<commit_message>
poc - comment - Phase 1 — Spring Data JPA and Phase 2 — Comment Module & Entities
</commit_message>
<xml_diff>
--- a/docs/poc_notes.docx
+++ b/docs/poc_notes.docx
@@ -3244,7 +3244,7 @@
           <v:shape id="_x0000_i1025" type="#_x0000_t75" style="width:75.6pt;height:49.35pt" o:ole="">
             <v:imagedata r:id="rId9" o:title=""/>
           </v:shape>
-          <o:OLEObject Type="Embed" ProgID="Package" ShapeID="_x0000_i1025" DrawAspect="Icon" ObjectID="_1835699556" r:id="rId10"/>
+          <o:OLEObject Type="Embed" ProgID="Package" ShapeID="_x0000_i1025" DrawAspect="Icon" ObjectID="_1835723698" r:id="rId10"/>
         </w:object>
       </w:r>
     </w:p>
@@ -3277,7 +3277,7 @@
           <v:shape id="_x0000_i1026" type="#_x0000_t75" style="width:75.6pt;height:49.35pt" o:ole="">
             <v:imagedata r:id="rId11" o:title=""/>
           </v:shape>
-          <o:OLEObject Type="Embed" ProgID="Package" ShapeID="_x0000_i1026" DrawAspect="Icon" ObjectID="_1835699557" r:id="rId12"/>
+          <o:OLEObject Type="Embed" ProgID="Package" ShapeID="_x0000_i1026" DrawAspect="Icon" ObjectID="_1835723699" r:id="rId12"/>
         </w:object>
       </w:r>
     </w:p>
@@ -3353,7 +3353,7 @@
           <v:shape id="_x0000_i1027" type="#_x0000_t75" style="width:75.6pt;height:49.35pt" o:ole="">
             <v:imagedata r:id="rId14" o:title=""/>
           </v:shape>
-          <o:OLEObject Type="Embed" ProgID="Package" ShapeID="_x0000_i1027" DrawAspect="Icon" ObjectID="_1835699558" r:id="rId15"/>
+          <o:OLEObject Type="Embed" ProgID="Package" ShapeID="_x0000_i1027" DrawAspect="Icon" ObjectID="_1835723700" r:id="rId15"/>
         </w:object>
       </w:r>
     </w:p>
@@ -3429,7 +3429,7 @@
           <v:shape id="_x0000_i1028" type="#_x0000_t75" style="width:75.6pt;height:49.35pt" o:ole="">
             <v:imagedata r:id="rId17" o:title=""/>
           </v:shape>
-          <o:OLEObject Type="Embed" ProgID="Package" ShapeID="_x0000_i1028" DrawAspect="Icon" ObjectID="_1835699559" r:id="rId18"/>
+          <o:OLEObject Type="Embed" ProgID="Package" ShapeID="_x0000_i1028" DrawAspect="Icon" ObjectID="_1835723701" r:id="rId18"/>
         </w:object>
       </w:r>
     </w:p>
@@ -7789,7 +7789,21 @@
         <w:pStyle w:val="Heading2"/>
       </w:pPr>
       <w:r>
-        <w:t>5.1 Database Setup</w:t>
+        <w:t xml:space="preserve">5.1 </w:t>
+      </w:r>
+      <w:r>
+        <w:t xml:space="preserve">Phase </w:t>
+      </w:r>
+      <w:proofErr w:type="gramStart"/>
+      <w:r>
+        <w:t>0  -</w:t>
+      </w:r>
+      <w:proofErr w:type="gramEnd"/>
+      <w:r>
+        <w:t xml:space="preserve"> </w:t>
+      </w:r>
+      <w:r>
+        <w:t>Database Setup</w:t>
       </w:r>
     </w:p>
     <w:p>
@@ -7797,7 +7811,13 @@
         <w:pStyle w:val="Heading3"/>
       </w:pPr>
       <w:r>
-        <w:t>5.1 Install SQL Server Developer Edition</w:t>
+        <w:t>5.</w:t>
+      </w:r>
+      <w:r>
+        <w:t>1.</w:t>
+      </w:r>
+      <w:r>
+        <w:t>1 Install SQL Server Developer Edition</w:t>
       </w:r>
     </w:p>
     <w:p>
@@ -8000,7 +8020,13 @@
         <w:pStyle w:val="Heading3"/>
       </w:pPr>
       <w:r>
-        <w:t xml:space="preserve">5.2 Connect from </w:t>
+        <w:t>5</w:t>
+      </w:r>
+      <w:r>
+        <w:t>.1</w:t>
+      </w:r>
+      <w:r>
+        <w:t xml:space="preserve">.2 Connect from </w:t>
       </w:r>
       <w:proofErr w:type="spellStart"/>
       <w:r>
@@ -8172,6 +8198,9 @@
       </w:r>
     </w:p>
     <w:p>
+      <w:pPr>
+        <w:ind w:left="426"/>
+      </w:pPr>
       <w:r>
         <w:t xml:space="preserve">Open </w:t>
       </w:r>
@@ -8185,6 +8214,7 @@
     </w:p>
     <w:p>
       <w:pPr>
+        <w:ind w:left="426"/>
         <w:rPr>
           <w:b/>
           <w:bCs/>
@@ -8199,6 +8229,9 @@
       </w:r>
     </w:p>
     <w:p>
+      <w:pPr>
+        <w:ind w:left="426"/>
+      </w:pPr>
       <w:r>
         <w:rPr>
           <w:noProof/>
@@ -8254,6 +8287,9 @@
       </w:r>
     </w:p>
     <w:p>
+      <w:pPr>
+        <w:ind w:left="426"/>
+      </w:pPr>
       <w:r>
         <w:t xml:space="preserve">2. </w:t>
       </w:r>
@@ -8282,6 +8318,9 @@
       </w:r>
     </w:p>
     <w:p>
+      <w:pPr>
+        <w:ind w:left="426"/>
+      </w:pPr>
       <w:r>
         <w:t xml:space="preserve">If it is a </w:t>
       </w:r>
@@ -8308,6 +8347,7 @@
     </w:p>
     <w:p>
       <w:pPr>
+        <w:ind w:left="426"/>
         <w:rPr>
           <w:b/>
           <w:bCs/>
@@ -8325,6 +8365,9 @@
       </w:r>
     </w:p>
     <w:p>
+      <w:pPr>
+        <w:ind w:left="426"/>
+      </w:pPr>
       <w:r>
         <w:t xml:space="preserve">In </w:t>
       </w:r>
@@ -8345,6 +8388,7 @@
           <w:ilvl w:val="0"/>
           <w:numId w:val="23"/>
         </w:numPr>
+        <w:ind w:left="426"/>
       </w:pPr>
       <w:r>
         <w:t xml:space="preserve">Expand </w:t>
@@ -8363,6 +8407,7 @@
           <w:ilvl w:val="0"/>
           <w:numId w:val="23"/>
         </w:numPr>
+        <w:ind w:left="426"/>
       </w:pPr>
       <w:r>
         <w:t xml:space="preserve">Click </w:t>
@@ -8381,6 +8426,7 @@
           <w:ilvl w:val="0"/>
           <w:numId w:val="23"/>
         </w:numPr>
+        <w:ind w:left="426"/>
       </w:pPr>
       <w:r>
         <w:t xml:space="preserve">Make sure </w:t>
@@ -8404,6 +8450,9 @@
       </w:r>
     </w:p>
     <w:p>
+      <w:pPr>
+        <w:ind w:left="426"/>
+      </w:pPr>
       <w:r>
         <w:rPr>
           <w:noProof/>
@@ -8460,6 +8509,7 @@
     </w:p>
     <w:p>
       <w:pPr>
+        <w:ind w:left="426"/>
         <w:rPr>
           <w:b/>
           <w:bCs/>
@@ -8474,6 +8524,9 @@
       </w:r>
     </w:p>
     <w:p>
+      <w:pPr>
+        <w:ind w:left="426"/>
+      </w:pPr>
       <w:r>
         <w:t xml:space="preserve">In </w:t>
       </w:r>
@@ -8494,6 +8547,7 @@
           <w:ilvl w:val="0"/>
           <w:numId w:val="24"/>
         </w:numPr>
+        <w:ind w:left="426"/>
       </w:pPr>
       <w:r>
         <w:t xml:space="preserve">Open </w:t>
@@ -8512,6 +8566,7 @@
           <w:ilvl w:val="0"/>
           <w:numId w:val="24"/>
         </w:numPr>
+        <w:ind w:left="426"/>
       </w:pPr>
       <w:r>
         <w:t xml:space="preserve">Double-click </w:t>
@@ -8530,6 +8585,7 @@
           <w:ilvl w:val="0"/>
           <w:numId w:val="24"/>
         </w:numPr>
+        <w:ind w:left="426"/>
       </w:pPr>
       <w:r>
         <w:t xml:space="preserve">Go to </w:t>
@@ -8548,6 +8604,7 @@
           <w:ilvl w:val="0"/>
           <w:numId w:val="24"/>
         </w:numPr>
+        <w:ind w:left="426"/>
       </w:pPr>
       <w:r>
         <w:lastRenderedPageBreak/>
@@ -8564,6 +8621,9 @@
       <w:proofErr w:type="spellEnd"/>
     </w:p>
     <w:p>
+      <w:pPr>
+        <w:ind w:left="426"/>
+      </w:pPr>
       <w:r>
         <w:t>Check these fields:</w:t>
       </w:r>
@@ -8574,6 +8634,7 @@
           <w:ilvl w:val="0"/>
           <w:numId w:val="25"/>
         </w:numPr>
+        <w:ind w:left="426"/>
       </w:pPr>
       <w:r>
         <w:rPr>
@@ -8589,6 +8650,7 @@
           <w:ilvl w:val="0"/>
           <w:numId w:val="25"/>
         </w:numPr>
+        <w:ind w:left="426"/>
       </w:pPr>
       <w:r>
         <w:rPr>
@@ -8599,6 +8661,9 @@
       </w:r>
     </w:p>
     <w:p>
+      <w:pPr>
+        <w:ind w:left="426"/>
+      </w:pPr>
       <w:r>
         <w:t>Microsoft’s port guidance says:</w:t>
       </w:r>
@@ -8609,6 +8674,7 @@
           <w:ilvl w:val="0"/>
           <w:numId w:val="26"/>
         </w:numPr>
+        <w:ind w:left="426"/>
       </w:pPr>
       <w:r>
         <w:t>for named instances, dynamic ports are common unless you change them</w:t>
@@ -8620,6 +8686,7 @@
           <w:ilvl w:val="0"/>
           <w:numId w:val="26"/>
         </w:numPr>
+        <w:ind w:left="426"/>
       </w:pPr>
       <w:r>
         <w:rPr>
@@ -8638,6 +8705,7 @@
           <w:ilvl w:val="0"/>
           <w:numId w:val="26"/>
         </w:numPr>
+        <w:ind w:left="426"/>
       </w:pPr>
       <w:r>
         <w:t xml:space="preserve">set TCP Port to </w:t>
@@ -8651,6 +8719,9 @@
       </w:r>
     </w:p>
     <w:p>
+      <w:pPr>
+        <w:ind w:left="426"/>
+      </w:pPr>
       <w:r>
         <w:rPr>
           <w:noProof/>
@@ -8706,6 +8777,9 @@
       </w:r>
     </w:p>
     <w:p>
+      <w:pPr>
+        <w:ind w:left="426"/>
+      </w:pPr>
       <w:r>
         <w:t>5. Restart the SQL Server service to take effect</w:t>
       </w:r>
@@ -8715,7 +8789,13 @@
         <w:pStyle w:val="Heading3"/>
       </w:pPr>
       <w:r>
-        <w:t>5.3 Create Database</w:t>
+        <w:t>5</w:t>
+      </w:r>
+      <w:r>
+        <w:t>.1</w:t>
+      </w:r>
+      <w:r>
+        <w:t>.3 Create Database</w:t>
       </w:r>
     </w:p>
     <w:p>
@@ -8740,7 +8820,13 @@
         <w:pStyle w:val="Heading3"/>
       </w:pPr>
       <w:r>
-        <w:t>5.4 Create Tables</w:t>
+        <w:t>5</w:t>
+      </w:r>
+      <w:r>
+        <w:t>.1</w:t>
+      </w:r>
+      <w:r>
+        <w:t>.4 Create Tables</w:t>
       </w:r>
     </w:p>
     <w:p>
@@ -8768,7 +8854,13 @@
         <w:pStyle w:val="Heading3"/>
       </w:pPr>
       <w:r>
-        <w:t>5.5 Insert Initial Data</w:t>
+        <w:t>5</w:t>
+      </w:r>
+      <w:r>
+        <w:t>.1</w:t>
+      </w:r>
+      <w:r>
+        <w:t>.5 Insert Initial Data</w:t>
       </w:r>
     </w:p>
     <w:p>
@@ -8791,8 +8883,185 @@
         <w:t>V2__seed_data.sql</w:t>
       </w:r>
     </w:p>
-    <w:p/>
-    <w:p/>
+    <w:p>
+      <w:pPr>
+        <w:pStyle w:val="Heading2"/>
+      </w:pPr>
+      <w:r>
+        <w:t xml:space="preserve">5.2 </w:t>
+      </w:r>
+      <w:r>
+        <w:t>Phase 1 — Spring Data JPA + Budget Migration</w:t>
+      </w:r>
+    </w:p>
+    <w:p>
+      <w:r>
+        <w:t>See implementation-state.md</w:t>
+      </w:r>
+    </w:p>
+    <w:p>
+      <w:r>
+        <w:rPr>
+          <w:b/>
+          <w:bCs/>
+        </w:rPr>
+        <w:t>Troubleshooting Notes</w:t>
+      </w:r>
+      <w:r>
+        <w:t>:</w:t>
+      </w:r>
+    </w:p>
+    <w:p>
+      <w:pPr>
+        <w:pStyle w:val="ListParagraph"/>
+        <w:numPr>
+          <w:ilvl w:val="0"/>
+          <w:numId w:val="27"/>
+        </w:numPr>
+      </w:pPr>
+      <w:r>
+        <w:t xml:space="preserve">Add Env variables </w:t>
+      </w:r>
+      <w:r>
+        <w:rPr>
+          <w:b/>
+          <w:bCs/>
+        </w:rPr>
+        <w:t>MSSQL_USERNAME</w:t>
+      </w:r>
+      <w:r>
+        <w:t xml:space="preserve"> and </w:t>
+      </w:r>
+      <w:r>
+        <w:rPr>
+          <w:b/>
+          <w:bCs/>
+        </w:rPr>
+        <w:t>MSSQL_PASSWORD</w:t>
+      </w:r>
+      <w:r>
+        <w:t xml:space="preserve"> for run configuration</w:t>
+      </w:r>
+    </w:p>
+    <w:p>
+      <w:pPr>
+        <w:pStyle w:val="ListParagraph"/>
+        <w:numPr>
+          <w:ilvl w:val="0"/>
+          <w:numId w:val="27"/>
+        </w:numPr>
+      </w:pPr>
+      <w:r>
+        <w:lastRenderedPageBreak/>
+        <w:t xml:space="preserve">Add </w:t>
+      </w:r>
+      <w:proofErr w:type="spellStart"/>
+      <w:r>
+        <w:t>EntityScan</w:t>
+      </w:r>
+      <w:proofErr w:type="spellEnd"/>
+      <w:r>
+        <w:t xml:space="preserve"> and </w:t>
+      </w:r>
+      <w:proofErr w:type="spellStart"/>
+      <w:r>
+        <w:t>EnableJpaRepositoryies</w:t>
+      </w:r>
+      <w:proofErr w:type="spellEnd"/>
+      <w:r>
+        <w:t xml:space="preserve"> in leap-app </w:t>
+      </w:r>
+      <w:proofErr w:type="spellStart"/>
+      <w:r>
+        <w:t>LeapPocApplication</w:t>
+      </w:r>
+      <w:proofErr w:type="spellEnd"/>
+      <w:r>
+        <w:t xml:space="preserve"> to scan JPA entities and repositories in other modules/packages</w:t>
+      </w:r>
+    </w:p>
+    <w:p>
+      <w:pPr>
+        <w:ind w:left="720"/>
+      </w:pPr>
+      <w:r>
+        <w:drawing>
+          <wp:inline distT="0" distB="0" distL="0" distR="0" wp14:anchorId="1DD958C5" wp14:editId="362F2EA5">
+            <wp:extent cx="3572374" cy="866896"/>
+            <wp:effectExtent l="0" t="0" r="9525" b="9525"/>
+            <wp:docPr id="2065013800" name="Picture 1"/>
+            <wp:cNvGraphicFramePr>
+              <a:graphicFrameLocks xmlns:a="http://schemas.openxmlformats.org/drawingml/2006/main" noChangeAspect="1"/>
+            </wp:cNvGraphicFramePr>
+            <a:graphic xmlns:a="http://schemas.openxmlformats.org/drawingml/2006/main">
+              <a:graphicData uri="http://schemas.openxmlformats.org/drawingml/2006/picture">
+                <pic:pic xmlns:pic="http://schemas.openxmlformats.org/drawingml/2006/picture">
+                  <pic:nvPicPr>
+                    <pic:cNvPr id="2065013800" name=""/>
+                    <pic:cNvPicPr/>
+                  </pic:nvPicPr>
+                  <pic:blipFill>
+                    <a:blip r:embed="rId35"/>
+                    <a:stretch>
+                      <a:fillRect/>
+                    </a:stretch>
+                  </pic:blipFill>
+                  <pic:spPr>
+                    <a:xfrm>
+                      <a:off x="0" y="0"/>
+                      <a:ext cx="3572374" cy="866896"/>
+                    </a:xfrm>
+                    <a:prstGeom prst="rect">
+                      <a:avLst/>
+                    </a:prstGeom>
+                  </pic:spPr>
+                </pic:pic>
+              </a:graphicData>
+            </a:graphic>
+          </wp:inline>
+        </w:drawing>
+      </w:r>
+    </w:p>
+    <w:p>
+      <w:pPr>
+        <w:pStyle w:val="ListParagraph"/>
+        <w:numPr>
+          <w:ilvl w:val="0"/>
+          <w:numId w:val="27"/>
+        </w:numPr>
+      </w:pPr>
+      <w:r>
+        <w:t xml:space="preserve">Change Instant to </w:t>
+      </w:r>
+      <w:proofErr w:type="spellStart"/>
+      <w:r>
+        <w:t>LocalDateTime</w:t>
+      </w:r>
+      <w:proofErr w:type="spellEnd"/>
+      <w:r>
+        <w:t xml:space="preserve"> for datetime fields such as </w:t>
+      </w:r>
+      <w:proofErr w:type="spellStart"/>
+      <w:r>
+        <w:t>createdAt</w:t>
+      </w:r>
+      <w:proofErr w:type="spellEnd"/>
+    </w:p>
+    <w:p>
+      <w:pPr>
+        <w:pStyle w:val="Heading3"/>
+        <w:rPr>
+          <w:b/>
+          <w:bCs/>
+        </w:rPr>
+      </w:pPr>
+      <w:r>
+        <w:t xml:space="preserve">5.3 </w:t>
+      </w:r>
+      <w:r>
+        <w:t>Phase 2 — Comment Module &amp; Entities</w:t>
+      </w:r>
+    </w:p>
     <w:p/>
     <w:p/>
     <w:p/>
@@ -9199,6 +9468,119 @@
     </w:lvl>
   </w:abstractNum>
   <w:abstractNum w:abstractNumId="3" w15:restartNumberingAfterBreak="0">
+    <w:nsid w:val="0CDE6022"/>
+    <w:multiLevelType w:val="hybridMultilevel"/>
+    <w:tmpl w:val="978AECC2"/>
+    <w:lvl w:ilvl="0" w:tplc="10090001">
+      <w:start w:val="1"/>
+      <w:numFmt w:val="bullet"/>
+      <w:lvlText w:val=""/>
+      <w:lvlJc w:val="left"/>
+      <w:pPr>
+        <w:ind w:left="720" w:hanging="360"/>
+      </w:pPr>
+      <w:rPr>
+        <w:rFonts w:ascii="Symbol" w:hAnsi="Symbol" w:hint="default"/>
+      </w:rPr>
+    </w:lvl>
+    <w:lvl w:ilvl="1" w:tplc="10090003" w:tentative="1">
+      <w:start w:val="1"/>
+      <w:numFmt w:val="bullet"/>
+      <w:lvlText w:val="o"/>
+      <w:lvlJc w:val="left"/>
+      <w:pPr>
+        <w:ind w:left="1440" w:hanging="360"/>
+      </w:pPr>
+      <w:rPr>
+        <w:rFonts w:ascii="Courier New" w:hAnsi="Courier New" w:cs="Courier New" w:hint="default"/>
+      </w:rPr>
+    </w:lvl>
+    <w:lvl w:ilvl="2" w:tplc="10090005" w:tentative="1">
+      <w:start w:val="1"/>
+      <w:numFmt w:val="bullet"/>
+      <w:lvlText w:val=""/>
+      <w:lvlJc w:val="left"/>
+      <w:pPr>
+        <w:ind w:left="2160" w:hanging="360"/>
+      </w:pPr>
+      <w:rPr>
+        <w:rFonts w:ascii="Wingdings" w:hAnsi="Wingdings" w:hint="default"/>
+      </w:rPr>
+    </w:lvl>
+    <w:lvl w:ilvl="3" w:tplc="10090001" w:tentative="1">
+      <w:start w:val="1"/>
+      <w:numFmt w:val="bullet"/>
+      <w:lvlText w:val=""/>
+      <w:lvlJc w:val="left"/>
+      <w:pPr>
+        <w:ind w:left="2880" w:hanging="360"/>
+      </w:pPr>
+      <w:rPr>
+        <w:rFonts w:ascii="Symbol" w:hAnsi="Symbol" w:hint="default"/>
+      </w:rPr>
+    </w:lvl>
+    <w:lvl w:ilvl="4" w:tplc="10090003" w:tentative="1">
+      <w:start w:val="1"/>
+      <w:numFmt w:val="bullet"/>
+      <w:lvlText w:val="o"/>
+      <w:lvlJc w:val="left"/>
+      <w:pPr>
+        <w:ind w:left="3600" w:hanging="360"/>
+      </w:pPr>
+      <w:rPr>
+        <w:rFonts w:ascii="Courier New" w:hAnsi="Courier New" w:cs="Courier New" w:hint="default"/>
+      </w:rPr>
+    </w:lvl>
+    <w:lvl w:ilvl="5" w:tplc="10090005" w:tentative="1">
+      <w:start w:val="1"/>
+      <w:numFmt w:val="bullet"/>
+      <w:lvlText w:val=""/>
+      <w:lvlJc w:val="left"/>
+      <w:pPr>
+        <w:ind w:left="4320" w:hanging="360"/>
+      </w:pPr>
+      <w:rPr>
+        <w:rFonts w:ascii="Wingdings" w:hAnsi="Wingdings" w:hint="default"/>
+      </w:rPr>
+    </w:lvl>
+    <w:lvl w:ilvl="6" w:tplc="10090001" w:tentative="1">
+      <w:start w:val="1"/>
+      <w:numFmt w:val="bullet"/>
+      <w:lvlText w:val=""/>
+      <w:lvlJc w:val="left"/>
+      <w:pPr>
+        <w:ind w:left="5040" w:hanging="360"/>
+      </w:pPr>
+      <w:rPr>
+        <w:rFonts w:ascii="Symbol" w:hAnsi="Symbol" w:hint="default"/>
+      </w:rPr>
+    </w:lvl>
+    <w:lvl w:ilvl="7" w:tplc="10090003" w:tentative="1">
+      <w:start w:val="1"/>
+      <w:numFmt w:val="bullet"/>
+      <w:lvlText w:val="o"/>
+      <w:lvlJc w:val="left"/>
+      <w:pPr>
+        <w:ind w:left="5760" w:hanging="360"/>
+      </w:pPr>
+      <w:rPr>
+        <w:rFonts w:ascii="Courier New" w:hAnsi="Courier New" w:cs="Courier New" w:hint="default"/>
+      </w:rPr>
+    </w:lvl>
+    <w:lvl w:ilvl="8" w:tplc="10090005" w:tentative="1">
+      <w:start w:val="1"/>
+      <w:numFmt w:val="bullet"/>
+      <w:lvlText w:val=""/>
+      <w:lvlJc w:val="left"/>
+      <w:pPr>
+        <w:ind w:left="6480" w:hanging="360"/>
+      </w:pPr>
+      <w:rPr>
+        <w:rFonts w:ascii="Wingdings" w:hAnsi="Wingdings" w:hint="default"/>
+      </w:rPr>
+    </w:lvl>
+  </w:abstractNum>
+  <w:abstractNum w:abstractNumId="4" w15:restartNumberingAfterBreak="0">
     <w:nsid w:val="10C505CB"/>
     <w:multiLevelType w:val="multilevel"/>
     <w:tmpl w:val="D07CD7FC"/>
@@ -9347,7 +9729,7 @@
       </w:rPr>
     </w:lvl>
   </w:abstractNum>
-  <w:abstractNum w:abstractNumId="4" w15:restartNumberingAfterBreak="0">
+  <w:abstractNum w:abstractNumId="5" w15:restartNumberingAfterBreak="0">
     <w:nsid w:val="116A5002"/>
     <w:multiLevelType w:val="multilevel"/>
     <w:tmpl w:val="401AB65A"/>
@@ -9496,7 +9878,7 @@
       </w:rPr>
     </w:lvl>
   </w:abstractNum>
-  <w:abstractNum w:abstractNumId="5" w15:restartNumberingAfterBreak="0">
+  <w:abstractNum w:abstractNumId="6" w15:restartNumberingAfterBreak="0">
     <w:nsid w:val="1AF90B6A"/>
     <w:multiLevelType w:val="multilevel"/>
     <w:tmpl w:val="1A56AF4A"/>
@@ -9609,7 +9991,7 @@
       </w:pPr>
     </w:lvl>
   </w:abstractNum>
-  <w:abstractNum w:abstractNumId="6" w15:restartNumberingAfterBreak="0">
+  <w:abstractNum w:abstractNumId="7" w15:restartNumberingAfterBreak="0">
     <w:nsid w:val="1BC87650"/>
     <w:multiLevelType w:val="hybridMultilevel"/>
     <w:tmpl w:val="971A6178"/>
@@ -9722,7 +10104,7 @@
       </w:rPr>
     </w:lvl>
   </w:abstractNum>
-  <w:abstractNum w:abstractNumId="7" w15:restartNumberingAfterBreak="0">
+  <w:abstractNum w:abstractNumId="8" w15:restartNumberingAfterBreak="0">
     <w:nsid w:val="1D1149F5"/>
     <w:multiLevelType w:val="multilevel"/>
     <w:tmpl w:val="19346220"/>
@@ -9871,7 +10253,7 @@
       </w:rPr>
     </w:lvl>
   </w:abstractNum>
-  <w:abstractNum w:abstractNumId="8" w15:restartNumberingAfterBreak="0">
+  <w:abstractNum w:abstractNumId="9" w15:restartNumberingAfterBreak="0">
     <w:nsid w:val="20180394"/>
     <w:multiLevelType w:val="multilevel"/>
     <w:tmpl w:val="24BCCDFE"/>
@@ -10020,7 +10402,7 @@
       </w:rPr>
     </w:lvl>
   </w:abstractNum>
-  <w:abstractNum w:abstractNumId="9" w15:restartNumberingAfterBreak="0">
+  <w:abstractNum w:abstractNumId="10" w15:restartNumberingAfterBreak="0">
     <w:nsid w:val="28BA103E"/>
     <w:multiLevelType w:val="hybridMultilevel"/>
     <w:tmpl w:val="77349F68"/>
@@ -10133,7 +10515,7 @@
       </w:rPr>
     </w:lvl>
   </w:abstractNum>
-  <w:abstractNum w:abstractNumId="10" w15:restartNumberingAfterBreak="0">
+  <w:abstractNum w:abstractNumId="11" w15:restartNumberingAfterBreak="0">
     <w:nsid w:val="2ACC1008"/>
     <w:multiLevelType w:val="multilevel"/>
     <w:tmpl w:val="83E0AAAE"/>
@@ -10282,7 +10664,7 @@
       </w:rPr>
     </w:lvl>
   </w:abstractNum>
-  <w:abstractNum w:abstractNumId="11" w15:restartNumberingAfterBreak="0">
+  <w:abstractNum w:abstractNumId="12" w15:restartNumberingAfterBreak="0">
     <w:nsid w:val="36DC4EAE"/>
     <w:multiLevelType w:val="multilevel"/>
     <w:tmpl w:val="768EADA2"/>
@@ -10399,7 +10781,7 @@
       </w:pPr>
     </w:lvl>
   </w:abstractNum>
-  <w:abstractNum w:abstractNumId="12" w15:restartNumberingAfterBreak="0">
+  <w:abstractNum w:abstractNumId="13" w15:restartNumberingAfterBreak="0">
     <w:nsid w:val="3AD06FD2"/>
     <w:multiLevelType w:val="multilevel"/>
     <w:tmpl w:val="3CC81D80"/>
@@ -10548,7 +10930,7 @@
       </w:rPr>
     </w:lvl>
   </w:abstractNum>
-  <w:abstractNum w:abstractNumId="13" w15:restartNumberingAfterBreak="0">
+  <w:abstractNum w:abstractNumId="14" w15:restartNumberingAfterBreak="0">
     <w:nsid w:val="3DAC2A76"/>
     <w:multiLevelType w:val="hybridMultilevel"/>
     <w:tmpl w:val="533A61F2"/>
@@ -10661,7 +11043,7 @@
       </w:rPr>
     </w:lvl>
   </w:abstractNum>
-  <w:abstractNum w:abstractNumId="14" w15:restartNumberingAfterBreak="0">
+  <w:abstractNum w:abstractNumId="15" w15:restartNumberingAfterBreak="0">
     <w:nsid w:val="43816EC9"/>
     <w:multiLevelType w:val="multilevel"/>
     <w:tmpl w:val="E1A4D0BE"/>
@@ -10774,7 +11156,7 @@
       </w:pPr>
     </w:lvl>
   </w:abstractNum>
-  <w:abstractNum w:abstractNumId="15" w15:restartNumberingAfterBreak="0">
+  <w:abstractNum w:abstractNumId="16" w15:restartNumberingAfterBreak="0">
     <w:nsid w:val="4B541038"/>
     <w:multiLevelType w:val="multilevel"/>
     <w:tmpl w:val="24BCCDFE"/>
@@ -10891,7 +11273,7 @@
       </w:pPr>
     </w:lvl>
   </w:abstractNum>
-  <w:abstractNum w:abstractNumId="16" w15:restartNumberingAfterBreak="0">
+  <w:abstractNum w:abstractNumId="17" w15:restartNumberingAfterBreak="0">
     <w:nsid w:val="4B803365"/>
     <w:multiLevelType w:val="multilevel"/>
     <w:tmpl w:val="24BCCDFE"/>
@@ -11008,7 +11390,7 @@
       </w:pPr>
     </w:lvl>
   </w:abstractNum>
-  <w:abstractNum w:abstractNumId="17" w15:restartNumberingAfterBreak="0">
+  <w:abstractNum w:abstractNumId="18" w15:restartNumberingAfterBreak="0">
     <w:nsid w:val="5EEA7024"/>
     <w:multiLevelType w:val="hybridMultilevel"/>
     <w:tmpl w:val="AABA2528"/>
@@ -11097,7 +11479,7 @@
       </w:pPr>
     </w:lvl>
   </w:abstractNum>
-  <w:abstractNum w:abstractNumId="18" w15:restartNumberingAfterBreak="0">
+  <w:abstractNum w:abstractNumId="19" w15:restartNumberingAfterBreak="0">
     <w:nsid w:val="5FE34003"/>
     <w:multiLevelType w:val="multilevel"/>
     <w:tmpl w:val="DF4AD572"/>
@@ -11246,7 +11628,7 @@
       </w:rPr>
     </w:lvl>
   </w:abstractNum>
-  <w:abstractNum w:abstractNumId="19" w15:restartNumberingAfterBreak="0">
+  <w:abstractNum w:abstractNumId="20" w15:restartNumberingAfterBreak="0">
     <w:nsid w:val="67C821B7"/>
     <w:multiLevelType w:val="multilevel"/>
     <w:tmpl w:val="532C346E"/>
@@ -11395,7 +11777,7 @@
       </w:rPr>
     </w:lvl>
   </w:abstractNum>
-  <w:abstractNum w:abstractNumId="20" w15:restartNumberingAfterBreak="0">
+  <w:abstractNum w:abstractNumId="21" w15:restartNumberingAfterBreak="0">
     <w:nsid w:val="77B815C1"/>
     <w:multiLevelType w:val="multilevel"/>
     <w:tmpl w:val="8F5C64D8"/>
@@ -11544,7 +11926,7 @@
       </w:rPr>
     </w:lvl>
   </w:abstractNum>
-  <w:abstractNum w:abstractNumId="21" w15:restartNumberingAfterBreak="0">
+  <w:abstractNum w:abstractNumId="22" w15:restartNumberingAfterBreak="0">
     <w:nsid w:val="786E5DA7"/>
     <w:multiLevelType w:val="hybridMultilevel"/>
     <w:tmpl w:val="1E96CCF8"/>
@@ -11657,7 +12039,7 @@
       </w:rPr>
     </w:lvl>
   </w:abstractNum>
-  <w:abstractNum w:abstractNumId="22" w15:restartNumberingAfterBreak="0">
+  <w:abstractNum w:abstractNumId="23" w15:restartNumberingAfterBreak="0">
     <w:nsid w:val="7912704F"/>
     <w:multiLevelType w:val="multilevel"/>
     <w:tmpl w:val="9EA0F730"/>
@@ -11806,7 +12188,7 @@
       </w:rPr>
     </w:lvl>
   </w:abstractNum>
-  <w:abstractNum w:abstractNumId="23" w15:restartNumberingAfterBreak="0">
+  <w:abstractNum w:abstractNumId="24" w15:restartNumberingAfterBreak="0">
     <w:nsid w:val="793778F5"/>
     <w:multiLevelType w:val="hybridMultilevel"/>
     <w:tmpl w:val="8F0C4A80"/>
@@ -11919,7 +12301,7 @@
       </w:rPr>
     </w:lvl>
   </w:abstractNum>
-  <w:abstractNum w:abstractNumId="24" w15:restartNumberingAfterBreak="0">
+  <w:abstractNum w:abstractNumId="25" w15:restartNumberingAfterBreak="0">
     <w:nsid w:val="7B45478C"/>
     <w:multiLevelType w:val="multilevel"/>
     <w:tmpl w:val="172AF74E"/>
@@ -12068,7 +12450,7 @@
       </w:rPr>
     </w:lvl>
   </w:abstractNum>
-  <w:abstractNum w:abstractNumId="25" w15:restartNumberingAfterBreak="0">
+  <w:abstractNum w:abstractNumId="26" w15:restartNumberingAfterBreak="0">
     <w:nsid w:val="7C633FCE"/>
     <w:multiLevelType w:val="multilevel"/>
     <w:tmpl w:val="24BCCDFE"/>
@@ -12186,82 +12568,85 @@
     </w:lvl>
   </w:abstractNum>
   <w:num w:numId="1" w16cid:durableId="1212882090">
-    <w:abstractNumId w:val="17"/>
+    <w:abstractNumId w:val="18"/>
   </w:num>
   <w:num w:numId="2" w16cid:durableId="1119959067">
-    <w:abstractNumId w:val="9"/>
+    <w:abstractNumId w:val="10"/>
   </w:num>
   <w:num w:numId="3" w16cid:durableId="322513659">
-    <w:abstractNumId w:val="24"/>
+    <w:abstractNumId w:val="25"/>
   </w:num>
   <w:num w:numId="4" w16cid:durableId="172915269">
     <w:abstractNumId w:val="1"/>
   </w:num>
   <w:num w:numId="5" w16cid:durableId="201405766">
-    <w:abstractNumId w:val="21"/>
+    <w:abstractNumId w:val="22"/>
   </w:num>
   <w:num w:numId="6" w16cid:durableId="1156267990">
-    <w:abstractNumId w:val="14"/>
+    <w:abstractNumId w:val="15"/>
   </w:num>
   <w:num w:numId="7" w16cid:durableId="589505510">
     <w:abstractNumId w:val="2"/>
   </w:num>
   <w:num w:numId="8" w16cid:durableId="500051174">
+    <w:abstractNumId w:val="9"/>
+  </w:num>
+  <w:num w:numId="9" w16cid:durableId="651830634">
+    <w:abstractNumId w:val="26"/>
+  </w:num>
+  <w:num w:numId="10" w16cid:durableId="841895827">
+    <w:abstractNumId w:val="24"/>
+  </w:num>
+  <w:num w:numId="11" w16cid:durableId="2122918639">
     <w:abstractNumId w:val="8"/>
   </w:num>
-  <w:num w:numId="9" w16cid:durableId="651830634">
-    <w:abstractNumId w:val="25"/>
+  <w:num w:numId="12" w16cid:durableId="164983286">
+    <w:abstractNumId w:val="17"/>
   </w:num>
-  <w:num w:numId="10" w16cid:durableId="841895827">
-    <w:abstractNumId w:val="23"/>
+  <w:num w:numId="13" w16cid:durableId="582690670">
+    <w:abstractNumId w:val="21"/>
   </w:num>
-  <w:num w:numId="11" w16cid:durableId="2122918639">
-    <w:abstractNumId w:val="7"/>
+  <w:num w:numId="14" w16cid:durableId="264189441">
+    <w:abstractNumId w:val="19"/>
   </w:num>
-  <w:num w:numId="12" w16cid:durableId="164983286">
+  <w:num w:numId="15" w16cid:durableId="1577714169">
     <w:abstractNumId w:val="16"/>
   </w:num>
-  <w:num w:numId="13" w16cid:durableId="582690670">
-    <w:abstractNumId w:val="20"/>
-  </w:num>
-  <w:num w:numId="14" w16cid:durableId="264189441">
-    <w:abstractNumId w:val="18"/>
-  </w:num>
-  <w:num w:numId="15" w16cid:durableId="1577714169">
-    <w:abstractNumId w:val="15"/>
-  </w:num>
   <w:num w:numId="16" w16cid:durableId="1429741216">
-    <w:abstractNumId w:val="11"/>
+    <w:abstractNumId w:val="12"/>
   </w:num>
   <w:num w:numId="17" w16cid:durableId="1176727730">
-    <w:abstractNumId w:val="6"/>
+    <w:abstractNumId w:val="7"/>
   </w:num>
   <w:num w:numId="18" w16cid:durableId="1618371638">
     <w:abstractNumId w:val="0"/>
   </w:num>
   <w:num w:numId="19" w16cid:durableId="264003664">
-    <w:abstractNumId w:val="12"/>
+    <w:abstractNumId w:val="13"/>
   </w:num>
   <w:num w:numId="20" w16cid:durableId="373120343">
+    <w:abstractNumId w:val="6"/>
+  </w:num>
+  <w:num w:numId="21" w16cid:durableId="1144279345">
+    <w:abstractNumId w:val="11"/>
+  </w:num>
+  <w:num w:numId="22" w16cid:durableId="465588484">
+    <w:abstractNumId w:val="14"/>
+  </w:num>
+  <w:num w:numId="23" w16cid:durableId="729421856">
+    <w:abstractNumId w:val="4"/>
+  </w:num>
+  <w:num w:numId="24" w16cid:durableId="1366057816">
+    <w:abstractNumId w:val="23"/>
+  </w:num>
+  <w:num w:numId="25" w16cid:durableId="1433428595">
+    <w:abstractNumId w:val="20"/>
+  </w:num>
+  <w:num w:numId="26" w16cid:durableId="687368329">
     <w:abstractNumId w:val="5"/>
   </w:num>
-  <w:num w:numId="21" w16cid:durableId="1144279345">
-    <w:abstractNumId w:val="10"/>
-  </w:num>
-  <w:num w:numId="22" w16cid:durableId="465588484">
-    <w:abstractNumId w:val="13"/>
-  </w:num>
-  <w:num w:numId="23" w16cid:durableId="729421856">
+  <w:num w:numId="27" w16cid:durableId="513543965">
     <w:abstractNumId w:val="3"/>
-  </w:num>
-  <w:num w:numId="24" w16cid:durableId="1366057816">
-    <w:abstractNumId w:val="22"/>
-  </w:num>
-  <w:num w:numId="25" w16cid:durableId="1433428595">
-    <w:abstractNumId w:val="19"/>
-  </w:num>
-  <w:num w:numId="26" w16cid:durableId="687368329">
-    <w:abstractNumId w:val="4"/>
   </w:num>
 </w:numbering>
 </file>

</xml_diff>

<commit_message>
poc - comment - Phase 4 and 5 - Frontend
</commit_message>
<xml_diff>
--- a/docs/poc_notes.docx
+++ b/docs/poc_notes.docx
@@ -4,6 +4,15 @@
   <w:body>
     <w:sdt>
       <w:sdtPr>
+        <w:rPr>
+          <w:rFonts w:asciiTheme="minorHAnsi" w:eastAsiaTheme="minorEastAsia" w:hAnsiTheme="minorHAnsi" w:cstheme="minorBidi"/>
+          <w:color w:val="auto"/>
+          <w:kern w:val="2"/>
+          <w:sz w:val="24"/>
+          <w:szCs w:val="24"/>
+          <w:lang w:val="en-CA" w:eastAsia="zh-CN"/>
+          <w14:ligatures w14:val="standardContextual"/>
+        </w:rPr>
         <w:id w:val="1530679987"/>
         <w:docPartObj>
           <w:docPartGallery w:val="Table of Contents"/>
@@ -12,16 +21,9 @@
       </w:sdtPr>
       <w:sdtEndPr>
         <w:rPr>
-          <w:rFonts w:asciiTheme="minorHAnsi" w:eastAsiaTheme="minorEastAsia" w:hAnsiTheme="minorHAnsi" w:cstheme="minorBidi"/>
           <w:b/>
           <w:bCs/>
           <w:noProof/>
-          <w:color w:val="auto"/>
-          <w:kern w:val="2"/>
-          <w:sz w:val="24"/>
-          <w:szCs w:val="24"/>
-          <w:lang w:val="en-CA" w:eastAsia="zh-CN"/>
-          <w14:ligatures w14:val="standardContextual"/>
         </w:rPr>
       </w:sdtEndPr>
       <w:sdtContent>
@@ -52,7 +54,7 @@
           <w:r>
             <w:fldChar w:fldCharType="separate"/>
           </w:r>
-          <w:hyperlink w:anchor="_Toc225032854" w:history="1">
+          <w:hyperlink w:anchor="_Toc225115670" w:history="1">
             <w:r>
               <w:rPr>
                 <w:rStyle w:val="Hyperlink"/>
@@ -79,7 +81,7 @@
                 <w:noProof/>
                 <w:webHidden/>
               </w:rPr>
-              <w:instrText xml:space="preserve"> PAGEREF _Toc225032854 \h </w:instrText>
+              <w:instrText xml:space="preserve"> PAGEREF _Toc225115670 \h </w:instrText>
             </w:r>
             <w:r>
               <w:rPr>
@@ -99,7 +101,7 @@
                 <w:noProof/>
                 <w:webHidden/>
               </w:rPr>
-              <w:t>2</w:t>
+              <w:t>3</w:t>
             </w:r>
             <w:r>
               <w:rPr>
@@ -120,7 +122,7 @@
               <w:noProof/>
             </w:rPr>
           </w:pPr>
-          <w:hyperlink w:anchor="_Toc225032855" w:history="1">
+          <w:hyperlink w:anchor="_Toc225115671" w:history="1">
             <w:r>
               <w:rPr>
                 <w:rStyle w:val="Hyperlink"/>
@@ -147,7 +149,7 @@
                 <w:noProof/>
                 <w:webHidden/>
               </w:rPr>
-              <w:instrText xml:space="preserve"> PAGEREF _Toc225032855 \h </w:instrText>
+              <w:instrText xml:space="preserve"> PAGEREF _Toc225115671 \h </w:instrText>
             </w:r>
             <w:r>
               <w:rPr>
@@ -167,7 +169,7 @@
                 <w:noProof/>
                 <w:webHidden/>
               </w:rPr>
-              <w:t>2</w:t>
+              <w:t>3</w:t>
             </w:r>
             <w:r>
               <w:rPr>
@@ -188,7 +190,7 @@
               <w:noProof/>
             </w:rPr>
           </w:pPr>
-          <w:hyperlink w:anchor="_Toc225032856" w:history="1">
+          <w:hyperlink w:anchor="_Toc225115672" w:history="1">
             <w:r>
               <w:rPr>
                 <w:rStyle w:val="Hyperlink"/>
@@ -215,7 +217,7 @@
                 <w:noProof/>
                 <w:webHidden/>
               </w:rPr>
-              <w:instrText xml:space="preserve"> PAGEREF _Toc225032856 \h </w:instrText>
+              <w:instrText xml:space="preserve"> PAGEREF _Toc225115672 \h </w:instrText>
             </w:r>
             <w:r>
               <w:rPr>
@@ -235,7 +237,7 @@
                 <w:noProof/>
                 <w:webHidden/>
               </w:rPr>
-              <w:t>2</w:t>
+              <w:t>3</w:t>
             </w:r>
             <w:r>
               <w:rPr>
@@ -256,13 +258,27 @@
               <w:noProof/>
             </w:rPr>
           </w:pPr>
-          <w:hyperlink w:anchor="_Toc225032857" w:history="1">
+          <w:hyperlink w:anchor="_Toc225115673" w:history="1">
             <w:r>
               <w:rPr>
                 <w:rStyle w:val="Hyperlink"/>
                 <w:noProof/>
               </w:rPr>
-              <w:t>2. Configure Entra ID: MFA (Security Defaults) + App Roles</w:t>
+              <w:t>2. Configure Entra ID: MFA (Security Default</w:t>
+            </w:r>
+            <w:r>
+              <w:rPr>
+                <w:rStyle w:val="Hyperlink"/>
+                <w:noProof/>
+              </w:rPr>
+              <w:t>s</w:t>
+            </w:r>
+            <w:r>
+              <w:rPr>
+                <w:rStyle w:val="Hyperlink"/>
+                <w:noProof/>
+              </w:rPr>
+              <w:t>) + App Roles</w:t>
             </w:r>
             <w:r>
               <w:rPr>
@@ -283,7 +299,7 @@
                 <w:noProof/>
                 <w:webHidden/>
               </w:rPr>
-              <w:instrText xml:space="preserve"> PAGEREF _Toc225032857 \h </w:instrText>
+              <w:instrText xml:space="preserve"> PAGEREF _Toc225115673 \h </w:instrText>
             </w:r>
             <w:r>
               <w:rPr>
@@ -303,7 +319,7 @@
                 <w:noProof/>
                 <w:webHidden/>
               </w:rPr>
-              <w:t>2</w:t>
+              <w:t>3</w:t>
             </w:r>
             <w:r>
               <w:rPr>
@@ -324,7 +340,7 @@
               <w:noProof/>
             </w:rPr>
           </w:pPr>
-          <w:hyperlink w:anchor="_Toc225032858" w:history="1">
+          <w:hyperlink w:anchor="_Toc225115674" w:history="1">
             <w:r>
               <w:rPr>
                 <w:rStyle w:val="Hyperlink"/>
@@ -351,7 +367,7 @@
                 <w:noProof/>
                 <w:webHidden/>
               </w:rPr>
-              <w:instrText xml:space="preserve"> PAGEREF _Toc225032858 \h </w:instrText>
+              <w:instrText xml:space="preserve"> PAGEREF _Toc225115674 \h </w:instrText>
             </w:r>
             <w:r>
               <w:rPr>
@@ -371,7 +387,7 @@
                 <w:noProof/>
                 <w:webHidden/>
               </w:rPr>
-              <w:t>2</w:t>
+              <w:t>3</w:t>
             </w:r>
             <w:r>
               <w:rPr>
@@ -392,7 +408,7 @@
               <w:noProof/>
             </w:rPr>
           </w:pPr>
-          <w:hyperlink w:anchor="_Toc225032859" w:history="1">
+          <w:hyperlink w:anchor="_Toc225115675" w:history="1">
             <w:r>
               <w:rPr>
                 <w:rStyle w:val="Hyperlink"/>
@@ -419,7 +435,7 @@
                 <w:noProof/>
                 <w:webHidden/>
               </w:rPr>
-              <w:instrText xml:space="preserve"> PAGEREF _Toc225032859 \h </w:instrText>
+              <w:instrText xml:space="preserve"> PAGEREF _Toc225115675 \h </w:instrText>
             </w:r>
             <w:r>
               <w:rPr>
@@ -439,7 +455,7 @@
                 <w:noProof/>
                 <w:webHidden/>
               </w:rPr>
-              <w:t>2</w:t>
+              <w:t>3</w:t>
             </w:r>
             <w:r>
               <w:rPr>
@@ -460,7 +476,7 @@
               <w:noProof/>
             </w:rPr>
           </w:pPr>
-          <w:hyperlink w:anchor="_Toc225032860" w:history="1">
+          <w:hyperlink w:anchor="_Toc225115676" w:history="1">
             <w:r>
               <w:rPr>
                 <w:rStyle w:val="Hyperlink"/>
@@ -487,7 +503,7 @@
                 <w:noProof/>
                 <w:webHidden/>
               </w:rPr>
-              <w:instrText xml:space="preserve"> PAGEREF _Toc225032860 \h </w:instrText>
+              <w:instrText xml:space="preserve"> PAGEREF _Toc225115676 \h </w:instrText>
             </w:r>
             <w:r>
               <w:rPr>
@@ -507,7 +523,7 @@
                 <w:noProof/>
                 <w:webHidden/>
               </w:rPr>
-              <w:t>3</w:t>
+              <w:t>4</w:t>
             </w:r>
             <w:r>
               <w:rPr>
@@ -528,7 +544,7 @@
               <w:noProof/>
             </w:rPr>
           </w:pPr>
-          <w:hyperlink w:anchor="_Toc225032861" w:history="1">
+          <w:hyperlink w:anchor="_Toc225115677" w:history="1">
             <w:r>
               <w:rPr>
                 <w:rStyle w:val="Hyperlink"/>
@@ -555,7 +571,7 @@
                 <w:noProof/>
                 <w:webHidden/>
               </w:rPr>
-              <w:instrText xml:space="preserve"> PAGEREF _Toc225032861 \h </w:instrText>
+              <w:instrText xml:space="preserve"> PAGEREF _Toc225115677 \h </w:instrText>
             </w:r>
             <w:r>
               <w:rPr>
@@ -575,7 +591,7 @@
                 <w:noProof/>
                 <w:webHidden/>
               </w:rPr>
-              <w:t>3</w:t>
+              <w:t>4</w:t>
             </w:r>
             <w:r>
               <w:rPr>
@@ -596,7 +612,7 @@
               <w:noProof/>
             </w:rPr>
           </w:pPr>
-          <w:hyperlink w:anchor="_Toc225032862" w:history="1">
+          <w:hyperlink w:anchor="_Toc225115678" w:history="1">
             <w:r>
               <w:rPr>
                 <w:rStyle w:val="Hyperlink"/>
@@ -623,7 +639,7 @@
                 <w:noProof/>
                 <w:webHidden/>
               </w:rPr>
-              <w:instrText xml:space="preserve"> PAGEREF _Toc225032862 \h </w:instrText>
+              <w:instrText xml:space="preserve"> PAGEREF _Toc225115678 \h </w:instrText>
             </w:r>
             <w:r>
               <w:rPr>
@@ -643,7 +659,7 @@
                 <w:noProof/>
                 <w:webHidden/>
               </w:rPr>
-              <w:t>3</w:t>
+              <w:t>4</w:t>
             </w:r>
             <w:r>
               <w:rPr>
@@ -664,7 +680,7 @@
               <w:noProof/>
             </w:rPr>
           </w:pPr>
-          <w:hyperlink w:anchor="_Toc225032863" w:history="1">
+          <w:hyperlink w:anchor="_Toc225115679" w:history="1">
             <w:r>
               <w:rPr>
                 <w:rStyle w:val="Hyperlink"/>
@@ -691,7 +707,7 @@
                 <w:noProof/>
                 <w:webHidden/>
               </w:rPr>
-              <w:instrText xml:space="preserve"> PAGEREF _Toc225032863 \h </w:instrText>
+              <w:instrText xml:space="preserve"> PAGEREF _Toc225115679 \h </w:instrText>
             </w:r>
             <w:r>
               <w:rPr>
@@ -711,7 +727,7 @@
                 <w:noProof/>
                 <w:webHidden/>
               </w:rPr>
-              <w:t>4</w:t>
+              <w:t>5</w:t>
             </w:r>
             <w:r>
               <w:rPr>
@@ -732,7 +748,7 @@
               <w:noProof/>
             </w:rPr>
           </w:pPr>
-          <w:hyperlink w:anchor="_Toc225032864" w:history="1">
+          <w:hyperlink w:anchor="_Toc225115680" w:history="1">
             <w:r>
               <w:rPr>
                 <w:rStyle w:val="Hyperlink"/>
@@ -759,7 +775,7 @@
                 <w:noProof/>
                 <w:webHidden/>
               </w:rPr>
-              <w:instrText xml:space="preserve"> PAGEREF _Toc225032864 \h </w:instrText>
+              <w:instrText xml:space="preserve"> PAGEREF _Toc225115680 \h </w:instrText>
             </w:r>
             <w:r>
               <w:rPr>
@@ -779,7 +795,7 @@
                 <w:noProof/>
                 <w:webHidden/>
               </w:rPr>
-              <w:t>4</w:t>
+              <w:t>5</w:t>
             </w:r>
             <w:r>
               <w:rPr>
@@ -800,7 +816,7 @@
               <w:noProof/>
             </w:rPr>
           </w:pPr>
-          <w:hyperlink w:anchor="_Toc225032865" w:history="1">
+          <w:hyperlink w:anchor="_Toc225115681" w:history="1">
             <w:r>
               <w:rPr>
                 <w:rStyle w:val="Hyperlink"/>
@@ -827,7 +843,7 @@
                 <w:noProof/>
                 <w:webHidden/>
               </w:rPr>
-              <w:instrText xml:space="preserve"> PAGEREF _Toc225032865 \h </w:instrText>
+              <w:instrText xml:space="preserve"> PAGEREF _Toc225115681 \h </w:instrText>
             </w:r>
             <w:r>
               <w:rPr>
@@ -847,7 +863,7 @@
                 <w:noProof/>
                 <w:webHidden/>
               </w:rPr>
-              <w:t>4</w:t>
+              <w:t>5</w:t>
             </w:r>
             <w:r>
               <w:rPr>
@@ -868,7 +884,7 @@
               <w:noProof/>
             </w:rPr>
           </w:pPr>
-          <w:hyperlink w:anchor="_Toc225032866" w:history="1">
+          <w:hyperlink w:anchor="_Toc225115682" w:history="1">
             <w:r>
               <w:rPr>
                 <w:rStyle w:val="Hyperlink"/>
@@ -895,7 +911,7 @@
                 <w:noProof/>
                 <w:webHidden/>
               </w:rPr>
-              <w:instrText xml:space="preserve"> PAGEREF _Toc225032866 \h </w:instrText>
+              <w:instrText xml:space="preserve"> PAGEREF _Toc225115682 \h </w:instrText>
             </w:r>
             <w:r>
               <w:rPr>
@@ -915,7 +931,7 @@
                 <w:noProof/>
                 <w:webHidden/>
               </w:rPr>
-              <w:t>4</w:t>
+              <w:t>5</w:t>
             </w:r>
             <w:r>
               <w:rPr>
@@ -936,7 +952,7 @@
               <w:noProof/>
             </w:rPr>
           </w:pPr>
-          <w:hyperlink w:anchor="_Toc225032867" w:history="1">
+          <w:hyperlink w:anchor="_Toc225115683" w:history="1">
             <w:r>
               <w:rPr>
                 <w:rStyle w:val="Hyperlink"/>
@@ -963,7 +979,7 @@
                 <w:noProof/>
                 <w:webHidden/>
               </w:rPr>
-              <w:instrText xml:space="preserve"> PAGEREF _Toc225032867 \h </w:instrText>
+              <w:instrText xml:space="preserve"> PAGEREF _Toc225115683 \h </w:instrText>
             </w:r>
             <w:r>
               <w:rPr>
@@ -983,7 +999,7 @@
                 <w:noProof/>
                 <w:webHidden/>
               </w:rPr>
-              <w:t>4</w:t>
+              <w:t>5</w:t>
             </w:r>
             <w:r>
               <w:rPr>
@@ -1004,7 +1020,7 @@
               <w:noProof/>
             </w:rPr>
           </w:pPr>
-          <w:hyperlink w:anchor="_Toc225032868" w:history="1">
+          <w:hyperlink w:anchor="_Toc225115684" w:history="1">
             <w:r>
               <w:rPr>
                 <w:rStyle w:val="Hyperlink"/>
@@ -1031,7 +1047,7 @@
                 <w:noProof/>
                 <w:webHidden/>
               </w:rPr>
-              <w:instrText xml:space="preserve"> PAGEREF _Toc225032868 \h </w:instrText>
+              <w:instrText xml:space="preserve"> PAGEREF _Toc225115684 \h </w:instrText>
             </w:r>
             <w:r>
               <w:rPr>
@@ -1051,7 +1067,7 @@
                 <w:noProof/>
                 <w:webHidden/>
               </w:rPr>
-              <w:t>5</w:t>
+              <w:t>6</w:t>
             </w:r>
             <w:r>
               <w:rPr>
@@ -1072,7 +1088,7 @@
               <w:noProof/>
             </w:rPr>
           </w:pPr>
-          <w:hyperlink w:anchor="_Toc225032869" w:history="1">
+          <w:hyperlink w:anchor="_Toc225115685" w:history="1">
             <w:r>
               <w:rPr>
                 <w:rStyle w:val="Hyperlink"/>
@@ -1099,7 +1115,7 @@
                 <w:noProof/>
                 <w:webHidden/>
               </w:rPr>
-              <w:instrText xml:space="preserve"> PAGEREF _Toc225032869 \h </w:instrText>
+              <w:instrText xml:space="preserve"> PAGEREF _Toc225115685 \h </w:instrText>
             </w:r>
             <w:r>
               <w:rPr>
@@ -1119,7 +1135,7 @@
                 <w:noProof/>
                 <w:webHidden/>
               </w:rPr>
-              <w:t>6</w:t>
+              <w:t>7</w:t>
             </w:r>
             <w:r>
               <w:rPr>
@@ -1140,7 +1156,7 @@
               <w:noProof/>
             </w:rPr>
           </w:pPr>
-          <w:hyperlink w:anchor="_Toc225032870" w:history="1">
+          <w:hyperlink w:anchor="_Toc225115686" w:history="1">
             <w:r>
               <w:rPr>
                 <w:rStyle w:val="Hyperlink"/>
@@ -1167,7 +1183,7 @@
                 <w:noProof/>
                 <w:webHidden/>
               </w:rPr>
-              <w:instrText xml:space="preserve"> PAGEREF _Toc225032870 \h </w:instrText>
+              <w:instrText xml:space="preserve"> PAGEREF _Toc225115686 \h </w:instrText>
             </w:r>
             <w:r>
               <w:rPr>
@@ -1187,7 +1203,7 @@
                 <w:noProof/>
                 <w:webHidden/>
               </w:rPr>
-              <w:t>6</w:t>
+              <w:t>7</w:t>
             </w:r>
             <w:r>
               <w:rPr>
@@ -1208,7 +1224,7 @@
               <w:noProof/>
             </w:rPr>
           </w:pPr>
-          <w:hyperlink w:anchor="_Toc225032871" w:history="1">
+          <w:hyperlink w:anchor="_Toc225115687" w:history="1">
             <w:r>
               <w:rPr>
                 <w:rStyle w:val="Hyperlink"/>
@@ -1244,7 +1260,7 @@
                 <w:noProof/>
                 <w:webHidden/>
               </w:rPr>
-              <w:instrText xml:space="preserve"> PAGEREF _Toc225032871 \h </w:instrText>
+              <w:instrText xml:space="preserve"> PAGEREF _Toc225115687 \h </w:instrText>
             </w:r>
             <w:r>
               <w:rPr>
@@ -1264,7 +1280,7 @@
                 <w:noProof/>
                 <w:webHidden/>
               </w:rPr>
-              <w:t>7</w:t>
+              <w:t>8</w:t>
             </w:r>
             <w:r>
               <w:rPr>
@@ -1285,7 +1301,7 @@
               <w:noProof/>
             </w:rPr>
           </w:pPr>
-          <w:hyperlink w:anchor="_Toc225032872" w:history="1">
+          <w:hyperlink w:anchor="_Toc225115688" w:history="1">
             <w:r>
               <w:rPr>
                 <w:rStyle w:val="Hyperlink"/>
@@ -1312,7 +1328,7 @@
                 <w:noProof/>
                 <w:webHidden/>
               </w:rPr>
-              <w:instrText xml:space="preserve"> PAGEREF _Toc225032872 \h </w:instrText>
+              <w:instrText xml:space="preserve"> PAGEREF _Toc225115688 \h </w:instrText>
             </w:r>
             <w:r>
               <w:rPr>
@@ -1332,7 +1348,7 @@
                 <w:noProof/>
                 <w:webHidden/>
               </w:rPr>
-              <w:t>7</w:t>
+              <w:t>8</w:t>
             </w:r>
             <w:r>
               <w:rPr>
@@ -1353,7 +1369,7 @@
               <w:noProof/>
             </w:rPr>
           </w:pPr>
-          <w:hyperlink w:anchor="_Toc225032873" w:history="1">
+          <w:hyperlink w:anchor="_Toc225115689" w:history="1">
             <w:r>
               <w:rPr>
                 <w:rStyle w:val="Hyperlink"/>
@@ -1380,7 +1396,7 @@
                 <w:noProof/>
                 <w:webHidden/>
               </w:rPr>
-              <w:instrText xml:space="preserve"> PAGEREF _Toc225032873 \h </w:instrText>
+              <w:instrText xml:space="preserve"> PAGEREF _Toc225115689 \h </w:instrText>
             </w:r>
             <w:r>
               <w:rPr>
@@ -1400,7 +1416,7 @@
                 <w:noProof/>
                 <w:webHidden/>
               </w:rPr>
-              <w:t>7</w:t>
+              <w:t>8</w:t>
             </w:r>
             <w:r>
               <w:rPr>
@@ -1421,7 +1437,7 @@
               <w:noProof/>
             </w:rPr>
           </w:pPr>
-          <w:hyperlink w:anchor="_Toc225032874" w:history="1">
+          <w:hyperlink w:anchor="_Toc225115690" w:history="1">
             <w:r>
               <w:rPr>
                 <w:rStyle w:val="Hyperlink"/>
@@ -1448,7 +1464,7 @@
                 <w:noProof/>
                 <w:webHidden/>
               </w:rPr>
-              <w:instrText xml:space="preserve"> PAGEREF _Toc225032874 \h </w:instrText>
+              <w:instrText xml:space="preserve"> PAGEREF _Toc225115690 \h </w:instrText>
             </w:r>
             <w:r>
               <w:rPr>
@@ -1468,7 +1484,7 @@
                 <w:noProof/>
                 <w:webHidden/>
               </w:rPr>
-              <w:t>8</w:t>
+              <w:t>9</w:t>
             </w:r>
             <w:r>
               <w:rPr>
@@ -1489,7 +1505,7 @@
               <w:noProof/>
             </w:rPr>
           </w:pPr>
-          <w:hyperlink w:anchor="_Toc225032875" w:history="1">
+          <w:hyperlink w:anchor="_Toc225115691" w:history="1">
             <w:r>
               <w:rPr>
                 <w:rStyle w:val="Hyperlink"/>
@@ -1516,7 +1532,7 @@
                 <w:noProof/>
                 <w:webHidden/>
               </w:rPr>
-              <w:instrText xml:space="preserve"> PAGEREF _Toc225032875 \h </w:instrText>
+              <w:instrText xml:space="preserve"> PAGEREF _Toc225115691 \h </w:instrText>
             </w:r>
             <w:r>
               <w:rPr>
@@ -1536,7 +1552,7 @@
                 <w:noProof/>
                 <w:webHidden/>
               </w:rPr>
-              <w:t>8</w:t>
+              <w:t>9</w:t>
             </w:r>
             <w:r>
               <w:rPr>
@@ -1557,7 +1573,7 @@
               <w:noProof/>
             </w:rPr>
           </w:pPr>
-          <w:hyperlink w:anchor="_Toc225032876" w:history="1">
+          <w:hyperlink w:anchor="_Toc225115692" w:history="1">
             <w:r>
               <w:rPr>
                 <w:rStyle w:val="Hyperlink"/>
@@ -1593,7 +1609,7 @@
                 <w:noProof/>
                 <w:webHidden/>
               </w:rPr>
-              <w:instrText xml:space="preserve"> PAGEREF _Toc225032876 \h </w:instrText>
+              <w:instrText xml:space="preserve"> PAGEREF _Toc225115692 \h </w:instrText>
             </w:r>
             <w:r>
               <w:rPr>
@@ -1613,7 +1629,7 @@
                 <w:noProof/>
                 <w:webHidden/>
               </w:rPr>
-              <w:t>8</w:t>
+              <w:t>9</w:t>
             </w:r>
             <w:r>
               <w:rPr>
@@ -1634,7 +1650,7 @@
               <w:noProof/>
             </w:rPr>
           </w:pPr>
-          <w:hyperlink w:anchor="_Toc225032877" w:history="1">
+          <w:hyperlink w:anchor="_Toc225115693" w:history="1">
             <w:r>
               <w:rPr>
                 <w:rStyle w:val="Hyperlink"/>
@@ -1670,7 +1686,7 @@
                 <w:noProof/>
                 <w:webHidden/>
               </w:rPr>
-              <w:instrText xml:space="preserve"> PAGEREF _Toc225032877 \h </w:instrText>
+              <w:instrText xml:space="preserve"> PAGEREF _Toc225115693 \h </w:instrText>
             </w:r>
             <w:r>
               <w:rPr>
@@ -1690,7 +1706,7 @@
                 <w:noProof/>
                 <w:webHidden/>
               </w:rPr>
-              <w:t>9</w:t>
+              <w:t>10</w:t>
             </w:r>
             <w:r>
               <w:rPr>
@@ -1711,7 +1727,7 @@
               <w:noProof/>
             </w:rPr>
           </w:pPr>
-          <w:hyperlink w:anchor="_Toc225032878" w:history="1">
+          <w:hyperlink w:anchor="_Toc225115694" w:history="1">
             <w:r>
               <w:rPr>
                 <w:rStyle w:val="Hyperlink"/>
@@ -1747,7 +1763,7 @@
                 <w:noProof/>
                 <w:webHidden/>
               </w:rPr>
-              <w:instrText xml:space="preserve"> PAGEREF _Toc225032878 \h </w:instrText>
+              <w:instrText xml:space="preserve"> PAGEREF _Toc225115694 \h </w:instrText>
             </w:r>
             <w:r>
               <w:rPr>
@@ -1767,7 +1783,619 @@
                 <w:noProof/>
                 <w:webHidden/>
               </w:rPr>
-              <w:t>11</w:t>
+              <w:t>12</w:t>
+            </w:r>
+            <w:r>
+              <w:rPr>
+                <w:noProof/>
+                <w:webHidden/>
+              </w:rPr>
+              <w:fldChar w:fldCharType="end"/>
+            </w:r>
+          </w:hyperlink>
+        </w:p>
+        <w:p>
+          <w:pPr>
+            <w:pStyle w:val="TOC1"/>
+            <w:tabs>
+              <w:tab w:val="right" w:leader="dot" w:pos="10338"/>
+            </w:tabs>
+            <w:rPr>
+              <w:noProof/>
+            </w:rPr>
+          </w:pPr>
+          <w:hyperlink w:anchor="_Toc225115695" w:history="1">
+            <w:r>
+              <w:rPr>
+                <w:rStyle w:val="Hyperlink"/>
+                <w:noProof/>
+              </w:rPr>
+              <w:t>5. POC – Report Entry Comments</w:t>
+            </w:r>
+            <w:r>
+              <w:rPr>
+                <w:noProof/>
+                <w:webHidden/>
+              </w:rPr>
+              <w:tab/>
+            </w:r>
+            <w:r>
+              <w:rPr>
+                <w:noProof/>
+                <w:webHidden/>
+              </w:rPr>
+              <w:fldChar w:fldCharType="begin"/>
+            </w:r>
+            <w:r>
+              <w:rPr>
+                <w:noProof/>
+                <w:webHidden/>
+              </w:rPr>
+              <w:instrText xml:space="preserve"> PAGEREF _Toc225115695 \h </w:instrText>
+            </w:r>
+            <w:r>
+              <w:rPr>
+                <w:noProof/>
+                <w:webHidden/>
+              </w:rPr>
+            </w:r>
+            <w:r>
+              <w:rPr>
+                <w:noProof/>
+                <w:webHidden/>
+              </w:rPr>
+              <w:fldChar w:fldCharType="separate"/>
+            </w:r>
+            <w:r>
+              <w:rPr>
+                <w:noProof/>
+                <w:webHidden/>
+              </w:rPr>
+              <w:t>14</w:t>
+            </w:r>
+            <w:r>
+              <w:rPr>
+                <w:noProof/>
+                <w:webHidden/>
+              </w:rPr>
+              <w:fldChar w:fldCharType="end"/>
+            </w:r>
+          </w:hyperlink>
+        </w:p>
+        <w:p>
+          <w:pPr>
+            <w:pStyle w:val="TOC2"/>
+            <w:tabs>
+              <w:tab w:val="right" w:leader="dot" w:pos="10338"/>
+            </w:tabs>
+            <w:rPr>
+              <w:noProof/>
+            </w:rPr>
+          </w:pPr>
+          <w:hyperlink w:anchor="_Toc225115696" w:history="1">
+            <w:r>
+              <w:rPr>
+                <w:rStyle w:val="Hyperlink"/>
+                <w:noProof/>
+              </w:rPr>
+              <w:t>5.1 Phase 0  - Database Setup</w:t>
+            </w:r>
+            <w:r>
+              <w:rPr>
+                <w:noProof/>
+                <w:webHidden/>
+              </w:rPr>
+              <w:tab/>
+            </w:r>
+            <w:r>
+              <w:rPr>
+                <w:noProof/>
+                <w:webHidden/>
+              </w:rPr>
+              <w:fldChar w:fldCharType="begin"/>
+            </w:r>
+            <w:r>
+              <w:rPr>
+                <w:noProof/>
+                <w:webHidden/>
+              </w:rPr>
+              <w:instrText xml:space="preserve"> PAGEREF _Toc225115696 \h </w:instrText>
+            </w:r>
+            <w:r>
+              <w:rPr>
+                <w:noProof/>
+                <w:webHidden/>
+              </w:rPr>
+            </w:r>
+            <w:r>
+              <w:rPr>
+                <w:noProof/>
+                <w:webHidden/>
+              </w:rPr>
+              <w:fldChar w:fldCharType="separate"/>
+            </w:r>
+            <w:r>
+              <w:rPr>
+                <w:noProof/>
+                <w:webHidden/>
+              </w:rPr>
+              <w:t>14</w:t>
+            </w:r>
+            <w:r>
+              <w:rPr>
+                <w:noProof/>
+                <w:webHidden/>
+              </w:rPr>
+              <w:fldChar w:fldCharType="end"/>
+            </w:r>
+          </w:hyperlink>
+        </w:p>
+        <w:p>
+          <w:pPr>
+            <w:pStyle w:val="TOC3"/>
+            <w:tabs>
+              <w:tab w:val="right" w:leader="dot" w:pos="10338"/>
+            </w:tabs>
+            <w:rPr>
+              <w:noProof/>
+            </w:rPr>
+          </w:pPr>
+          <w:hyperlink w:anchor="_Toc225115697" w:history="1">
+            <w:r>
+              <w:rPr>
+                <w:rStyle w:val="Hyperlink"/>
+                <w:noProof/>
+              </w:rPr>
+              <w:t>5.1.1 Install SQL Server Developer Edition</w:t>
+            </w:r>
+            <w:r>
+              <w:rPr>
+                <w:noProof/>
+                <w:webHidden/>
+              </w:rPr>
+              <w:tab/>
+            </w:r>
+            <w:r>
+              <w:rPr>
+                <w:noProof/>
+                <w:webHidden/>
+              </w:rPr>
+              <w:fldChar w:fldCharType="begin"/>
+            </w:r>
+            <w:r>
+              <w:rPr>
+                <w:noProof/>
+                <w:webHidden/>
+              </w:rPr>
+              <w:instrText xml:space="preserve"> PAGEREF _Toc225115697 \h </w:instrText>
+            </w:r>
+            <w:r>
+              <w:rPr>
+                <w:noProof/>
+                <w:webHidden/>
+              </w:rPr>
+            </w:r>
+            <w:r>
+              <w:rPr>
+                <w:noProof/>
+                <w:webHidden/>
+              </w:rPr>
+              <w:fldChar w:fldCharType="separate"/>
+            </w:r>
+            <w:r>
+              <w:rPr>
+                <w:noProof/>
+                <w:webHidden/>
+              </w:rPr>
+              <w:t>14</w:t>
+            </w:r>
+            <w:r>
+              <w:rPr>
+                <w:noProof/>
+                <w:webHidden/>
+              </w:rPr>
+              <w:fldChar w:fldCharType="end"/>
+            </w:r>
+          </w:hyperlink>
+        </w:p>
+        <w:p>
+          <w:pPr>
+            <w:pStyle w:val="TOC3"/>
+            <w:tabs>
+              <w:tab w:val="right" w:leader="dot" w:pos="10338"/>
+            </w:tabs>
+            <w:rPr>
+              <w:noProof/>
+            </w:rPr>
+          </w:pPr>
+          <w:hyperlink w:anchor="_Toc225115698" w:history="1">
+            <w:r>
+              <w:rPr>
+                <w:rStyle w:val="Hyperlink"/>
+                <w:noProof/>
+              </w:rPr>
+              <w:t>5.1.2 Connect from DBeaver</w:t>
+            </w:r>
+            <w:r>
+              <w:rPr>
+                <w:noProof/>
+                <w:webHidden/>
+              </w:rPr>
+              <w:tab/>
+            </w:r>
+            <w:r>
+              <w:rPr>
+                <w:noProof/>
+                <w:webHidden/>
+              </w:rPr>
+              <w:fldChar w:fldCharType="begin"/>
+            </w:r>
+            <w:r>
+              <w:rPr>
+                <w:noProof/>
+                <w:webHidden/>
+              </w:rPr>
+              <w:instrText xml:space="preserve"> PAGEREF _Toc225115698 \h </w:instrText>
+            </w:r>
+            <w:r>
+              <w:rPr>
+                <w:noProof/>
+                <w:webHidden/>
+              </w:rPr>
+            </w:r>
+            <w:r>
+              <w:rPr>
+                <w:noProof/>
+                <w:webHidden/>
+              </w:rPr>
+              <w:fldChar w:fldCharType="separate"/>
+            </w:r>
+            <w:r>
+              <w:rPr>
+                <w:noProof/>
+                <w:webHidden/>
+              </w:rPr>
+              <w:t>15</w:t>
+            </w:r>
+            <w:r>
+              <w:rPr>
+                <w:noProof/>
+                <w:webHidden/>
+              </w:rPr>
+              <w:fldChar w:fldCharType="end"/>
+            </w:r>
+          </w:hyperlink>
+        </w:p>
+        <w:p>
+          <w:pPr>
+            <w:pStyle w:val="TOC3"/>
+            <w:tabs>
+              <w:tab w:val="right" w:leader="dot" w:pos="10338"/>
+            </w:tabs>
+            <w:rPr>
+              <w:noProof/>
+            </w:rPr>
+          </w:pPr>
+          <w:hyperlink w:anchor="_Toc225115699" w:history="1">
+            <w:r>
+              <w:rPr>
+                <w:rStyle w:val="Hyperlink"/>
+                <w:noProof/>
+              </w:rPr>
+              <w:t>5.1.3 Create Database</w:t>
+            </w:r>
+            <w:r>
+              <w:rPr>
+                <w:noProof/>
+                <w:webHidden/>
+              </w:rPr>
+              <w:tab/>
+            </w:r>
+            <w:r>
+              <w:rPr>
+                <w:noProof/>
+                <w:webHidden/>
+              </w:rPr>
+              <w:fldChar w:fldCharType="begin"/>
+            </w:r>
+            <w:r>
+              <w:rPr>
+                <w:noProof/>
+                <w:webHidden/>
+              </w:rPr>
+              <w:instrText xml:space="preserve"> PAGEREF _Toc225115699 \h </w:instrText>
+            </w:r>
+            <w:r>
+              <w:rPr>
+                <w:noProof/>
+                <w:webHidden/>
+              </w:rPr>
+            </w:r>
+            <w:r>
+              <w:rPr>
+                <w:noProof/>
+                <w:webHidden/>
+              </w:rPr>
+              <w:fldChar w:fldCharType="separate"/>
+            </w:r>
+            <w:r>
+              <w:rPr>
+                <w:noProof/>
+                <w:webHidden/>
+              </w:rPr>
+              <w:t>17</w:t>
+            </w:r>
+            <w:r>
+              <w:rPr>
+                <w:noProof/>
+                <w:webHidden/>
+              </w:rPr>
+              <w:fldChar w:fldCharType="end"/>
+            </w:r>
+          </w:hyperlink>
+        </w:p>
+        <w:p>
+          <w:pPr>
+            <w:pStyle w:val="TOC3"/>
+            <w:tabs>
+              <w:tab w:val="right" w:leader="dot" w:pos="10338"/>
+            </w:tabs>
+            <w:rPr>
+              <w:noProof/>
+            </w:rPr>
+          </w:pPr>
+          <w:hyperlink w:anchor="_Toc225115700" w:history="1">
+            <w:r>
+              <w:rPr>
+                <w:rStyle w:val="Hyperlink"/>
+                <w:noProof/>
+              </w:rPr>
+              <w:t>5.1.4 Create Tables</w:t>
+            </w:r>
+            <w:r>
+              <w:rPr>
+                <w:noProof/>
+                <w:webHidden/>
+              </w:rPr>
+              <w:tab/>
+            </w:r>
+            <w:r>
+              <w:rPr>
+                <w:noProof/>
+                <w:webHidden/>
+              </w:rPr>
+              <w:fldChar w:fldCharType="begin"/>
+            </w:r>
+            <w:r>
+              <w:rPr>
+                <w:noProof/>
+                <w:webHidden/>
+              </w:rPr>
+              <w:instrText xml:space="preserve"> PAGEREF _Toc225115700 \h </w:instrText>
+            </w:r>
+            <w:r>
+              <w:rPr>
+                <w:noProof/>
+                <w:webHidden/>
+              </w:rPr>
+            </w:r>
+            <w:r>
+              <w:rPr>
+                <w:noProof/>
+                <w:webHidden/>
+              </w:rPr>
+              <w:fldChar w:fldCharType="separate"/>
+            </w:r>
+            <w:r>
+              <w:rPr>
+                <w:noProof/>
+                <w:webHidden/>
+              </w:rPr>
+              <w:t>17</w:t>
+            </w:r>
+            <w:r>
+              <w:rPr>
+                <w:noProof/>
+                <w:webHidden/>
+              </w:rPr>
+              <w:fldChar w:fldCharType="end"/>
+            </w:r>
+          </w:hyperlink>
+        </w:p>
+        <w:p>
+          <w:pPr>
+            <w:pStyle w:val="TOC3"/>
+            <w:tabs>
+              <w:tab w:val="right" w:leader="dot" w:pos="10338"/>
+            </w:tabs>
+            <w:rPr>
+              <w:noProof/>
+            </w:rPr>
+          </w:pPr>
+          <w:hyperlink w:anchor="_Toc225115701" w:history="1">
+            <w:r>
+              <w:rPr>
+                <w:rStyle w:val="Hyperlink"/>
+                <w:noProof/>
+              </w:rPr>
+              <w:t>5.1.5 Insert Initial Data</w:t>
+            </w:r>
+            <w:r>
+              <w:rPr>
+                <w:noProof/>
+                <w:webHidden/>
+              </w:rPr>
+              <w:tab/>
+            </w:r>
+            <w:r>
+              <w:rPr>
+                <w:noProof/>
+                <w:webHidden/>
+              </w:rPr>
+              <w:fldChar w:fldCharType="begin"/>
+            </w:r>
+            <w:r>
+              <w:rPr>
+                <w:noProof/>
+                <w:webHidden/>
+              </w:rPr>
+              <w:instrText xml:space="preserve"> PAGEREF _Toc225115701 \h </w:instrText>
+            </w:r>
+            <w:r>
+              <w:rPr>
+                <w:noProof/>
+                <w:webHidden/>
+              </w:rPr>
+            </w:r>
+            <w:r>
+              <w:rPr>
+                <w:noProof/>
+                <w:webHidden/>
+              </w:rPr>
+              <w:fldChar w:fldCharType="separate"/>
+            </w:r>
+            <w:r>
+              <w:rPr>
+                <w:noProof/>
+                <w:webHidden/>
+              </w:rPr>
+              <w:t>17</w:t>
+            </w:r>
+            <w:r>
+              <w:rPr>
+                <w:noProof/>
+                <w:webHidden/>
+              </w:rPr>
+              <w:fldChar w:fldCharType="end"/>
+            </w:r>
+          </w:hyperlink>
+        </w:p>
+        <w:p>
+          <w:pPr>
+            <w:pStyle w:val="TOC2"/>
+            <w:tabs>
+              <w:tab w:val="right" w:leader="dot" w:pos="10338"/>
+            </w:tabs>
+            <w:rPr>
+              <w:noProof/>
+            </w:rPr>
+          </w:pPr>
+          <w:hyperlink w:anchor="_Toc225115702" w:history="1">
+            <w:r>
+              <w:rPr>
+                <w:rStyle w:val="Hyperlink"/>
+                <w:noProof/>
+              </w:rPr>
+              <w:t>5.2 Phase 1 — Spring Data JPA + Budget Migration</w:t>
+            </w:r>
+            <w:r>
+              <w:rPr>
+                <w:noProof/>
+                <w:webHidden/>
+              </w:rPr>
+              <w:tab/>
+            </w:r>
+            <w:r>
+              <w:rPr>
+                <w:noProof/>
+                <w:webHidden/>
+              </w:rPr>
+              <w:fldChar w:fldCharType="begin"/>
+            </w:r>
+            <w:r>
+              <w:rPr>
+                <w:noProof/>
+                <w:webHidden/>
+              </w:rPr>
+              <w:instrText xml:space="preserve"> PAGEREF _Toc225115702 \h </w:instrText>
+            </w:r>
+            <w:r>
+              <w:rPr>
+                <w:noProof/>
+                <w:webHidden/>
+              </w:rPr>
+            </w:r>
+            <w:r>
+              <w:rPr>
+                <w:noProof/>
+                <w:webHidden/>
+              </w:rPr>
+              <w:fldChar w:fldCharType="separate"/>
+            </w:r>
+            <w:r>
+              <w:rPr>
+                <w:noProof/>
+                <w:webHidden/>
+              </w:rPr>
+              <w:t>17</w:t>
+            </w:r>
+            <w:r>
+              <w:rPr>
+                <w:noProof/>
+                <w:webHidden/>
+              </w:rPr>
+              <w:fldChar w:fldCharType="end"/>
+            </w:r>
+          </w:hyperlink>
+        </w:p>
+        <w:p>
+          <w:pPr>
+            <w:pStyle w:val="TOC3"/>
+            <w:tabs>
+              <w:tab w:val="right" w:leader="dot" w:pos="10338"/>
+            </w:tabs>
+            <w:rPr>
+              <w:noProof/>
+            </w:rPr>
+          </w:pPr>
+          <w:hyperlink w:anchor="_Toc225115703" w:history="1">
+            <w:r>
+              <w:rPr>
+                <w:rStyle w:val="Hyperlink"/>
+                <w:noProof/>
+              </w:rPr>
+              <w:t>5.3 Phase 2 — Comment Module &amp; Entities</w:t>
+            </w:r>
+            <w:r>
+              <w:rPr>
+                <w:noProof/>
+                <w:webHidden/>
+              </w:rPr>
+              <w:tab/>
+            </w:r>
+            <w:r>
+              <w:rPr>
+                <w:noProof/>
+                <w:webHidden/>
+              </w:rPr>
+              <w:fldChar w:fldCharType="begin"/>
+            </w:r>
+            <w:r>
+              <w:rPr>
+                <w:noProof/>
+                <w:webHidden/>
+              </w:rPr>
+              <w:instrText xml:space="preserve"> PAGEREF _Toc225115703 \h </w:instrText>
+            </w:r>
+            <w:r>
+              <w:rPr>
+                <w:noProof/>
+                <w:webHidden/>
+              </w:rPr>
+            </w:r>
+            <w:r>
+              <w:rPr>
+                <w:noProof/>
+                <w:webHidden/>
+              </w:rPr>
+              <w:fldChar w:fldCharType="separate"/>
+            </w:r>
+            <w:r>
+              <w:rPr>
+                <w:noProof/>
+                <w:webHidden/>
+              </w:rPr>
+              <w:t>18</w:t>
             </w:r>
             <w:r>
               <w:rPr>
@@ -1807,7 +2435,7 @@
       <w:pPr>
         <w:pStyle w:val="Heading1"/>
       </w:pPr>
-      <w:bookmarkStart w:id="0" w:name="_Toc225032854"/>
+      <w:bookmarkStart w:id="0" w:name="_Toc225115670"/>
       <w:r>
         <w:lastRenderedPageBreak/>
         <w:t xml:space="preserve">1. </w:t>
@@ -1821,7 +2449,7 @@
       <w:pPr>
         <w:pStyle w:val="Heading2"/>
       </w:pPr>
-      <w:bookmarkStart w:id="1" w:name="_Toc225032855"/>
+      <w:bookmarkStart w:id="1" w:name="_Toc225115671"/>
       <w:r>
         <w:t xml:space="preserve">1.1 </w:t>
       </w:r>
@@ -2000,7 +2628,7 @@
       <w:pPr>
         <w:pStyle w:val="Heading2"/>
       </w:pPr>
-      <w:bookmarkStart w:id="2" w:name="_Toc225032856"/>
+      <w:bookmarkStart w:id="2" w:name="_Toc225115672"/>
       <w:r>
         <w:t xml:space="preserve">1.2 </w:t>
       </w:r>
@@ -2116,7 +2744,7 @@
       <w:pPr>
         <w:pStyle w:val="Heading1"/>
       </w:pPr>
-      <w:bookmarkStart w:id="3" w:name="_Toc225032857"/>
+      <w:bookmarkStart w:id="3" w:name="_Toc225115673"/>
       <w:r>
         <w:t xml:space="preserve">2. </w:t>
       </w:r>
@@ -2129,7 +2757,7 @@
       <w:pPr>
         <w:pStyle w:val="Heading2"/>
       </w:pPr>
-      <w:bookmarkStart w:id="4" w:name="_Toc225032858"/>
+      <w:bookmarkStart w:id="4" w:name="_Toc225115674"/>
       <w:r>
         <w:t>2</w:t>
       </w:r>
@@ -2256,6 +2884,7 @@
         </w:numPr>
       </w:pPr>
       <w:r>
+        <w:lastRenderedPageBreak/>
         <w:t xml:space="preserve">Turn </w:t>
       </w:r>
       <w:r>
@@ -2292,7 +2921,7 @@
       <w:pPr>
         <w:pStyle w:val="Heading2"/>
       </w:pPr>
-      <w:bookmarkStart w:id="5" w:name="_Toc225032859"/>
+      <w:bookmarkStart w:id="5" w:name="_Toc225115675"/>
       <w:r>
         <w:t>2</w:t>
       </w:r>
@@ -2365,7 +2994,6 @@
         <w:ind w:left="720"/>
       </w:pPr>
       <w:r>
-        <w:lastRenderedPageBreak/>
         <w:t>leap-poc-read2</w:t>
       </w:r>
     </w:p>
@@ -2389,7 +3017,7 @@
       <w:pPr>
         <w:pStyle w:val="Heading2"/>
       </w:pPr>
-      <w:bookmarkStart w:id="6" w:name="_Toc225032860"/>
+      <w:bookmarkStart w:id="6" w:name="_Toc225115676"/>
       <w:r>
         <w:t>2</w:t>
       </w:r>
@@ -2556,7 +3184,7 @@
       <w:pPr>
         <w:pStyle w:val="Heading3"/>
       </w:pPr>
-      <w:bookmarkStart w:id="7" w:name="_Toc225032861"/>
+      <w:bookmarkStart w:id="7" w:name="_Toc225115677"/>
       <w:r>
         <w:t>2</w:t>
       </w:r>
@@ -2649,6 +3277,7 @@
         <w:ind w:left="1134"/>
       </w:pPr>
       <w:r>
+        <w:lastRenderedPageBreak/>
         <w:t xml:space="preserve">Client secret: </w:t>
       </w:r>
       <w:r>
@@ -2675,7 +3304,7 @@
       <w:pPr>
         <w:pStyle w:val="Heading3"/>
       </w:pPr>
-      <w:bookmarkStart w:id="8" w:name="_Toc225032862"/>
+      <w:bookmarkStart w:id="8" w:name="_Toc225115678"/>
       <w:r>
         <w:t xml:space="preserve">1.3.2 </w:t>
       </w:r>
@@ -2866,9 +3495,8 @@
       <w:pPr>
         <w:pStyle w:val="Heading2"/>
       </w:pPr>
-      <w:bookmarkStart w:id="9" w:name="_Toc225032863"/>
-      <w:r>
-        <w:lastRenderedPageBreak/>
+      <w:bookmarkStart w:id="9" w:name="_Toc225115679"/>
+      <w:r>
         <w:t xml:space="preserve">1.4 </w:t>
       </w:r>
       <w:r>
@@ -2994,6 +3622,7 @@
         </w:numPr>
       </w:pPr>
       <w:r>
+        <w:lastRenderedPageBreak/>
         <w:t xml:space="preserve">Create role </w:t>
       </w:r>
       <w:r>
@@ -3034,7 +3663,7 @@
       <w:pPr>
         <w:pStyle w:val="Heading2"/>
       </w:pPr>
-      <w:bookmarkStart w:id="10" w:name="_Toc225032864"/>
+      <w:bookmarkStart w:id="10" w:name="_Toc225115680"/>
       <w:r>
         <w:t xml:space="preserve">1.5 </w:t>
       </w:r>
@@ -3201,7 +3830,7 @@
       <w:pPr>
         <w:pStyle w:val="Heading1"/>
       </w:pPr>
-      <w:bookmarkStart w:id="11" w:name="_Toc225032865"/>
+      <w:bookmarkStart w:id="11" w:name="_Toc225115681"/>
       <w:r>
         <w:t xml:space="preserve">3. </w:t>
       </w:r>
@@ -3241,10 +3870,10 @@
             <v:path o:extrusionok="f" gradientshapeok="t" o:connecttype="rect"/>
             <o:lock v:ext="edit" aspectratio="t"/>
           </v:shapetype>
-          <v:shape id="_x0000_i1025" type="#_x0000_t75" style="width:75.6pt;height:49.35pt" o:ole="">
+          <v:shape id="_x0000_i1025" type="#_x0000_t75" style="width:75.4pt;height:49.6pt" o:ole="">
             <v:imagedata r:id="rId9" o:title=""/>
           </v:shape>
-          <o:OLEObject Type="Embed" ProgID="Package" ShapeID="_x0000_i1025" DrawAspect="Icon" ObjectID="_1835723698" r:id="rId10"/>
+          <o:OLEObject Type="Embed" ProgID="Package" ShapeID="_x0000_i1025" DrawAspect="Icon" ObjectID="_1835809924" r:id="rId10"/>
         </w:object>
       </w:r>
     </w:p>
@@ -3252,7 +3881,7 @@
       <w:pPr>
         <w:pStyle w:val="Heading2"/>
       </w:pPr>
-      <w:bookmarkStart w:id="12" w:name="_Toc225032866"/>
+      <w:bookmarkStart w:id="12" w:name="_Toc225115682"/>
       <w:r>
         <w:t>3.</w:t>
       </w:r>
@@ -3265,7 +3894,7 @@
       <w:pPr>
         <w:pStyle w:val="Heading3"/>
       </w:pPr>
-      <w:bookmarkStart w:id="13" w:name="_Toc225032867"/>
+      <w:bookmarkStart w:id="13" w:name="_Toc225115683"/>
       <w:r>
         <w:t>3.1.1 BFF Authentication Flow Sequence Diagram</w:t>
       </w:r>
@@ -3274,10 +3903,10 @@
     <w:p>
       <w:r>
         <w:object w:dxaOrig="1514" w:dyaOrig="987" w14:anchorId="56E11D1A">
-          <v:shape id="_x0000_i1026" type="#_x0000_t75" style="width:75.6pt;height:49.35pt" o:ole="">
+          <v:shape id="_x0000_i1026" type="#_x0000_t75" style="width:75.4pt;height:49.6pt" o:ole="">
             <v:imagedata r:id="rId11" o:title=""/>
           </v:shape>
-          <o:OLEObject Type="Embed" ProgID="Package" ShapeID="_x0000_i1026" DrawAspect="Icon" ObjectID="_1835723699" r:id="rId12"/>
+          <o:OLEObject Type="Embed" ProgID="Package" ShapeID="_x0000_i1026" DrawAspect="Icon" ObjectID="_1835809925" r:id="rId12"/>
         </w:object>
       </w:r>
     </w:p>
@@ -3341,7 +3970,7 @@
       <w:pPr>
         <w:pStyle w:val="Heading3"/>
       </w:pPr>
-      <w:bookmarkStart w:id="14" w:name="_Toc225032868"/>
+      <w:bookmarkStart w:id="14" w:name="_Toc225115684"/>
       <w:r>
         <w:t>3.1.2 Component Diagram</w:t>
       </w:r>
@@ -3350,10 +3979,10 @@
     <w:p>
       <w:r>
         <w:object w:dxaOrig="1514" w:dyaOrig="987" w14:anchorId="0BC1555C">
-          <v:shape id="_x0000_i1027" type="#_x0000_t75" style="width:75.6pt;height:49.35pt" o:ole="">
+          <v:shape id="_x0000_i1027" type="#_x0000_t75" style="width:75.4pt;height:49.6pt" o:ole="">
             <v:imagedata r:id="rId14" o:title=""/>
           </v:shape>
-          <o:OLEObject Type="Embed" ProgID="Package" ShapeID="_x0000_i1027" DrawAspect="Icon" ObjectID="_1835723700" r:id="rId15"/>
+          <o:OLEObject Type="Embed" ProgID="Package" ShapeID="_x0000_i1027" DrawAspect="Icon" ObjectID="_1835809926" r:id="rId15"/>
         </w:object>
       </w:r>
     </w:p>
@@ -3362,6 +3991,7 @@
         <w:rPr>
           <w:noProof/>
         </w:rPr>
+        <w:lastRenderedPageBreak/>
         <w:drawing>
           <wp:inline distT="0" distB="0" distL="0" distR="0" wp14:anchorId="717FDD54" wp14:editId="00F0091E">
             <wp:extent cx="6558280" cy="2159000"/>
@@ -3416,9 +4046,8 @@
       <w:pPr>
         <w:pStyle w:val="Heading3"/>
       </w:pPr>
-      <w:bookmarkStart w:id="15" w:name="_Toc225032869"/>
-      <w:r>
-        <w:lastRenderedPageBreak/>
+      <w:bookmarkStart w:id="15" w:name="_Toc225115685"/>
+      <w:r>
         <w:t>3.1.3 Authorization Flow</w:t>
       </w:r>
       <w:bookmarkEnd w:id="15"/>
@@ -3426,10 +4055,10 @@
     <w:p>
       <w:r>
         <w:object w:dxaOrig="1514" w:dyaOrig="987" w14:anchorId="2F1BACAC">
-          <v:shape id="_x0000_i1028" type="#_x0000_t75" style="width:75.6pt;height:49.35pt" o:ole="">
+          <v:shape id="_x0000_i1028" type="#_x0000_t75" style="width:75.4pt;height:49.6pt" o:ole="">
             <v:imagedata r:id="rId17" o:title=""/>
           </v:shape>
-          <o:OLEObject Type="Embed" ProgID="Package" ShapeID="_x0000_i1028" DrawAspect="Icon" ObjectID="_1835723701" r:id="rId18"/>
+          <o:OLEObject Type="Embed" ProgID="Package" ShapeID="_x0000_i1028" DrawAspect="Icon" ObjectID="_1835809927" r:id="rId18"/>
         </w:object>
       </w:r>
     </w:p>
@@ -3492,8 +4121,9 @@
       <w:pPr>
         <w:pStyle w:val="Heading2"/>
       </w:pPr>
-      <w:bookmarkStart w:id="16" w:name="_Toc225032870"/>
-      <w:r>
+      <w:bookmarkStart w:id="16" w:name="_Toc225115686"/>
+      <w:r>
+        <w:lastRenderedPageBreak/>
         <w:t>3.2 Implementation Plan (Phases Checklist)</w:t>
       </w:r>
       <w:bookmarkEnd w:id="16"/>
@@ -4418,9 +5048,8 @@
           <w:bCs/>
         </w:rPr>
       </w:pPr>
-      <w:bookmarkStart w:id="17" w:name="_Toc225032871"/>
-      <w:r>
-        <w:lastRenderedPageBreak/>
+      <w:bookmarkStart w:id="17" w:name="_Toc225115687"/>
+      <w:r>
         <w:t xml:space="preserve">3.3 </w:t>
       </w:r>
       <w:r>
@@ -4879,6 +5508,7 @@
           <w:p>
             <w:proofErr w:type="spellStart"/>
             <w:r>
+              <w:lastRenderedPageBreak/>
               <w:t>writer@yourtenant</w:t>
             </w:r>
             <w:proofErr w:type="spellEnd"/>
@@ -5162,7 +5792,7 @@
       <w:pPr>
         <w:pStyle w:val="Heading2"/>
       </w:pPr>
-      <w:bookmarkStart w:id="18" w:name="_Toc225032872"/>
+      <w:bookmarkStart w:id="18" w:name="_Toc225115688"/>
       <w:r>
         <w:t>3.4 Generate the full code skeleton</w:t>
       </w:r>
@@ -5247,7 +5877,7 @@
       <w:pPr>
         <w:pStyle w:val="Heading3"/>
       </w:pPr>
-      <w:bookmarkStart w:id="19" w:name="_Toc225032873"/>
+      <w:bookmarkStart w:id="19" w:name="_Toc225115689"/>
       <w:r>
         <w:t>3.4.1 What was built</w:t>
       </w:r>
@@ -5487,6 +6117,7 @@
                 <w:b/>
                 <w:bCs/>
               </w:rPr>
+              <w:lastRenderedPageBreak/>
               <w:t>leap-budget-report</w:t>
             </w:r>
           </w:p>
@@ -5547,7 +6178,6 @@
                 <w:b/>
                 <w:bCs/>
               </w:rPr>
-              <w:lastRenderedPageBreak/>
               <w:t>leap-app</w:t>
             </w:r>
           </w:p>
@@ -6170,8 +6800,9 @@
       <w:pPr>
         <w:pStyle w:val="Heading3"/>
       </w:pPr>
-      <w:bookmarkStart w:id="20" w:name="_Toc225032874"/>
-      <w:r>
+      <w:bookmarkStart w:id="20" w:name="_Toc225115690"/>
+      <w:r>
+        <w:lastRenderedPageBreak/>
         <w:t xml:space="preserve">3.4.2 </w:t>
       </w:r>
       <w:r>
@@ -6283,7 +6914,7 @@
       <w:pPr>
         <w:pStyle w:val="Heading1"/>
       </w:pPr>
-      <w:bookmarkStart w:id="21" w:name="_Toc225032875"/>
+      <w:bookmarkStart w:id="21" w:name="_Toc225115691"/>
       <w:r>
         <w:t>4. Troubleshooting</w:t>
       </w:r>
@@ -6297,7 +6928,7 @@
           <w:bCs/>
         </w:rPr>
       </w:pPr>
-      <w:bookmarkStart w:id="22" w:name="_Toc225032876"/>
+      <w:bookmarkStart w:id="22" w:name="_Toc225115692"/>
       <w:r>
         <w:t xml:space="preserve">4.1 </w:t>
       </w:r>
@@ -6321,7 +6952,6 @@
     </w:p>
     <w:p>
       <w:r>
-        <w:lastRenderedPageBreak/>
         <w:t>Logout doesn't actually log out from Entra ID - After clicking logout, clicking login again immediately shows the user as logged in without going through Entra authentication.</w:t>
       </w:r>
     </w:p>
@@ -6579,6 +7209,7 @@
         <w:rPr>
           <w:bCs/>
         </w:rPr>
+        <w:lastRenderedPageBreak/>
         <w:t>Azure Portal → App Registrations → "</w:t>
       </w:r>
       <w:proofErr w:type="spellStart"/>
@@ -6634,7 +7265,7 @@
           <w:bCs/>
         </w:rPr>
       </w:pPr>
-      <w:bookmarkStart w:id="23" w:name="_Toc225032877"/>
+      <w:bookmarkStart w:id="23" w:name="_Toc225115693"/>
       <w:r>
         <w:t xml:space="preserve">4.2 </w:t>
       </w:r>
@@ -7083,7 +7714,6 @@
         </w:numPr>
       </w:pPr>
       <w:r>
-        <w:lastRenderedPageBreak/>
         <w:t>Maps each Entra role to ROLE_APP_ADMIN, ROLE_APP_READ, ROLE_APP_WRITE authorities</w:t>
       </w:r>
     </w:p>
@@ -7137,6 +7767,7 @@
         <w:rPr>
           <w:noProof/>
         </w:rPr>
+        <w:lastRenderedPageBreak/>
         <w:drawing>
           <wp:inline distT="0" distB="0" distL="0" distR="0" wp14:anchorId="4EFAB97E" wp14:editId="4D2B625E">
             <wp:extent cx="4248150" cy="3373724"/>
@@ -7311,7 +7942,7 @@
           <w:bCs/>
         </w:rPr>
       </w:pPr>
-      <w:bookmarkStart w:id="24" w:name="_Toc225032878"/>
+      <w:bookmarkStart w:id="24" w:name="_Toc225115694"/>
       <w:r>
         <w:t xml:space="preserve">4.3 </w:t>
       </w:r>
@@ -7419,6 +8050,7 @@
           <w:b/>
           <w:bCs/>
         </w:rPr>
+        <w:lastRenderedPageBreak/>
         <w:t>Solution</w:t>
       </w:r>
       <w:r>
@@ -7613,6 +8245,7 @@
         <w:rPr>
           <w:noProof/>
         </w:rPr>
+        <w:lastRenderedPageBreak/>
         <w:drawing>
           <wp:inline distT="0" distB="0" distL="0" distR="0" wp14:anchorId="748D06F4" wp14:editId="68D67899">
             <wp:extent cx="5480629" cy="6334963"/>
@@ -7662,6 +8295,7 @@
           <w:b/>
           <w:bCs/>
         </w:rPr>
+        <w:lastRenderedPageBreak/>
         <w:t xml:space="preserve">Option </w:t>
       </w:r>
       <w:r>
@@ -7780,14 +8414,18 @@
       <w:pPr>
         <w:pStyle w:val="Heading1"/>
       </w:pPr>
-      <w:r>
+      <w:bookmarkStart w:id="25" w:name="_Toc225115695"/>
+      <w:r>
+        <w:lastRenderedPageBreak/>
         <w:t>5. POC – Report Entry Comments</w:t>
       </w:r>
+      <w:bookmarkEnd w:id="25"/>
     </w:p>
     <w:p>
       <w:pPr>
         <w:pStyle w:val="Heading2"/>
       </w:pPr>
+      <w:bookmarkStart w:id="26" w:name="_Toc225115696"/>
       <w:r>
         <w:t xml:space="preserve">5.1 </w:t>
       </w:r>
@@ -7805,11 +8443,13 @@
       <w:r>
         <w:t>Database Setup</w:t>
       </w:r>
+      <w:bookmarkEnd w:id="26"/>
     </w:p>
     <w:p>
       <w:pPr>
         <w:pStyle w:val="Heading3"/>
       </w:pPr>
+      <w:bookmarkStart w:id="27" w:name="_Toc225115697"/>
       <w:r>
         <w:t>5.</w:t>
       </w:r>
@@ -7819,6 +8459,7 @@
       <w:r>
         <w:t>1 Install SQL Server Developer Edition</w:t>
       </w:r>
+      <w:bookmarkEnd w:id="27"/>
     </w:p>
     <w:p>
       <w:pPr>
@@ -7925,7 +8566,6 @@
           <w:b/>
           <w:bCs/>
         </w:rPr>
-        <w:lastRenderedPageBreak/>
         <w:t>Named instance</w:t>
       </w:r>
       <w:r>
@@ -8019,6 +8659,7 @@
       <w:pPr>
         <w:pStyle w:val="Heading3"/>
       </w:pPr>
+      <w:bookmarkStart w:id="28" w:name="_Toc225115698"/>
       <w:r>
         <w:t>5</w:t>
       </w:r>
@@ -8032,6 +8673,7 @@
       <w:r>
         <w:t>DBeaver</w:t>
       </w:r>
+      <w:bookmarkEnd w:id="28"/>
       <w:proofErr w:type="spellEnd"/>
     </w:p>
     <w:p>
@@ -8041,6 +8683,10 @@
     </w:p>
     <w:p>
       <w:r>
+        <w:rPr>
+          <w:noProof/>
+        </w:rPr>
+        <w:lastRenderedPageBreak/>
         <w:drawing>
           <wp:inline distT="0" distB="0" distL="0" distR="0" wp14:anchorId="7C3C51BA" wp14:editId="3E4D3A00">
             <wp:extent cx="3772619" cy="3789026"/>
@@ -8094,6 +8740,9 @@
         <w:br/>
       </w:r>
       <w:r>
+        <w:rPr>
+          <w:noProof/>
+        </w:rPr>
         <w:drawing>
           <wp:inline distT="0" distB="0" distL="0" distR="0" wp14:anchorId="71CC32D8" wp14:editId="4BA32105">
             <wp:extent cx="3411056" cy="2254369"/>
@@ -8137,6 +8786,7 @@
           <w:b/>
           <w:bCs/>
         </w:rPr>
+        <w:lastRenderedPageBreak/>
         <w:t>Root Cause</w:t>
       </w:r>
       <w:r>
@@ -8145,7 +8795,6 @@
     </w:p>
     <w:p>
       <w:r>
-        <w:lastRenderedPageBreak/>
         <w:t xml:space="preserve">When install a </w:t>
       </w:r>
       <w:r>
@@ -8457,6 +9106,7 @@
         <w:rPr>
           <w:noProof/>
         </w:rPr>
+        <w:lastRenderedPageBreak/>
         <w:drawing>
           <wp:inline distT="0" distB="0" distL="0" distR="0" wp14:anchorId="5C2A5422" wp14:editId="4CCC95D2">
             <wp:extent cx="2743200" cy="1708150"/>
@@ -8607,7 +9257,6 @@
         <w:ind w:left="426"/>
       </w:pPr>
       <w:r>
-        <w:lastRenderedPageBreak/>
         <w:t xml:space="preserve">Scroll to </w:t>
       </w:r>
       <w:proofErr w:type="spellStart"/>
@@ -8726,6 +9375,7 @@
         <w:rPr>
           <w:noProof/>
         </w:rPr>
+        <w:lastRenderedPageBreak/>
         <w:drawing>
           <wp:inline distT="0" distB="0" distL="0" distR="0" wp14:anchorId="169A2E57" wp14:editId="17C0A9DE">
             <wp:extent cx="2506505" cy="2651185"/>
@@ -8788,6 +9438,7 @@
       <w:pPr>
         <w:pStyle w:val="Heading3"/>
       </w:pPr>
+      <w:bookmarkStart w:id="29" w:name="_Toc225115699"/>
       <w:r>
         <w:t>5</w:t>
       </w:r>
@@ -8797,6 +9448,7 @@
       <w:r>
         <w:t>.3 Create Database</w:t>
       </w:r>
+      <w:bookmarkEnd w:id="29"/>
     </w:p>
     <w:p>
       <w:r>
@@ -8819,6 +9471,7 @@
       <w:pPr>
         <w:pStyle w:val="Heading3"/>
       </w:pPr>
+      <w:bookmarkStart w:id="30" w:name="_Toc225115700"/>
       <w:r>
         <w:t>5</w:t>
       </w:r>
@@ -8828,6 +9481,7 @@
       <w:r>
         <w:t>.4 Create Tables</w:t>
       </w:r>
+      <w:bookmarkEnd w:id="30"/>
     </w:p>
     <w:p>
       <w:r>
@@ -8853,6 +9507,7 @@
       <w:pPr>
         <w:pStyle w:val="Heading3"/>
       </w:pPr>
+      <w:bookmarkStart w:id="31" w:name="_Toc225115701"/>
       <w:r>
         <w:t>5</w:t>
       </w:r>
@@ -8862,6 +9517,7 @@
       <w:r>
         <w:t>.5 Insert Initial Data</w:t>
       </w:r>
+      <w:bookmarkEnd w:id="31"/>
     </w:p>
     <w:p>
       <w:r>
@@ -8887,12 +9543,14 @@
       <w:pPr>
         <w:pStyle w:val="Heading2"/>
       </w:pPr>
+      <w:bookmarkStart w:id="32" w:name="_Toc225115702"/>
       <w:r>
         <w:t xml:space="preserve">5.2 </w:t>
       </w:r>
       <w:r>
         <w:t>Phase 1 — Spring Data JPA + Budget Migration</w:t>
       </w:r>
+      <w:bookmarkEnd w:id="32"/>
     </w:p>
     <w:p>
       <w:r>
@@ -8952,39 +9610,42 @@
         </w:numPr>
       </w:pPr>
       <w:r>
+        <w:t xml:space="preserve">Add </w:t>
+      </w:r>
+      <w:proofErr w:type="spellStart"/>
+      <w:r>
+        <w:t>EntityScan</w:t>
+      </w:r>
+      <w:proofErr w:type="spellEnd"/>
+      <w:r>
+        <w:t xml:space="preserve"> and </w:t>
+      </w:r>
+      <w:proofErr w:type="spellStart"/>
+      <w:r>
+        <w:t>EnableJpaRepositoryies</w:t>
+      </w:r>
+      <w:proofErr w:type="spellEnd"/>
+      <w:r>
+        <w:t xml:space="preserve"> in leap-app </w:t>
+      </w:r>
+      <w:proofErr w:type="spellStart"/>
+      <w:r>
+        <w:t>LeapPocApplication</w:t>
+      </w:r>
+      <w:proofErr w:type="spellEnd"/>
+      <w:r>
+        <w:t xml:space="preserve"> to scan JPA entities and repositories in other modules/packages</w:t>
+      </w:r>
+    </w:p>
+    <w:p>
+      <w:pPr>
+        <w:ind w:left="720"/>
+      </w:pPr>
+      <w:r>
+        <w:rPr>
+          <w:noProof/>
+        </w:rPr>
         <w:lastRenderedPageBreak/>
-        <w:t xml:space="preserve">Add </w:t>
-      </w:r>
-      <w:proofErr w:type="spellStart"/>
-      <w:r>
-        <w:t>EntityScan</w:t>
-      </w:r>
-      <w:proofErr w:type="spellEnd"/>
-      <w:r>
-        <w:t xml:space="preserve"> and </w:t>
-      </w:r>
-      <w:proofErr w:type="spellStart"/>
-      <w:r>
-        <w:t>EnableJpaRepositoryies</w:t>
-      </w:r>
-      <w:proofErr w:type="spellEnd"/>
-      <w:r>
-        <w:t xml:space="preserve"> in leap-app </w:t>
-      </w:r>
-      <w:proofErr w:type="spellStart"/>
-      <w:r>
-        <w:t>LeapPocApplication</w:t>
-      </w:r>
-      <w:proofErr w:type="spellEnd"/>
-      <w:r>
-        <w:t xml:space="preserve"> to scan JPA entities and repositories in other modules/packages</w:t>
-      </w:r>
-    </w:p>
-    <w:p>
-      <w:pPr>
-        <w:ind w:left="720"/>
-      </w:pPr>
-      <w:r>
         <w:drawing>
           <wp:inline distT="0" distB="0" distL="0" distR="0" wp14:anchorId="1DD958C5" wp14:editId="362F2EA5">
             <wp:extent cx="3572374" cy="866896"/>
@@ -9050,21 +9711,265 @@
     <w:p>
       <w:pPr>
         <w:pStyle w:val="Heading3"/>
+      </w:pPr>
+      <w:bookmarkStart w:id="33" w:name="_Toc225115703"/>
+      <w:r>
+        <w:t xml:space="preserve">5.3 </w:t>
+      </w:r>
+      <w:r>
+        <w:t>Phase 2 — Comment Module &amp; Entities</w:t>
+      </w:r>
+      <w:bookmarkEnd w:id="33"/>
+    </w:p>
+    <w:p>
+      <w:pPr>
+        <w:pStyle w:val="Heading3"/>
+      </w:pPr>
+      <w:r>
+        <w:t>5.4 Phase 3 – Comment API</w:t>
+      </w:r>
+    </w:p>
+    <w:p>
+      <w:pPr>
+        <w:ind w:left="284"/>
+      </w:pPr>
+      <w:r>
+        <w:t xml:space="preserve">See </w:t>
+      </w:r>
+      <w:r>
+        <w:t>implementation plan</w:t>
+      </w:r>
+    </w:p>
+    <w:p>
+      <w:pPr>
+        <w:ind w:left="284"/>
+      </w:pPr>
+      <w:r>
         <w:rPr>
           <w:b/>
           <w:bCs/>
         </w:rPr>
-      </w:pPr>
-      <w:r>
-        <w:t xml:space="preserve">5.3 </w:t>
-      </w:r>
-      <w:r>
-        <w:t>Phase 2 — Comment Module &amp; Entities</w:t>
-      </w:r>
-    </w:p>
-    <w:p/>
-    <w:p/>
-    <w:p/>
+        <w:t>Test in Postman</w:t>
+      </w:r>
+      <w:r>
+        <w:t xml:space="preserve"> - </w:t>
+      </w:r>
+      <w:r>
+        <w:t>Browser Login → Copy Cookie (simplest)</w:t>
+      </w:r>
+    </w:p>
+    <w:p>
+      <w:pPr>
+        <w:ind w:left="284"/>
+      </w:pPr>
+      <w:r>
+        <w:t>Since this is a BFF (session-cookie) architecture — not a bearer-token API — you can't directly configure "OAuth 2.0 Authorization" in Postman's Auth tab in the traditional way. The API expects a session cookie, not a Bearer token</w:t>
+      </w:r>
+      <w:r>
+        <w:t xml:space="preserve">. </w:t>
+      </w:r>
+      <w:r>
+        <w:t>Here's how to test:</w:t>
+      </w:r>
+    </w:p>
+    <w:p>
+      <w:pPr>
+        <w:pStyle w:val="ListParagraph"/>
+        <w:numPr>
+          <w:ilvl w:val="0"/>
+          <w:numId w:val="27"/>
+        </w:numPr>
+        <w:ind w:left="709"/>
+      </w:pPr>
+      <w:r>
+        <w:t>Open your browser, log in at http://localhost:18080/oauth2/authorization/entra</w:t>
+      </w:r>
+    </w:p>
+    <w:p>
+      <w:pPr>
+        <w:pStyle w:val="ListParagraph"/>
+        <w:numPr>
+          <w:ilvl w:val="0"/>
+          <w:numId w:val="27"/>
+        </w:numPr>
+        <w:ind w:left="709"/>
+        <w:rPr>
+          <w:rFonts w:hint="eastAsia"/>
+        </w:rPr>
+      </w:pPr>
+      <w:r>
+        <w:rPr>
+          <w:rFonts w:hint="eastAsia"/>
+        </w:rPr>
+        <w:t xml:space="preserve">After login, open </w:t>
+      </w:r>
+      <w:proofErr w:type="spellStart"/>
+      <w:r>
+        <w:rPr>
+          <w:rFonts w:hint="eastAsia"/>
+        </w:rPr>
+        <w:t>DevTools</w:t>
+      </w:r>
+      <w:proofErr w:type="spellEnd"/>
+      <w:r>
+        <w:rPr>
+          <w:rFonts w:hint="eastAsia"/>
+        </w:rPr>
+        <w:t xml:space="preserve"> </w:t>
+      </w:r>
+      <w:r>
+        <w:rPr>
+          <w:rFonts w:hint="eastAsia"/>
+        </w:rPr>
+        <w:t>→</w:t>
+      </w:r>
+      <w:r>
+        <w:rPr>
+          <w:rFonts w:hint="eastAsia"/>
+        </w:rPr>
+        <w:t xml:space="preserve"> Application </w:t>
+      </w:r>
+      <w:r>
+        <w:rPr>
+          <w:rFonts w:hint="eastAsia"/>
+        </w:rPr>
+        <w:t>→</w:t>
+      </w:r>
+      <w:r>
+        <w:rPr>
+          <w:rFonts w:hint="eastAsia"/>
+        </w:rPr>
+        <w:t xml:space="preserve"> Cookies </w:t>
+      </w:r>
+      <w:r>
+        <w:rPr>
+          <w:rFonts w:hint="eastAsia"/>
+        </w:rPr>
+        <w:t>→</w:t>
+      </w:r>
+      <w:r>
+        <w:rPr>
+          <w:rFonts w:hint="eastAsia"/>
+        </w:rPr>
+        <w:t xml:space="preserve"> copy the JSESSIONID value</w:t>
+      </w:r>
+    </w:p>
+    <w:p>
+      <w:pPr>
+        <w:pStyle w:val="ListParagraph"/>
+        <w:numPr>
+          <w:ilvl w:val="0"/>
+          <w:numId w:val="27"/>
+        </w:numPr>
+        <w:ind w:left="709"/>
+      </w:pPr>
+      <w:r>
+        <w:t>In Postman:</w:t>
+      </w:r>
+    </w:p>
+    <w:p>
+      <w:pPr>
+        <w:pStyle w:val="ListParagraph"/>
+        <w:numPr>
+          <w:ilvl w:val="1"/>
+          <w:numId w:val="27"/>
+        </w:numPr>
+        <w:ind w:left="1134"/>
+      </w:pPr>
+      <w:r>
+        <w:t>Headers tab: don't set Authorization</w:t>
+      </w:r>
+    </w:p>
+    <w:p>
+      <w:pPr>
+        <w:pStyle w:val="ListParagraph"/>
+        <w:numPr>
+          <w:ilvl w:val="1"/>
+          <w:numId w:val="27"/>
+        </w:numPr>
+        <w:ind w:left="1134"/>
+      </w:pPr>
+      <w:r>
+        <w:t xml:space="preserve">Cookies: </w:t>
+      </w:r>
+    </w:p>
+    <w:p>
+      <w:pPr>
+        <w:pStyle w:val="ListParagraph"/>
+        <w:numPr>
+          <w:ilvl w:val="2"/>
+          <w:numId w:val="27"/>
+        </w:numPr>
+        <w:ind w:left="1560"/>
+      </w:pPr>
+      <w:r>
+        <w:t>Add JSESSIONID=&lt;value&gt; for domain localhost</w:t>
+      </w:r>
+    </w:p>
+    <w:p>
+      <w:pPr>
+        <w:pStyle w:val="ListParagraph"/>
+        <w:numPr>
+          <w:ilvl w:val="2"/>
+          <w:numId w:val="27"/>
+        </w:numPr>
+        <w:ind w:left="1560"/>
+      </w:pPr>
+      <w:r>
+        <w:t xml:space="preserve">Add </w:t>
+      </w:r>
+      <w:r>
+        <w:t>XSRF-TOKEN</w:t>
+      </w:r>
+      <w:r>
+        <w:t>=&lt;value&gt; for domain localhost</w:t>
+      </w:r>
+    </w:p>
+    <w:p>
+      <w:pPr>
+        <w:pStyle w:val="ListParagraph"/>
+        <w:numPr>
+          <w:ilvl w:val="1"/>
+          <w:numId w:val="27"/>
+        </w:numPr>
+        <w:ind w:left="1134"/>
+      </w:pPr>
+      <w:r>
+        <w:t>For POST/PUT/DELETE: also send a GET first to obtain the XSRF-TOKEN cookie, then add header X-XSRF-TOKEN: &lt;value&gt;</w:t>
+      </w:r>
+    </w:p>
+    <w:p>
+      <w:pPr>
+        <w:pStyle w:val="Heading3"/>
+      </w:pPr>
+      <w:r>
+        <w:t>5.5 Phase 4 – 5 – Frontend</w:t>
+      </w:r>
+    </w:p>
+    <w:p>
+      <w:pPr>
+        <w:ind w:left="284"/>
+      </w:pPr>
+      <w:r>
+        <w:t>See implementation plan</w:t>
+      </w:r>
+    </w:p>
+    <w:p>
+      <w:pPr>
+        <w:pStyle w:val="Heading3"/>
+      </w:pPr>
+      <w:r>
+        <w:t xml:space="preserve">5.6 </w:t>
+      </w:r>
+      <w:r>
+        <w:t>Phase 6: Polish &amp; Hardening</w:t>
+      </w:r>
+    </w:p>
+    <w:p>
+      <w:pPr>
+        <w:ind w:left="284"/>
+      </w:pPr>
+    </w:p>
     <w:p/>
     <w:p/>
     <w:p/>
@@ -9077,8 +9982,8 @@
     <w:p/>
     <w:p/>
     <w:sectPr>
-      <w:pgSz w:w="12240" w:h="15840"/>
-      <w:pgMar w:top="993" w:right="1041" w:bottom="993" w:left="851" w:header="708" w:footer="708" w:gutter="0"/>
+      <w:pgSz w:w="15840" w:h="12240" w:orient="landscape"/>
+      <w:pgMar w:top="851" w:right="993" w:bottom="1041" w:left="993" w:header="708" w:footer="708" w:gutter="0"/>
       <w:cols w:space="708"/>
       <w:docGrid w:linePitch="360"/>
     </w:sectPr>
@@ -9202,6 +10107,155 @@
     </w:lvl>
   </w:abstractNum>
   <w:abstractNum w:abstractNumId="1" w15:restartNumberingAfterBreak="0">
+    <w:nsid w:val="04A31B48"/>
+    <w:multiLevelType w:val="multilevel"/>
+    <w:tmpl w:val="AA2E31A0"/>
+    <w:lvl w:ilvl="0">
+      <w:start w:val="1"/>
+      <w:numFmt w:val="bullet"/>
+      <w:lvlText w:val=""/>
+      <w:lvlJc w:val="left"/>
+      <w:pPr>
+        <w:tabs>
+          <w:tab w:val="num" w:pos="720"/>
+        </w:tabs>
+        <w:ind w:left="720" w:hanging="360"/>
+      </w:pPr>
+      <w:rPr>
+        <w:rFonts w:ascii="Symbol" w:hAnsi="Symbol" w:hint="default"/>
+        <w:sz w:val="20"/>
+      </w:rPr>
+    </w:lvl>
+    <w:lvl w:ilvl="1" w:tentative="1">
+      <w:start w:val="1"/>
+      <w:numFmt w:val="bullet"/>
+      <w:lvlText w:val="o"/>
+      <w:lvlJc w:val="left"/>
+      <w:pPr>
+        <w:tabs>
+          <w:tab w:val="num" w:pos="1440"/>
+        </w:tabs>
+        <w:ind w:left="1440" w:hanging="360"/>
+      </w:pPr>
+      <w:rPr>
+        <w:rFonts w:ascii="Courier New" w:hAnsi="Courier New" w:hint="default"/>
+        <w:sz w:val="20"/>
+      </w:rPr>
+    </w:lvl>
+    <w:lvl w:ilvl="2" w:tentative="1">
+      <w:start w:val="1"/>
+      <w:numFmt w:val="bullet"/>
+      <w:lvlText w:val=""/>
+      <w:lvlJc w:val="left"/>
+      <w:pPr>
+        <w:tabs>
+          <w:tab w:val="num" w:pos="2160"/>
+        </w:tabs>
+        <w:ind w:left="2160" w:hanging="360"/>
+      </w:pPr>
+      <w:rPr>
+        <w:rFonts w:ascii="Wingdings" w:hAnsi="Wingdings" w:hint="default"/>
+        <w:sz w:val="20"/>
+      </w:rPr>
+    </w:lvl>
+    <w:lvl w:ilvl="3" w:tentative="1">
+      <w:start w:val="1"/>
+      <w:numFmt w:val="bullet"/>
+      <w:lvlText w:val=""/>
+      <w:lvlJc w:val="left"/>
+      <w:pPr>
+        <w:tabs>
+          <w:tab w:val="num" w:pos="2880"/>
+        </w:tabs>
+        <w:ind w:left="2880" w:hanging="360"/>
+      </w:pPr>
+      <w:rPr>
+        <w:rFonts w:ascii="Wingdings" w:hAnsi="Wingdings" w:hint="default"/>
+        <w:sz w:val="20"/>
+      </w:rPr>
+    </w:lvl>
+    <w:lvl w:ilvl="4" w:tentative="1">
+      <w:start w:val="1"/>
+      <w:numFmt w:val="bullet"/>
+      <w:lvlText w:val=""/>
+      <w:lvlJc w:val="left"/>
+      <w:pPr>
+        <w:tabs>
+          <w:tab w:val="num" w:pos="3600"/>
+        </w:tabs>
+        <w:ind w:left="3600" w:hanging="360"/>
+      </w:pPr>
+      <w:rPr>
+        <w:rFonts w:ascii="Wingdings" w:hAnsi="Wingdings" w:hint="default"/>
+        <w:sz w:val="20"/>
+      </w:rPr>
+    </w:lvl>
+    <w:lvl w:ilvl="5" w:tentative="1">
+      <w:start w:val="1"/>
+      <w:numFmt w:val="bullet"/>
+      <w:lvlText w:val=""/>
+      <w:lvlJc w:val="left"/>
+      <w:pPr>
+        <w:tabs>
+          <w:tab w:val="num" w:pos="4320"/>
+        </w:tabs>
+        <w:ind w:left="4320" w:hanging="360"/>
+      </w:pPr>
+      <w:rPr>
+        <w:rFonts w:ascii="Wingdings" w:hAnsi="Wingdings" w:hint="default"/>
+        <w:sz w:val="20"/>
+      </w:rPr>
+    </w:lvl>
+    <w:lvl w:ilvl="6" w:tentative="1">
+      <w:start w:val="1"/>
+      <w:numFmt w:val="bullet"/>
+      <w:lvlText w:val=""/>
+      <w:lvlJc w:val="left"/>
+      <w:pPr>
+        <w:tabs>
+          <w:tab w:val="num" w:pos="5040"/>
+        </w:tabs>
+        <w:ind w:left="5040" w:hanging="360"/>
+      </w:pPr>
+      <w:rPr>
+        <w:rFonts w:ascii="Wingdings" w:hAnsi="Wingdings" w:hint="default"/>
+        <w:sz w:val="20"/>
+      </w:rPr>
+    </w:lvl>
+    <w:lvl w:ilvl="7" w:tentative="1">
+      <w:start w:val="1"/>
+      <w:numFmt w:val="bullet"/>
+      <w:lvlText w:val=""/>
+      <w:lvlJc w:val="left"/>
+      <w:pPr>
+        <w:tabs>
+          <w:tab w:val="num" w:pos="5760"/>
+        </w:tabs>
+        <w:ind w:left="5760" w:hanging="360"/>
+      </w:pPr>
+      <w:rPr>
+        <w:rFonts w:ascii="Wingdings" w:hAnsi="Wingdings" w:hint="default"/>
+        <w:sz w:val="20"/>
+      </w:rPr>
+    </w:lvl>
+    <w:lvl w:ilvl="8" w:tentative="1">
+      <w:start w:val="1"/>
+      <w:numFmt w:val="bullet"/>
+      <w:lvlText w:val=""/>
+      <w:lvlJc w:val="left"/>
+      <w:pPr>
+        <w:tabs>
+          <w:tab w:val="num" w:pos="6480"/>
+        </w:tabs>
+        <w:ind w:left="6480" w:hanging="360"/>
+      </w:pPr>
+      <w:rPr>
+        <w:rFonts w:ascii="Wingdings" w:hAnsi="Wingdings" w:hint="default"/>
+        <w:sz w:val="20"/>
+      </w:rPr>
+    </w:lvl>
+  </w:abstractNum>
+  <w:abstractNum w:abstractNumId="2" w15:restartNumberingAfterBreak="0">
     <w:nsid w:val="070454B9"/>
     <w:multiLevelType w:val="multilevel"/>
     <w:tmpl w:val="24BCCDFE"/>
@@ -9318,7 +10372,7 @@
       </w:pPr>
     </w:lvl>
   </w:abstractNum>
-  <w:abstractNum w:abstractNumId="2" w15:restartNumberingAfterBreak="0">
+  <w:abstractNum w:abstractNumId="3" w15:restartNumberingAfterBreak="0">
     <w:nsid w:val="08C77489"/>
     <w:multiLevelType w:val="multilevel"/>
     <w:tmpl w:val="1CD2FC78"/>
@@ -9467,10 +10521,10 @@
       </w:rPr>
     </w:lvl>
   </w:abstractNum>
-  <w:abstractNum w:abstractNumId="3" w15:restartNumberingAfterBreak="0">
+  <w:abstractNum w:abstractNumId="4" w15:restartNumberingAfterBreak="0">
     <w:nsid w:val="0CDE6022"/>
     <w:multiLevelType w:val="hybridMultilevel"/>
-    <w:tmpl w:val="978AECC2"/>
+    <w:tmpl w:val="DB12CA8A"/>
     <w:lvl w:ilvl="0" w:tplc="10090001">
       <w:start w:val="1"/>
       <w:numFmt w:val="bullet"/>
@@ -9483,7 +10537,7 @@
         <w:rFonts w:ascii="Symbol" w:hAnsi="Symbol" w:hint="default"/>
       </w:rPr>
     </w:lvl>
-    <w:lvl w:ilvl="1" w:tplc="10090003" w:tentative="1">
+    <w:lvl w:ilvl="1" w:tplc="10090003">
       <w:start w:val="1"/>
       <w:numFmt w:val="bullet"/>
       <w:lvlText w:val="o"/>
@@ -9495,7 +10549,7 @@
         <w:rFonts w:ascii="Courier New" w:hAnsi="Courier New" w:cs="Courier New" w:hint="default"/>
       </w:rPr>
     </w:lvl>
-    <w:lvl w:ilvl="2" w:tplc="10090005" w:tentative="1">
+    <w:lvl w:ilvl="2" w:tplc="10090005">
       <w:start w:val="1"/>
       <w:numFmt w:val="bullet"/>
       <w:lvlText w:val=""/>
@@ -9580,7 +10634,7 @@
       </w:rPr>
     </w:lvl>
   </w:abstractNum>
-  <w:abstractNum w:abstractNumId="4" w15:restartNumberingAfterBreak="0">
+  <w:abstractNum w:abstractNumId="5" w15:restartNumberingAfterBreak="0">
     <w:nsid w:val="10C505CB"/>
     <w:multiLevelType w:val="multilevel"/>
     <w:tmpl w:val="D07CD7FC"/>
@@ -9729,7 +10783,7 @@
       </w:rPr>
     </w:lvl>
   </w:abstractNum>
-  <w:abstractNum w:abstractNumId="5" w15:restartNumberingAfterBreak="0">
+  <w:abstractNum w:abstractNumId="6" w15:restartNumberingAfterBreak="0">
     <w:nsid w:val="116A5002"/>
     <w:multiLevelType w:val="multilevel"/>
     <w:tmpl w:val="401AB65A"/>
@@ -9878,7 +10932,7 @@
       </w:rPr>
     </w:lvl>
   </w:abstractNum>
-  <w:abstractNum w:abstractNumId="6" w15:restartNumberingAfterBreak="0">
+  <w:abstractNum w:abstractNumId="7" w15:restartNumberingAfterBreak="0">
     <w:nsid w:val="1AF90B6A"/>
     <w:multiLevelType w:val="multilevel"/>
     <w:tmpl w:val="1A56AF4A"/>
@@ -9991,7 +11045,7 @@
       </w:pPr>
     </w:lvl>
   </w:abstractNum>
-  <w:abstractNum w:abstractNumId="7" w15:restartNumberingAfterBreak="0">
+  <w:abstractNum w:abstractNumId="8" w15:restartNumberingAfterBreak="0">
     <w:nsid w:val="1BC87650"/>
     <w:multiLevelType w:val="hybridMultilevel"/>
     <w:tmpl w:val="971A6178"/>
@@ -10104,7 +11158,7 @@
       </w:rPr>
     </w:lvl>
   </w:abstractNum>
-  <w:abstractNum w:abstractNumId="8" w15:restartNumberingAfterBreak="0">
+  <w:abstractNum w:abstractNumId="9" w15:restartNumberingAfterBreak="0">
     <w:nsid w:val="1D1149F5"/>
     <w:multiLevelType w:val="multilevel"/>
     <w:tmpl w:val="19346220"/>
@@ -10253,7 +11307,7 @@
       </w:rPr>
     </w:lvl>
   </w:abstractNum>
-  <w:abstractNum w:abstractNumId="9" w15:restartNumberingAfterBreak="0">
+  <w:abstractNum w:abstractNumId="10" w15:restartNumberingAfterBreak="0">
     <w:nsid w:val="20180394"/>
     <w:multiLevelType w:val="multilevel"/>
     <w:tmpl w:val="24BCCDFE"/>
@@ -10402,7 +11456,7 @@
       </w:rPr>
     </w:lvl>
   </w:abstractNum>
-  <w:abstractNum w:abstractNumId="10" w15:restartNumberingAfterBreak="0">
+  <w:abstractNum w:abstractNumId="11" w15:restartNumberingAfterBreak="0">
     <w:nsid w:val="28BA103E"/>
     <w:multiLevelType w:val="hybridMultilevel"/>
     <w:tmpl w:val="77349F68"/>
@@ -10515,7 +11569,7 @@
       </w:rPr>
     </w:lvl>
   </w:abstractNum>
-  <w:abstractNum w:abstractNumId="11" w15:restartNumberingAfterBreak="0">
+  <w:abstractNum w:abstractNumId="12" w15:restartNumberingAfterBreak="0">
     <w:nsid w:val="2ACC1008"/>
     <w:multiLevelType w:val="multilevel"/>
     <w:tmpl w:val="83E0AAAE"/>
@@ -10664,7 +11718,7 @@
       </w:rPr>
     </w:lvl>
   </w:abstractNum>
-  <w:abstractNum w:abstractNumId="12" w15:restartNumberingAfterBreak="0">
+  <w:abstractNum w:abstractNumId="13" w15:restartNumberingAfterBreak="0">
     <w:nsid w:val="36DC4EAE"/>
     <w:multiLevelType w:val="multilevel"/>
     <w:tmpl w:val="768EADA2"/>
@@ -10781,7 +11835,7 @@
       </w:pPr>
     </w:lvl>
   </w:abstractNum>
-  <w:abstractNum w:abstractNumId="13" w15:restartNumberingAfterBreak="0">
+  <w:abstractNum w:abstractNumId="14" w15:restartNumberingAfterBreak="0">
     <w:nsid w:val="3AD06FD2"/>
     <w:multiLevelType w:val="multilevel"/>
     <w:tmpl w:val="3CC81D80"/>
@@ -10930,7 +11984,7 @@
       </w:rPr>
     </w:lvl>
   </w:abstractNum>
-  <w:abstractNum w:abstractNumId="14" w15:restartNumberingAfterBreak="0">
+  <w:abstractNum w:abstractNumId="15" w15:restartNumberingAfterBreak="0">
     <w:nsid w:val="3DAC2A76"/>
     <w:multiLevelType w:val="hybridMultilevel"/>
     <w:tmpl w:val="533A61F2"/>
@@ -11043,7 +12097,7 @@
       </w:rPr>
     </w:lvl>
   </w:abstractNum>
-  <w:abstractNum w:abstractNumId="15" w15:restartNumberingAfterBreak="0">
+  <w:abstractNum w:abstractNumId="16" w15:restartNumberingAfterBreak="0">
     <w:nsid w:val="43816EC9"/>
     <w:multiLevelType w:val="multilevel"/>
     <w:tmpl w:val="E1A4D0BE"/>
@@ -11156,7 +12210,156 @@
       </w:pPr>
     </w:lvl>
   </w:abstractNum>
-  <w:abstractNum w:abstractNumId="16" w15:restartNumberingAfterBreak="0">
+  <w:abstractNum w:abstractNumId="17" w15:restartNumberingAfterBreak="0">
+    <w:nsid w:val="453F48B0"/>
+    <w:multiLevelType w:val="multilevel"/>
+    <w:tmpl w:val="AEB4B102"/>
+    <w:lvl w:ilvl="0">
+      <w:start w:val="1"/>
+      <w:numFmt w:val="bullet"/>
+      <w:lvlText w:val=""/>
+      <w:lvlJc w:val="left"/>
+      <w:pPr>
+        <w:tabs>
+          <w:tab w:val="num" w:pos="720"/>
+        </w:tabs>
+        <w:ind w:left="720" w:hanging="360"/>
+      </w:pPr>
+      <w:rPr>
+        <w:rFonts w:ascii="Symbol" w:hAnsi="Symbol" w:hint="default"/>
+        <w:sz w:val="20"/>
+      </w:rPr>
+    </w:lvl>
+    <w:lvl w:ilvl="1" w:tentative="1">
+      <w:start w:val="1"/>
+      <w:numFmt w:val="bullet"/>
+      <w:lvlText w:val="o"/>
+      <w:lvlJc w:val="left"/>
+      <w:pPr>
+        <w:tabs>
+          <w:tab w:val="num" w:pos="1440"/>
+        </w:tabs>
+        <w:ind w:left="1440" w:hanging="360"/>
+      </w:pPr>
+      <w:rPr>
+        <w:rFonts w:ascii="Courier New" w:hAnsi="Courier New" w:hint="default"/>
+        <w:sz w:val="20"/>
+      </w:rPr>
+    </w:lvl>
+    <w:lvl w:ilvl="2" w:tentative="1">
+      <w:start w:val="1"/>
+      <w:numFmt w:val="bullet"/>
+      <w:lvlText w:val=""/>
+      <w:lvlJc w:val="left"/>
+      <w:pPr>
+        <w:tabs>
+          <w:tab w:val="num" w:pos="2160"/>
+        </w:tabs>
+        <w:ind w:left="2160" w:hanging="360"/>
+      </w:pPr>
+      <w:rPr>
+        <w:rFonts w:ascii="Wingdings" w:hAnsi="Wingdings" w:hint="default"/>
+        <w:sz w:val="20"/>
+      </w:rPr>
+    </w:lvl>
+    <w:lvl w:ilvl="3" w:tentative="1">
+      <w:start w:val="1"/>
+      <w:numFmt w:val="bullet"/>
+      <w:lvlText w:val=""/>
+      <w:lvlJc w:val="left"/>
+      <w:pPr>
+        <w:tabs>
+          <w:tab w:val="num" w:pos="2880"/>
+        </w:tabs>
+        <w:ind w:left="2880" w:hanging="360"/>
+      </w:pPr>
+      <w:rPr>
+        <w:rFonts w:ascii="Wingdings" w:hAnsi="Wingdings" w:hint="default"/>
+        <w:sz w:val="20"/>
+      </w:rPr>
+    </w:lvl>
+    <w:lvl w:ilvl="4" w:tentative="1">
+      <w:start w:val="1"/>
+      <w:numFmt w:val="bullet"/>
+      <w:lvlText w:val=""/>
+      <w:lvlJc w:val="left"/>
+      <w:pPr>
+        <w:tabs>
+          <w:tab w:val="num" w:pos="3600"/>
+        </w:tabs>
+        <w:ind w:left="3600" w:hanging="360"/>
+      </w:pPr>
+      <w:rPr>
+        <w:rFonts w:ascii="Wingdings" w:hAnsi="Wingdings" w:hint="default"/>
+        <w:sz w:val="20"/>
+      </w:rPr>
+    </w:lvl>
+    <w:lvl w:ilvl="5" w:tentative="1">
+      <w:start w:val="1"/>
+      <w:numFmt w:val="bullet"/>
+      <w:lvlText w:val=""/>
+      <w:lvlJc w:val="left"/>
+      <w:pPr>
+        <w:tabs>
+          <w:tab w:val="num" w:pos="4320"/>
+        </w:tabs>
+        <w:ind w:left="4320" w:hanging="360"/>
+      </w:pPr>
+      <w:rPr>
+        <w:rFonts w:ascii="Wingdings" w:hAnsi="Wingdings" w:hint="default"/>
+        <w:sz w:val="20"/>
+      </w:rPr>
+    </w:lvl>
+    <w:lvl w:ilvl="6" w:tentative="1">
+      <w:start w:val="1"/>
+      <w:numFmt w:val="bullet"/>
+      <w:lvlText w:val=""/>
+      <w:lvlJc w:val="left"/>
+      <w:pPr>
+        <w:tabs>
+          <w:tab w:val="num" w:pos="5040"/>
+        </w:tabs>
+        <w:ind w:left="5040" w:hanging="360"/>
+      </w:pPr>
+      <w:rPr>
+        <w:rFonts w:ascii="Wingdings" w:hAnsi="Wingdings" w:hint="default"/>
+        <w:sz w:val="20"/>
+      </w:rPr>
+    </w:lvl>
+    <w:lvl w:ilvl="7" w:tentative="1">
+      <w:start w:val="1"/>
+      <w:numFmt w:val="bullet"/>
+      <w:lvlText w:val=""/>
+      <w:lvlJc w:val="left"/>
+      <w:pPr>
+        <w:tabs>
+          <w:tab w:val="num" w:pos="5760"/>
+        </w:tabs>
+        <w:ind w:left="5760" w:hanging="360"/>
+      </w:pPr>
+      <w:rPr>
+        <w:rFonts w:ascii="Wingdings" w:hAnsi="Wingdings" w:hint="default"/>
+        <w:sz w:val="20"/>
+      </w:rPr>
+    </w:lvl>
+    <w:lvl w:ilvl="8" w:tentative="1">
+      <w:start w:val="1"/>
+      <w:numFmt w:val="bullet"/>
+      <w:lvlText w:val=""/>
+      <w:lvlJc w:val="left"/>
+      <w:pPr>
+        <w:tabs>
+          <w:tab w:val="num" w:pos="6480"/>
+        </w:tabs>
+        <w:ind w:left="6480" w:hanging="360"/>
+      </w:pPr>
+      <w:rPr>
+        <w:rFonts w:ascii="Wingdings" w:hAnsi="Wingdings" w:hint="default"/>
+        <w:sz w:val="20"/>
+      </w:rPr>
+    </w:lvl>
+  </w:abstractNum>
+  <w:abstractNum w:abstractNumId="18" w15:restartNumberingAfterBreak="0">
     <w:nsid w:val="4B541038"/>
     <w:multiLevelType w:val="multilevel"/>
     <w:tmpl w:val="24BCCDFE"/>
@@ -11273,7 +12476,7 @@
       </w:pPr>
     </w:lvl>
   </w:abstractNum>
-  <w:abstractNum w:abstractNumId="17" w15:restartNumberingAfterBreak="0">
+  <w:abstractNum w:abstractNumId="19" w15:restartNumberingAfterBreak="0">
     <w:nsid w:val="4B803365"/>
     <w:multiLevelType w:val="multilevel"/>
     <w:tmpl w:val="24BCCDFE"/>
@@ -11390,7 +12593,7 @@
       </w:pPr>
     </w:lvl>
   </w:abstractNum>
-  <w:abstractNum w:abstractNumId="18" w15:restartNumberingAfterBreak="0">
+  <w:abstractNum w:abstractNumId="20" w15:restartNumberingAfterBreak="0">
     <w:nsid w:val="5EEA7024"/>
     <w:multiLevelType w:val="hybridMultilevel"/>
     <w:tmpl w:val="AABA2528"/>
@@ -11479,7 +12682,7 @@
       </w:pPr>
     </w:lvl>
   </w:abstractNum>
-  <w:abstractNum w:abstractNumId="19" w15:restartNumberingAfterBreak="0">
+  <w:abstractNum w:abstractNumId="21" w15:restartNumberingAfterBreak="0">
     <w:nsid w:val="5FE34003"/>
     <w:multiLevelType w:val="multilevel"/>
     <w:tmpl w:val="DF4AD572"/>
@@ -11628,7 +12831,7 @@
       </w:rPr>
     </w:lvl>
   </w:abstractNum>
-  <w:abstractNum w:abstractNumId="20" w15:restartNumberingAfterBreak="0">
+  <w:abstractNum w:abstractNumId="22" w15:restartNumberingAfterBreak="0">
     <w:nsid w:val="67C821B7"/>
     <w:multiLevelType w:val="multilevel"/>
     <w:tmpl w:val="532C346E"/>
@@ -11777,7 +12980,7 @@
       </w:rPr>
     </w:lvl>
   </w:abstractNum>
-  <w:abstractNum w:abstractNumId="21" w15:restartNumberingAfterBreak="0">
+  <w:abstractNum w:abstractNumId="23" w15:restartNumberingAfterBreak="0">
     <w:nsid w:val="77B815C1"/>
     <w:multiLevelType w:val="multilevel"/>
     <w:tmpl w:val="8F5C64D8"/>
@@ -11926,7 +13129,7 @@
       </w:rPr>
     </w:lvl>
   </w:abstractNum>
-  <w:abstractNum w:abstractNumId="22" w15:restartNumberingAfterBreak="0">
+  <w:abstractNum w:abstractNumId="24" w15:restartNumberingAfterBreak="0">
     <w:nsid w:val="786E5DA7"/>
     <w:multiLevelType w:val="hybridMultilevel"/>
     <w:tmpl w:val="1E96CCF8"/>
@@ -12039,7 +13242,7 @@
       </w:rPr>
     </w:lvl>
   </w:abstractNum>
-  <w:abstractNum w:abstractNumId="23" w15:restartNumberingAfterBreak="0">
+  <w:abstractNum w:abstractNumId="25" w15:restartNumberingAfterBreak="0">
     <w:nsid w:val="7912704F"/>
     <w:multiLevelType w:val="multilevel"/>
     <w:tmpl w:val="9EA0F730"/>
@@ -12188,7 +13391,7 @@
       </w:rPr>
     </w:lvl>
   </w:abstractNum>
-  <w:abstractNum w:abstractNumId="24" w15:restartNumberingAfterBreak="0">
+  <w:abstractNum w:abstractNumId="26" w15:restartNumberingAfterBreak="0">
     <w:nsid w:val="793778F5"/>
     <w:multiLevelType w:val="hybridMultilevel"/>
     <w:tmpl w:val="8F0C4A80"/>
@@ -12301,7 +13504,156 @@
       </w:rPr>
     </w:lvl>
   </w:abstractNum>
-  <w:abstractNum w:abstractNumId="25" w15:restartNumberingAfterBreak="0">
+  <w:abstractNum w:abstractNumId="27" w15:restartNumberingAfterBreak="0">
+    <w:nsid w:val="7A1A11C2"/>
+    <w:multiLevelType w:val="multilevel"/>
+    <w:tmpl w:val="F8E2C328"/>
+    <w:lvl w:ilvl="0">
+      <w:start w:val="1"/>
+      <w:numFmt w:val="bullet"/>
+      <w:lvlText w:val=""/>
+      <w:lvlJc w:val="left"/>
+      <w:pPr>
+        <w:tabs>
+          <w:tab w:val="num" w:pos="720"/>
+        </w:tabs>
+        <w:ind w:left="720" w:hanging="360"/>
+      </w:pPr>
+      <w:rPr>
+        <w:rFonts w:ascii="Symbol" w:hAnsi="Symbol" w:hint="default"/>
+        <w:sz w:val="20"/>
+      </w:rPr>
+    </w:lvl>
+    <w:lvl w:ilvl="1" w:tentative="1">
+      <w:start w:val="1"/>
+      <w:numFmt w:val="bullet"/>
+      <w:lvlText w:val="o"/>
+      <w:lvlJc w:val="left"/>
+      <w:pPr>
+        <w:tabs>
+          <w:tab w:val="num" w:pos="1440"/>
+        </w:tabs>
+        <w:ind w:left="1440" w:hanging="360"/>
+      </w:pPr>
+      <w:rPr>
+        <w:rFonts w:ascii="Courier New" w:hAnsi="Courier New" w:hint="default"/>
+        <w:sz w:val="20"/>
+      </w:rPr>
+    </w:lvl>
+    <w:lvl w:ilvl="2" w:tentative="1">
+      <w:start w:val="1"/>
+      <w:numFmt w:val="bullet"/>
+      <w:lvlText w:val=""/>
+      <w:lvlJc w:val="left"/>
+      <w:pPr>
+        <w:tabs>
+          <w:tab w:val="num" w:pos="2160"/>
+        </w:tabs>
+        <w:ind w:left="2160" w:hanging="360"/>
+      </w:pPr>
+      <w:rPr>
+        <w:rFonts w:ascii="Wingdings" w:hAnsi="Wingdings" w:hint="default"/>
+        <w:sz w:val="20"/>
+      </w:rPr>
+    </w:lvl>
+    <w:lvl w:ilvl="3" w:tentative="1">
+      <w:start w:val="1"/>
+      <w:numFmt w:val="bullet"/>
+      <w:lvlText w:val=""/>
+      <w:lvlJc w:val="left"/>
+      <w:pPr>
+        <w:tabs>
+          <w:tab w:val="num" w:pos="2880"/>
+        </w:tabs>
+        <w:ind w:left="2880" w:hanging="360"/>
+      </w:pPr>
+      <w:rPr>
+        <w:rFonts w:ascii="Wingdings" w:hAnsi="Wingdings" w:hint="default"/>
+        <w:sz w:val="20"/>
+      </w:rPr>
+    </w:lvl>
+    <w:lvl w:ilvl="4" w:tentative="1">
+      <w:start w:val="1"/>
+      <w:numFmt w:val="bullet"/>
+      <w:lvlText w:val=""/>
+      <w:lvlJc w:val="left"/>
+      <w:pPr>
+        <w:tabs>
+          <w:tab w:val="num" w:pos="3600"/>
+        </w:tabs>
+        <w:ind w:left="3600" w:hanging="360"/>
+      </w:pPr>
+      <w:rPr>
+        <w:rFonts w:ascii="Wingdings" w:hAnsi="Wingdings" w:hint="default"/>
+        <w:sz w:val="20"/>
+      </w:rPr>
+    </w:lvl>
+    <w:lvl w:ilvl="5" w:tentative="1">
+      <w:start w:val="1"/>
+      <w:numFmt w:val="bullet"/>
+      <w:lvlText w:val=""/>
+      <w:lvlJc w:val="left"/>
+      <w:pPr>
+        <w:tabs>
+          <w:tab w:val="num" w:pos="4320"/>
+        </w:tabs>
+        <w:ind w:left="4320" w:hanging="360"/>
+      </w:pPr>
+      <w:rPr>
+        <w:rFonts w:ascii="Wingdings" w:hAnsi="Wingdings" w:hint="default"/>
+        <w:sz w:val="20"/>
+      </w:rPr>
+    </w:lvl>
+    <w:lvl w:ilvl="6" w:tentative="1">
+      <w:start w:val="1"/>
+      <w:numFmt w:val="bullet"/>
+      <w:lvlText w:val=""/>
+      <w:lvlJc w:val="left"/>
+      <w:pPr>
+        <w:tabs>
+          <w:tab w:val="num" w:pos="5040"/>
+        </w:tabs>
+        <w:ind w:left="5040" w:hanging="360"/>
+      </w:pPr>
+      <w:rPr>
+        <w:rFonts w:ascii="Wingdings" w:hAnsi="Wingdings" w:hint="default"/>
+        <w:sz w:val="20"/>
+      </w:rPr>
+    </w:lvl>
+    <w:lvl w:ilvl="7" w:tentative="1">
+      <w:start w:val="1"/>
+      <w:numFmt w:val="bullet"/>
+      <w:lvlText w:val=""/>
+      <w:lvlJc w:val="left"/>
+      <w:pPr>
+        <w:tabs>
+          <w:tab w:val="num" w:pos="5760"/>
+        </w:tabs>
+        <w:ind w:left="5760" w:hanging="360"/>
+      </w:pPr>
+      <w:rPr>
+        <w:rFonts w:ascii="Wingdings" w:hAnsi="Wingdings" w:hint="default"/>
+        <w:sz w:val="20"/>
+      </w:rPr>
+    </w:lvl>
+    <w:lvl w:ilvl="8" w:tentative="1">
+      <w:start w:val="1"/>
+      <w:numFmt w:val="bullet"/>
+      <w:lvlText w:val=""/>
+      <w:lvlJc w:val="left"/>
+      <w:pPr>
+        <w:tabs>
+          <w:tab w:val="num" w:pos="6480"/>
+        </w:tabs>
+        <w:ind w:left="6480" w:hanging="360"/>
+      </w:pPr>
+      <w:rPr>
+        <w:rFonts w:ascii="Wingdings" w:hAnsi="Wingdings" w:hint="default"/>
+        <w:sz w:val="20"/>
+      </w:rPr>
+    </w:lvl>
+  </w:abstractNum>
+  <w:abstractNum w:abstractNumId="28" w15:restartNumberingAfterBreak="0">
     <w:nsid w:val="7B45478C"/>
     <w:multiLevelType w:val="multilevel"/>
     <w:tmpl w:val="172AF74E"/>
@@ -12450,7 +13802,7 @@
       </w:rPr>
     </w:lvl>
   </w:abstractNum>
-  <w:abstractNum w:abstractNumId="26" w15:restartNumberingAfterBreak="0">
+  <w:abstractNum w:abstractNumId="29" w15:restartNumberingAfterBreak="0">
     <w:nsid w:val="7C633FCE"/>
     <w:multiLevelType w:val="multilevel"/>
     <w:tmpl w:val="24BCCDFE"/>
@@ -12568,85 +13920,94 @@
     </w:lvl>
   </w:abstractNum>
   <w:num w:numId="1" w16cid:durableId="1212882090">
+    <w:abstractNumId w:val="20"/>
+  </w:num>
+  <w:num w:numId="2" w16cid:durableId="1119959067">
+    <w:abstractNumId w:val="11"/>
+  </w:num>
+  <w:num w:numId="3" w16cid:durableId="322513659">
+    <w:abstractNumId w:val="28"/>
+  </w:num>
+  <w:num w:numId="4" w16cid:durableId="172915269">
+    <w:abstractNumId w:val="2"/>
+  </w:num>
+  <w:num w:numId="5" w16cid:durableId="201405766">
+    <w:abstractNumId w:val="24"/>
+  </w:num>
+  <w:num w:numId="6" w16cid:durableId="1156267990">
+    <w:abstractNumId w:val="16"/>
+  </w:num>
+  <w:num w:numId="7" w16cid:durableId="589505510">
+    <w:abstractNumId w:val="3"/>
+  </w:num>
+  <w:num w:numId="8" w16cid:durableId="500051174">
+    <w:abstractNumId w:val="10"/>
+  </w:num>
+  <w:num w:numId="9" w16cid:durableId="651830634">
+    <w:abstractNumId w:val="29"/>
+  </w:num>
+  <w:num w:numId="10" w16cid:durableId="841895827">
+    <w:abstractNumId w:val="26"/>
+  </w:num>
+  <w:num w:numId="11" w16cid:durableId="2122918639">
+    <w:abstractNumId w:val="9"/>
+  </w:num>
+  <w:num w:numId="12" w16cid:durableId="164983286">
+    <w:abstractNumId w:val="19"/>
+  </w:num>
+  <w:num w:numId="13" w16cid:durableId="582690670">
+    <w:abstractNumId w:val="23"/>
+  </w:num>
+  <w:num w:numId="14" w16cid:durableId="264189441">
+    <w:abstractNumId w:val="21"/>
+  </w:num>
+  <w:num w:numId="15" w16cid:durableId="1577714169">
     <w:abstractNumId w:val="18"/>
   </w:num>
-  <w:num w:numId="2" w16cid:durableId="1119959067">
-    <w:abstractNumId w:val="10"/>
-  </w:num>
-  <w:num w:numId="3" w16cid:durableId="322513659">
-    <w:abstractNumId w:val="25"/>
-  </w:num>
-  <w:num w:numId="4" w16cid:durableId="172915269">
-    <w:abstractNumId w:val="1"/>
-  </w:num>
-  <w:num w:numId="5" w16cid:durableId="201405766">
-    <w:abstractNumId w:val="22"/>
-  </w:num>
-  <w:num w:numId="6" w16cid:durableId="1156267990">
-    <w:abstractNumId w:val="15"/>
-  </w:num>
-  <w:num w:numId="7" w16cid:durableId="589505510">
-    <w:abstractNumId w:val="2"/>
-  </w:num>
-  <w:num w:numId="8" w16cid:durableId="500051174">
-    <w:abstractNumId w:val="9"/>
-  </w:num>
-  <w:num w:numId="9" w16cid:durableId="651830634">
-    <w:abstractNumId w:val="26"/>
-  </w:num>
-  <w:num w:numId="10" w16cid:durableId="841895827">
-    <w:abstractNumId w:val="24"/>
-  </w:num>
-  <w:num w:numId="11" w16cid:durableId="2122918639">
-    <w:abstractNumId w:val="8"/>
-  </w:num>
-  <w:num w:numId="12" w16cid:durableId="164983286">
-    <w:abstractNumId w:val="17"/>
-  </w:num>
-  <w:num w:numId="13" w16cid:durableId="582690670">
-    <w:abstractNumId w:val="21"/>
-  </w:num>
-  <w:num w:numId="14" w16cid:durableId="264189441">
-    <w:abstractNumId w:val="19"/>
-  </w:num>
-  <w:num w:numId="15" w16cid:durableId="1577714169">
-    <w:abstractNumId w:val="16"/>
-  </w:num>
   <w:num w:numId="16" w16cid:durableId="1429741216">
-    <w:abstractNumId w:val="12"/>
+    <w:abstractNumId w:val="13"/>
   </w:num>
   <w:num w:numId="17" w16cid:durableId="1176727730">
-    <w:abstractNumId w:val="7"/>
+    <w:abstractNumId w:val="8"/>
   </w:num>
   <w:num w:numId="18" w16cid:durableId="1618371638">
     <w:abstractNumId w:val="0"/>
   </w:num>
   <w:num w:numId="19" w16cid:durableId="264003664">
-    <w:abstractNumId w:val="13"/>
+    <w:abstractNumId w:val="14"/>
   </w:num>
   <w:num w:numId="20" w16cid:durableId="373120343">
+    <w:abstractNumId w:val="7"/>
+  </w:num>
+  <w:num w:numId="21" w16cid:durableId="1144279345">
+    <w:abstractNumId w:val="12"/>
+  </w:num>
+  <w:num w:numId="22" w16cid:durableId="465588484">
+    <w:abstractNumId w:val="15"/>
+  </w:num>
+  <w:num w:numId="23" w16cid:durableId="729421856">
+    <w:abstractNumId w:val="5"/>
+  </w:num>
+  <w:num w:numId="24" w16cid:durableId="1366057816">
+    <w:abstractNumId w:val="25"/>
+  </w:num>
+  <w:num w:numId="25" w16cid:durableId="1433428595">
+    <w:abstractNumId w:val="22"/>
+  </w:num>
+  <w:num w:numId="26" w16cid:durableId="687368329">
     <w:abstractNumId w:val="6"/>
   </w:num>
-  <w:num w:numId="21" w16cid:durableId="1144279345">
-    <w:abstractNumId w:val="11"/>
-  </w:num>
-  <w:num w:numId="22" w16cid:durableId="465588484">
-    <w:abstractNumId w:val="14"/>
-  </w:num>
-  <w:num w:numId="23" w16cid:durableId="729421856">
+  <w:num w:numId="27" w16cid:durableId="513543965">
     <w:abstractNumId w:val="4"/>
   </w:num>
-  <w:num w:numId="24" w16cid:durableId="1366057816">
-    <w:abstractNumId w:val="23"/>
+  <w:num w:numId="28" w16cid:durableId="1143740170">
+    <w:abstractNumId w:val="27"/>
   </w:num>
-  <w:num w:numId="25" w16cid:durableId="1433428595">
-    <w:abstractNumId w:val="20"/>
+  <w:num w:numId="29" w16cid:durableId="476342647">
+    <w:abstractNumId w:val="1"/>
   </w:num>
-  <w:num w:numId="26" w16cid:durableId="687368329">
-    <w:abstractNumId w:val="5"/>
-  </w:num>
-  <w:num w:numId="27" w16cid:durableId="513543965">
-    <w:abstractNumId w:val="3"/>
+  <w:num w:numId="30" w16cid:durableId="205289970">
+    <w:abstractNumId w:val="17"/>
   </w:num>
 </w:numbering>
 </file>

</xml_diff>

<commit_message>
poc - comment - Phase 6 - Polish & Hardening
</commit_message>
<xml_diff>
--- a/docs/poc_notes.docx
+++ b/docs/poc_notes.docx
@@ -3873,7 +3873,7 @@
           <v:shape id="_x0000_i1025" type="#_x0000_t75" style="width:75.4pt;height:49.6pt" o:ole="">
             <v:imagedata r:id="rId9" o:title=""/>
           </v:shape>
-          <o:OLEObject Type="Embed" ProgID="Package" ShapeID="_x0000_i1025" DrawAspect="Icon" ObjectID="_1835809924" r:id="rId10"/>
+          <o:OLEObject Type="Embed" ProgID="Package" ShapeID="_x0000_i1025" DrawAspect="Icon" ObjectID="_1835811614" r:id="rId10"/>
         </w:object>
       </w:r>
     </w:p>
@@ -3906,7 +3906,7 @@
           <v:shape id="_x0000_i1026" type="#_x0000_t75" style="width:75.4pt;height:49.6pt" o:ole="">
             <v:imagedata r:id="rId11" o:title=""/>
           </v:shape>
-          <o:OLEObject Type="Embed" ProgID="Package" ShapeID="_x0000_i1026" DrawAspect="Icon" ObjectID="_1835809925" r:id="rId12"/>
+          <o:OLEObject Type="Embed" ProgID="Package" ShapeID="_x0000_i1026" DrawAspect="Icon" ObjectID="_1835811615" r:id="rId12"/>
         </w:object>
       </w:r>
     </w:p>
@@ -3982,7 +3982,7 @@
           <v:shape id="_x0000_i1027" type="#_x0000_t75" style="width:75.4pt;height:49.6pt" o:ole="">
             <v:imagedata r:id="rId14" o:title=""/>
           </v:shape>
-          <o:OLEObject Type="Embed" ProgID="Package" ShapeID="_x0000_i1027" DrawAspect="Icon" ObjectID="_1835809926" r:id="rId15"/>
+          <o:OLEObject Type="Embed" ProgID="Package" ShapeID="_x0000_i1027" DrawAspect="Icon" ObjectID="_1835811616" r:id="rId15"/>
         </w:object>
       </w:r>
     </w:p>
@@ -4058,7 +4058,7 @@
           <v:shape id="_x0000_i1028" type="#_x0000_t75" style="width:75.4pt;height:49.6pt" o:ole="">
             <v:imagedata r:id="rId17" o:title=""/>
           </v:shape>
-          <o:OLEObject Type="Embed" ProgID="Package" ShapeID="_x0000_i1028" DrawAspect="Icon" ObjectID="_1835809927" r:id="rId18"/>
+          <o:OLEObject Type="Embed" ProgID="Package" ShapeID="_x0000_i1028" DrawAspect="Icon" ObjectID="_1835811617" r:id="rId18"/>
         </w:object>
       </w:r>
     </w:p>
@@ -9969,6 +9969,432 @@
       <w:pPr>
         <w:ind w:left="284"/>
       </w:pPr>
+      <w:r>
+        <w:rPr>
+          <w:b/>
+          <w:bCs/>
+        </w:rPr>
+        <w:t>Backend (Java):</w:t>
+      </w:r>
+    </w:p>
+    <w:p>
+      <w:pPr>
+        <w:numPr>
+          <w:ilvl w:val="0"/>
+          <w:numId w:val="31"/>
+        </w:numPr>
+        <w:tabs>
+          <w:tab w:val="clear" w:pos="720"/>
+          <w:tab w:val="num" w:pos="851"/>
+        </w:tabs>
+        <w:ind w:left="851" w:hanging="284"/>
+      </w:pPr>
+      <w:proofErr w:type="spellStart"/>
+      <w:r>
+        <w:rPr>
+          <w:b/>
+          <w:bCs/>
+        </w:rPr>
+        <w:t>CommentThreadDto</w:t>
+      </w:r>
+      <w:proofErr w:type="spellEnd"/>
+      <w:r>
+        <w:t> — added </w:t>
+      </w:r>
+      <w:proofErr w:type="spellStart"/>
+      <w:r>
+        <w:fldChar w:fldCharType="begin"/>
+      </w:r>
+      <w:r>
+        <w:instrText>HYPERLINK "vscode-file://vscode-app/d:/apps/Microsoft%20VS%20Code/07ff9d6178/resources/app/out/vs/code/electron-browser/workbench/workbench.html" \o ""</w:instrText>
+      </w:r>
+      <w:r>
+        <w:fldChar w:fldCharType="separate"/>
+      </w:r>
+      <w:r>
+        <w:rPr>
+          <w:rStyle w:val="Hyperlink"/>
+        </w:rPr>
+        <w:t>isDeleted</w:t>
+      </w:r>
+      <w:proofErr w:type="spellEnd"/>
+      <w:r>
+        <w:fldChar w:fldCharType="end"/>
+      </w:r>
+      <w:r>
+        <w:t> </w:t>
+      </w:r>
+      <w:proofErr w:type="spellStart"/>
+      <w:r>
+        <w:t>boolean</w:t>
+      </w:r>
+      <w:proofErr w:type="spellEnd"/>
+      <w:r>
+        <w:t xml:space="preserve"> field</w:t>
+      </w:r>
+    </w:p>
+    <w:p>
+      <w:pPr>
+        <w:numPr>
+          <w:ilvl w:val="0"/>
+          <w:numId w:val="31"/>
+        </w:numPr>
+        <w:tabs>
+          <w:tab w:val="clear" w:pos="720"/>
+          <w:tab w:val="num" w:pos="851"/>
+        </w:tabs>
+        <w:ind w:left="851" w:hanging="284"/>
+      </w:pPr>
+      <w:proofErr w:type="spellStart"/>
+      <w:r>
+        <w:rPr>
+          <w:b/>
+          <w:bCs/>
+        </w:rPr>
+        <w:lastRenderedPageBreak/>
+        <w:t>CommentRepository</w:t>
+      </w:r>
+      <w:proofErr w:type="spellEnd"/>
+      <w:r>
+        <w:t> — added 3 new queries: fetch all comments (including deleted), single entity count, and batch entity counts via JPQL</w:t>
+      </w:r>
+    </w:p>
+    <w:p>
+      <w:pPr>
+        <w:numPr>
+          <w:ilvl w:val="0"/>
+          <w:numId w:val="31"/>
+        </w:numPr>
+        <w:tabs>
+          <w:tab w:val="clear" w:pos="720"/>
+          <w:tab w:val="num" w:pos="851"/>
+        </w:tabs>
+        <w:ind w:left="851" w:hanging="284"/>
+      </w:pPr>
+      <w:proofErr w:type="spellStart"/>
+      <w:r>
+        <w:rPr>
+          <w:b/>
+          <w:bCs/>
+        </w:rPr>
+        <w:t>CommentServiceImpl</w:t>
+      </w:r>
+      <w:proofErr w:type="spellEnd"/>
+      <w:r>
+        <w:t> — rewrote </w:t>
+      </w:r>
+      <w:proofErr w:type="spellStart"/>
+      <w:r>
+        <w:fldChar w:fldCharType="begin"/>
+      </w:r>
+      <w:r>
+        <w:instrText>HYPERLINK "vscode-file://vscode-app/d:/apps/Microsoft%20VS%20Code/07ff9d6178/resources/app/out/vs/code/electron-browser/workbench/workbench.html" \o ""</w:instrText>
+      </w:r>
+      <w:r>
+        <w:fldChar w:fldCharType="separate"/>
+      </w:r>
+      <w:r>
+        <w:rPr>
+          <w:rStyle w:val="Hyperlink"/>
+        </w:rPr>
+        <w:t>getThread</w:t>
+      </w:r>
+      <w:proofErr w:type="spellEnd"/>
+      <w:r>
+        <w:rPr>
+          <w:rStyle w:val="Hyperlink"/>
+        </w:rPr>
+        <w:t>()</w:t>
+      </w:r>
+      <w:r>
+        <w:fldChar w:fldCharType="end"/>
+      </w:r>
+      <w:r>
+        <w:t> to include soft-deleted parents as placeholders when they have non-deleted descendants; added </w:t>
+      </w:r>
+      <w:proofErr w:type="spellStart"/>
+      <w:r>
+        <w:fldChar w:fldCharType="begin"/>
+      </w:r>
+      <w:r>
+        <w:instrText>HYPERLINK "vscode-file://vscode-app/d:/apps/Microsoft%20VS%20Code/07ff9d6178/resources/app/out/vs/code/electron-browser/workbench/workbench.html" \o ""</w:instrText>
+      </w:r>
+      <w:r>
+        <w:fldChar w:fldCharType="separate"/>
+      </w:r>
+      <w:r>
+        <w:rPr>
+          <w:rStyle w:val="Hyperlink"/>
+        </w:rPr>
+        <w:t>getCounts</w:t>
+      </w:r>
+      <w:proofErr w:type="spellEnd"/>
+      <w:r>
+        <w:rPr>
+          <w:rStyle w:val="Hyperlink"/>
+        </w:rPr>
+        <w:t>()</w:t>
+      </w:r>
+      <w:r>
+        <w:fldChar w:fldCharType="end"/>
+      </w:r>
+      <w:r>
+        <w:t> for batch comment count retrieval</w:t>
+      </w:r>
+    </w:p>
+    <w:p>
+      <w:pPr>
+        <w:numPr>
+          <w:ilvl w:val="0"/>
+          <w:numId w:val="31"/>
+        </w:numPr>
+        <w:tabs>
+          <w:tab w:val="clear" w:pos="720"/>
+          <w:tab w:val="num" w:pos="851"/>
+        </w:tabs>
+        <w:ind w:left="851" w:hanging="284"/>
+      </w:pPr>
+      <w:proofErr w:type="spellStart"/>
+      <w:r>
+        <w:rPr>
+          <w:b/>
+          <w:bCs/>
+        </w:rPr>
+        <w:t>CommentController</w:t>
+      </w:r>
+      <w:proofErr w:type="spellEnd"/>
+      <w:r>
+        <w:t> — added </w:t>
+      </w:r>
+      <w:hyperlink r:id="rId36" w:history="1">
+        <w:r>
+          <w:rPr>
+            <w:rStyle w:val="Hyperlink"/>
+          </w:rPr>
+          <w:t>GET /</w:t>
+        </w:r>
+        <w:proofErr w:type="spellStart"/>
+        <w:r>
+          <w:rPr>
+            <w:rStyle w:val="Hyperlink"/>
+          </w:rPr>
+          <w:t>api</w:t>
+        </w:r>
+        <w:proofErr w:type="spellEnd"/>
+        <w:r>
+          <w:rPr>
+            <w:rStyle w:val="Hyperlink"/>
+          </w:rPr>
+          <w:t>/comments/</w:t>
+        </w:r>
+        <w:proofErr w:type="spellStart"/>
+        <w:r>
+          <w:rPr>
+            <w:rStyle w:val="Hyperlink"/>
+          </w:rPr>
+          <w:t>counts?entityType</w:t>
+        </w:r>
+        <w:proofErr w:type="spellEnd"/>
+        <w:r>
+          <w:rPr>
+            <w:rStyle w:val="Hyperlink"/>
+          </w:rPr>
+          <w:t>=&amp;</w:t>
+        </w:r>
+        <w:proofErr w:type="spellStart"/>
+        <w:r>
+          <w:rPr>
+            <w:rStyle w:val="Hyperlink"/>
+          </w:rPr>
+          <w:t>entityIds</w:t>
+        </w:r>
+        <w:proofErr w:type="spellEnd"/>
+        <w:r>
+          <w:rPr>
+            <w:rStyle w:val="Hyperlink"/>
+          </w:rPr>
+          <w:t>=</w:t>
+        </w:r>
+      </w:hyperlink>
+      <w:r>
+        <w:t> endpoint</w:t>
+      </w:r>
+    </w:p>
+    <w:p>
+      <w:pPr>
+        <w:ind w:left="284"/>
+      </w:pPr>
+      <w:r>
+        <w:rPr>
+          <w:b/>
+          <w:bCs/>
+        </w:rPr>
+        <w:t>Frontend (Angular):</w:t>
+      </w:r>
+    </w:p>
+    <w:p>
+      <w:pPr>
+        <w:numPr>
+          <w:ilvl w:val="0"/>
+          <w:numId w:val="31"/>
+        </w:numPr>
+        <w:tabs>
+          <w:tab w:val="clear" w:pos="720"/>
+          <w:tab w:val="num" w:pos="851"/>
+        </w:tabs>
+        <w:ind w:left="851" w:hanging="284"/>
+      </w:pPr>
+      <w:r>
+        <w:rPr>
+          <w:b/>
+          <w:bCs/>
+        </w:rPr>
+        <w:t>6.1 Error handling</w:t>
+      </w:r>
+      <w:r>
+        <w:t>: Thread panel differentiates 401/403/404/500/network errors with specific messages; network/server errors show a Retry button</w:t>
+      </w:r>
+    </w:p>
+    <w:p>
+      <w:pPr>
+        <w:numPr>
+          <w:ilvl w:val="0"/>
+          <w:numId w:val="31"/>
+        </w:numPr>
+        <w:tabs>
+          <w:tab w:val="clear" w:pos="720"/>
+          <w:tab w:val="num" w:pos="851"/>
+        </w:tabs>
+        <w:ind w:left="851" w:hanging="284"/>
+      </w:pPr>
+      <w:r>
+        <w:rPr>
+          <w:b/>
+          <w:bCs/>
+        </w:rPr>
+        <w:t>6.4 Deleted display</w:t>
+      </w:r>
+      <w:r>
+        <w:t>: Deleted comments render as "[This comment has been removed]" with dashed border styling; their replies still show</w:t>
+      </w:r>
+    </w:p>
+    <w:p>
+      <w:pPr>
+        <w:numPr>
+          <w:ilvl w:val="0"/>
+          <w:numId w:val="31"/>
+        </w:numPr>
+        <w:tabs>
+          <w:tab w:val="clear" w:pos="720"/>
+          <w:tab w:val="num" w:pos="851"/>
+        </w:tabs>
+        <w:ind w:left="851" w:hanging="284"/>
+      </w:pPr>
+      <w:r>
+        <w:rPr>
+          <w:b/>
+          <w:bCs/>
+        </w:rPr>
+        <w:t>6.5 Collapse deep threads</w:t>
+      </w:r>
+      <w:r>
+        <w:t>: Replies beyond depth 3 auto-collapse with "Show N more replies" expandable link</w:t>
+      </w:r>
+    </w:p>
+    <w:p>
+      <w:pPr>
+        <w:numPr>
+          <w:ilvl w:val="0"/>
+          <w:numId w:val="31"/>
+        </w:numPr>
+        <w:tabs>
+          <w:tab w:val="clear" w:pos="720"/>
+          <w:tab w:val="num" w:pos="851"/>
+        </w:tabs>
+        <w:ind w:left="851" w:hanging="284"/>
+      </w:pPr>
+      <w:r>
+        <w:rPr>
+          <w:b/>
+          <w:bCs/>
+        </w:rPr>
+        <w:t>6.6 Comment count badge</w:t>
+      </w:r>
+      <w:r>
+        <w:t xml:space="preserve">: Counts load on page </w:t>
+      </w:r>
+      <w:proofErr w:type="spellStart"/>
+      <w:r>
+        <w:t>init</w:t>
+      </w:r>
+      <w:proofErr w:type="spellEnd"/>
+      <w:r>
+        <w:t xml:space="preserve"> via batch endpoint (not just when panel opens)</w:t>
+      </w:r>
+    </w:p>
+    <w:p>
+      <w:pPr>
+        <w:numPr>
+          <w:ilvl w:val="0"/>
+          <w:numId w:val="31"/>
+        </w:numPr>
+        <w:tabs>
+          <w:tab w:val="clear" w:pos="720"/>
+          <w:tab w:val="num" w:pos="851"/>
+        </w:tabs>
+        <w:ind w:left="851" w:hanging="284"/>
+      </w:pPr>
+      <w:r>
+        <w:rPr>
+          <w:b/>
+          <w:bCs/>
+        </w:rPr>
+        <w:t>6.7 Optimistic UI</w:t>
+      </w:r>
+      <w:r>
+        <w:t>: New top-level comments appear instantly; reverted on error</w:t>
+      </w:r>
+    </w:p>
+    <w:p>
+      <w:pPr>
+        <w:numPr>
+          <w:ilvl w:val="0"/>
+          <w:numId w:val="31"/>
+        </w:numPr>
+        <w:tabs>
+          <w:tab w:val="clear" w:pos="720"/>
+          <w:tab w:val="num" w:pos="851"/>
+        </w:tabs>
+        <w:ind w:left="851" w:hanging="284"/>
+      </w:pPr>
+      <w:r>
+        <w:rPr>
+          <w:b/>
+          <w:bCs/>
+        </w:rPr>
+        <w:t>6.8 Accessibility</w:t>
+      </w:r>
+      <w:r>
+        <w:t>: ARIA roles/labels on panel, entries, buttons, icons; aria-live="polite" for dynamic content; Escape key closes panel; </w:t>
+      </w:r>
+      <w:proofErr w:type="spellStart"/>
+      <w:r>
+        <w:t>trackBy</w:t>
+      </w:r>
+      <w:proofErr w:type="spellEnd"/>
+      <w:r>
+        <w:t> on all *</w:t>
+      </w:r>
+      <w:proofErr w:type="spellStart"/>
+      <w:r>
+        <w:t>ngFor</w:t>
+      </w:r>
+      <w:proofErr w:type="spellEnd"/>
+    </w:p>
+    <w:p>
+      <w:pPr>
+        <w:ind w:left="284"/>
+      </w:pPr>
     </w:p>
     <w:p/>
     <w:p/>
@@ -11159,6 +11585,155 @@
     </w:lvl>
   </w:abstractNum>
   <w:abstractNum w:abstractNumId="9" w15:restartNumberingAfterBreak="0">
+    <w:nsid w:val="1BCA4711"/>
+    <w:multiLevelType w:val="multilevel"/>
+    <w:tmpl w:val="3F587C96"/>
+    <w:lvl w:ilvl="0">
+      <w:start w:val="1"/>
+      <w:numFmt w:val="bullet"/>
+      <w:lvlText w:val=""/>
+      <w:lvlJc w:val="left"/>
+      <w:pPr>
+        <w:tabs>
+          <w:tab w:val="num" w:pos="720"/>
+        </w:tabs>
+        <w:ind w:left="720" w:hanging="360"/>
+      </w:pPr>
+      <w:rPr>
+        <w:rFonts w:ascii="Symbol" w:hAnsi="Symbol" w:hint="default"/>
+        <w:sz w:val="20"/>
+      </w:rPr>
+    </w:lvl>
+    <w:lvl w:ilvl="1" w:tentative="1">
+      <w:start w:val="1"/>
+      <w:numFmt w:val="bullet"/>
+      <w:lvlText w:val="o"/>
+      <w:lvlJc w:val="left"/>
+      <w:pPr>
+        <w:tabs>
+          <w:tab w:val="num" w:pos="1440"/>
+        </w:tabs>
+        <w:ind w:left="1440" w:hanging="360"/>
+      </w:pPr>
+      <w:rPr>
+        <w:rFonts w:ascii="Courier New" w:hAnsi="Courier New" w:hint="default"/>
+        <w:sz w:val="20"/>
+      </w:rPr>
+    </w:lvl>
+    <w:lvl w:ilvl="2" w:tentative="1">
+      <w:start w:val="1"/>
+      <w:numFmt w:val="bullet"/>
+      <w:lvlText w:val=""/>
+      <w:lvlJc w:val="left"/>
+      <w:pPr>
+        <w:tabs>
+          <w:tab w:val="num" w:pos="2160"/>
+        </w:tabs>
+        <w:ind w:left="2160" w:hanging="360"/>
+      </w:pPr>
+      <w:rPr>
+        <w:rFonts w:ascii="Wingdings" w:hAnsi="Wingdings" w:hint="default"/>
+        <w:sz w:val="20"/>
+      </w:rPr>
+    </w:lvl>
+    <w:lvl w:ilvl="3" w:tentative="1">
+      <w:start w:val="1"/>
+      <w:numFmt w:val="bullet"/>
+      <w:lvlText w:val=""/>
+      <w:lvlJc w:val="left"/>
+      <w:pPr>
+        <w:tabs>
+          <w:tab w:val="num" w:pos="2880"/>
+        </w:tabs>
+        <w:ind w:left="2880" w:hanging="360"/>
+      </w:pPr>
+      <w:rPr>
+        <w:rFonts w:ascii="Wingdings" w:hAnsi="Wingdings" w:hint="default"/>
+        <w:sz w:val="20"/>
+      </w:rPr>
+    </w:lvl>
+    <w:lvl w:ilvl="4" w:tentative="1">
+      <w:start w:val="1"/>
+      <w:numFmt w:val="bullet"/>
+      <w:lvlText w:val=""/>
+      <w:lvlJc w:val="left"/>
+      <w:pPr>
+        <w:tabs>
+          <w:tab w:val="num" w:pos="3600"/>
+        </w:tabs>
+        <w:ind w:left="3600" w:hanging="360"/>
+      </w:pPr>
+      <w:rPr>
+        <w:rFonts w:ascii="Wingdings" w:hAnsi="Wingdings" w:hint="default"/>
+        <w:sz w:val="20"/>
+      </w:rPr>
+    </w:lvl>
+    <w:lvl w:ilvl="5" w:tentative="1">
+      <w:start w:val="1"/>
+      <w:numFmt w:val="bullet"/>
+      <w:lvlText w:val=""/>
+      <w:lvlJc w:val="left"/>
+      <w:pPr>
+        <w:tabs>
+          <w:tab w:val="num" w:pos="4320"/>
+        </w:tabs>
+        <w:ind w:left="4320" w:hanging="360"/>
+      </w:pPr>
+      <w:rPr>
+        <w:rFonts w:ascii="Wingdings" w:hAnsi="Wingdings" w:hint="default"/>
+        <w:sz w:val="20"/>
+      </w:rPr>
+    </w:lvl>
+    <w:lvl w:ilvl="6" w:tentative="1">
+      <w:start w:val="1"/>
+      <w:numFmt w:val="bullet"/>
+      <w:lvlText w:val=""/>
+      <w:lvlJc w:val="left"/>
+      <w:pPr>
+        <w:tabs>
+          <w:tab w:val="num" w:pos="5040"/>
+        </w:tabs>
+        <w:ind w:left="5040" w:hanging="360"/>
+      </w:pPr>
+      <w:rPr>
+        <w:rFonts w:ascii="Wingdings" w:hAnsi="Wingdings" w:hint="default"/>
+        <w:sz w:val="20"/>
+      </w:rPr>
+    </w:lvl>
+    <w:lvl w:ilvl="7" w:tentative="1">
+      <w:start w:val="1"/>
+      <w:numFmt w:val="bullet"/>
+      <w:lvlText w:val=""/>
+      <w:lvlJc w:val="left"/>
+      <w:pPr>
+        <w:tabs>
+          <w:tab w:val="num" w:pos="5760"/>
+        </w:tabs>
+        <w:ind w:left="5760" w:hanging="360"/>
+      </w:pPr>
+      <w:rPr>
+        <w:rFonts w:ascii="Wingdings" w:hAnsi="Wingdings" w:hint="default"/>
+        <w:sz w:val="20"/>
+      </w:rPr>
+    </w:lvl>
+    <w:lvl w:ilvl="8" w:tentative="1">
+      <w:start w:val="1"/>
+      <w:numFmt w:val="bullet"/>
+      <w:lvlText w:val=""/>
+      <w:lvlJc w:val="left"/>
+      <w:pPr>
+        <w:tabs>
+          <w:tab w:val="num" w:pos="6480"/>
+        </w:tabs>
+        <w:ind w:left="6480" w:hanging="360"/>
+      </w:pPr>
+      <w:rPr>
+        <w:rFonts w:ascii="Wingdings" w:hAnsi="Wingdings" w:hint="default"/>
+        <w:sz w:val="20"/>
+      </w:rPr>
+    </w:lvl>
+  </w:abstractNum>
+  <w:abstractNum w:abstractNumId="10" w15:restartNumberingAfterBreak="0">
     <w:nsid w:val="1D1149F5"/>
     <w:multiLevelType w:val="multilevel"/>
     <w:tmpl w:val="19346220"/>
@@ -11307,7 +11882,7 @@
       </w:rPr>
     </w:lvl>
   </w:abstractNum>
-  <w:abstractNum w:abstractNumId="10" w15:restartNumberingAfterBreak="0">
+  <w:abstractNum w:abstractNumId="11" w15:restartNumberingAfterBreak="0">
     <w:nsid w:val="20180394"/>
     <w:multiLevelType w:val="multilevel"/>
     <w:tmpl w:val="24BCCDFE"/>
@@ -11456,7 +12031,156 @@
       </w:rPr>
     </w:lvl>
   </w:abstractNum>
-  <w:abstractNum w:abstractNumId="11" w15:restartNumberingAfterBreak="0">
+  <w:abstractNum w:abstractNumId="12" w15:restartNumberingAfterBreak="0">
+    <w:nsid w:val="246317E1"/>
+    <w:multiLevelType w:val="multilevel"/>
+    <w:tmpl w:val="85F0C770"/>
+    <w:lvl w:ilvl="0">
+      <w:start w:val="1"/>
+      <w:numFmt w:val="bullet"/>
+      <w:lvlText w:val=""/>
+      <w:lvlJc w:val="left"/>
+      <w:pPr>
+        <w:tabs>
+          <w:tab w:val="num" w:pos="720"/>
+        </w:tabs>
+        <w:ind w:left="720" w:hanging="360"/>
+      </w:pPr>
+      <w:rPr>
+        <w:rFonts w:ascii="Symbol" w:hAnsi="Symbol" w:hint="default"/>
+        <w:sz w:val="20"/>
+      </w:rPr>
+    </w:lvl>
+    <w:lvl w:ilvl="1" w:tentative="1">
+      <w:start w:val="1"/>
+      <w:numFmt w:val="bullet"/>
+      <w:lvlText w:val="o"/>
+      <w:lvlJc w:val="left"/>
+      <w:pPr>
+        <w:tabs>
+          <w:tab w:val="num" w:pos="1440"/>
+        </w:tabs>
+        <w:ind w:left="1440" w:hanging="360"/>
+      </w:pPr>
+      <w:rPr>
+        <w:rFonts w:ascii="Courier New" w:hAnsi="Courier New" w:hint="default"/>
+        <w:sz w:val="20"/>
+      </w:rPr>
+    </w:lvl>
+    <w:lvl w:ilvl="2" w:tentative="1">
+      <w:start w:val="1"/>
+      <w:numFmt w:val="bullet"/>
+      <w:lvlText w:val=""/>
+      <w:lvlJc w:val="left"/>
+      <w:pPr>
+        <w:tabs>
+          <w:tab w:val="num" w:pos="2160"/>
+        </w:tabs>
+        <w:ind w:left="2160" w:hanging="360"/>
+      </w:pPr>
+      <w:rPr>
+        <w:rFonts w:ascii="Wingdings" w:hAnsi="Wingdings" w:hint="default"/>
+        <w:sz w:val="20"/>
+      </w:rPr>
+    </w:lvl>
+    <w:lvl w:ilvl="3" w:tentative="1">
+      <w:start w:val="1"/>
+      <w:numFmt w:val="bullet"/>
+      <w:lvlText w:val=""/>
+      <w:lvlJc w:val="left"/>
+      <w:pPr>
+        <w:tabs>
+          <w:tab w:val="num" w:pos="2880"/>
+        </w:tabs>
+        <w:ind w:left="2880" w:hanging="360"/>
+      </w:pPr>
+      <w:rPr>
+        <w:rFonts w:ascii="Wingdings" w:hAnsi="Wingdings" w:hint="default"/>
+        <w:sz w:val="20"/>
+      </w:rPr>
+    </w:lvl>
+    <w:lvl w:ilvl="4" w:tentative="1">
+      <w:start w:val="1"/>
+      <w:numFmt w:val="bullet"/>
+      <w:lvlText w:val=""/>
+      <w:lvlJc w:val="left"/>
+      <w:pPr>
+        <w:tabs>
+          <w:tab w:val="num" w:pos="3600"/>
+        </w:tabs>
+        <w:ind w:left="3600" w:hanging="360"/>
+      </w:pPr>
+      <w:rPr>
+        <w:rFonts w:ascii="Wingdings" w:hAnsi="Wingdings" w:hint="default"/>
+        <w:sz w:val="20"/>
+      </w:rPr>
+    </w:lvl>
+    <w:lvl w:ilvl="5" w:tentative="1">
+      <w:start w:val="1"/>
+      <w:numFmt w:val="bullet"/>
+      <w:lvlText w:val=""/>
+      <w:lvlJc w:val="left"/>
+      <w:pPr>
+        <w:tabs>
+          <w:tab w:val="num" w:pos="4320"/>
+        </w:tabs>
+        <w:ind w:left="4320" w:hanging="360"/>
+      </w:pPr>
+      <w:rPr>
+        <w:rFonts w:ascii="Wingdings" w:hAnsi="Wingdings" w:hint="default"/>
+        <w:sz w:val="20"/>
+      </w:rPr>
+    </w:lvl>
+    <w:lvl w:ilvl="6" w:tentative="1">
+      <w:start w:val="1"/>
+      <w:numFmt w:val="bullet"/>
+      <w:lvlText w:val=""/>
+      <w:lvlJc w:val="left"/>
+      <w:pPr>
+        <w:tabs>
+          <w:tab w:val="num" w:pos="5040"/>
+        </w:tabs>
+        <w:ind w:left="5040" w:hanging="360"/>
+      </w:pPr>
+      <w:rPr>
+        <w:rFonts w:ascii="Wingdings" w:hAnsi="Wingdings" w:hint="default"/>
+        <w:sz w:val="20"/>
+      </w:rPr>
+    </w:lvl>
+    <w:lvl w:ilvl="7" w:tentative="1">
+      <w:start w:val="1"/>
+      <w:numFmt w:val="bullet"/>
+      <w:lvlText w:val=""/>
+      <w:lvlJc w:val="left"/>
+      <w:pPr>
+        <w:tabs>
+          <w:tab w:val="num" w:pos="5760"/>
+        </w:tabs>
+        <w:ind w:left="5760" w:hanging="360"/>
+      </w:pPr>
+      <w:rPr>
+        <w:rFonts w:ascii="Wingdings" w:hAnsi="Wingdings" w:hint="default"/>
+        <w:sz w:val="20"/>
+      </w:rPr>
+    </w:lvl>
+    <w:lvl w:ilvl="8" w:tentative="1">
+      <w:start w:val="1"/>
+      <w:numFmt w:val="bullet"/>
+      <w:lvlText w:val=""/>
+      <w:lvlJc w:val="left"/>
+      <w:pPr>
+        <w:tabs>
+          <w:tab w:val="num" w:pos="6480"/>
+        </w:tabs>
+        <w:ind w:left="6480" w:hanging="360"/>
+      </w:pPr>
+      <w:rPr>
+        <w:rFonts w:ascii="Wingdings" w:hAnsi="Wingdings" w:hint="default"/>
+        <w:sz w:val="20"/>
+      </w:rPr>
+    </w:lvl>
+  </w:abstractNum>
+  <w:abstractNum w:abstractNumId="13" w15:restartNumberingAfterBreak="0">
     <w:nsid w:val="28BA103E"/>
     <w:multiLevelType w:val="hybridMultilevel"/>
     <w:tmpl w:val="77349F68"/>
@@ -11569,7 +12293,7 @@
       </w:rPr>
     </w:lvl>
   </w:abstractNum>
-  <w:abstractNum w:abstractNumId="12" w15:restartNumberingAfterBreak="0">
+  <w:abstractNum w:abstractNumId="14" w15:restartNumberingAfterBreak="0">
     <w:nsid w:val="2ACC1008"/>
     <w:multiLevelType w:val="multilevel"/>
     <w:tmpl w:val="83E0AAAE"/>
@@ -11718,7 +12442,7 @@
       </w:rPr>
     </w:lvl>
   </w:abstractNum>
-  <w:abstractNum w:abstractNumId="13" w15:restartNumberingAfterBreak="0">
+  <w:abstractNum w:abstractNumId="15" w15:restartNumberingAfterBreak="0">
     <w:nsid w:val="36DC4EAE"/>
     <w:multiLevelType w:val="multilevel"/>
     <w:tmpl w:val="768EADA2"/>
@@ -11835,7 +12559,7 @@
       </w:pPr>
     </w:lvl>
   </w:abstractNum>
-  <w:abstractNum w:abstractNumId="14" w15:restartNumberingAfterBreak="0">
+  <w:abstractNum w:abstractNumId="16" w15:restartNumberingAfterBreak="0">
     <w:nsid w:val="3AD06FD2"/>
     <w:multiLevelType w:val="multilevel"/>
     <w:tmpl w:val="3CC81D80"/>
@@ -11984,7 +12708,7 @@
       </w:rPr>
     </w:lvl>
   </w:abstractNum>
-  <w:abstractNum w:abstractNumId="15" w15:restartNumberingAfterBreak="0">
+  <w:abstractNum w:abstractNumId="17" w15:restartNumberingAfterBreak="0">
     <w:nsid w:val="3DAC2A76"/>
     <w:multiLevelType w:val="hybridMultilevel"/>
     <w:tmpl w:val="533A61F2"/>
@@ -12097,7 +12821,7 @@
       </w:rPr>
     </w:lvl>
   </w:abstractNum>
-  <w:abstractNum w:abstractNumId="16" w15:restartNumberingAfterBreak="0">
+  <w:abstractNum w:abstractNumId="18" w15:restartNumberingAfterBreak="0">
     <w:nsid w:val="43816EC9"/>
     <w:multiLevelType w:val="multilevel"/>
     <w:tmpl w:val="E1A4D0BE"/>
@@ -12210,7 +12934,7 @@
       </w:pPr>
     </w:lvl>
   </w:abstractNum>
-  <w:abstractNum w:abstractNumId="17" w15:restartNumberingAfterBreak="0">
+  <w:abstractNum w:abstractNumId="19" w15:restartNumberingAfterBreak="0">
     <w:nsid w:val="453F48B0"/>
     <w:multiLevelType w:val="multilevel"/>
     <w:tmpl w:val="AEB4B102"/>
@@ -12359,7 +13083,7 @@
       </w:rPr>
     </w:lvl>
   </w:abstractNum>
-  <w:abstractNum w:abstractNumId="18" w15:restartNumberingAfterBreak="0">
+  <w:abstractNum w:abstractNumId="20" w15:restartNumberingAfterBreak="0">
     <w:nsid w:val="4B541038"/>
     <w:multiLevelType w:val="multilevel"/>
     <w:tmpl w:val="24BCCDFE"/>
@@ -12476,7 +13200,7 @@
       </w:pPr>
     </w:lvl>
   </w:abstractNum>
-  <w:abstractNum w:abstractNumId="19" w15:restartNumberingAfterBreak="0">
+  <w:abstractNum w:abstractNumId="21" w15:restartNumberingAfterBreak="0">
     <w:nsid w:val="4B803365"/>
     <w:multiLevelType w:val="multilevel"/>
     <w:tmpl w:val="24BCCDFE"/>
@@ -12593,7 +13317,7 @@
       </w:pPr>
     </w:lvl>
   </w:abstractNum>
-  <w:abstractNum w:abstractNumId="20" w15:restartNumberingAfterBreak="0">
+  <w:abstractNum w:abstractNumId="22" w15:restartNumberingAfterBreak="0">
     <w:nsid w:val="5EEA7024"/>
     <w:multiLevelType w:val="hybridMultilevel"/>
     <w:tmpl w:val="AABA2528"/>
@@ -12682,7 +13406,7 @@
       </w:pPr>
     </w:lvl>
   </w:abstractNum>
-  <w:abstractNum w:abstractNumId="21" w15:restartNumberingAfterBreak="0">
+  <w:abstractNum w:abstractNumId="23" w15:restartNumberingAfterBreak="0">
     <w:nsid w:val="5FE34003"/>
     <w:multiLevelType w:val="multilevel"/>
     <w:tmpl w:val="DF4AD572"/>
@@ -12831,7 +13555,7 @@
       </w:rPr>
     </w:lvl>
   </w:abstractNum>
-  <w:abstractNum w:abstractNumId="22" w15:restartNumberingAfterBreak="0">
+  <w:abstractNum w:abstractNumId="24" w15:restartNumberingAfterBreak="0">
     <w:nsid w:val="67C821B7"/>
     <w:multiLevelType w:val="multilevel"/>
     <w:tmpl w:val="532C346E"/>
@@ -12980,7 +13704,7 @@
       </w:rPr>
     </w:lvl>
   </w:abstractNum>
-  <w:abstractNum w:abstractNumId="23" w15:restartNumberingAfterBreak="0">
+  <w:abstractNum w:abstractNumId="25" w15:restartNumberingAfterBreak="0">
     <w:nsid w:val="77B815C1"/>
     <w:multiLevelType w:val="multilevel"/>
     <w:tmpl w:val="8F5C64D8"/>
@@ -13129,7 +13853,7 @@
       </w:rPr>
     </w:lvl>
   </w:abstractNum>
-  <w:abstractNum w:abstractNumId="24" w15:restartNumberingAfterBreak="0">
+  <w:abstractNum w:abstractNumId="26" w15:restartNumberingAfterBreak="0">
     <w:nsid w:val="786E5DA7"/>
     <w:multiLevelType w:val="hybridMultilevel"/>
     <w:tmpl w:val="1E96CCF8"/>
@@ -13242,7 +13966,7 @@
       </w:rPr>
     </w:lvl>
   </w:abstractNum>
-  <w:abstractNum w:abstractNumId="25" w15:restartNumberingAfterBreak="0">
+  <w:abstractNum w:abstractNumId="27" w15:restartNumberingAfterBreak="0">
     <w:nsid w:val="7912704F"/>
     <w:multiLevelType w:val="multilevel"/>
     <w:tmpl w:val="9EA0F730"/>
@@ -13391,7 +14115,7 @@
       </w:rPr>
     </w:lvl>
   </w:abstractNum>
-  <w:abstractNum w:abstractNumId="26" w15:restartNumberingAfterBreak="0">
+  <w:abstractNum w:abstractNumId="28" w15:restartNumberingAfterBreak="0">
     <w:nsid w:val="793778F5"/>
     <w:multiLevelType w:val="hybridMultilevel"/>
     <w:tmpl w:val="8F0C4A80"/>
@@ -13504,7 +14228,7 @@
       </w:rPr>
     </w:lvl>
   </w:abstractNum>
-  <w:abstractNum w:abstractNumId="27" w15:restartNumberingAfterBreak="0">
+  <w:abstractNum w:abstractNumId="29" w15:restartNumberingAfterBreak="0">
     <w:nsid w:val="7A1A11C2"/>
     <w:multiLevelType w:val="multilevel"/>
     <w:tmpl w:val="F8E2C328"/>
@@ -13653,7 +14377,7 @@
       </w:rPr>
     </w:lvl>
   </w:abstractNum>
-  <w:abstractNum w:abstractNumId="28" w15:restartNumberingAfterBreak="0">
+  <w:abstractNum w:abstractNumId="30" w15:restartNumberingAfterBreak="0">
     <w:nsid w:val="7B45478C"/>
     <w:multiLevelType w:val="multilevel"/>
     <w:tmpl w:val="172AF74E"/>
@@ -13802,7 +14526,7 @@
       </w:rPr>
     </w:lvl>
   </w:abstractNum>
-  <w:abstractNum w:abstractNumId="29" w15:restartNumberingAfterBreak="0">
+  <w:abstractNum w:abstractNumId="31" w15:restartNumberingAfterBreak="0">
     <w:nsid w:val="7C633FCE"/>
     <w:multiLevelType w:val="multilevel"/>
     <w:tmpl w:val="24BCCDFE"/>
@@ -13920,52 +14644,52 @@
     </w:lvl>
   </w:abstractNum>
   <w:num w:numId="1" w16cid:durableId="1212882090">
-    <w:abstractNumId w:val="20"/>
+    <w:abstractNumId w:val="22"/>
   </w:num>
   <w:num w:numId="2" w16cid:durableId="1119959067">
-    <w:abstractNumId w:val="11"/>
+    <w:abstractNumId w:val="13"/>
   </w:num>
   <w:num w:numId="3" w16cid:durableId="322513659">
-    <w:abstractNumId w:val="28"/>
+    <w:abstractNumId w:val="30"/>
   </w:num>
   <w:num w:numId="4" w16cid:durableId="172915269">
     <w:abstractNumId w:val="2"/>
   </w:num>
   <w:num w:numId="5" w16cid:durableId="201405766">
-    <w:abstractNumId w:val="24"/>
+    <w:abstractNumId w:val="26"/>
   </w:num>
   <w:num w:numId="6" w16cid:durableId="1156267990">
-    <w:abstractNumId w:val="16"/>
+    <w:abstractNumId w:val="18"/>
   </w:num>
   <w:num w:numId="7" w16cid:durableId="589505510">
     <w:abstractNumId w:val="3"/>
   </w:num>
   <w:num w:numId="8" w16cid:durableId="500051174">
+    <w:abstractNumId w:val="11"/>
+  </w:num>
+  <w:num w:numId="9" w16cid:durableId="651830634">
+    <w:abstractNumId w:val="31"/>
+  </w:num>
+  <w:num w:numId="10" w16cid:durableId="841895827">
+    <w:abstractNumId w:val="28"/>
+  </w:num>
+  <w:num w:numId="11" w16cid:durableId="2122918639">
     <w:abstractNumId w:val="10"/>
   </w:num>
-  <w:num w:numId="9" w16cid:durableId="651830634">
-    <w:abstractNumId w:val="29"/>
-  </w:num>
-  <w:num w:numId="10" w16cid:durableId="841895827">
-    <w:abstractNumId w:val="26"/>
-  </w:num>
-  <w:num w:numId="11" w16cid:durableId="2122918639">
-    <w:abstractNumId w:val="9"/>
-  </w:num>
   <w:num w:numId="12" w16cid:durableId="164983286">
-    <w:abstractNumId w:val="19"/>
+    <w:abstractNumId w:val="21"/>
   </w:num>
   <w:num w:numId="13" w16cid:durableId="582690670">
+    <w:abstractNumId w:val="25"/>
+  </w:num>
+  <w:num w:numId="14" w16cid:durableId="264189441">
     <w:abstractNumId w:val="23"/>
   </w:num>
-  <w:num w:numId="14" w16cid:durableId="264189441">
-    <w:abstractNumId w:val="21"/>
-  </w:num>
   <w:num w:numId="15" w16cid:durableId="1577714169">
-    <w:abstractNumId w:val="18"/>
+    <w:abstractNumId w:val="20"/>
   </w:num>
   <w:num w:numId="16" w16cid:durableId="1429741216">
-    <w:abstractNumId w:val="13"/>
+    <w:abstractNumId w:val="15"/>
   </w:num>
   <w:num w:numId="17" w16cid:durableId="1176727730">
     <w:abstractNumId w:val="8"/>
@@ -13974,25 +14698,25 @@
     <w:abstractNumId w:val="0"/>
   </w:num>
   <w:num w:numId="19" w16cid:durableId="264003664">
-    <w:abstractNumId w:val="14"/>
+    <w:abstractNumId w:val="16"/>
   </w:num>
   <w:num w:numId="20" w16cid:durableId="373120343">
     <w:abstractNumId w:val="7"/>
   </w:num>
   <w:num w:numId="21" w16cid:durableId="1144279345">
-    <w:abstractNumId w:val="12"/>
+    <w:abstractNumId w:val="14"/>
   </w:num>
   <w:num w:numId="22" w16cid:durableId="465588484">
-    <w:abstractNumId w:val="15"/>
+    <w:abstractNumId w:val="17"/>
   </w:num>
   <w:num w:numId="23" w16cid:durableId="729421856">
     <w:abstractNumId w:val="5"/>
   </w:num>
   <w:num w:numId="24" w16cid:durableId="1366057816">
-    <w:abstractNumId w:val="25"/>
+    <w:abstractNumId w:val="27"/>
   </w:num>
   <w:num w:numId="25" w16cid:durableId="1433428595">
-    <w:abstractNumId w:val="22"/>
+    <w:abstractNumId w:val="24"/>
   </w:num>
   <w:num w:numId="26" w16cid:durableId="687368329">
     <w:abstractNumId w:val="6"/>
@@ -14001,13 +14725,19 @@
     <w:abstractNumId w:val="4"/>
   </w:num>
   <w:num w:numId="28" w16cid:durableId="1143740170">
-    <w:abstractNumId w:val="27"/>
+    <w:abstractNumId w:val="29"/>
   </w:num>
   <w:num w:numId="29" w16cid:durableId="476342647">
     <w:abstractNumId w:val="1"/>
   </w:num>
   <w:num w:numId="30" w16cid:durableId="205289970">
-    <w:abstractNumId w:val="17"/>
+    <w:abstractNumId w:val="19"/>
+  </w:num>
+  <w:num w:numId="31" w16cid:durableId="1179277601">
+    <w:abstractNumId w:val="12"/>
+  </w:num>
+  <w:num w:numId="32" w16cid:durableId="2048213906">
+    <w:abstractNumId w:val="9"/>
   </w:num>
 </w:numbering>
 </file>

</xml_diff>

<commit_message>
Added support for using Entra groups for authorization
</commit_message>
<xml_diff>
--- a/docs/poc_notes.docx
+++ b/docs/poc_notes.docx
@@ -264,21 +264,7 @@
                 <w:rStyle w:val="Hyperlink"/>
                 <w:noProof/>
               </w:rPr>
-              <w:t>2. Configure Entra ID: MFA (Security Default</w:t>
-            </w:r>
-            <w:r>
-              <w:rPr>
-                <w:rStyle w:val="Hyperlink"/>
-                <w:noProof/>
-              </w:rPr>
-              <w:t>s</w:t>
-            </w:r>
-            <w:r>
-              <w:rPr>
-                <w:rStyle w:val="Hyperlink"/>
-                <w:noProof/>
-              </w:rPr>
-              <w:t>) + App Roles</w:t>
+              <w:t>2. Configure Entra ID: MFA (Security Defaults) + App Roles</w:t>
             </w:r>
             <w:r>
               <w:rPr>
@@ -2938,6 +2924,15 @@
         <w:t>leap-poc-admin1</w:t>
       </w:r>
       <w:r>
+        <w:t xml:space="preserve"> (</w:t>
+      </w:r>
+      <w:r>
+        <w:t>Admin1</w:t>
+      </w:r>
+      <w:r>
+        <w:t xml:space="preserve"> Leap)</w:t>
+      </w:r>
+      <w:r>
         <w:t xml:space="preserve"> / </w:t>
       </w:r>
       <w:r>
@@ -2966,6 +2961,15 @@
       <w:r>
         <w:t>leap-poc-admin2</w:t>
       </w:r>
+      <w:r>
+        <w:t xml:space="preserve"> (</w:t>
+      </w:r>
+      <w:r>
+        <w:t>Admin</w:t>
+      </w:r>
+      <w:r>
+        <w:t>2 Leap)</w:t>
+      </w:r>
     </w:p>
     <w:p>
       <w:pPr>
@@ -2980,14 +2984,43 @@
       <w:r>
         <w:t>e1</w:t>
       </w:r>
+      <w:r>
+        <w:t xml:space="preserve"> (Write</w:t>
+      </w:r>
+      <w:r>
+        <w:t>1</w:t>
+      </w:r>
+      <w:r>
+        <w:t xml:space="preserve"> Leap)</w:t>
+      </w:r>
     </w:p>
     <w:p>
       <w:pPr>
         <w:ind w:left="720"/>
       </w:pPr>
       <w:r>
+        <w:t>leap-poc-write</w:t>
+      </w:r>
+      <w:r>
+        <w:t>2 (Write2 Leap)</w:t>
+      </w:r>
+    </w:p>
+    <w:p>
+      <w:pPr>
+        <w:ind w:left="720"/>
+      </w:pPr>
+      <w:r>
         <w:t>leap-poc-read1</w:t>
       </w:r>
+      <w:r>
+        <w:t xml:space="preserve"> (</w:t>
+      </w:r>
+      <w:r>
+        <w:t>Admin1</w:t>
+      </w:r>
+      <w:r>
+        <w:t xml:space="preserve"> Leap)</w:t>
+      </w:r>
     </w:p>
     <w:p>
       <w:pPr>
@@ -2995,6 +3028,15 @@
       </w:pPr>
       <w:r>
         <w:t>leap-poc-read2</w:t>
+      </w:r>
+      <w:r>
+        <w:t xml:space="preserve"> (</w:t>
+      </w:r>
+      <w:r>
+        <w:t>Admin2</w:t>
+      </w:r>
+      <w:r>
+        <w:t xml:space="preserve"> Leap)</w:t>
       </w:r>
     </w:p>
     <w:p>
@@ -3252,6 +3294,7 @@
           <w:b/>
           <w:bCs/>
         </w:rPr>
+        <w:lastRenderedPageBreak/>
         <w:t>New client secret</w:t>
       </w:r>
     </w:p>
@@ -3277,7 +3320,6 @@
         <w:ind w:left="1134"/>
       </w:pPr>
       <w:r>
-        <w:lastRenderedPageBreak/>
         <w:t xml:space="preserve">Client secret: </w:t>
       </w:r>
       <w:r>
@@ -3610,6 +3652,7 @@
         </w:tabs>
       </w:pPr>
       <w:r>
+        <w:lastRenderedPageBreak/>
         <w:t>Enabled: yes</w:t>
       </w:r>
     </w:p>
@@ -3622,7 +3665,6 @@
         </w:numPr>
       </w:pPr>
       <w:r>
-        <w:lastRenderedPageBreak/>
         <w:t xml:space="preserve">Create role </w:t>
       </w:r>
       <w:r>
@@ -3870,10 +3912,10 @@
             <v:path o:extrusionok="f" gradientshapeok="t" o:connecttype="rect"/>
             <o:lock v:ext="edit" aspectratio="t"/>
           </v:shapetype>
-          <v:shape id="_x0000_i1025" type="#_x0000_t75" style="width:75.4pt;height:49.6pt" o:ole="">
+          <v:shape id="_x0000_i1025" type="#_x0000_t75" style="width:75.65pt;height:49.55pt" o:ole="">
             <v:imagedata r:id="rId9" o:title=""/>
           </v:shape>
-          <o:OLEObject Type="Embed" ProgID="Package" ShapeID="_x0000_i1025" DrawAspect="Icon" ObjectID="_1835811614" r:id="rId10"/>
+          <o:OLEObject Type="Embed" ProgID="Package" ShapeID="_x0000_i1025" DrawAspect="Icon" ObjectID="_1836244740" r:id="rId10"/>
         </w:object>
       </w:r>
     </w:p>
@@ -3903,10 +3945,10 @@
     <w:p>
       <w:r>
         <w:object w:dxaOrig="1514" w:dyaOrig="987" w14:anchorId="56E11D1A">
-          <v:shape id="_x0000_i1026" type="#_x0000_t75" style="width:75.4pt;height:49.6pt" o:ole="">
+          <v:shape id="_x0000_i1026" type="#_x0000_t75" style="width:75.65pt;height:49.55pt" o:ole="">
             <v:imagedata r:id="rId11" o:title=""/>
           </v:shape>
-          <o:OLEObject Type="Embed" ProgID="Package" ShapeID="_x0000_i1026" DrawAspect="Icon" ObjectID="_1835811615" r:id="rId12"/>
+          <o:OLEObject Type="Embed" ProgID="Package" ShapeID="_x0000_i1026" DrawAspect="Icon" ObjectID="_1836244741" r:id="rId12"/>
         </w:object>
       </w:r>
     </w:p>
@@ -3979,10 +4021,10 @@
     <w:p>
       <w:r>
         <w:object w:dxaOrig="1514" w:dyaOrig="987" w14:anchorId="0BC1555C">
-          <v:shape id="_x0000_i1027" type="#_x0000_t75" style="width:75.4pt;height:49.6pt" o:ole="">
+          <v:shape id="_x0000_i1027" type="#_x0000_t75" style="width:75.65pt;height:49.55pt" o:ole="">
             <v:imagedata r:id="rId14" o:title=""/>
           </v:shape>
-          <o:OLEObject Type="Embed" ProgID="Package" ShapeID="_x0000_i1027" DrawAspect="Icon" ObjectID="_1835811616" r:id="rId15"/>
+          <o:OLEObject Type="Embed" ProgID="Package" ShapeID="_x0000_i1027" DrawAspect="Icon" ObjectID="_1836244742" r:id="rId15"/>
         </w:object>
       </w:r>
     </w:p>
@@ -4055,10 +4097,10 @@
     <w:p>
       <w:r>
         <w:object w:dxaOrig="1514" w:dyaOrig="987" w14:anchorId="2F1BACAC">
-          <v:shape id="_x0000_i1028" type="#_x0000_t75" style="width:75.4pt;height:49.6pt" o:ole="">
+          <v:shape id="_x0000_i1028" type="#_x0000_t75" style="width:75.65pt;height:49.55pt" o:ole="">
             <v:imagedata r:id="rId17" o:title=""/>
           </v:shape>
-          <o:OLEObject Type="Embed" ProgID="Package" ShapeID="_x0000_i1028" DrawAspect="Icon" ObjectID="_1835811617" r:id="rId18"/>
+          <o:OLEObject Type="Embed" ProgID="Package" ShapeID="_x0000_i1028" DrawAspect="Icon" ObjectID="_1836244743" r:id="rId18"/>
         </w:object>
       </w:r>
     </w:p>
@@ -9734,10 +9776,7 @@
         <w:ind w:left="284"/>
       </w:pPr>
       <w:r>
-        <w:t xml:space="preserve">See </w:t>
-      </w:r>
-      <w:r>
-        <w:t>implementation plan</w:t>
+        <w:t>See implementation plan</w:t>
       </w:r>
     </w:p>
     <w:p>
@@ -9793,9 +9832,6 @@
           <w:numId w:val="27"/>
         </w:numPr>
         <w:ind w:left="709"/>
-        <w:rPr>
-          <w:rFonts w:hint="eastAsia"/>
-        </w:rPr>
       </w:pPr>
       <w:r>
         <w:rPr>
@@ -9916,13 +9952,7 @@
         <w:ind w:left="1560"/>
       </w:pPr>
       <w:r>
-        <w:t xml:space="preserve">Add </w:t>
-      </w:r>
-      <w:r>
-        <w:t>XSRF-TOKEN</w:t>
-      </w:r>
-      <w:r>
-        <w:t>=&lt;value&gt; for domain localhost</w:t>
+        <w:t>Add XSRF-TOKEN=&lt;value&gt; for domain localhost</w:t>
       </w:r>
     </w:p>
     <w:p>
@@ -10393,8 +10423,2362 @@
     </w:p>
     <w:p>
       <w:pPr>
-        <w:ind w:left="284"/>
-      </w:pPr>
+        <w:pStyle w:val="Heading1"/>
+      </w:pPr>
+      <w:r>
+        <w:t>6. Authorization by Group</w:t>
+      </w:r>
+    </w:p>
+    <w:p>
+      <w:pPr>
+        <w:pStyle w:val="Heading2"/>
+        <w:rPr>
+          <w:b/>
+          <w:bCs/>
+        </w:rPr>
+      </w:pPr>
+      <w:proofErr w:type="gramStart"/>
+      <w:r>
+        <w:t xml:space="preserve">6.1  </w:t>
+      </w:r>
+      <w:r>
+        <w:t>Setting</w:t>
+      </w:r>
+      <w:proofErr w:type="gramEnd"/>
+      <w:r>
+        <w:t xml:space="preserve"> Up Groups in Microsoft Entra ID</w:t>
+      </w:r>
+    </w:p>
+    <w:p>
+      <w:pPr>
+        <w:rPr>
+          <w:b/>
+          <w:bCs/>
+        </w:rPr>
+      </w:pPr>
+      <w:r>
+        <w:rPr>
+          <w:b/>
+          <w:bCs/>
+        </w:rPr>
+        <w:t>Step 1 — Create the 3 Groups</w:t>
+      </w:r>
+    </w:p>
+    <w:p>
+      <w:pPr>
+        <w:numPr>
+          <w:ilvl w:val="0"/>
+          <w:numId w:val="33"/>
+        </w:numPr>
+      </w:pPr>
+      <w:r>
+        <w:t>Go to</w:t>
+      </w:r>
+      <w:r>
+        <w:t xml:space="preserve"> </w:t>
+      </w:r>
+      <w:hyperlink r:id="rId37" w:anchor="view/Microsoft_AAD_IAM/TenantOverview.ReactView" w:history="1">
+        <w:r>
+          <w:rPr>
+            <w:rStyle w:val="Hyperlink"/>
+          </w:rPr>
+          <w:t>Entra ID</w:t>
+        </w:r>
+      </w:hyperlink>
+      <w:r>
+        <w:t xml:space="preserve"> </w:t>
+      </w:r>
+      <w:r>
+        <w:t>→ </w:t>
+      </w:r>
+      <w:r>
+        <w:rPr>
+          <w:b/>
+          <w:bCs/>
+        </w:rPr>
+        <w:t>Groups</w:t>
+      </w:r>
+      <w:r>
+        <w:t> → </w:t>
+      </w:r>
+      <w:r>
+        <w:rPr>
+          <w:b/>
+          <w:bCs/>
+        </w:rPr>
+        <w:t>All groups</w:t>
+      </w:r>
+    </w:p>
+    <w:p>
+      <w:pPr>
+        <w:numPr>
+          <w:ilvl w:val="0"/>
+          <w:numId w:val="33"/>
+        </w:numPr>
+      </w:pPr>
+      <w:r>
+        <w:t>Click </w:t>
+      </w:r>
+      <w:r>
+        <w:rPr>
+          <w:b/>
+          <w:bCs/>
+        </w:rPr>
+        <w:t>+ New group</w:t>
+      </w:r>
+    </w:p>
+    <w:p>
+      <w:pPr>
+        <w:numPr>
+          <w:ilvl w:val="0"/>
+          <w:numId w:val="33"/>
+        </w:numPr>
+      </w:pPr>
+      <w:r>
+        <w:t>For each group:</w:t>
+      </w:r>
+    </w:p>
+    <w:tbl>
+      <w:tblPr>
+        <w:tblW w:w="0" w:type="auto"/>
+        <w:tblCellSpacing w:w="15" w:type="dxa"/>
+        <w:tblInd w:w="600" w:type="dxa"/>
+        <w:tblBorders>
+          <w:top w:val="single" w:sz="4" w:space="0" w:color="auto"/>
+          <w:left w:val="single" w:sz="4" w:space="0" w:color="auto"/>
+          <w:bottom w:val="single" w:sz="4" w:space="0" w:color="auto"/>
+          <w:right w:val="single" w:sz="4" w:space="0" w:color="auto"/>
+        </w:tblBorders>
+        <w:shd w:val="clear" w:color="auto" w:fill="181818"/>
+        <w:tblCellMar>
+          <w:top w:w="15" w:type="dxa"/>
+          <w:left w:w="15" w:type="dxa"/>
+          <w:bottom w:w="15" w:type="dxa"/>
+          <w:right w:w="15" w:type="dxa"/>
+        </w:tblCellMar>
+        <w:tblLook w:val="04A0" w:firstRow="1" w:lastRow="0" w:firstColumn="1" w:lastColumn="0" w:noHBand="0" w:noVBand="1"/>
+      </w:tblPr>
+      <w:tblGrid>
+        <w:gridCol w:w="1981"/>
+        <w:gridCol w:w="1474"/>
+        <w:gridCol w:w="1398"/>
+        <w:gridCol w:w="1338"/>
+      </w:tblGrid>
+      <w:tr>
+        <w:trPr>
+          <w:tblHeader/>
+          <w:tblCellSpacing w:w="15" w:type="dxa"/>
+        </w:trPr>
+        <w:tc>
+          <w:tcPr>
+            <w:tcW w:w="0" w:type="auto"/>
+            <w:tcBorders>
+              <w:top w:val="nil"/>
+              <w:left w:val="nil"/>
+            </w:tcBorders>
+            <w:tcMar>
+              <w:top w:w="60" w:type="dxa"/>
+              <w:left w:w="90" w:type="dxa"/>
+              <w:bottom w:w="60" w:type="dxa"/>
+              <w:right w:w="90" w:type="dxa"/>
+            </w:tcMar>
+            <w:vAlign w:val="center"/>
+            <w:hideMark/>
+          </w:tcPr>
+          <w:p>
+            <w:pPr>
+              <w:rPr>
+                <w:b/>
+                <w:bCs/>
+              </w:rPr>
+            </w:pPr>
+            <w:r>
+              <w:rPr>
+                <w:b/>
+                <w:bCs/>
+              </w:rPr>
+              <w:lastRenderedPageBreak/>
+              <w:t>Setting</w:t>
+            </w:r>
+          </w:p>
+        </w:tc>
+        <w:tc>
+          <w:tcPr>
+            <w:tcW w:w="0" w:type="auto"/>
+            <w:tcBorders>
+              <w:top w:val="nil"/>
+              <w:left w:val="nil"/>
+            </w:tcBorders>
+            <w:tcMar>
+              <w:top w:w="60" w:type="dxa"/>
+              <w:left w:w="90" w:type="dxa"/>
+              <w:bottom w:w="60" w:type="dxa"/>
+              <w:right w:w="90" w:type="dxa"/>
+            </w:tcMar>
+            <w:vAlign w:val="center"/>
+            <w:hideMark/>
+          </w:tcPr>
+          <w:p>
+            <w:pPr>
+              <w:rPr>
+                <w:b/>
+                <w:bCs/>
+              </w:rPr>
+            </w:pPr>
+            <w:r>
+              <w:rPr>
+                <w:b/>
+                <w:bCs/>
+              </w:rPr>
+              <w:t>GRP_ADMIN</w:t>
+            </w:r>
+          </w:p>
+        </w:tc>
+        <w:tc>
+          <w:tcPr>
+            <w:tcW w:w="0" w:type="auto"/>
+            <w:tcBorders>
+              <w:top w:val="nil"/>
+              <w:left w:val="nil"/>
+            </w:tcBorders>
+            <w:tcMar>
+              <w:top w:w="60" w:type="dxa"/>
+              <w:left w:w="90" w:type="dxa"/>
+              <w:bottom w:w="60" w:type="dxa"/>
+              <w:right w:w="90" w:type="dxa"/>
+            </w:tcMar>
+            <w:vAlign w:val="center"/>
+            <w:hideMark/>
+          </w:tcPr>
+          <w:p>
+            <w:pPr>
+              <w:rPr>
+                <w:b/>
+                <w:bCs/>
+              </w:rPr>
+            </w:pPr>
+            <w:r>
+              <w:rPr>
+                <w:b/>
+                <w:bCs/>
+              </w:rPr>
+              <w:t>GRP_WRITE</w:t>
+            </w:r>
+          </w:p>
+        </w:tc>
+        <w:tc>
+          <w:tcPr>
+            <w:tcW w:w="0" w:type="auto"/>
+            <w:tcBorders>
+              <w:top w:val="nil"/>
+              <w:left w:val="nil"/>
+              <w:right w:val="nil"/>
+            </w:tcBorders>
+            <w:tcMar>
+              <w:top w:w="60" w:type="dxa"/>
+              <w:left w:w="90" w:type="dxa"/>
+              <w:bottom w:w="60" w:type="dxa"/>
+              <w:right w:w="90" w:type="dxa"/>
+            </w:tcMar>
+            <w:vAlign w:val="center"/>
+            <w:hideMark/>
+          </w:tcPr>
+          <w:p>
+            <w:pPr>
+              <w:rPr>
+                <w:b/>
+                <w:bCs/>
+              </w:rPr>
+            </w:pPr>
+            <w:r>
+              <w:rPr>
+                <w:b/>
+                <w:bCs/>
+              </w:rPr>
+              <w:t>GRP_READ</w:t>
+            </w:r>
+          </w:p>
+        </w:tc>
+      </w:tr>
+      <w:tr>
+        <w:trPr>
+          <w:tblCellSpacing w:w="15" w:type="dxa"/>
+        </w:trPr>
+        <w:tc>
+          <w:tcPr>
+            <w:tcW w:w="0" w:type="auto"/>
+            <w:tcBorders>
+              <w:top w:val="nil"/>
+              <w:left w:val="nil"/>
+            </w:tcBorders>
+            <w:tcMar>
+              <w:top w:w="60" w:type="dxa"/>
+              <w:left w:w="90" w:type="dxa"/>
+              <w:bottom w:w="60" w:type="dxa"/>
+              <w:right w:w="90" w:type="dxa"/>
+            </w:tcMar>
+            <w:vAlign w:val="center"/>
+            <w:hideMark/>
+          </w:tcPr>
+          <w:p>
+            <w:r>
+              <w:t>Group type</w:t>
+            </w:r>
+          </w:p>
+        </w:tc>
+        <w:tc>
+          <w:tcPr>
+            <w:tcW w:w="0" w:type="auto"/>
+            <w:tcBorders>
+              <w:top w:val="nil"/>
+              <w:left w:val="nil"/>
+            </w:tcBorders>
+            <w:tcMar>
+              <w:top w:w="60" w:type="dxa"/>
+              <w:left w:w="90" w:type="dxa"/>
+              <w:bottom w:w="60" w:type="dxa"/>
+              <w:right w:w="90" w:type="dxa"/>
+            </w:tcMar>
+            <w:vAlign w:val="center"/>
+            <w:hideMark/>
+          </w:tcPr>
+          <w:p>
+            <w:r>
+              <w:rPr>
+                <w:b/>
+                <w:bCs/>
+              </w:rPr>
+              <w:t>Security</w:t>
+            </w:r>
+          </w:p>
+        </w:tc>
+        <w:tc>
+          <w:tcPr>
+            <w:tcW w:w="0" w:type="auto"/>
+            <w:tcBorders>
+              <w:top w:val="nil"/>
+              <w:left w:val="nil"/>
+            </w:tcBorders>
+            <w:tcMar>
+              <w:top w:w="60" w:type="dxa"/>
+              <w:left w:w="90" w:type="dxa"/>
+              <w:bottom w:w="60" w:type="dxa"/>
+              <w:right w:w="90" w:type="dxa"/>
+            </w:tcMar>
+            <w:vAlign w:val="center"/>
+            <w:hideMark/>
+          </w:tcPr>
+          <w:p>
+            <w:r>
+              <w:rPr>
+                <w:b/>
+                <w:bCs/>
+              </w:rPr>
+              <w:t>Security</w:t>
+            </w:r>
+          </w:p>
+        </w:tc>
+        <w:tc>
+          <w:tcPr>
+            <w:tcW w:w="0" w:type="auto"/>
+            <w:tcBorders>
+              <w:top w:val="nil"/>
+              <w:left w:val="nil"/>
+              <w:right w:val="nil"/>
+            </w:tcBorders>
+            <w:tcMar>
+              <w:top w:w="60" w:type="dxa"/>
+              <w:left w:w="90" w:type="dxa"/>
+              <w:bottom w:w="60" w:type="dxa"/>
+              <w:right w:w="90" w:type="dxa"/>
+            </w:tcMar>
+            <w:vAlign w:val="center"/>
+            <w:hideMark/>
+          </w:tcPr>
+          <w:p>
+            <w:r>
+              <w:rPr>
+                <w:b/>
+                <w:bCs/>
+              </w:rPr>
+              <w:t>Security</w:t>
+            </w:r>
+          </w:p>
+        </w:tc>
+      </w:tr>
+      <w:tr>
+        <w:trPr>
+          <w:tblCellSpacing w:w="15" w:type="dxa"/>
+        </w:trPr>
+        <w:tc>
+          <w:tcPr>
+            <w:tcW w:w="0" w:type="auto"/>
+            <w:tcBorders>
+              <w:top w:val="nil"/>
+              <w:left w:val="nil"/>
+            </w:tcBorders>
+            <w:tcMar>
+              <w:top w:w="60" w:type="dxa"/>
+              <w:left w:w="90" w:type="dxa"/>
+              <w:bottom w:w="60" w:type="dxa"/>
+              <w:right w:w="90" w:type="dxa"/>
+            </w:tcMar>
+            <w:vAlign w:val="center"/>
+            <w:hideMark/>
+          </w:tcPr>
+          <w:p>
+            <w:r>
+              <w:t>Group name</w:t>
+            </w:r>
+          </w:p>
+        </w:tc>
+        <w:tc>
+          <w:tcPr>
+            <w:tcW w:w="0" w:type="auto"/>
+            <w:tcBorders>
+              <w:top w:val="nil"/>
+              <w:left w:val="nil"/>
+            </w:tcBorders>
+            <w:tcMar>
+              <w:top w:w="60" w:type="dxa"/>
+              <w:left w:w="90" w:type="dxa"/>
+              <w:bottom w:w="60" w:type="dxa"/>
+              <w:right w:w="90" w:type="dxa"/>
+            </w:tcMar>
+            <w:vAlign w:val="center"/>
+            <w:hideMark/>
+          </w:tcPr>
+          <w:p>
+            <w:r>
+              <w:t>GRP_ADMIN</w:t>
+            </w:r>
+          </w:p>
+        </w:tc>
+        <w:tc>
+          <w:tcPr>
+            <w:tcW w:w="0" w:type="auto"/>
+            <w:tcBorders>
+              <w:top w:val="nil"/>
+              <w:left w:val="nil"/>
+            </w:tcBorders>
+            <w:tcMar>
+              <w:top w:w="60" w:type="dxa"/>
+              <w:left w:w="90" w:type="dxa"/>
+              <w:bottom w:w="60" w:type="dxa"/>
+              <w:right w:w="90" w:type="dxa"/>
+            </w:tcMar>
+            <w:vAlign w:val="center"/>
+            <w:hideMark/>
+          </w:tcPr>
+          <w:p>
+            <w:r>
+              <w:t>GRP_WRITE</w:t>
+            </w:r>
+          </w:p>
+        </w:tc>
+        <w:tc>
+          <w:tcPr>
+            <w:tcW w:w="0" w:type="auto"/>
+            <w:tcBorders>
+              <w:top w:val="nil"/>
+              <w:left w:val="nil"/>
+              <w:right w:val="nil"/>
+            </w:tcBorders>
+            <w:tcMar>
+              <w:top w:w="60" w:type="dxa"/>
+              <w:left w:w="90" w:type="dxa"/>
+              <w:bottom w:w="60" w:type="dxa"/>
+              <w:right w:w="90" w:type="dxa"/>
+            </w:tcMar>
+            <w:vAlign w:val="center"/>
+            <w:hideMark/>
+          </w:tcPr>
+          <w:p>
+            <w:r>
+              <w:t>GRP_READ</w:t>
+            </w:r>
+          </w:p>
+        </w:tc>
+      </w:tr>
+      <w:tr>
+        <w:trPr>
+          <w:tblCellSpacing w:w="15" w:type="dxa"/>
+        </w:trPr>
+        <w:tc>
+          <w:tcPr>
+            <w:tcW w:w="0" w:type="auto"/>
+            <w:tcBorders>
+              <w:top w:val="nil"/>
+              <w:left w:val="nil"/>
+            </w:tcBorders>
+            <w:tcMar>
+              <w:top w:w="60" w:type="dxa"/>
+              <w:left w:w="90" w:type="dxa"/>
+              <w:bottom w:w="60" w:type="dxa"/>
+              <w:right w:w="90" w:type="dxa"/>
+            </w:tcMar>
+            <w:vAlign w:val="center"/>
+            <w:hideMark/>
+          </w:tcPr>
+          <w:p>
+            <w:r>
+              <w:t>Group description</w:t>
+            </w:r>
+          </w:p>
+        </w:tc>
+        <w:tc>
+          <w:tcPr>
+            <w:tcW w:w="0" w:type="auto"/>
+            <w:tcBorders>
+              <w:top w:val="nil"/>
+              <w:left w:val="nil"/>
+            </w:tcBorders>
+            <w:tcMar>
+              <w:top w:w="60" w:type="dxa"/>
+              <w:left w:w="90" w:type="dxa"/>
+              <w:bottom w:w="60" w:type="dxa"/>
+              <w:right w:w="90" w:type="dxa"/>
+            </w:tcMar>
+            <w:vAlign w:val="center"/>
+            <w:hideMark/>
+          </w:tcPr>
+          <w:p>
+            <w:r>
+              <w:t>Admin group</w:t>
+            </w:r>
+          </w:p>
+        </w:tc>
+        <w:tc>
+          <w:tcPr>
+            <w:tcW w:w="0" w:type="auto"/>
+            <w:tcBorders>
+              <w:top w:val="nil"/>
+              <w:left w:val="nil"/>
+            </w:tcBorders>
+            <w:tcMar>
+              <w:top w:w="60" w:type="dxa"/>
+              <w:left w:w="90" w:type="dxa"/>
+              <w:bottom w:w="60" w:type="dxa"/>
+              <w:right w:w="90" w:type="dxa"/>
+            </w:tcMar>
+            <w:vAlign w:val="center"/>
+            <w:hideMark/>
+          </w:tcPr>
+          <w:p>
+            <w:r>
+              <w:t>Write group</w:t>
+            </w:r>
+          </w:p>
+        </w:tc>
+        <w:tc>
+          <w:tcPr>
+            <w:tcW w:w="0" w:type="auto"/>
+            <w:tcBorders>
+              <w:top w:val="nil"/>
+              <w:left w:val="nil"/>
+              <w:right w:val="nil"/>
+            </w:tcBorders>
+            <w:tcMar>
+              <w:top w:w="60" w:type="dxa"/>
+              <w:left w:w="90" w:type="dxa"/>
+              <w:bottom w:w="60" w:type="dxa"/>
+              <w:right w:w="90" w:type="dxa"/>
+            </w:tcMar>
+            <w:vAlign w:val="center"/>
+            <w:hideMark/>
+          </w:tcPr>
+          <w:p>
+            <w:r>
+              <w:t>Read group</w:t>
+            </w:r>
+          </w:p>
+        </w:tc>
+      </w:tr>
+      <w:tr>
+        <w:trPr>
+          <w:tblCellSpacing w:w="15" w:type="dxa"/>
+        </w:trPr>
+        <w:tc>
+          <w:tcPr>
+            <w:tcW w:w="0" w:type="auto"/>
+            <w:tcBorders>
+              <w:top w:val="nil"/>
+              <w:left w:val="nil"/>
+              <w:bottom w:val="nil"/>
+            </w:tcBorders>
+            <w:tcMar>
+              <w:top w:w="60" w:type="dxa"/>
+              <w:left w:w="90" w:type="dxa"/>
+              <w:bottom w:w="60" w:type="dxa"/>
+              <w:right w:w="90" w:type="dxa"/>
+            </w:tcMar>
+            <w:vAlign w:val="center"/>
+            <w:hideMark/>
+          </w:tcPr>
+          <w:p>
+            <w:r>
+              <w:t>Membership type</w:t>
+            </w:r>
+          </w:p>
+        </w:tc>
+        <w:tc>
+          <w:tcPr>
+            <w:tcW w:w="0" w:type="auto"/>
+            <w:tcBorders>
+              <w:top w:val="nil"/>
+              <w:left w:val="nil"/>
+              <w:bottom w:val="nil"/>
+            </w:tcBorders>
+            <w:tcMar>
+              <w:top w:w="60" w:type="dxa"/>
+              <w:left w:w="90" w:type="dxa"/>
+              <w:bottom w:w="60" w:type="dxa"/>
+              <w:right w:w="90" w:type="dxa"/>
+            </w:tcMar>
+            <w:vAlign w:val="center"/>
+            <w:hideMark/>
+          </w:tcPr>
+          <w:p>
+            <w:r>
+              <w:rPr>
+                <w:b/>
+                <w:bCs/>
+              </w:rPr>
+              <w:t>Assigned</w:t>
+            </w:r>
+          </w:p>
+        </w:tc>
+        <w:tc>
+          <w:tcPr>
+            <w:tcW w:w="0" w:type="auto"/>
+            <w:tcBorders>
+              <w:top w:val="nil"/>
+              <w:left w:val="nil"/>
+              <w:bottom w:val="nil"/>
+            </w:tcBorders>
+            <w:tcMar>
+              <w:top w:w="60" w:type="dxa"/>
+              <w:left w:w="90" w:type="dxa"/>
+              <w:bottom w:w="60" w:type="dxa"/>
+              <w:right w:w="90" w:type="dxa"/>
+            </w:tcMar>
+            <w:vAlign w:val="center"/>
+            <w:hideMark/>
+          </w:tcPr>
+          <w:p>
+            <w:r>
+              <w:rPr>
+                <w:b/>
+                <w:bCs/>
+              </w:rPr>
+              <w:t>Assigned</w:t>
+            </w:r>
+          </w:p>
+        </w:tc>
+        <w:tc>
+          <w:tcPr>
+            <w:tcW w:w="0" w:type="auto"/>
+            <w:tcBorders>
+              <w:top w:val="nil"/>
+              <w:left w:val="nil"/>
+              <w:bottom w:val="nil"/>
+              <w:right w:val="nil"/>
+            </w:tcBorders>
+            <w:tcMar>
+              <w:top w:w="60" w:type="dxa"/>
+              <w:left w:w="90" w:type="dxa"/>
+              <w:bottom w:w="60" w:type="dxa"/>
+              <w:right w:w="90" w:type="dxa"/>
+            </w:tcMar>
+            <w:vAlign w:val="center"/>
+            <w:hideMark/>
+          </w:tcPr>
+          <w:p>
+            <w:r>
+              <w:rPr>
+                <w:b/>
+                <w:bCs/>
+              </w:rPr>
+              <w:t>Assigned</w:t>
+            </w:r>
+          </w:p>
+        </w:tc>
+      </w:tr>
+      <w:tr>
+        <w:trPr>
+          <w:tblCellSpacing w:w="15" w:type="dxa"/>
+        </w:trPr>
+        <w:tc>
+          <w:tcPr>
+            <w:tcW w:w="0" w:type="auto"/>
+            <w:tcBorders>
+              <w:top w:val="nil"/>
+              <w:left w:val="nil"/>
+              <w:bottom w:val="nil"/>
+            </w:tcBorders>
+            <w:tcMar>
+              <w:top w:w="60" w:type="dxa"/>
+              <w:left w:w="90" w:type="dxa"/>
+              <w:bottom w:w="60" w:type="dxa"/>
+              <w:right w:w="90" w:type="dxa"/>
+            </w:tcMar>
+            <w:vAlign w:val="center"/>
+          </w:tcPr>
+          <w:p/>
+        </w:tc>
+        <w:tc>
+          <w:tcPr>
+            <w:tcW w:w="0" w:type="auto"/>
+            <w:tcBorders>
+              <w:top w:val="nil"/>
+              <w:left w:val="nil"/>
+              <w:bottom w:val="nil"/>
+            </w:tcBorders>
+            <w:tcMar>
+              <w:top w:w="60" w:type="dxa"/>
+              <w:left w:w="90" w:type="dxa"/>
+              <w:bottom w:w="60" w:type="dxa"/>
+              <w:right w:w="90" w:type="dxa"/>
+            </w:tcMar>
+            <w:vAlign w:val="center"/>
+          </w:tcPr>
+          <w:p>
+            <w:pPr>
+              <w:rPr>
+                <w:b/>
+                <w:bCs/>
+              </w:rPr>
+            </w:pPr>
+          </w:p>
+        </w:tc>
+        <w:tc>
+          <w:tcPr>
+            <w:tcW w:w="0" w:type="auto"/>
+            <w:tcBorders>
+              <w:top w:val="nil"/>
+              <w:left w:val="nil"/>
+              <w:bottom w:val="nil"/>
+            </w:tcBorders>
+            <w:tcMar>
+              <w:top w:w="60" w:type="dxa"/>
+              <w:left w:w="90" w:type="dxa"/>
+              <w:bottom w:w="60" w:type="dxa"/>
+              <w:right w:w="90" w:type="dxa"/>
+            </w:tcMar>
+            <w:vAlign w:val="center"/>
+          </w:tcPr>
+          <w:p>
+            <w:pPr>
+              <w:rPr>
+                <w:b/>
+                <w:bCs/>
+              </w:rPr>
+            </w:pPr>
+          </w:p>
+        </w:tc>
+        <w:tc>
+          <w:tcPr>
+            <w:tcW w:w="0" w:type="auto"/>
+            <w:tcBorders>
+              <w:top w:val="nil"/>
+              <w:left w:val="nil"/>
+              <w:bottom w:val="nil"/>
+              <w:right w:val="nil"/>
+            </w:tcBorders>
+            <w:tcMar>
+              <w:top w:w="60" w:type="dxa"/>
+              <w:left w:w="90" w:type="dxa"/>
+              <w:bottom w:w="60" w:type="dxa"/>
+              <w:right w:w="90" w:type="dxa"/>
+            </w:tcMar>
+            <w:vAlign w:val="center"/>
+          </w:tcPr>
+          <w:p>
+            <w:pPr>
+              <w:rPr>
+                <w:b/>
+                <w:bCs/>
+              </w:rPr>
+            </w:pPr>
+          </w:p>
+        </w:tc>
+      </w:tr>
+    </w:tbl>
+    <w:p>
+      <w:pPr>
+        <w:numPr>
+          <w:ilvl w:val="0"/>
+          <w:numId w:val="34"/>
+        </w:numPr>
+      </w:pPr>
+      <w:r>
+        <w:t>Click </w:t>
+      </w:r>
+      <w:r>
+        <w:rPr>
+          <w:b/>
+          <w:bCs/>
+        </w:rPr>
+        <w:t>Create</w:t>
+      </w:r>
+      <w:r>
+        <w:t> for each.</w:t>
+      </w:r>
+    </w:p>
+    <w:p>
+      <w:pPr>
+        <w:rPr>
+          <w:b/>
+          <w:bCs/>
+        </w:rPr>
+      </w:pPr>
+      <w:r>
+        <w:rPr>
+          <w:b/>
+          <w:bCs/>
+        </w:rPr>
+        <w:t>Step 2 — Add Users to Groups</w:t>
+      </w:r>
+    </w:p>
+    <w:p>
+      <w:pPr>
+        <w:numPr>
+          <w:ilvl w:val="0"/>
+          <w:numId w:val="35"/>
+        </w:numPr>
+      </w:pPr>
+      <w:r>
+        <w:t>Open each group → </w:t>
+      </w:r>
+      <w:r>
+        <w:rPr>
+          <w:b/>
+          <w:bCs/>
+        </w:rPr>
+        <w:t>Members</w:t>
+      </w:r>
+      <w:r>
+        <w:t> → </w:t>
+      </w:r>
+      <w:r>
+        <w:rPr>
+          <w:b/>
+          <w:bCs/>
+        </w:rPr>
+        <w:t>+ Add members</w:t>
+      </w:r>
+    </w:p>
+    <w:p>
+      <w:pPr>
+        <w:numPr>
+          <w:ilvl w:val="0"/>
+          <w:numId w:val="35"/>
+        </w:numPr>
+      </w:pPr>
+      <w:r>
+        <w:t>Search for and select the users, then click </w:t>
+      </w:r>
+      <w:r>
+        <w:rPr>
+          <w:b/>
+          <w:bCs/>
+        </w:rPr>
+        <w:t>Select</w:t>
+      </w:r>
+    </w:p>
+    <w:p>
+      <w:pPr>
+        <w:rPr>
+          <w:b/>
+          <w:bCs/>
+        </w:rPr>
+      </w:pPr>
+      <w:r>
+        <w:rPr>
+          <w:b/>
+          <w:bCs/>
+        </w:rPr>
+        <w:t>Step 3 — Configure the App Registration to Emit Group Claims</w:t>
+      </w:r>
+    </w:p>
+    <w:p>
+      <w:pPr>
+        <w:numPr>
+          <w:ilvl w:val="0"/>
+          <w:numId w:val="36"/>
+        </w:numPr>
+      </w:pPr>
+      <w:r>
+        <w:t>Go to </w:t>
+      </w:r>
+      <w:r>
+        <w:rPr>
+          <w:b/>
+          <w:bCs/>
+        </w:rPr>
+        <w:t xml:space="preserve">Entra </w:t>
+      </w:r>
+      <w:r>
+        <w:rPr>
+          <w:b/>
+          <w:bCs/>
+        </w:rPr>
+        <w:t>ID</w:t>
+      </w:r>
+      <w:r>
+        <w:t> → </w:t>
+      </w:r>
+      <w:r>
+        <w:rPr>
+          <w:b/>
+          <w:bCs/>
+        </w:rPr>
+        <w:t>App registrations</w:t>
+      </w:r>
+      <w:r>
+        <w:t> → Select your app</w:t>
+      </w:r>
+      <w:r>
+        <w:t xml:space="preserve"> </w:t>
+      </w:r>
+      <w:proofErr w:type="spellStart"/>
+      <w:r>
+        <w:rPr>
+          <w:b/>
+          <w:bCs/>
+        </w:rPr>
+        <w:t>poc-bff</w:t>
+      </w:r>
+      <w:proofErr w:type="spellEnd"/>
+    </w:p>
+    <w:p>
+      <w:pPr>
+        <w:numPr>
+          <w:ilvl w:val="0"/>
+          <w:numId w:val="36"/>
+        </w:numPr>
+      </w:pPr>
+      <w:r>
+        <w:t>Go to </w:t>
+      </w:r>
+      <w:r>
+        <w:rPr>
+          <w:b/>
+          <w:bCs/>
+        </w:rPr>
+        <w:t>Token configuration</w:t>
+      </w:r>
+      <w:r>
+        <w:t> → </w:t>
+      </w:r>
+      <w:r>
+        <w:rPr>
+          <w:b/>
+          <w:bCs/>
+        </w:rPr>
+        <w:t>+ Add groups claim</w:t>
+      </w:r>
+    </w:p>
+    <w:p>
+      <w:pPr>
+        <w:numPr>
+          <w:ilvl w:val="0"/>
+          <w:numId w:val="36"/>
+        </w:numPr>
+      </w:pPr>
+      <w:r>
+        <w:t>Select </w:t>
+      </w:r>
+      <w:r>
+        <w:rPr>
+          <w:b/>
+          <w:bCs/>
+        </w:rPr>
+        <w:t>Security groups</w:t>
+      </w:r>
+    </w:p>
+    <w:p>
+      <w:pPr>
+        <w:numPr>
+          <w:ilvl w:val="0"/>
+          <w:numId w:val="36"/>
+        </w:numPr>
+      </w:pPr>
+      <w:r>
+        <w:t>Under </w:t>
+      </w:r>
+      <w:r>
+        <w:rPr>
+          <w:b/>
+          <w:bCs/>
+        </w:rPr>
+        <w:t>Customize token properties by type</w:t>
+      </w:r>
+      <w:r>
+        <w:t> → for </w:t>
+      </w:r>
+      <w:r>
+        <w:rPr>
+          <w:b/>
+          <w:bCs/>
+        </w:rPr>
+        <w:t>ID</w:t>
+      </w:r>
+      <w:r>
+        <w:t> token, choose </w:t>
+      </w:r>
+      <w:r>
+        <w:rPr>
+          <w:b/>
+          <w:bCs/>
+        </w:rPr>
+        <w:t>Group ID</w:t>
+      </w:r>
+      <w:r>
+        <w:t> (this will emit group Object IDs in the groups claim)</w:t>
+      </w:r>
+    </w:p>
+    <w:p>
+      <w:pPr>
+        <w:numPr>
+          <w:ilvl w:val="0"/>
+          <w:numId w:val="36"/>
+        </w:numPr>
+      </w:pPr>
+      <w:r>
+        <w:t>Click </w:t>
+      </w:r>
+      <w:r>
+        <w:rPr>
+          <w:b/>
+          <w:bCs/>
+        </w:rPr>
+        <w:t>Add</w:t>
+      </w:r>
+    </w:p>
+    <w:p>
+      <w:pPr>
+        <w:rPr>
+          <w:b/>
+          <w:bCs/>
+        </w:rPr>
+      </w:pPr>
+      <w:r>
+        <w:rPr>
+          <w:b/>
+          <w:bCs/>
+        </w:rPr>
+        <w:t>Step 4 — Note the Group Object IDs</w:t>
+      </w:r>
+    </w:p>
+    <w:p>
+      <w:pPr>
+        <w:numPr>
+          <w:ilvl w:val="0"/>
+          <w:numId w:val="38"/>
+        </w:numPr>
+      </w:pPr>
+      <w:r>
+        <w:t>Go back to </w:t>
+      </w:r>
+      <w:r>
+        <w:rPr>
+          <w:b/>
+          <w:bCs/>
+        </w:rPr>
+        <w:t>Groups</w:t>
+      </w:r>
+      <w:r>
+        <w:t> → Open each group → Copy the </w:t>
+      </w:r>
+      <w:r>
+        <w:rPr>
+          <w:b/>
+          <w:bCs/>
+        </w:rPr>
+        <w:t>Object ID</w:t>
+      </w:r>
+      <w:r>
+        <w:t> from the </w:t>
+      </w:r>
+      <w:r>
+        <w:rPr>
+          <w:b/>
+          <w:bCs/>
+        </w:rPr>
+        <w:t>Overview</w:t>
+      </w:r>
+      <w:r>
+        <w:t> tab</w:t>
+      </w:r>
+    </w:p>
+    <w:p>
+      <w:pPr>
+        <w:numPr>
+          <w:ilvl w:val="0"/>
+          <w:numId w:val="38"/>
+        </w:numPr>
+      </w:pPr>
+      <w:r>
+        <w:t>You'll need these IDs in </w:t>
+      </w:r>
+      <w:proofErr w:type="spellStart"/>
+      <w:r>
+        <w:rPr>
+          <w:b/>
+          <w:bCs/>
+        </w:rPr>
+        <w:t>application.yml</w:t>
+      </w:r>
+      <w:proofErr w:type="spellEnd"/>
+      <w:r>
+        <w:t>:</w:t>
+      </w:r>
+    </w:p>
+    <w:p>
+      <w:pPr>
+        <w:numPr>
+          <w:ilvl w:val="1"/>
+          <w:numId w:val="38"/>
+        </w:numPr>
+      </w:pPr>
+      <w:r>
+        <w:lastRenderedPageBreak/>
+        <w:t>GRP_ADMIN Object ID → 3538de91-a17e-4c8b-bfce-9e36058c7764</w:t>
+      </w:r>
+    </w:p>
+    <w:p>
+      <w:pPr>
+        <w:numPr>
+          <w:ilvl w:val="1"/>
+          <w:numId w:val="38"/>
+        </w:numPr>
+      </w:pPr>
+      <w:r>
+        <w:t>GRP_WRITE Object ID → 0503c540-06d3-4424-bef0-56e1d6d6e68e</w:t>
+      </w:r>
+    </w:p>
+    <w:p>
+      <w:pPr>
+        <w:numPr>
+          <w:ilvl w:val="1"/>
+          <w:numId w:val="38"/>
+        </w:numPr>
+      </w:pPr>
+      <w:r>
+        <w:t>GRP_READ Object ID → 0885c41f-0b47-47cc-a85d-76d6dfa7c9dc</w:t>
+      </w:r>
+    </w:p>
+    <w:p>
+      <w:r>
+        <w:rPr>
+          <w:b/>
+          <w:bCs/>
+        </w:rPr>
+        <w:t>Important:</w:t>
+      </w:r>
+      <w:r>
+        <w:t> Entra ID emits group </w:t>
+      </w:r>
+      <w:r>
+        <w:rPr>
+          <w:b/>
+          <w:bCs/>
+        </w:rPr>
+        <w:t>Object IDs</w:t>
+      </w:r>
+      <w:r>
+        <w:t> (GUIDs) in the groups claim, not display names. The Spring Boot config will map these GUIDs to friendly names.</w:t>
+      </w:r>
+    </w:p>
+    <w:p>
+      <w:pPr>
+        <w:pStyle w:val="Heading2"/>
+      </w:pPr>
+      <w:r>
+        <w:t xml:space="preserve">6.2 </w:t>
+      </w:r>
+      <w:r>
+        <w:t>Spring Boot Application Implementation</w:t>
+      </w:r>
+    </w:p>
+    <w:p>
+      <w:pPr>
+        <w:rPr>
+          <w:b/>
+          <w:bCs/>
+        </w:rPr>
+      </w:pPr>
+      <w:r>
+        <w:rPr>
+          <w:b/>
+          <w:bCs/>
+        </w:rPr>
+        <w:t>Step 1 – Entra ID Group Setup</w:t>
+      </w:r>
+    </w:p>
+    <w:p>
+      <w:pPr>
+        <w:pStyle w:val="ListParagraph"/>
+        <w:numPr>
+          <w:ilvl w:val="0"/>
+          <w:numId w:val="39"/>
+        </w:numPr>
+      </w:pPr>
+      <w:r>
+        <w:t>Copy each group's Object ID and set them as environment variables:</w:t>
+      </w:r>
+    </w:p>
+    <w:p>
+      <w:pPr>
+        <w:pStyle w:val="ListParagraph"/>
+        <w:numPr>
+          <w:ilvl w:val="1"/>
+          <w:numId w:val="39"/>
+        </w:numPr>
+      </w:pPr>
+      <w:r>
+        <w:t>ENTRA_GROUP_ADMIN</w:t>
+      </w:r>
+    </w:p>
+    <w:p>
+      <w:pPr>
+        <w:pStyle w:val="ListParagraph"/>
+        <w:numPr>
+          <w:ilvl w:val="1"/>
+          <w:numId w:val="39"/>
+        </w:numPr>
+      </w:pPr>
+      <w:r>
+        <w:t>ENTRA_GROUP_WRITE</w:t>
+      </w:r>
+    </w:p>
+    <w:p>
+      <w:pPr>
+        <w:pStyle w:val="ListParagraph"/>
+        <w:numPr>
+          <w:ilvl w:val="1"/>
+          <w:numId w:val="39"/>
+        </w:numPr>
+      </w:pPr>
+      <w:r>
+        <w:t>ENTRA_GROUP_READ</w:t>
+      </w:r>
+    </w:p>
+    <w:p>
+      <w:pPr>
+        <w:pStyle w:val="ListParagraph"/>
+        <w:numPr>
+          <w:ilvl w:val="0"/>
+          <w:numId w:val="39"/>
+        </w:numPr>
+      </w:pPr>
+      <w:r>
+        <w:t>Added </w:t>
+      </w:r>
+      <w:proofErr w:type="spellStart"/>
+      <w:proofErr w:type="gramStart"/>
+      <w:r>
+        <w:rPr>
+          <w:b/>
+          <w:bCs/>
+        </w:rPr>
+        <w:t>app.groups</w:t>
+      </w:r>
+      <w:proofErr w:type="spellEnd"/>
+      <w:proofErr w:type="gramEnd"/>
+      <w:r>
+        <w:t> config mapping group Object IDs → friendly names</w:t>
+      </w:r>
+    </w:p>
+    <w:p>
+      <w:pPr>
+        <w:ind w:left="720"/>
+      </w:pPr>
+      <w:r>
+        <w:drawing>
+          <wp:inline distT="0" distB="0" distL="0" distR="0" wp14:anchorId="3B99D702" wp14:editId="7075C6FA">
+            <wp:extent cx="2557670" cy="1201047"/>
+            <wp:effectExtent l="0" t="0" r="0" b="0"/>
+            <wp:docPr id="366581152" name="Picture 1"/>
+            <wp:cNvGraphicFramePr>
+              <a:graphicFrameLocks xmlns:a="http://schemas.openxmlformats.org/drawingml/2006/main" noChangeAspect="1"/>
+            </wp:cNvGraphicFramePr>
+            <a:graphic xmlns:a="http://schemas.openxmlformats.org/drawingml/2006/main">
+              <a:graphicData uri="http://schemas.openxmlformats.org/drawingml/2006/picture">
+                <pic:pic xmlns:pic="http://schemas.openxmlformats.org/drawingml/2006/picture">
+                  <pic:nvPicPr>
+                    <pic:cNvPr id="366581152" name=""/>
+                    <pic:cNvPicPr/>
+                  </pic:nvPicPr>
+                  <pic:blipFill>
+                    <a:blip r:embed="rId38"/>
+                    <a:stretch>
+                      <a:fillRect/>
+                    </a:stretch>
+                  </pic:blipFill>
+                  <pic:spPr>
+                    <a:xfrm>
+                      <a:off x="0" y="0"/>
+                      <a:ext cx="2567155" cy="1205501"/>
+                    </a:xfrm>
+                    <a:prstGeom prst="rect">
+                      <a:avLst/>
+                    </a:prstGeom>
+                  </pic:spPr>
+                </pic:pic>
+              </a:graphicData>
+            </a:graphic>
+          </wp:inline>
+        </w:drawing>
+      </w:r>
+    </w:p>
+    <w:p>
+      <w:pPr>
+        <w:pStyle w:val="ListParagraph"/>
+        <w:numPr>
+          <w:ilvl w:val="0"/>
+          <w:numId w:val="39"/>
+        </w:numPr>
+      </w:pPr>
+      <w:r>
+        <w:rPr>
+          <w:b/>
+          <w:bCs/>
+        </w:rPr>
+        <w:t>Java code</w:t>
+      </w:r>
+    </w:p>
+    <w:tbl>
+      <w:tblPr>
+        <w:tblW w:w="0" w:type="auto"/>
+        <w:tblCellSpacing w:w="15" w:type="dxa"/>
+        <w:tblInd w:w="600" w:type="dxa"/>
+        <w:tblBorders>
+          <w:top w:val="single" w:sz="4" w:space="0" w:color="auto"/>
+          <w:left w:val="single" w:sz="4" w:space="0" w:color="auto"/>
+          <w:bottom w:val="single" w:sz="4" w:space="0" w:color="auto"/>
+          <w:right w:val="single" w:sz="4" w:space="0" w:color="auto"/>
+        </w:tblBorders>
+        <w:shd w:val="clear" w:color="auto" w:fill="181818"/>
+        <w:tblCellMar>
+          <w:top w:w="15" w:type="dxa"/>
+          <w:left w:w="15" w:type="dxa"/>
+          <w:bottom w:w="15" w:type="dxa"/>
+          <w:right w:w="15" w:type="dxa"/>
+        </w:tblCellMar>
+        <w:tblLook w:val="04A0" w:firstRow="1" w:lastRow="0" w:firstColumn="1" w:lastColumn="0" w:noHBand="0" w:noVBand="1"/>
+      </w:tblPr>
+      <w:tblGrid>
+        <w:gridCol w:w="2590"/>
+        <w:gridCol w:w="9291"/>
+      </w:tblGrid>
+      <w:tr>
+        <w:trPr>
+          <w:tblCellSpacing w:w="15" w:type="dxa"/>
+        </w:trPr>
+        <w:tc>
+          <w:tcPr>
+            <w:tcW w:w="0" w:type="auto"/>
+            <w:tcBorders>
+              <w:top w:val="nil"/>
+              <w:left w:val="nil"/>
+            </w:tcBorders>
+            <w:tcMar>
+              <w:top w:w="60" w:type="dxa"/>
+              <w:left w:w="90" w:type="dxa"/>
+              <w:bottom w:w="60" w:type="dxa"/>
+              <w:right w:w="90" w:type="dxa"/>
+            </w:tcMar>
+            <w:vAlign w:val="center"/>
+            <w:hideMark/>
+          </w:tcPr>
+          <w:p>
+            <w:hyperlink r:id="rId39" w:history="1">
+              <w:r>
+                <w:rPr>
+                  <w:rStyle w:val="Hyperlink"/>
+                </w:rPr>
+                <w:t>RoleConstants.java</w:t>
+              </w:r>
+            </w:hyperlink>
+          </w:p>
+        </w:tc>
+        <w:tc>
+          <w:tcPr>
+            <w:tcW w:w="0" w:type="auto"/>
+            <w:tcBorders>
+              <w:top w:val="nil"/>
+              <w:left w:val="nil"/>
+              <w:right w:val="nil"/>
+            </w:tcBorders>
+            <w:tcMar>
+              <w:top w:w="60" w:type="dxa"/>
+              <w:left w:w="90" w:type="dxa"/>
+              <w:bottom w:w="60" w:type="dxa"/>
+              <w:right w:w="90" w:type="dxa"/>
+            </w:tcMar>
+            <w:vAlign w:val="center"/>
+            <w:hideMark/>
+          </w:tcPr>
+          <w:p>
+            <w:r>
+              <w:t>Added GRP_ADMIN/WRITE/READ and GROUP_GRP_ADMIN/WRITE/READ constants</w:t>
+            </w:r>
+          </w:p>
+        </w:tc>
+      </w:tr>
+      <w:tr>
+        <w:trPr>
+          <w:tblCellSpacing w:w="15" w:type="dxa"/>
+        </w:trPr>
+        <w:tc>
+          <w:tcPr>
+            <w:tcW w:w="0" w:type="auto"/>
+            <w:tcBorders>
+              <w:top w:val="nil"/>
+              <w:left w:val="nil"/>
+            </w:tcBorders>
+            <w:tcMar>
+              <w:top w:w="60" w:type="dxa"/>
+              <w:left w:w="90" w:type="dxa"/>
+              <w:bottom w:w="60" w:type="dxa"/>
+              <w:right w:w="90" w:type="dxa"/>
+            </w:tcMar>
+            <w:vAlign w:val="center"/>
+            <w:hideMark/>
+          </w:tcPr>
+          <w:p>
+            <w:hyperlink r:id="rId40" w:history="1">
+              <w:r>
+                <w:rPr>
+                  <w:rStyle w:val="Hyperlink"/>
+                </w:rPr>
+                <w:t>SecurityConfig.java</w:t>
+              </w:r>
+            </w:hyperlink>
+          </w:p>
+        </w:tc>
+        <w:tc>
+          <w:tcPr>
+            <w:tcW w:w="0" w:type="auto"/>
+            <w:tcBorders>
+              <w:top w:val="nil"/>
+              <w:left w:val="nil"/>
+              <w:right w:val="nil"/>
+            </w:tcBorders>
+            <w:tcMar>
+              <w:top w:w="60" w:type="dxa"/>
+              <w:left w:w="90" w:type="dxa"/>
+              <w:bottom w:w="60" w:type="dxa"/>
+              <w:right w:w="90" w:type="dxa"/>
+            </w:tcMar>
+            <w:vAlign w:val="center"/>
+            <w:hideMark/>
+          </w:tcPr>
+          <w:p>
+            <w:r>
+              <w:t>Reads group mapping from config; maps Entra groups claim IDs → GROUP_GRP_* authorities</w:t>
+            </w:r>
+          </w:p>
+        </w:tc>
+      </w:tr>
+      <w:tr>
+        <w:trPr>
+          <w:tblCellSpacing w:w="15" w:type="dxa"/>
+        </w:trPr>
+        <w:tc>
+          <w:tcPr>
+            <w:tcW w:w="0" w:type="auto"/>
+            <w:tcBorders>
+              <w:top w:val="nil"/>
+              <w:left w:val="nil"/>
+            </w:tcBorders>
+            <w:tcMar>
+              <w:top w:w="60" w:type="dxa"/>
+              <w:left w:w="90" w:type="dxa"/>
+              <w:bottom w:w="60" w:type="dxa"/>
+              <w:right w:w="90" w:type="dxa"/>
+            </w:tcMar>
+            <w:vAlign w:val="center"/>
+            <w:hideMark/>
+          </w:tcPr>
+          <w:p>
+            <w:hyperlink r:id="rId41" w:history="1">
+              <w:r>
+                <w:rPr>
+                  <w:rStyle w:val="Hyperlink"/>
+                </w:rPr>
+                <w:t>UserInfoDto.java</w:t>
+              </w:r>
+            </w:hyperlink>
+          </w:p>
+        </w:tc>
+        <w:tc>
+          <w:tcPr>
+            <w:tcW w:w="0" w:type="auto"/>
+            <w:tcBorders>
+              <w:top w:val="nil"/>
+              <w:left w:val="nil"/>
+              <w:right w:val="nil"/>
+            </w:tcBorders>
+            <w:tcMar>
+              <w:top w:w="60" w:type="dxa"/>
+              <w:left w:w="90" w:type="dxa"/>
+              <w:bottom w:w="60" w:type="dxa"/>
+              <w:right w:w="90" w:type="dxa"/>
+            </w:tcMar>
+            <w:vAlign w:val="center"/>
+            <w:hideMark/>
+          </w:tcPr>
+          <w:p>
+            <w:r>
+              <w:t>Added groups field</w:t>
+            </w:r>
+          </w:p>
+        </w:tc>
+      </w:tr>
+      <w:tr>
+        <w:trPr>
+          <w:tblCellSpacing w:w="15" w:type="dxa"/>
+        </w:trPr>
+        <w:tc>
+          <w:tcPr>
+            <w:tcW w:w="0" w:type="auto"/>
+            <w:tcBorders>
+              <w:top w:val="nil"/>
+              <w:left w:val="nil"/>
+            </w:tcBorders>
+            <w:tcMar>
+              <w:top w:w="60" w:type="dxa"/>
+              <w:left w:w="90" w:type="dxa"/>
+              <w:bottom w:w="60" w:type="dxa"/>
+              <w:right w:w="90" w:type="dxa"/>
+            </w:tcMar>
+            <w:vAlign w:val="center"/>
+            <w:hideMark/>
+          </w:tcPr>
+          <w:p>
+            <w:hyperlink r:id="rId42" w:history="1">
+              <w:r>
+                <w:rPr>
+                  <w:rStyle w:val="Hyperlink"/>
+                </w:rPr>
+                <w:t>UserService.java</w:t>
+              </w:r>
+            </w:hyperlink>
+          </w:p>
+        </w:tc>
+        <w:tc>
+          <w:tcPr>
+            <w:tcW w:w="0" w:type="auto"/>
+            <w:tcBorders>
+              <w:top w:val="nil"/>
+              <w:left w:val="nil"/>
+              <w:right w:val="nil"/>
+            </w:tcBorders>
+            <w:tcMar>
+              <w:top w:w="60" w:type="dxa"/>
+              <w:left w:w="90" w:type="dxa"/>
+              <w:bottom w:w="60" w:type="dxa"/>
+              <w:right w:w="90" w:type="dxa"/>
+            </w:tcMar>
+            <w:vAlign w:val="center"/>
+            <w:hideMark/>
+          </w:tcPr>
+          <w:p>
+            <w:r>
+              <w:t>Extracts GROUP_* authorities → returns groups list in /</w:t>
+            </w:r>
+            <w:proofErr w:type="spellStart"/>
+            <w:r>
+              <w:t>api</w:t>
+            </w:r>
+            <w:proofErr w:type="spellEnd"/>
+            <w:r>
+              <w:t>/me</w:t>
+            </w:r>
+          </w:p>
+        </w:tc>
+      </w:tr>
+      <w:tr>
+        <w:trPr>
+          <w:tblCellSpacing w:w="15" w:type="dxa"/>
+        </w:trPr>
+        <w:tc>
+          <w:tcPr>
+            <w:tcW w:w="0" w:type="auto"/>
+            <w:tcBorders>
+              <w:top w:val="nil"/>
+              <w:left w:val="nil"/>
+            </w:tcBorders>
+            <w:tcMar>
+              <w:top w:w="60" w:type="dxa"/>
+              <w:left w:w="90" w:type="dxa"/>
+              <w:bottom w:w="60" w:type="dxa"/>
+              <w:right w:w="90" w:type="dxa"/>
+            </w:tcMar>
+            <w:vAlign w:val="center"/>
+            <w:hideMark/>
+          </w:tcPr>
+          <w:p>
+            <w:hyperlink r:id="rId43" w:history="1">
+              <w:r>
+                <w:rPr>
+                  <w:rStyle w:val="Hyperlink"/>
+                </w:rPr>
+                <w:t>BudgetController.java</w:t>
+              </w:r>
+            </w:hyperlink>
+          </w:p>
+        </w:tc>
+        <w:tc>
+          <w:tcPr>
+            <w:tcW w:w="0" w:type="auto"/>
+            <w:tcBorders>
+              <w:top w:val="nil"/>
+              <w:left w:val="nil"/>
+              <w:right w:val="nil"/>
+            </w:tcBorders>
+            <w:tcMar>
+              <w:top w:w="60" w:type="dxa"/>
+              <w:left w:w="90" w:type="dxa"/>
+              <w:bottom w:w="60" w:type="dxa"/>
+              <w:right w:w="90" w:type="dxa"/>
+            </w:tcMar>
+            <w:vAlign w:val="center"/>
+            <w:hideMark/>
+          </w:tcPr>
+          <w:p>
+            <w:r>
+              <w:t>All @PreAuthorize now: </w:t>
+            </w:r>
+            <w:proofErr w:type="spellStart"/>
+            <w:r>
+              <w:t>hasRole</w:t>
+            </w:r>
+            <w:proofErr w:type="spellEnd"/>
+            <w:r>
+              <w:t xml:space="preserve">('APP_X') or </w:t>
+            </w:r>
+            <w:proofErr w:type="spellStart"/>
+            <w:r>
+              <w:t>hasAuthority</w:t>
+            </w:r>
+            <w:proofErr w:type="spellEnd"/>
+            <w:r>
+              <w:t>('GROUP_GRP_X')</w:t>
+            </w:r>
+          </w:p>
+        </w:tc>
+      </w:tr>
+      <w:tr>
+        <w:trPr>
+          <w:tblCellSpacing w:w="15" w:type="dxa"/>
+        </w:trPr>
+        <w:tc>
+          <w:tcPr>
+            <w:tcW w:w="0" w:type="auto"/>
+            <w:tcBorders>
+              <w:top w:val="nil"/>
+              <w:left w:val="nil"/>
+              <w:bottom w:val="nil"/>
+            </w:tcBorders>
+            <w:tcMar>
+              <w:top w:w="60" w:type="dxa"/>
+              <w:left w:w="90" w:type="dxa"/>
+              <w:bottom w:w="60" w:type="dxa"/>
+              <w:right w:w="90" w:type="dxa"/>
+            </w:tcMar>
+            <w:vAlign w:val="center"/>
+            <w:hideMark/>
+          </w:tcPr>
+          <w:p>
+            <w:hyperlink r:id="rId44" w:history="1">
+              <w:r>
+                <w:rPr>
+                  <w:rStyle w:val="Hyperlink"/>
+                </w:rPr>
+                <w:t>CommentController.java</w:t>
+              </w:r>
+            </w:hyperlink>
+          </w:p>
+        </w:tc>
+        <w:tc>
+          <w:tcPr>
+            <w:tcW w:w="0" w:type="auto"/>
+            <w:tcBorders>
+              <w:top w:val="nil"/>
+              <w:left w:val="nil"/>
+              <w:bottom w:val="nil"/>
+              <w:right w:val="nil"/>
+            </w:tcBorders>
+            <w:tcMar>
+              <w:top w:w="60" w:type="dxa"/>
+              <w:left w:w="90" w:type="dxa"/>
+              <w:bottom w:w="60" w:type="dxa"/>
+              <w:right w:w="90" w:type="dxa"/>
+            </w:tcMar>
+            <w:vAlign w:val="center"/>
+            <w:hideMark/>
+          </w:tcPr>
+          <w:p>
+            <w:r>
+              <w:t>Same pattern; </w:t>
+            </w:r>
+            <w:proofErr w:type="spellStart"/>
+            <w:r>
+              <w:fldChar w:fldCharType="begin"/>
+            </w:r>
+            <w:r>
+              <w:instrText>HYPERLINK "vscode-file://vscode-app/d:/apps/Microsoft%20VS%20Code/07ff9d6178/resources/app/out/vs/code/electron-browser/workbench/workbench.html" \o ""</w:instrText>
+            </w:r>
+            <w:r>
+              <w:fldChar w:fldCharType="separate"/>
+            </w:r>
+            <w:r>
+              <w:rPr>
+                <w:rStyle w:val="Hyperlink"/>
+              </w:rPr>
+              <w:t>isAdmin</w:t>
+            </w:r>
+            <w:proofErr w:type="spellEnd"/>
+            <w:r>
+              <w:fldChar w:fldCharType="end"/>
+            </w:r>
+            <w:r>
+              <w:t> check also considers GROUP_GRP_ADMIN</w:t>
+            </w:r>
+          </w:p>
+        </w:tc>
+      </w:tr>
+    </w:tbl>
+    <w:p/>
+    <w:p>
+      <w:pPr>
+        <w:pStyle w:val="ListParagraph"/>
+        <w:numPr>
+          <w:ilvl w:val="0"/>
+          <w:numId w:val="39"/>
+        </w:numPr>
+      </w:pPr>
+      <w:r>
+        <w:rPr>
+          <w:b/>
+          <w:bCs/>
+        </w:rPr>
+        <w:t>Angular</w:t>
+      </w:r>
+      <w:r>
+        <w:t>:</w:t>
+      </w:r>
+    </w:p>
+    <w:tbl>
+      <w:tblPr>
+        <w:tblW w:w="0" w:type="auto"/>
+        <w:tblCellSpacing w:w="15" w:type="dxa"/>
+        <w:tblInd w:w="600" w:type="dxa"/>
+        <w:tblBorders>
+          <w:top w:val="single" w:sz="4" w:space="0" w:color="auto"/>
+          <w:left w:val="single" w:sz="4" w:space="0" w:color="auto"/>
+          <w:bottom w:val="single" w:sz="4" w:space="0" w:color="auto"/>
+          <w:right w:val="single" w:sz="4" w:space="0" w:color="auto"/>
+        </w:tblBorders>
+        <w:shd w:val="clear" w:color="auto" w:fill="181818"/>
+        <w:tblCellMar>
+          <w:top w:w="15" w:type="dxa"/>
+          <w:left w:w="15" w:type="dxa"/>
+          <w:bottom w:w="15" w:type="dxa"/>
+          <w:right w:w="15" w:type="dxa"/>
+        </w:tblCellMar>
+        <w:tblLook w:val="04A0" w:firstRow="1" w:lastRow="0" w:firstColumn="1" w:lastColumn="0" w:noHBand="0" w:noVBand="1"/>
+      </w:tblPr>
+      <w:tblGrid>
+        <w:gridCol w:w="3898"/>
+        <w:gridCol w:w="8427"/>
+      </w:tblGrid>
+      <w:tr>
+        <w:trPr>
+          <w:tblHeader/>
+          <w:tblCellSpacing w:w="15" w:type="dxa"/>
+        </w:trPr>
+        <w:tc>
+          <w:tcPr>
+            <w:tcW w:w="0" w:type="auto"/>
+            <w:tcBorders>
+              <w:top w:val="nil"/>
+              <w:left w:val="nil"/>
+            </w:tcBorders>
+            <w:tcMar>
+              <w:top w:w="60" w:type="dxa"/>
+              <w:left w:w="90" w:type="dxa"/>
+              <w:bottom w:w="60" w:type="dxa"/>
+              <w:right w:w="90" w:type="dxa"/>
+            </w:tcMar>
+            <w:vAlign w:val="center"/>
+            <w:hideMark/>
+          </w:tcPr>
+          <w:p>
+            <w:pPr>
+              <w:rPr>
+                <w:b/>
+                <w:bCs/>
+              </w:rPr>
+            </w:pPr>
+            <w:r>
+              <w:rPr>
+                <w:b/>
+                <w:bCs/>
+              </w:rPr>
+              <w:t>File</w:t>
+            </w:r>
+          </w:p>
+        </w:tc>
+        <w:tc>
+          <w:tcPr>
+            <w:tcW w:w="0" w:type="auto"/>
+            <w:tcBorders>
+              <w:top w:val="nil"/>
+              <w:left w:val="nil"/>
+              <w:right w:val="nil"/>
+            </w:tcBorders>
+            <w:tcMar>
+              <w:top w:w="60" w:type="dxa"/>
+              <w:left w:w="90" w:type="dxa"/>
+              <w:bottom w:w="60" w:type="dxa"/>
+              <w:right w:w="90" w:type="dxa"/>
+            </w:tcMar>
+            <w:vAlign w:val="center"/>
+            <w:hideMark/>
+          </w:tcPr>
+          <w:p>
+            <w:pPr>
+              <w:rPr>
+                <w:b/>
+                <w:bCs/>
+              </w:rPr>
+            </w:pPr>
+            <w:r>
+              <w:rPr>
+                <w:b/>
+                <w:bCs/>
+              </w:rPr>
+              <w:t>Change</w:t>
+            </w:r>
+          </w:p>
+        </w:tc>
+      </w:tr>
+      <w:tr>
+        <w:trPr>
+          <w:tblCellSpacing w:w="15" w:type="dxa"/>
+        </w:trPr>
+        <w:tc>
+          <w:tcPr>
+            <w:tcW w:w="0" w:type="auto"/>
+            <w:tcBorders>
+              <w:top w:val="nil"/>
+              <w:left w:val="nil"/>
+            </w:tcBorders>
+            <w:tcMar>
+              <w:top w:w="60" w:type="dxa"/>
+              <w:left w:w="90" w:type="dxa"/>
+              <w:bottom w:w="60" w:type="dxa"/>
+              <w:right w:w="90" w:type="dxa"/>
+            </w:tcMar>
+            <w:vAlign w:val="center"/>
+            <w:hideMark/>
+          </w:tcPr>
+          <w:p>
+            <w:hyperlink r:id="rId45" w:history="1">
+              <w:r>
+                <w:rPr>
+                  <w:rStyle w:val="Hyperlink"/>
+                </w:rPr>
+                <w:t>user-</w:t>
+              </w:r>
+              <w:proofErr w:type="spellStart"/>
+              <w:proofErr w:type="gramStart"/>
+              <w:r>
+                <w:rPr>
+                  <w:rStyle w:val="Hyperlink"/>
+                </w:rPr>
+                <w:t>info.model</w:t>
+              </w:r>
+              <w:proofErr w:type="gramEnd"/>
+              <w:r>
+                <w:rPr>
+                  <w:rStyle w:val="Hyperlink"/>
+                </w:rPr>
+                <w:t>.ts</w:t>
+              </w:r>
+              <w:proofErr w:type="spellEnd"/>
+            </w:hyperlink>
+          </w:p>
+        </w:tc>
+        <w:tc>
+          <w:tcPr>
+            <w:tcW w:w="0" w:type="auto"/>
+            <w:tcBorders>
+              <w:top w:val="nil"/>
+              <w:left w:val="nil"/>
+              <w:right w:val="nil"/>
+            </w:tcBorders>
+            <w:tcMar>
+              <w:top w:w="60" w:type="dxa"/>
+              <w:left w:w="90" w:type="dxa"/>
+              <w:bottom w:w="60" w:type="dxa"/>
+              <w:right w:w="90" w:type="dxa"/>
+            </w:tcMar>
+            <w:vAlign w:val="center"/>
+            <w:hideMark/>
+          </w:tcPr>
+          <w:p>
+            <w:r>
+              <w:t xml:space="preserve">Added groups: </w:t>
+            </w:r>
+            <w:proofErr w:type="gramStart"/>
+            <w:r>
+              <w:t>string[</w:t>
+            </w:r>
+            <w:proofErr w:type="gramEnd"/>
+            <w:r>
+              <w:t>]</w:t>
+            </w:r>
+          </w:p>
+        </w:tc>
+      </w:tr>
+      <w:tr>
+        <w:trPr>
+          <w:tblCellSpacing w:w="15" w:type="dxa"/>
+        </w:trPr>
+        <w:tc>
+          <w:tcPr>
+            <w:tcW w:w="0" w:type="auto"/>
+            <w:tcBorders>
+              <w:top w:val="nil"/>
+              <w:left w:val="nil"/>
+            </w:tcBorders>
+            <w:tcMar>
+              <w:top w:w="60" w:type="dxa"/>
+              <w:left w:w="90" w:type="dxa"/>
+              <w:bottom w:w="60" w:type="dxa"/>
+              <w:right w:w="90" w:type="dxa"/>
+            </w:tcMar>
+            <w:vAlign w:val="center"/>
+            <w:hideMark/>
+          </w:tcPr>
+          <w:p>
+            <w:hyperlink r:id="rId46" w:history="1">
+              <w:proofErr w:type="spellStart"/>
+              <w:proofErr w:type="gramStart"/>
+              <w:r>
+                <w:rPr>
+                  <w:rStyle w:val="Hyperlink"/>
+                </w:rPr>
+                <w:t>auth.service</w:t>
+              </w:r>
+              <w:proofErr w:type="gramEnd"/>
+              <w:r>
+                <w:rPr>
+                  <w:rStyle w:val="Hyperlink"/>
+                </w:rPr>
+                <w:t>.ts</w:t>
+              </w:r>
+              <w:proofErr w:type="spellEnd"/>
+            </w:hyperlink>
+          </w:p>
+        </w:tc>
+        <w:tc>
+          <w:tcPr>
+            <w:tcW w:w="0" w:type="auto"/>
+            <w:tcBorders>
+              <w:top w:val="nil"/>
+              <w:left w:val="nil"/>
+              <w:right w:val="nil"/>
+            </w:tcBorders>
+            <w:tcMar>
+              <w:top w:w="60" w:type="dxa"/>
+              <w:left w:w="90" w:type="dxa"/>
+              <w:bottom w:w="60" w:type="dxa"/>
+              <w:right w:w="90" w:type="dxa"/>
+            </w:tcMar>
+            <w:vAlign w:val="center"/>
+            <w:hideMark/>
+          </w:tcPr>
+          <w:p>
+            <w:r>
+              <w:t>Added </w:t>
+            </w:r>
+            <w:proofErr w:type="spellStart"/>
+            <w:r>
+              <w:t>hasGroup</w:t>
+            </w:r>
+            <w:proofErr w:type="spellEnd"/>
+            <w:r>
+              <w:t>(), </w:t>
+            </w:r>
+            <w:proofErr w:type="spellStart"/>
+            <w:r>
+              <w:t>hasAnyGroup</w:t>
+            </w:r>
+            <w:proofErr w:type="spellEnd"/>
+            <w:r>
+              <w:t>(), </w:t>
+            </w:r>
+            <w:proofErr w:type="spellStart"/>
+            <w:r>
+              <w:fldChar w:fldCharType="begin"/>
+            </w:r>
+            <w:r>
+              <w:instrText>HYPERLINK "vscode-file://vscode-app/d:/apps/Microsoft%20VS%20Code/07ff9d6178/resources/app/out/vs/code/electron-browser/workbench/workbench.html" \o ""</w:instrText>
+            </w:r>
+            <w:r>
+              <w:fldChar w:fldCharType="separate"/>
+            </w:r>
+            <w:r>
+              <w:rPr>
+                <w:rStyle w:val="Hyperlink"/>
+              </w:rPr>
+              <w:t>hasAnyRoleOrGroup</w:t>
+            </w:r>
+            <w:proofErr w:type="spellEnd"/>
+            <w:r>
+              <w:rPr>
+                <w:rStyle w:val="Hyperlink"/>
+              </w:rPr>
+              <w:t>()</w:t>
+            </w:r>
+            <w:r>
+              <w:fldChar w:fldCharType="end"/>
+            </w:r>
+            <w:r>
+              <w:t> — maps APP_X ↔ GRP_X</w:t>
+            </w:r>
+          </w:p>
+        </w:tc>
+      </w:tr>
+      <w:tr>
+        <w:trPr>
+          <w:tblCellSpacing w:w="15" w:type="dxa"/>
+        </w:trPr>
+        <w:tc>
+          <w:tcPr>
+            <w:tcW w:w="0" w:type="auto"/>
+            <w:tcBorders>
+              <w:top w:val="nil"/>
+              <w:left w:val="nil"/>
+            </w:tcBorders>
+            <w:tcMar>
+              <w:top w:w="60" w:type="dxa"/>
+              <w:left w:w="90" w:type="dxa"/>
+              <w:bottom w:w="60" w:type="dxa"/>
+              <w:right w:w="90" w:type="dxa"/>
+            </w:tcMar>
+            <w:vAlign w:val="center"/>
+            <w:hideMark/>
+          </w:tcPr>
+          <w:p>
+            <w:hyperlink r:id="rId47" w:history="1">
+              <w:proofErr w:type="spellStart"/>
+              <w:proofErr w:type="gramStart"/>
+              <w:r>
+                <w:rPr>
+                  <w:rStyle w:val="Hyperlink"/>
+                </w:rPr>
+                <w:t>role.guard</w:t>
+              </w:r>
+              <w:proofErr w:type="gramEnd"/>
+              <w:r>
+                <w:rPr>
+                  <w:rStyle w:val="Hyperlink"/>
+                </w:rPr>
+                <w:t>.ts</w:t>
+              </w:r>
+              <w:proofErr w:type="spellEnd"/>
+            </w:hyperlink>
+          </w:p>
+        </w:tc>
+        <w:tc>
+          <w:tcPr>
+            <w:tcW w:w="0" w:type="auto"/>
+            <w:tcBorders>
+              <w:top w:val="nil"/>
+              <w:left w:val="nil"/>
+              <w:right w:val="nil"/>
+            </w:tcBorders>
+            <w:tcMar>
+              <w:top w:w="60" w:type="dxa"/>
+              <w:left w:w="90" w:type="dxa"/>
+              <w:bottom w:w="60" w:type="dxa"/>
+              <w:right w:w="90" w:type="dxa"/>
+            </w:tcMar>
+            <w:vAlign w:val="center"/>
+            <w:hideMark/>
+          </w:tcPr>
+          <w:p>
+            <w:r>
+              <w:t>Now calls </w:t>
+            </w:r>
+            <w:proofErr w:type="spellStart"/>
+            <w:r>
+              <w:fldChar w:fldCharType="begin"/>
+            </w:r>
+            <w:r>
+              <w:instrText>HYPERLINK "vscode-file://vscode-app/d:/apps/Microsoft%20VS%20Code/07ff9d6178/resources/app/out/vs/code/electron-browser/workbench/workbench.html" \o ""</w:instrText>
+            </w:r>
+            <w:r>
+              <w:fldChar w:fldCharType="separate"/>
+            </w:r>
+            <w:r>
+              <w:rPr>
+                <w:rStyle w:val="Hyperlink"/>
+              </w:rPr>
+              <w:t>hasAnyRoleOrGroup</w:t>
+            </w:r>
+            <w:proofErr w:type="spellEnd"/>
+            <w:r>
+              <w:rPr>
+                <w:rStyle w:val="Hyperlink"/>
+              </w:rPr>
+              <w:t>()</w:t>
+            </w:r>
+            <w:r>
+              <w:fldChar w:fldCharType="end"/>
+            </w:r>
+            <w:r>
+              <w:t> instead of </w:t>
+            </w:r>
+            <w:proofErr w:type="spellStart"/>
+            <w:r>
+              <w:t>hasAnyRole</w:t>
+            </w:r>
+            <w:proofErr w:type="spellEnd"/>
+            <w:r>
+              <w:t>()</w:t>
+            </w:r>
+          </w:p>
+        </w:tc>
+      </w:tr>
+      <w:tr>
+        <w:trPr>
+          <w:tblCellSpacing w:w="15" w:type="dxa"/>
+        </w:trPr>
+        <w:tc>
+          <w:tcPr>
+            <w:tcW w:w="0" w:type="auto"/>
+            <w:tcBorders>
+              <w:top w:val="nil"/>
+              <w:left w:val="nil"/>
+            </w:tcBorders>
+            <w:tcMar>
+              <w:top w:w="60" w:type="dxa"/>
+              <w:left w:w="90" w:type="dxa"/>
+              <w:bottom w:w="60" w:type="dxa"/>
+              <w:right w:w="90" w:type="dxa"/>
+            </w:tcMar>
+            <w:vAlign w:val="center"/>
+            <w:hideMark/>
+          </w:tcPr>
+          <w:p>
+            <w:hyperlink r:id="rId48" w:history="1">
+              <w:r>
+                <w:rPr>
+                  <w:rStyle w:val="Hyperlink"/>
+                </w:rPr>
+                <w:t>header.component.html</w:t>
+              </w:r>
+            </w:hyperlink>
+          </w:p>
+        </w:tc>
+        <w:tc>
+          <w:tcPr>
+            <w:tcW w:w="0" w:type="auto"/>
+            <w:tcBorders>
+              <w:top w:val="nil"/>
+              <w:left w:val="nil"/>
+              <w:right w:val="nil"/>
+            </w:tcBorders>
+            <w:tcMar>
+              <w:top w:w="60" w:type="dxa"/>
+              <w:left w:w="90" w:type="dxa"/>
+              <w:bottom w:w="60" w:type="dxa"/>
+              <w:right w:w="90" w:type="dxa"/>
+            </w:tcMar>
+            <w:vAlign w:val="center"/>
+            <w:hideMark/>
+          </w:tcPr>
+          <w:p>
+            <w:r>
+              <w:t>Nav visibility uses </w:t>
+            </w:r>
+            <w:proofErr w:type="spellStart"/>
+            <w:r>
+              <w:fldChar w:fldCharType="begin"/>
+            </w:r>
+            <w:r>
+              <w:instrText>HYPERLINK "vscode-file://vscode-app/d:/apps/Microsoft%20VS%20Code/07ff9d6178/resources/app/out/vs/code/electron-browser/workbench/workbench.html" \o ""</w:instrText>
+            </w:r>
+            <w:r>
+              <w:fldChar w:fldCharType="separate"/>
+            </w:r>
+            <w:r>
+              <w:rPr>
+                <w:rStyle w:val="Hyperlink"/>
+              </w:rPr>
+              <w:t>hasAnyRoleOrGroup</w:t>
+            </w:r>
+            <w:proofErr w:type="spellEnd"/>
+            <w:r>
+              <w:rPr>
+                <w:rStyle w:val="Hyperlink"/>
+              </w:rPr>
+              <w:t>()</w:t>
+            </w:r>
+            <w:r>
+              <w:fldChar w:fldCharType="end"/>
+            </w:r>
+          </w:p>
+        </w:tc>
+      </w:tr>
+      <w:tr>
+        <w:trPr>
+          <w:tblCellSpacing w:w="15" w:type="dxa"/>
+        </w:trPr>
+        <w:tc>
+          <w:tcPr>
+            <w:tcW w:w="0" w:type="auto"/>
+            <w:tcBorders>
+              <w:top w:val="nil"/>
+              <w:left w:val="nil"/>
+              <w:bottom w:val="nil"/>
+            </w:tcBorders>
+            <w:tcMar>
+              <w:top w:w="60" w:type="dxa"/>
+              <w:left w:w="90" w:type="dxa"/>
+              <w:bottom w:w="60" w:type="dxa"/>
+              <w:right w:w="90" w:type="dxa"/>
+            </w:tcMar>
+            <w:vAlign w:val="center"/>
+            <w:hideMark/>
+          </w:tcPr>
+          <w:p>
+            <w:hyperlink r:id="rId49" w:history="1">
+              <w:r>
+                <w:rPr>
+                  <w:rStyle w:val="Hyperlink"/>
+                </w:rPr>
+                <w:t>comment-thread-</w:t>
+              </w:r>
+              <w:proofErr w:type="spellStart"/>
+              <w:proofErr w:type="gramStart"/>
+              <w:r>
+                <w:rPr>
+                  <w:rStyle w:val="Hyperlink"/>
+                </w:rPr>
+                <w:t>panel.component</w:t>
+              </w:r>
+              <w:proofErr w:type="gramEnd"/>
+              <w:r>
+                <w:rPr>
+                  <w:rStyle w:val="Hyperlink"/>
+                </w:rPr>
+                <w:t>.ts</w:t>
+              </w:r>
+              <w:proofErr w:type="spellEnd"/>
+            </w:hyperlink>
+          </w:p>
+        </w:tc>
+        <w:tc>
+          <w:tcPr>
+            <w:tcW w:w="0" w:type="auto"/>
+            <w:tcBorders>
+              <w:top w:val="nil"/>
+              <w:left w:val="nil"/>
+              <w:bottom w:val="nil"/>
+              <w:right w:val="nil"/>
+            </w:tcBorders>
+            <w:tcMar>
+              <w:top w:w="60" w:type="dxa"/>
+              <w:left w:w="90" w:type="dxa"/>
+              <w:bottom w:w="60" w:type="dxa"/>
+              <w:right w:w="90" w:type="dxa"/>
+            </w:tcMar>
+            <w:vAlign w:val="center"/>
+            <w:hideMark/>
+          </w:tcPr>
+          <w:p>
+            <w:hyperlink r:id="rId50" w:history="1">
+              <w:proofErr w:type="spellStart"/>
+              <w:r>
+                <w:rPr>
+                  <w:rStyle w:val="Hyperlink"/>
+                </w:rPr>
+                <w:t>canWrite</w:t>
+              </w:r>
+              <w:proofErr w:type="spellEnd"/>
+            </w:hyperlink>
+            <w:r>
+              <w:t>/</w:t>
+            </w:r>
+            <w:proofErr w:type="spellStart"/>
+            <w:r>
+              <w:fldChar w:fldCharType="begin"/>
+            </w:r>
+            <w:r>
+              <w:instrText>HYPERLINK "vscode-file://vscode-app/d:/apps/Microsoft%20VS%20Code/07ff9d6178/resources/app/out/vs/code/electron-browser/workbench/workbench.html" \o ""</w:instrText>
+            </w:r>
+            <w:r>
+              <w:fldChar w:fldCharType="separate"/>
+            </w:r>
+            <w:r>
+              <w:rPr>
+                <w:rStyle w:val="Hyperlink"/>
+              </w:rPr>
+              <w:t>isAdmin</w:t>
+            </w:r>
+            <w:proofErr w:type="spellEnd"/>
+            <w:r>
+              <w:fldChar w:fldCharType="end"/>
+            </w:r>
+            <w:r>
+              <w:t> use </w:t>
+            </w:r>
+            <w:proofErr w:type="spellStart"/>
+            <w:r>
+              <w:fldChar w:fldCharType="begin"/>
+            </w:r>
+            <w:r>
+              <w:instrText>HYPERLINK "vscode-file://vscode-app/d:/apps/Microsoft%20VS%20Code/07ff9d6178/resources/app/out/vs/code/electron-browser/workbench/workbench.html" \o ""</w:instrText>
+            </w:r>
+            <w:r>
+              <w:fldChar w:fldCharType="separate"/>
+            </w:r>
+            <w:r>
+              <w:rPr>
+                <w:rStyle w:val="Hyperlink"/>
+              </w:rPr>
+              <w:t>hasAnyRoleOrGroup</w:t>
+            </w:r>
+            <w:proofErr w:type="spellEnd"/>
+            <w:r>
+              <w:rPr>
+                <w:rStyle w:val="Hyperlink"/>
+              </w:rPr>
+              <w:t>()</w:t>
+            </w:r>
+            <w:r>
+              <w:fldChar w:fldCharType="end"/>
+            </w:r>
+          </w:p>
+        </w:tc>
+      </w:tr>
+    </w:tbl>
+    <w:p/>
+    <w:p/>
+    <w:p>
+      <w:r>
+        <w:t xml:space="preserve"> </w:t>
+      </w:r>
     </w:p>
     <w:p/>
     <w:p/>
@@ -10420,6 +12804,119 @@
 <file path=word/numbering.xml><?xml version="1.0" encoding="utf-8"?>
 <w:numbering xmlns:wpc="http://schemas.microsoft.com/office/word/2010/wordprocessingCanvas" xmlns:cx="http://schemas.microsoft.com/office/drawing/2014/chartex" xmlns:cx1="http://schemas.microsoft.com/office/drawing/2015/9/8/chartex" xmlns:cx2="http://schemas.microsoft.com/office/drawing/2015/10/21/chartex" xmlns:cx3="http://schemas.microsoft.com/office/drawing/2016/5/9/chartex" xmlns:cx4="http://schemas.microsoft.com/office/drawing/2016/5/10/chartex" xmlns:cx5="http://schemas.microsoft.com/office/drawing/2016/5/11/chartex" xmlns:cx6="http://schemas.microsoft.com/office/drawing/2016/5/12/chartex" xmlns:cx7="http://schemas.microsoft.com/office/drawing/2016/5/13/chartex" xmlns:cx8="http://schemas.microsoft.com/office/drawing/2016/5/14/chartex" xmlns:mc="http://schemas.openxmlformats.org/markup-compatibility/2006" xmlns:aink="http://schemas.microsoft.com/office/drawing/2016/ink" xmlns:am3d="http://schemas.microsoft.com/office/drawing/2017/model3d" xmlns:o="urn:schemas-microsoft-com:office:office" xmlns:oel="http://schemas.microsoft.com/office/2019/extlst" xmlns:r="http://schemas.openxmlformats.org/officeDocument/2006/relationships" xmlns:m="http://schemas.openxmlformats.org/officeDocument/2006/math" xmlns:v="urn:schemas-microsoft-com:vml" xmlns:wp14="http://schemas.microsoft.com/office/word/2010/wordprocessingDrawing" xmlns:wp="http://schemas.openxmlformats.org/drawingml/2006/wordprocessingDrawing" xmlns:w10="urn:schemas-microsoft-com:office:word" xmlns:w="http://schemas.openxmlformats.org/wordprocessingml/2006/main" xmlns:w14="http://schemas.microsoft.com/office/word/2010/wordml" xmlns:w15="http://schemas.microsoft.com/office/word/2012/wordml" xmlns:w16cex="http://schemas.microsoft.com/office/word/2018/wordml/cex" xmlns:w16cid="http://schemas.microsoft.com/office/word/2016/wordml/cid" xmlns:w16="http://schemas.microsoft.com/office/word/2018/wordml" xmlns:w16du="http://schemas.microsoft.com/office/word/2023/wordml/word16du" xmlns:w16sdtdh="http://schemas.microsoft.com/office/word/2020/wordml/sdtdatahash" xmlns:w16sdtfl="http://schemas.microsoft.com/office/word/2024/wordml/sdtformatlock" xmlns:w16se="http://schemas.microsoft.com/office/word/2015/wordml/symex" xmlns:wpg="http://schemas.microsoft.com/office/word/2010/wordprocessingGroup" xmlns:wpi="http://schemas.microsoft.com/office/word/2010/wordprocessingInk" xmlns:wne="http://schemas.microsoft.com/office/word/2006/wordml" xmlns:wps="http://schemas.microsoft.com/office/word/2010/wordprocessingShape" mc:Ignorable="w14 w15 w16se w16cid w16 w16cex w16sdtdh w16sdtfl w16du wp14">
   <w:abstractNum w:abstractNumId="0" w15:restartNumberingAfterBreak="0">
+    <w:nsid w:val="01F54FD3"/>
+    <w:multiLevelType w:val="multilevel"/>
+    <w:tmpl w:val="190E7BB0"/>
+    <w:lvl w:ilvl="0">
+      <w:start w:val="1"/>
+      <w:numFmt w:val="decimal"/>
+      <w:lvlText w:val="%1."/>
+      <w:lvlJc w:val="left"/>
+      <w:pPr>
+        <w:tabs>
+          <w:tab w:val="num" w:pos="720"/>
+        </w:tabs>
+        <w:ind w:left="720" w:hanging="360"/>
+      </w:pPr>
+    </w:lvl>
+    <w:lvl w:ilvl="1" w:tentative="1">
+      <w:start w:val="1"/>
+      <w:numFmt w:val="decimal"/>
+      <w:lvlText w:val="%2."/>
+      <w:lvlJc w:val="left"/>
+      <w:pPr>
+        <w:tabs>
+          <w:tab w:val="num" w:pos="1440"/>
+        </w:tabs>
+        <w:ind w:left="1440" w:hanging="360"/>
+      </w:pPr>
+    </w:lvl>
+    <w:lvl w:ilvl="2" w:tentative="1">
+      <w:start w:val="1"/>
+      <w:numFmt w:val="decimal"/>
+      <w:lvlText w:val="%3."/>
+      <w:lvlJc w:val="left"/>
+      <w:pPr>
+        <w:tabs>
+          <w:tab w:val="num" w:pos="2160"/>
+        </w:tabs>
+        <w:ind w:left="2160" w:hanging="360"/>
+      </w:pPr>
+    </w:lvl>
+    <w:lvl w:ilvl="3" w:tentative="1">
+      <w:start w:val="1"/>
+      <w:numFmt w:val="decimal"/>
+      <w:lvlText w:val="%4."/>
+      <w:lvlJc w:val="left"/>
+      <w:pPr>
+        <w:tabs>
+          <w:tab w:val="num" w:pos="2880"/>
+        </w:tabs>
+        <w:ind w:left="2880" w:hanging="360"/>
+      </w:pPr>
+    </w:lvl>
+    <w:lvl w:ilvl="4" w:tentative="1">
+      <w:start w:val="1"/>
+      <w:numFmt w:val="decimal"/>
+      <w:lvlText w:val="%5."/>
+      <w:lvlJc w:val="left"/>
+      <w:pPr>
+        <w:tabs>
+          <w:tab w:val="num" w:pos="3600"/>
+        </w:tabs>
+        <w:ind w:left="3600" w:hanging="360"/>
+      </w:pPr>
+    </w:lvl>
+    <w:lvl w:ilvl="5" w:tentative="1">
+      <w:start w:val="1"/>
+      <w:numFmt w:val="decimal"/>
+      <w:lvlText w:val="%6."/>
+      <w:lvlJc w:val="left"/>
+      <w:pPr>
+        <w:tabs>
+          <w:tab w:val="num" w:pos="4320"/>
+        </w:tabs>
+        <w:ind w:left="4320" w:hanging="360"/>
+      </w:pPr>
+    </w:lvl>
+    <w:lvl w:ilvl="6" w:tentative="1">
+      <w:start w:val="1"/>
+      <w:numFmt w:val="decimal"/>
+      <w:lvlText w:val="%7."/>
+      <w:lvlJc w:val="left"/>
+      <w:pPr>
+        <w:tabs>
+          <w:tab w:val="num" w:pos="5040"/>
+        </w:tabs>
+        <w:ind w:left="5040" w:hanging="360"/>
+      </w:pPr>
+    </w:lvl>
+    <w:lvl w:ilvl="7" w:tentative="1">
+      <w:start w:val="1"/>
+      <w:numFmt w:val="decimal"/>
+      <w:lvlText w:val="%8."/>
+      <w:lvlJc w:val="left"/>
+      <w:pPr>
+        <w:tabs>
+          <w:tab w:val="num" w:pos="5760"/>
+        </w:tabs>
+        <w:ind w:left="5760" w:hanging="360"/>
+      </w:pPr>
+    </w:lvl>
+    <w:lvl w:ilvl="8" w:tentative="1">
+      <w:start w:val="1"/>
+      <w:numFmt w:val="decimal"/>
+      <w:lvlText w:val="%9."/>
+      <w:lvlJc w:val="left"/>
+      <w:pPr>
+        <w:tabs>
+          <w:tab w:val="num" w:pos="6480"/>
+        </w:tabs>
+        <w:ind w:left="6480" w:hanging="360"/>
+      </w:pPr>
+    </w:lvl>
+  </w:abstractNum>
+  <w:abstractNum w:abstractNumId="1" w15:restartNumberingAfterBreak="0">
     <w:nsid w:val="0231473F"/>
     <w:multiLevelType w:val="multilevel"/>
     <w:tmpl w:val="046C0890"/>
@@ -10532,7 +13029,7 @@
       </w:pPr>
     </w:lvl>
   </w:abstractNum>
-  <w:abstractNum w:abstractNumId="1" w15:restartNumberingAfterBreak="0">
+  <w:abstractNum w:abstractNumId="2" w15:restartNumberingAfterBreak="0">
     <w:nsid w:val="04A31B48"/>
     <w:multiLevelType w:val="multilevel"/>
     <w:tmpl w:val="AA2E31A0"/>
@@ -10681,7 +13178,7 @@
       </w:rPr>
     </w:lvl>
   </w:abstractNum>
-  <w:abstractNum w:abstractNumId="2" w15:restartNumberingAfterBreak="0">
+  <w:abstractNum w:abstractNumId="3" w15:restartNumberingAfterBreak="0">
     <w:nsid w:val="070454B9"/>
     <w:multiLevelType w:val="multilevel"/>
     <w:tmpl w:val="24BCCDFE"/>
@@ -10798,7 +13295,7 @@
       </w:pPr>
     </w:lvl>
   </w:abstractNum>
-  <w:abstractNum w:abstractNumId="3" w15:restartNumberingAfterBreak="0">
+  <w:abstractNum w:abstractNumId="4" w15:restartNumberingAfterBreak="0">
     <w:nsid w:val="08C77489"/>
     <w:multiLevelType w:val="multilevel"/>
     <w:tmpl w:val="1CD2FC78"/>
@@ -10947,7 +13444,7 @@
       </w:rPr>
     </w:lvl>
   </w:abstractNum>
-  <w:abstractNum w:abstractNumId="4" w15:restartNumberingAfterBreak="0">
+  <w:abstractNum w:abstractNumId="5" w15:restartNumberingAfterBreak="0">
     <w:nsid w:val="0CDE6022"/>
     <w:multiLevelType w:val="hybridMultilevel"/>
     <w:tmpl w:val="DB12CA8A"/>
@@ -11060,7 +13557,124 @@
       </w:rPr>
     </w:lvl>
   </w:abstractNum>
-  <w:abstractNum w:abstractNumId="5" w15:restartNumberingAfterBreak="0">
+  <w:abstractNum w:abstractNumId="6" w15:restartNumberingAfterBreak="0">
+    <w:nsid w:val="0D540426"/>
+    <w:multiLevelType w:val="multilevel"/>
+    <w:tmpl w:val="A49A23D4"/>
+    <w:lvl w:ilvl="0">
+      <w:start w:val="1"/>
+      <w:numFmt w:val="decimal"/>
+      <w:lvlText w:val="%1."/>
+      <w:lvlJc w:val="left"/>
+      <w:pPr>
+        <w:tabs>
+          <w:tab w:val="num" w:pos="720"/>
+        </w:tabs>
+        <w:ind w:left="720" w:hanging="360"/>
+      </w:pPr>
+    </w:lvl>
+    <w:lvl w:ilvl="1">
+      <w:start w:val="1"/>
+      <w:numFmt w:val="bullet"/>
+      <w:lvlText w:val="o"/>
+      <w:lvlJc w:val="left"/>
+      <w:pPr>
+        <w:tabs>
+          <w:tab w:val="num" w:pos="1440"/>
+        </w:tabs>
+        <w:ind w:left="1440" w:hanging="360"/>
+      </w:pPr>
+      <w:rPr>
+        <w:rFonts w:ascii="Courier New" w:hAnsi="Courier New" w:hint="default"/>
+        <w:sz w:val="20"/>
+      </w:rPr>
+    </w:lvl>
+    <w:lvl w:ilvl="2" w:tentative="1">
+      <w:start w:val="1"/>
+      <w:numFmt w:val="decimal"/>
+      <w:lvlText w:val="%3."/>
+      <w:lvlJc w:val="left"/>
+      <w:pPr>
+        <w:tabs>
+          <w:tab w:val="num" w:pos="2160"/>
+        </w:tabs>
+        <w:ind w:left="2160" w:hanging="360"/>
+      </w:pPr>
+    </w:lvl>
+    <w:lvl w:ilvl="3" w:tentative="1">
+      <w:start w:val="1"/>
+      <w:numFmt w:val="decimal"/>
+      <w:lvlText w:val="%4."/>
+      <w:lvlJc w:val="left"/>
+      <w:pPr>
+        <w:tabs>
+          <w:tab w:val="num" w:pos="2880"/>
+        </w:tabs>
+        <w:ind w:left="2880" w:hanging="360"/>
+      </w:pPr>
+    </w:lvl>
+    <w:lvl w:ilvl="4" w:tentative="1">
+      <w:start w:val="1"/>
+      <w:numFmt w:val="decimal"/>
+      <w:lvlText w:val="%5."/>
+      <w:lvlJc w:val="left"/>
+      <w:pPr>
+        <w:tabs>
+          <w:tab w:val="num" w:pos="3600"/>
+        </w:tabs>
+        <w:ind w:left="3600" w:hanging="360"/>
+      </w:pPr>
+    </w:lvl>
+    <w:lvl w:ilvl="5" w:tentative="1">
+      <w:start w:val="1"/>
+      <w:numFmt w:val="decimal"/>
+      <w:lvlText w:val="%6."/>
+      <w:lvlJc w:val="left"/>
+      <w:pPr>
+        <w:tabs>
+          <w:tab w:val="num" w:pos="4320"/>
+        </w:tabs>
+        <w:ind w:left="4320" w:hanging="360"/>
+      </w:pPr>
+    </w:lvl>
+    <w:lvl w:ilvl="6" w:tentative="1">
+      <w:start w:val="1"/>
+      <w:numFmt w:val="decimal"/>
+      <w:lvlText w:val="%7."/>
+      <w:lvlJc w:val="left"/>
+      <w:pPr>
+        <w:tabs>
+          <w:tab w:val="num" w:pos="5040"/>
+        </w:tabs>
+        <w:ind w:left="5040" w:hanging="360"/>
+      </w:pPr>
+    </w:lvl>
+    <w:lvl w:ilvl="7" w:tentative="1">
+      <w:start w:val="1"/>
+      <w:numFmt w:val="decimal"/>
+      <w:lvlText w:val="%8."/>
+      <w:lvlJc w:val="left"/>
+      <w:pPr>
+        <w:tabs>
+          <w:tab w:val="num" w:pos="5760"/>
+        </w:tabs>
+        <w:ind w:left="5760" w:hanging="360"/>
+      </w:pPr>
+    </w:lvl>
+    <w:lvl w:ilvl="8" w:tentative="1">
+      <w:start w:val="1"/>
+      <w:numFmt w:val="decimal"/>
+      <w:lvlText w:val="%9."/>
+      <w:lvlJc w:val="left"/>
+      <w:pPr>
+        <w:tabs>
+          <w:tab w:val="num" w:pos="6480"/>
+        </w:tabs>
+        <w:ind w:left="6480" w:hanging="360"/>
+      </w:pPr>
+    </w:lvl>
+  </w:abstractNum>
+  <w:abstractNum w:abstractNumId="7" w15:restartNumberingAfterBreak="0">
     <w:nsid w:val="10C505CB"/>
     <w:multiLevelType w:val="multilevel"/>
     <w:tmpl w:val="D07CD7FC"/>
@@ -11209,7 +13823,7 @@
       </w:rPr>
     </w:lvl>
   </w:abstractNum>
-  <w:abstractNum w:abstractNumId="6" w15:restartNumberingAfterBreak="0">
+  <w:abstractNum w:abstractNumId="8" w15:restartNumberingAfterBreak="0">
     <w:nsid w:val="116A5002"/>
     <w:multiLevelType w:val="multilevel"/>
     <w:tmpl w:val="401AB65A"/>
@@ -11358,7 +13972,7 @@
       </w:rPr>
     </w:lvl>
   </w:abstractNum>
-  <w:abstractNum w:abstractNumId="7" w15:restartNumberingAfterBreak="0">
+  <w:abstractNum w:abstractNumId="9" w15:restartNumberingAfterBreak="0">
     <w:nsid w:val="1AF90B6A"/>
     <w:multiLevelType w:val="multilevel"/>
     <w:tmpl w:val="1A56AF4A"/>
@@ -11471,7 +14085,7 @@
       </w:pPr>
     </w:lvl>
   </w:abstractNum>
-  <w:abstractNum w:abstractNumId="8" w15:restartNumberingAfterBreak="0">
+  <w:abstractNum w:abstractNumId="10" w15:restartNumberingAfterBreak="0">
     <w:nsid w:val="1BC87650"/>
     <w:multiLevelType w:val="hybridMultilevel"/>
     <w:tmpl w:val="971A6178"/>
@@ -11584,7 +14198,7 @@
       </w:rPr>
     </w:lvl>
   </w:abstractNum>
-  <w:abstractNum w:abstractNumId="9" w15:restartNumberingAfterBreak="0">
+  <w:abstractNum w:abstractNumId="11" w15:restartNumberingAfterBreak="0">
     <w:nsid w:val="1BCA4711"/>
     <w:multiLevelType w:val="multilevel"/>
     <w:tmpl w:val="3F587C96"/>
@@ -11733,7 +14347,7 @@
       </w:rPr>
     </w:lvl>
   </w:abstractNum>
-  <w:abstractNum w:abstractNumId="10" w15:restartNumberingAfterBreak="0">
+  <w:abstractNum w:abstractNumId="12" w15:restartNumberingAfterBreak="0">
     <w:nsid w:val="1D1149F5"/>
     <w:multiLevelType w:val="multilevel"/>
     <w:tmpl w:val="19346220"/>
@@ -11882,7 +14496,7 @@
       </w:rPr>
     </w:lvl>
   </w:abstractNum>
-  <w:abstractNum w:abstractNumId="11" w15:restartNumberingAfterBreak="0">
+  <w:abstractNum w:abstractNumId="13" w15:restartNumberingAfterBreak="0">
     <w:nsid w:val="20180394"/>
     <w:multiLevelType w:val="multilevel"/>
     <w:tmpl w:val="24BCCDFE"/>
@@ -12031,7 +14645,7 @@
       </w:rPr>
     </w:lvl>
   </w:abstractNum>
-  <w:abstractNum w:abstractNumId="12" w15:restartNumberingAfterBreak="0">
+  <w:abstractNum w:abstractNumId="14" w15:restartNumberingAfterBreak="0">
     <w:nsid w:val="246317E1"/>
     <w:multiLevelType w:val="multilevel"/>
     <w:tmpl w:val="85F0C770"/>
@@ -12180,7 +14794,7 @@
       </w:rPr>
     </w:lvl>
   </w:abstractNum>
-  <w:abstractNum w:abstractNumId="13" w15:restartNumberingAfterBreak="0">
+  <w:abstractNum w:abstractNumId="15" w15:restartNumberingAfterBreak="0">
     <w:nsid w:val="28BA103E"/>
     <w:multiLevelType w:val="hybridMultilevel"/>
     <w:tmpl w:val="77349F68"/>
@@ -12293,7 +14907,7 @@
       </w:rPr>
     </w:lvl>
   </w:abstractNum>
-  <w:abstractNum w:abstractNumId="14" w15:restartNumberingAfterBreak="0">
+  <w:abstractNum w:abstractNumId="16" w15:restartNumberingAfterBreak="0">
     <w:nsid w:val="2ACC1008"/>
     <w:multiLevelType w:val="multilevel"/>
     <w:tmpl w:val="83E0AAAE"/>
@@ -12442,7 +15056,120 @@
       </w:rPr>
     </w:lvl>
   </w:abstractNum>
-  <w:abstractNum w:abstractNumId="15" w15:restartNumberingAfterBreak="0">
+  <w:abstractNum w:abstractNumId="17" w15:restartNumberingAfterBreak="0">
+    <w:nsid w:val="2F2E41C4"/>
+    <w:multiLevelType w:val="multilevel"/>
+    <w:tmpl w:val="9E20C3CE"/>
+    <w:lvl w:ilvl="0">
+      <w:start w:val="4"/>
+      <w:numFmt w:val="decimal"/>
+      <w:lvlText w:val="%1."/>
+      <w:lvlJc w:val="left"/>
+      <w:pPr>
+        <w:tabs>
+          <w:tab w:val="num" w:pos="720"/>
+        </w:tabs>
+        <w:ind w:left="720" w:hanging="360"/>
+      </w:pPr>
+    </w:lvl>
+    <w:lvl w:ilvl="1" w:tentative="1">
+      <w:start w:val="1"/>
+      <w:numFmt w:val="decimal"/>
+      <w:lvlText w:val="%2."/>
+      <w:lvlJc w:val="left"/>
+      <w:pPr>
+        <w:tabs>
+          <w:tab w:val="num" w:pos="1440"/>
+        </w:tabs>
+        <w:ind w:left="1440" w:hanging="360"/>
+      </w:pPr>
+    </w:lvl>
+    <w:lvl w:ilvl="2" w:tentative="1">
+      <w:start w:val="1"/>
+      <w:numFmt w:val="decimal"/>
+      <w:lvlText w:val="%3."/>
+      <w:lvlJc w:val="left"/>
+      <w:pPr>
+        <w:tabs>
+          <w:tab w:val="num" w:pos="2160"/>
+        </w:tabs>
+        <w:ind w:left="2160" w:hanging="360"/>
+      </w:pPr>
+    </w:lvl>
+    <w:lvl w:ilvl="3" w:tentative="1">
+      <w:start w:val="1"/>
+      <w:numFmt w:val="decimal"/>
+      <w:lvlText w:val="%4."/>
+      <w:lvlJc w:val="left"/>
+      <w:pPr>
+        <w:tabs>
+          <w:tab w:val="num" w:pos="2880"/>
+        </w:tabs>
+        <w:ind w:left="2880" w:hanging="360"/>
+      </w:pPr>
+    </w:lvl>
+    <w:lvl w:ilvl="4" w:tentative="1">
+      <w:start w:val="1"/>
+      <w:numFmt w:val="decimal"/>
+      <w:lvlText w:val="%5."/>
+      <w:lvlJc w:val="left"/>
+      <w:pPr>
+        <w:tabs>
+          <w:tab w:val="num" w:pos="3600"/>
+        </w:tabs>
+        <w:ind w:left="3600" w:hanging="360"/>
+      </w:pPr>
+    </w:lvl>
+    <w:lvl w:ilvl="5" w:tentative="1">
+      <w:start w:val="1"/>
+      <w:numFmt w:val="decimal"/>
+      <w:lvlText w:val="%6."/>
+      <w:lvlJc w:val="left"/>
+      <w:pPr>
+        <w:tabs>
+          <w:tab w:val="num" w:pos="4320"/>
+        </w:tabs>
+        <w:ind w:left="4320" w:hanging="360"/>
+      </w:pPr>
+    </w:lvl>
+    <w:lvl w:ilvl="6" w:tentative="1">
+      <w:start w:val="1"/>
+      <w:numFmt w:val="decimal"/>
+      <w:lvlText w:val="%7."/>
+      <w:lvlJc w:val="left"/>
+      <w:pPr>
+        <w:tabs>
+          <w:tab w:val="num" w:pos="5040"/>
+        </w:tabs>
+        <w:ind w:left="5040" w:hanging="360"/>
+      </w:pPr>
+    </w:lvl>
+    <w:lvl w:ilvl="7" w:tentative="1">
+      <w:start w:val="1"/>
+      <w:numFmt w:val="decimal"/>
+      <w:lvlText w:val="%8."/>
+      <w:lvlJc w:val="left"/>
+      <w:pPr>
+        <w:tabs>
+          <w:tab w:val="num" w:pos="5760"/>
+        </w:tabs>
+        <w:ind w:left="5760" w:hanging="360"/>
+      </w:pPr>
+    </w:lvl>
+    <w:lvl w:ilvl="8" w:tentative="1">
+      <w:start w:val="1"/>
+      <w:numFmt w:val="decimal"/>
+      <w:lvlText w:val="%9."/>
+      <w:lvlJc w:val="left"/>
+      <w:pPr>
+        <w:tabs>
+          <w:tab w:val="num" w:pos="6480"/>
+        </w:tabs>
+        <w:ind w:left="6480" w:hanging="360"/>
+      </w:pPr>
+    </w:lvl>
+  </w:abstractNum>
+  <w:abstractNum w:abstractNumId="18" w15:restartNumberingAfterBreak="0">
     <w:nsid w:val="36DC4EAE"/>
     <w:multiLevelType w:val="multilevel"/>
     <w:tmpl w:val="768EADA2"/>
@@ -12559,7 +15286,7 @@
       </w:pPr>
     </w:lvl>
   </w:abstractNum>
-  <w:abstractNum w:abstractNumId="16" w15:restartNumberingAfterBreak="0">
+  <w:abstractNum w:abstractNumId="19" w15:restartNumberingAfterBreak="0">
     <w:nsid w:val="3AD06FD2"/>
     <w:multiLevelType w:val="multilevel"/>
     <w:tmpl w:val="3CC81D80"/>
@@ -12708,7 +15435,7 @@
       </w:rPr>
     </w:lvl>
   </w:abstractNum>
-  <w:abstractNum w:abstractNumId="17" w15:restartNumberingAfterBreak="0">
+  <w:abstractNum w:abstractNumId="20" w15:restartNumberingAfterBreak="0">
     <w:nsid w:val="3DAC2A76"/>
     <w:multiLevelType w:val="hybridMultilevel"/>
     <w:tmpl w:val="533A61F2"/>
@@ -12821,7 +15548,7 @@
       </w:rPr>
     </w:lvl>
   </w:abstractNum>
-  <w:abstractNum w:abstractNumId="18" w15:restartNumberingAfterBreak="0">
+  <w:abstractNum w:abstractNumId="21" w15:restartNumberingAfterBreak="0">
     <w:nsid w:val="43816EC9"/>
     <w:multiLevelType w:val="multilevel"/>
     <w:tmpl w:val="E1A4D0BE"/>
@@ -12934,7 +15661,7 @@
       </w:pPr>
     </w:lvl>
   </w:abstractNum>
-  <w:abstractNum w:abstractNumId="19" w15:restartNumberingAfterBreak="0">
+  <w:abstractNum w:abstractNumId="22" w15:restartNumberingAfterBreak="0">
     <w:nsid w:val="453F48B0"/>
     <w:multiLevelType w:val="multilevel"/>
     <w:tmpl w:val="AEB4B102"/>
@@ -13083,7 +15810,7 @@
       </w:rPr>
     </w:lvl>
   </w:abstractNum>
-  <w:abstractNum w:abstractNumId="20" w15:restartNumberingAfterBreak="0">
+  <w:abstractNum w:abstractNumId="23" w15:restartNumberingAfterBreak="0">
     <w:nsid w:val="4B541038"/>
     <w:multiLevelType w:val="multilevel"/>
     <w:tmpl w:val="24BCCDFE"/>
@@ -13200,7 +15927,7 @@
       </w:pPr>
     </w:lvl>
   </w:abstractNum>
-  <w:abstractNum w:abstractNumId="21" w15:restartNumberingAfterBreak="0">
+  <w:abstractNum w:abstractNumId="24" w15:restartNumberingAfterBreak="0">
     <w:nsid w:val="4B803365"/>
     <w:multiLevelType w:val="multilevel"/>
     <w:tmpl w:val="24BCCDFE"/>
@@ -13317,7 +16044,233 @@
       </w:pPr>
     </w:lvl>
   </w:abstractNum>
-  <w:abstractNum w:abstractNumId="22" w15:restartNumberingAfterBreak="0">
+  <w:abstractNum w:abstractNumId="25" w15:restartNumberingAfterBreak="0">
+    <w:nsid w:val="4C9D739F"/>
+    <w:multiLevelType w:val="hybridMultilevel"/>
+    <w:tmpl w:val="407C4612"/>
+    <w:lvl w:ilvl="0" w:tplc="10090001">
+      <w:start w:val="1"/>
+      <w:numFmt w:val="bullet"/>
+      <w:lvlText w:val=""/>
+      <w:lvlJc w:val="left"/>
+      <w:pPr>
+        <w:ind w:left="720" w:hanging="360"/>
+      </w:pPr>
+      <w:rPr>
+        <w:rFonts w:ascii="Symbol" w:hAnsi="Symbol" w:hint="default"/>
+      </w:rPr>
+    </w:lvl>
+    <w:lvl w:ilvl="1" w:tplc="10090003">
+      <w:start w:val="1"/>
+      <w:numFmt w:val="bullet"/>
+      <w:lvlText w:val="o"/>
+      <w:lvlJc w:val="left"/>
+      <w:pPr>
+        <w:ind w:left="1440" w:hanging="360"/>
+      </w:pPr>
+      <w:rPr>
+        <w:rFonts w:ascii="Courier New" w:hAnsi="Courier New" w:cs="Courier New" w:hint="default"/>
+      </w:rPr>
+    </w:lvl>
+    <w:lvl w:ilvl="2" w:tplc="10090005" w:tentative="1">
+      <w:start w:val="1"/>
+      <w:numFmt w:val="bullet"/>
+      <w:lvlText w:val=""/>
+      <w:lvlJc w:val="left"/>
+      <w:pPr>
+        <w:ind w:left="2160" w:hanging="360"/>
+      </w:pPr>
+      <w:rPr>
+        <w:rFonts w:ascii="Wingdings" w:hAnsi="Wingdings" w:hint="default"/>
+      </w:rPr>
+    </w:lvl>
+    <w:lvl w:ilvl="3" w:tplc="10090001" w:tentative="1">
+      <w:start w:val="1"/>
+      <w:numFmt w:val="bullet"/>
+      <w:lvlText w:val=""/>
+      <w:lvlJc w:val="left"/>
+      <w:pPr>
+        <w:ind w:left="2880" w:hanging="360"/>
+      </w:pPr>
+      <w:rPr>
+        <w:rFonts w:ascii="Symbol" w:hAnsi="Symbol" w:hint="default"/>
+      </w:rPr>
+    </w:lvl>
+    <w:lvl w:ilvl="4" w:tplc="10090003" w:tentative="1">
+      <w:start w:val="1"/>
+      <w:numFmt w:val="bullet"/>
+      <w:lvlText w:val="o"/>
+      <w:lvlJc w:val="left"/>
+      <w:pPr>
+        <w:ind w:left="3600" w:hanging="360"/>
+      </w:pPr>
+      <w:rPr>
+        <w:rFonts w:ascii="Courier New" w:hAnsi="Courier New" w:cs="Courier New" w:hint="default"/>
+      </w:rPr>
+    </w:lvl>
+    <w:lvl w:ilvl="5" w:tplc="10090005" w:tentative="1">
+      <w:start w:val="1"/>
+      <w:numFmt w:val="bullet"/>
+      <w:lvlText w:val=""/>
+      <w:lvlJc w:val="left"/>
+      <w:pPr>
+        <w:ind w:left="4320" w:hanging="360"/>
+      </w:pPr>
+      <w:rPr>
+        <w:rFonts w:ascii="Wingdings" w:hAnsi="Wingdings" w:hint="default"/>
+      </w:rPr>
+    </w:lvl>
+    <w:lvl w:ilvl="6" w:tplc="10090001" w:tentative="1">
+      <w:start w:val="1"/>
+      <w:numFmt w:val="bullet"/>
+      <w:lvlText w:val=""/>
+      <w:lvlJc w:val="left"/>
+      <w:pPr>
+        <w:ind w:left="5040" w:hanging="360"/>
+      </w:pPr>
+      <w:rPr>
+        <w:rFonts w:ascii="Symbol" w:hAnsi="Symbol" w:hint="default"/>
+      </w:rPr>
+    </w:lvl>
+    <w:lvl w:ilvl="7" w:tplc="10090003" w:tentative="1">
+      <w:start w:val="1"/>
+      <w:numFmt w:val="bullet"/>
+      <w:lvlText w:val="o"/>
+      <w:lvlJc w:val="left"/>
+      <w:pPr>
+        <w:ind w:left="5760" w:hanging="360"/>
+      </w:pPr>
+      <w:rPr>
+        <w:rFonts w:ascii="Courier New" w:hAnsi="Courier New" w:cs="Courier New" w:hint="default"/>
+      </w:rPr>
+    </w:lvl>
+    <w:lvl w:ilvl="8" w:tplc="10090005" w:tentative="1">
+      <w:start w:val="1"/>
+      <w:numFmt w:val="bullet"/>
+      <w:lvlText w:val=""/>
+      <w:lvlJc w:val="left"/>
+      <w:pPr>
+        <w:ind w:left="6480" w:hanging="360"/>
+      </w:pPr>
+      <w:rPr>
+        <w:rFonts w:ascii="Wingdings" w:hAnsi="Wingdings" w:hint="default"/>
+      </w:rPr>
+    </w:lvl>
+  </w:abstractNum>
+  <w:abstractNum w:abstractNumId="26" w15:restartNumberingAfterBreak="0">
+    <w:nsid w:val="5DA53AD2"/>
+    <w:multiLevelType w:val="multilevel"/>
+    <w:tmpl w:val="7A0E108C"/>
+    <w:lvl w:ilvl="0">
+      <w:start w:val="1"/>
+      <w:numFmt w:val="decimal"/>
+      <w:lvlText w:val="%1."/>
+      <w:lvlJc w:val="left"/>
+      <w:pPr>
+        <w:tabs>
+          <w:tab w:val="num" w:pos="720"/>
+        </w:tabs>
+        <w:ind w:left="720" w:hanging="360"/>
+      </w:pPr>
+    </w:lvl>
+    <w:lvl w:ilvl="1" w:tentative="1">
+      <w:start w:val="1"/>
+      <w:numFmt w:val="decimal"/>
+      <w:lvlText w:val="%2."/>
+      <w:lvlJc w:val="left"/>
+      <w:pPr>
+        <w:tabs>
+          <w:tab w:val="num" w:pos="1440"/>
+        </w:tabs>
+        <w:ind w:left="1440" w:hanging="360"/>
+      </w:pPr>
+    </w:lvl>
+    <w:lvl w:ilvl="2" w:tentative="1">
+      <w:start w:val="1"/>
+      <w:numFmt w:val="decimal"/>
+      <w:lvlText w:val="%3."/>
+      <w:lvlJc w:val="left"/>
+      <w:pPr>
+        <w:tabs>
+          <w:tab w:val="num" w:pos="2160"/>
+        </w:tabs>
+        <w:ind w:left="2160" w:hanging="360"/>
+      </w:pPr>
+    </w:lvl>
+    <w:lvl w:ilvl="3" w:tentative="1">
+      <w:start w:val="1"/>
+      <w:numFmt w:val="decimal"/>
+      <w:lvlText w:val="%4."/>
+      <w:lvlJc w:val="left"/>
+      <w:pPr>
+        <w:tabs>
+          <w:tab w:val="num" w:pos="2880"/>
+        </w:tabs>
+        <w:ind w:left="2880" w:hanging="360"/>
+      </w:pPr>
+    </w:lvl>
+    <w:lvl w:ilvl="4" w:tentative="1">
+      <w:start w:val="1"/>
+      <w:numFmt w:val="decimal"/>
+      <w:lvlText w:val="%5."/>
+      <w:lvlJc w:val="left"/>
+      <w:pPr>
+        <w:tabs>
+          <w:tab w:val="num" w:pos="3600"/>
+        </w:tabs>
+        <w:ind w:left="3600" w:hanging="360"/>
+      </w:pPr>
+    </w:lvl>
+    <w:lvl w:ilvl="5" w:tentative="1">
+      <w:start w:val="1"/>
+      <w:numFmt w:val="decimal"/>
+      <w:lvlText w:val="%6."/>
+      <w:lvlJc w:val="left"/>
+      <w:pPr>
+        <w:tabs>
+          <w:tab w:val="num" w:pos="4320"/>
+        </w:tabs>
+        <w:ind w:left="4320" w:hanging="360"/>
+      </w:pPr>
+    </w:lvl>
+    <w:lvl w:ilvl="6" w:tentative="1">
+      <w:start w:val="1"/>
+      <w:numFmt w:val="decimal"/>
+      <w:lvlText w:val="%7."/>
+      <w:lvlJc w:val="left"/>
+      <w:pPr>
+        <w:tabs>
+          <w:tab w:val="num" w:pos="5040"/>
+        </w:tabs>
+        <w:ind w:left="5040" w:hanging="360"/>
+      </w:pPr>
+    </w:lvl>
+    <w:lvl w:ilvl="7" w:tentative="1">
+      <w:start w:val="1"/>
+      <w:numFmt w:val="decimal"/>
+      <w:lvlText w:val="%8."/>
+      <w:lvlJc w:val="left"/>
+      <w:pPr>
+        <w:tabs>
+          <w:tab w:val="num" w:pos="5760"/>
+        </w:tabs>
+        <w:ind w:left="5760" w:hanging="360"/>
+      </w:pPr>
+    </w:lvl>
+    <w:lvl w:ilvl="8" w:tentative="1">
+      <w:start w:val="1"/>
+      <w:numFmt w:val="decimal"/>
+      <w:lvlText w:val="%9."/>
+      <w:lvlJc w:val="left"/>
+      <w:pPr>
+        <w:tabs>
+          <w:tab w:val="num" w:pos="6480"/>
+        </w:tabs>
+        <w:ind w:left="6480" w:hanging="360"/>
+      </w:pPr>
+    </w:lvl>
+  </w:abstractNum>
+  <w:abstractNum w:abstractNumId="27" w15:restartNumberingAfterBreak="0">
     <w:nsid w:val="5EEA7024"/>
     <w:multiLevelType w:val="hybridMultilevel"/>
     <w:tmpl w:val="AABA2528"/>
@@ -13406,7 +16359,7 @@
       </w:pPr>
     </w:lvl>
   </w:abstractNum>
-  <w:abstractNum w:abstractNumId="23" w15:restartNumberingAfterBreak="0">
+  <w:abstractNum w:abstractNumId="28" w15:restartNumberingAfterBreak="0">
     <w:nsid w:val="5FE34003"/>
     <w:multiLevelType w:val="multilevel"/>
     <w:tmpl w:val="DF4AD572"/>
@@ -13555,7 +16508,7 @@
       </w:rPr>
     </w:lvl>
   </w:abstractNum>
-  <w:abstractNum w:abstractNumId="24" w15:restartNumberingAfterBreak="0">
+  <w:abstractNum w:abstractNumId="29" w15:restartNumberingAfterBreak="0">
     <w:nsid w:val="67C821B7"/>
     <w:multiLevelType w:val="multilevel"/>
     <w:tmpl w:val="532C346E"/>
@@ -13704,7 +16657,120 @@
       </w:rPr>
     </w:lvl>
   </w:abstractNum>
-  <w:abstractNum w:abstractNumId="25" w15:restartNumberingAfterBreak="0">
+  <w:abstractNum w:abstractNumId="30" w15:restartNumberingAfterBreak="0">
+    <w:nsid w:val="6F294354"/>
+    <w:multiLevelType w:val="multilevel"/>
+    <w:tmpl w:val="6D163E16"/>
+    <w:lvl w:ilvl="0">
+      <w:start w:val="1"/>
+      <w:numFmt w:val="decimal"/>
+      <w:lvlText w:val="%1."/>
+      <w:lvlJc w:val="left"/>
+      <w:pPr>
+        <w:tabs>
+          <w:tab w:val="num" w:pos="720"/>
+        </w:tabs>
+        <w:ind w:left="720" w:hanging="360"/>
+      </w:pPr>
+    </w:lvl>
+    <w:lvl w:ilvl="1" w:tentative="1">
+      <w:start w:val="1"/>
+      <w:numFmt w:val="decimal"/>
+      <w:lvlText w:val="%2."/>
+      <w:lvlJc w:val="left"/>
+      <w:pPr>
+        <w:tabs>
+          <w:tab w:val="num" w:pos="1440"/>
+        </w:tabs>
+        <w:ind w:left="1440" w:hanging="360"/>
+      </w:pPr>
+    </w:lvl>
+    <w:lvl w:ilvl="2" w:tentative="1">
+      <w:start w:val="1"/>
+      <w:numFmt w:val="decimal"/>
+      <w:lvlText w:val="%3."/>
+      <w:lvlJc w:val="left"/>
+      <w:pPr>
+        <w:tabs>
+          <w:tab w:val="num" w:pos="2160"/>
+        </w:tabs>
+        <w:ind w:left="2160" w:hanging="360"/>
+      </w:pPr>
+    </w:lvl>
+    <w:lvl w:ilvl="3" w:tentative="1">
+      <w:start w:val="1"/>
+      <w:numFmt w:val="decimal"/>
+      <w:lvlText w:val="%4."/>
+      <w:lvlJc w:val="left"/>
+      <w:pPr>
+        <w:tabs>
+          <w:tab w:val="num" w:pos="2880"/>
+        </w:tabs>
+        <w:ind w:left="2880" w:hanging="360"/>
+      </w:pPr>
+    </w:lvl>
+    <w:lvl w:ilvl="4" w:tentative="1">
+      <w:start w:val="1"/>
+      <w:numFmt w:val="decimal"/>
+      <w:lvlText w:val="%5."/>
+      <w:lvlJc w:val="left"/>
+      <w:pPr>
+        <w:tabs>
+          <w:tab w:val="num" w:pos="3600"/>
+        </w:tabs>
+        <w:ind w:left="3600" w:hanging="360"/>
+      </w:pPr>
+    </w:lvl>
+    <w:lvl w:ilvl="5" w:tentative="1">
+      <w:start w:val="1"/>
+      <w:numFmt w:val="decimal"/>
+      <w:lvlText w:val="%6."/>
+      <w:lvlJc w:val="left"/>
+      <w:pPr>
+        <w:tabs>
+          <w:tab w:val="num" w:pos="4320"/>
+        </w:tabs>
+        <w:ind w:left="4320" w:hanging="360"/>
+      </w:pPr>
+    </w:lvl>
+    <w:lvl w:ilvl="6" w:tentative="1">
+      <w:start w:val="1"/>
+      <w:numFmt w:val="decimal"/>
+      <w:lvlText w:val="%7."/>
+      <w:lvlJc w:val="left"/>
+      <w:pPr>
+        <w:tabs>
+          <w:tab w:val="num" w:pos="5040"/>
+        </w:tabs>
+        <w:ind w:left="5040" w:hanging="360"/>
+      </w:pPr>
+    </w:lvl>
+    <w:lvl w:ilvl="7" w:tentative="1">
+      <w:start w:val="1"/>
+      <w:numFmt w:val="decimal"/>
+      <w:lvlText w:val="%8."/>
+      <w:lvlJc w:val="left"/>
+      <w:pPr>
+        <w:tabs>
+          <w:tab w:val="num" w:pos="5760"/>
+        </w:tabs>
+        <w:ind w:left="5760" w:hanging="360"/>
+      </w:pPr>
+    </w:lvl>
+    <w:lvl w:ilvl="8" w:tentative="1">
+      <w:start w:val="1"/>
+      <w:numFmt w:val="decimal"/>
+      <w:lvlText w:val="%9."/>
+      <w:lvlJc w:val="left"/>
+      <w:pPr>
+        <w:tabs>
+          <w:tab w:val="num" w:pos="6480"/>
+        </w:tabs>
+        <w:ind w:left="6480" w:hanging="360"/>
+      </w:pPr>
+    </w:lvl>
+  </w:abstractNum>
+  <w:abstractNum w:abstractNumId="31" w15:restartNumberingAfterBreak="0">
     <w:nsid w:val="77B815C1"/>
     <w:multiLevelType w:val="multilevel"/>
     <w:tmpl w:val="8F5C64D8"/>
@@ -13853,7 +16919,7 @@
       </w:rPr>
     </w:lvl>
   </w:abstractNum>
-  <w:abstractNum w:abstractNumId="26" w15:restartNumberingAfterBreak="0">
+  <w:abstractNum w:abstractNumId="32" w15:restartNumberingAfterBreak="0">
     <w:nsid w:val="786E5DA7"/>
     <w:multiLevelType w:val="hybridMultilevel"/>
     <w:tmpl w:val="1E96CCF8"/>
@@ -13966,7 +17032,7 @@
       </w:rPr>
     </w:lvl>
   </w:abstractNum>
-  <w:abstractNum w:abstractNumId="27" w15:restartNumberingAfterBreak="0">
+  <w:abstractNum w:abstractNumId="33" w15:restartNumberingAfterBreak="0">
     <w:nsid w:val="7912704F"/>
     <w:multiLevelType w:val="multilevel"/>
     <w:tmpl w:val="9EA0F730"/>
@@ -14115,7 +17181,7 @@
       </w:rPr>
     </w:lvl>
   </w:abstractNum>
-  <w:abstractNum w:abstractNumId="28" w15:restartNumberingAfterBreak="0">
+  <w:abstractNum w:abstractNumId="34" w15:restartNumberingAfterBreak="0">
     <w:nsid w:val="793778F5"/>
     <w:multiLevelType w:val="hybridMultilevel"/>
     <w:tmpl w:val="8F0C4A80"/>
@@ -14228,7 +17294,120 @@
       </w:rPr>
     </w:lvl>
   </w:abstractNum>
-  <w:abstractNum w:abstractNumId="29" w15:restartNumberingAfterBreak="0">
+  <w:abstractNum w:abstractNumId="35" w15:restartNumberingAfterBreak="0">
+    <w:nsid w:val="7A0E3BC7"/>
+    <w:multiLevelType w:val="multilevel"/>
+    <w:tmpl w:val="2878DBE2"/>
+    <w:lvl w:ilvl="0">
+      <w:start w:val="1"/>
+      <w:numFmt w:val="decimal"/>
+      <w:lvlText w:val="%1."/>
+      <w:lvlJc w:val="left"/>
+      <w:pPr>
+        <w:tabs>
+          <w:tab w:val="num" w:pos="720"/>
+        </w:tabs>
+        <w:ind w:left="720" w:hanging="360"/>
+      </w:pPr>
+    </w:lvl>
+    <w:lvl w:ilvl="1" w:tentative="1">
+      <w:start w:val="1"/>
+      <w:numFmt w:val="decimal"/>
+      <w:lvlText w:val="%2."/>
+      <w:lvlJc w:val="left"/>
+      <w:pPr>
+        <w:tabs>
+          <w:tab w:val="num" w:pos="1440"/>
+        </w:tabs>
+        <w:ind w:left="1440" w:hanging="360"/>
+      </w:pPr>
+    </w:lvl>
+    <w:lvl w:ilvl="2" w:tentative="1">
+      <w:start w:val="1"/>
+      <w:numFmt w:val="decimal"/>
+      <w:lvlText w:val="%3."/>
+      <w:lvlJc w:val="left"/>
+      <w:pPr>
+        <w:tabs>
+          <w:tab w:val="num" w:pos="2160"/>
+        </w:tabs>
+        <w:ind w:left="2160" w:hanging="360"/>
+      </w:pPr>
+    </w:lvl>
+    <w:lvl w:ilvl="3" w:tentative="1">
+      <w:start w:val="1"/>
+      <w:numFmt w:val="decimal"/>
+      <w:lvlText w:val="%4."/>
+      <w:lvlJc w:val="left"/>
+      <w:pPr>
+        <w:tabs>
+          <w:tab w:val="num" w:pos="2880"/>
+        </w:tabs>
+        <w:ind w:left="2880" w:hanging="360"/>
+      </w:pPr>
+    </w:lvl>
+    <w:lvl w:ilvl="4" w:tentative="1">
+      <w:start w:val="1"/>
+      <w:numFmt w:val="decimal"/>
+      <w:lvlText w:val="%5."/>
+      <w:lvlJc w:val="left"/>
+      <w:pPr>
+        <w:tabs>
+          <w:tab w:val="num" w:pos="3600"/>
+        </w:tabs>
+        <w:ind w:left="3600" w:hanging="360"/>
+      </w:pPr>
+    </w:lvl>
+    <w:lvl w:ilvl="5" w:tentative="1">
+      <w:start w:val="1"/>
+      <w:numFmt w:val="decimal"/>
+      <w:lvlText w:val="%6."/>
+      <w:lvlJc w:val="left"/>
+      <w:pPr>
+        <w:tabs>
+          <w:tab w:val="num" w:pos="4320"/>
+        </w:tabs>
+        <w:ind w:left="4320" w:hanging="360"/>
+      </w:pPr>
+    </w:lvl>
+    <w:lvl w:ilvl="6" w:tentative="1">
+      <w:start w:val="1"/>
+      <w:numFmt w:val="decimal"/>
+      <w:lvlText w:val="%7."/>
+      <w:lvlJc w:val="left"/>
+      <w:pPr>
+        <w:tabs>
+          <w:tab w:val="num" w:pos="5040"/>
+        </w:tabs>
+        <w:ind w:left="5040" w:hanging="360"/>
+      </w:pPr>
+    </w:lvl>
+    <w:lvl w:ilvl="7" w:tentative="1">
+      <w:start w:val="1"/>
+      <w:numFmt w:val="decimal"/>
+      <w:lvlText w:val="%8."/>
+      <w:lvlJc w:val="left"/>
+      <w:pPr>
+        <w:tabs>
+          <w:tab w:val="num" w:pos="5760"/>
+        </w:tabs>
+        <w:ind w:left="5760" w:hanging="360"/>
+      </w:pPr>
+    </w:lvl>
+    <w:lvl w:ilvl="8" w:tentative="1">
+      <w:start w:val="1"/>
+      <w:numFmt w:val="decimal"/>
+      <w:lvlText w:val="%9."/>
+      <w:lvlJc w:val="left"/>
+      <w:pPr>
+        <w:tabs>
+          <w:tab w:val="num" w:pos="6480"/>
+        </w:tabs>
+        <w:ind w:left="6480" w:hanging="360"/>
+      </w:pPr>
+    </w:lvl>
+  </w:abstractNum>
+  <w:abstractNum w:abstractNumId="36" w15:restartNumberingAfterBreak="0">
     <w:nsid w:val="7A1A11C2"/>
     <w:multiLevelType w:val="multilevel"/>
     <w:tmpl w:val="F8E2C328"/>
@@ -14377,7 +17556,7 @@
       </w:rPr>
     </w:lvl>
   </w:abstractNum>
-  <w:abstractNum w:abstractNumId="30" w15:restartNumberingAfterBreak="0">
+  <w:abstractNum w:abstractNumId="37" w15:restartNumberingAfterBreak="0">
     <w:nsid w:val="7B45478C"/>
     <w:multiLevelType w:val="multilevel"/>
     <w:tmpl w:val="172AF74E"/>
@@ -14526,7 +17705,7 @@
       </w:rPr>
     </w:lvl>
   </w:abstractNum>
-  <w:abstractNum w:abstractNumId="31" w15:restartNumberingAfterBreak="0">
+  <w:abstractNum w:abstractNumId="38" w15:restartNumberingAfterBreak="0">
     <w:nsid w:val="7C633FCE"/>
     <w:multiLevelType w:val="multilevel"/>
     <w:tmpl w:val="24BCCDFE"/>
@@ -14644,100 +17823,121 @@
     </w:lvl>
   </w:abstractNum>
   <w:num w:numId="1" w16cid:durableId="1212882090">
+    <w:abstractNumId w:val="27"/>
+  </w:num>
+  <w:num w:numId="2" w16cid:durableId="1119959067">
+    <w:abstractNumId w:val="15"/>
+  </w:num>
+  <w:num w:numId="3" w16cid:durableId="322513659">
+    <w:abstractNumId w:val="37"/>
+  </w:num>
+  <w:num w:numId="4" w16cid:durableId="172915269">
+    <w:abstractNumId w:val="3"/>
+  </w:num>
+  <w:num w:numId="5" w16cid:durableId="201405766">
+    <w:abstractNumId w:val="32"/>
+  </w:num>
+  <w:num w:numId="6" w16cid:durableId="1156267990">
+    <w:abstractNumId w:val="21"/>
+  </w:num>
+  <w:num w:numId="7" w16cid:durableId="589505510">
+    <w:abstractNumId w:val="4"/>
+  </w:num>
+  <w:num w:numId="8" w16cid:durableId="500051174">
+    <w:abstractNumId w:val="13"/>
+  </w:num>
+  <w:num w:numId="9" w16cid:durableId="651830634">
+    <w:abstractNumId w:val="38"/>
+  </w:num>
+  <w:num w:numId="10" w16cid:durableId="841895827">
+    <w:abstractNumId w:val="34"/>
+  </w:num>
+  <w:num w:numId="11" w16cid:durableId="2122918639">
+    <w:abstractNumId w:val="12"/>
+  </w:num>
+  <w:num w:numId="12" w16cid:durableId="164983286">
+    <w:abstractNumId w:val="24"/>
+  </w:num>
+  <w:num w:numId="13" w16cid:durableId="582690670">
+    <w:abstractNumId w:val="31"/>
+  </w:num>
+  <w:num w:numId="14" w16cid:durableId="264189441">
+    <w:abstractNumId w:val="28"/>
+  </w:num>
+  <w:num w:numId="15" w16cid:durableId="1577714169">
+    <w:abstractNumId w:val="23"/>
+  </w:num>
+  <w:num w:numId="16" w16cid:durableId="1429741216">
+    <w:abstractNumId w:val="18"/>
+  </w:num>
+  <w:num w:numId="17" w16cid:durableId="1176727730">
+    <w:abstractNumId w:val="10"/>
+  </w:num>
+  <w:num w:numId="18" w16cid:durableId="1618371638">
+    <w:abstractNumId w:val="1"/>
+  </w:num>
+  <w:num w:numId="19" w16cid:durableId="264003664">
+    <w:abstractNumId w:val="19"/>
+  </w:num>
+  <w:num w:numId="20" w16cid:durableId="373120343">
+    <w:abstractNumId w:val="9"/>
+  </w:num>
+  <w:num w:numId="21" w16cid:durableId="1144279345">
+    <w:abstractNumId w:val="16"/>
+  </w:num>
+  <w:num w:numId="22" w16cid:durableId="465588484">
+    <w:abstractNumId w:val="20"/>
+  </w:num>
+  <w:num w:numId="23" w16cid:durableId="729421856">
+    <w:abstractNumId w:val="7"/>
+  </w:num>
+  <w:num w:numId="24" w16cid:durableId="1366057816">
+    <w:abstractNumId w:val="33"/>
+  </w:num>
+  <w:num w:numId="25" w16cid:durableId="1433428595">
+    <w:abstractNumId w:val="29"/>
+  </w:num>
+  <w:num w:numId="26" w16cid:durableId="687368329">
+    <w:abstractNumId w:val="8"/>
+  </w:num>
+  <w:num w:numId="27" w16cid:durableId="513543965">
+    <w:abstractNumId w:val="5"/>
+  </w:num>
+  <w:num w:numId="28" w16cid:durableId="1143740170">
+    <w:abstractNumId w:val="36"/>
+  </w:num>
+  <w:num w:numId="29" w16cid:durableId="476342647">
+    <w:abstractNumId w:val="2"/>
+  </w:num>
+  <w:num w:numId="30" w16cid:durableId="205289970">
     <w:abstractNumId w:val="22"/>
   </w:num>
-  <w:num w:numId="2" w16cid:durableId="1119959067">
-    <w:abstractNumId w:val="13"/>
+  <w:num w:numId="31" w16cid:durableId="1179277601">
+    <w:abstractNumId w:val="14"/>
   </w:num>
-  <w:num w:numId="3" w16cid:durableId="322513659">
+  <w:num w:numId="32" w16cid:durableId="2048213906">
+    <w:abstractNumId w:val="11"/>
+  </w:num>
+  <w:num w:numId="33" w16cid:durableId="220797351">
+    <w:abstractNumId w:val="35"/>
+  </w:num>
+  <w:num w:numId="34" w16cid:durableId="392504169">
+    <w:abstractNumId w:val="17"/>
+  </w:num>
+  <w:num w:numId="35" w16cid:durableId="681902629">
+    <w:abstractNumId w:val="26"/>
+  </w:num>
+  <w:num w:numId="36" w16cid:durableId="782727131">
     <w:abstractNumId w:val="30"/>
   </w:num>
-  <w:num w:numId="4" w16cid:durableId="172915269">
-    <w:abstractNumId w:val="2"/>
-  </w:num>
-  <w:num w:numId="5" w16cid:durableId="201405766">
-    <w:abstractNumId w:val="26"/>
-  </w:num>
-  <w:num w:numId="6" w16cid:durableId="1156267990">
-    <w:abstractNumId w:val="18"/>
-  </w:num>
-  <w:num w:numId="7" w16cid:durableId="589505510">
-    <w:abstractNumId w:val="3"/>
-  </w:num>
-  <w:num w:numId="8" w16cid:durableId="500051174">
-    <w:abstractNumId w:val="11"/>
-  </w:num>
-  <w:num w:numId="9" w16cid:durableId="651830634">
-    <w:abstractNumId w:val="31"/>
-  </w:num>
-  <w:num w:numId="10" w16cid:durableId="841895827">
-    <w:abstractNumId w:val="28"/>
-  </w:num>
-  <w:num w:numId="11" w16cid:durableId="2122918639">
-    <w:abstractNumId w:val="10"/>
-  </w:num>
-  <w:num w:numId="12" w16cid:durableId="164983286">
-    <w:abstractNumId w:val="21"/>
-  </w:num>
-  <w:num w:numId="13" w16cid:durableId="582690670">
-    <w:abstractNumId w:val="25"/>
-  </w:num>
-  <w:num w:numId="14" w16cid:durableId="264189441">
-    <w:abstractNumId w:val="23"/>
-  </w:num>
-  <w:num w:numId="15" w16cid:durableId="1577714169">
-    <w:abstractNumId w:val="20"/>
-  </w:num>
-  <w:num w:numId="16" w16cid:durableId="1429741216">
-    <w:abstractNumId w:val="15"/>
-  </w:num>
-  <w:num w:numId="17" w16cid:durableId="1176727730">
-    <w:abstractNumId w:val="8"/>
-  </w:num>
-  <w:num w:numId="18" w16cid:durableId="1618371638">
+  <w:num w:numId="37" w16cid:durableId="975062067">
     <w:abstractNumId w:val="0"/>
   </w:num>
-  <w:num w:numId="19" w16cid:durableId="264003664">
-    <w:abstractNumId w:val="16"/>
-  </w:num>
-  <w:num w:numId="20" w16cid:durableId="373120343">
-    <w:abstractNumId w:val="7"/>
-  </w:num>
-  <w:num w:numId="21" w16cid:durableId="1144279345">
-    <w:abstractNumId w:val="14"/>
-  </w:num>
-  <w:num w:numId="22" w16cid:durableId="465588484">
-    <w:abstractNumId w:val="17"/>
-  </w:num>
-  <w:num w:numId="23" w16cid:durableId="729421856">
-    <w:abstractNumId w:val="5"/>
-  </w:num>
-  <w:num w:numId="24" w16cid:durableId="1366057816">
-    <w:abstractNumId w:val="27"/>
-  </w:num>
-  <w:num w:numId="25" w16cid:durableId="1433428595">
-    <w:abstractNumId w:val="24"/>
-  </w:num>
-  <w:num w:numId="26" w16cid:durableId="687368329">
+  <w:num w:numId="38" w16cid:durableId="1814565015">
     <w:abstractNumId w:val="6"/>
   </w:num>
-  <w:num w:numId="27" w16cid:durableId="513543965">
-    <w:abstractNumId w:val="4"/>
-  </w:num>
-  <w:num w:numId="28" w16cid:durableId="1143740170">
-    <w:abstractNumId w:val="29"/>
-  </w:num>
-  <w:num w:numId="29" w16cid:durableId="476342647">
-    <w:abstractNumId w:val="1"/>
-  </w:num>
-  <w:num w:numId="30" w16cid:durableId="205289970">
-    <w:abstractNumId w:val="19"/>
-  </w:num>
-  <w:num w:numId="31" w16cid:durableId="1179277601">
-    <w:abstractNumId w:val="12"/>
-  </w:num>
-  <w:num w:numId="32" w16cid:durableId="2048213906">
-    <w:abstractNumId w:val="9"/>
+  <w:num w:numId="39" w16cid:durableId="659043209">
+    <w:abstractNumId w:val="25"/>
   </w:num>
 </w:numbering>
 </file>
@@ -15762,6 +18962,31 @@
       <w:ind w:left="480"/>
     </w:pPr>
   </w:style>
+  <w:style w:type="character" w:styleId="FollowedHyperlink">
+    <w:name w:val="FollowedHyperlink"/>
+    <w:basedOn w:val="DefaultParagraphFont"/>
+    <w:uiPriority w:val="99"/>
+    <w:semiHidden/>
+    <w:unhideWhenUsed/>
+    <w:rsid w:val="004E71FB"/>
+    <w:rPr>
+      <w:color w:val="954F72" w:themeColor="followedHyperlink"/>
+      <w:u w:val="single"/>
+    </w:rPr>
+  </w:style>
+  <w:style w:type="character" w:styleId="HTMLCode">
+    <w:name w:val="HTML Code"/>
+    <w:basedOn w:val="DefaultParagraphFont"/>
+    <w:uiPriority w:val="99"/>
+    <w:semiHidden/>
+    <w:unhideWhenUsed/>
+    <w:rsid w:val="00A370A0"/>
+    <w:rPr>
+      <w:rFonts w:ascii="Courier New" w:eastAsia="Times New Roman" w:hAnsi="Courier New" w:cs="Courier New"/>
+      <w:sz w:val="20"/>
+      <w:szCs w:val="20"/>
+    </w:rPr>
+  </w:style>
 </w:styles>
 </file>
 

</xml_diff>

<commit_message>
Implemented Mock authentication and authorization
</commit_message>
<xml_diff>
--- a/docs/poc_notes.docx
+++ b/docs/poc_notes.docx
@@ -264,7 +264,21 @@
                 <w:rStyle w:val="Hyperlink"/>
                 <w:noProof/>
               </w:rPr>
-              <w:t>2. Configure Entra ID: MFA (Security Defaults) + App Roles</w:t>
+              <w:t>2. Configure Entra ID: M</w:t>
+            </w:r>
+            <w:r>
+              <w:rPr>
+                <w:rStyle w:val="Hyperlink"/>
+                <w:noProof/>
+              </w:rPr>
+              <w:t>F</w:t>
+            </w:r>
+            <w:r>
+              <w:rPr>
+                <w:rStyle w:val="Hyperlink"/>
+                <w:noProof/>
+              </w:rPr>
+              <w:t>A (Security Defaults) + App Roles</w:t>
             </w:r>
             <w:r>
               <w:rPr>
@@ -441,7 +455,7 @@
                 <w:noProof/>
                 <w:webHidden/>
               </w:rPr>
-              <w:t>3</w:t>
+              <w:t>4</w:t>
             </w:r>
             <w:r>
               <w:rPr>
@@ -645,7 +659,7 @@
                 <w:noProof/>
                 <w:webHidden/>
               </w:rPr>
-              <w:t>4</w:t>
+              <w:t>5</w:t>
             </w:r>
             <w:r>
               <w:rPr>
@@ -781,7 +795,7 @@
                 <w:noProof/>
                 <w:webHidden/>
               </w:rPr>
-              <w:t>5</w:t>
+              <w:t>6</w:t>
             </w:r>
             <w:r>
               <w:rPr>
@@ -849,7 +863,7 @@
                 <w:noProof/>
                 <w:webHidden/>
               </w:rPr>
-              <w:t>5</w:t>
+              <w:t>6</w:t>
             </w:r>
             <w:r>
               <w:rPr>
@@ -917,7 +931,7 @@
                 <w:noProof/>
                 <w:webHidden/>
               </w:rPr>
-              <w:t>5</w:t>
+              <w:t>6</w:t>
             </w:r>
             <w:r>
               <w:rPr>
@@ -985,7 +999,7 @@
                 <w:noProof/>
                 <w:webHidden/>
               </w:rPr>
-              <w:t>5</w:t>
+              <w:t>6</w:t>
             </w:r>
             <w:r>
               <w:rPr>
@@ -1053,7 +1067,7 @@
                 <w:noProof/>
                 <w:webHidden/>
               </w:rPr>
-              <w:t>6</w:t>
+              <w:t>7</w:t>
             </w:r>
             <w:r>
               <w:rPr>
@@ -1121,7 +1135,7 @@
                 <w:noProof/>
                 <w:webHidden/>
               </w:rPr>
-              <w:t>7</w:t>
+              <w:t>8</w:t>
             </w:r>
             <w:r>
               <w:rPr>
@@ -1189,7 +1203,7 @@
                 <w:noProof/>
                 <w:webHidden/>
               </w:rPr>
-              <w:t>7</w:t>
+              <w:t>9</w:t>
             </w:r>
             <w:r>
               <w:rPr>
@@ -1266,7 +1280,7 @@
                 <w:noProof/>
                 <w:webHidden/>
               </w:rPr>
-              <w:t>8</w:t>
+              <w:t>9</w:t>
             </w:r>
             <w:r>
               <w:rPr>
@@ -1334,7 +1348,7 @@
                 <w:noProof/>
                 <w:webHidden/>
               </w:rPr>
-              <w:t>8</w:t>
+              <w:t>10</w:t>
             </w:r>
             <w:r>
               <w:rPr>
@@ -1402,7 +1416,7 @@
                 <w:noProof/>
                 <w:webHidden/>
               </w:rPr>
-              <w:t>8</w:t>
+              <w:t>10</w:t>
             </w:r>
             <w:r>
               <w:rPr>
@@ -1470,7 +1484,7 @@
                 <w:noProof/>
                 <w:webHidden/>
               </w:rPr>
-              <w:t>9</w:t>
+              <w:t>12</w:t>
             </w:r>
             <w:r>
               <w:rPr>
@@ -1538,7 +1552,7 @@
                 <w:noProof/>
                 <w:webHidden/>
               </w:rPr>
-              <w:t>9</w:t>
+              <w:t>12</w:t>
             </w:r>
             <w:r>
               <w:rPr>
@@ -1615,7 +1629,7 @@
                 <w:noProof/>
                 <w:webHidden/>
               </w:rPr>
-              <w:t>9</w:t>
+              <w:t>12</w:t>
             </w:r>
             <w:r>
               <w:rPr>
@@ -1692,7 +1706,7 @@
                 <w:noProof/>
                 <w:webHidden/>
               </w:rPr>
-              <w:t>10</w:t>
+              <w:t>13</w:t>
             </w:r>
             <w:r>
               <w:rPr>
@@ -1769,7 +1783,7 @@
                 <w:noProof/>
                 <w:webHidden/>
               </w:rPr>
-              <w:t>12</w:t>
+              <w:t>15</w:t>
             </w:r>
             <w:r>
               <w:rPr>
@@ -1837,7 +1851,7 @@
                 <w:noProof/>
                 <w:webHidden/>
               </w:rPr>
-              <w:t>14</w:t>
+              <w:t>20</w:t>
             </w:r>
             <w:r>
               <w:rPr>
@@ -1905,7 +1919,7 @@
                 <w:noProof/>
                 <w:webHidden/>
               </w:rPr>
-              <w:t>14</w:t>
+              <w:t>20</w:t>
             </w:r>
             <w:r>
               <w:rPr>
@@ -1973,7 +1987,7 @@
                 <w:noProof/>
                 <w:webHidden/>
               </w:rPr>
-              <w:t>14</w:t>
+              <w:t>20</w:t>
             </w:r>
             <w:r>
               <w:rPr>
@@ -2041,7 +2055,7 @@
                 <w:noProof/>
                 <w:webHidden/>
               </w:rPr>
-              <w:t>15</w:t>
+              <w:t>20</w:t>
             </w:r>
             <w:r>
               <w:rPr>
@@ -2109,7 +2123,7 @@
                 <w:noProof/>
                 <w:webHidden/>
               </w:rPr>
-              <w:t>17</w:t>
+              <w:t>24</w:t>
             </w:r>
             <w:r>
               <w:rPr>
@@ -2177,7 +2191,7 @@
                 <w:noProof/>
                 <w:webHidden/>
               </w:rPr>
-              <w:t>17</w:t>
+              <w:t>24</w:t>
             </w:r>
             <w:r>
               <w:rPr>
@@ -2245,7 +2259,7 @@
                 <w:noProof/>
                 <w:webHidden/>
               </w:rPr>
-              <w:t>17</w:t>
+              <w:t>24</w:t>
             </w:r>
             <w:r>
               <w:rPr>
@@ -2313,7 +2327,7 @@
                 <w:noProof/>
                 <w:webHidden/>
               </w:rPr>
-              <w:t>17</w:t>
+              <w:t>24</w:t>
             </w:r>
             <w:r>
               <w:rPr>
@@ -2381,7 +2395,7 @@
                 <w:noProof/>
                 <w:webHidden/>
               </w:rPr>
-              <w:t>18</w:t>
+              <w:t>25</w:t>
             </w:r>
             <w:r>
               <w:rPr>
@@ -3915,7 +3929,7 @@
           <v:shape id="_x0000_i1025" type="#_x0000_t75" style="width:75.65pt;height:49.55pt" o:ole="">
             <v:imagedata r:id="rId9" o:title=""/>
           </v:shape>
-          <o:OLEObject Type="Embed" ProgID="Package" ShapeID="_x0000_i1025" DrawAspect="Icon" ObjectID="_1836244740" r:id="rId10"/>
+          <o:OLEObject Type="Embed" ProgID="Package" ShapeID="_x0000_i1025" DrawAspect="Icon" ObjectID="_1836292669" r:id="rId10"/>
         </w:object>
       </w:r>
     </w:p>
@@ -3948,7 +3962,7 @@
           <v:shape id="_x0000_i1026" type="#_x0000_t75" style="width:75.65pt;height:49.55pt" o:ole="">
             <v:imagedata r:id="rId11" o:title=""/>
           </v:shape>
-          <o:OLEObject Type="Embed" ProgID="Package" ShapeID="_x0000_i1026" DrawAspect="Icon" ObjectID="_1836244741" r:id="rId12"/>
+          <o:OLEObject Type="Embed" ProgID="Package" ShapeID="_x0000_i1026" DrawAspect="Icon" ObjectID="_1836292670" r:id="rId12"/>
         </w:object>
       </w:r>
     </w:p>
@@ -4024,7 +4038,7 @@
           <v:shape id="_x0000_i1027" type="#_x0000_t75" style="width:75.65pt;height:49.55pt" o:ole="">
             <v:imagedata r:id="rId14" o:title=""/>
           </v:shape>
-          <o:OLEObject Type="Embed" ProgID="Package" ShapeID="_x0000_i1027" DrawAspect="Icon" ObjectID="_1836244742" r:id="rId15"/>
+          <o:OLEObject Type="Embed" ProgID="Package" ShapeID="_x0000_i1027" DrawAspect="Icon" ObjectID="_1836292671" r:id="rId15"/>
         </w:object>
       </w:r>
     </w:p>
@@ -4100,7 +4114,7 @@
           <v:shape id="_x0000_i1028" type="#_x0000_t75" style="width:75.65pt;height:49.55pt" o:ole="">
             <v:imagedata r:id="rId17" o:title=""/>
           </v:shape>
-          <o:OLEObject Type="Embed" ProgID="Package" ShapeID="_x0000_i1028" DrawAspect="Icon" ObjectID="_1836244743" r:id="rId18"/>
+          <o:OLEObject Type="Embed" ProgID="Package" ShapeID="_x0000_i1028" DrawAspect="Icon" ObjectID="_1836292672" r:id="rId18"/>
         </w:object>
       </w:r>
     </w:p>
@@ -12774,22 +12788,31 @@
       </w:tr>
     </w:tbl>
     <w:p/>
-    <w:p/>
+    <w:p>
+      <w:pPr>
+        <w:pStyle w:val="Heading1"/>
+      </w:pPr>
+      <w:r>
+        <w:t>7. Mock Authentication and Authorization</w:t>
+      </w:r>
+    </w:p>
+    <w:p>
+      <w:r>
+        <w:t xml:space="preserve">See </w:t>
+      </w:r>
+      <w:r>
+        <w:rPr>
+          <w:b/>
+          <w:bCs/>
+        </w:rPr>
+        <w:t>docs/mock-authentication.md</w:t>
+      </w:r>
+    </w:p>
     <w:p>
       <w:r>
         <w:t xml:space="preserve"> </w:t>
       </w:r>
     </w:p>
-    <w:p/>
-    <w:p/>
-    <w:p/>
-    <w:p/>
-    <w:p/>
-    <w:p/>
-    <w:p/>
-    <w:p/>
-    <w:p/>
-    <w:p/>
     <w:p/>
     <w:sectPr>
       <w:pgSz w:w="15840" w:h="12240" w:orient="landscape"/>

</xml_diff>

<commit_message>
Implementated the solution of Spring profile-based mock authentication / authorization. Do not use for now. Decide later.
</commit_message>
<xml_diff>
--- a/docs/poc_notes.docx
+++ b/docs/poc_notes.docx
@@ -39,7 +39,7 @@
           <w:pPr>
             <w:pStyle w:val="TOC1"/>
             <w:tabs>
-              <w:tab w:val="right" w:leader="dot" w:pos="10338"/>
+              <w:tab w:val="right" w:leader="dot" w:pos="13844"/>
             </w:tabs>
             <w:rPr>
               <w:noProof/>
@@ -54,7 +54,7 @@
           <w:r>
             <w:fldChar w:fldCharType="separate"/>
           </w:r>
-          <w:hyperlink w:anchor="_Toc225115670" w:history="1">
+          <w:hyperlink w:anchor="_Toc225694754" w:history="1">
             <w:r>
               <w:rPr>
                 <w:rStyle w:val="Hyperlink"/>
@@ -81,7 +81,7 @@
                 <w:noProof/>
                 <w:webHidden/>
               </w:rPr>
-              <w:instrText xml:space="preserve"> PAGEREF _Toc225115670 \h </w:instrText>
+              <w:instrText xml:space="preserve"> PAGEREF _Toc225694754 \h </w:instrText>
             </w:r>
             <w:r>
               <w:rPr>
@@ -116,13 +116,13 @@
           <w:pPr>
             <w:pStyle w:val="TOC2"/>
             <w:tabs>
-              <w:tab w:val="right" w:leader="dot" w:pos="10338"/>
+              <w:tab w:val="right" w:leader="dot" w:pos="13844"/>
             </w:tabs>
             <w:rPr>
               <w:noProof/>
             </w:rPr>
           </w:pPr>
-          <w:hyperlink w:anchor="_Toc225115671" w:history="1">
+          <w:hyperlink w:anchor="_Toc225694755" w:history="1">
             <w:r>
               <w:rPr>
                 <w:rStyle w:val="Hyperlink"/>
@@ -149,7 +149,7 @@
                 <w:noProof/>
                 <w:webHidden/>
               </w:rPr>
-              <w:instrText xml:space="preserve"> PAGEREF _Toc225115671 \h </w:instrText>
+              <w:instrText xml:space="preserve"> PAGEREF _Toc225694755 \h </w:instrText>
             </w:r>
             <w:r>
               <w:rPr>
@@ -184,13 +184,13 @@
           <w:pPr>
             <w:pStyle w:val="TOC2"/>
             <w:tabs>
-              <w:tab w:val="right" w:leader="dot" w:pos="10338"/>
+              <w:tab w:val="right" w:leader="dot" w:pos="13844"/>
             </w:tabs>
             <w:rPr>
               <w:noProof/>
             </w:rPr>
           </w:pPr>
-          <w:hyperlink w:anchor="_Toc225115672" w:history="1">
+          <w:hyperlink w:anchor="_Toc225694756" w:history="1">
             <w:r>
               <w:rPr>
                 <w:rStyle w:val="Hyperlink"/>
@@ -217,7 +217,7 @@
                 <w:noProof/>
                 <w:webHidden/>
               </w:rPr>
-              <w:instrText xml:space="preserve"> PAGEREF _Toc225115672 \h </w:instrText>
+              <w:instrText xml:space="preserve"> PAGEREF _Toc225694756 \h </w:instrText>
             </w:r>
             <w:r>
               <w:rPr>
@@ -252,33 +252,19 @@
           <w:pPr>
             <w:pStyle w:val="TOC1"/>
             <w:tabs>
-              <w:tab w:val="right" w:leader="dot" w:pos="10338"/>
+              <w:tab w:val="right" w:leader="dot" w:pos="13844"/>
             </w:tabs>
             <w:rPr>
               <w:noProof/>
             </w:rPr>
           </w:pPr>
-          <w:hyperlink w:anchor="_Toc225115673" w:history="1">
+          <w:hyperlink w:anchor="_Toc225694757" w:history="1">
             <w:r>
               <w:rPr>
                 <w:rStyle w:val="Hyperlink"/>
                 <w:noProof/>
               </w:rPr>
-              <w:t>2. Configure Entra ID: M</w:t>
-            </w:r>
-            <w:r>
-              <w:rPr>
-                <w:rStyle w:val="Hyperlink"/>
-                <w:noProof/>
-              </w:rPr>
-              <w:t>F</w:t>
-            </w:r>
-            <w:r>
-              <w:rPr>
-                <w:rStyle w:val="Hyperlink"/>
-                <w:noProof/>
-              </w:rPr>
-              <w:t>A (Security Defaults) + App Roles</w:t>
+              <w:t>2. Configure Entra ID: MFA (Security Defaults) + App Roles</w:t>
             </w:r>
             <w:r>
               <w:rPr>
@@ -299,7 +285,7 @@
                 <w:noProof/>
                 <w:webHidden/>
               </w:rPr>
-              <w:instrText xml:space="preserve"> PAGEREF _Toc225115673 \h </w:instrText>
+              <w:instrText xml:space="preserve"> PAGEREF _Toc225694757 \h </w:instrText>
             </w:r>
             <w:r>
               <w:rPr>
@@ -334,13 +320,13 @@
           <w:pPr>
             <w:pStyle w:val="TOC2"/>
             <w:tabs>
-              <w:tab w:val="right" w:leader="dot" w:pos="10338"/>
+              <w:tab w:val="right" w:leader="dot" w:pos="13844"/>
             </w:tabs>
             <w:rPr>
               <w:noProof/>
             </w:rPr>
           </w:pPr>
-          <w:hyperlink w:anchor="_Toc225115674" w:history="1">
+          <w:hyperlink w:anchor="_Toc225694758" w:history="1">
             <w:r>
               <w:rPr>
                 <w:rStyle w:val="Hyperlink"/>
@@ -367,7 +353,7 @@
                 <w:noProof/>
                 <w:webHidden/>
               </w:rPr>
-              <w:instrText xml:space="preserve"> PAGEREF _Toc225115674 \h </w:instrText>
+              <w:instrText xml:space="preserve"> PAGEREF _Toc225694758 \h </w:instrText>
             </w:r>
             <w:r>
               <w:rPr>
@@ -402,13 +388,13 @@
           <w:pPr>
             <w:pStyle w:val="TOC2"/>
             <w:tabs>
-              <w:tab w:val="right" w:leader="dot" w:pos="10338"/>
+              <w:tab w:val="right" w:leader="dot" w:pos="13844"/>
             </w:tabs>
             <w:rPr>
               <w:noProof/>
             </w:rPr>
           </w:pPr>
-          <w:hyperlink w:anchor="_Toc225115675" w:history="1">
+          <w:hyperlink w:anchor="_Toc225694759" w:history="1">
             <w:r>
               <w:rPr>
                 <w:rStyle w:val="Hyperlink"/>
@@ -435,7 +421,7 @@
                 <w:noProof/>
                 <w:webHidden/>
               </w:rPr>
-              <w:instrText xml:space="preserve"> PAGEREF _Toc225115675 \h </w:instrText>
+              <w:instrText xml:space="preserve"> PAGEREF _Toc225694759 \h </w:instrText>
             </w:r>
             <w:r>
               <w:rPr>
@@ -470,13 +456,13 @@
           <w:pPr>
             <w:pStyle w:val="TOC2"/>
             <w:tabs>
-              <w:tab w:val="right" w:leader="dot" w:pos="10338"/>
+              <w:tab w:val="right" w:leader="dot" w:pos="13844"/>
             </w:tabs>
             <w:rPr>
               <w:noProof/>
             </w:rPr>
           </w:pPr>
-          <w:hyperlink w:anchor="_Toc225115676" w:history="1">
+          <w:hyperlink w:anchor="_Toc225694760" w:history="1">
             <w:r>
               <w:rPr>
                 <w:rStyle w:val="Hyperlink"/>
@@ -503,7 +489,7 @@
                 <w:noProof/>
                 <w:webHidden/>
               </w:rPr>
-              <w:instrText xml:space="preserve"> PAGEREF _Toc225115676 \h </w:instrText>
+              <w:instrText xml:space="preserve"> PAGEREF _Toc225694760 \h </w:instrText>
             </w:r>
             <w:r>
               <w:rPr>
@@ -538,13 +524,13 @@
           <w:pPr>
             <w:pStyle w:val="TOC3"/>
             <w:tabs>
-              <w:tab w:val="right" w:leader="dot" w:pos="10338"/>
+              <w:tab w:val="right" w:leader="dot" w:pos="13844"/>
             </w:tabs>
             <w:rPr>
               <w:noProof/>
             </w:rPr>
           </w:pPr>
-          <w:hyperlink w:anchor="_Toc225115677" w:history="1">
+          <w:hyperlink w:anchor="_Toc225694761" w:history="1">
             <w:r>
               <w:rPr>
                 <w:rStyle w:val="Hyperlink"/>
@@ -571,7 +557,7 @@
                 <w:noProof/>
                 <w:webHidden/>
               </w:rPr>
-              <w:instrText xml:space="preserve"> PAGEREF _Toc225115677 \h </w:instrText>
+              <w:instrText xml:space="preserve"> PAGEREF _Toc225694761 \h </w:instrText>
             </w:r>
             <w:r>
               <w:rPr>
@@ -606,13 +592,13 @@
           <w:pPr>
             <w:pStyle w:val="TOC3"/>
             <w:tabs>
-              <w:tab w:val="right" w:leader="dot" w:pos="10338"/>
+              <w:tab w:val="right" w:leader="dot" w:pos="13844"/>
             </w:tabs>
             <w:rPr>
               <w:noProof/>
             </w:rPr>
           </w:pPr>
-          <w:hyperlink w:anchor="_Toc225115678" w:history="1">
+          <w:hyperlink w:anchor="_Toc225694762" w:history="1">
             <w:r>
               <w:rPr>
                 <w:rStyle w:val="Hyperlink"/>
@@ -639,7 +625,7 @@
                 <w:noProof/>
                 <w:webHidden/>
               </w:rPr>
-              <w:instrText xml:space="preserve"> PAGEREF _Toc225115678 \h </w:instrText>
+              <w:instrText xml:space="preserve"> PAGEREF _Toc225694762 \h </w:instrText>
             </w:r>
             <w:r>
               <w:rPr>
@@ -674,13 +660,13 @@
           <w:pPr>
             <w:pStyle w:val="TOC2"/>
             <w:tabs>
-              <w:tab w:val="right" w:leader="dot" w:pos="10338"/>
+              <w:tab w:val="right" w:leader="dot" w:pos="13844"/>
             </w:tabs>
             <w:rPr>
               <w:noProof/>
             </w:rPr>
           </w:pPr>
-          <w:hyperlink w:anchor="_Toc225115679" w:history="1">
+          <w:hyperlink w:anchor="_Toc225694763" w:history="1">
             <w:r>
               <w:rPr>
                 <w:rStyle w:val="Hyperlink"/>
@@ -707,7 +693,7 @@
                 <w:noProof/>
                 <w:webHidden/>
               </w:rPr>
-              <w:instrText xml:space="preserve"> PAGEREF _Toc225115679 \h </w:instrText>
+              <w:instrText xml:space="preserve"> PAGEREF _Toc225694763 \h </w:instrText>
             </w:r>
             <w:r>
               <w:rPr>
@@ -742,13 +728,13 @@
           <w:pPr>
             <w:pStyle w:val="TOC2"/>
             <w:tabs>
-              <w:tab w:val="right" w:leader="dot" w:pos="10338"/>
+              <w:tab w:val="right" w:leader="dot" w:pos="13844"/>
             </w:tabs>
             <w:rPr>
               <w:noProof/>
             </w:rPr>
           </w:pPr>
-          <w:hyperlink w:anchor="_Toc225115680" w:history="1">
+          <w:hyperlink w:anchor="_Toc225694764" w:history="1">
             <w:r>
               <w:rPr>
                 <w:rStyle w:val="Hyperlink"/>
@@ -775,7 +761,7 @@
                 <w:noProof/>
                 <w:webHidden/>
               </w:rPr>
-              <w:instrText xml:space="preserve"> PAGEREF _Toc225115680 \h </w:instrText>
+              <w:instrText xml:space="preserve"> PAGEREF _Toc225694764 \h </w:instrText>
             </w:r>
             <w:r>
               <w:rPr>
@@ -810,13 +796,13 @@
           <w:pPr>
             <w:pStyle w:val="TOC1"/>
             <w:tabs>
-              <w:tab w:val="right" w:leader="dot" w:pos="10338"/>
+              <w:tab w:val="right" w:leader="dot" w:pos="13844"/>
             </w:tabs>
             <w:rPr>
               <w:noProof/>
             </w:rPr>
           </w:pPr>
-          <w:hyperlink w:anchor="_Toc225115681" w:history="1">
+          <w:hyperlink w:anchor="_Toc225694765" w:history="1">
             <w:r>
               <w:rPr>
                 <w:rStyle w:val="Hyperlink"/>
@@ -843,7 +829,7 @@
                 <w:noProof/>
                 <w:webHidden/>
               </w:rPr>
-              <w:instrText xml:space="preserve"> PAGEREF _Toc225115681 \h </w:instrText>
+              <w:instrText xml:space="preserve"> PAGEREF _Toc225694765 \h </w:instrText>
             </w:r>
             <w:r>
               <w:rPr>
@@ -878,13 +864,13 @@
           <w:pPr>
             <w:pStyle w:val="TOC2"/>
             <w:tabs>
-              <w:tab w:val="right" w:leader="dot" w:pos="10338"/>
+              <w:tab w:val="right" w:leader="dot" w:pos="13844"/>
             </w:tabs>
             <w:rPr>
               <w:noProof/>
             </w:rPr>
           </w:pPr>
-          <w:hyperlink w:anchor="_Toc225115682" w:history="1">
+          <w:hyperlink w:anchor="_Toc225694766" w:history="1">
             <w:r>
               <w:rPr>
                 <w:rStyle w:val="Hyperlink"/>
@@ -911,7 +897,7 @@
                 <w:noProof/>
                 <w:webHidden/>
               </w:rPr>
-              <w:instrText xml:space="preserve"> PAGEREF _Toc225115682 \h </w:instrText>
+              <w:instrText xml:space="preserve"> PAGEREF _Toc225694766 \h </w:instrText>
             </w:r>
             <w:r>
               <w:rPr>
@@ -946,13 +932,13 @@
           <w:pPr>
             <w:pStyle w:val="TOC3"/>
             <w:tabs>
-              <w:tab w:val="right" w:leader="dot" w:pos="10338"/>
+              <w:tab w:val="right" w:leader="dot" w:pos="13844"/>
             </w:tabs>
             <w:rPr>
               <w:noProof/>
             </w:rPr>
           </w:pPr>
-          <w:hyperlink w:anchor="_Toc225115683" w:history="1">
+          <w:hyperlink w:anchor="_Toc225694767" w:history="1">
             <w:r>
               <w:rPr>
                 <w:rStyle w:val="Hyperlink"/>
@@ -979,7 +965,7 @@
                 <w:noProof/>
                 <w:webHidden/>
               </w:rPr>
-              <w:instrText xml:space="preserve"> PAGEREF _Toc225115683 \h </w:instrText>
+              <w:instrText xml:space="preserve"> PAGEREF _Toc225694767 \h </w:instrText>
             </w:r>
             <w:r>
               <w:rPr>
@@ -1014,13 +1000,13 @@
           <w:pPr>
             <w:pStyle w:val="TOC3"/>
             <w:tabs>
-              <w:tab w:val="right" w:leader="dot" w:pos="10338"/>
+              <w:tab w:val="right" w:leader="dot" w:pos="13844"/>
             </w:tabs>
             <w:rPr>
               <w:noProof/>
             </w:rPr>
           </w:pPr>
-          <w:hyperlink w:anchor="_Toc225115684" w:history="1">
+          <w:hyperlink w:anchor="_Toc225694768" w:history="1">
             <w:r>
               <w:rPr>
                 <w:rStyle w:val="Hyperlink"/>
@@ -1047,7 +1033,7 @@
                 <w:noProof/>
                 <w:webHidden/>
               </w:rPr>
-              <w:instrText xml:space="preserve"> PAGEREF _Toc225115684 \h </w:instrText>
+              <w:instrText xml:space="preserve"> PAGEREF _Toc225694768 \h </w:instrText>
             </w:r>
             <w:r>
               <w:rPr>
@@ -1082,13 +1068,13 @@
           <w:pPr>
             <w:pStyle w:val="TOC3"/>
             <w:tabs>
-              <w:tab w:val="right" w:leader="dot" w:pos="10338"/>
+              <w:tab w:val="right" w:leader="dot" w:pos="13844"/>
             </w:tabs>
             <w:rPr>
               <w:noProof/>
             </w:rPr>
           </w:pPr>
-          <w:hyperlink w:anchor="_Toc225115685" w:history="1">
+          <w:hyperlink w:anchor="_Toc225694769" w:history="1">
             <w:r>
               <w:rPr>
                 <w:rStyle w:val="Hyperlink"/>
@@ -1115,7 +1101,7 @@
                 <w:noProof/>
                 <w:webHidden/>
               </w:rPr>
-              <w:instrText xml:space="preserve"> PAGEREF _Toc225115685 \h </w:instrText>
+              <w:instrText xml:space="preserve"> PAGEREF _Toc225694769 \h </w:instrText>
             </w:r>
             <w:r>
               <w:rPr>
@@ -1150,13 +1136,13 @@
           <w:pPr>
             <w:pStyle w:val="TOC2"/>
             <w:tabs>
-              <w:tab w:val="right" w:leader="dot" w:pos="10338"/>
+              <w:tab w:val="right" w:leader="dot" w:pos="13844"/>
             </w:tabs>
             <w:rPr>
               <w:noProof/>
             </w:rPr>
           </w:pPr>
-          <w:hyperlink w:anchor="_Toc225115686" w:history="1">
+          <w:hyperlink w:anchor="_Toc225694770" w:history="1">
             <w:r>
               <w:rPr>
                 <w:rStyle w:val="Hyperlink"/>
@@ -1183,7 +1169,7 @@
                 <w:noProof/>
                 <w:webHidden/>
               </w:rPr>
-              <w:instrText xml:space="preserve"> PAGEREF _Toc225115686 \h </w:instrText>
+              <w:instrText xml:space="preserve"> PAGEREF _Toc225694770 \h </w:instrText>
             </w:r>
             <w:r>
               <w:rPr>
@@ -1218,13 +1204,13 @@
           <w:pPr>
             <w:pStyle w:val="TOC2"/>
             <w:tabs>
-              <w:tab w:val="right" w:leader="dot" w:pos="10338"/>
+              <w:tab w:val="right" w:leader="dot" w:pos="13844"/>
             </w:tabs>
             <w:rPr>
               <w:noProof/>
             </w:rPr>
           </w:pPr>
-          <w:hyperlink w:anchor="_Toc225115687" w:history="1">
+          <w:hyperlink w:anchor="_Toc225694771" w:history="1">
             <w:r>
               <w:rPr>
                 <w:rStyle w:val="Hyperlink"/>
@@ -1260,7 +1246,7 @@
                 <w:noProof/>
                 <w:webHidden/>
               </w:rPr>
-              <w:instrText xml:space="preserve"> PAGEREF _Toc225115687 \h </w:instrText>
+              <w:instrText xml:space="preserve"> PAGEREF _Toc225694771 \h </w:instrText>
             </w:r>
             <w:r>
               <w:rPr>
@@ -1295,13 +1281,13 @@
           <w:pPr>
             <w:pStyle w:val="TOC2"/>
             <w:tabs>
-              <w:tab w:val="right" w:leader="dot" w:pos="10338"/>
+              <w:tab w:val="right" w:leader="dot" w:pos="13844"/>
             </w:tabs>
             <w:rPr>
               <w:noProof/>
             </w:rPr>
           </w:pPr>
-          <w:hyperlink w:anchor="_Toc225115688" w:history="1">
+          <w:hyperlink w:anchor="_Toc225694772" w:history="1">
             <w:r>
               <w:rPr>
                 <w:rStyle w:val="Hyperlink"/>
@@ -1328,7 +1314,7 @@
                 <w:noProof/>
                 <w:webHidden/>
               </w:rPr>
-              <w:instrText xml:space="preserve"> PAGEREF _Toc225115688 \h </w:instrText>
+              <w:instrText xml:space="preserve"> PAGEREF _Toc225694772 \h </w:instrText>
             </w:r>
             <w:r>
               <w:rPr>
@@ -1363,13 +1349,13 @@
           <w:pPr>
             <w:pStyle w:val="TOC3"/>
             <w:tabs>
-              <w:tab w:val="right" w:leader="dot" w:pos="10338"/>
+              <w:tab w:val="right" w:leader="dot" w:pos="13844"/>
             </w:tabs>
             <w:rPr>
               <w:noProof/>
             </w:rPr>
           </w:pPr>
-          <w:hyperlink w:anchor="_Toc225115689" w:history="1">
+          <w:hyperlink w:anchor="_Toc225694773" w:history="1">
             <w:r>
               <w:rPr>
                 <w:rStyle w:val="Hyperlink"/>
@@ -1396,7 +1382,7 @@
                 <w:noProof/>
                 <w:webHidden/>
               </w:rPr>
-              <w:instrText xml:space="preserve"> PAGEREF _Toc225115689 \h </w:instrText>
+              <w:instrText xml:space="preserve"> PAGEREF _Toc225694773 \h </w:instrText>
             </w:r>
             <w:r>
               <w:rPr>
@@ -1431,13 +1417,13 @@
           <w:pPr>
             <w:pStyle w:val="TOC3"/>
             <w:tabs>
-              <w:tab w:val="right" w:leader="dot" w:pos="10338"/>
+              <w:tab w:val="right" w:leader="dot" w:pos="13844"/>
             </w:tabs>
             <w:rPr>
               <w:noProof/>
             </w:rPr>
           </w:pPr>
-          <w:hyperlink w:anchor="_Toc225115690" w:history="1">
+          <w:hyperlink w:anchor="_Toc225694774" w:history="1">
             <w:r>
               <w:rPr>
                 <w:rStyle w:val="Hyperlink"/>
@@ -1464,7 +1450,7 @@
                 <w:noProof/>
                 <w:webHidden/>
               </w:rPr>
-              <w:instrText xml:space="preserve"> PAGEREF _Toc225115690 \h </w:instrText>
+              <w:instrText xml:space="preserve"> PAGEREF _Toc225694774 \h </w:instrText>
             </w:r>
             <w:r>
               <w:rPr>
@@ -1499,13 +1485,13 @@
           <w:pPr>
             <w:pStyle w:val="TOC1"/>
             <w:tabs>
-              <w:tab w:val="right" w:leader="dot" w:pos="10338"/>
+              <w:tab w:val="right" w:leader="dot" w:pos="13844"/>
             </w:tabs>
             <w:rPr>
               <w:noProof/>
             </w:rPr>
           </w:pPr>
-          <w:hyperlink w:anchor="_Toc225115691" w:history="1">
+          <w:hyperlink w:anchor="_Toc225694775" w:history="1">
             <w:r>
               <w:rPr>
                 <w:rStyle w:val="Hyperlink"/>
@@ -1532,7 +1518,7 @@
                 <w:noProof/>
                 <w:webHidden/>
               </w:rPr>
-              <w:instrText xml:space="preserve"> PAGEREF _Toc225115691 \h </w:instrText>
+              <w:instrText xml:space="preserve"> PAGEREF _Toc225694775 \h </w:instrText>
             </w:r>
             <w:r>
               <w:rPr>
@@ -1567,13 +1553,13 @@
           <w:pPr>
             <w:pStyle w:val="TOC2"/>
             <w:tabs>
-              <w:tab w:val="right" w:leader="dot" w:pos="10338"/>
+              <w:tab w:val="right" w:leader="dot" w:pos="13844"/>
             </w:tabs>
             <w:rPr>
               <w:noProof/>
             </w:rPr>
           </w:pPr>
-          <w:hyperlink w:anchor="_Toc225115692" w:history="1">
+          <w:hyperlink w:anchor="_Toc225694776" w:history="1">
             <w:r>
               <w:rPr>
                 <w:rStyle w:val="Hyperlink"/>
@@ -1609,7 +1595,7 @@
                 <w:noProof/>
                 <w:webHidden/>
               </w:rPr>
-              <w:instrText xml:space="preserve"> PAGEREF _Toc225115692 \h </w:instrText>
+              <w:instrText xml:space="preserve"> PAGEREF _Toc225694776 \h </w:instrText>
             </w:r>
             <w:r>
               <w:rPr>
@@ -1644,13 +1630,13 @@
           <w:pPr>
             <w:pStyle w:val="TOC2"/>
             <w:tabs>
-              <w:tab w:val="right" w:leader="dot" w:pos="10338"/>
+              <w:tab w:val="right" w:leader="dot" w:pos="13844"/>
             </w:tabs>
             <w:rPr>
               <w:noProof/>
             </w:rPr>
           </w:pPr>
-          <w:hyperlink w:anchor="_Toc225115693" w:history="1">
+          <w:hyperlink w:anchor="_Toc225694777" w:history="1">
             <w:r>
               <w:rPr>
                 <w:rStyle w:val="Hyperlink"/>
@@ -1686,7 +1672,7 @@
                 <w:noProof/>
                 <w:webHidden/>
               </w:rPr>
-              <w:instrText xml:space="preserve"> PAGEREF _Toc225115693 \h </w:instrText>
+              <w:instrText xml:space="preserve"> PAGEREF _Toc225694777 \h </w:instrText>
             </w:r>
             <w:r>
               <w:rPr>
@@ -1721,13 +1707,13 @@
           <w:pPr>
             <w:pStyle w:val="TOC2"/>
             <w:tabs>
-              <w:tab w:val="right" w:leader="dot" w:pos="10338"/>
+              <w:tab w:val="right" w:leader="dot" w:pos="13844"/>
             </w:tabs>
             <w:rPr>
               <w:noProof/>
             </w:rPr>
           </w:pPr>
-          <w:hyperlink w:anchor="_Toc225115694" w:history="1">
+          <w:hyperlink w:anchor="_Toc225694778" w:history="1">
             <w:r>
               <w:rPr>
                 <w:rStyle w:val="Hyperlink"/>
@@ -1763,7 +1749,7 @@
                 <w:noProof/>
                 <w:webHidden/>
               </w:rPr>
-              <w:instrText xml:space="preserve"> PAGEREF _Toc225115694 \h </w:instrText>
+              <w:instrText xml:space="preserve"> PAGEREF _Toc225694778 \h </w:instrText>
             </w:r>
             <w:r>
               <w:rPr>
@@ -1798,13 +1784,13 @@
           <w:pPr>
             <w:pStyle w:val="TOC1"/>
             <w:tabs>
-              <w:tab w:val="right" w:leader="dot" w:pos="10338"/>
+              <w:tab w:val="right" w:leader="dot" w:pos="13844"/>
             </w:tabs>
             <w:rPr>
               <w:noProof/>
             </w:rPr>
           </w:pPr>
-          <w:hyperlink w:anchor="_Toc225115695" w:history="1">
+          <w:hyperlink w:anchor="_Toc225694779" w:history="1">
             <w:r>
               <w:rPr>
                 <w:rStyle w:val="Hyperlink"/>
@@ -1831,7 +1817,7 @@
                 <w:noProof/>
                 <w:webHidden/>
               </w:rPr>
-              <w:instrText xml:space="preserve"> PAGEREF _Toc225115695 \h </w:instrText>
+              <w:instrText xml:space="preserve"> PAGEREF _Toc225694779 \h </w:instrText>
             </w:r>
             <w:r>
               <w:rPr>
@@ -1866,13 +1852,13 @@
           <w:pPr>
             <w:pStyle w:val="TOC2"/>
             <w:tabs>
-              <w:tab w:val="right" w:leader="dot" w:pos="10338"/>
+              <w:tab w:val="right" w:leader="dot" w:pos="13844"/>
             </w:tabs>
             <w:rPr>
               <w:noProof/>
             </w:rPr>
           </w:pPr>
-          <w:hyperlink w:anchor="_Toc225115696" w:history="1">
+          <w:hyperlink w:anchor="_Toc225694780" w:history="1">
             <w:r>
               <w:rPr>
                 <w:rStyle w:val="Hyperlink"/>
@@ -1899,7 +1885,7 @@
                 <w:noProof/>
                 <w:webHidden/>
               </w:rPr>
-              <w:instrText xml:space="preserve"> PAGEREF _Toc225115696 \h </w:instrText>
+              <w:instrText xml:space="preserve"> PAGEREF _Toc225694780 \h </w:instrText>
             </w:r>
             <w:r>
               <w:rPr>
@@ -1934,13 +1920,13 @@
           <w:pPr>
             <w:pStyle w:val="TOC3"/>
             <w:tabs>
-              <w:tab w:val="right" w:leader="dot" w:pos="10338"/>
+              <w:tab w:val="right" w:leader="dot" w:pos="13844"/>
             </w:tabs>
             <w:rPr>
               <w:noProof/>
             </w:rPr>
           </w:pPr>
-          <w:hyperlink w:anchor="_Toc225115697" w:history="1">
+          <w:hyperlink w:anchor="_Toc225694781" w:history="1">
             <w:r>
               <w:rPr>
                 <w:rStyle w:val="Hyperlink"/>
@@ -1967,7 +1953,7 @@
                 <w:noProof/>
                 <w:webHidden/>
               </w:rPr>
-              <w:instrText xml:space="preserve"> PAGEREF _Toc225115697 \h </w:instrText>
+              <w:instrText xml:space="preserve"> PAGEREF _Toc225694781 \h </w:instrText>
             </w:r>
             <w:r>
               <w:rPr>
@@ -2002,13 +1988,13 @@
           <w:pPr>
             <w:pStyle w:val="TOC3"/>
             <w:tabs>
-              <w:tab w:val="right" w:leader="dot" w:pos="10338"/>
+              <w:tab w:val="right" w:leader="dot" w:pos="13844"/>
             </w:tabs>
             <w:rPr>
               <w:noProof/>
             </w:rPr>
           </w:pPr>
-          <w:hyperlink w:anchor="_Toc225115698" w:history="1">
+          <w:hyperlink w:anchor="_Toc225694782" w:history="1">
             <w:r>
               <w:rPr>
                 <w:rStyle w:val="Hyperlink"/>
@@ -2035,7 +2021,7 @@
                 <w:noProof/>
                 <w:webHidden/>
               </w:rPr>
-              <w:instrText xml:space="preserve"> PAGEREF _Toc225115698 \h </w:instrText>
+              <w:instrText xml:space="preserve"> PAGEREF _Toc225694782 \h </w:instrText>
             </w:r>
             <w:r>
               <w:rPr>
@@ -2070,13 +2056,13 @@
           <w:pPr>
             <w:pStyle w:val="TOC3"/>
             <w:tabs>
-              <w:tab w:val="right" w:leader="dot" w:pos="10338"/>
+              <w:tab w:val="right" w:leader="dot" w:pos="13844"/>
             </w:tabs>
             <w:rPr>
               <w:noProof/>
             </w:rPr>
           </w:pPr>
-          <w:hyperlink w:anchor="_Toc225115699" w:history="1">
+          <w:hyperlink w:anchor="_Toc225694783" w:history="1">
             <w:r>
               <w:rPr>
                 <w:rStyle w:val="Hyperlink"/>
@@ -2103,7 +2089,7 @@
                 <w:noProof/>
                 <w:webHidden/>
               </w:rPr>
-              <w:instrText xml:space="preserve"> PAGEREF _Toc225115699 \h </w:instrText>
+              <w:instrText xml:space="preserve"> PAGEREF _Toc225694783 \h </w:instrText>
             </w:r>
             <w:r>
               <w:rPr>
@@ -2138,13 +2124,13 @@
           <w:pPr>
             <w:pStyle w:val="TOC3"/>
             <w:tabs>
-              <w:tab w:val="right" w:leader="dot" w:pos="10338"/>
+              <w:tab w:val="right" w:leader="dot" w:pos="13844"/>
             </w:tabs>
             <w:rPr>
               <w:noProof/>
             </w:rPr>
           </w:pPr>
-          <w:hyperlink w:anchor="_Toc225115700" w:history="1">
+          <w:hyperlink w:anchor="_Toc225694784" w:history="1">
             <w:r>
               <w:rPr>
                 <w:rStyle w:val="Hyperlink"/>
@@ -2171,7 +2157,7 @@
                 <w:noProof/>
                 <w:webHidden/>
               </w:rPr>
-              <w:instrText xml:space="preserve"> PAGEREF _Toc225115700 \h </w:instrText>
+              <w:instrText xml:space="preserve"> PAGEREF _Toc225694784 \h </w:instrText>
             </w:r>
             <w:r>
               <w:rPr>
@@ -2206,13 +2192,13 @@
           <w:pPr>
             <w:pStyle w:val="TOC3"/>
             <w:tabs>
-              <w:tab w:val="right" w:leader="dot" w:pos="10338"/>
+              <w:tab w:val="right" w:leader="dot" w:pos="13844"/>
             </w:tabs>
             <w:rPr>
               <w:noProof/>
             </w:rPr>
           </w:pPr>
-          <w:hyperlink w:anchor="_Toc225115701" w:history="1">
+          <w:hyperlink w:anchor="_Toc225694785" w:history="1">
             <w:r>
               <w:rPr>
                 <w:rStyle w:val="Hyperlink"/>
@@ -2239,7 +2225,7 @@
                 <w:noProof/>
                 <w:webHidden/>
               </w:rPr>
-              <w:instrText xml:space="preserve"> PAGEREF _Toc225115701 \h </w:instrText>
+              <w:instrText xml:space="preserve"> PAGEREF _Toc225694785 \h </w:instrText>
             </w:r>
             <w:r>
               <w:rPr>
@@ -2274,13 +2260,13 @@
           <w:pPr>
             <w:pStyle w:val="TOC2"/>
             <w:tabs>
-              <w:tab w:val="right" w:leader="dot" w:pos="10338"/>
+              <w:tab w:val="right" w:leader="dot" w:pos="13844"/>
             </w:tabs>
             <w:rPr>
               <w:noProof/>
             </w:rPr>
           </w:pPr>
-          <w:hyperlink w:anchor="_Toc225115702" w:history="1">
+          <w:hyperlink w:anchor="_Toc225694786" w:history="1">
             <w:r>
               <w:rPr>
                 <w:rStyle w:val="Hyperlink"/>
@@ -2307,7 +2293,7 @@
                 <w:noProof/>
                 <w:webHidden/>
               </w:rPr>
-              <w:instrText xml:space="preserve"> PAGEREF _Toc225115702 \h </w:instrText>
+              <w:instrText xml:space="preserve"> PAGEREF _Toc225694786 \h </w:instrText>
             </w:r>
             <w:r>
               <w:rPr>
@@ -2342,13 +2328,13 @@
           <w:pPr>
             <w:pStyle w:val="TOC3"/>
             <w:tabs>
-              <w:tab w:val="right" w:leader="dot" w:pos="10338"/>
+              <w:tab w:val="right" w:leader="dot" w:pos="13844"/>
             </w:tabs>
             <w:rPr>
               <w:noProof/>
             </w:rPr>
           </w:pPr>
-          <w:hyperlink w:anchor="_Toc225115703" w:history="1">
+          <w:hyperlink w:anchor="_Toc225694787" w:history="1">
             <w:r>
               <w:rPr>
                 <w:rStyle w:val="Hyperlink"/>
@@ -2375,7 +2361,7 @@
                 <w:noProof/>
                 <w:webHidden/>
               </w:rPr>
-              <w:instrText xml:space="preserve"> PAGEREF _Toc225115703 \h </w:instrText>
+              <w:instrText xml:space="preserve"> PAGEREF _Toc225694787 \h </w:instrText>
             </w:r>
             <w:r>
               <w:rPr>
@@ -2396,6 +2382,496 @@
                 <w:webHidden/>
               </w:rPr>
               <w:t>25</w:t>
+            </w:r>
+            <w:r>
+              <w:rPr>
+                <w:noProof/>
+                <w:webHidden/>
+              </w:rPr>
+              <w:fldChar w:fldCharType="end"/>
+            </w:r>
+          </w:hyperlink>
+        </w:p>
+        <w:p>
+          <w:pPr>
+            <w:pStyle w:val="TOC3"/>
+            <w:tabs>
+              <w:tab w:val="right" w:leader="dot" w:pos="13844"/>
+            </w:tabs>
+            <w:rPr>
+              <w:noProof/>
+            </w:rPr>
+          </w:pPr>
+          <w:hyperlink w:anchor="_Toc225694788" w:history="1">
+            <w:r>
+              <w:rPr>
+                <w:rStyle w:val="Hyperlink"/>
+                <w:noProof/>
+              </w:rPr>
+              <w:t>5.4 Phase 3 – Comment API</w:t>
+            </w:r>
+            <w:r>
+              <w:rPr>
+                <w:noProof/>
+                <w:webHidden/>
+              </w:rPr>
+              <w:tab/>
+            </w:r>
+            <w:r>
+              <w:rPr>
+                <w:noProof/>
+                <w:webHidden/>
+              </w:rPr>
+              <w:fldChar w:fldCharType="begin"/>
+            </w:r>
+            <w:r>
+              <w:rPr>
+                <w:noProof/>
+                <w:webHidden/>
+              </w:rPr>
+              <w:instrText xml:space="preserve"> PAGEREF _Toc225694788 \h </w:instrText>
+            </w:r>
+            <w:r>
+              <w:rPr>
+                <w:noProof/>
+                <w:webHidden/>
+              </w:rPr>
+            </w:r>
+            <w:r>
+              <w:rPr>
+                <w:noProof/>
+                <w:webHidden/>
+              </w:rPr>
+              <w:fldChar w:fldCharType="separate"/>
+            </w:r>
+            <w:r>
+              <w:rPr>
+                <w:noProof/>
+                <w:webHidden/>
+              </w:rPr>
+              <w:t>25</w:t>
+            </w:r>
+            <w:r>
+              <w:rPr>
+                <w:noProof/>
+                <w:webHidden/>
+              </w:rPr>
+              <w:fldChar w:fldCharType="end"/>
+            </w:r>
+          </w:hyperlink>
+        </w:p>
+        <w:p>
+          <w:pPr>
+            <w:pStyle w:val="TOC3"/>
+            <w:tabs>
+              <w:tab w:val="right" w:leader="dot" w:pos="13844"/>
+            </w:tabs>
+            <w:rPr>
+              <w:noProof/>
+            </w:rPr>
+          </w:pPr>
+          <w:hyperlink w:anchor="_Toc225694789" w:history="1">
+            <w:r>
+              <w:rPr>
+                <w:rStyle w:val="Hyperlink"/>
+                <w:noProof/>
+              </w:rPr>
+              <w:t>5.5 Phase 4 – 5 – Frontend</w:t>
+            </w:r>
+            <w:r>
+              <w:rPr>
+                <w:noProof/>
+                <w:webHidden/>
+              </w:rPr>
+              <w:tab/>
+            </w:r>
+            <w:r>
+              <w:rPr>
+                <w:noProof/>
+                <w:webHidden/>
+              </w:rPr>
+              <w:fldChar w:fldCharType="begin"/>
+            </w:r>
+            <w:r>
+              <w:rPr>
+                <w:noProof/>
+                <w:webHidden/>
+              </w:rPr>
+              <w:instrText xml:space="preserve"> PAGEREF _Toc225694789 \h </w:instrText>
+            </w:r>
+            <w:r>
+              <w:rPr>
+                <w:noProof/>
+                <w:webHidden/>
+              </w:rPr>
+            </w:r>
+            <w:r>
+              <w:rPr>
+                <w:noProof/>
+                <w:webHidden/>
+              </w:rPr>
+              <w:fldChar w:fldCharType="separate"/>
+            </w:r>
+            <w:r>
+              <w:rPr>
+                <w:noProof/>
+                <w:webHidden/>
+              </w:rPr>
+              <w:t>25</w:t>
+            </w:r>
+            <w:r>
+              <w:rPr>
+                <w:noProof/>
+                <w:webHidden/>
+              </w:rPr>
+              <w:fldChar w:fldCharType="end"/>
+            </w:r>
+          </w:hyperlink>
+        </w:p>
+        <w:p>
+          <w:pPr>
+            <w:pStyle w:val="TOC3"/>
+            <w:tabs>
+              <w:tab w:val="right" w:leader="dot" w:pos="13844"/>
+            </w:tabs>
+            <w:rPr>
+              <w:noProof/>
+            </w:rPr>
+          </w:pPr>
+          <w:hyperlink w:anchor="_Toc225694790" w:history="1">
+            <w:r>
+              <w:rPr>
+                <w:rStyle w:val="Hyperlink"/>
+                <w:noProof/>
+              </w:rPr>
+              <w:t>5.6 Phase 6: Polish &amp; Hardening</w:t>
+            </w:r>
+            <w:r>
+              <w:rPr>
+                <w:noProof/>
+                <w:webHidden/>
+              </w:rPr>
+              <w:tab/>
+            </w:r>
+            <w:r>
+              <w:rPr>
+                <w:noProof/>
+                <w:webHidden/>
+              </w:rPr>
+              <w:fldChar w:fldCharType="begin"/>
+            </w:r>
+            <w:r>
+              <w:rPr>
+                <w:noProof/>
+                <w:webHidden/>
+              </w:rPr>
+              <w:instrText xml:space="preserve"> PAGEREF _Toc225694790 \h </w:instrText>
+            </w:r>
+            <w:r>
+              <w:rPr>
+                <w:noProof/>
+                <w:webHidden/>
+              </w:rPr>
+            </w:r>
+            <w:r>
+              <w:rPr>
+                <w:noProof/>
+                <w:webHidden/>
+              </w:rPr>
+              <w:fldChar w:fldCharType="separate"/>
+            </w:r>
+            <w:r>
+              <w:rPr>
+                <w:noProof/>
+                <w:webHidden/>
+              </w:rPr>
+              <w:t>25</w:t>
+            </w:r>
+            <w:r>
+              <w:rPr>
+                <w:noProof/>
+                <w:webHidden/>
+              </w:rPr>
+              <w:fldChar w:fldCharType="end"/>
+            </w:r>
+          </w:hyperlink>
+        </w:p>
+        <w:p>
+          <w:pPr>
+            <w:pStyle w:val="TOC1"/>
+            <w:tabs>
+              <w:tab w:val="right" w:leader="dot" w:pos="13844"/>
+            </w:tabs>
+            <w:rPr>
+              <w:noProof/>
+            </w:rPr>
+          </w:pPr>
+          <w:hyperlink w:anchor="_Toc225694791" w:history="1">
+            <w:r>
+              <w:rPr>
+                <w:rStyle w:val="Hyperlink"/>
+                <w:noProof/>
+              </w:rPr>
+              <w:t>6. Authorization by G</w:t>
+            </w:r>
+            <w:r>
+              <w:rPr>
+                <w:rStyle w:val="Hyperlink"/>
+                <w:noProof/>
+              </w:rPr>
+              <w:t>r</w:t>
+            </w:r>
+            <w:r>
+              <w:rPr>
+                <w:rStyle w:val="Hyperlink"/>
+                <w:noProof/>
+              </w:rPr>
+              <w:t>oup</w:t>
+            </w:r>
+            <w:r>
+              <w:rPr>
+                <w:noProof/>
+                <w:webHidden/>
+              </w:rPr>
+              <w:tab/>
+            </w:r>
+            <w:r>
+              <w:rPr>
+                <w:noProof/>
+                <w:webHidden/>
+              </w:rPr>
+              <w:fldChar w:fldCharType="begin"/>
+            </w:r>
+            <w:r>
+              <w:rPr>
+                <w:noProof/>
+                <w:webHidden/>
+              </w:rPr>
+              <w:instrText xml:space="preserve"> PAGEREF _Toc225694791 \h </w:instrText>
+            </w:r>
+            <w:r>
+              <w:rPr>
+                <w:noProof/>
+                <w:webHidden/>
+              </w:rPr>
+            </w:r>
+            <w:r>
+              <w:rPr>
+                <w:noProof/>
+                <w:webHidden/>
+              </w:rPr>
+              <w:fldChar w:fldCharType="separate"/>
+            </w:r>
+            <w:r>
+              <w:rPr>
+                <w:noProof/>
+                <w:webHidden/>
+              </w:rPr>
+              <w:t>26</w:t>
+            </w:r>
+            <w:r>
+              <w:rPr>
+                <w:noProof/>
+                <w:webHidden/>
+              </w:rPr>
+              <w:fldChar w:fldCharType="end"/>
+            </w:r>
+          </w:hyperlink>
+        </w:p>
+        <w:p>
+          <w:pPr>
+            <w:pStyle w:val="TOC2"/>
+            <w:tabs>
+              <w:tab w:val="right" w:leader="dot" w:pos="13844"/>
+            </w:tabs>
+            <w:rPr>
+              <w:noProof/>
+            </w:rPr>
+          </w:pPr>
+          <w:hyperlink w:anchor="_Toc225694792" w:history="1">
+            <w:r>
+              <w:rPr>
+                <w:rStyle w:val="Hyperlink"/>
+                <w:noProof/>
+              </w:rPr>
+              <w:t>6.1  Setting Up Groups in Microsoft Entra ID</w:t>
+            </w:r>
+            <w:r>
+              <w:rPr>
+                <w:noProof/>
+                <w:webHidden/>
+              </w:rPr>
+              <w:tab/>
+            </w:r>
+            <w:r>
+              <w:rPr>
+                <w:noProof/>
+                <w:webHidden/>
+              </w:rPr>
+              <w:fldChar w:fldCharType="begin"/>
+            </w:r>
+            <w:r>
+              <w:rPr>
+                <w:noProof/>
+                <w:webHidden/>
+              </w:rPr>
+              <w:instrText xml:space="preserve"> PAGEREF _Toc225694792 \h </w:instrText>
+            </w:r>
+            <w:r>
+              <w:rPr>
+                <w:noProof/>
+                <w:webHidden/>
+              </w:rPr>
+            </w:r>
+            <w:r>
+              <w:rPr>
+                <w:noProof/>
+                <w:webHidden/>
+              </w:rPr>
+              <w:fldChar w:fldCharType="separate"/>
+            </w:r>
+            <w:r>
+              <w:rPr>
+                <w:noProof/>
+                <w:webHidden/>
+              </w:rPr>
+              <w:t>26</w:t>
+            </w:r>
+            <w:r>
+              <w:rPr>
+                <w:noProof/>
+                <w:webHidden/>
+              </w:rPr>
+              <w:fldChar w:fldCharType="end"/>
+            </w:r>
+          </w:hyperlink>
+        </w:p>
+        <w:p>
+          <w:pPr>
+            <w:pStyle w:val="TOC2"/>
+            <w:tabs>
+              <w:tab w:val="right" w:leader="dot" w:pos="13844"/>
+            </w:tabs>
+            <w:rPr>
+              <w:noProof/>
+            </w:rPr>
+          </w:pPr>
+          <w:hyperlink w:anchor="_Toc225694793" w:history="1">
+            <w:r>
+              <w:rPr>
+                <w:rStyle w:val="Hyperlink"/>
+                <w:noProof/>
+              </w:rPr>
+              <w:t>6.2 Spring Boot Application Implementation</w:t>
+            </w:r>
+            <w:r>
+              <w:rPr>
+                <w:noProof/>
+                <w:webHidden/>
+              </w:rPr>
+              <w:tab/>
+            </w:r>
+            <w:r>
+              <w:rPr>
+                <w:noProof/>
+                <w:webHidden/>
+              </w:rPr>
+              <w:fldChar w:fldCharType="begin"/>
+            </w:r>
+            <w:r>
+              <w:rPr>
+                <w:noProof/>
+                <w:webHidden/>
+              </w:rPr>
+              <w:instrText xml:space="preserve"> PAGEREF _Toc225694793 \h </w:instrText>
+            </w:r>
+            <w:r>
+              <w:rPr>
+                <w:noProof/>
+                <w:webHidden/>
+              </w:rPr>
+            </w:r>
+            <w:r>
+              <w:rPr>
+                <w:noProof/>
+                <w:webHidden/>
+              </w:rPr>
+              <w:fldChar w:fldCharType="separate"/>
+            </w:r>
+            <w:r>
+              <w:rPr>
+                <w:noProof/>
+                <w:webHidden/>
+              </w:rPr>
+              <w:t>28</w:t>
+            </w:r>
+            <w:r>
+              <w:rPr>
+                <w:noProof/>
+                <w:webHidden/>
+              </w:rPr>
+              <w:fldChar w:fldCharType="end"/>
+            </w:r>
+          </w:hyperlink>
+        </w:p>
+        <w:p>
+          <w:pPr>
+            <w:pStyle w:val="TOC1"/>
+            <w:tabs>
+              <w:tab w:val="right" w:leader="dot" w:pos="13844"/>
+            </w:tabs>
+            <w:rPr>
+              <w:noProof/>
+            </w:rPr>
+          </w:pPr>
+          <w:hyperlink w:anchor="_Toc225694794" w:history="1">
+            <w:r>
+              <w:rPr>
+                <w:rStyle w:val="Hyperlink"/>
+                <w:noProof/>
+              </w:rPr>
+              <w:t>7. Mock Authentication and Authorization</w:t>
+            </w:r>
+            <w:r>
+              <w:rPr>
+                <w:noProof/>
+                <w:webHidden/>
+              </w:rPr>
+              <w:tab/>
+            </w:r>
+            <w:r>
+              <w:rPr>
+                <w:noProof/>
+                <w:webHidden/>
+              </w:rPr>
+              <w:fldChar w:fldCharType="begin"/>
+            </w:r>
+            <w:r>
+              <w:rPr>
+                <w:noProof/>
+                <w:webHidden/>
+              </w:rPr>
+              <w:instrText xml:space="preserve"> PAGEREF _Toc225694794 \h </w:instrText>
+            </w:r>
+            <w:r>
+              <w:rPr>
+                <w:noProof/>
+                <w:webHidden/>
+              </w:rPr>
+            </w:r>
+            <w:r>
+              <w:rPr>
+                <w:noProof/>
+                <w:webHidden/>
+              </w:rPr>
+              <w:fldChar w:fldCharType="separate"/>
+            </w:r>
+            <w:r>
+              <w:rPr>
+                <w:noProof/>
+                <w:webHidden/>
+              </w:rPr>
+              <w:t>29</w:t>
             </w:r>
             <w:r>
               <w:rPr>
@@ -2435,7 +2911,7 @@
       <w:pPr>
         <w:pStyle w:val="Heading1"/>
       </w:pPr>
-      <w:bookmarkStart w:id="0" w:name="_Toc225115670"/>
+      <w:bookmarkStart w:id="0" w:name="_Toc225694754"/>
       <w:r>
         <w:lastRenderedPageBreak/>
         <w:t xml:space="preserve">1. </w:t>
@@ -2449,7 +2925,7 @@
       <w:pPr>
         <w:pStyle w:val="Heading2"/>
       </w:pPr>
-      <w:bookmarkStart w:id="1" w:name="_Toc225115671"/>
+      <w:bookmarkStart w:id="1" w:name="_Toc225694755"/>
       <w:r>
         <w:t xml:space="preserve">1.1 </w:t>
       </w:r>
@@ -2628,7 +3104,7 @@
       <w:pPr>
         <w:pStyle w:val="Heading2"/>
       </w:pPr>
-      <w:bookmarkStart w:id="2" w:name="_Toc225115672"/>
+      <w:bookmarkStart w:id="2" w:name="_Toc225694756"/>
       <w:r>
         <w:t xml:space="preserve">1.2 </w:t>
       </w:r>
@@ -2744,7 +3220,7 @@
       <w:pPr>
         <w:pStyle w:val="Heading1"/>
       </w:pPr>
-      <w:bookmarkStart w:id="3" w:name="_Toc225115673"/>
+      <w:bookmarkStart w:id="3" w:name="_Toc225694757"/>
       <w:r>
         <w:t xml:space="preserve">2. </w:t>
       </w:r>
@@ -2757,7 +3233,7 @@
       <w:pPr>
         <w:pStyle w:val="Heading2"/>
       </w:pPr>
-      <w:bookmarkStart w:id="4" w:name="_Toc225115674"/>
+      <w:bookmarkStart w:id="4" w:name="_Toc225694758"/>
       <w:r>
         <w:t>2</w:t>
       </w:r>
@@ -2921,7 +3397,7 @@
       <w:pPr>
         <w:pStyle w:val="Heading2"/>
       </w:pPr>
-      <w:bookmarkStart w:id="5" w:name="_Toc225115675"/>
+      <w:bookmarkStart w:id="5" w:name="_Toc225694759"/>
       <w:r>
         <w:t>2</w:t>
       </w:r>
@@ -2938,30 +3414,24 @@
         <w:t>leap-poc-admin1</w:t>
       </w:r>
       <w:r>
+        <w:t xml:space="preserve"> (Admin1 Leap)</w:t>
+      </w:r>
+      <w:r>
+        <w:t xml:space="preserve"> / </w:t>
+      </w:r>
+      <w:r>
+        <w:t>P</w:t>
+      </w:r>
+      <w:r>
+        <w:t>swd@9991</w:t>
+      </w:r>
+      <w:r>
+        <w:t>23</w:t>
+      </w:r>
+      <w:r>
         <w:t xml:space="preserve"> (</w:t>
       </w:r>
       <w:r>
-        <w:t>Admin1</w:t>
-      </w:r>
-      <w:r>
-        <w:t xml:space="preserve"> Leap)</w:t>
-      </w:r>
-      <w:r>
-        <w:t xml:space="preserve"> / </w:t>
-      </w:r>
-      <w:r>
-        <w:t>P</w:t>
-      </w:r>
-      <w:r>
-        <w:t>swd@9991</w:t>
-      </w:r>
-      <w:r>
-        <w:t>23</w:t>
-      </w:r>
-      <w:r>
-        <w:t xml:space="preserve"> (</w:t>
-      </w:r>
-      <w:r>
         <w:t>leap-poc-admin1@danielxtbsmgmail.onmicrosoft.com</w:t>
       </w:r>
       <w:r>
@@ -2976,13 +3446,7 @@
         <w:t>leap-poc-admin2</w:t>
       </w:r>
       <w:r>
-        <w:t xml:space="preserve"> (</w:t>
-      </w:r>
-      <w:r>
-        <w:t>Admin</w:t>
-      </w:r>
-      <w:r>
-        <w:t>2 Leap)</w:t>
+        <w:t xml:space="preserve"> (Admin2 Leap)</w:t>
       </w:r>
     </w:p>
     <w:p>
@@ -2999,13 +3463,7 @@
         <w:t>e1</w:t>
       </w:r>
       <w:r>
-        <w:t xml:space="preserve"> (Write</w:t>
-      </w:r>
-      <w:r>
-        <w:t>1</w:t>
-      </w:r>
-      <w:r>
-        <w:t xml:space="preserve"> Leap)</w:t>
+        <w:t xml:space="preserve"> (Write1 Leap)</w:t>
       </w:r>
     </w:p>
     <w:p>
@@ -3013,10 +3471,7 @@
         <w:ind w:left="720"/>
       </w:pPr>
       <w:r>
-        <w:t>leap-poc-write</w:t>
-      </w:r>
-      <w:r>
-        <w:t>2 (Write2 Leap)</w:t>
+        <w:t>leap-poc-write2 (Write2 Leap)</w:t>
       </w:r>
     </w:p>
     <w:p>
@@ -3027,13 +3482,7 @@
         <w:t>leap-poc-read1</w:t>
       </w:r>
       <w:r>
-        <w:t xml:space="preserve"> (</w:t>
-      </w:r>
-      <w:r>
-        <w:t>Admin1</w:t>
-      </w:r>
-      <w:r>
-        <w:t xml:space="preserve"> Leap)</w:t>
+        <w:t xml:space="preserve"> (Admin1 Leap)</w:t>
       </w:r>
     </w:p>
     <w:p>
@@ -3044,13 +3493,7 @@
         <w:t>leap-poc-read2</w:t>
       </w:r>
       <w:r>
-        <w:t xml:space="preserve"> (</w:t>
-      </w:r>
-      <w:r>
-        <w:t>Admin2</w:t>
-      </w:r>
-      <w:r>
-        <w:t xml:space="preserve"> Leap)</w:t>
+        <w:t xml:space="preserve"> (Admin2 Leap)</w:t>
       </w:r>
     </w:p>
     <w:p>
@@ -3073,7 +3516,7 @@
       <w:pPr>
         <w:pStyle w:val="Heading2"/>
       </w:pPr>
-      <w:bookmarkStart w:id="6" w:name="_Toc225115676"/>
+      <w:bookmarkStart w:id="6" w:name="_Toc225694760"/>
       <w:r>
         <w:t>2</w:t>
       </w:r>
@@ -3128,13 +3571,8 @@
         </w:numPr>
       </w:pPr>
       <w:r>
-        <w:t xml:space="preserve">Name: </w:t>
-      </w:r>
-      <w:proofErr w:type="spellStart"/>
-      <w:r>
-        <w:t>poc-bff</w:t>
-      </w:r>
-      <w:proofErr w:type="spellEnd"/>
+        <w:t>Name: poc-bff</w:t>
+      </w:r>
     </w:p>
     <w:p>
       <w:pPr>
@@ -3240,7 +3678,7 @@
       <w:pPr>
         <w:pStyle w:val="Heading3"/>
       </w:pPr>
-      <w:bookmarkStart w:id="7" w:name="_Toc225115677"/>
+      <w:bookmarkStart w:id="7" w:name="_Toc225694761"/>
       <w:r>
         <w:t>2</w:t>
       </w:r>
@@ -3258,15 +3696,7 @@
         </w:numPr>
       </w:pPr>
       <w:r>
-        <w:t xml:space="preserve">App registrations → </w:t>
-      </w:r>
-      <w:proofErr w:type="spellStart"/>
-      <w:r>
-        <w:t>poc-bff</w:t>
-      </w:r>
-      <w:proofErr w:type="spellEnd"/>
-      <w:r>
-        <w:t xml:space="preserve"> →</w:t>
+        <w:t>App registrations → poc-bff →</w:t>
       </w:r>
       <w:r>
         <w:t xml:space="preserve"> </w:t>
@@ -3360,7 +3790,7 @@
       <w:pPr>
         <w:pStyle w:val="Heading3"/>
       </w:pPr>
-      <w:bookmarkStart w:id="8" w:name="_Toc225115678"/>
+      <w:bookmarkStart w:id="8" w:name="_Toc225694762"/>
       <w:r>
         <w:t xml:space="preserve">1.3.2 </w:t>
       </w:r>
@@ -3378,15 +3808,7 @@
         </w:numPr>
       </w:pPr>
       <w:r>
-        <w:t xml:space="preserve">App registrations → </w:t>
-      </w:r>
-      <w:proofErr w:type="spellStart"/>
-      <w:r>
-        <w:t>poc-bff</w:t>
-      </w:r>
-      <w:proofErr w:type="spellEnd"/>
-      <w:r>
-        <w:t xml:space="preserve"> → </w:t>
+        <w:t xml:space="preserve">App registrations → poc-bff → </w:t>
       </w:r>
       <w:r>
         <w:rPr>
@@ -3465,15 +3887,7 @@
         </w:r>
       </w:hyperlink>
       <w:r>
-        <w:t xml:space="preserve"> </w:t>
-      </w:r>
-      <w:proofErr w:type="gramStart"/>
-      <w:r>
-        <w:t xml:space="preserve">  ??</w:t>
-      </w:r>
-      <w:proofErr w:type="gramEnd"/>
-      <w:r>
-        <w:t xml:space="preserve"> </w:t>
+        <w:t xml:space="preserve">   ?? </w:t>
       </w:r>
       <w:r>
         <w:t>The logout URL must start with "HTTPS"</w:t>
@@ -3551,7 +3965,7 @@
       <w:pPr>
         <w:pStyle w:val="Heading2"/>
       </w:pPr>
-      <w:bookmarkStart w:id="9" w:name="_Toc225115679"/>
+      <w:bookmarkStart w:id="9" w:name="_Toc225694763"/>
       <w:r>
         <w:t xml:space="preserve">1.4 </w:t>
       </w:r>
@@ -3569,15 +3983,7 @@
         </w:numPr>
       </w:pPr>
       <w:r>
-        <w:t xml:space="preserve">App registrations → </w:t>
-      </w:r>
-      <w:proofErr w:type="spellStart"/>
-      <w:r>
-        <w:t>poc-bff</w:t>
-      </w:r>
-      <w:proofErr w:type="spellEnd"/>
-      <w:r>
-        <w:t xml:space="preserve"> → </w:t>
+        <w:t xml:space="preserve">App registrations → poc-bff → </w:t>
       </w:r>
       <w:r>
         <w:rPr>
@@ -3719,7 +4125,7 @@
       <w:pPr>
         <w:pStyle w:val="Heading2"/>
       </w:pPr>
-      <w:bookmarkStart w:id="10" w:name="_Toc225115680"/>
+      <w:bookmarkStart w:id="10" w:name="_Toc225694764"/>
       <w:r>
         <w:t xml:space="preserve">1.5 </w:t>
       </w:r>
@@ -3756,7 +4162,6 @@
       <w:r>
         <w:t xml:space="preserve">Find </w:t>
       </w:r>
-      <w:proofErr w:type="spellStart"/>
       <w:r>
         <w:rPr>
           <w:b/>
@@ -3764,7 +4169,6 @@
         </w:rPr>
         <w:t>poc-bff</w:t>
       </w:r>
-      <w:proofErr w:type="spellEnd"/>
       <w:r>
         <w:t xml:space="preserve"> (this is the service principal created from your app registration)</w:t>
       </w:r>
@@ -3864,11 +4268,7 @@
         <w:t>✅</w:t>
       </w:r>
       <w:r>
-        <w:t xml:space="preserve"> Now Entra will include </w:t>
-      </w:r>
-      <w:proofErr w:type="gramStart"/>
-      <w:r>
-        <w:t xml:space="preserve">a </w:t>
+        <w:t xml:space="preserve"> Now Entra will include a </w:t>
       </w:r>
       <w:r>
         <w:rPr>
@@ -3877,7 +4277,6 @@
         </w:rPr>
         <w:t>roles</w:t>
       </w:r>
-      <w:proofErr w:type="gramEnd"/>
       <w:r>
         <w:t xml:space="preserve"> claim in tokens for these users.</w:t>
       </w:r>
@@ -3886,7 +4285,7 @@
       <w:pPr>
         <w:pStyle w:val="Heading1"/>
       </w:pPr>
-      <w:bookmarkStart w:id="11" w:name="_Toc225115681"/>
+      <w:bookmarkStart w:id="11" w:name="_Toc225694765"/>
       <w:r>
         <w:t xml:space="preserve">3. </w:t>
       </w:r>
@@ -3929,7 +4328,7 @@
           <v:shape id="_x0000_i1025" type="#_x0000_t75" style="width:75.65pt;height:49.55pt" o:ole="">
             <v:imagedata r:id="rId9" o:title=""/>
           </v:shape>
-          <o:OLEObject Type="Embed" ProgID="Package" ShapeID="_x0000_i1025" DrawAspect="Icon" ObjectID="_1836292669" r:id="rId10"/>
+          <o:OLEObject Type="Embed" ProgID="Package" ShapeID="_x0000_i1025" DrawAspect="Icon" ObjectID="_1836409137" r:id="rId10"/>
         </w:object>
       </w:r>
     </w:p>
@@ -3937,7 +4336,7 @@
       <w:pPr>
         <w:pStyle w:val="Heading2"/>
       </w:pPr>
-      <w:bookmarkStart w:id="12" w:name="_Toc225115682"/>
+      <w:bookmarkStart w:id="12" w:name="_Toc225694766"/>
       <w:r>
         <w:t>3.</w:t>
       </w:r>
@@ -3950,7 +4349,7 @@
       <w:pPr>
         <w:pStyle w:val="Heading3"/>
       </w:pPr>
-      <w:bookmarkStart w:id="13" w:name="_Toc225115683"/>
+      <w:bookmarkStart w:id="13" w:name="_Toc225694767"/>
       <w:r>
         <w:t>3.1.1 BFF Authentication Flow Sequence Diagram</w:t>
       </w:r>
@@ -3962,7 +4361,7 @@
           <v:shape id="_x0000_i1026" type="#_x0000_t75" style="width:75.65pt;height:49.55pt" o:ole="">
             <v:imagedata r:id="rId11" o:title=""/>
           </v:shape>
-          <o:OLEObject Type="Embed" ProgID="Package" ShapeID="_x0000_i1026" DrawAspect="Icon" ObjectID="_1836292670" r:id="rId12"/>
+          <o:OLEObject Type="Embed" ProgID="Package" ShapeID="_x0000_i1026" DrawAspect="Icon" ObjectID="_1836409138" r:id="rId12"/>
         </w:object>
       </w:r>
     </w:p>
@@ -4026,7 +4425,7 @@
       <w:pPr>
         <w:pStyle w:val="Heading3"/>
       </w:pPr>
-      <w:bookmarkStart w:id="14" w:name="_Toc225115684"/>
+      <w:bookmarkStart w:id="14" w:name="_Toc225694768"/>
       <w:r>
         <w:t>3.1.2 Component Diagram</w:t>
       </w:r>
@@ -4038,7 +4437,7 @@
           <v:shape id="_x0000_i1027" type="#_x0000_t75" style="width:75.65pt;height:49.55pt" o:ole="">
             <v:imagedata r:id="rId14" o:title=""/>
           </v:shape>
-          <o:OLEObject Type="Embed" ProgID="Package" ShapeID="_x0000_i1027" DrawAspect="Icon" ObjectID="_1836292671" r:id="rId15"/>
+          <o:OLEObject Type="Embed" ProgID="Package" ShapeID="_x0000_i1027" DrawAspect="Icon" ObjectID="_1836409139" r:id="rId15"/>
         </w:object>
       </w:r>
     </w:p>
@@ -4102,7 +4501,7 @@
       <w:pPr>
         <w:pStyle w:val="Heading3"/>
       </w:pPr>
-      <w:bookmarkStart w:id="15" w:name="_Toc225115685"/>
+      <w:bookmarkStart w:id="15" w:name="_Toc225694769"/>
       <w:r>
         <w:t>3.1.3 Authorization Flow</w:t>
       </w:r>
@@ -4114,7 +4513,7 @@
           <v:shape id="_x0000_i1028" type="#_x0000_t75" style="width:75.65pt;height:49.55pt" o:ole="">
             <v:imagedata r:id="rId17" o:title=""/>
           </v:shape>
-          <o:OLEObject Type="Embed" ProgID="Package" ShapeID="_x0000_i1028" DrawAspect="Icon" ObjectID="_1836292672" r:id="rId18"/>
+          <o:OLEObject Type="Embed" ProgID="Package" ShapeID="_x0000_i1028" DrawAspect="Icon" ObjectID="_1836409140" r:id="rId18"/>
         </w:object>
       </w:r>
     </w:p>
@@ -4177,7 +4576,7 @@
       <w:pPr>
         <w:pStyle w:val="Heading2"/>
       </w:pPr>
-      <w:bookmarkStart w:id="16" w:name="_Toc225115686"/>
+      <w:bookmarkStart w:id="16" w:name="_Toc225694770"/>
       <w:r>
         <w:lastRenderedPageBreak/>
         <w:t>3.2 Implementation Plan (Phases Checklist)</w:t>
@@ -4419,13 +4818,8 @@
           </w:tcPr>
           <w:p>
             <w:r>
-              <w:t xml:space="preserve">DTOs, </w:t>
-            </w:r>
-            <w:proofErr w:type="spellStart"/>
-            <w:r>
-              <w:t>RoleConstants</w:t>
-            </w:r>
-            <w:proofErr w:type="spellEnd"/>
+              <w:t>DTOs, RoleConstants</w:t>
+            </w:r>
           </w:p>
         </w:tc>
       </w:tr>
@@ -4485,19 +4879,9 @@
             <w:hideMark/>
           </w:tcPr>
           <w:p>
-            <w:proofErr w:type="spellStart"/>
-            <w:r>
-              <w:t>SecurityConfig</w:t>
-            </w:r>
-            <w:proofErr w:type="spellEnd"/>
-            <w:r>
-              <w:t> with oauth2Login, CSRF cookie, authority mapper, </w:t>
-            </w:r>
-            <w:proofErr w:type="spellStart"/>
-            <w:r>
-              <w:t>application.yml</w:t>
-            </w:r>
-            <w:proofErr w:type="spellEnd"/>
+            <w:r>
+              <w:t>SecurityConfig with oauth2Login, CSRF cookie, authority mapper, application.yml</w:t>
+            </w:r>
           </w:p>
         </w:tc>
       </w:tr>
@@ -4539,15 +4923,7 @@
           </w:tcPr>
           <w:p>
             <w:r>
-              <w:t>/</w:t>
-            </w:r>
-            <w:proofErr w:type="spellStart"/>
-            <w:r>
-              <w:t>api</w:t>
-            </w:r>
-            <w:proofErr w:type="spellEnd"/>
-            <w:r>
-              <w:t>/me endpoint</w:t>
+              <w:t>/api/me endpoint</w:t>
             </w:r>
           </w:p>
         </w:tc>
@@ -4628,20 +5004,7 @@
           </w:tcPr>
           <w:p>
             <w:r>
-              <w:t xml:space="preserve">ng new, </w:t>
-            </w:r>
-            <w:proofErr w:type="spellStart"/>
-            <w:r>
-              <w:t>proxy.</w:t>
-            </w:r>
-            <w:proofErr w:type="gramStart"/>
-            <w:r>
-              <w:t>conf.json</w:t>
-            </w:r>
-            <w:proofErr w:type="spellEnd"/>
-            <w:proofErr w:type="gramEnd"/>
-            <w:r>
-              <w:t xml:space="preserve"> → localhost:</w:t>
+              <w:t>ng new, proxy.conf.json → localhost:</w:t>
             </w:r>
             <w:r>
               <w:t>1</w:t>
@@ -4771,15 +5134,7 @@
           </w:tcPr>
           <w:p>
             <w:r>
-              <w:t>GET /</w:t>
-            </w:r>
-            <w:proofErr w:type="spellStart"/>
-            <w:r>
-              <w:t>api</w:t>
-            </w:r>
-            <w:proofErr w:type="spellEnd"/>
-            <w:r>
-              <w:t>/me, cache result, route guards</w:t>
+              <w:t>GET /api/me, cache result, route guards</w:t>
             </w:r>
           </w:p>
         </w:tc>
@@ -5104,7 +5459,7 @@
           <w:bCs/>
         </w:rPr>
       </w:pPr>
-      <w:bookmarkStart w:id="17" w:name="_Toc225115687"/>
+      <w:bookmarkStart w:id="17" w:name="_Toc225694771"/>
       <w:r>
         <w:t xml:space="preserve">3.3 </w:t>
       </w:r>
@@ -5199,15 +5554,7 @@
           </w:tcPr>
           <w:p>
             <w:r>
-              <w:t xml:space="preserve">Sees "User </w:t>
-            </w:r>
-            <w:proofErr w:type="spellStart"/>
-            <w:r>
-              <w:t>Mgmt</w:t>
-            </w:r>
-            <w:proofErr w:type="spellEnd"/>
-            <w:r>
-              <w:t>"</w:t>
+              <w:t>Sees "User Mgmt"</w:t>
             </w:r>
           </w:p>
         </w:tc>
@@ -5265,11 +5612,9 @@
             <w:hideMark/>
           </w:tcPr>
           <w:p>
-            <w:proofErr w:type="spellStart"/>
             <w:r>
               <w:t>admin@yourtenant</w:t>
             </w:r>
-            <w:proofErr w:type="spellEnd"/>
           </w:p>
         </w:tc>
         <w:tc>
@@ -5364,11 +5709,9 @@
             <w:hideMark/>
           </w:tcPr>
           <w:p>
-            <w:proofErr w:type="spellStart"/>
             <w:r>
               <w:t>admin-rw@yourtenant</w:t>
             </w:r>
-            <w:proofErr w:type="spellEnd"/>
           </w:p>
         </w:tc>
         <w:tc>
@@ -5463,11 +5806,9 @@
             <w:hideMark/>
           </w:tcPr>
           <w:p>
-            <w:proofErr w:type="spellStart"/>
             <w:r>
               <w:t>reader@yourtenant</w:t>
             </w:r>
-            <w:proofErr w:type="spellEnd"/>
           </w:p>
         </w:tc>
         <w:tc>
@@ -5562,12 +5903,10 @@
             <w:hideMark/>
           </w:tcPr>
           <w:p>
-            <w:proofErr w:type="spellStart"/>
             <w:r>
               <w:lastRenderedPageBreak/>
               <w:t>writer@yourtenant</w:t>
             </w:r>
-            <w:proofErr w:type="spellEnd"/>
           </w:p>
         </w:tc>
         <w:tc>
@@ -5662,11 +6001,9 @@
             <w:hideMark/>
           </w:tcPr>
           <w:p>
-            <w:proofErr w:type="spellStart"/>
             <w:r>
               <w:t>reader-writer@yourtenant</w:t>
             </w:r>
-            <w:proofErr w:type="spellEnd"/>
           </w:p>
         </w:tc>
         <w:tc>
@@ -5848,7 +6185,7 @@
       <w:pPr>
         <w:pStyle w:val="Heading2"/>
       </w:pPr>
-      <w:bookmarkStart w:id="18" w:name="_Toc225115688"/>
+      <w:bookmarkStart w:id="18" w:name="_Toc225694772"/>
       <w:r>
         <w:t>3.4 Generate the full code skeleton</w:t>
       </w:r>
@@ -5921,19 +6258,14 @@
         </w:numPr>
       </w:pPr>
       <w:r>
-        <w:t>leap-</w:t>
-      </w:r>
-      <w:proofErr w:type="spellStart"/>
-      <w:r>
-        <w:t>frontedn</w:t>
-      </w:r>
-      <w:proofErr w:type="spellEnd"/>
+        <w:t>leap-frontedn</w:t>
+      </w:r>
     </w:p>
     <w:p>
       <w:pPr>
         <w:pStyle w:val="Heading3"/>
       </w:pPr>
-      <w:bookmarkStart w:id="19" w:name="_Toc225115689"/>
+      <w:bookmarkStart w:id="19" w:name="_Toc225694773"/>
       <w:r>
         <w:t>3.4.1 What was built</w:t>
       </w:r>
@@ -6077,27 +6409,9 @@
             <w:hideMark/>
           </w:tcPr>
           <w:p>
-            <w:proofErr w:type="spellStart"/>
-            <w:r>
-              <w:t>UserInfoDto</w:t>
-            </w:r>
-            <w:proofErr w:type="spellEnd"/>
-            <w:r>
-              <w:t>, </w:t>
-            </w:r>
-            <w:proofErr w:type="spellStart"/>
-            <w:r>
-              <w:t>BudgetRowDto</w:t>
-            </w:r>
-            <w:proofErr w:type="spellEnd"/>
-            <w:r>
-              <w:t>, </w:t>
-            </w:r>
-            <w:proofErr w:type="spellStart"/>
-            <w:r>
-              <w:t>RoleConstants</w:t>
-            </w:r>
-            <w:proofErr w:type="spellEnd"/>
+            <w:r>
+              <w:t>UserInfoDto, BudgetRowDto, RoleConstants</w:t>
+            </w:r>
           </w:p>
         </w:tc>
       </w:tr>
@@ -6140,15 +6454,7 @@
           </w:tcPr>
           <w:p>
             <w:r>
-              <w:t>GET /</w:t>
-            </w:r>
-            <w:proofErr w:type="spellStart"/>
-            <w:r>
-              <w:t>api</w:t>
-            </w:r>
-            <w:proofErr w:type="spellEnd"/>
-            <w:r>
-              <w:t>/me — returns user info + mapped roles (or anon)</w:t>
+              <w:t>GET /api/me — returns user info + mapped roles (or anon)</w:t>
             </w:r>
           </w:p>
         </w:tc>
@@ -6193,23 +6499,7 @@
           </w:tcPr>
           <w:p>
             <w:r>
-              <w:t>GET /</w:t>
-            </w:r>
-            <w:proofErr w:type="spellStart"/>
-            <w:r>
-              <w:t>api</w:t>
-            </w:r>
-            <w:proofErr w:type="spellEnd"/>
-            <w:r>
-              <w:t>/budget (APP_READ/WRITE), PUT /</w:t>
-            </w:r>
-            <w:proofErr w:type="spellStart"/>
-            <w:r>
-              <w:t>api</w:t>
-            </w:r>
-            <w:proofErr w:type="spellEnd"/>
-            <w:r>
-              <w:t>/budget/{id} (APP_WRITE), in-memory repo with 6 seed rows</w:t>
+              <w:t>GET /api/budget (APP_READ/WRITE), PUT /api/budget/{id} (APP_WRITE), in-memory repo with 6 seed rows</w:t>
             </w:r>
           </w:p>
         </w:tc>
@@ -6252,29 +6542,8 @@
             <w:hideMark/>
           </w:tcPr>
           <w:p>
-            <w:proofErr w:type="spellStart"/>
-            <w:r>
-              <w:t>SecurityConfig</w:t>
-            </w:r>
-            <w:proofErr w:type="spellEnd"/>
-            <w:r>
-              <w:t xml:space="preserve"> — oauth2Login, CSRF cookie, Entra </w:t>
-            </w:r>
-            <w:proofErr w:type="spellStart"/>
-            <w:r>
-              <w:t>roles→ROLE_APP</w:t>
-            </w:r>
-            <w:proofErr w:type="spellEnd"/>
-            <w:r>
-              <w:t>_* mapper, session-based auth. </w:t>
-            </w:r>
-            <w:proofErr w:type="spellStart"/>
-            <w:r>
-              <w:t>application.yml</w:t>
-            </w:r>
-            <w:proofErr w:type="spellEnd"/>
-            <w:r>
-              <w:t> reads ENTRA_* env vars</w:t>
+            <w:r>
+              <w:t>SecurityConfig — oauth2Login, CSRF cookie, Entra roles→ROLE_APP_* mapper, session-based auth. application.yml reads ENTRA_* env vars</w:t>
             </w:r>
           </w:p>
         </w:tc>
@@ -6403,7 +6672,6 @@
             <w:hideMark/>
           </w:tcPr>
           <w:p>
-            <w:proofErr w:type="spellStart"/>
             <w:r>
               <w:rPr>
                 <w:b/>
@@ -6411,7 +6679,6 @@
               </w:rPr>
               <w:t>AuthService</w:t>
             </w:r>
-            <w:proofErr w:type="spellEnd"/>
           </w:p>
         </w:tc>
         <w:tc>
@@ -6429,52 +6696,7 @@
           </w:tcPr>
           <w:p>
             <w:r>
-              <w:t>Calls /</w:t>
-            </w:r>
-            <w:proofErr w:type="spellStart"/>
-            <w:r>
-              <w:t>api</w:t>
-            </w:r>
-            <w:proofErr w:type="spellEnd"/>
-            <w:r>
-              <w:t xml:space="preserve">/me on </w:t>
-            </w:r>
-            <w:proofErr w:type="spellStart"/>
-            <w:r>
-              <w:t>init</w:t>
-            </w:r>
-            <w:proofErr w:type="spellEnd"/>
-            <w:r>
-              <w:t>, caches user, exposes </w:t>
-            </w:r>
-            <w:proofErr w:type="spellStart"/>
-            <w:proofErr w:type="gramStart"/>
-            <w:r>
-              <w:t>hasRole</w:t>
-            </w:r>
-            <w:proofErr w:type="spellEnd"/>
-            <w:r>
-              <w:t>(</w:t>
-            </w:r>
-            <w:proofErr w:type="gramEnd"/>
-            <w:r>
-              <w:t>), </w:t>
-            </w:r>
-            <w:proofErr w:type="gramStart"/>
-            <w:r>
-              <w:t>login(</w:t>
-            </w:r>
-            <w:proofErr w:type="gramEnd"/>
-            <w:r>
-              <w:t>), </w:t>
-            </w:r>
-            <w:proofErr w:type="gramStart"/>
-            <w:r>
-              <w:t>logout(</w:t>
-            </w:r>
-            <w:proofErr w:type="gramEnd"/>
-            <w:r>
-              <w:t>)</w:t>
+              <w:t>Calls /api/me on init, caches user, exposes hasRole(), login(), logout()</w:t>
             </w:r>
           </w:p>
         </w:tc>
@@ -6494,7 +6716,6 @@
             <w:hideMark/>
           </w:tcPr>
           <w:p>
-            <w:proofErr w:type="spellStart"/>
             <w:r>
               <w:rPr>
                 <w:b/>
@@ -6502,7 +6723,6 @@
               </w:rPr>
               <w:t>csrfInterceptor</w:t>
             </w:r>
-            <w:proofErr w:type="spellEnd"/>
           </w:p>
         </w:tc>
         <w:tc>
@@ -6540,7 +6760,6 @@
             <w:hideMark/>
           </w:tcPr>
           <w:p>
-            <w:proofErr w:type="spellStart"/>
             <w:r>
               <w:rPr>
                 <w:b/>
@@ -6548,7 +6767,6 @@
               </w:rPr>
               <w:t>roleGuard</w:t>
             </w:r>
-            <w:proofErr w:type="spellEnd"/>
           </w:p>
         </w:tc>
         <w:tc>
@@ -6568,32 +6786,14 @@
             <w:r>
               <w:t>Route guard factory: </w:t>
             </w:r>
-            <w:proofErr w:type="spellStart"/>
-            <w:r>
-              <w:fldChar w:fldCharType="begin"/>
-            </w:r>
-            <w:r>
-              <w:instrText>HYPERLINK "vscode-file://vscode-app/d:/apps/Microsoft%20VS%20Code/072586267e/resources/app/out/vs/code/electron-browser/workbench/workbench.html" \o ""</w:instrText>
-            </w:r>
-            <w:r>
-              <w:fldChar w:fldCharType="separate"/>
-            </w:r>
-            <w:r>
-              <w:rPr>
-                <w:rStyle w:val="Hyperlink"/>
-              </w:rPr>
-              <w:t>roleGuard</w:t>
-            </w:r>
-            <w:proofErr w:type="spellEnd"/>
-            <w:r>
-              <w:rPr>
-                <w:rStyle w:val="Hyperlink"/>
-              </w:rPr>
-              <w:t>('APP_READ', 'APP_WRITE')</w:t>
-            </w:r>
-            <w:r>
-              <w:fldChar w:fldCharType="end"/>
-            </w:r>
+            <w:hyperlink r:id="rId20" w:history="1">
+              <w:r>
+                <w:rPr>
+                  <w:rStyle w:val="Hyperlink"/>
+                </w:rPr>
+                <w:t>roleGuard('APP_READ', 'APP_WRITE')</w:t>
+              </w:r>
+            </w:hyperlink>
           </w:p>
         </w:tc>
       </w:tr>
@@ -6612,7 +6812,6 @@
             <w:hideMark/>
           </w:tcPr>
           <w:p>
-            <w:proofErr w:type="spellStart"/>
             <w:r>
               <w:rPr>
                 <w:b/>
@@ -6620,7 +6819,6 @@
               </w:rPr>
               <w:t>HeaderComponent</w:t>
             </w:r>
-            <w:proofErr w:type="spellEnd"/>
           </w:p>
         </w:tc>
         <w:tc>
@@ -6658,7 +6856,6 @@
             <w:hideMark/>
           </w:tcPr>
           <w:p>
-            <w:proofErr w:type="spellStart"/>
             <w:r>
               <w:rPr>
                 <w:b/>
@@ -6666,7 +6863,6 @@
               </w:rPr>
               <w:t>WelcomeComponent</w:t>
             </w:r>
-            <w:proofErr w:type="spellEnd"/>
           </w:p>
         </w:tc>
         <w:tc>
@@ -6704,7 +6900,6 @@
             <w:hideMark/>
           </w:tcPr>
           <w:p>
-            <w:proofErr w:type="spellStart"/>
             <w:r>
               <w:rPr>
                 <w:b/>
@@ -6712,7 +6907,6 @@
               </w:rPr>
               <w:t>UserManagementComponent</w:t>
             </w:r>
-            <w:proofErr w:type="spellEnd"/>
           </w:p>
         </w:tc>
         <w:tc>
@@ -6750,7 +6944,6 @@
             <w:hideMark/>
           </w:tcPr>
           <w:p>
-            <w:proofErr w:type="spellStart"/>
             <w:r>
               <w:rPr>
                 <w:b/>
@@ -6758,7 +6951,6 @@
               </w:rPr>
               <w:t>BudgetReportComponent</w:t>
             </w:r>
-            <w:proofErr w:type="spellEnd"/>
           </w:p>
         </w:tc>
         <w:tc>
@@ -6796,24 +6988,13 @@
             <w:hideMark/>
           </w:tcPr>
           <w:p>
-            <w:proofErr w:type="spellStart"/>
             <w:r>
               <w:rPr>
                 <w:b/>
                 <w:bCs/>
               </w:rPr>
-              <w:t>proxy.</w:t>
-            </w:r>
-            <w:proofErr w:type="gramStart"/>
-            <w:r>
-              <w:rPr>
-                <w:b/>
-                <w:bCs/>
-              </w:rPr>
-              <w:t>conf.json</w:t>
-            </w:r>
-            <w:proofErr w:type="spellEnd"/>
-            <w:proofErr w:type="gramEnd"/>
+              <w:t>proxy.conf.json</w:t>
+            </w:r>
           </w:p>
         </w:tc>
         <w:tc>
@@ -6831,15 +7012,7 @@
           </w:tcPr>
           <w:p>
             <w:r>
-              <w:t>Proxies /</w:t>
-            </w:r>
-            <w:proofErr w:type="spellStart"/>
-            <w:r>
-              <w:t>api</w:t>
-            </w:r>
-            <w:proofErr w:type="spellEnd"/>
-            <w:r>
-              <w:t xml:space="preserve">, /oauth2, /login, /logout → port </w:t>
+              <w:t xml:space="preserve">Proxies /api, /oauth2, /login, /logout → port </w:t>
             </w:r>
             <w:r>
               <w:t>1</w:t>
@@ -6856,7 +7029,7 @@
       <w:pPr>
         <w:pStyle w:val="Heading3"/>
       </w:pPr>
-      <w:bookmarkStart w:id="20" w:name="_Toc225115690"/>
+      <w:bookmarkStart w:id="20" w:name="_Toc225694774"/>
       <w:r>
         <w:lastRenderedPageBreak/>
         <w:t xml:space="preserve">3.4.2 </w:t>
@@ -6892,28 +7065,7 @@
         <w:t>Backend:</w:t>
       </w:r>
       <w:r>
-        <w:t> </w:t>
-      </w:r>
-      <w:proofErr w:type="spellStart"/>
-      <w:r>
-        <w:t>mvn</w:t>
-      </w:r>
-      <w:proofErr w:type="spellEnd"/>
-      <w:r>
-        <w:t xml:space="preserve"> </w:t>
-      </w:r>
-      <w:proofErr w:type="spellStart"/>
-      <w:r>
-        <w:t>spring-</w:t>
-      </w:r>
-      <w:proofErr w:type="gramStart"/>
-      <w:r>
-        <w:t>boot:run</w:t>
-      </w:r>
-      <w:proofErr w:type="spellEnd"/>
-      <w:proofErr w:type="gramEnd"/>
-      <w:r>
-        <w:t xml:space="preserve"> -pl leap-app (port </w:t>
+        <w:t xml:space="preserve"> mvn spring-boot:run -pl leap-app (port </w:t>
       </w:r>
       <w:r>
         <w:t>1</w:t>
@@ -6937,15 +7089,7 @@
         <w:t>Frontend:</w:t>
       </w:r>
       <w:r>
-        <w:t xml:space="preserve"> cd leap-frontend &amp;&amp; </w:t>
-      </w:r>
-      <w:proofErr w:type="spellStart"/>
-      <w:r>
-        <w:t>npm</w:t>
-      </w:r>
-      <w:proofErr w:type="spellEnd"/>
-      <w:r>
-        <w:t xml:space="preserve"> start (port 4200)</w:t>
+        <w:t> cd leap-frontend &amp;&amp; npm start (port 4200)</w:t>
       </w:r>
     </w:p>
     <w:p>
@@ -6970,7 +7114,7 @@
       <w:pPr>
         <w:pStyle w:val="Heading1"/>
       </w:pPr>
-      <w:bookmarkStart w:id="21" w:name="_Toc225115691"/>
+      <w:bookmarkStart w:id="21" w:name="_Toc225694775"/>
       <w:r>
         <w:t>4. Troubleshooting</w:t>
       </w:r>
@@ -6984,7 +7128,7 @@
           <w:bCs/>
         </w:rPr>
       </w:pPr>
-      <w:bookmarkStart w:id="22" w:name="_Toc225115692"/>
+      <w:bookmarkStart w:id="22" w:name="_Toc225694776"/>
       <w:r>
         <w:t xml:space="preserve">4.1 </w:t>
       </w:r>
@@ -7070,7 +7214,6 @@
       <w:r>
         <w:t>se Spring Security's </w:t>
       </w:r>
-      <w:proofErr w:type="spellStart"/>
       <w:r>
         <w:rPr>
           <w:b/>
@@ -7078,7 +7221,6 @@
         </w:rPr>
         <w:t>OidcClientInitiatedLogoutSuccessHandler</w:t>
       </w:r>
-      <w:proofErr w:type="spellEnd"/>
       <w:r>
         <w:t> which</w:t>
       </w:r>
@@ -7119,21 +7261,7 @@
         <w:rPr>
           <w:bCs/>
         </w:rPr>
-        <w:t xml:space="preserve">Redirects the browser to Entra's </w:t>
-      </w:r>
-      <w:proofErr w:type="spellStart"/>
-      <w:r>
-        <w:rPr>
-          <w:bCs/>
-        </w:rPr>
-        <w:t>end_session_endpoint</w:t>
-      </w:r>
-      <w:proofErr w:type="spellEnd"/>
-      <w:r>
-        <w:rPr>
-          <w:bCs/>
-        </w:rPr>
-        <w:t xml:space="preserve"> (https://login.microsoftonline.com/{tenant}/oauth2/v2.0/logout)</w:t>
+        <w:t>Redirects the browser to Entra's end_session_endpoint (https://login.microsoftonline.com/{tenant}/oauth2/v2.0/logout)</w:t>
       </w:r>
     </w:p>
     <w:p>
@@ -7171,7 +7299,7 @@
         </w:rPr>
         <w:t xml:space="preserve">Entra redirects back to </w:t>
       </w:r>
-      <w:hyperlink r:id="rId20" w:history="1">
+      <w:hyperlink r:id="rId21" w:history="1">
         <w:r>
           <w:rPr>
             <w:rStyle w:val="Hyperlink"/>
@@ -7193,17 +7321,8 @@
           <w:b/>
           <w:bCs/>
         </w:rPr>
-        <w:t>(Below is already done at the beginning</w:t>
-      </w:r>
-      <w:proofErr w:type="gramStart"/>
-      <w:r>
-        <w:rPr>
-          <w:b/>
-          <w:bCs/>
-        </w:rPr>
-        <w:t>) :</w:t>
-      </w:r>
-      <w:proofErr w:type="gramEnd"/>
+        <w:t>(Below is already done at the beginning) :</w:t>
+      </w:r>
     </w:p>
     <w:p>
       <w:pPr>
@@ -7266,21 +7385,7 @@
           <w:bCs/>
         </w:rPr>
         <w:lastRenderedPageBreak/>
-        <w:t>Azure Portal → App Registrations → "</w:t>
-      </w:r>
-      <w:proofErr w:type="spellStart"/>
-      <w:r>
-        <w:rPr>
-          <w:bCs/>
-        </w:rPr>
-        <w:t>poc-bff</w:t>
-      </w:r>
-      <w:proofErr w:type="spellEnd"/>
-      <w:r>
-        <w:rPr>
-          <w:bCs/>
-        </w:rPr>
-        <w:t>" → Authentication</w:t>
+        <w:t>Azure Portal → App Registrations → "poc-bff" → Authentication</w:t>
       </w:r>
     </w:p>
     <w:p>
@@ -7321,7 +7426,7 @@
           <w:bCs/>
         </w:rPr>
       </w:pPr>
-      <w:bookmarkStart w:id="23" w:name="_Toc225115693"/>
+      <w:bookmarkStart w:id="23" w:name="_Toc225694777"/>
       <w:r>
         <w:t xml:space="preserve">4.2 </w:t>
       </w:r>
@@ -7351,41 +7456,7 @@
     </w:p>
     <w:p>
       <w:r>
-        <w:t xml:space="preserve">The </w:t>
-      </w:r>
-      <w:proofErr w:type="spellStart"/>
-      <w:proofErr w:type="gramStart"/>
-      <w:r>
-        <w:t>principal.getAuthorities</w:t>
-      </w:r>
-      <w:proofErr w:type="spellEnd"/>
-      <w:proofErr w:type="gramEnd"/>
-      <w:r>
-        <w:t xml:space="preserve">() only has OIDC_USER, </w:t>
-      </w:r>
-      <w:proofErr w:type="spellStart"/>
-      <w:r>
-        <w:t>SCOPE_email</w:t>
-      </w:r>
-      <w:proofErr w:type="spellEnd"/>
-      <w:r>
-        <w:t xml:space="preserve">, </w:t>
-      </w:r>
-      <w:proofErr w:type="spellStart"/>
-      <w:r>
-        <w:t>SCOPE_openid</w:t>
-      </w:r>
-      <w:proofErr w:type="spellEnd"/>
-      <w:r>
-        <w:t xml:space="preserve">, </w:t>
-      </w:r>
-      <w:proofErr w:type="spellStart"/>
-      <w:r>
-        <w:t>SCOPE_profile</w:t>
-      </w:r>
-      <w:proofErr w:type="spellEnd"/>
-      <w:r>
-        <w:t>. No roles are being mapped.</w:t>
+        <w:t>The principal.getAuthorities() only has OIDC_USER, SCOPE_email, SCOPE_openid, SCOPE_profile. No roles are being mapped.</w:t>
       </w:r>
     </w:p>
     <w:p>
@@ -7412,68 +7483,20 @@
     </w:p>
     <w:p>
       <w:r>
-        <w:t>The old </w:t>
-      </w:r>
-      <w:proofErr w:type="spellStart"/>
-      <w:r>
-        <w:t>GrantedAuthoritiesMapper</w:t>
-      </w:r>
-      <w:proofErr w:type="spellEnd"/>
-      <w:r>
-        <w:t> read roles from </w:t>
-      </w:r>
-      <w:proofErr w:type="spellStart"/>
-      <w:r>
-        <w:fldChar w:fldCharType="begin"/>
-      </w:r>
-      <w:r>
-        <w:instrText>HYPERLINK "vscode-file://vscode-app/d:/apps/Microsoft%20VS%20Code/072586267e/resources/app/out/vs/code/electron-browser/workbench/workbench.html" \o ""</w:instrText>
-      </w:r>
-      <w:r>
-        <w:fldChar w:fldCharType="separate"/>
-      </w:r>
-      <w:r>
-        <w:rPr>
-          <w:rStyle w:val="Hyperlink"/>
-        </w:rPr>
-        <w:t>oidcUserAuthority.getIdToken</w:t>
-      </w:r>
-      <w:proofErr w:type="spellEnd"/>
-      <w:r>
-        <w:rPr>
-          <w:rStyle w:val="Hyperlink"/>
-        </w:rPr>
-        <w:t>().</w:t>
-      </w:r>
-      <w:proofErr w:type="spellStart"/>
-      <w:r>
-        <w:rPr>
-          <w:rStyle w:val="Hyperlink"/>
-        </w:rPr>
-        <w:t>getClaims</w:t>
-      </w:r>
-      <w:proofErr w:type="spellEnd"/>
-      <w:r>
-        <w:rPr>
-          <w:rStyle w:val="Hyperlink"/>
-        </w:rPr>
-        <w:t>()</w:t>
-      </w:r>
-      <w:r>
-        <w:fldChar w:fldCharType="end"/>
-      </w:r>
-      <w:r>
-        <w:t>. But Spring Security's </w:t>
-      </w:r>
-      <w:proofErr w:type="spellStart"/>
-      <w:r>
-        <w:t>OidcIdToken</w:t>
-      </w:r>
-      <w:proofErr w:type="spellEnd"/>
-      <w:r>
-        <w:t> doesn't always expose non-standard claims (like Entra's </w:t>
-      </w:r>
-      <w:hyperlink r:id="rId21" w:history="1">
+        <w:t>The old GrantedAuthoritiesMapper read roles from </w:t>
+      </w:r>
+      <w:hyperlink r:id="rId22" w:history="1">
+        <w:r>
+          <w:rPr>
+            <w:rStyle w:val="Hyperlink"/>
+          </w:rPr>
+          <w:t>oidcUserAuthority.getIdToken().getClaims()</w:t>
+        </w:r>
+      </w:hyperlink>
+      <w:r>
+        <w:t>. But Spring Security's OidcIdToken doesn't always expose non-standard claims (like Entra's </w:t>
+      </w:r>
+      <w:hyperlink r:id="rId23" w:history="1">
         <w:r>
           <w:rPr>
             <w:rStyle w:val="Hyperlink"/>
@@ -7490,183 +7513,117 @@
       <w:r>
         <w:t xml:space="preserve"> confirmed </w:t>
       </w:r>
-      <w:proofErr w:type="spellStart"/>
-      <w:r>
-        <w:fldChar w:fldCharType="begin"/>
-      </w:r>
-      <w:r>
-        <w:instrText>HYPERLINK "vscode-file://vscode-app/d:/apps/Microsoft%20VS%20Code/072586267e/resources/app/out/vs/code/electron-browser/workbench/workbench.html" \o ""</w:instrText>
-      </w:r>
-      <w:r>
-        <w:fldChar w:fldCharType="separate"/>
-      </w:r>
-      <w:r>
-        <w:rPr>
-          <w:rStyle w:val="Hyperlink"/>
-        </w:rPr>
-        <w:t>principal.getAttribute</w:t>
-      </w:r>
-      <w:proofErr w:type="spellEnd"/>
-      <w:r>
-        <w:rPr>
-          <w:rStyle w:val="Hyperlink"/>
-        </w:rPr>
-        <w:t>("roles")</w:t>
-      </w:r>
-      <w:r>
-        <w:fldChar w:fldCharType="end"/>
-      </w:r>
-      <w:r>
-        <w:t> works — that reads from </w:t>
-      </w:r>
-      <w:proofErr w:type="spellStart"/>
-      <w:r>
-        <w:fldChar w:fldCharType="begin"/>
-      </w:r>
-      <w:r>
-        <w:instrText>HYPERLINK "vscode-file://vscode-app/d:/apps/Microsoft%20VS%20Code/072586267e/resources/app/out/vs/code/electron-browser/workbench/workbench.html" \o ""</w:instrText>
-      </w:r>
-      <w:r>
-        <w:fldChar w:fldCharType="separate"/>
-      </w:r>
-      <w:r>
-        <w:rPr>
-          <w:rStyle w:val="Hyperlink"/>
-        </w:rPr>
-        <w:t>OidcUser.getAttributes</w:t>
-      </w:r>
-      <w:proofErr w:type="spellEnd"/>
-      <w:r>
-        <w:rPr>
-          <w:rStyle w:val="Hyperlink"/>
-        </w:rPr>
-        <w:t>()</w:t>
-      </w:r>
-      <w:r>
-        <w:fldChar w:fldCharType="end"/>
-      </w:r>
-      <w:r>
-        <w:t>, which is the merged attribute map.</w:t>
-      </w:r>
-    </w:p>
-    <w:p>
-      <w:pPr>
-        <w:rPr>
-          <w:b/>
-          <w:bCs/>
-        </w:rPr>
-      </w:pPr>
-      <w:r>
-        <w:rPr>
-          <w:b/>
-          <w:bCs/>
-        </w:rPr>
-        <w:t>Solution:</w:t>
-      </w:r>
-    </w:p>
-    <w:p>
-      <w:r>
-        <w:t>Replaced the </w:t>
-      </w:r>
-      <w:proofErr w:type="spellStart"/>
-      <w:r>
-        <w:rPr>
-          <w:b/>
-          <w:bCs/>
-        </w:rPr>
-        <w:t>GrantedAuthoritiesMapper</w:t>
-      </w:r>
-      <w:proofErr w:type="spellEnd"/>
-      <w:r>
-        <w:t> bean with a </w:t>
-      </w:r>
-      <w:r>
-        <w:rPr>
-          <w:b/>
-          <w:bCs/>
-        </w:rPr>
-        <w:t>custom </w:t>
-      </w:r>
-      <w:proofErr w:type="spellStart"/>
-      <w:r>
-        <w:rPr>
-          <w:b/>
-          <w:bCs/>
-        </w:rPr>
-        <w:fldChar w:fldCharType="begin"/>
-      </w:r>
-      <w:r>
-        <w:rPr>
-          <w:b/>
-          <w:bCs/>
-        </w:rPr>
-        <w:instrText>HYPERLINK "vscode-file://vscode-app/d:/apps/Microsoft%20VS%20Code/072586267e/resources/app/out/vs/code/electron-browser/workbench/workbench.html" \o ""</w:instrText>
-      </w:r>
-      <w:r>
-        <w:rPr>
-          <w:b/>
-          <w:bCs/>
-        </w:rPr>
-      </w:r>
-      <w:r>
-        <w:rPr>
-          <w:b/>
-          <w:bCs/>
-        </w:rPr>
-        <w:fldChar w:fldCharType="separate"/>
-      </w:r>
-      <w:r>
-        <w:rPr>
-          <w:rStyle w:val="Hyperlink"/>
-        </w:rPr>
-        <w:t>OidcUserService</w:t>
-      </w:r>
-      <w:proofErr w:type="spellEnd"/>
-      <w:r>
-        <w:fldChar w:fldCharType="end"/>
-      </w:r>
-      <w:r>
-        <w:t> wired into </w:t>
-      </w:r>
-      <w:hyperlink r:id="rId22" w:history="1">
+      <w:hyperlink r:id="rId24" w:history="1">
         <w:r>
           <w:rPr>
             <w:rStyle w:val="Hyperlink"/>
           </w:rPr>
-          <w:t>.oauth2Login().</w:t>
+          <w:t>principal.getAttribute("roles")</w:t>
         </w:r>
-        <w:proofErr w:type="spellStart"/>
+      </w:hyperlink>
+      <w:r>
+        <w:t> works — that reads from </w:t>
+      </w:r>
+      <w:hyperlink r:id="rId25" w:history="1">
         <w:r>
           <w:rPr>
             <w:rStyle w:val="Hyperlink"/>
           </w:rPr>
-          <w:t>userInfoEndpoint</w:t>
+          <w:t>OidcUser.getAttributes()</w:t>
         </w:r>
-        <w:proofErr w:type="spellEnd"/>
+      </w:hyperlink>
+      <w:r>
+        <w:t>, which is the merged attribute map.</w:t>
+      </w:r>
+    </w:p>
+    <w:p>
+      <w:pPr>
+        <w:rPr>
+          <w:b/>
+          <w:bCs/>
+        </w:rPr>
+      </w:pPr>
+      <w:r>
+        <w:rPr>
+          <w:b/>
+          <w:bCs/>
+        </w:rPr>
+        <w:t>Solution:</w:t>
+      </w:r>
+    </w:p>
+    <w:p>
+      <w:r>
+        <w:t>Replaced the </w:t>
+      </w:r>
+      <w:r>
+        <w:rPr>
+          <w:b/>
+          <w:bCs/>
+        </w:rPr>
+        <w:t>GrantedAuthoritiesMapper</w:t>
+      </w:r>
+      <w:r>
+        <w:t> bean with a </w:t>
+      </w:r>
+      <w:r>
+        <w:rPr>
+          <w:b/>
+          <w:bCs/>
+        </w:rPr>
+        <w:t>custom </w:t>
+      </w:r>
+      <w:hyperlink r:id="rId26" w:history="1">
         <w:r>
           <w:rPr>
             <w:rStyle w:val="Hyperlink"/>
           </w:rPr>
-          <w:t>().</w:t>
+          <w:t>OidcUserService</w:t>
         </w:r>
-        <w:proofErr w:type="spellStart"/>
+      </w:hyperlink>
+      <w:r>
+        <w:t> wired into </w:t>
+      </w:r>
+      <w:hyperlink r:id="rId27" w:history="1">
         <w:r>
           <w:rPr>
             <w:rStyle w:val="Hyperlink"/>
           </w:rPr>
-          <w:t>oidcUserService</w:t>
+          <w:t>.oauth2Login().userInfoEndpoint().oidcUserService(...)</w:t>
         </w:r>
-        <w:proofErr w:type="spellEnd"/>
+      </w:hyperlink>
+      <w:r>
+        <w:t>. This:</w:t>
+      </w:r>
+    </w:p>
+    <w:p>
+      <w:pPr>
+        <w:numPr>
+          <w:ilvl w:val="0"/>
+          <w:numId w:val="20"/>
+        </w:numPr>
+      </w:pPr>
+      <w:r>
+        <w:t>Delegates to the default </w:t>
+      </w:r>
+      <w:hyperlink r:id="rId28" w:history="1">
         <w:r>
           <w:rPr>
             <w:rStyle w:val="Hyperlink"/>
           </w:rPr>
-          <w:t>(...)</w:t>
+          <w:t>OidcUserService</w:t>
         </w:r>
       </w:hyperlink>
       <w:r>
-        <w:t>. This:</w:t>
-      </w:r>
+        <w:t> to get the </w:t>
+      </w:r>
+      <w:hyperlink r:id="rId29" w:history="1">
+        <w:r>
+          <w:rPr>
+            <w:rStyle w:val="Hyperlink"/>
+          </w:rPr>
+          <w:t>OidcUser</w:t>
+        </w:r>
+      </w:hyperlink>
     </w:p>
     <w:p>
       <w:pPr>
@@ -7676,50 +7633,18 @@
         </w:numPr>
       </w:pPr>
       <w:r>
-        <w:t>Delegates to the default </w:t>
-      </w:r>
-      <w:proofErr w:type="spellStart"/>
-      <w:r>
-        <w:fldChar w:fldCharType="begin"/>
-      </w:r>
-      <w:r>
-        <w:instrText>HYPERLINK "vscode-file://vscode-app/d:/apps/Microsoft%20VS%20Code/072586267e/resources/app/out/vs/code/electron-browser/workbench/workbench.html" \o ""</w:instrText>
-      </w:r>
-      <w:r>
-        <w:fldChar w:fldCharType="separate"/>
-      </w:r>
-      <w:r>
-        <w:rPr>
-          <w:rStyle w:val="Hyperlink"/>
-        </w:rPr>
-        <w:t>OidcUserService</w:t>
-      </w:r>
-      <w:proofErr w:type="spellEnd"/>
-      <w:r>
-        <w:fldChar w:fldCharType="end"/>
-      </w:r>
-      <w:r>
-        <w:t> to get the </w:t>
-      </w:r>
-      <w:proofErr w:type="spellStart"/>
-      <w:r>
-        <w:fldChar w:fldCharType="begin"/>
-      </w:r>
-      <w:r>
-        <w:instrText>HYPERLINK "vscode-file://vscode-app/d:/apps/Microsoft%20VS%20Code/072586267e/resources/app/out/vs/code/electron-browser/workbench/workbench.html" \o ""</w:instrText>
-      </w:r>
-      <w:r>
-        <w:fldChar w:fldCharType="separate"/>
-      </w:r>
-      <w:r>
-        <w:rPr>
-          <w:rStyle w:val="Hyperlink"/>
-        </w:rPr>
-        <w:t>OidcUser</w:t>
-      </w:r>
-      <w:proofErr w:type="spellEnd"/>
-      <w:r>
-        <w:fldChar w:fldCharType="end"/>
+        <w:t>Reads </w:t>
+      </w:r>
+      <w:hyperlink r:id="rId30" w:history="1">
+        <w:r>
+          <w:rPr>
+            <w:rStyle w:val="Hyperlink"/>
+          </w:rPr>
+          <w:t>oidcUser.getAttribute("roles")</w:t>
+        </w:r>
+      </w:hyperlink>
+      <w:r>
+        <w:t> — exactly where you confirmed the roles exist</w:t>
       </w:r>
     </w:p>
     <w:p>
@@ -7730,36 +7655,7 @@
         </w:numPr>
       </w:pPr>
       <w:r>
-        <w:t>Reads </w:t>
-      </w:r>
-      <w:proofErr w:type="spellStart"/>
-      <w:r>
-        <w:fldChar w:fldCharType="begin"/>
-      </w:r>
-      <w:r>
-        <w:instrText>HYPERLINK "vscode-file://vscode-app/d:/apps/Microsoft%20VS%20Code/072586267e/resources/app/out/vs/code/electron-browser/workbench/workbench.html" \o ""</w:instrText>
-      </w:r>
-      <w:r>
-        <w:fldChar w:fldCharType="separate"/>
-      </w:r>
-      <w:r>
-        <w:rPr>
-          <w:rStyle w:val="Hyperlink"/>
-        </w:rPr>
-        <w:t>oidcUser.getAttribute</w:t>
-      </w:r>
-      <w:proofErr w:type="spellEnd"/>
-      <w:r>
-        <w:rPr>
-          <w:rStyle w:val="Hyperlink"/>
-        </w:rPr>
-        <w:t>("roles")</w:t>
-      </w:r>
-      <w:r>
-        <w:fldChar w:fldCharType="end"/>
-      </w:r>
-      <w:r>
-        <w:t> — exactly where you confirmed the roles exist</w:t>
+        <w:t>Maps each Entra role to ROLE_APP_ADMIN, ROLE_APP_READ, ROLE_APP_WRITE authorities</w:t>
       </w:r>
     </w:p>
     <w:p>
@@ -7770,39 +7666,16 @@
         </w:numPr>
       </w:pPr>
       <w:r>
-        <w:t>Maps each Entra role to ROLE_APP_ADMIN, ROLE_APP_READ, ROLE_APP_WRITE authorities</w:t>
-      </w:r>
-    </w:p>
-    <w:p>
-      <w:pPr>
-        <w:numPr>
-          <w:ilvl w:val="0"/>
-          <w:numId w:val="20"/>
-        </w:numPr>
-      </w:pPr>
-      <w:r>
         <w:t>Returns a new </w:t>
       </w:r>
-      <w:proofErr w:type="spellStart"/>
-      <w:r>
-        <w:fldChar w:fldCharType="begin"/>
-      </w:r>
-      <w:r>
-        <w:instrText>HYPERLINK "vscode-file://vscode-app/d:/apps/Microsoft%20VS%20Code/072586267e/resources/app/out/vs/code/electron-browser/workbench/workbench.html" \o ""</w:instrText>
-      </w:r>
-      <w:r>
-        <w:fldChar w:fldCharType="separate"/>
-      </w:r>
-      <w:r>
-        <w:rPr>
-          <w:rStyle w:val="Hyperlink"/>
-        </w:rPr>
-        <w:t>DefaultOidcUser</w:t>
-      </w:r>
-      <w:proofErr w:type="spellEnd"/>
-      <w:r>
-        <w:fldChar w:fldCharType="end"/>
-      </w:r>
+      <w:hyperlink r:id="rId31" w:history="1">
+        <w:r>
+          <w:rPr>
+            <w:rStyle w:val="Hyperlink"/>
+          </w:rPr>
+          <w:t>DefaultOidcUser</w:t>
+        </w:r>
+      </w:hyperlink>
       <w:r>
         <w:t> with the combined authorities</w:t>
       </w:r>
@@ -7842,7 +7715,7 @@
                     </pic:cNvPicPr>
                   </pic:nvPicPr>
                   <pic:blipFill>
-                    <a:blip r:embed="rId23">
+                    <a:blip r:embed="rId32">
                       <a:extLst>
                         <a:ext uri="{28A0092B-C50C-407E-A947-70E740481C1C}">
                           <a14:useLocalDpi xmlns:a14="http://schemas.microsoft.com/office/drawing/2010/main" val="0"/>
@@ -7902,7 +7775,7 @@
                     </pic:cNvPicPr>
                   </pic:nvPicPr>
                   <pic:blipFill>
-                    <a:blip r:embed="rId24">
+                    <a:blip r:embed="rId33">
                       <a:extLst>
                         <a:ext uri="{28A0092B-C50C-407E-A947-70E740481C1C}">
                           <a14:useLocalDpi xmlns:a14="http://schemas.microsoft.com/office/drawing/2010/main" val="0"/>
@@ -7958,7 +7831,7 @@
                     </pic:cNvPicPr>
                   </pic:nvPicPr>
                   <pic:blipFill>
-                    <a:blip r:embed="rId25">
+                    <a:blip r:embed="rId34">
                       <a:extLst>
                         <a:ext uri="{28A0092B-C50C-407E-A947-70E740481C1C}">
                           <a14:useLocalDpi xmlns:a14="http://schemas.microsoft.com/office/drawing/2010/main" val="0"/>
@@ -7998,7 +7871,7 @@
           <w:bCs/>
         </w:rPr>
       </w:pPr>
-      <w:bookmarkStart w:id="24" w:name="_Toc225115694"/>
+      <w:bookmarkStart w:id="24" w:name="_Toc225694778"/>
       <w:r>
         <w:t xml:space="preserve">4.3 </w:t>
       </w:r>
@@ -8082,7 +7955,7 @@
       <w:r>
         <w:t>Azure Portal always triggers MFA because it has built-in Microsoft first-party policies — your custom app doesn't inherit that behavior. Even </w:t>
       </w:r>
-      <w:hyperlink r:id="rId26" w:history="1">
+      <w:hyperlink r:id="rId35" w:history="1">
         <w:r>
           <w:rPr>
             <w:rStyle w:val="Hyperlink"/>
@@ -8171,36 +8044,16 @@
       <w:r>
         <w:t>This tells Entra: "The </w:t>
       </w:r>
-      <w:proofErr w:type="spellStart"/>
-      <w:r>
-        <w:fldChar w:fldCharType="begin"/>
-      </w:r>
-      <w:r>
-        <w:instrText>HYPERLINK "vscode-file://vscode-app/d:/apps/Microsoft%20VS%20Code/072586267e/resources/app/out/vs/code/electron-browser/workbench/workbench.html" \o ""</w:instrText>
-      </w:r>
-      <w:r>
-        <w:fldChar w:fldCharType="separate"/>
-      </w:r>
-      <w:r>
-        <w:rPr>
-          <w:rStyle w:val="Hyperlink"/>
-        </w:rPr>
-        <w:t>amr</w:t>
-      </w:r>
-      <w:proofErr w:type="spellEnd"/>
-      <w:r>
-        <w:fldChar w:fldCharType="end"/>
-      </w:r>
-      <w:r>
-        <w:t> (authentication method reference) claim with value </w:t>
-      </w:r>
-      <w:proofErr w:type="spellStart"/>
-      <w:r>
-        <w:t>mfa</w:t>
-      </w:r>
-      <w:proofErr w:type="spellEnd"/>
-      <w:r>
-        <w:t> is </w:t>
+      <w:hyperlink r:id="rId36" w:history="1">
+        <w:r>
+          <w:rPr>
+            <w:rStyle w:val="Hyperlink"/>
+          </w:rPr>
+          <w:t>amr</w:t>
+        </w:r>
+      </w:hyperlink>
+      <w:r>
+        <w:t> (authentication method reference) claim with value mfa is </w:t>
       </w:r>
       <w:r>
         <w:rPr>
@@ -8233,7 +8086,7 @@
         </w:tabs>
         <w:ind w:left="1276"/>
       </w:pPr>
-      <w:hyperlink r:id="rId27" w:history="1">
+      <w:hyperlink r:id="rId37" w:history="1">
         <w:r>
           <w:rPr>
             <w:rStyle w:val="Hyperlink"/>
@@ -8258,39 +8111,7 @@
         <w:ind w:left="1276"/>
       </w:pPr>
       <w:r>
-        <w:t>claims={"id_token</w:t>
-      </w:r>
-      <w:proofErr w:type="gramStart"/>
-      <w:r>
-        <w:t>":{</w:t>
-      </w:r>
-      <w:proofErr w:type="gramEnd"/>
-      <w:r>
-        <w:t>"amr</w:t>
-      </w:r>
-      <w:proofErr w:type="gramStart"/>
-      <w:r>
-        <w:t>":{</w:t>
-      </w:r>
-      <w:proofErr w:type="gramEnd"/>
-      <w:r>
-        <w:t>"essential</w:t>
-      </w:r>
-      <w:proofErr w:type="gramStart"/>
-      <w:r>
-        <w:t>":true</w:t>
-      </w:r>
-      <w:proofErr w:type="gramEnd"/>
-      <w:r>
-        <w:t>,"values</w:t>
-      </w:r>
-      <w:proofErr w:type="gramStart"/>
-      <w:r>
-        <w:t>":[</w:t>
-      </w:r>
-      <w:proofErr w:type="gramEnd"/>
-      <w:r>
-        <w:t>"mfa"]}}} — demands MFA step-up</w:t>
+        <w:t>claims={"id_token":{"amr":{"essential":true,"values":["mfa"]}}} — demands MFA step-up</w:t>
       </w:r>
     </w:p>
     <w:p>
@@ -8318,7 +8139,7 @@
                     <pic:cNvPicPr/>
                   </pic:nvPicPr>
                   <pic:blipFill>
-                    <a:blip r:embed="rId28"/>
+                    <a:blip r:embed="rId38"/>
                     <a:stretch>
                       <a:fillRect/>
                     </a:stretch>
@@ -8384,15 +8205,7 @@
     </w:p>
     <w:p>
       <w:r>
-        <w:t>Disable Security Defaults → create a Conditional Access policy targeting the </w:t>
-      </w:r>
-      <w:proofErr w:type="spellStart"/>
-      <w:r>
-        <w:t>poc-bff</w:t>
-      </w:r>
-      <w:proofErr w:type="spellEnd"/>
-      <w:r>
-        <w:t> app that requires MFA on every sign-in. This is the production-grade solution.</w:t>
+        <w:t>Disable Security Defaults → create a Conditional Access policy targeting the poc-bff app that requires MFA on every sign-in. This is the production-grade solution.</w:t>
       </w:r>
     </w:p>
     <w:p>
@@ -8434,7 +8247,7 @@
                     </pic:cNvPicPr>
                   </pic:nvPicPr>
                   <pic:blipFill>
-                    <a:blip r:embed="rId29">
+                    <a:blip r:embed="rId39">
                       <a:extLst>
                         <a:ext uri="{28A0092B-C50C-407E-A947-70E740481C1C}">
                           <a14:useLocalDpi xmlns:a14="http://schemas.microsoft.com/office/drawing/2010/main" val="0"/>
@@ -8470,7 +8283,7 @@
       <w:pPr>
         <w:pStyle w:val="Heading1"/>
       </w:pPr>
-      <w:bookmarkStart w:id="25" w:name="_Toc225115695"/>
+      <w:bookmarkStart w:id="25" w:name="_Toc225694779"/>
       <w:r>
         <w:lastRenderedPageBreak/>
         <w:t>5. POC – Report Entry Comments</w:t>
@@ -8481,20 +8294,12 @@
       <w:pPr>
         <w:pStyle w:val="Heading2"/>
       </w:pPr>
-      <w:bookmarkStart w:id="26" w:name="_Toc225115696"/>
+      <w:bookmarkStart w:id="26" w:name="_Toc225694780"/>
       <w:r>
         <w:t xml:space="preserve">5.1 </w:t>
       </w:r>
       <w:r>
-        <w:t xml:space="preserve">Phase </w:t>
-      </w:r>
-      <w:proofErr w:type="gramStart"/>
-      <w:r>
-        <w:t>0  -</w:t>
-      </w:r>
-      <w:proofErr w:type="gramEnd"/>
-      <w:r>
-        <w:t xml:space="preserve"> </w:t>
+        <w:t xml:space="preserve">Phase 0  - </w:t>
       </w:r>
       <w:r>
         <w:t>Database Setup</w:t>
@@ -8505,7 +8310,7 @@
       <w:pPr>
         <w:pStyle w:val="Heading3"/>
       </w:pPr>
-      <w:bookmarkStart w:id="27" w:name="_Toc225115697"/>
+      <w:bookmarkStart w:id="27" w:name="_Toc225694781"/>
       <w:r>
         <w:t>5.</w:t>
       </w:r>
@@ -8701,7 +8506,6 @@
       <w:r>
         <w:t xml:space="preserve">Set strong password for </w:t>
       </w:r>
-      <w:proofErr w:type="spellStart"/>
       <w:r>
         <w:rPr>
           <w:b/>
@@ -8709,13 +8513,12 @@
         </w:rPr>
         <w:t>sa</w:t>
       </w:r>
-      <w:proofErr w:type="spellEnd"/>
     </w:p>
     <w:p>
       <w:pPr>
         <w:pStyle w:val="Heading3"/>
       </w:pPr>
-      <w:bookmarkStart w:id="28" w:name="_Toc225115698"/>
+      <w:bookmarkStart w:id="28" w:name="_Toc225694782"/>
       <w:r>
         <w:t>5</w:t>
       </w:r>
@@ -8723,14 +8526,9 @@
         <w:t>.1</w:t>
       </w:r>
       <w:r>
-        <w:t xml:space="preserve">.2 Connect from </w:t>
-      </w:r>
-      <w:proofErr w:type="spellStart"/>
-      <w:r>
-        <w:t>DBeaver</w:t>
+        <w:t>.2 Connect from DBeaver</w:t>
       </w:r>
       <w:bookmarkEnd w:id="28"/>
-      <w:proofErr w:type="spellEnd"/>
     </w:p>
     <w:p>
       <w:r>
@@ -8759,7 +8557,7 @@
                     <pic:cNvPicPr/>
                   </pic:nvPicPr>
                   <pic:blipFill>
-                    <a:blip r:embed="rId30"/>
+                    <a:blip r:embed="rId40"/>
                     <a:stretch>
                       <a:fillRect/>
                     </a:stretch>
@@ -8815,7 +8613,7 @@
                     <pic:cNvPicPr/>
                   </pic:nvPicPr>
                   <pic:blipFill>
-                    <a:blip r:embed="rId31"/>
+                    <a:blip r:embed="rId41"/>
                     <a:stretch>
                       <a:fillRect/>
                     </a:stretch>
@@ -8959,7 +8757,7 @@
                     </pic:cNvPicPr>
                   </pic:nvPicPr>
                   <pic:blipFill>
-                    <a:blip r:embed="rId32">
+                    <a:blip r:embed="rId42">
                       <a:extLst>
                         <a:ext uri="{28A0092B-C50C-407E-A947-70E740481C1C}">
                           <a14:useLocalDpi xmlns:a14="http://schemas.microsoft.com/office/drawing/2010/main" val="0"/>
@@ -9181,7 +8979,7 @@
                     </pic:cNvPicPr>
                   </pic:nvPicPr>
                   <pic:blipFill>
-                    <a:blip r:embed="rId33">
+                    <a:blip r:embed="rId43">
                       <a:extLst>
                         <a:ext uri="{28A0092B-C50C-407E-A947-70E740481C1C}">
                           <a14:useLocalDpi xmlns:a14="http://schemas.microsoft.com/office/drawing/2010/main" val="0"/>
@@ -9315,7 +9113,6 @@
       <w:r>
         <w:t xml:space="preserve">Scroll to </w:t>
       </w:r>
-      <w:proofErr w:type="spellStart"/>
       <w:r>
         <w:rPr>
           <w:b/>
@@ -9323,7 +9120,6 @@
         </w:rPr>
         <w:t>IPAll</w:t>
       </w:r>
-      <w:proofErr w:type="spellEnd"/>
     </w:p>
     <w:p>
       <w:pPr>
@@ -9450,7 +9246,7 @@
                     </pic:cNvPicPr>
                   </pic:nvPicPr>
                   <pic:blipFill>
-                    <a:blip r:embed="rId34">
+                    <a:blip r:embed="rId44">
                       <a:extLst>
                         <a:ext uri="{28A0092B-C50C-407E-A947-70E740481C1C}">
                           <a14:useLocalDpi xmlns:a14="http://schemas.microsoft.com/office/drawing/2010/main" val="0"/>
@@ -9494,7 +9290,7 @@
       <w:pPr>
         <w:pStyle w:val="Heading3"/>
       </w:pPr>
-      <w:bookmarkStart w:id="29" w:name="_Toc225115699"/>
+      <w:bookmarkStart w:id="29" w:name="_Toc225694783"/>
       <w:r>
         <w:t>5</w:t>
       </w:r>
@@ -9510,7 +9306,6 @@
       <w:r>
         <w:t xml:space="preserve">CREATE DATABASE </w:t>
       </w:r>
-      <w:proofErr w:type="spellStart"/>
       <w:r>
         <w:rPr>
           <w:b/>
@@ -9518,7 +9313,6 @@
         </w:rPr>
         <w:t>LeapPoc</w:t>
       </w:r>
-      <w:proofErr w:type="spellEnd"/>
       <w:r>
         <w:t> on local MSSQL Developer Edition</w:t>
       </w:r>
@@ -9527,7 +9321,7 @@
       <w:pPr>
         <w:pStyle w:val="Heading3"/>
       </w:pPr>
-      <w:bookmarkStart w:id="30" w:name="_Toc225115700"/>
+      <w:bookmarkStart w:id="30" w:name="_Toc225694784"/>
       <w:r>
         <w:t>5</w:t>
       </w:r>
@@ -9541,15 +9335,7 @@
     </w:p>
     <w:p>
       <w:r>
-        <w:t>See docs/</w:t>
-      </w:r>
-      <w:proofErr w:type="spellStart"/>
-      <w:r>
-        <w:t>sql</w:t>
-      </w:r>
-      <w:proofErr w:type="spellEnd"/>
-      <w:r>
-        <w:t>/</w:t>
+        <w:t>See docs/sql/</w:t>
       </w:r>
       <w:r>
         <w:rPr>
@@ -9563,7 +9349,7 @@
       <w:pPr>
         <w:pStyle w:val="Heading3"/>
       </w:pPr>
-      <w:bookmarkStart w:id="31" w:name="_Toc225115701"/>
+      <w:bookmarkStart w:id="31" w:name="_Toc225694785"/>
       <w:r>
         <w:t>5</w:t>
       </w:r>
@@ -9577,15 +9363,7 @@
     </w:p>
     <w:p>
       <w:r>
-        <w:t>See docs/</w:t>
-      </w:r>
-      <w:proofErr w:type="spellStart"/>
-      <w:r>
-        <w:t>sql</w:t>
-      </w:r>
-      <w:proofErr w:type="spellEnd"/>
-      <w:r>
-        <w:t>/</w:t>
+        <w:t>See docs/sql/</w:t>
       </w:r>
       <w:r>
         <w:rPr>
@@ -9599,7 +9377,7 @@
       <w:pPr>
         <w:pStyle w:val="Heading2"/>
       </w:pPr>
-      <w:bookmarkStart w:id="32" w:name="_Toc225115702"/>
+      <w:bookmarkStart w:id="32" w:name="_Toc225694786"/>
       <w:r>
         <w:t xml:space="preserve">5.2 </w:t>
       </w:r>
@@ -9666,31 +9444,7 @@
         </w:numPr>
       </w:pPr>
       <w:r>
-        <w:t xml:space="preserve">Add </w:t>
-      </w:r>
-      <w:proofErr w:type="spellStart"/>
-      <w:r>
-        <w:t>EntityScan</w:t>
-      </w:r>
-      <w:proofErr w:type="spellEnd"/>
-      <w:r>
-        <w:t xml:space="preserve"> and </w:t>
-      </w:r>
-      <w:proofErr w:type="spellStart"/>
-      <w:r>
-        <w:t>EnableJpaRepositoryies</w:t>
-      </w:r>
-      <w:proofErr w:type="spellEnd"/>
-      <w:r>
-        <w:t xml:space="preserve"> in leap-app </w:t>
-      </w:r>
-      <w:proofErr w:type="spellStart"/>
-      <w:r>
-        <w:t>LeapPocApplication</w:t>
-      </w:r>
-      <w:proofErr w:type="spellEnd"/>
-      <w:r>
-        <w:t xml:space="preserve"> to scan JPA entities and repositories in other modules/packages</w:t>
+        <w:t>Add EntityScan and EnableJpaRepositoryies in leap-app LeapPocApplication to scan JPA entities and repositories in other modules/packages</w:t>
       </w:r>
     </w:p>
     <w:p>
@@ -9718,7 +9472,7 @@
                     <pic:cNvPicPr/>
                   </pic:nvPicPr>
                   <pic:blipFill>
-                    <a:blip r:embed="rId35"/>
+                    <a:blip r:embed="rId45"/>
                     <a:stretch>
                       <a:fillRect/>
                     </a:stretch>
@@ -9748,27 +9502,14 @@
         </w:numPr>
       </w:pPr>
       <w:r>
-        <w:t xml:space="preserve">Change Instant to </w:t>
-      </w:r>
-      <w:proofErr w:type="spellStart"/>
-      <w:r>
-        <w:t>LocalDateTime</w:t>
-      </w:r>
-      <w:proofErr w:type="spellEnd"/>
-      <w:r>
-        <w:t xml:space="preserve"> for datetime fields such as </w:t>
-      </w:r>
-      <w:proofErr w:type="spellStart"/>
-      <w:r>
-        <w:t>createdAt</w:t>
-      </w:r>
-      <w:proofErr w:type="spellEnd"/>
+        <w:t>Change Instant to LocalDateTime for datetime fields such as createdAt</w:t>
+      </w:r>
     </w:p>
     <w:p>
       <w:pPr>
         <w:pStyle w:val="Heading3"/>
       </w:pPr>
-      <w:bookmarkStart w:id="33" w:name="_Toc225115703"/>
+      <w:bookmarkStart w:id="33" w:name="_Toc225694787"/>
       <w:r>
         <w:t xml:space="preserve">5.3 </w:t>
       </w:r>
@@ -9781,9 +9522,11 @@
       <w:pPr>
         <w:pStyle w:val="Heading3"/>
       </w:pPr>
+      <w:bookmarkStart w:id="34" w:name="_Toc225694788"/>
       <w:r>
         <w:t>5.4 Phase 3 – Comment API</w:t>
       </w:r>
+      <w:bookmarkEnd w:id="34"/>
     </w:p>
     <w:p>
       <w:pPr>
@@ -9851,21 +9594,7 @@
         <w:rPr>
           <w:rFonts w:hint="eastAsia"/>
         </w:rPr>
-        <w:t xml:space="preserve">After login, open </w:t>
-      </w:r>
-      <w:proofErr w:type="spellStart"/>
-      <w:r>
-        <w:rPr>
-          <w:rFonts w:hint="eastAsia"/>
-        </w:rPr>
-        <w:t>DevTools</w:t>
-      </w:r>
-      <w:proofErr w:type="spellEnd"/>
-      <w:r>
-        <w:rPr>
-          <w:rFonts w:hint="eastAsia"/>
-        </w:rPr>
-        <w:t xml:space="preserve"> </w:t>
+        <w:t xml:space="preserve">After login, open DevTools </w:t>
       </w:r>
       <w:r>
         <w:rPr>
@@ -9986,9 +9715,11 @@
       <w:pPr>
         <w:pStyle w:val="Heading3"/>
       </w:pPr>
+      <w:bookmarkStart w:id="35" w:name="_Toc225694789"/>
       <w:r>
         <w:t>5.5 Phase 4 – 5 – Frontend</w:t>
       </w:r>
+      <w:bookmarkEnd w:id="35"/>
     </w:p>
     <w:p>
       <w:pPr>
@@ -10002,12 +9733,14 @@
       <w:pPr>
         <w:pStyle w:val="Heading3"/>
       </w:pPr>
+      <w:bookmarkStart w:id="36" w:name="_Toc225694790"/>
       <w:r>
         <w:t xml:space="preserve">5.6 </w:t>
       </w:r>
       <w:r>
         <w:t>Phase 6: Polish &amp; Hardening</w:t>
       </w:r>
+      <w:bookmarkEnd w:id="36"/>
     </w:p>
     <w:p>
       <w:pPr>
@@ -10033,7 +9766,6 @@
         </w:tabs>
         <w:ind w:left="851" w:hanging="284"/>
       </w:pPr>
-      <w:proofErr w:type="spellStart"/>
       <w:r>
         <w:rPr>
           <w:b/>
@@ -10041,40 +9773,19 @@
         </w:rPr>
         <w:t>CommentThreadDto</w:t>
       </w:r>
-      <w:proofErr w:type="spellEnd"/>
       <w:r>
         <w:t> — added </w:t>
       </w:r>
-      <w:proofErr w:type="spellStart"/>
-      <w:r>
-        <w:fldChar w:fldCharType="begin"/>
-      </w:r>
-      <w:r>
-        <w:instrText>HYPERLINK "vscode-file://vscode-app/d:/apps/Microsoft%20VS%20Code/07ff9d6178/resources/app/out/vs/code/electron-browser/workbench/workbench.html" \o ""</w:instrText>
-      </w:r>
-      <w:r>
-        <w:fldChar w:fldCharType="separate"/>
-      </w:r>
-      <w:r>
-        <w:rPr>
-          <w:rStyle w:val="Hyperlink"/>
-        </w:rPr>
-        <w:t>isDeleted</w:t>
-      </w:r>
-      <w:proofErr w:type="spellEnd"/>
-      <w:r>
-        <w:fldChar w:fldCharType="end"/>
-      </w:r>
-      <w:r>
-        <w:t> </w:t>
-      </w:r>
-      <w:proofErr w:type="spellStart"/>
-      <w:r>
-        <w:t>boolean</w:t>
-      </w:r>
-      <w:proofErr w:type="spellEnd"/>
-      <w:r>
-        <w:t xml:space="preserve"> field</w:t>
+      <w:hyperlink r:id="rId46" w:history="1">
+        <w:r>
+          <w:rPr>
+            <w:rStyle w:val="Hyperlink"/>
+          </w:rPr>
+          <w:t>isDeleted</w:t>
+        </w:r>
+      </w:hyperlink>
+      <w:r>
+        <w:t> boolean field</w:t>
       </w:r>
     </w:p>
     <w:p>
@@ -10089,7 +9800,6 @@
         </w:tabs>
         <w:ind w:left="851" w:hanging="284"/>
       </w:pPr>
-      <w:proofErr w:type="spellStart"/>
       <w:r>
         <w:rPr>
           <w:b/>
@@ -10098,7 +9808,6 @@
         <w:lastRenderedPageBreak/>
         <w:t>CommentRepository</w:t>
       </w:r>
-      <w:proofErr w:type="spellEnd"/>
       <w:r>
         <w:t> — added 3 new queries: fetch all comments (including deleted), single entity count, and batch entity counts via JPQL</w:t>
       </w:r>
@@ -10115,7 +9824,6 @@
         </w:tabs>
         <w:ind w:left="851" w:hanging="284"/>
       </w:pPr>
-      <w:proofErr w:type="spellStart"/>
       <w:r>
         <w:rPr>
           <w:b/>
@@ -10123,65 +9831,28 @@
         </w:rPr>
         <w:t>CommentServiceImpl</w:t>
       </w:r>
-      <w:proofErr w:type="spellEnd"/>
       <w:r>
         <w:t> — rewrote </w:t>
       </w:r>
-      <w:proofErr w:type="spellStart"/>
-      <w:r>
-        <w:fldChar w:fldCharType="begin"/>
-      </w:r>
-      <w:r>
-        <w:instrText>HYPERLINK "vscode-file://vscode-app/d:/apps/Microsoft%20VS%20Code/07ff9d6178/resources/app/out/vs/code/electron-browser/workbench/workbench.html" \o ""</w:instrText>
-      </w:r>
-      <w:r>
-        <w:fldChar w:fldCharType="separate"/>
-      </w:r>
-      <w:r>
-        <w:rPr>
-          <w:rStyle w:val="Hyperlink"/>
-        </w:rPr>
-        <w:t>getThread</w:t>
-      </w:r>
-      <w:proofErr w:type="spellEnd"/>
-      <w:r>
-        <w:rPr>
-          <w:rStyle w:val="Hyperlink"/>
-        </w:rPr>
-        <w:t>()</w:t>
-      </w:r>
-      <w:r>
-        <w:fldChar w:fldCharType="end"/>
-      </w:r>
+      <w:hyperlink r:id="rId47" w:history="1">
+        <w:r>
+          <w:rPr>
+            <w:rStyle w:val="Hyperlink"/>
+          </w:rPr>
+          <w:t>getThread()</w:t>
+        </w:r>
+      </w:hyperlink>
       <w:r>
         <w:t> to include soft-deleted parents as placeholders when they have non-deleted descendants; added </w:t>
       </w:r>
-      <w:proofErr w:type="spellStart"/>
-      <w:r>
-        <w:fldChar w:fldCharType="begin"/>
-      </w:r>
-      <w:r>
-        <w:instrText>HYPERLINK "vscode-file://vscode-app/d:/apps/Microsoft%20VS%20Code/07ff9d6178/resources/app/out/vs/code/electron-browser/workbench/workbench.html" \o ""</w:instrText>
-      </w:r>
-      <w:r>
-        <w:fldChar w:fldCharType="separate"/>
-      </w:r>
-      <w:r>
-        <w:rPr>
-          <w:rStyle w:val="Hyperlink"/>
-        </w:rPr>
-        <w:t>getCounts</w:t>
-      </w:r>
-      <w:proofErr w:type="spellEnd"/>
-      <w:r>
-        <w:rPr>
-          <w:rStyle w:val="Hyperlink"/>
-        </w:rPr>
-        <w:t>()</w:t>
-      </w:r>
-      <w:r>
-        <w:fldChar w:fldCharType="end"/>
-      </w:r>
+      <w:hyperlink r:id="rId48" w:history="1">
+        <w:r>
+          <w:rPr>
+            <w:rStyle w:val="Hyperlink"/>
+          </w:rPr>
+          <w:t>getCounts()</w:t>
+        </w:r>
+      </w:hyperlink>
       <w:r>
         <w:t> for batch comment count retrieval</w:t>
       </w:r>
@@ -10198,7 +9869,6 @@
         </w:tabs>
         <w:ind w:left="851" w:hanging="284"/>
       </w:pPr>
-      <w:proofErr w:type="spellStart"/>
       <w:r>
         <w:rPr>
           <w:b/>
@@ -10206,58 +9876,15 @@
         </w:rPr>
         <w:t>CommentController</w:t>
       </w:r>
-      <w:proofErr w:type="spellEnd"/>
       <w:r>
         <w:t> — added </w:t>
       </w:r>
-      <w:hyperlink r:id="rId36" w:history="1">
+      <w:hyperlink r:id="rId49" w:history="1">
         <w:r>
           <w:rPr>
             <w:rStyle w:val="Hyperlink"/>
           </w:rPr>
-          <w:t>GET /</w:t>
-        </w:r>
-        <w:proofErr w:type="spellStart"/>
-        <w:r>
-          <w:rPr>
-            <w:rStyle w:val="Hyperlink"/>
-          </w:rPr>
-          <w:t>api</w:t>
-        </w:r>
-        <w:proofErr w:type="spellEnd"/>
-        <w:r>
-          <w:rPr>
-            <w:rStyle w:val="Hyperlink"/>
-          </w:rPr>
-          <w:t>/comments/</w:t>
-        </w:r>
-        <w:proofErr w:type="spellStart"/>
-        <w:r>
-          <w:rPr>
-            <w:rStyle w:val="Hyperlink"/>
-          </w:rPr>
-          <w:t>counts?entityType</w:t>
-        </w:r>
-        <w:proofErr w:type="spellEnd"/>
-        <w:r>
-          <w:rPr>
-            <w:rStyle w:val="Hyperlink"/>
-          </w:rPr>
-          <w:t>=&amp;</w:t>
-        </w:r>
-        <w:proofErr w:type="spellStart"/>
-        <w:r>
-          <w:rPr>
-            <w:rStyle w:val="Hyperlink"/>
-          </w:rPr>
-          <w:t>entityIds</w:t>
-        </w:r>
-        <w:proofErr w:type="spellEnd"/>
-        <w:r>
-          <w:rPr>
-            <w:rStyle w:val="Hyperlink"/>
-          </w:rPr>
-          <w:t>=</w:t>
+          <w:t>GET /api/comments/counts?entityType=&amp;entityIds=</w:t>
         </w:r>
       </w:hyperlink>
       <w:r>
@@ -10365,15 +9992,7 @@
         <w:t>6.6 Comment count badge</w:t>
       </w:r>
       <w:r>
-        <w:t xml:space="preserve">: Counts load on page </w:t>
-      </w:r>
-      <w:proofErr w:type="spellStart"/>
-      <w:r>
-        <w:t>init</w:t>
-      </w:r>
-      <w:proofErr w:type="spellEnd"/>
-      <w:r>
-        <w:t xml:space="preserve"> via batch endpoint (not just when panel opens)</w:t>
+        <w:t>: Counts load on page init via batch endpoint (not just when panel opens)</w:t>
       </w:r>
     </w:p>
     <w:p>
@@ -10419,29 +10038,18 @@
         <w:t>6.8 Accessibility</w:t>
       </w:r>
       <w:r>
-        <w:t>: ARIA roles/labels on panel, entries, buttons, icons; aria-live="polite" for dynamic content; Escape key closes panel; </w:t>
-      </w:r>
-      <w:proofErr w:type="spellStart"/>
-      <w:r>
-        <w:t>trackBy</w:t>
-      </w:r>
-      <w:proofErr w:type="spellEnd"/>
-      <w:r>
-        <w:t> on all *</w:t>
-      </w:r>
-      <w:proofErr w:type="spellStart"/>
-      <w:r>
-        <w:t>ngFor</w:t>
-      </w:r>
-      <w:proofErr w:type="spellEnd"/>
+        <w:t>: ARIA roles/labels on panel, entries, buttons, icons; aria-live="polite" for dynamic content; Escape key closes panel; trackBy on all *ngFor</w:t>
+      </w:r>
     </w:p>
     <w:p>
       <w:pPr>
         <w:pStyle w:val="Heading1"/>
       </w:pPr>
+      <w:bookmarkStart w:id="37" w:name="_Toc225694791"/>
       <w:r>
         <w:t>6. Authorization by Group</w:t>
       </w:r>
+      <w:bookmarkEnd w:id="37"/>
     </w:p>
     <w:p>
       <w:pPr>
@@ -10451,17 +10059,14 @@
           <w:bCs/>
         </w:rPr>
       </w:pPr>
-      <w:proofErr w:type="gramStart"/>
+      <w:bookmarkStart w:id="38" w:name="_Toc225694792"/>
       <w:r>
         <w:t xml:space="preserve">6.1  </w:t>
       </w:r>
       <w:r>
-        <w:t>Setting</w:t>
-      </w:r>
-      <w:proofErr w:type="gramEnd"/>
-      <w:r>
-        <w:t xml:space="preserve"> Up Groups in Microsoft Entra ID</w:t>
-      </w:r>
+        <w:t>Setting Up Groups in Microsoft Entra ID</w:t>
+      </w:r>
+      <w:bookmarkEnd w:id="38"/>
     </w:p>
     <w:p>
       <w:pPr>
@@ -10491,7 +10096,7 @@
       <w:r>
         <w:t xml:space="preserve"> </w:t>
       </w:r>
-      <w:hyperlink r:id="rId37" w:anchor="view/Microsoft_AAD_IAM/TenantOverview.ReactView" w:history="1">
+      <w:hyperlink r:id="rId50" w:anchor="view/Microsoft_AAD_IAM/TenantOverview.ReactView" w:history="1">
         <w:r>
           <w:rPr>
             <w:rStyle w:val="Hyperlink"/>
@@ -10500,10 +10105,7 @@
         </w:r>
       </w:hyperlink>
       <w:r>
-        <w:t xml:space="preserve"> </w:t>
-      </w:r>
-      <w:r>
-        <w:t>→ </w:t>
+        <w:t xml:space="preserve"> → </w:t>
       </w:r>
       <w:r>
         <w:rPr>
@@ -11355,7 +10957,6 @@
       <w:r>
         <w:t xml:space="preserve"> </w:t>
       </w:r>
-      <w:proofErr w:type="spellStart"/>
       <w:r>
         <w:rPr>
           <w:b/>
@@ -11363,7 +10964,6 @@
         </w:rPr>
         <w:t>poc-bff</w:t>
       </w:r>
-      <w:proofErr w:type="spellEnd"/>
     </w:p>
     <w:p>
       <w:pPr>
@@ -11536,7 +11136,6 @@
       <w:r>
         <w:t>You'll need these IDs in </w:t>
       </w:r>
-      <w:proofErr w:type="spellStart"/>
       <w:r>
         <w:rPr>
           <w:b/>
@@ -11544,7 +11143,6 @@
         </w:rPr>
         <w:t>application.yml</w:t>
       </w:r>
-      <w:proofErr w:type="spellEnd"/>
       <w:r>
         <w:t>:</w:t>
       </w:r>
@@ -11609,12 +11207,14 @@
       <w:pPr>
         <w:pStyle w:val="Heading2"/>
       </w:pPr>
+      <w:bookmarkStart w:id="39" w:name="_Toc225694793"/>
       <w:r>
         <w:t xml:space="preserve">6.2 </w:t>
       </w:r>
       <w:r>
         <w:t>Spring Boot Application Implementation</w:t>
       </w:r>
+      <w:bookmarkEnd w:id="39"/>
     </w:p>
     <w:p>
       <w:pPr>
@@ -11690,8 +11290,6 @@
       <w:r>
         <w:t>Added </w:t>
       </w:r>
-      <w:proofErr w:type="spellStart"/>
-      <w:proofErr w:type="gramStart"/>
       <w:r>
         <w:rPr>
           <w:b/>
@@ -11699,8 +11297,6 @@
         </w:rPr>
         <w:t>app.groups</w:t>
       </w:r>
-      <w:proofErr w:type="spellEnd"/>
-      <w:proofErr w:type="gramEnd"/>
       <w:r>
         <w:t> config mapping group Object IDs → friendly names</w:t>
       </w:r>
@@ -11710,6 +11306,9 @@
         <w:ind w:left="720"/>
       </w:pPr>
       <w:r>
+        <w:rPr>
+          <w:noProof/>
+        </w:rPr>
         <w:drawing>
           <wp:inline distT="0" distB="0" distL="0" distR="0" wp14:anchorId="3B99D702" wp14:editId="7075C6FA">
             <wp:extent cx="2557670" cy="1201047"/>
@@ -11726,7 +11325,7 @@
                     <pic:cNvPicPr/>
                   </pic:nvPicPr>
                   <pic:blipFill>
-                    <a:blip r:embed="rId38"/>
+                    <a:blip r:embed="rId51"/>
                     <a:stretch>
                       <a:fillRect/>
                     </a:stretch>
@@ -11808,7 +11407,7 @@
             <w:hideMark/>
           </w:tcPr>
           <w:p>
-            <w:hyperlink r:id="rId39" w:history="1">
+            <w:hyperlink r:id="rId52" w:history="1">
               <w:r>
                 <w:rPr>
                   <w:rStyle w:val="Hyperlink"/>
@@ -11863,7 +11462,7 @@
             <w:hideMark/>
           </w:tcPr>
           <w:p>
-            <w:hyperlink r:id="rId40" w:history="1">
+            <w:hyperlink r:id="rId53" w:history="1">
               <w:r>
                 <w:rPr>
                   <w:rStyle w:val="Hyperlink"/>
@@ -11918,7 +11517,7 @@
             <w:hideMark/>
           </w:tcPr>
           <w:p>
-            <w:hyperlink r:id="rId41" w:history="1">
+            <w:hyperlink r:id="rId54" w:history="1">
               <w:r>
                 <w:rPr>
                   <w:rStyle w:val="Hyperlink"/>
@@ -11973,7 +11572,7 @@
             <w:hideMark/>
           </w:tcPr>
           <w:p>
-            <w:hyperlink r:id="rId42" w:history="1">
+            <w:hyperlink r:id="rId55" w:history="1">
               <w:r>
                 <w:rPr>
                   <w:rStyle w:val="Hyperlink"/>
@@ -12002,15 +11601,7 @@
           </w:tcPr>
           <w:p>
             <w:r>
-              <w:t>Extracts GROUP_* authorities → returns groups list in /</w:t>
-            </w:r>
-            <w:proofErr w:type="spellStart"/>
-            <w:r>
-              <w:t>api</w:t>
-            </w:r>
-            <w:proofErr w:type="spellEnd"/>
-            <w:r>
-              <w:t>/me</w:t>
+              <w:t>Extracts GROUP_* authorities → returns groups list in /api/me</w:t>
             </w:r>
           </w:p>
         </w:tc>
@@ -12036,7 +11627,7 @@
             <w:hideMark/>
           </w:tcPr>
           <w:p>
-            <w:hyperlink r:id="rId43" w:history="1">
+            <w:hyperlink r:id="rId56" w:history="1">
               <w:r>
                 <w:rPr>
                   <w:rStyle w:val="Hyperlink"/>
@@ -12065,23 +11656,7 @@
           </w:tcPr>
           <w:p>
             <w:r>
-              <w:t>All @PreAuthorize now: </w:t>
-            </w:r>
-            <w:proofErr w:type="spellStart"/>
-            <w:r>
-              <w:t>hasRole</w:t>
-            </w:r>
-            <w:proofErr w:type="spellEnd"/>
-            <w:r>
-              <w:t xml:space="preserve">('APP_X') or </w:t>
-            </w:r>
-            <w:proofErr w:type="spellStart"/>
-            <w:r>
-              <w:t>hasAuthority</w:t>
-            </w:r>
-            <w:proofErr w:type="spellEnd"/>
-            <w:r>
-              <w:t>('GROUP_GRP_X')</w:t>
+              <w:t>All @PreAuthorize now: hasRole('APP_X') or hasAuthority('GROUP_GRP_X')</w:t>
             </w:r>
           </w:p>
         </w:tc>
@@ -12108,7 +11683,7 @@
             <w:hideMark/>
           </w:tcPr>
           <w:p>
-            <w:hyperlink r:id="rId44" w:history="1">
+            <w:hyperlink r:id="rId57" w:history="1">
               <w:r>
                 <w:rPr>
                   <w:rStyle w:val="Hyperlink"/>
@@ -12140,26 +11715,14 @@
             <w:r>
               <w:t>Same pattern; </w:t>
             </w:r>
-            <w:proofErr w:type="spellStart"/>
-            <w:r>
-              <w:fldChar w:fldCharType="begin"/>
-            </w:r>
-            <w:r>
-              <w:instrText>HYPERLINK "vscode-file://vscode-app/d:/apps/Microsoft%20VS%20Code/07ff9d6178/resources/app/out/vs/code/electron-browser/workbench/workbench.html" \o ""</w:instrText>
-            </w:r>
-            <w:r>
-              <w:fldChar w:fldCharType="separate"/>
-            </w:r>
-            <w:r>
-              <w:rPr>
-                <w:rStyle w:val="Hyperlink"/>
-              </w:rPr>
-              <w:t>isAdmin</w:t>
-            </w:r>
-            <w:proofErr w:type="spellEnd"/>
-            <w:r>
-              <w:fldChar w:fldCharType="end"/>
-            </w:r>
+            <w:hyperlink r:id="rId58" w:history="1">
+              <w:r>
+                <w:rPr>
+                  <w:rStyle w:val="Hyperlink"/>
+                </w:rPr>
+                <w:t>isAdmin</w:t>
+              </w:r>
+            </w:hyperlink>
             <w:r>
               <w:t> check also considers GROUP_GRP_ADMIN</w:t>
             </w:r>
@@ -12303,29 +11866,13 @@
             <w:hideMark/>
           </w:tcPr>
           <w:p>
-            <w:hyperlink r:id="rId45" w:history="1">
+            <w:hyperlink r:id="rId59" w:history="1">
               <w:r>
                 <w:rPr>
                   <w:rStyle w:val="Hyperlink"/>
                 </w:rPr>
-                <w:t>user-</w:t>
+                <w:t>user-info.model.ts</w:t>
               </w:r>
-              <w:proofErr w:type="spellStart"/>
-              <w:proofErr w:type="gramStart"/>
-              <w:r>
-                <w:rPr>
-                  <w:rStyle w:val="Hyperlink"/>
-                </w:rPr>
-                <w:t>info.model</w:t>
-              </w:r>
-              <w:proofErr w:type="gramEnd"/>
-              <w:r>
-                <w:rPr>
-                  <w:rStyle w:val="Hyperlink"/>
-                </w:rPr>
-                <w:t>.ts</w:t>
-              </w:r>
-              <w:proofErr w:type="spellEnd"/>
             </w:hyperlink>
           </w:p>
         </w:tc>
@@ -12348,15 +11895,7 @@
           </w:tcPr>
           <w:p>
             <w:r>
-              <w:t xml:space="preserve">Added groups: </w:t>
-            </w:r>
-            <w:proofErr w:type="gramStart"/>
-            <w:r>
-              <w:t>string[</w:t>
-            </w:r>
-            <w:proofErr w:type="gramEnd"/>
-            <w:r>
-              <w:t>]</w:t>
+              <w:t>Added groups: string[]</w:t>
             </w:r>
           </w:p>
         </w:tc>
@@ -12382,23 +11921,13 @@
             <w:hideMark/>
           </w:tcPr>
           <w:p>
-            <w:hyperlink r:id="rId46" w:history="1">
-              <w:proofErr w:type="spellStart"/>
-              <w:proofErr w:type="gramStart"/>
+            <w:hyperlink r:id="rId60" w:history="1">
               <w:r>
                 <w:rPr>
                   <w:rStyle w:val="Hyperlink"/>
                 </w:rPr>
-                <w:t>auth.service</w:t>
+                <w:t>auth.service.ts</w:t>
               </w:r>
-              <w:proofErr w:type="gramEnd"/>
-              <w:r>
-                <w:rPr>
-                  <w:rStyle w:val="Hyperlink"/>
-                </w:rPr>
-                <w:t>.ts</w:t>
-              </w:r>
-              <w:proofErr w:type="spellEnd"/>
             </w:hyperlink>
           </w:p>
         </w:tc>
@@ -12421,50 +11950,16 @@
           </w:tcPr>
           <w:p>
             <w:r>
-              <w:t>Added </w:t>
-            </w:r>
-            <w:proofErr w:type="spellStart"/>
-            <w:r>
-              <w:t>hasGroup</w:t>
-            </w:r>
-            <w:proofErr w:type="spellEnd"/>
-            <w:r>
-              <w:t>(), </w:t>
-            </w:r>
-            <w:proofErr w:type="spellStart"/>
-            <w:r>
-              <w:t>hasAnyGroup</w:t>
-            </w:r>
-            <w:proofErr w:type="spellEnd"/>
-            <w:r>
-              <w:t>(), </w:t>
-            </w:r>
-            <w:proofErr w:type="spellStart"/>
-            <w:r>
-              <w:fldChar w:fldCharType="begin"/>
-            </w:r>
-            <w:r>
-              <w:instrText>HYPERLINK "vscode-file://vscode-app/d:/apps/Microsoft%20VS%20Code/07ff9d6178/resources/app/out/vs/code/electron-browser/workbench/workbench.html" \o ""</w:instrText>
-            </w:r>
-            <w:r>
-              <w:fldChar w:fldCharType="separate"/>
-            </w:r>
-            <w:r>
-              <w:rPr>
-                <w:rStyle w:val="Hyperlink"/>
-              </w:rPr>
-              <w:t>hasAnyRoleOrGroup</w:t>
-            </w:r>
-            <w:proofErr w:type="spellEnd"/>
-            <w:r>
-              <w:rPr>
-                <w:rStyle w:val="Hyperlink"/>
-              </w:rPr>
-              <w:t>()</w:t>
-            </w:r>
-            <w:r>
-              <w:fldChar w:fldCharType="end"/>
-            </w:r>
+              <w:t>Added hasGroup(), hasAnyGroup(), </w:t>
+            </w:r>
+            <w:hyperlink r:id="rId61" w:history="1">
+              <w:r>
+                <w:rPr>
+                  <w:rStyle w:val="Hyperlink"/>
+                </w:rPr>
+                <w:t>hasAnyRoleOrGroup()</w:t>
+              </w:r>
+            </w:hyperlink>
             <w:r>
               <w:t> — maps APP_X ↔ GRP_X</w:t>
             </w:r>
@@ -12492,23 +11987,13 @@
             <w:hideMark/>
           </w:tcPr>
           <w:p>
-            <w:hyperlink r:id="rId47" w:history="1">
-              <w:proofErr w:type="spellStart"/>
-              <w:proofErr w:type="gramStart"/>
+            <w:hyperlink r:id="rId62" w:history="1">
               <w:r>
                 <w:rPr>
                   <w:rStyle w:val="Hyperlink"/>
                 </w:rPr>
-                <w:t>role.guard</w:t>
+                <w:t>role.guard.ts</w:t>
               </w:r>
-              <w:proofErr w:type="gramEnd"/>
-              <w:r>
-                <w:rPr>
-                  <w:rStyle w:val="Hyperlink"/>
-                </w:rPr>
-                <w:t>.ts</w:t>
-              </w:r>
-              <w:proofErr w:type="spellEnd"/>
             </w:hyperlink>
           </w:p>
         </w:tc>
@@ -12533,42 +12018,16 @@
             <w:r>
               <w:t>Now calls </w:t>
             </w:r>
-            <w:proofErr w:type="spellStart"/>
-            <w:r>
-              <w:fldChar w:fldCharType="begin"/>
-            </w:r>
-            <w:r>
-              <w:instrText>HYPERLINK "vscode-file://vscode-app/d:/apps/Microsoft%20VS%20Code/07ff9d6178/resources/app/out/vs/code/electron-browser/workbench/workbench.html" \o ""</w:instrText>
-            </w:r>
-            <w:r>
-              <w:fldChar w:fldCharType="separate"/>
-            </w:r>
-            <w:r>
-              <w:rPr>
-                <w:rStyle w:val="Hyperlink"/>
-              </w:rPr>
-              <w:t>hasAnyRoleOrGroup</w:t>
-            </w:r>
-            <w:proofErr w:type="spellEnd"/>
-            <w:r>
-              <w:rPr>
-                <w:rStyle w:val="Hyperlink"/>
-              </w:rPr>
-              <w:t>()</w:t>
-            </w:r>
-            <w:r>
-              <w:fldChar w:fldCharType="end"/>
-            </w:r>
-            <w:r>
-              <w:t> instead of </w:t>
-            </w:r>
-            <w:proofErr w:type="spellStart"/>
-            <w:r>
-              <w:t>hasAnyRole</w:t>
-            </w:r>
-            <w:proofErr w:type="spellEnd"/>
-            <w:r>
-              <w:t>()</w:t>
+            <w:hyperlink r:id="rId63" w:history="1">
+              <w:r>
+                <w:rPr>
+                  <w:rStyle w:val="Hyperlink"/>
+                </w:rPr>
+                <w:t>hasAnyRoleOrGroup()</w:t>
+              </w:r>
+            </w:hyperlink>
+            <w:r>
+              <w:t> instead of hasAnyRole()</w:t>
             </w:r>
           </w:p>
         </w:tc>
@@ -12594,7 +12053,7 @@
             <w:hideMark/>
           </w:tcPr>
           <w:p>
-            <w:hyperlink r:id="rId48" w:history="1">
+            <w:hyperlink r:id="rId64" w:history="1">
               <w:r>
                 <w:rPr>
                   <w:rStyle w:val="Hyperlink"/>
@@ -12625,32 +12084,14 @@
             <w:r>
               <w:t>Nav visibility uses </w:t>
             </w:r>
-            <w:proofErr w:type="spellStart"/>
-            <w:r>
-              <w:fldChar w:fldCharType="begin"/>
-            </w:r>
-            <w:r>
-              <w:instrText>HYPERLINK "vscode-file://vscode-app/d:/apps/Microsoft%20VS%20Code/07ff9d6178/resources/app/out/vs/code/electron-browser/workbench/workbench.html" \o ""</w:instrText>
-            </w:r>
-            <w:r>
-              <w:fldChar w:fldCharType="separate"/>
-            </w:r>
-            <w:r>
-              <w:rPr>
-                <w:rStyle w:val="Hyperlink"/>
-              </w:rPr>
-              <w:t>hasAnyRoleOrGroup</w:t>
-            </w:r>
-            <w:proofErr w:type="spellEnd"/>
-            <w:r>
-              <w:rPr>
-                <w:rStyle w:val="Hyperlink"/>
-              </w:rPr>
-              <w:t>()</w:t>
-            </w:r>
-            <w:r>
-              <w:fldChar w:fldCharType="end"/>
-            </w:r>
+            <w:hyperlink r:id="rId65" w:history="1">
+              <w:r>
+                <w:rPr>
+                  <w:rStyle w:val="Hyperlink"/>
+                </w:rPr>
+                <w:t>hasAnyRoleOrGroup()</w:t>
+              </w:r>
+            </w:hyperlink>
           </w:p>
         </w:tc>
       </w:tr>
@@ -12676,29 +12117,13 @@
             <w:hideMark/>
           </w:tcPr>
           <w:p>
-            <w:hyperlink r:id="rId49" w:history="1">
+            <w:hyperlink r:id="rId66" w:history="1">
               <w:r>
                 <w:rPr>
                   <w:rStyle w:val="Hyperlink"/>
                 </w:rPr>
-                <w:t>comment-thread-</w:t>
+                <w:t>comment-thread-panel.component.ts</w:t>
               </w:r>
-              <w:proofErr w:type="spellStart"/>
-              <w:proofErr w:type="gramStart"/>
-              <w:r>
-                <w:rPr>
-                  <w:rStyle w:val="Hyperlink"/>
-                </w:rPr>
-                <w:t>panel.component</w:t>
-              </w:r>
-              <w:proofErr w:type="gramEnd"/>
-              <w:r>
-                <w:rPr>
-                  <w:rStyle w:val="Hyperlink"/>
-                </w:rPr>
-                <w:t>.ts</w:t>
-              </w:r>
-              <w:proofErr w:type="spellEnd"/>
             </w:hyperlink>
           </w:p>
         </w:tc>
@@ -12721,68 +12146,36 @@
             <w:hideMark/>
           </w:tcPr>
           <w:p>
-            <w:hyperlink r:id="rId50" w:history="1">
-              <w:proofErr w:type="spellStart"/>
+            <w:hyperlink r:id="rId67" w:history="1">
               <w:r>
                 <w:rPr>
                   <w:rStyle w:val="Hyperlink"/>
                 </w:rPr>
                 <w:t>canWrite</w:t>
               </w:r>
-              <w:proofErr w:type="spellEnd"/>
             </w:hyperlink>
             <w:r>
               <w:t>/</w:t>
             </w:r>
-            <w:proofErr w:type="spellStart"/>
-            <w:r>
-              <w:fldChar w:fldCharType="begin"/>
-            </w:r>
-            <w:r>
-              <w:instrText>HYPERLINK "vscode-file://vscode-app/d:/apps/Microsoft%20VS%20Code/07ff9d6178/resources/app/out/vs/code/electron-browser/workbench/workbench.html" \o ""</w:instrText>
-            </w:r>
-            <w:r>
-              <w:fldChar w:fldCharType="separate"/>
-            </w:r>
-            <w:r>
-              <w:rPr>
-                <w:rStyle w:val="Hyperlink"/>
-              </w:rPr>
-              <w:t>isAdmin</w:t>
-            </w:r>
-            <w:proofErr w:type="spellEnd"/>
-            <w:r>
-              <w:fldChar w:fldCharType="end"/>
-            </w:r>
+            <w:hyperlink r:id="rId68" w:history="1">
+              <w:r>
+                <w:rPr>
+                  <w:rStyle w:val="Hyperlink"/>
+                </w:rPr>
+                <w:t>isAdmin</w:t>
+              </w:r>
+            </w:hyperlink>
             <w:r>
               <w:t> use </w:t>
             </w:r>
-            <w:proofErr w:type="spellStart"/>
-            <w:r>
-              <w:fldChar w:fldCharType="begin"/>
-            </w:r>
-            <w:r>
-              <w:instrText>HYPERLINK "vscode-file://vscode-app/d:/apps/Microsoft%20VS%20Code/07ff9d6178/resources/app/out/vs/code/electron-browser/workbench/workbench.html" \o ""</w:instrText>
-            </w:r>
-            <w:r>
-              <w:fldChar w:fldCharType="separate"/>
-            </w:r>
-            <w:r>
-              <w:rPr>
-                <w:rStyle w:val="Hyperlink"/>
-              </w:rPr>
-              <w:t>hasAnyRoleOrGroup</w:t>
-            </w:r>
-            <w:proofErr w:type="spellEnd"/>
-            <w:r>
-              <w:rPr>
-                <w:rStyle w:val="Hyperlink"/>
-              </w:rPr>
-              <w:t>()</w:t>
-            </w:r>
-            <w:r>
-              <w:fldChar w:fldCharType="end"/>
-            </w:r>
+            <w:hyperlink r:id="rId69" w:history="1">
+              <w:r>
+                <w:rPr>
+                  <w:rStyle w:val="Hyperlink"/>
+                </w:rPr>
+                <w:t>hasAnyRoleOrGroup()</w:t>
+              </w:r>
+            </w:hyperlink>
           </w:p>
         </w:tc>
       </w:tr>
@@ -12792,9 +12185,17 @@
       <w:pPr>
         <w:pStyle w:val="Heading1"/>
       </w:pPr>
-      <w:r>
-        <w:t>7. Mock Authentication and Authorization</w:t>
-      </w:r>
+      <w:bookmarkStart w:id="40" w:name="_Toc225694794"/>
+      <w:r>
+        <w:t xml:space="preserve">7. </w:t>
+      </w:r>
+      <w:r>
+        <w:t xml:space="preserve">Profile-based </w:t>
+      </w:r>
+      <w:r>
+        <w:t>Mock Authentication and Authorization</w:t>
+      </w:r>
+      <w:bookmarkEnd w:id="40"/>
     </w:p>
     <w:p>
       <w:r>
@@ -18566,6 +17967,7 @@
   <w:style w:type="character" w:default="1" w:styleId="DefaultParagraphFont">
     <w:name w:val="Default Paragraph Font"/>
     <w:uiPriority w:val="1"/>
+    <w:semiHidden/>
     <w:unhideWhenUsed/>
   </w:style>
   <w:style w:type="table" w:default="1" w:styleId="TableNormal">

</xml_diff>

<commit_message>
1. Create e2e tests using Selenium WebDriver. 2. Fixed 2 minor issues
</commit_message>
<xml_diff>
--- a/docs/poc_notes.docx
+++ b/docs/poc_notes.docx
@@ -39,7 +39,7 @@
           <w:pPr>
             <w:pStyle w:val="TOC1"/>
             <w:tabs>
-              <w:tab w:val="right" w:leader="dot" w:pos="10338"/>
+              <w:tab w:val="right" w:leader="dot" w:pos="13844"/>
             </w:tabs>
             <w:rPr>
               <w:noProof/>
@@ -54,7 +54,7 @@
           <w:r>
             <w:fldChar w:fldCharType="separate"/>
           </w:r>
-          <w:hyperlink w:anchor="_Toc225115670" w:history="1">
+          <w:hyperlink w:anchor="_Toc225694754" w:history="1">
             <w:r>
               <w:rPr>
                 <w:rStyle w:val="Hyperlink"/>
@@ -81,7 +81,7 @@
                 <w:noProof/>
                 <w:webHidden/>
               </w:rPr>
-              <w:instrText xml:space="preserve"> PAGEREF _Toc225115670 \h </w:instrText>
+              <w:instrText xml:space="preserve"> PAGEREF _Toc225694754 \h </w:instrText>
             </w:r>
             <w:r>
               <w:rPr>
@@ -116,13 +116,13 @@
           <w:pPr>
             <w:pStyle w:val="TOC2"/>
             <w:tabs>
-              <w:tab w:val="right" w:leader="dot" w:pos="10338"/>
+              <w:tab w:val="right" w:leader="dot" w:pos="13844"/>
             </w:tabs>
             <w:rPr>
               <w:noProof/>
             </w:rPr>
           </w:pPr>
-          <w:hyperlink w:anchor="_Toc225115671" w:history="1">
+          <w:hyperlink w:anchor="_Toc225694755" w:history="1">
             <w:r>
               <w:rPr>
                 <w:rStyle w:val="Hyperlink"/>
@@ -149,7 +149,7 @@
                 <w:noProof/>
                 <w:webHidden/>
               </w:rPr>
-              <w:instrText xml:space="preserve"> PAGEREF _Toc225115671 \h </w:instrText>
+              <w:instrText xml:space="preserve"> PAGEREF _Toc225694755 \h </w:instrText>
             </w:r>
             <w:r>
               <w:rPr>
@@ -184,13 +184,13 @@
           <w:pPr>
             <w:pStyle w:val="TOC2"/>
             <w:tabs>
-              <w:tab w:val="right" w:leader="dot" w:pos="10338"/>
+              <w:tab w:val="right" w:leader="dot" w:pos="13844"/>
             </w:tabs>
             <w:rPr>
               <w:noProof/>
             </w:rPr>
           </w:pPr>
-          <w:hyperlink w:anchor="_Toc225115672" w:history="1">
+          <w:hyperlink w:anchor="_Toc225694756" w:history="1">
             <w:r>
               <w:rPr>
                 <w:rStyle w:val="Hyperlink"/>
@@ -217,7 +217,7 @@
                 <w:noProof/>
                 <w:webHidden/>
               </w:rPr>
-              <w:instrText xml:space="preserve"> PAGEREF _Toc225115672 \h </w:instrText>
+              <w:instrText xml:space="preserve"> PAGEREF _Toc225694756 \h </w:instrText>
             </w:r>
             <w:r>
               <w:rPr>
@@ -252,33 +252,19 @@
           <w:pPr>
             <w:pStyle w:val="TOC1"/>
             <w:tabs>
-              <w:tab w:val="right" w:leader="dot" w:pos="10338"/>
+              <w:tab w:val="right" w:leader="dot" w:pos="13844"/>
             </w:tabs>
             <w:rPr>
               <w:noProof/>
             </w:rPr>
           </w:pPr>
-          <w:hyperlink w:anchor="_Toc225115673" w:history="1">
+          <w:hyperlink w:anchor="_Toc225694757" w:history="1">
             <w:r>
               <w:rPr>
                 <w:rStyle w:val="Hyperlink"/>
                 <w:noProof/>
               </w:rPr>
-              <w:t>2. Configure Entra ID: M</w:t>
-            </w:r>
-            <w:r>
-              <w:rPr>
-                <w:rStyle w:val="Hyperlink"/>
-                <w:noProof/>
-              </w:rPr>
-              <w:t>F</w:t>
-            </w:r>
-            <w:r>
-              <w:rPr>
-                <w:rStyle w:val="Hyperlink"/>
-                <w:noProof/>
-              </w:rPr>
-              <w:t>A (Security Defaults) + App Roles</w:t>
+              <w:t>2. Configure Entra ID: MFA (Security Defaults) + App Roles</w:t>
             </w:r>
             <w:r>
               <w:rPr>
@@ -299,7 +285,7 @@
                 <w:noProof/>
                 <w:webHidden/>
               </w:rPr>
-              <w:instrText xml:space="preserve"> PAGEREF _Toc225115673 \h </w:instrText>
+              <w:instrText xml:space="preserve"> PAGEREF _Toc225694757 \h </w:instrText>
             </w:r>
             <w:r>
               <w:rPr>
@@ -334,13 +320,13 @@
           <w:pPr>
             <w:pStyle w:val="TOC2"/>
             <w:tabs>
-              <w:tab w:val="right" w:leader="dot" w:pos="10338"/>
+              <w:tab w:val="right" w:leader="dot" w:pos="13844"/>
             </w:tabs>
             <w:rPr>
               <w:noProof/>
             </w:rPr>
           </w:pPr>
-          <w:hyperlink w:anchor="_Toc225115674" w:history="1">
+          <w:hyperlink w:anchor="_Toc225694758" w:history="1">
             <w:r>
               <w:rPr>
                 <w:rStyle w:val="Hyperlink"/>
@@ -367,7 +353,7 @@
                 <w:noProof/>
                 <w:webHidden/>
               </w:rPr>
-              <w:instrText xml:space="preserve"> PAGEREF _Toc225115674 \h </w:instrText>
+              <w:instrText xml:space="preserve"> PAGEREF _Toc225694758 \h </w:instrText>
             </w:r>
             <w:r>
               <w:rPr>
@@ -402,13 +388,13 @@
           <w:pPr>
             <w:pStyle w:val="TOC2"/>
             <w:tabs>
-              <w:tab w:val="right" w:leader="dot" w:pos="10338"/>
+              <w:tab w:val="right" w:leader="dot" w:pos="13844"/>
             </w:tabs>
             <w:rPr>
               <w:noProof/>
             </w:rPr>
           </w:pPr>
-          <w:hyperlink w:anchor="_Toc225115675" w:history="1">
+          <w:hyperlink w:anchor="_Toc225694759" w:history="1">
             <w:r>
               <w:rPr>
                 <w:rStyle w:val="Hyperlink"/>
@@ -435,7 +421,7 @@
                 <w:noProof/>
                 <w:webHidden/>
               </w:rPr>
-              <w:instrText xml:space="preserve"> PAGEREF _Toc225115675 \h </w:instrText>
+              <w:instrText xml:space="preserve"> PAGEREF _Toc225694759 \h </w:instrText>
             </w:r>
             <w:r>
               <w:rPr>
@@ -470,13 +456,13 @@
           <w:pPr>
             <w:pStyle w:val="TOC2"/>
             <w:tabs>
-              <w:tab w:val="right" w:leader="dot" w:pos="10338"/>
+              <w:tab w:val="right" w:leader="dot" w:pos="13844"/>
             </w:tabs>
             <w:rPr>
               <w:noProof/>
             </w:rPr>
           </w:pPr>
-          <w:hyperlink w:anchor="_Toc225115676" w:history="1">
+          <w:hyperlink w:anchor="_Toc225694760" w:history="1">
             <w:r>
               <w:rPr>
                 <w:rStyle w:val="Hyperlink"/>
@@ -503,7 +489,7 @@
                 <w:noProof/>
                 <w:webHidden/>
               </w:rPr>
-              <w:instrText xml:space="preserve"> PAGEREF _Toc225115676 \h </w:instrText>
+              <w:instrText xml:space="preserve"> PAGEREF _Toc225694760 \h </w:instrText>
             </w:r>
             <w:r>
               <w:rPr>
@@ -538,13 +524,13 @@
           <w:pPr>
             <w:pStyle w:val="TOC3"/>
             <w:tabs>
-              <w:tab w:val="right" w:leader="dot" w:pos="10338"/>
+              <w:tab w:val="right" w:leader="dot" w:pos="13844"/>
             </w:tabs>
             <w:rPr>
               <w:noProof/>
             </w:rPr>
           </w:pPr>
-          <w:hyperlink w:anchor="_Toc225115677" w:history="1">
+          <w:hyperlink w:anchor="_Toc225694761" w:history="1">
             <w:r>
               <w:rPr>
                 <w:rStyle w:val="Hyperlink"/>
@@ -571,7 +557,7 @@
                 <w:noProof/>
                 <w:webHidden/>
               </w:rPr>
-              <w:instrText xml:space="preserve"> PAGEREF _Toc225115677 \h </w:instrText>
+              <w:instrText xml:space="preserve"> PAGEREF _Toc225694761 \h </w:instrText>
             </w:r>
             <w:r>
               <w:rPr>
@@ -606,13 +592,13 @@
           <w:pPr>
             <w:pStyle w:val="TOC3"/>
             <w:tabs>
-              <w:tab w:val="right" w:leader="dot" w:pos="10338"/>
+              <w:tab w:val="right" w:leader="dot" w:pos="13844"/>
             </w:tabs>
             <w:rPr>
               <w:noProof/>
             </w:rPr>
           </w:pPr>
-          <w:hyperlink w:anchor="_Toc225115678" w:history="1">
+          <w:hyperlink w:anchor="_Toc225694762" w:history="1">
             <w:r>
               <w:rPr>
                 <w:rStyle w:val="Hyperlink"/>
@@ -639,7 +625,7 @@
                 <w:noProof/>
                 <w:webHidden/>
               </w:rPr>
-              <w:instrText xml:space="preserve"> PAGEREF _Toc225115678 \h </w:instrText>
+              <w:instrText xml:space="preserve"> PAGEREF _Toc225694762 \h </w:instrText>
             </w:r>
             <w:r>
               <w:rPr>
@@ -674,13 +660,13 @@
           <w:pPr>
             <w:pStyle w:val="TOC2"/>
             <w:tabs>
-              <w:tab w:val="right" w:leader="dot" w:pos="10338"/>
+              <w:tab w:val="right" w:leader="dot" w:pos="13844"/>
             </w:tabs>
             <w:rPr>
               <w:noProof/>
             </w:rPr>
           </w:pPr>
-          <w:hyperlink w:anchor="_Toc225115679" w:history="1">
+          <w:hyperlink w:anchor="_Toc225694763" w:history="1">
             <w:r>
               <w:rPr>
                 <w:rStyle w:val="Hyperlink"/>
@@ -707,7 +693,7 @@
                 <w:noProof/>
                 <w:webHidden/>
               </w:rPr>
-              <w:instrText xml:space="preserve"> PAGEREF _Toc225115679 \h </w:instrText>
+              <w:instrText xml:space="preserve"> PAGEREF _Toc225694763 \h </w:instrText>
             </w:r>
             <w:r>
               <w:rPr>
@@ -742,13 +728,13 @@
           <w:pPr>
             <w:pStyle w:val="TOC2"/>
             <w:tabs>
-              <w:tab w:val="right" w:leader="dot" w:pos="10338"/>
+              <w:tab w:val="right" w:leader="dot" w:pos="13844"/>
             </w:tabs>
             <w:rPr>
               <w:noProof/>
             </w:rPr>
           </w:pPr>
-          <w:hyperlink w:anchor="_Toc225115680" w:history="1">
+          <w:hyperlink w:anchor="_Toc225694764" w:history="1">
             <w:r>
               <w:rPr>
                 <w:rStyle w:val="Hyperlink"/>
@@ -775,7 +761,7 @@
                 <w:noProof/>
                 <w:webHidden/>
               </w:rPr>
-              <w:instrText xml:space="preserve"> PAGEREF _Toc225115680 \h </w:instrText>
+              <w:instrText xml:space="preserve"> PAGEREF _Toc225694764 \h </w:instrText>
             </w:r>
             <w:r>
               <w:rPr>
@@ -810,13 +796,13 @@
           <w:pPr>
             <w:pStyle w:val="TOC1"/>
             <w:tabs>
-              <w:tab w:val="right" w:leader="dot" w:pos="10338"/>
+              <w:tab w:val="right" w:leader="dot" w:pos="13844"/>
             </w:tabs>
             <w:rPr>
               <w:noProof/>
             </w:rPr>
           </w:pPr>
-          <w:hyperlink w:anchor="_Toc225115681" w:history="1">
+          <w:hyperlink w:anchor="_Toc225694765" w:history="1">
             <w:r>
               <w:rPr>
                 <w:rStyle w:val="Hyperlink"/>
@@ -843,7 +829,7 @@
                 <w:noProof/>
                 <w:webHidden/>
               </w:rPr>
-              <w:instrText xml:space="preserve"> PAGEREF _Toc225115681 \h </w:instrText>
+              <w:instrText xml:space="preserve"> PAGEREF _Toc225694765 \h </w:instrText>
             </w:r>
             <w:r>
               <w:rPr>
@@ -878,13 +864,13 @@
           <w:pPr>
             <w:pStyle w:val="TOC2"/>
             <w:tabs>
-              <w:tab w:val="right" w:leader="dot" w:pos="10338"/>
+              <w:tab w:val="right" w:leader="dot" w:pos="13844"/>
             </w:tabs>
             <w:rPr>
               <w:noProof/>
             </w:rPr>
           </w:pPr>
-          <w:hyperlink w:anchor="_Toc225115682" w:history="1">
+          <w:hyperlink w:anchor="_Toc225694766" w:history="1">
             <w:r>
               <w:rPr>
                 <w:rStyle w:val="Hyperlink"/>
@@ -911,7 +897,7 @@
                 <w:noProof/>
                 <w:webHidden/>
               </w:rPr>
-              <w:instrText xml:space="preserve"> PAGEREF _Toc225115682 \h </w:instrText>
+              <w:instrText xml:space="preserve"> PAGEREF _Toc225694766 \h </w:instrText>
             </w:r>
             <w:r>
               <w:rPr>
@@ -946,13 +932,13 @@
           <w:pPr>
             <w:pStyle w:val="TOC3"/>
             <w:tabs>
-              <w:tab w:val="right" w:leader="dot" w:pos="10338"/>
+              <w:tab w:val="right" w:leader="dot" w:pos="13844"/>
             </w:tabs>
             <w:rPr>
               <w:noProof/>
             </w:rPr>
           </w:pPr>
-          <w:hyperlink w:anchor="_Toc225115683" w:history="1">
+          <w:hyperlink w:anchor="_Toc225694767" w:history="1">
             <w:r>
               <w:rPr>
                 <w:rStyle w:val="Hyperlink"/>
@@ -979,7 +965,7 @@
                 <w:noProof/>
                 <w:webHidden/>
               </w:rPr>
-              <w:instrText xml:space="preserve"> PAGEREF _Toc225115683 \h </w:instrText>
+              <w:instrText xml:space="preserve"> PAGEREF _Toc225694767 \h </w:instrText>
             </w:r>
             <w:r>
               <w:rPr>
@@ -1014,13 +1000,13 @@
           <w:pPr>
             <w:pStyle w:val="TOC3"/>
             <w:tabs>
-              <w:tab w:val="right" w:leader="dot" w:pos="10338"/>
+              <w:tab w:val="right" w:leader="dot" w:pos="13844"/>
             </w:tabs>
             <w:rPr>
               <w:noProof/>
             </w:rPr>
           </w:pPr>
-          <w:hyperlink w:anchor="_Toc225115684" w:history="1">
+          <w:hyperlink w:anchor="_Toc225694768" w:history="1">
             <w:r>
               <w:rPr>
                 <w:rStyle w:val="Hyperlink"/>
@@ -1047,7 +1033,7 @@
                 <w:noProof/>
                 <w:webHidden/>
               </w:rPr>
-              <w:instrText xml:space="preserve"> PAGEREF _Toc225115684 \h </w:instrText>
+              <w:instrText xml:space="preserve"> PAGEREF _Toc225694768 \h </w:instrText>
             </w:r>
             <w:r>
               <w:rPr>
@@ -1082,13 +1068,13 @@
           <w:pPr>
             <w:pStyle w:val="TOC3"/>
             <w:tabs>
-              <w:tab w:val="right" w:leader="dot" w:pos="10338"/>
+              <w:tab w:val="right" w:leader="dot" w:pos="13844"/>
             </w:tabs>
             <w:rPr>
               <w:noProof/>
             </w:rPr>
           </w:pPr>
-          <w:hyperlink w:anchor="_Toc225115685" w:history="1">
+          <w:hyperlink w:anchor="_Toc225694769" w:history="1">
             <w:r>
               <w:rPr>
                 <w:rStyle w:val="Hyperlink"/>
@@ -1115,7 +1101,7 @@
                 <w:noProof/>
                 <w:webHidden/>
               </w:rPr>
-              <w:instrText xml:space="preserve"> PAGEREF _Toc225115685 \h </w:instrText>
+              <w:instrText xml:space="preserve"> PAGEREF _Toc225694769 \h </w:instrText>
             </w:r>
             <w:r>
               <w:rPr>
@@ -1150,13 +1136,13 @@
           <w:pPr>
             <w:pStyle w:val="TOC2"/>
             <w:tabs>
-              <w:tab w:val="right" w:leader="dot" w:pos="10338"/>
+              <w:tab w:val="right" w:leader="dot" w:pos="13844"/>
             </w:tabs>
             <w:rPr>
               <w:noProof/>
             </w:rPr>
           </w:pPr>
-          <w:hyperlink w:anchor="_Toc225115686" w:history="1">
+          <w:hyperlink w:anchor="_Toc225694770" w:history="1">
             <w:r>
               <w:rPr>
                 <w:rStyle w:val="Hyperlink"/>
@@ -1183,7 +1169,7 @@
                 <w:noProof/>
                 <w:webHidden/>
               </w:rPr>
-              <w:instrText xml:space="preserve"> PAGEREF _Toc225115686 \h </w:instrText>
+              <w:instrText xml:space="preserve"> PAGEREF _Toc225694770 \h </w:instrText>
             </w:r>
             <w:r>
               <w:rPr>
@@ -1218,13 +1204,13 @@
           <w:pPr>
             <w:pStyle w:val="TOC2"/>
             <w:tabs>
-              <w:tab w:val="right" w:leader="dot" w:pos="10338"/>
+              <w:tab w:val="right" w:leader="dot" w:pos="13844"/>
             </w:tabs>
             <w:rPr>
               <w:noProof/>
             </w:rPr>
           </w:pPr>
-          <w:hyperlink w:anchor="_Toc225115687" w:history="1">
+          <w:hyperlink w:anchor="_Toc225694771" w:history="1">
             <w:r>
               <w:rPr>
                 <w:rStyle w:val="Hyperlink"/>
@@ -1260,7 +1246,7 @@
                 <w:noProof/>
                 <w:webHidden/>
               </w:rPr>
-              <w:instrText xml:space="preserve"> PAGEREF _Toc225115687 \h </w:instrText>
+              <w:instrText xml:space="preserve"> PAGEREF _Toc225694771 \h </w:instrText>
             </w:r>
             <w:r>
               <w:rPr>
@@ -1295,13 +1281,13 @@
           <w:pPr>
             <w:pStyle w:val="TOC2"/>
             <w:tabs>
-              <w:tab w:val="right" w:leader="dot" w:pos="10338"/>
+              <w:tab w:val="right" w:leader="dot" w:pos="13844"/>
             </w:tabs>
             <w:rPr>
               <w:noProof/>
             </w:rPr>
           </w:pPr>
-          <w:hyperlink w:anchor="_Toc225115688" w:history="1">
+          <w:hyperlink w:anchor="_Toc225694772" w:history="1">
             <w:r>
               <w:rPr>
                 <w:rStyle w:val="Hyperlink"/>
@@ -1328,7 +1314,7 @@
                 <w:noProof/>
                 <w:webHidden/>
               </w:rPr>
-              <w:instrText xml:space="preserve"> PAGEREF _Toc225115688 \h </w:instrText>
+              <w:instrText xml:space="preserve"> PAGEREF _Toc225694772 \h </w:instrText>
             </w:r>
             <w:r>
               <w:rPr>
@@ -1363,13 +1349,13 @@
           <w:pPr>
             <w:pStyle w:val="TOC3"/>
             <w:tabs>
-              <w:tab w:val="right" w:leader="dot" w:pos="10338"/>
+              <w:tab w:val="right" w:leader="dot" w:pos="13844"/>
             </w:tabs>
             <w:rPr>
               <w:noProof/>
             </w:rPr>
           </w:pPr>
-          <w:hyperlink w:anchor="_Toc225115689" w:history="1">
+          <w:hyperlink w:anchor="_Toc225694773" w:history="1">
             <w:r>
               <w:rPr>
                 <w:rStyle w:val="Hyperlink"/>
@@ -1396,7 +1382,7 @@
                 <w:noProof/>
                 <w:webHidden/>
               </w:rPr>
-              <w:instrText xml:space="preserve"> PAGEREF _Toc225115689 \h </w:instrText>
+              <w:instrText xml:space="preserve"> PAGEREF _Toc225694773 \h </w:instrText>
             </w:r>
             <w:r>
               <w:rPr>
@@ -1431,13 +1417,13 @@
           <w:pPr>
             <w:pStyle w:val="TOC3"/>
             <w:tabs>
-              <w:tab w:val="right" w:leader="dot" w:pos="10338"/>
+              <w:tab w:val="right" w:leader="dot" w:pos="13844"/>
             </w:tabs>
             <w:rPr>
               <w:noProof/>
             </w:rPr>
           </w:pPr>
-          <w:hyperlink w:anchor="_Toc225115690" w:history="1">
+          <w:hyperlink w:anchor="_Toc225694774" w:history="1">
             <w:r>
               <w:rPr>
                 <w:rStyle w:val="Hyperlink"/>
@@ -1464,7 +1450,7 @@
                 <w:noProof/>
                 <w:webHidden/>
               </w:rPr>
-              <w:instrText xml:space="preserve"> PAGEREF _Toc225115690 \h </w:instrText>
+              <w:instrText xml:space="preserve"> PAGEREF _Toc225694774 \h </w:instrText>
             </w:r>
             <w:r>
               <w:rPr>
@@ -1499,13 +1485,13 @@
           <w:pPr>
             <w:pStyle w:val="TOC1"/>
             <w:tabs>
-              <w:tab w:val="right" w:leader="dot" w:pos="10338"/>
+              <w:tab w:val="right" w:leader="dot" w:pos="13844"/>
             </w:tabs>
             <w:rPr>
               <w:noProof/>
             </w:rPr>
           </w:pPr>
-          <w:hyperlink w:anchor="_Toc225115691" w:history="1">
+          <w:hyperlink w:anchor="_Toc225694775" w:history="1">
             <w:r>
               <w:rPr>
                 <w:rStyle w:val="Hyperlink"/>
@@ -1532,7 +1518,7 @@
                 <w:noProof/>
                 <w:webHidden/>
               </w:rPr>
-              <w:instrText xml:space="preserve"> PAGEREF _Toc225115691 \h </w:instrText>
+              <w:instrText xml:space="preserve"> PAGEREF _Toc225694775 \h </w:instrText>
             </w:r>
             <w:r>
               <w:rPr>
@@ -1567,13 +1553,13 @@
           <w:pPr>
             <w:pStyle w:val="TOC2"/>
             <w:tabs>
-              <w:tab w:val="right" w:leader="dot" w:pos="10338"/>
+              <w:tab w:val="right" w:leader="dot" w:pos="13844"/>
             </w:tabs>
             <w:rPr>
               <w:noProof/>
             </w:rPr>
           </w:pPr>
-          <w:hyperlink w:anchor="_Toc225115692" w:history="1">
+          <w:hyperlink w:anchor="_Toc225694776" w:history="1">
             <w:r>
               <w:rPr>
                 <w:rStyle w:val="Hyperlink"/>
@@ -1609,7 +1595,7 @@
                 <w:noProof/>
                 <w:webHidden/>
               </w:rPr>
-              <w:instrText xml:space="preserve"> PAGEREF _Toc225115692 \h </w:instrText>
+              <w:instrText xml:space="preserve"> PAGEREF _Toc225694776 \h </w:instrText>
             </w:r>
             <w:r>
               <w:rPr>
@@ -1644,13 +1630,13 @@
           <w:pPr>
             <w:pStyle w:val="TOC2"/>
             <w:tabs>
-              <w:tab w:val="right" w:leader="dot" w:pos="10338"/>
+              <w:tab w:val="right" w:leader="dot" w:pos="13844"/>
             </w:tabs>
             <w:rPr>
               <w:noProof/>
             </w:rPr>
           </w:pPr>
-          <w:hyperlink w:anchor="_Toc225115693" w:history="1">
+          <w:hyperlink w:anchor="_Toc225694777" w:history="1">
             <w:r>
               <w:rPr>
                 <w:rStyle w:val="Hyperlink"/>
@@ -1686,7 +1672,7 @@
                 <w:noProof/>
                 <w:webHidden/>
               </w:rPr>
-              <w:instrText xml:space="preserve"> PAGEREF _Toc225115693 \h </w:instrText>
+              <w:instrText xml:space="preserve"> PAGEREF _Toc225694777 \h </w:instrText>
             </w:r>
             <w:r>
               <w:rPr>
@@ -1721,13 +1707,13 @@
           <w:pPr>
             <w:pStyle w:val="TOC2"/>
             <w:tabs>
-              <w:tab w:val="right" w:leader="dot" w:pos="10338"/>
+              <w:tab w:val="right" w:leader="dot" w:pos="13844"/>
             </w:tabs>
             <w:rPr>
               <w:noProof/>
             </w:rPr>
           </w:pPr>
-          <w:hyperlink w:anchor="_Toc225115694" w:history="1">
+          <w:hyperlink w:anchor="_Toc225694778" w:history="1">
             <w:r>
               <w:rPr>
                 <w:rStyle w:val="Hyperlink"/>
@@ -1763,7 +1749,7 @@
                 <w:noProof/>
                 <w:webHidden/>
               </w:rPr>
-              <w:instrText xml:space="preserve"> PAGEREF _Toc225115694 \h </w:instrText>
+              <w:instrText xml:space="preserve"> PAGEREF _Toc225694778 \h </w:instrText>
             </w:r>
             <w:r>
               <w:rPr>
@@ -1798,13 +1784,13 @@
           <w:pPr>
             <w:pStyle w:val="TOC1"/>
             <w:tabs>
-              <w:tab w:val="right" w:leader="dot" w:pos="10338"/>
+              <w:tab w:val="right" w:leader="dot" w:pos="13844"/>
             </w:tabs>
             <w:rPr>
               <w:noProof/>
             </w:rPr>
           </w:pPr>
-          <w:hyperlink w:anchor="_Toc225115695" w:history="1">
+          <w:hyperlink w:anchor="_Toc225694779" w:history="1">
             <w:r>
               <w:rPr>
                 <w:rStyle w:val="Hyperlink"/>
@@ -1831,7 +1817,7 @@
                 <w:noProof/>
                 <w:webHidden/>
               </w:rPr>
-              <w:instrText xml:space="preserve"> PAGEREF _Toc225115695 \h </w:instrText>
+              <w:instrText xml:space="preserve"> PAGEREF _Toc225694779 \h </w:instrText>
             </w:r>
             <w:r>
               <w:rPr>
@@ -1866,13 +1852,13 @@
           <w:pPr>
             <w:pStyle w:val="TOC2"/>
             <w:tabs>
-              <w:tab w:val="right" w:leader="dot" w:pos="10338"/>
+              <w:tab w:val="right" w:leader="dot" w:pos="13844"/>
             </w:tabs>
             <w:rPr>
               <w:noProof/>
             </w:rPr>
           </w:pPr>
-          <w:hyperlink w:anchor="_Toc225115696" w:history="1">
+          <w:hyperlink w:anchor="_Toc225694780" w:history="1">
             <w:r>
               <w:rPr>
                 <w:rStyle w:val="Hyperlink"/>
@@ -1899,7 +1885,7 @@
                 <w:noProof/>
                 <w:webHidden/>
               </w:rPr>
-              <w:instrText xml:space="preserve"> PAGEREF _Toc225115696 \h </w:instrText>
+              <w:instrText xml:space="preserve"> PAGEREF _Toc225694780 \h </w:instrText>
             </w:r>
             <w:r>
               <w:rPr>
@@ -1934,13 +1920,13 @@
           <w:pPr>
             <w:pStyle w:val="TOC3"/>
             <w:tabs>
-              <w:tab w:val="right" w:leader="dot" w:pos="10338"/>
+              <w:tab w:val="right" w:leader="dot" w:pos="13844"/>
             </w:tabs>
             <w:rPr>
               <w:noProof/>
             </w:rPr>
           </w:pPr>
-          <w:hyperlink w:anchor="_Toc225115697" w:history="1">
+          <w:hyperlink w:anchor="_Toc225694781" w:history="1">
             <w:r>
               <w:rPr>
                 <w:rStyle w:val="Hyperlink"/>
@@ -1967,7 +1953,7 @@
                 <w:noProof/>
                 <w:webHidden/>
               </w:rPr>
-              <w:instrText xml:space="preserve"> PAGEREF _Toc225115697 \h </w:instrText>
+              <w:instrText xml:space="preserve"> PAGEREF _Toc225694781 \h </w:instrText>
             </w:r>
             <w:r>
               <w:rPr>
@@ -2002,13 +1988,13 @@
           <w:pPr>
             <w:pStyle w:val="TOC3"/>
             <w:tabs>
-              <w:tab w:val="right" w:leader="dot" w:pos="10338"/>
+              <w:tab w:val="right" w:leader="dot" w:pos="13844"/>
             </w:tabs>
             <w:rPr>
               <w:noProof/>
             </w:rPr>
           </w:pPr>
-          <w:hyperlink w:anchor="_Toc225115698" w:history="1">
+          <w:hyperlink w:anchor="_Toc225694782" w:history="1">
             <w:r>
               <w:rPr>
                 <w:rStyle w:val="Hyperlink"/>
@@ -2035,7 +2021,7 @@
                 <w:noProof/>
                 <w:webHidden/>
               </w:rPr>
-              <w:instrText xml:space="preserve"> PAGEREF _Toc225115698 \h </w:instrText>
+              <w:instrText xml:space="preserve"> PAGEREF _Toc225694782 \h </w:instrText>
             </w:r>
             <w:r>
               <w:rPr>
@@ -2070,13 +2056,13 @@
           <w:pPr>
             <w:pStyle w:val="TOC3"/>
             <w:tabs>
-              <w:tab w:val="right" w:leader="dot" w:pos="10338"/>
+              <w:tab w:val="right" w:leader="dot" w:pos="13844"/>
             </w:tabs>
             <w:rPr>
               <w:noProof/>
             </w:rPr>
           </w:pPr>
-          <w:hyperlink w:anchor="_Toc225115699" w:history="1">
+          <w:hyperlink w:anchor="_Toc225694783" w:history="1">
             <w:r>
               <w:rPr>
                 <w:rStyle w:val="Hyperlink"/>
@@ -2103,7 +2089,7 @@
                 <w:noProof/>
                 <w:webHidden/>
               </w:rPr>
-              <w:instrText xml:space="preserve"> PAGEREF _Toc225115699 \h </w:instrText>
+              <w:instrText xml:space="preserve"> PAGEREF _Toc225694783 \h </w:instrText>
             </w:r>
             <w:r>
               <w:rPr>
@@ -2138,13 +2124,13 @@
           <w:pPr>
             <w:pStyle w:val="TOC3"/>
             <w:tabs>
-              <w:tab w:val="right" w:leader="dot" w:pos="10338"/>
+              <w:tab w:val="right" w:leader="dot" w:pos="13844"/>
             </w:tabs>
             <w:rPr>
               <w:noProof/>
             </w:rPr>
           </w:pPr>
-          <w:hyperlink w:anchor="_Toc225115700" w:history="1">
+          <w:hyperlink w:anchor="_Toc225694784" w:history="1">
             <w:r>
               <w:rPr>
                 <w:rStyle w:val="Hyperlink"/>
@@ -2171,7 +2157,7 @@
                 <w:noProof/>
                 <w:webHidden/>
               </w:rPr>
-              <w:instrText xml:space="preserve"> PAGEREF _Toc225115700 \h </w:instrText>
+              <w:instrText xml:space="preserve"> PAGEREF _Toc225694784 \h </w:instrText>
             </w:r>
             <w:r>
               <w:rPr>
@@ -2206,13 +2192,13 @@
           <w:pPr>
             <w:pStyle w:val="TOC3"/>
             <w:tabs>
-              <w:tab w:val="right" w:leader="dot" w:pos="10338"/>
+              <w:tab w:val="right" w:leader="dot" w:pos="13844"/>
             </w:tabs>
             <w:rPr>
               <w:noProof/>
             </w:rPr>
           </w:pPr>
-          <w:hyperlink w:anchor="_Toc225115701" w:history="1">
+          <w:hyperlink w:anchor="_Toc225694785" w:history="1">
             <w:r>
               <w:rPr>
                 <w:rStyle w:val="Hyperlink"/>
@@ -2239,7 +2225,7 @@
                 <w:noProof/>
                 <w:webHidden/>
               </w:rPr>
-              <w:instrText xml:space="preserve"> PAGEREF _Toc225115701 \h </w:instrText>
+              <w:instrText xml:space="preserve"> PAGEREF _Toc225694785 \h </w:instrText>
             </w:r>
             <w:r>
               <w:rPr>
@@ -2274,13 +2260,13 @@
           <w:pPr>
             <w:pStyle w:val="TOC2"/>
             <w:tabs>
-              <w:tab w:val="right" w:leader="dot" w:pos="10338"/>
+              <w:tab w:val="right" w:leader="dot" w:pos="13844"/>
             </w:tabs>
             <w:rPr>
               <w:noProof/>
             </w:rPr>
           </w:pPr>
-          <w:hyperlink w:anchor="_Toc225115702" w:history="1">
+          <w:hyperlink w:anchor="_Toc225694786" w:history="1">
             <w:r>
               <w:rPr>
                 <w:rStyle w:val="Hyperlink"/>
@@ -2307,7 +2293,7 @@
                 <w:noProof/>
                 <w:webHidden/>
               </w:rPr>
-              <w:instrText xml:space="preserve"> PAGEREF _Toc225115702 \h </w:instrText>
+              <w:instrText xml:space="preserve"> PAGEREF _Toc225694786 \h </w:instrText>
             </w:r>
             <w:r>
               <w:rPr>
@@ -2342,13 +2328,13 @@
           <w:pPr>
             <w:pStyle w:val="TOC3"/>
             <w:tabs>
-              <w:tab w:val="right" w:leader="dot" w:pos="10338"/>
+              <w:tab w:val="right" w:leader="dot" w:pos="13844"/>
             </w:tabs>
             <w:rPr>
               <w:noProof/>
             </w:rPr>
           </w:pPr>
-          <w:hyperlink w:anchor="_Toc225115703" w:history="1">
+          <w:hyperlink w:anchor="_Toc225694787" w:history="1">
             <w:r>
               <w:rPr>
                 <w:rStyle w:val="Hyperlink"/>
@@ -2375,7 +2361,7 @@
                 <w:noProof/>
                 <w:webHidden/>
               </w:rPr>
-              <w:instrText xml:space="preserve"> PAGEREF _Toc225115703 \h </w:instrText>
+              <w:instrText xml:space="preserve"> PAGEREF _Toc225694787 \h </w:instrText>
             </w:r>
             <w:r>
               <w:rPr>
@@ -2396,6 +2382,496 @@
                 <w:webHidden/>
               </w:rPr>
               <w:t>25</w:t>
+            </w:r>
+            <w:r>
+              <w:rPr>
+                <w:noProof/>
+                <w:webHidden/>
+              </w:rPr>
+              <w:fldChar w:fldCharType="end"/>
+            </w:r>
+          </w:hyperlink>
+        </w:p>
+        <w:p>
+          <w:pPr>
+            <w:pStyle w:val="TOC3"/>
+            <w:tabs>
+              <w:tab w:val="right" w:leader="dot" w:pos="13844"/>
+            </w:tabs>
+            <w:rPr>
+              <w:noProof/>
+            </w:rPr>
+          </w:pPr>
+          <w:hyperlink w:anchor="_Toc225694788" w:history="1">
+            <w:r>
+              <w:rPr>
+                <w:rStyle w:val="Hyperlink"/>
+                <w:noProof/>
+              </w:rPr>
+              <w:t>5.4 Phase 3 – Comment API</w:t>
+            </w:r>
+            <w:r>
+              <w:rPr>
+                <w:noProof/>
+                <w:webHidden/>
+              </w:rPr>
+              <w:tab/>
+            </w:r>
+            <w:r>
+              <w:rPr>
+                <w:noProof/>
+                <w:webHidden/>
+              </w:rPr>
+              <w:fldChar w:fldCharType="begin"/>
+            </w:r>
+            <w:r>
+              <w:rPr>
+                <w:noProof/>
+                <w:webHidden/>
+              </w:rPr>
+              <w:instrText xml:space="preserve"> PAGEREF _Toc225694788 \h </w:instrText>
+            </w:r>
+            <w:r>
+              <w:rPr>
+                <w:noProof/>
+                <w:webHidden/>
+              </w:rPr>
+            </w:r>
+            <w:r>
+              <w:rPr>
+                <w:noProof/>
+                <w:webHidden/>
+              </w:rPr>
+              <w:fldChar w:fldCharType="separate"/>
+            </w:r>
+            <w:r>
+              <w:rPr>
+                <w:noProof/>
+                <w:webHidden/>
+              </w:rPr>
+              <w:t>25</w:t>
+            </w:r>
+            <w:r>
+              <w:rPr>
+                <w:noProof/>
+                <w:webHidden/>
+              </w:rPr>
+              <w:fldChar w:fldCharType="end"/>
+            </w:r>
+          </w:hyperlink>
+        </w:p>
+        <w:p>
+          <w:pPr>
+            <w:pStyle w:val="TOC3"/>
+            <w:tabs>
+              <w:tab w:val="right" w:leader="dot" w:pos="13844"/>
+            </w:tabs>
+            <w:rPr>
+              <w:noProof/>
+            </w:rPr>
+          </w:pPr>
+          <w:hyperlink w:anchor="_Toc225694789" w:history="1">
+            <w:r>
+              <w:rPr>
+                <w:rStyle w:val="Hyperlink"/>
+                <w:noProof/>
+              </w:rPr>
+              <w:t>5.5 Phase 4 – 5 – Frontend</w:t>
+            </w:r>
+            <w:r>
+              <w:rPr>
+                <w:noProof/>
+                <w:webHidden/>
+              </w:rPr>
+              <w:tab/>
+            </w:r>
+            <w:r>
+              <w:rPr>
+                <w:noProof/>
+                <w:webHidden/>
+              </w:rPr>
+              <w:fldChar w:fldCharType="begin"/>
+            </w:r>
+            <w:r>
+              <w:rPr>
+                <w:noProof/>
+                <w:webHidden/>
+              </w:rPr>
+              <w:instrText xml:space="preserve"> PAGEREF _Toc225694789 \h </w:instrText>
+            </w:r>
+            <w:r>
+              <w:rPr>
+                <w:noProof/>
+                <w:webHidden/>
+              </w:rPr>
+            </w:r>
+            <w:r>
+              <w:rPr>
+                <w:noProof/>
+                <w:webHidden/>
+              </w:rPr>
+              <w:fldChar w:fldCharType="separate"/>
+            </w:r>
+            <w:r>
+              <w:rPr>
+                <w:noProof/>
+                <w:webHidden/>
+              </w:rPr>
+              <w:t>25</w:t>
+            </w:r>
+            <w:r>
+              <w:rPr>
+                <w:noProof/>
+                <w:webHidden/>
+              </w:rPr>
+              <w:fldChar w:fldCharType="end"/>
+            </w:r>
+          </w:hyperlink>
+        </w:p>
+        <w:p>
+          <w:pPr>
+            <w:pStyle w:val="TOC3"/>
+            <w:tabs>
+              <w:tab w:val="right" w:leader="dot" w:pos="13844"/>
+            </w:tabs>
+            <w:rPr>
+              <w:noProof/>
+            </w:rPr>
+          </w:pPr>
+          <w:hyperlink w:anchor="_Toc225694790" w:history="1">
+            <w:r>
+              <w:rPr>
+                <w:rStyle w:val="Hyperlink"/>
+                <w:noProof/>
+              </w:rPr>
+              <w:t>5.6 Phase 6: Polish &amp; Hardening</w:t>
+            </w:r>
+            <w:r>
+              <w:rPr>
+                <w:noProof/>
+                <w:webHidden/>
+              </w:rPr>
+              <w:tab/>
+            </w:r>
+            <w:r>
+              <w:rPr>
+                <w:noProof/>
+                <w:webHidden/>
+              </w:rPr>
+              <w:fldChar w:fldCharType="begin"/>
+            </w:r>
+            <w:r>
+              <w:rPr>
+                <w:noProof/>
+                <w:webHidden/>
+              </w:rPr>
+              <w:instrText xml:space="preserve"> PAGEREF _Toc225694790 \h </w:instrText>
+            </w:r>
+            <w:r>
+              <w:rPr>
+                <w:noProof/>
+                <w:webHidden/>
+              </w:rPr>
+            </w:r>
+            <w:r>
+              <w:rPr>
+                <w:noProof/>
+                <w:webHidden/>
+              </w:rPr>
+              <w:fldChar w:fldCharType="separate"/>
+            </w:r>
+            <w:r>
+              <w:rPr>
+                <w:noProof/>
+                <w:webHidden/>
+              </w:rPr>
+              <w:t>25</w:t>
+            </w:r>
+            <w:r>
+              <w:rPr>
+                <w:noProof/>
+                <w:webHidden/>
+              </w:rPr>
+              <w:fldChar w:fldCharType="end"/>
+            </w:r>
+          </w:hyperlink>
+        </w:p>
+        <w:p>
+          <w:pPr>
+            <w:pStyle w:val="TOC1"/>
+            <w:tabs>
+              <w:tab w:val="right" w:leader="dot" w:pos="13844"/>
+            </w:tabs>
+            <w:rPr>
+              <w:noProof/>
+            </w:rPr>
+          </w:pPr>
+          <w:hyperlink w:anchor="_Toc225694791" w:history="1">
+            <w:r>
+              <w:rPr>
+                <w:rStyle w:val="Hyperlink"/>
+                <w:noProof/>
+              </w:rPr>
+              <w:t>6. Authorization by G</w:t>
+            </w:r>
+            <w:r>
+              <w:rPr>
+                <w:rStyle w:val="Hyperlink"/>
+                <w:noProof/>
+              </w:rPr>
+              <w:t>r</w:t>
+            </w:r>
+            <w:r>
+              <w:rPr>
+                <w:rStyle w:val="Hyperlink"/>
+                <w:noProof/>
+              </w:rPr>
+              <w:t>oup</w:t>
+            </w:r>
+            <w:r>
+              <w:rPr>
+                <w:noProof/>
+                <w:webHidden/>
+              </w:rPr>
+              <w:tab/>
+            </w:r>
+            <w:r>
+              <w:rPr>
+                <w:noProof/>
+                <w:webHidden/>
+              </w:rPr>
+              <w:fldChar w:fldCharType="begin"/>
+            </w:r>
+            <w:r>
+              <w:rPr>
+                <w:noProof/>
+                <w:webHidden/>
+              </w:rPr>
+              <w:instrText xml:space="preserve"> PAGEREF _Toc225694791 \h </w:instrText>
+            </w:r>
+            <w:r>
+              <w:rPr>
+                <w:noProof/>
+                <w:webHidden/>
+              </w:rPr>
+            </w:r>
+            <w:r>
+              <w:rPr>
+                <w:noProof/>
+                <w:webHidden/>
+              </w:rPr>
+              <w:fldChar w:fldCharType="separate"/>
+            </w:r>
+            <w:r>
+              <w:rPr>
+                <w:noProof/>
+                <w:webHidden/>
+              </w:rPr>
+              <w:t>26</w:t>
+            </w:r>
+            <w:r>
+              <w:rPr>
+                <w:noProof/>
+                <w:webHidden/>
+              </w:rPr>
+              <w:fldChar w:fldCharType="end"/>
+            </w:r>
+          </w:hyperlink>
+        </w:p>
+        <w:p>
+          <w:pPr>
+            <w:pStyle w:val="TOC2"/>
+            <w:tabs>
+              <w:tab w:val="right" w:leader="dot" w:pos="13844"/>
+            </w:tabs>
+            <w:rPr>
+              <w:noProof/>
+            </w:rPr>
+          </w:pPr>
+          <w:hyperlink w:anchor="_Toc225694792" w:history="1">
+            <w:r>
+              <w:rPr>
+                <w:rStyle w:val="Hyperlink"/>
+                <w:noProof/>
+              </w:rPr>
+              <w:t>6.1  Setting Up Groups in Microsoft Entra ID</w:t>
+            </w:r>
+            <w:r>
+              <w:rPr>
+                <w:noProof/>
+                <w:webHidden/>
+              </w:rPr>
+              <w:tab/>
+            </w:r>
+            <w:r>
+              <w:rPr>
+                <w:noProof/>
+                <w:webHidden/>
+              </w:rPr>
+              <w:fldChar w:fldCharType="begin"/>
+            </w:r>
+            <w:r>
+              <w:rPr>
+                <w:noProof/>
+                <w:webHidden/>
+              </w:rPr>
+              <w:instrText xml:space="preserve"> PAGEREF _Toc225694792 \h </w:instrText>
+            </w:r>
+            <w:r>
+              <w:rPr>
+                <w:noProof/>
+                <w:webHidden/>
+              </w:rPr>
+            </w:r>
+            <w:r>
+              <w:rPr>
+                <w:noProof/>
+                <w:webHidden/>
+              </w:rPr>
+              <w:fldChar w:fldCharType="separate"/>
+            </w:r>
+            <w:r>
+              <w:rPr>
+                <w:noProof/>
+                <w:webHidden/>
+              </w:rPr>
+              <w:t>26</w:t>
+            </w:r>
+            <w:r>
+              <w:rPr>
+                <w:noProof/>
+                <w:webHidden/>
+              </w:rPr>
+              <w:fldChar w:fldCharType="end"/>
+            </w:r>
+          </w:hyperlink>
+        </w:p>
+        <w:p>
+          <w:pPr>
+            <w:pStyle w:val="TOC2"/>
+            <w:tabs>
+              <w:tab w:val="right" w:leader="dot" w:pos="13844"/>
+            </w:tabs>
+            <w:rPr>
+              <w:noProof/>
+            </w:rPr>
+          </w:pPr>
+          <w:hyperlink w:anchor="_Toc225694793" w:history="1">
+            <w:r>
+              <w:rPr>
+                <w:rStyle w:val="Hyperlink"/>
+                <w:noProof/>
+              </w:rPr>
+              <w:t>6.2 Spring Boot Application Implementation</w:t>
+            </w:r>
+            <w:r>
+              <w:rPr>
+                <w:noProof/>
+                <w:webHidden/>
+              </w:rPr>
+              <w:tab/>
+            </w:r>
+            <w:r>
+              <w:rPr>
+                <w:noProof/>
+                <w:webHidden/>
+              </w:rPr>
+              <w:fldChar w:fldCharType="begin"/>
+            </w:r>
+            <w:r>
+              <w:rPr>
+                <w:noProof/>
+                <w:webHidden/>
+              </w:rPr>
+              <w:instrText xml:space="preserve"> PAGEREF _Toc225694793 \h </w:instrText>
+            </w:r>
+            <w:r>
+              <w:rPr>
+                <w:noProof/>
+                <w:webHidden/>
+              </w:rPr>
+            </w:r>
+            <w:r>
+              <w:rPr>
+                <w:noProof/>
+                <w:webHidden/>
+              </w:rPr>
+              <w:fldChar w:fldCharType="separate"/>
+            </w:r>
+            <w:r>
+              <w:rPr>
+                <w:noProof/>
+                <w:webHidden/>
+              </w:rPr>
+              <w:t>28</w:t>
+            </w:r>
+            <w:r>
+              <w:rPr>
+                <w:noProof/>
+                <w:webHidden/>
+              </w:rPr>
+              <w:fldChar w:fldCharType="end"/>
+            </w:r>
+          </w:hyperlink>
+        </w:p>
+        <w:p>
+          <w:pPr>
+            <w:pStyle w:val="TOC1"/>
+            <w:tabs>
+              <w:tab w:val="right" w:leader="dot" w:pos="13844"/>
+            </w:tabs>
+            <w:rPr>
+              <w:noProof/>
+            </w:rPr>
+          </w:pPr>
+          <w:hyperlink w:anchor="_Toc225694794" w:history="1">
+            <w:r>
+              <w:rPr>
+                <w:rStyle w:val="Hyperlink"/>
+                <w:noProof/>
+              </w:rPr>
+              <w:t>7. Mock Authentication and Authorization</w:t>
+            </w:r>
+            <w:r>
+              <w:rPr>
+                <w:noProof/>
+                <w:webHidden/>
+              </w:rPr>
+              <w:tab/>
+            </w:r>
+            <w:r>
+              <w:rPr>
+                <w:noProof/>
+                <w:webHidden/>
+              </w:rPr>
+              <w:fldChar w:fldCharType="begin"/>
+            </w:r>
+            <w:r>
+              <w:rPr>
+                <w:noProof/>
+                <w:webHidden/>
+              </w:rPr>
+              <w:instrText xml:space="preserve"> PAGEREF _Toc225694794 \h </w:instrText>
+            </w:r>
+            <w:r>
+              <w:rPr>
+                <w:noProof/>
+                <w:webHidden/>
+              </w:rPr>
+            </w:r>
+            <w:r>
+              <w:rPr>
+                <w:noProof/>
+                <w:webHidden/>
+              </w:rPr>
+              <w:fldChar w:fldCharType="separate"/>
+            </w:r>
+            <w:r>
+              <w:rPr>
+                <w:noProof/>
+                <w:webHidden/>
+              </w:rPr>
+              <w:t>29</w:t>
             </w:r>
             <w:r>
               <w:rPr>
@@ -2435,7 +2911,7 @@
       <w:pPr>
         <w:pStyle w:val="Heading1"/>
       </w:pPr>
-      <w:bookmarkStart w:id="0" w:name="_Toc225115670"/>
+      <w:bookmarkStart w:id="0" w:name="_Toc225694754"/>
       <w:r>
         <w:lastRenderedPageBreak/>
         <w:t xml:space="preserve">1. </w:t>
@@ -2449,7 +2925,7 @@
       <w:pPr>
         <w:pStyle w:val="Heading2"/>
       </w:pPr>
-      <w:bookmarkStart w:id="1" w:name="_Toc225115671"/>
+      <w:bookmarkStart w:id="1" w:name="_Toc225694755"/>
       <w:r>
         <w:t xml:space="preserve">1.1 </w:t>
       </w:r>
@@ -2628,7 +3104,7 @@
       <w:pPr>
         <w:pStyle w:val="Heading2"/>
       </w:pPr>
-      <w:bookmarkStart w:id="2" w:name="_Toc225115672"/>
+      <w:bookmarkStart w:id="2" w:name="_Toc225694756"/>
       <w:r>
         <w:t xml:space="preserve">1.2 </w:t>
       </w:r>
@@ -2744,7 +3220,7 @@
       <w:pPr>
         <w:pStyle w:val="Heading1"/>
       </w:pPr>
-      <w:bookmarkStart w:id="3" w:name="_Toc225115673"/>
+      <w:bookmarkStart w:id="3" w:name="_Toc225694757"/>
       <w:r>
         <w:t xml:space="preserve">2. </w:t>
       </w:r>
@@ -2757,7 +3233,7 @@
       <w:pPr>
         <w:pStyle w:val="Heading2"/>
       </w:pPr>
-      <w:bookmarkStart w:id="4" w:name="_Toc225115674"/>
+      <w:bookmarkStart w:id="4" w:name="_Toc225694758"/>
       <w:r>
         <w:t>2</w:t>
       </w:r>
@@ -2921,7 +3397,7 @@
       <w:pPr>
         <w:pStyle w:val="Heading2"/>
       </w:pPr>
-      <w:bookmarkStart w:id="5" w:name="_Toc225115675"/>
+      <w:bookmarkStart w:id="5" w:name="_Toc225694759"/>
       <w:r>
         <w:t>2</w:t>
       </w:r>
@@ -2938,30 +3414,24 @@
         <w:t>leap-poc-admin1</w:t>
       </w:r>
       <w:r>
+        <w:t xml:space="preserve"> (Admin1 Leap)</w:t>
+      </w:r>
+      <w:r>
+        <w:t xml:space="preserve"> / </w:t>
+      </w:r>
+      <w:r>
+        <w:t>P</w:t>
+      </w:r>
+      <w:r>
+        <w:t>swd@9991</w:t>
+      </w:r>
+      <w:r>
+        <w:t>23</w:t>
+      </w:r>
+      <w:r>
         <w:t xml:space="preserve"> (</w:t>
       </w:r>
       <w:r>
-        <w:t>Admin1</w:t>
-      </w:r>
-      <w:r>
-        <w:t xml:space="preserve"> Leap)</w:t>
-      </w:r>
-      <w:r>
-        <w:t xml:space="preserve"> / </w:t>
-      </w:r>
-      <w:r>
-        <w:t>P</w:t>
-      </w:r>
-      <w:r>
-        <w:t>swd@9991</w:t>
-      </w:r>
-      <w:r>
-        <w:t>23</w:t>
-      </w:r>
-      <w:r>
-        <w:t xml:space="preserve"> (</w:t>
-      </w:r>
-      <w:r>
         <w:t>leap-poc-admin1@danielxtbsmgmail.onmicrosoft.com</w:t>
       </w:r>
       <w:r>
@@ -2976,13 +3446,7 @@
         <w:t>leap-poc-admin2</w:t>
       </w:r>
       <w:r>
-        <w:t xml:space="preserve"> (</w:t>
-      </w:r>
-      <w:r>
-        <w:t>Admin</w:t>
-      </w:r>
-      <w:r>
-        <w:t>2 Leap)</w:t>
+        <w:t xml:space="preserve"> (Admin2 Leap)</w:t>
       </w:r>
     </w:p>
     <w:p>
@@ -2999,13 +3463,7 @@
         <w:t>e1</w:t>
       </w:r>
       <w:r>
-        <w:t xml:space="preserve"> (Write</w:t>
-      </w:r>
-      <w:r>
-        <w:t>1</w:t>
-      </w:r>
-      <w:r>
-        <w:t xml:space="preserve"> Leap)</w:t>
+        <w:t xml:space="preserve"> (Write1 Leap)</w:t>
       </w:r>
     </w:p>
     <w:p>
@@ -3013,10 +3471,7 @@
         <w:ind w:left="720"/>
       </w:pPr>
       <w:r>
-        <w:t>leap-poc-write</w:t>
-      </w:r>
-      <w:r>
-        <w:t>2 (Write2 Leap)</w:t>
+        <w:t>leap-poc-write2 (Write2 Leap)</w:t>
       </w:r>
     </w:p>
     <w:p>
@@ -3027,13 +3482,7 @@
         <w:t>leap-poc-read1</w:t>
       </w:r>
       <w:r>
-        <w:t xml:space="preserve"> (</w:t>
-      </w:r>
-      <w:r>
-        <w:t>Admin1</w:t>
-      </w:r>
-      <w:r>
-        <w:t xml:space="preserve"> Leap)</w:t>
+        <w:t xml:space="preserve"> (Admin1 Leap)</w:t>
       </w:r>
     </w:p>
     <w:p>
@@ -3044,13 +3493,7 @@
         <w:t>leap-poc-read2</w:t>
       </w:r>
       <w:r>
-        <w:t xml:space="preserve"> (</w:t>
-      </w:r>
-      <w:r>
-        <w:t>Admin2</w:t>
-      </w:r>
-      <w:r>
-        <w:t xml:space="preserve"> Leap)</w:t>
+        <w:t xml:space="preserve"> (Admin2 Leap)</w:t>
       </w:r>
     </w:p>
     <w:p>
@@ -3073,7 +3516,7 @@
       <w:pPr>
         <w:pStyle w:val="Heading2"/>
       </w:pPr>
-      <w:bookmarkStart w:id="6" w:name="_Toc225115676"/>
+      <w:bookmarkStart w:id="6" w:name="_Toc225694760"/>
       <w:r>
         <w:t>2</w:t>
       </w:r>
@@ -3128,13 +3571,8 @@
         </w:numPr>
       </w:pPr>
       <w:r>
-        <w:t xml:space="preserve">Name: </w:t>
-      </w:r>
-      <w:proofErr w:type="spellStart"/>
-      <w:r>
-        <w:t>poc-bff</w:t>
-      </w:r>
-      <w:proofErr w:type="spellEnd"/>
+        <w:t>Name: poc-bff</w:t>
+      </w:r>
     </w:p>
     <w:p>
       <w:pPr>
@@ -3240,7 +3678,7 @@
       <w:pPr>
         <w:pStyle w:val="Heading3"/>
       </w:pPr>
-      <w:bookmarkStart w:id="7" w:name="_Toc225115677"/>
+      <w:bookmarkStart w:id="7" w:name="_Toc225694761"/>
       <w:r>
         <w:t>2</w:t>
       </w:r>
@@ -3258,15 +3696,7 @@
         </w:numPr>
       </w:pPr>
       <w:r>
-        <w:t xml:space="preserve">App registrations → </w:t>
-      </w:r>
-      <w:proofErr w:type="spellStart"/>
-      <w:r>
-        <w:t>poc-bff</w:t>
-      </w:r>
-      <w:proofErr w:type="spellEnd"/>
-      <w:r>
-        <w:t xml:space="preserve"> →</w:t>
+        <w:t>App registrations → poc-bff →</w:t>
       </w:r>
       <w:r>
         <w:t xml:space="preserve"> </w:t>
@@ -3360,7 +3790,7 @@
       <w:pPr>
         <w:pStyle w:val="Heading3"/>
       </w:pPr>
-      <w:bookmarkStart w:id="8" w:name="_Toc225115678"/>
+      <w:bookmarkStart w:id="8" w:name="_Toc225694762"/>
       <w:r>
         <w:t xml:space="preserve">1.3.2 </w:t>
       </w:r>
@@ -3378,15 +3808,7 @@
         </w:numPr>
       </w:pPr>
       <w:r>
-        <w:t xml:space="preserve">App registrations → </w:t>
-      </w:r>
-      <w:proofErr w:type="spellStart"/>
-      <w:r>
-        <w:t>poc-bff</w:t>
-      </w:r>
-      <w:proofErr w:type="spellEnd"/>
-      <w:r>
-        <w:t xml:space="preserve"> → </w:t>
+        <w:t xml:space="preserve">App registrations → poc-bff → </w:t>
       </w:r>
       <w:r>
         <w:rPr>
@@ -3465,15 +3887,7 @@
         </w:r>
       </w:hyperlink>
       <w:r>
-        <w:t xml:space="preserve"> </w:t>
-      </w:r>
-      <w:proofErr w:type="gramStart"/>
-      <w:r>
-        <w:t xml:space="preserve">  ??</w:t>
-      </w:r>
-      <w:proofErr w:type="gramEnd"/>
-      <w:r>
-        <w:t xml:space="preserve"> </w:t>
+        <w:t xml:space="preserve">   ?? </w:t>
       </w:r>
       <w:r>
         <w:t>The logout URL must start with "HTTPS"</w:t>
@@ -3551,7 +3965,7 @@
       <w:pPr>
         <w:pStyle w:val="Heading2"/>
       </w:pPr>
-      <w:bookmarkStart w:id="9" w:name="_Toc225115679"/>
+      <w:bookmarkStart w:id="9" w:name="_Toc225694763"/>
       <w:r>
         <w:t xml:space="preserve">1.4 </w:t>
       </w:r>
@@ -3569,15 +3983,7 @@
         </w:numPr>
       </w:pPr>
       <w:r>
-        <w:t xml:space="preserve">App registrations → </w:t>
-      </w:r>
-      <w:proofErr w:type="spellStart"/>
-      <w:r>
-        <w:t>poc-bff</w:t>
-      </w:r>
-      <w:proofErr w:type="spellEnd"/>
-      <w:r>
-        <w:t xml:space="preserve"> → </w:t>
+        <w:t xml:space="preserve">App registrations → poc-bff → </w:t>
       </w:r>
       <w:r>
         <w:rPr>
@@ -3719,7 +4125,7 @@
       <w:pPr>
         <w:pStyle w:val="Heading2"/>
       </w:pPr>
-      <w:bookmarkStart w:id="10" w:name="_Toc225115680"/>
+      <w:bookmarkStart w:id="10" w:name="_Toc225694764"/>
       <w:r>
         <w:t xml:space="preserve">1.5 </w:t>
       </w:r>
@@ -3756,7 +4162,6 @@
       <w:r>
         <w:t xml:space="preserve">Find </w:t>
       </w:r>
-      <w:proofErr w:type="spellStart"/>
       <w:r>
         <w:rPr>
           <w:b/>
@@ -3764,7 +4169,6 @@
         </w:rPr>
         <w:t>poc-bff</w:t>
       </w:r>
-      <w:proofErr w:type="spellEnd"/>
       <w:r>
         <w:t xml:space="preserve"> (this is the service principal created from your app registration)</w:t>
       </w:r>
@@ -3864,11 +4268,7 @@
         <w:t>✅</w:t>
       </w:r>
       <w:r>
-        <w:t xml:space="preserve"> Now Entra will include </w:t>
-      </w:r>
-      <w:proofErr w:type="gramStart"/>
-      <w:r>
-        <w:t xml:space="preserve">a </w:t>
+        <w:t xml:space="preserve"> Now Entra will include a </w:t>
       </w:r>
       <w:r>
         <w:rPr>
@@ -3877,7 +4277,6 @@
         </w:rPr>
         <w:t>roles</w:t>
       </w:r>
-      <w:proofErr w:type="gramEnd"/>
       <w:r>
         <w:t xml:space="preserve"> claim in tokens for these users.</w:t>
       </w:r>
@@ -3886,7 +4285,7 @@
       <w:pPr>
         <w:pStyle w:val="Heading1"/>
       </w:pPr>
-      <w:bookmarkStart w:id="11" w:name="_Toc225115681"/>
+      <w:bookmarkStart w:id="11" w:name="_Toc225694765"/>
       <w:r>
         <w:t xml:space="preserve">3. </w:t>
       </w:r>
@@ -3929,7 +4328,7 @@
           <v:shape id="_x0000_i1025" type="#_x0000_t75" style="width:75.65pt;height:49.55pt" o:ole="">
             <v:imagedata r:id="rId9" o:title=""/>
           </v:shape>
-          <o:OLEObject Type="Embed" ProgID="Package" ShapeID="_x0000_i1025" DrawAspect="Icon" ObjectID="_1836292669" r:id="rId10"/>
+          <o:OLEObject Type="Embed" ProgID="Package" ShapeID="_x0000_i1025" DrawAspect="Icon" ObjectID="_1836410110" r:id="rId10"/>
         </w:object>
       </w:r>
     </w:p>
@@ -3937,7 +4336,7 @@
       <w:pPr>
         <w:pStyle w:val="Heading2"/>
       </w:pPr>
-      <w:bookmarkStart w:id="12" w:name="_Toc225115682"/>
+      <w:bookmarkStart w:id="12" w:name="_Toc225694766"/>
       <w:r>
         <w:t>3.</w:t>
       </w:r>
@@ -3950,7 +4349,7 @@
       <w:pPr>
         <w:pStyle w:val="Heading3"/>
       </w:pPr>
-      <w:bookmarkStart w:id="13" w:name="_Toc225115683"/>
+      <w:bookmarkStart w:id="13" w:name="_Toc225694767"/>
       <w:r>
         <w:t>3.1.1 BFF Authentication Flow Sequence Diagram</w:t>
       </w:r>
@@ -3962,7 +4361,7 @@
           <v:shape id="_x0000_i1026" type="#_x0000_t75" style="width:75.65pt;height:49.55pt" o:ole="">
             <v:imagedata r:id="rId11" o:title=""/>
           </v:shape>
-          <o:OLEObject Type="Embed" ProgID="Package" ShapeID="_x0000_i1026" DrawAspect="Icon" ObjectID="_1836292670" r:id="rId12"/>
+          <o:OLEObject Type="Embed" ProgID="Package" ShapeID="_x0000_i1026" DrawAspect="Icon" ObjectID="_1836410111" r:id="rId12"/>
         </w:object>
       </w:r>
     </w:p>
@@ -4026,7 +4425,7 @@
       <w:pPr>
         <w:pStyle w:val="Heading3"/>
       </w:pPr>
-      <w:bookmarkStart w:id="14" w:name="_Toc225115684"/>
+      <w:bookmarkStart w:id="14" w:name="_Toc225694768"/>
       <w:r>
         <w:t>3.1.2 Component Diagram</w:t>
       </w:r>
@@ -4038,7 +4437,7 @@
           <v:shape id="_x0000_i1027" type="#_x0000_t75" style="width:75.65pt;height:49.55pt" o:ole="">
             <v:imagedata r:id="rId14" o:title=""/>
           </v:shape>
-          <o:OLEObject Type="Embed" ProgID="Package" ShapeID="_x0000_i1027" DrawAspect="Icon" ObjectID="_1836292671" r:id="rId15"/>
+          <o:OLEObject Type="Embed" ProgID="Package" ShapeID="_x0000_i1027" DrawAspect="Icon" ObjectID="_1836410112" r:id="rId15"/>
         </w:object>
       </w:r>
     </w:p>
@@ -4102,7 +4501,7 @@
       <w:pPr>
         <w:pStyle w:val="Heading3"/>
       </w:pPr>
-      <w:bookmarkStart w:id="15" w:name="_Toc225115685"/>
+      <w:bookmarkStart w:id="15" w:name="_Toc225694769"/>
       <w:r>
         <w:t>3.1.3 Authorization Flow</w:t>
       </w:r>
@@ -4114,7 +4513,7 @@
           <v:shape id="_x0000_i1028" type="#_x0000_t75" style="width:75.65pt;height:49.55pt" o:ole="">
             <v:imagedata r:id="rId17" o:title=""/>
           </v:shape>
-          <o:OLEObject Type="Embed" ProgID="Package" ShapeID="_x0000_i1028" DrawAspect="Icon" ObjectID="_1836292672" r:id="rId18"/>
+          <o:OLEObject Type="Embed" ProgID="Package" ShapeID="_x0000_i1028" DrawAspect="Icon" ObjectID="_1836410113" r:id="rId18"/>
         </w:object>
       </w:r>
     </w:p>
@@ -4177,7 +4576,7 @@
       <w:pPr>
         <w:pStyle w:val="Heading2"/>
       </w:pPr>
-      <w:bookmarkStart w:id="16" w:name="_Toc225115686"/>
+      <w:bookmarkStart w:id="16" w:name="_Toc225694770"/>
       <w:r>
         <w:lastRenderedPageBreak/>
         <w:t>3.2 Implementation Plan (Phases Checklist)</w:t>
@@ -4419,13 +4818,8 @@
           </w:tcPr>
           <w:p>
             <w:r>
-              <w:t xml:space="preserve">DTOs, </w:t>
-            </w:r>
-            <w:proofErr w:type="spellStart"/>
-            <w:r>
-              <w:t>RoleConstants</w:t>
-            </w:r>
-            <w:proofErr w:type="spellEnd"/>
+              <w:t>DTOs, RoleConstants</w:t>
+            </w:r>
           </w:p>
         </w:tc>
       </w:tr>
@@ -4485,19 +4879,9 @@
             <w:hideMark/>
           </w:tcPr>
           <w:p>
-            <w:proofErr w:type="spellStart"/>
-            <w:r>
-              <w:t>SecurityConfig</w:t>
-            </w:r>
-            <w:proofErr w:type="spellEnd"/>
-            <w:r>
-              <w:t> with oauth2Login, CSRF cookie, authority mapper, </w:t>
-            </w:r>
-            <w:proofErr w:type="spellStart"/>
-            <w:r>
-              <w:t>application.yml</w:t>
-            </w:r>
-            <w:proofErr w:type="spellEnd"/>
+            <w:r>
+              <w:t>SecurityConfig with oauth2Login, CSRF cookie, authority mapper, application.yml</w:t>
+            </w:r>
           </w:p>
         </w:tc>
       </w:tr>
@@ -4539,15 +4923,7 @@
           </w:tcPr>
           <w:p>
             <w:r>
-              <w:t>/</w:t>
-            </w:r>
-            <w:proofErr w:type="spellStart"/>
-            <w:r>
-              <w:t>api</w:t>
-            </w:r>
-            <w:proofErr w:type="spellEnd"/>
-            <w:r>
-              <w:t>/me endpoint</w:t>
+              <w:t>/api/me endpoint</w:t>
             </w:r>
           </w:p>
         </w:tc>
@@ -4628,20 +5004,7 @@
           </w:tcPr>
           <w:p>
             <w:r>
-              <w:t xml:space="preserve">ng new, </w:t>
-            </w:r>
-            <w:proofErr w:type="spellStart"/>
-            <w:r>
-              <w:t>proxy.</w:t>
-            </w:r>
-            <w:proofErr w:type="gramStart"/>
-            <w:r>
-              <w:t>conf.json</w:t>
-            </w:r>
-            <w:proofErr w:type="spellEnd"/>
-            <w:proofErr w:type="gramEnd"/>
-            <w:r>
-              <w:t xml:space="preserve"> → localhost:</w:t>
+              <w:t>ng new, proxy.conf.json → localhost:</w:t>
             </w:r>
             <w:r>
               <w:t>1</w:t>
@@ -4771,15 +5134,7 @@
           </w:tcPr>
           <w:p>
             <w:r>
-              <w:t>GET /</w:t>
-            </w:r>
-            <w:proofErr w:type="spellStart"/>
-            <w:r>
-              <w:t>api</w:t>
-            </w:r>
-            <w:proofErr w:type="spellEnd"/>
-            <w:r>
-              <w:t>/me, cache result, route guards</w:t>
+              <w:t>GET /api/me, cache result, route guards</w:t>
             </w:r>
           </w:p>
         </w:tc>
@@ -5104,7 +5459,7 @@
           <w:bCs/>
         </w:rPr>
       </w:pPr>
-      <w:bookmarkStart w:id="17" w:name="_Toc225115687"/>
+      <w:bookmarkStart w:id="17" w:name="_Toc225694771"/>
       <w:r>
         <w:t xml:space="preserve">3.3 </w:t>
       </w:r>
@@ -5199,15 +5554,7 @@
           </w:tcPr>
           <w:p>
             <w:r>
-              <w:t xml:space="preserve">Sees "User </w:t>
-            </w:r>
-            <w:proofErr w:type="spellStart"/>
-            <w:r>
-              <w:t>Mgmt</w:t>
-            </w:r>
-            <w:proofErr w:type="spellEnd"/>
-            <w:r>
-              <w:t>"</w:t>
+              <w:t>Sees "User Mgmt"</w:t>
             </w:r>
           </w:p>
         </w:tc>
@@ -5265,11 +5612,9 @@
             <w:hideMark/>
           </w:tcPr>
           <w:p>
-            <w:proofErr w:type="spellStart"/>
             <w:r>
               <w:t>admin@yourtenant</w:t>
             </w:r>
-            <w:proofErr w:type="spellEnd"/>
           </w:p>
         </w:tc>
         <w:tc>
@@ -5364,11 +5709,9 @@
             <w:hideMark/>
           </w:tcPr>
           <w:p>
-            <w:proofErr w:type="spellStart"/>
             <w:r>
               <w:t>admin-rw@yourtenant</w:t>
             </w:r>
-            <w:proofErr w:type="spellEnd"/>
           </w:p>
         </w:tc>
         <w:tc>
@@ -5463,11 +5806,9 @@
             <w:hideMark/>
           </w:tcPr>
           <w:p>
-            <w:proofErr w:type="spellStart"/>
             <w:r>
               <w:t>reader@yourtenant</w:t>
             </w:r>
-            <w:proofErr w:type="spellEnd"/>
           </w:p>
         </w:tc>
         <w:tc>
@@ -5562,12 +5903,10 @@
             <w:hideMark/>
           </w:tcPr>
           <w:p>
-            <w:proofErr w:type="spellStart"/>
             <w:r>
               <w:lastRenderedPageBreak/>
               <w:t>writer@yourtenant</w:t>
             </w:r>
-            <w:proofErr w:type="spellEnd"/>
           </w:p>
         </w:tc>
         <w:tc>
@@ -5662,11 +6001,9 @@
             <w:hideMark/>
           </w:tcPr>
           <w:p>
-            <w:proofErr w:type="spellStart"/>
             <w:r>
               <w:t>reader-writer@yourtenant</w:t>
             </w:r>
-            <w:proofErr w:type="spellEnd"/>
           </w:p>
         </w:tc>
         <w:tc>
@@ -5848,7 +6185,7 @@
       <w:pPr>
         <w:pStyle w:val="Heading2"/>
       </w:pPr>
-      <w:bookmarkStart w:id="18" w:name="_Toc225115688"/>
+      <w:bookmarkStart w:id="18" w:name="_Toc225694772"/>
       <w:r>
         <w:t>3.4 Generate the full code skeleton</w:t>
       </w:r>
@@ -5921,19 +6258,14 @@
         </w:numPr>
       </w:pPr>
       <w:r>
-        <w:t>leap-</w:t>
-      </w:r>
-      <w:proofErr w:type="spellStart"/>
-      <w:r>
-        <w:t>frontedn</w:t>
-      </w:r>
-      <w:proofErr w:type="spellEnd"/>
+        <w:t>leap-frontedn</w:t>
+      </w:r>
     </w:p>
     <w:p>
       <w:pPr>
         <w:pStyle w:val="Heading3"/>
       </w:pPr>
-      <w:bookmarkStart w:id="19" w:name="_Toc225115689"/>
+      <w:bookmarkStart w:id="19" w:name="_Toc225694773"/>
       <w:r>
         <w:t>3.4.1 What was built</w:t>
       </w:r>
@@ -6077,27 +6409,9 @@
             <w:hideMark/>
           </w:tcPr>
           <w:p>
-            <w:proofErr w:type="spellStart"/>
-            <w:r>
-              <w:t>UserInfoDto</w:t>
-            </w:r>
-            <w:proofErr w:type="spellEnd"/>
-            <w:r>
-              <w:t>, </w:t>
-            </w:r>
-            <w:proofErr w:type="spellStart"/>
-            <w:r>
-              <w:t>BudgetRowDto</w:t>
-            </w:r>
-            <w:proofErr w:type="spellEnd"/>
-            <w:r>
-              <w:t>, </w:t>
-            </w:r>
-            <w:proofErr w:type="spellStart"/>
-            <w:r>
-              <w:t>RoleConstants</w:t>
-            </w:r>
-            <w:proofErr w:type="spellEnd"/>
+            <w:r>
+              <w:t>UserInfoDto, BudgetRowDto, RoleConstants</w:t>
+            </w:r>
           </w:p>
         </w:tc>
       </w:tr>
@@ -6140,15 +6454,7 @@
           </w:tcPr>
           <w:p>
             <w:r>
-              <w:t>GET /</w:t>
-            </w:r>
-            <w:proofErr w:type="spellStart"/>
-            <w:r>
-              <w:t>api</w:t>
-            </w:r>
-            <w:proofErr w:type="spellEnd"/>
-            <w:r>
-              <w:t>/me — returns user info + mapped roles (or anon)</w:t>
+              <w:t>GET /api/me — returns user info + mapped roles (or anon)</w:t>
             </w:r>
           </w:p>
         </w:tc>
@@ -6193,23 +6499,7 @@
           </w:tcPr>
           <w:p>
             <w:r>
-              <w:t>GET /</w:t>
-            </w:r>
-            <w:proofErr w:type="spellStart"/>
-            <w:r>
-              <w:t>api</w:t>
-            </w:r>
-            <w:proofErr w:type="spellEnd"/>
-            <w:r>
-              <w:t>/budget (APP_READ/WRITE), PUT /</w:t>
-            </w:r>
-            <w:proofErr w:type="spellStart"/>
-            <w:r>
-              <w:t>api</w:t>
-            </w:r>
-            <w:proofErr w:type="spellEnd"/>
-            <w:r>
-              <w:t>/budget/{id} (APP_WRITE), in-memory repo with 6 seed rows</w:t>
+              <w:t>GET /api/budget (APP_READ/WRITE), PUT /api/budget/{id} (APP_WRITE), in-memory repo with 6 seed rows</w:t>
             </w:r>
           </w:p>
         </w:tc>
@@ -6252,29 +6542,8 @@
             <w:hideMark/>
           </w:tcPr>
           <w:p>
-            <w:proofErr w:type="spellStart"/>
-            <w:r>
-              <w:t>SecurityConfig</w:t>
-            </w:r>
-            <w:proofErr w:type="spellEnd"/>
-            <w:r>
-              <w:t xml:space="preserve"> — oauth2Login, CSRF cookie, Entra </w:t>
-            </w:r>
-            <w:proofErr w:type="spellStart"/>
-            <w:r>
-              <w:t>roles→ROLE_APP</w:t>
-            </w:r>
-            <w:proofErr w:type="spellEnd"/>
-            <w:r>
-              <w:t>_* mapper, session-based auth. </w:t>
-            </w:r>
-            <w:proofErr w:type="spellStart"/>
-            <w:r>
-              <w:t>application.yml</w:t>
-            </w:r>
-            <w:proofErr w:type="spellEnd"/>
-            <w:r>
-              <w:t> reads ENTRA_* env vars</w:t>
+            <w:r>
+              <w:t>SecurityConfig — oauth2Login, CSRF cookie, Entra roles→ROLE_APP_* mapper, session-based auth. application.yml reads ENTRA_* env vars</w:t>
             </w:r>
           </w:p>
         </w:tc>
@@ -6403,7 +6672,6 @@
             <w:hideMark/>
           </w:tcPr>
           <w:p>
-            <w:proofErr w:type="spellStart"/>
             <w:r>
               <w:rPr>
                 <w:b/>
@@ -6411,7 +6679,6 @@
               </w:rPr>
               <w:t>AuthService</w:t>
             </w:r>
-            <w:proofErr w:type="spellEnd"/>
           </w:p>
         </w:tc>
         <w:tc>
@@ -6429,52 +6696,7 @@
           </w:tcPr>
           <w:p>
             <w:r>
-              <w:t>Calls /</w:t>
-            </w:r>
-            <w:proofErr w:type="spellStart"/>
-            <w:r>
-              <w:t>api</w:t>
-            </w:r>
-            <w:proofErr w:type="spellEnd"/>
-            <w:r>
-              <w:t xml:space="preserve">/me on </w:t>
-            </w:r>
-            <w:proofErr w:type="spellStart"/>
-            <w:r>
-              <w:t>init</w:t>
-            </w:r>
-            <w:proofErr w:type="spellEnd"/>
-            <w:r>
-              <w:t>, caches user, exposes </w:t>
-            </w:r>
-            <w:proofErr w:type="spellStart"/>
-            <w:proofErr w:type="gramStart"/>
-            <w:r>
-              <w:t>hasRole</w:t>
-            </w:r>
-            <w:proofErr w:type="spellEnd"/>
-            <w:r>
-              <w:t>(</w:t>
-            </w:r>
-            <w:proofErr w:type="gramEnd"/>
-            <w:r>
-              <w:t>), </w:t>
-            </w:r>
-            <w:proofErr w:type="gramStart"/>
-            <w:r>
-              <w:t>login(</w:t>
-            </w:r>
-            <w:proofErr w:type="gramEnd"/>
-            <w:r>
-              <w:t>), </w:t>
-            </w:r>
-            <w:proofErr w:type="gramStart"/>
-            <w:r>
-              <w:t>logout(</w:t>
-            </w:r>
-            <w:proofErr w:type="gramEnd"/>
-            <w:r>
-              <w:t>)</w:t>
+              <w:t>Calls /api/me on init, caches user, exposes hasRole(), login(), logout()</w:t>
             </w:r>
           </w:p>
         </w:tc>
@@ -6494,7 +6716,6 @@
             <w:hideMark/>
           </w:tcPr>
           <w:p>
-            <w:proofErr w:type="spellStart"/>
             <w:r>
               <w:rPr>
                 <w:b/>
@@ -6502,7 +6723,6 @@
               </w:rPr>
               <w:t>csrfInterceptor</w:t>
             </w:r>
-            <w:proofErr w:type="spellEnd"/>
           </w:p>
         </w:tc>
         <w:tc>
@@ -6540,7 +6760,6 @@
             <w:hideMark/>
           </w:tcPr>
           <w:p>
-            <w:proofErr w:type="spellStart"/>
             <w:r>
               <w:rPr>
                 <w:b/>
@@ -6548,7 +6767,6 @@
               </w:rPr>
               <w:t>roleGuard</w:t>
             </w:r>
-            <w:proofErr w:type="spellEnd"/>
           </w:p>
         </w:tc>
         <w:tc>
@@ -6568,32 +6786,14 @@
             <w:r>
               <w:t>Route guard factory: </w:t>
             </w:r>
-            <w:proofErr w:type="spellStart"/>
-            <w:r>
-              <w:fldChar w:fldCharType="begin"/>
-            </w:r>
-            <w:r>
-              <w:instrText>HYPERLINK "vscode-file://vscode-app/d:/apps/Microsoft%20VS%20Code/072586267e/resources/app/out/vs/code/electron-browser/workbench/workbench.html" \o ""</w:instrText>
-            </w:r>
-            <w:r>
-              <w:fldChar w:fldCharType="separate"/>
-            </w:r>
-            <w:r>
-              <w:rPr>
-                <w:rStyle w:val="Hyperlink"/>
-              </w:rPr>
-              <w:t>roleGuard</w:t>
-            </w:r>
-            <w:proofErr w:type="spellEnd"/>
-            <w:r>
-              <w:rPr>
-                <w:rStyle w:val="Hyperlink"/>
-              </w:rPr>
-              <w:t>('APP_READ', 'APP_WRITE')</w:t>
-            </w:r>
-            <w:r>
-              <w:fldChar w:fldCharType="end"/>
-            </w:r>
+            <w:hyperlink r:id="rId20" w:history="1">
+              <w:r>
+                <w:rPr>
+                  <w:rStyle w:val="Hyperlink"/>
+                </w:rPr>
+                <w:t>roleGuard('APP_READ', 'APP_WRITE')</w:t>
+              </w:r>
+            </w:hyperlink>
           </w:p>
         </w:tc>
       </w:tr>
@@ -6612,7 +6812,6 @@
             <w:hideMark/>
           </w:tcPr>
           <w:p>
-            <w:proofErr w:type="spellStart"/>
             <w:r>
               <w:rPr>
                 <w:b/>
@@ -6620,7 +6819,6 @@
               </w:rPr>
               <w:t>HeaderComponent</w:t>
             </w:r>
-            <w:proofErr w:type="spellEnd"/>
           </w:p>
         </w:tc>
         <w:tc>
@@ -6658,7 +6856,6 @@
             <w:hideMark/>
           </w:tcPr>
           <w:p>
-            <w:proofErr w:type="spellStart"/>
             <w:r>
               <w:rPr>
                 <w:b/>
@@ -6666,7 +6863,6 @@
               </w:rPr>
               <w:t>WelcomeComponent</w:t>
             </w:r>
-            <w:proofErr w:type="spellEnd"/>
           </w:p>
         </w:tc>
         <w:tc>
@@ -6704,7 +6900,6 @@
             <w:hideMark/>
           </w:tcPr>
           <w:p>
-            <w:proofErr w:type="spellStart"/>
             <w:r>
               <w:rPr>
                 <w:b/>
@@ -6712,7 +6907,6 @@
               </w:rPr>
               <w:t>UserManagementComponent</w:t>
             </w:r>
-            <w:proofErr w:type="spellEnd"/>
           </w:p>
         </w:tc>
         <w:tc>
@@ -6750,7 +6944,6 @@
             <w:hideMark/>
           </w:tcPr>
           <w:p>
-            <w:proofErr w:type="spellStart"/>
             <w:r>
               <w:rPr>
                 <w:b/>
@@ -6758,7 +6951,6 @@
               </w:rPr>
               <w:t>BudgetReportComponent</w:t>
             </w:r>
-            <w:proofErr w:type="spellEnd"/>
           </w:p>
         </w:tc>
         <w:tc>
@@ -6796,24 +6988,13 @@
             <w:hideMark/>
           </w:tcPr>
           <w:p>
-            <w:proofErr w:type="spellStart"/>
             <w:r>
               <w:rPr>
                 <w:b/>
                 <w:bCs/>
               </w:rPr>
-              <w:t>proxy.</w:t>
-            </w:r>
-            <w:proofErr w:type="gramStart"/>
-            <w:r>
-              <w:rPr>
-                <w:b/>
-                <w:bCs/>
-              </w:rPr>
-              <w:t>conf.json</w:t>
-            </w:r>
-            <w:proofErr w:type="spellEnd"/>
-            <w:proofErr w:type="gramEnd"/>
+              <w:t>proxy.conf.json</w:t>
+            </w:r>
           </w:p>
         </w:tc>
         <w:tc>
@@ -6831,15 +7012,7 @@
           </w:tcPr>
           <w:p>
             <w:r>
-              <w:t>Proxies /</w:t>
-            </w:r>
-            <w:proofErr w:type="spellStart"/>
-            <w:r>
-              <w:t>api</w:t>
-            </w:r>
-            <w:proofErr w:type="spellEnd"/>
-            <w:r>
-              <w:t xml:space="preserve">, /oauth2, /login, /logout → port </w:t>
+              <w:t xml:space="preserve">Proxies /api, /oauth2, /login, /logout → port </w:t>
             </w:r>
             <w:r>
               <w:t>1</w:t>
@@ -6856,7 +7029,7 @@
       <w:pPr>
         <w:pStyle w:val="Heading3"/>
       </w:pPr>
-      <w:bookmarkStart w:id="20" w:name="_Toc225115690"/>
+      <w:bookmarkStart w:id="20" w:name="_Toc225694774"/>
       <w:r>
         <w:lastRenderedPageBreak/>
         <w:t xml:space="preserve">3.4.2 </w:t>
@@ -6892,28 +7065,7 @@
         <w:t>Backend:</w:t>
       </w:r>
       <w:r>
-        <w:t> </w:t>
-      </w:r>
-      <w:proofErr w:type="spellStart"/>
-      <w:r>
-        <w:t>mvn</w:t>
-      </w:r>
-      <w:proofErr w:type="spellEnd"/>
-      <w:r>
-        <w:t xml:space="preserve"> </w:t>
-      </w:r>
-      <w:proofErr w:type="spellStart"/>
-      <w:r>
-        <w:t>spring-</w:t>
-      </w:r>
-      <w:proofErr w:type="gramStart"/>
-      <w:r>
-        <w:t>boot:run</w:t>
-      </w:r>
-      <w:proofErr w:type="spellEnd"/>
-      <w:proofErr w:type="gramEnd"/>
-      <w:r>
-        <w:t xml:space="preserve"> -pl leap-app (port </w:t>
+        <w:t xml:space="preserve"> mvn spring-boot:run -pl leap-app (port </w:t>
       </w:r>
       <w:r>
         <w:t>1</w:t>
@@ -6937,15 +7089,7 @@
         <w:t>Frontend:</w:t>
       </w:r>
       <w:r>
-        <w:t xml:space="preserve"> cd leap-frontend &amp;&amp; </w:t>
-      </w:r>
-      <w:proofErr w:type="spellStart"/>
-      <w:r>
-        <w:t>npm</w:t>
-      </w:r>
-      <w:proofErr w:type="spellEnd"/>
-      <w:r>
-        <w:t xml:space="preserve"> start (port 4200)</w:t>
+        <w:t> cd leap-frontend &amp;&amp; npm start (port 4200)</w:t>
       </w:r>
     </w:p>
     <w:p>
@@ -6970,7 +7114,7 @@
       <w:pPr>
         <w:pStyle w:val="Heading1"/>
       </w:pPr>
-      <w:bookmarkStart w:id="21" w:name="_Toc225115691"/>
+      <w:bookmarkStart w:id="21" w:name="_Toc225694775"/>
       <w:r>
         <w:t>4. Troubleshooting</w:t>
       </w:r>
@@ -6984,7 +7128,7 @@
           <w:bCs/>
         </w:rPr>
       </w:pPr>
-      <w:bookmarkStart w:id="22" w:name="_Toc225115692"/>
+      <w:bookmarkStart w:id="22" w:name="_Toc225694776"/>
       <w:r>
         <w:t xml:space="preserve">4.1 </w:t>
       </w:r>
@@ -7070,7 +7214,6 @@
       <w:r>
         <w:t>se Spring Security's </w:t>
       </w:r>
-      <w:proofErr w:type="spellStart"/>
       <w:r>
         <w:rPr>
           <w:b/>
@@ -7078,7 +7221,6 @@
         </w:rPr>
         <w:t>OidcClientInitiatedLogoutSuccessHandler</w:t>
       </w:r>
-      <w:proofErr w:type="spellEnd"/>
       <w:r>
         <w:t> which</w:t>
       </w:r>
@@ -7119,21 +7261,7 @@
         <w:rPr>
           <w:bCs/>
         </w:rPr>
-        <w:t xml:space="preserve">Redirects the browser to Entra's </w:t>
-      </w:r>
-      <w:proofErr w:type="spellStart"/>
-      <w:r>
-        <w:rPr>
-          <w:bCs/>
-        </w:rPr>
-        <w:t>end_session_endpoint</w:t>
-      </w:r>
-      <w:proofErr w:type="spellEnd"/>
-      <w:r>
-        <w:rPr>
-          <w:bCs/>
-        </w:rPr>
-        <w:t xml:space="preserve"> (https://login.microsoftonline.com/{tenant}/oauth2/v2.0/logout)</w:t>
+        <w:t>Redirects the browser to Entra's end_session_endpoint (https://login.microsoftonline.com/{tenant}/oauth2/v2.0/logout)</w:t>
       </w:r>
     </w:p>
     <w:p>
@@ -7171,7 +7299,7 @@
         </w:rPr>
         <w:t xml:space="preserve">Entra redirects back to </w:t>
       </w:r>
-      <w:hyperlink r:id="rId20" w:history="1">
+      <w:hyperlink r:id="rId21" w:history="1">
         <w:r>
           <w:rPr>
             <w:rStyle w:val="Hyperlink"/>
@@ -7193,17 +7321,8 @@
           <w:b/>
           <w:bCs/>
         </w:rPr>
-        <w:t>(Below is already done at the beginning</w:t>
-      </w:r>
-      <w:proofErr w:type="gramStart"/>
-      <w:r>
-        <w:rPr>
-          <w:b/>
-          <w:bCs/>
-        </w:rPr>
-        <w:t>) :</w:t>
-      </w:r>
-      <w:proofErr w:type="gramEnd"/>
+        <w:t>(Below is already done at the beginning) :</w:t>
+      </w:r>
     </w:p>
     <w:p>
       <w:pPr>
@@ -7266,21 +7385,7 @@
           <w:bCs/>
         </w:rPr>
         <w:lastRenderedPageBreak/>
-        <w:t>Azure Portal → App Registrations → "</w:t>
-      </w:r>
-      <w:proofErr w:type="spellStart"/>
-      <w:r>
-        <w:rPr>
-          <w:bCs/>
-        </w:rPr>
-        <w:t>poc-bff</w:t>
-      </w:r>
-      <w:proofErr w:type="spellEnd"/>
-      <w:r>
-        <w:rPr>
-          <w:bCs/>
-        </w:rPr>
-        <w:t>" → Authentication</w:t>
+        <w:t>Azure Portal → App Registrations → "poc-bff" → Authentication</w:t>
       </w:r>
     </w:p>
     <w:p>
@@ -7321,7 +7426,7 @@
           <w:bCs/>
         </w:rPr>
       </w:pPr>
-      <w:bookmarkStart w:id="23" w:name="_Toc225115693"/>
+      <w:bookmarkStart w:id="23" w:name="_Toc225694777"/>
       <w:r>
         <w:t xml:space="preserve">4.2 </w:t>
       </w:r>
@@ -7351,41 +7456,7 @@
     </w:p>
     <w:p>
       <w:r>
-        <w:t xml:space="preserve">The </w:t>
-      </w:r>
-      <w:proofErr w:type="spellStart"/>
-      <w:proofErr w:type="gramStart"/>
-      <w:r>
-        <w:t>principal.getAuthorities</w:t>
-      </w:r>
-      <w:proofErr w:type="spellEnd"/>
-      <w:proofErr w:type="gramEnd"/>
-      <w:r>
-        <w:t xml:space="preserve">() only has OIDC_USER, </w:t>
-      </w:r>
-      <w:proofErr w:type="spellStart"/>
-      <w:r>
-        <w:t>SCOPE_email</w:t>
-      </w:r>
-      <w:proofErr w:type="spellEnd"/>
-      <w:r>
-        <w:t xml:space="preserve">, </w:t>
-      </w:r>
-      <w:proofErr w:type="spellStart"/>
-      <w:r>
-        <w:t>SCOPE_openid</w:t>
-      </w:r>
-      <w:proofErr w:type="spellEnd"/>
-      <w:r>
-        <w:t xml:space="preserve">, </w:t>
-      </w:r>
-      <w:proofErr w:type="spellStart"/>
-      <w:r>
-        <w:t>SCOPE_profile</w:t>
-      </w:r>
-      <w:proofErr w:type="spellEnd"/>
-      <w:r>
-        <w:t>. No roles are being mapped.</w:t>
+        <w:t>The principal.getAuthorities() only has OIDC_USER, SCOPE_email, SCOPE_openid, SCOPE_profile. No roles are being mapped.</w:t>
       </w:r>
     </w:p>
     <w:p>
@@ -7412,68 +7483,20 @@
     </w:p>
     <w:p>
       <w:r>
-        <w:t>The old </w:t>
-      </w:r>
-      <w:proofErr w:type="spellStart"/>
-      <w:r>
-        <w:t>GrantedAuthoritiesMapper</w:t>
-      </w:r>
-      <w:proofErr w:type="spellEnd"/>
-      <w:r>
-        <w:t> read roles from </w:t>
-      </w:r>
-      <w:proofErr w:type="spellStart"/>
-      <w:r>
-        <w:fldChar w:fldCharType="begin"/>
-      </w:r>
-      <w:r>
-        <w:instrText>HYPERLINK "vscode-file://vscode-app/d:/apps/Microsoft%20VS%20Code/072586267e/resources/app/out/vs/code/electron-browser/workbench/workbench.html" \o ""</w:instrText>
-      </w:r>
-      <w:r>
-        <w:fldChar w:fldCharType="separate"/>
-      </w:r>
-      <w:r>
-        <w:rPr>
-          <w:rStyle w:val="Hyperlink"/>
-        </w:rPr>
-        <w:t>oidcUserAuthority.getIdToken</w:t>
-      </w:r>
-      <w:proofErr w:type="spellEnd"/>
-      <w:r>
-        <w:rPr>
-          <w:rStyle w:val="Hyperlink"/>
-        </w:rPr>
-        <w:t>().</w:t>
-      </w:r>
-      <w:proofErr w:type="spellStart"/>
-      <w:r>
-        <w:rPr>
-          <w:rStyle w:val="Hyperlink"/>
-        </w:rPr>
-        <w:t>getClaims</w:t>
-      </w:r>
-      <w:proofErr w:type="spellEnd"/>
-      <w:r>
-        <w:rPr>
-          <w:rStyle w:val="Hyperlink"/>
-        </w:rPr>
-        <w:t>()</w:t>
-      </w:r>
-      <w:r>
-        <w:fldChar w:fldCharType="end"/>
-      </w:r>
-      <w:r>
-        <w:t>. But Spring Security's </w:t>
-      </w:r>
-      <w:proofErr w:type="spellStart"/>
-      <w:r>
-        <w:t>OidcIdToken</w:t>
-      </w:r>
-      <w:proofErr w:type="spellEnd"/>
-      <w:r>
-        <w:t> doesn't always expose non-standard claims (like Entra's </w:t>
-      </w:r>
-      <w:hyperlink r:id="rId21" w:history="1">
+        <w:t>The old GrantedAuthoritiesMapper read roles from </w:t>
+      </w:r>
+      <w:hyperlink r:id="rId22" w:history="1">
+        <w:r>
+          <w:rPr>
+            <w:rStyle w:val="Hyperlink"/>
+          </w:rPr>
+          <w:t>oidcUserAuthority.getIdToken().getClaims()</w:t>
+        </w:r>
+      </w:hyperlink>
+      <w:r>
+        <w:t>. But Spring Security's OidcIdToken doesn't always expose non-standard claims (like Entra's </w:t>
+      </w:r>
+      <w:hyperlink r:id="rId23" w:history="1">
         <w:r>
           <w:rPr>
             <w:rStyle w:val="Hyperlink"/>
@@ -7490,183 +7513,117 @@
       <w:r>
         <w:t xml:space="preserve"> confirmed </w:t>
       </w:r>
-      <w:proofErr w:type="spellStart"/>
-      <w:r>
-        <w:fldChar w:fldCharType="begin"/>
-      </w:r>
-      <w:r>
-        <w:instrText>HYPERLINK "vscode-file://vscode-app/d:/apps/Microsoft%20VS%20Code/072586267e/resources/app/out/vs/code/electron-browser/workbench/workbench.html" \o ""</w:instrText>
-      </w:r>
-      <w:r>
-        <w:fldChar w:fldCharType="separate"/>
-      </w:r>
-      <w:r>
-        <w:rPr>
-          <w:rStyle w:val="Hyperlink"/>
-        </w:rPr>
-        <w:t>principal.getAttribute</w:t>
-      </w:r>
-      <w:proofErr w:type="spellEnd"/>
-      <w:r>
-        <w:rPr>
-          <w:rStyle w:val="Hyperlink"/>
-        </w:rPr>
-        <w:t>("roles")</w:t>
-      </w:r>
-      <w:r>
-        <w:fldChar w:fldCharType="end"/>
-      </w:r>
-      <w:r>
-        <w:t> works — that reads from </w:t>
-      </w:r>
-      <w:proofErr w:type="spellStart"/>
-      <w:r>
-        <w:fldChar w:fldCharType="begin"/>
-      </w:r>
-      <w:r>
-        <w:instrText>HYPERLINK "vscode-file://vscode-app/d:/apps/Microsoft%20VS%20Code/072586267e/resources/app/out/vs/code/electron-browser/workbench/workbench.html" \o ""</w:instrText>
-      </w:r>
-      <w:r>
-        <w:fldChar w:fldCharType="separate"/>
-      </w:r>
-      <w:r>
-        <w:rPr>
-          <w:rStyle w:val="Hyperlink"/>
-        </w:rPr>
-        <w:t>OidcUser.getAttributes</w:t>
-      </w:r>
-      <w:proofErr w:type="spellEnd"/>
-      <w:r>
-        <w:rPr>
-          <w:rStyle w:val="Hyperlink"/>
-        </w:rPr>
-        <w:t>()</w:t>
-      </w:r>
-      <w:r>
-        <w:fldChar w:fldCharType="end"/>
-      </w:r>
-      <w:r>
-        <w:t>, which is the merged attribute map.</w:t>
-      </w:r>
-    </w:p>
-    <w:p>
-      <w:pPr>
-        <w:rPr>
-          <w:b/>
-          <w:bCs/>
-        </w:rPr>
-      </w:pPr>
-      <w:r>
-        <w:rPr>
-          <w:b/>
-          <w:bCs/>
-        </w:rPr>
-        <w:t>Solution:</w:t>
-      </w:r>
-    </w:p>
-    <w:p>
-      <w:r>
-        <w:t>Replaced the </w:t>
-      </w:r>
-      <w:proofErr w:type="spellStart"/>
-      <w:r>
-        <w:rPr>
-          <w:b/>
-          <w:bCs/>
-        </w:rPr>
-        <w:t>GrantedAuthoritiesMapper</w:t>
-      </w:r>
-      <w:proofErr w:type="spellEnd"/>
-      <w:r>
-        <w:t> bean with a </w:t>
-      </w:r>
-      <w:r>
-        <w:rPr>
-          <w:b/>
-          <w:bCs/>
-        </w:rPr>
-        <w:t>custom </w:t>
-      </w:r>
-      <w:proofErr w:type="spellStart"/>
-      <w:r>
-        <w:rPr>
-          <w:b/>
-          <w:bCs/>
-        </w:rPr>
-        <w:fldChar w:fldCharType="begin"/>
-      </w:r>
-      <w:r>
-        <w:rPr>
-          <w:b/>
-          <w:bCs/>
-        </w:rPr>
-        <w:instrText>HYPERLINK "vscode-file://vscode-app/d:/apps/Microsoft%20VS%20Code/072586267e/resources/app/out/vs/code/electron-browser/workbench/workbench.html" \o ""</w:instrText>
-      </w:r>
-      <w:r>
-        <w:rPr>
-          <w:b/>
-          <w:bCs/>
-        </w:rPr>
-      </w:r>
-      <w:r>
-        <w:rPr>
-          <w:b/>
-          <w:bCs/>
-        </w:rPr>
-        <w:fldChar w:fldCharType="separate"/>
-      </w:r>
-      <w:r>
-        <w:rPr>
-          <w:rStyle w:val="Hyperlink"/>
-        </w:rPr>
-        <w:t>OidcUserService</w:t>
-      </w:r>
-      <w:proofErr w:type="spellEnd"/>
-      <w:r>
-        <w:fldChar w:fldCharType="end"/>
-      </w:r>
-      <w:r>
-        <w:t> wired into </w:t>
-      </w:r>
-      <w:hyperlink r:id="rId22" w:history="1">
+      <w:hyperlink r:id="rId24" w:history="1">
         <w:r>
           <w:rPr>
             <w:rStyle w:val="Hyperlink"/>
           </w:rPr>
-          <w:t>.oauth2Login().</w:t>
+          <w:t>principal.getAttribute("roles")</w:t>
         </w:r>
-        <w:proofErr w:type="spellStart"/>
+      </w:hyperlink>
+      <w:r>
+        <w:t> works — that reads from </w:t>
+      </w:r>
+      <w:hyperlink r:id="rId25" w:history="1">
         <w:r>
           <w:rPr>
             <w:rStyle w:val="Hyperlink"/>
           </w:rPr>
-          <w:t>userInfoEndpoint</w:t>
+          <w:t>OidcUser.getAttributes()</w:t>
         </w:r>
-        <w:proofErr w:type="spellEnd"/>
+      </w:hyperlink>
+      <w:r>
+        <w:t>, which is the merged attribute map.</w:t>
+      </w:r>
+    </w:p>
+    <w:p>
+      <w:pPr>
+        <w:rPr>
+          <w:b/>
+          <w:bCs/>
+        </w:rPr>
+      </w:pPr>
+      <w:r>
+        <w:rPr>
+          <w:b/>
+          <w:bCs/>
+        </w:rPr>
+        <w:t>Solution:</w:t>
+      </w:r>
+    </w:p>
+    <w:p>
+      <w:r>
+        <w:t>Replaced the </w:t>
+      </w:r>
+      <w:r>
+        <w:rPr>
+          <w:b/>
+          <w:bCs/>
+        </w:rPr>
+        <w:t>GrantedAuthoritiesMapper</w:t>
+      </w:r>
+      <w:r>
+        <w:t> bean with a </w:t>
+      </w:r>
+      <w:r>
+        <w:rPr>
+          <w:b/>
+          <w:bCs/>
+        </w:rPr>
+        <w:t>custom </w:t>
+      </w:r>
+      <w:hyperlink r:id="rId26" w:history="1">
         <w:r>
           <w:rPr>
             <w:rStyle w:val="Hyperlink"/>
           </w:rPr>
-          <w:t>().</w:t>
+          <w:t>OidcUserService</w:t>
         </w:r>
-        <w:proofErr w:type="spellStart"/>
+      </w:hyperlink>
+      <w:r>
+        <w:t> wired into </w:t>
+      </w:r>
+      <w:hyperlink r:id="rId27" w:history="1">
         <w:r>
           <w:rPr>
             <w:rStyle w:val="Hyperlink"/>
           </w:rPr>
-          <w:t>oidcUserService</w:t>
+          <w:t>.oauth2Login().userInfoEndpoint().oidcUserService(...)</w:t>
         </w:r>
-        <w:proofErr w:type="spellEnd"/>
+      </w:hyperlink>
+      <w:r>
+        <w:t>. This:</w:t>
+      </w:r>
+    </w:p>
+    <w:p>
+      <w:pPr>
+        <w:numPr>
+          <w:ilvl w:val="0"/>
+          <w:numId w:val="20"/>
+        </w:numPr>
+      </w:pPr>
+      <w:r>
+        <w:t>Delegates to the default </w:t>
+      </w:r>
+      <w:hyperlink r:id="rId28" w:history="1">
         <w:r>
           <w:rPr>
             <w:rStyle w:val="Hyperlink"/>
           </w:rPr>
-          <w:t>(...)</w:t>
+          <w:t>OidcUserService</w:t>
         </w:r>
       </w:hyperlink>
       <w:r>
-        <w:t>. This:</w:t>
-      </w:r>
+        <w:t> to get the </w:t>
+      </w:r>
+      <w:hyperlink r:id="rId29" w:history="1">
+        <w:r>
+          <w:rPr>
+            <w:rStyle w:val="Hyperlink"/>
+          </w:rPr>
+          <w:t>OidcUser</w:t>
+        </w:r>
+      </w:hyperlink>
     </w:p>
     <w:p>
       <w:pPr>
@@ -7676,50 +7633,18 @@
         </w:numPr>
       </w:pPr>
       <w:r>
-        <w:t>Delegates to the default </w:t>
-      </w:r>
-      <w:proofErr w:type="spellStart"/>
-      <w:r>
-        <w:fldChar w:fldCharType="begin"/>
-      </w:r>
-      <w:r>
-        <w:instrText>HYPERLINK "vscode-file://vscode-app/d:/apps/Microsoft%20VS%20Code/072586267e/resources/app/out/vs/code/electron-browser/workbench/workbench.html" \o ""</w:instrText>
-      </w:r>
-      <w:r>
-        <w:fldChar w:fldCharType="separate"/>
-      </w:r>
-      <w:r>
-        <w:rPr>
-          <w:rStyle w:val="Hyperlink"/>
-        </w:rPr>
-        <w:t>OidcUserService</w:t>
-      </w:r>
-      <w:proofErr w:type="spellEnd"/>
-      <w:r>
-        <w:fldChar w:fldCharType="end"/>
-      </w:r>
-      <w:r>
-        <w:t> to get the </w:t>
-      </w:r>
-      <w:proofErr w:type="spellStart"/>
-      <w:r>
-        <w:fldChar w:fldCharType="begin"/>
-      </w:r>
-      <w:r>
-        <w:instrText>HYPERLINK "vscode-file://vscode-app/d:/apps/Microsoft%20VS%20Code/072586267e/resources/app/out/vs/code/electron-browser/workbench/workbench.html" \o ""</w:instrText>
-      </w:r>
-      <w:r>
-        <w:fldChar w:fldCharType="separate"/>
-      </w:r>
-      <w:r>
-        <w:rPr>
-          <w:rStyle w:val="Hyperlink"/>
-        </w:rPr>
-        <w:t>OidcUser</w:t>
-      </w:r>
-      <w:proofErr w:type="spellEnd"/>
-      <w:r>
-        <w:fldChar w:fldCharType="end"/>
+        <w:t>Reads </w:t>
+      </w:r>
+      <w:hyperlink r:id="rId30" w:history="1">
+        <w:r>
+          <w:rPr>
+            <w:rStyle w:val="Hyperlink"/>
+          </w:rPr>
+          <w:t>oidcUser.getAttribute("roles")</w:t>
+        </w:r>
+      </w:hyperlink>
+      <w:r>
+        <w:t> — exactly where you confirmed the roles exist</w:t>
       </w:r>
     </w:p>
     <w:p>
@@ -7730,36 +7655,7 @@
         </w:numPr>
       </w:pPr>
       <w:r>
-        <w:t>Reads </w:t>
-      </w:r>
-      <w:proofErr w:type="spellStart"/>
-      <w:r>
-        <w:fldChar w:fldCharType="begin"/>
-      </w:r>
-      <w:r>
-        <w:instrText>HYPERLINK "vscode-file://vscode-app/d:/apps/Microsoft%20VS%20Code/072586267e/resources/app/out/vs/code/electron-browser/workbench/workbench.html" \o ""</w:instrText>
-      </w:r>
-      <w:r>
-        <w:fldChar w:fldCharType="separate"/>
-      </w:r>
-      <w:r>
-        <w:rPr>
-          <w:rStyle w:val="Hyperlink"/>
-        </w:rPr>
-        <w:t>oidcUser.getAttribute</w:t>
-      </w:r>
-      <w:proofErr w:type="spellEnd"/>
-      <w:r>
-        <w:rPr>
-          <w:rStyle w:val="Hyperlink"/>
-        </w:rPr>
-        <w:t>("roles")</w:t>
-      </w:r>
-      <w:r>
-        <w:fldChar w:fldCharType="end"/>
-      </w:r>
-      <w:r>
-        <w:t> — exactly where you confirmed the roles exist</w:t>
+        <w:t>Maps each Entra role to ROLE_APP_ADMIN, ROLE_APP_READ, ROLE_APP_WRITE authorities</w:t>
       </w:r>
     </w:p>
     <w:p>
@@ -7770,39 +7666,16 @@
         </w:numPr>
       </w:pPr>
       <w:r>
-        <w:t>Maps each Entra role to ROLE_APP_ADMIN, ROLE_APP_READ, ROLE_APP_WRITE authorities</w:t>
-      </w:r>
-    </w:p>
-    <w:p>
-      <w:pPr>
-        <w:numPr>
-          <w:ilvl w:val="0"/>
-          <w:numId w:val="20"/>
-        </w:numPr>
-      </w:pPr>
-      <w:r>
         <w:t>Returns a new </w:t>
       </w:r>
-      <w:proofErr w:type="spellStart"/>
-      <w:r>
-        <w:fldChar w:fldCharType="begin"/>
-      </w:r>
-      <w:r>
-        <w:instrText>HYPERLINK "vscode-file://vscode-app/d:/apps/Microsoft%20VS%20Code/072586267e/resources/app/out/vs/code/electron-browser/workbench/workbench.html" \o ""</w:instrText>
-      </w:r>
-      <w:r>
-        <w:fldChar w:fldCharType="separate"/>
-      </w:r>
-      <w:r>
-        <w:rPr>
-          <w:rStyle w:val="Hyperlink"/>
-        </w:rPr>
-        <w:t>DefaultOidcUser</w:t>
-      </w:r>
-      <w:proofErr w:type="spellEnd"/>
-      <w:r>
-        <w:fldChar w:fldCharType="end"/>
-      </w:r>
+      <w:hyperlink r:id="rId31" w:history="1">
+        <w:r>
+          <w:rPr>
+            <w:rStyle w:val="Hyperlink"/>
+          </w:rPr>
+          <w:t>DefaultOidcUser</w:t>
+        </w:r>
+      </w:hyperlink>
       <w:r>
         <w:t> with the combined authorities</w:t>
       </w:r>
@@ -7842,7 +7715,7 @@
                     </pic:cNvPicPr>
                   </pic:nvPicPr>
                   <pic:blipFill>
-                    <a:blip r:embed="rId23">
+                    <a:blip r:embed="rId32">
                       <a:extLst>
                         <a:ext uri="{28A0092B-C50C-407E-A947-70E740481C1C}">
                           <a14:useLocalDpi xmlns:a14="http://schemas.microsoft.com/office/drawing/2010/main" val="0"/>
@@ -7902,7 +7775,7 @@
                     </pic:cNvPicPr>
                   </pic:nvPicPr>
                   <pic:blipFill>
-                    <a:blip r:embed="rId24">
+                    <a:blip r:embed="rId33">
                       <a:extLst>
                         <a:ext uri="{28A0092B-C50C-407E-A947-70E740481C1C}">
                           <a14:useLocalDpi xmlns:a14="http://schemas.microsoft.com/office/drawing/2010/main" val="0"/>
@@ -7958,7 +7831,7 @@
                     </pic:cNvPicPr>
                   </pic:nvPicPr>
                   <pic:blipFill>
-                    <a:blip r:embed="rId25">
+                    <a:blip r:embed="rId34">
                       <a:extLst>
                         <a:ext uri="{28A0092B-C50C-407E-A947-70E740481C1C}">
                           <a14:useLocalDpi xmlns:a14="http://schemas.microsoft.com/office/drawing/2010/main" val="0"/>
@@ -7998,7 +7871,7 @@
           <w:bCs/>
         </w:rPr>
       </w:pPr>
-      <w:bookmarkStart w:id="24" w:name="_Toc225115694"/>
+      <w:bookmarkStart w:id="24" w:name="_Toc225694778"/>
       <w:r>
         <w:t xml:space="preserve">4.3 </w:t>
       </w:r>
@@ -8082,7 +7955,7 @@
       <w:r>
         <w:t>Azure Portal always triggers MFA because it has built-in Microsoft first-party policies — your custom app doesn't inherit that behavior. Even </w:t>
       </w:r>
-      <w:hyperlink r:id="rId26" w:history="1">
+      <w:hyperlink r:id="rId35" w:history="1">
         <w:r>
           <w:rPr>
             <w:rStyle w:val="Hyperlink"/>
@@ -8171,36 +8044,16 @@
       <w:r>
         <w:t>This tells Entra: "The </w:t>
       </w:r>
-      <w:proofErr w:type="spellStart"/>
-      <w:r>
-        <w:fldChar w:fldCharType="begin"/>
-      </w:r>
-      <w:r>
-        <w:instrText>HYPERLINK "vscode-file://vscode-app/d:/apps/Microsoft%20VS%20Code/072586267e/resources/app/out/vs/code/electron-browser/workbench/workbench.html" \o ""</w:instrText>
-      </w:r>
-      <w:r>
-        <w:fldChar w:fldCharType="separate"/>
-      </w:r>
-      <w:r>
-        <w:rPr>
-          <w:rStyle w:val="Hyperlink"/>
-        </w:rPr>
-        <w:t>amr</w:t>
-      </w:r>
-      <w:proofErr w:type="spellEnd"/>
-      <w:r>
-        <w:fldChar w:fldCharType="end"/>
-      </w:r>
-      <w:r>
-        <w:t> (authentication method reference) claim with value </w:t>
-      </w:r>
-      <w:proofErr w:type="spellStart"/>
-      <w:r>
-        <w:t>mfa</w:t>
-      </w:r>
-      <w:proofErr w:type="spellEnd"/>
-      <w:r>
-        <w:t> is </w:t>
+      <w:hyperlink r:id="rId36" w:history="1">
+        <w:r>
+          <w:rPr>
+            <w:rStyle w:val="Hyperlink"/>
+          </w:rPr>
+          <w:t>amr</w:t>
+        </w:r>
+      </w:hyperlink>
+      <w:r>
+        <w:t> (authentication method reference) claim with value mfa is </w:t>
       </w:r>
       <w:r>
         <w:rPr>
@@ -8233,7 +8086,7 @@
         </w:tabs>
         <w:ind w:left="1276"/>
       </w:pPr>
-      <w:hyperlink r:id="rId27" w:history="1">
+      <w:hyperlink r:id="rId37" w:history="1">
         <w:r>
           <w:rPr>
             <w:rStyle w:val="Hyperlink"/>
@@ -8258,39 +8111,7 @@
         <w:ind w:left="1276"/>
       </w:pPr>
       <w:r>
-        <w:t>claims={"id_token</w:t>
-      </w:r>
-      <w:proofErr w:type="gramStart"/>
-      <w:r>
-        <w:t>":{</w:t>
-      </w:r>
-      <w:proofErr w:type="gramEnd"/>
-      <w:r>
-        <w:t>"amr</w:t>
-      </w:r>
-      <w:proofErr w:type="gramStart"/>
-      <w:r>
-        <w:t>":{</w:t>
-      </w:r>
-      <w:proofErr w:type="gramEnd"/>
-      <w:r>
-        <w:t>"essential</w:t>
-      </w:r>
-      <w:proofErr w:type="gramStart"/>
-      <w:r>
-        <w:t>":true</w:t>
-      </w:r>
-      <w:proofErr w:type="gramEnd"/>
-      <w:r>
-        <w:t>,"values</w:t>
-      </w:r>
-      <w:proofErr w:type="gramStart"/>
-      <w:r>
-        <w:t>":[</w:t>
-      </w:r>
-      <w:proofErr w:type="gramEnd"/>
-      <w:r>
-        <w:t>"mfa"]}}} — demands MFA step-up</w:t>
+        <w:t>claims={"id_token":{"amr":{"essential":true,"values":["mfa"]}}} — demands MFA step-up</w:t>
       </w:r>
     </w:p>
     <w:p>
@@ -8318,7 +8139,7 @@
                     <pic:cNvPicPr/>
                   </pic:nvPicPr>
                   <pic:blipFill>
-                    <a:blip r:embed="rId28"/>
+                    <a:blip r:embed="rId38"/>
                     <a:stretch>
                       <a:fillRect/>
                     </a:stretch>
@@ -8384,15 +8205,7 @@
     </w:p>
     <w:p>
       <w:r>
-        <w:t>Disable Security Defaults → create a Conditional Access policy targeting the </w:t>
-      </w:r>
-      <w:proofErr w:type="spellStart"/>
-      <w:r>
-        <w:t>poc-bff</w:t>
-      </w:r>
-      <w:proofErr w:type="spellEnd"/>
-      <w:r>
-        <w:t> app that requires MFA on every sign-in. This is the production-grade solution.</w:t>
+        <w:t>Disable Security Defaults → create a Conditional Access policy targeting the poc-bff app that requires MFA on every sign-in. This is the production-grade solution.</w:t>
       </w:r>
     </w:p>
     <w:p>
@@ -8434,7 +8247,7 @@
                     </pic:cNvPicPr>
                   </pic:nvPicPr>
                   <pic:blipFill>
-                    <a:blip r:embed="rId29">
+                    <a:blip r:embed="rId39">
                       <a:extLst>
                         <a:ext uri="{28A0092B-C50C-407E-A947-70E740481C1C}">
                           <a14:useLocalDpi xmlns:a14="http://schemas.microsoft.com/office/drawing/2010/main" val="0"/>
@@ -8470,7 +8283,7 @@
       <w:pPr>
         <w:pStyle w:val="Heading1"/>
       </w:pPr>
-      <w:bookmarkStart w:id="25" w:name="_Toc225115695"/>
+      <w:bookmarkStart w:id="25" w:name="_Toc225694779"/>
       <w:r>
         <w:lastRenderedPageBreak/>
         <w:t>5. POC – Report Entry Comments</w:t>
@@ -8481,20 +8294,12 @@
       <w:pPr>
         <w:pStyle w:val="Heading2"/>
       </w:pPr>
-      <w:bookmarkStart w:id="26" w:name="_Toc225115696"/>
+      <w:bookmarkStart w:id="26" w:name="_Toc225694780"/>
       <w:r>
         <w:t xml:space="preserve">5.1 </w:t>
       </w:r>
       <w:r>
-        <w:t xml:space="preserve">Phase </w:t>
-      </w:r>
-      <w:proofErr w:type="gramStart"/>
-      <w:r>
-        <w:t>0  -</w:t>
-      </w:r>
-      <w:proofErr w:type="gramEnd"/>
-      <w:r>
-        <w:t xml:space="preserve"> </w:t>
+        <w:t xml:space="preserve">Phase 0  - </w:t>
       </w:r>
       <w:r>
         <w:t>Database Setup</w:t>
@@ -8505,7 +8310,7 @@
       <w:pPr>
         <w:pStyle w:val="Heading3"/>
       </w:pPr>
-      <w:bookmarkStart w:id="27" w:name="_Toc225115697"/>
+      <w:bookmarkStart w:id="27" w:name="_Toc225694781"/>
       <w:r>
         <w:t>5.</w:t>
       </w:r>
@@ -8701,7 +8506,6 @@
       <w:r>
         <w:t xml:space="preserve">Set strong password for </w:t>
       </w:r>
-      <w:proofErr w:type="spellStart"/>
       <w:r>
         <w:rPr>
           <w:b/>
@@ -8709,13 +8513,12 @@
         </w:rPr>
         <w:t>sa</w:t>
       </w:r>
-      <w:proofErr w:type="spellEnd"/>
     </w:p>
     <w:p>
       <w:pPr>
         <w:pStyle w:val="Heading3"/>
       </w:pPr>
-      <w:bookmarkStart w:id="28" w:name="_Toc225115698"/>
+      <w:bookmarkStart w:id="28" w:name="_Toc225694782"/>
       <w:r>
         <w:t>5</w:t>
       </w:r>
@@ -8723,14 +8526,9 @@
         <w:t>.1</w:t>
       </w:r>
       <w:r>
-        <w:t xml:space="preserve">.2 Connect from </w:t>
-      </w:r>
-      <w:proofErr w:type="spellStart"/>
-      <w:r>
-        <w:t>DBeaver</w:t>
+        <w:t>.2 Connect from DBeaver</w:t>
       </w:r>
       <w:bookmarkEnd w:id="28"/>
-      <w:proofErr w:type="spellEnd"/>
     </w:p>
     <w:p>
       <w:r>
@@ -8759,7 +8557,7 @@
                     <pic:cNvPicPr/>
                   </pic:nvPicPr>
                   <pic:blipFill>
-                    <a:blip r:embed="rId30"/>
+                    <a:blip r:embed="rId40"/>
                     <a:stretch>
                       <a:fillRect/>
                     </a:stretch>
@@ -8815,7 +8613,7 @@
                     <pic:cNvPicPr/>
                   </pic:nvPicPr>
                   <pic:blipFill>
-                    <a:blip r:embed="rId31"/>
+                    <a:blip r:embed="rId41"/>
                     <a:stretch>
                       <a:fillRect/>
                     </a:stretch>
@@ -8959,7 +8757,7 @@
                     </pic:cNvPicPr>
                   </pic:nvPicPr>
                   <pic:blipFill>
-                    <a:blip r:embed="rId32">
+                    <a:blip r:embed="rId42">
                       <a:extLst>
                         <a:ext uri="{28A0092B-C50C-407E-A947-70E740481C1C}">
                           <a14:useLocalDpi xmlns:a14="http://schemas.microsoft.com/office/drawing/2010/main" val="0"/>
@@ -9181,7 +8979,7 @@
                     </pic:cNvPicPr>
                   </pic:nvPicPr>
                   <pic:blipFill>
-                    <a:blip r:embed="rId33">
+                    <a:blip r:embed="rId43">
                       <a:extLst>
                         <a:ext uri="{28A0092B-C50C-407E-A947-70E740481C1C}">
                           <a14:useLocalDpi xmlns:a14="http://schemas.microsoft.com/office/drawing/2010/main" val="0"/>
@@ -9315,7 +9113,6 @@
       <w:r>
         <w:t xml:space="preserve">Scroll to </w:t>
       </w:r>
-      <w:proofErr w:type="spellStart"/>
       <w:r>
         <w:rPr>
           <w:b/>
@@ -9323,7 +9120,6 @@
         </w:rPr>
         <w:t>IPAll</w:t>
       </w:r>
-      <w:proofErr w:type="spellEnd"/>
     </w:p>
     <w:p>
       <w:pPr>
@@ -9450,7 +9246,7 @@
                     </pic:cNvPicPr>
                   </pic:nvPicPr>
                   <pic:blipFill>
-                    <a:blip r:embed="rId34">
+                    <a:blip r:embed="rId44">
                       <a:extLst>
                         <a:ext uri="{28A0092B-C50C-407E-A947-70E740481C1C}">
                           <a14:useLocalDpi xmlns:a14="http://schemas.microsoft.com/office/drawing/2010/main" val="0"/>
@@ -9494,7 +9290,7 @@
       <w:pPr>
         <w:pStyle w:val="Heading3"/>
       </w:pPr>
-      <w:bookmarkStart w:id="29" w:name="_Toc225115699"/>
+      <w:bookmarkStart w:id="29" w:name="_Toc225694783"/>
       <w:r>
         <w:t>5</w:t>
       </w:r>
@@ -9510,7 +9306,6 @@
       <w:r>
         <w:t xml:space="preserve">CREATE DATABASE </w:t>
       </w:r>
-      <w:proofErr w:type="spellStart"/>
       <w:r>
         <w:rPr>
           <w:b/>
@@ -9518,7 +9313,6 @@
         </w:rPr>
         <w:t>LeapPoc</w:t>
       </w:r>
-      <w:proofErr w:type="spellEnd"/>
       <w:r>
         <w:t> on local MSSQL Developer Edition</w:t>
       </w:r>
@@ -9527,7 +9321,7 @@
       <w:pPr>
         <w:pStyle w:val="Heading3"/>
       </w:pPr>
-      <w:bookmarkStart w:id="30" w:name="_Toc225115700"/>
+      <w:bookmarkStart w:id="30" w:name="_Toc225694784"/>
       <w:r>
         <w:t>5</w:t>
       </w:r>
@@ -9541,15 +9335,7 @@
     </w:p>
     <w:p>
       <w:r>
-        <w:t>See docs/</w:t>
-      </w:r>
-      <w:proofErr w:type="spellStart"/>
-      <w:r>
-        <w:t>sql</w:t>
-      </w:r>
-      <w:proofErr w:type="spellEnd"/>
-      <w:r>
-        <w:t>/</w:t>
+        <w:t>See docs/sql/</w:t>
       </w:r>
       <w:r>
         <w:rPr>
@@ -9563,7 +9349,7 @@
       <w:pPr>
         <w:pStyle w:val="Heading3"/>
       </w:pPr>
-      <w:bookmarkStart w:id="31" w:name="_Toc225115701"/>
+      <w:bookmarkStart w:id="31" w:name="_Toc225694785"/>
       <w:r>
         <w:t>5</w:t>
       </w:r>
@@ -9577,15 +9363,7 @@
     </w:p>
     <w:p>
       <w:r>
-        <w:t>See docs/</w:t>
-      </w:r>
-      <w:proofErr w:type="spellStart"/>
-      <w:r>
-        <w:t>sql</w:t>
-      </w:r>
-      <w:proofErr w:type="spellEnd"/>
-      <w:r>
-        <w:t>/</w:t>
+        <w:t>See docs/sql/</w:t>
       </w:r>
       <w:r>
         <w:rPr>
@@ -9599,7 +9377,7 @@
       <w:pPr>
         <w:pStyle w:val="Heading2"/>
       </w:pPr>
-      <w:bookmarkStart w:id="32" w:name="_Toc225115702"/>
+      <w:bookmarkStart w:id="32" w:name="_Toc225694786"/>
       <w:r>
         <w:t xml:space="preserve">5.2 </w:t>
       </w:r>
@@ -9666,31 +9444,7 @@
         </w:numPr>
       </w:pPr>
       <w:r>
-        <w:t xml:space="preserve">Add </w:t>
-      </w:r>
-      <w:proofErr w:type="spellStart"/>
-      <w:r>
-        <w:t>EntityScan</w:t>
-      </w:r>
-      <w:proofErr w:type="spellEnd"/>
-      <w:r>
-        <w:t xml:space="preserve"> and </w:t>
-      </w:r>
-      <w:proofErr w:type="spellStart"/>
-      <w:r>
-        <w:t>EnableJpaRepositoryies</w:t>
-      </w:r>
-      <w:proofErr w:type="spellEnd"/>
-      <w:r>
-        <w:t xml:space="preserve"> in leap-app </w:t>
-      </w:r>
-      <w:proofErr w:type="spellStart"/>
-      <w:r>
-        <w:t>LeapPocApplication</w:t>
-      </w:r>
-      <w:proofErr w:type="spellEnd"/>
-      <w:r>
-        <w:t xml:space="preserve"> to scan JPA entities and repositories in other modules/packages</w:t>
+        <w:t>Add EntityScan and EnableJpaRepositoryies in leap-app LeapPocApplication to scan JPA entities and repositories in other modules/packages</w:t>
       </w:r>
     </w:p>
     <w:p>
@@ -9718,7 +9472,7 @@
                     <pic:cNvPicPr/>
                   </pic:nvPicPr>
                   <pic:blipFill>
-                    <a:blip r:embed="rId35"/>
+                    <a:blip r:embed="rId45"/>
                     <a:stretch>
                       <a:fillRect/>
                     </a:stretch>
@@ -9748,27 +9502,14 @@
         </w:numPr>
       </w:pPr>
       <w:r>
-        <w:t xml:space="preserve">Change Instant to </w:t>
-      </w:r>
-      <w:proofErr w:type="spellStart"/>
-      <w:r>
-        <w:t>LocalDateTime</w:t>
-      </w:r>
-      <w:proofErr w:type="spellEnd"/>
-      <w:r>
-        <w:t xml:space="preserve"> for datetime fields such as </w:t>
-      </w:r>
-      <w:proofErr w:type="spellStart"/>
-      <w:r>
-        <w:t>createdAt</w:t>
-      </w:r>
-      <w:proofErr w:type="spellEnd"/>
+        <w:t>Change Instant to LocalDateTime for datetime fields such as createdAt</w:t>
+      </w:r>
     </w:p>
     <w:p>
       <w:pPr>
         <w:pStyle w:val="Heading3"/>
       </w:pPr>
-      <w:bookmarkStart w:id="33" w:name="_Toc225115703"/>
+      <w:bookmarkStart w:id="33" w:name="_Toc225694787"/>
       <w:r>
         <w:t xml:space="preserve">5.3 </w:t>
       </w:r>
@@ -9781,9 +9522,11 @@
       <w:pPr>
         <w:pStyle w:val="Heading3"/>
       </w:pPr>
+      <w:bookmarkStart w:id="34" w:name="_Toc225694788"/>
       <w:r>
         <w:t>5.4 Phase 3 – Comment API</w:t>
       </w:r>
+      <w:bookmarkEnd w:id="34"/>
     </w:p>
     <w:p>
       <w:pPr>
@@ -9851,21 +9594,7 @@
         <w:rPr>
           <w:rFonts w:hint="eastAsia"/>
         </w:rPr>
-        <w:t xml:space="preserve">After login, open </w:t>
-      </w:r>
-      <w:proofErr w:type="spellStart"/>
-      <w:r>
-        <w:rPr>
-          <w:rFonts w:hint="eastAsia"/>
-        </w:rPr>
-        <w:t>DevTools</w:t>
-      </w:r>
-      <w:proofErr w:type="spellEnd"/>
-      <w:r>
-        <w:rPr>
-          <w:rFonts w:hint="eastAsia"/>
-        </w:rPr>
-        <w:t xml:space="preserve"> </w:t>
+        <w:t xml:space="preserve">After login, open DevTools </w:t>
       </w:r>
       <w:r>
         <w:rPr>
@@ -9986,9 +9715,11 @@
       <w:pPr>
         <w:pStyle w:val="Heading3"/>
       </w:pPr>
+      <w:bookmarkStart w:id="35" w:name="_Toc225694789"/>
       <w:r>
         <w:t>5.5 Phase 4 – 5 – Frontend</w:t>
       </w:r>
+      <w:bookmarkEnd w:id="35"/>
     </w:p>
     <w:p>
       <w:pPr>
@@ -10002,12 +9733,14 @@
       <w:pPr>
         <w:pStyle w:val="Heading3"/>
       </w:pPr>
+      <w:bookmarkStart w:id="36" w:name="_Toc225694790"/>
       <w:r>
         <w:t xml:space="preserve">5.6 </w:t>
       </w:r>
       <w:r>
         <w:t>Phase 6: Polish &amp; Hardening</w:t>
       </w:r>
+      <w:bookmarkEnd w:id="36"/>
     </w:p>
     <w:p>
       <w:pPr>
@@ -10033,7 +9766,6 @@
         </w:tabs>
         <w:ind w:left="851" w:hanging="284"/>
       </w:pPr>
-      <w:proofErr w:type="spellStart"/>
       <w:r>
         <w:rPr>
           <w:b/>
@@ -10041,40 +9773,19 @@
         </w:rPr>
         <w:t>CommentThreadDto</w:t>
       </w:r>
-      <w:proofErr w:type="spellEnd"/>
       <w:r>
         <w:t> — added </w:t>
       </w:r>
-      <w:proofErr w:type="spellStart"/>
-      <w:r>
-        <w:fldChar w:fldCharType="begin"/>
-      </w:r>
-      <w:r>
-        <w:instrText>HYPERLINK "vscode-file://vscode-app/d:/apps/Microsoft%20VS%20Code/07ff9d6178/resources/app/out/vs/code/electron-browser/workbench/workbench.html" \o ""</w:instrText>
-      </w:r>
-      <w:r>
-        <w:fldChar w:fldCharType="separate"/>
-      </w:r>
-      <w:r>
-        <w:rPr>
-          <w:rStyle w:val="Hyperlink"/>
-        </w:rPr>
-        <w:t>isDeleted</w:t>
-      </w:r>
-      <w:proofErr w:type="spellEnd"/>
-      <w:r>
-        <w:fldChar w:fldCharType="end"/>
-      </w:r>
-      <w:r>
-        <w:t> </w:t>
-      </w:r>
-      <w:proofErr w:type="spellStart"/>
-      <w:r>
-        <w:t>boolean</w:t>
-      </w:r>
-      <w:proofErr w:type="spellEnd"/>
-      <w:r>
-        <w:t xml:space="preserve"> field</w:t>
+      <w:hyperlink r:id="rId46" w:history="1">
+        <w:r>
+          <w:rPr>
+            <w:rStyle w:val="Hyperlink"/>
+          </w:rPr>
+          <w:t>isDeleted</w:t>
+        </w:r>
+      </w:hyperlink>
+      <w:r>
+        <w:t> boolean field</w:t>
       </w:r>
     </w:p>
     <w:p>
@@ -10089,7 +9800,6 @@
         </w:tabs>
         <w:ind w:left="851" w:hanging="284"/>
       </w:pPr>
-      <w:proofErr w:type="spellStart"/>
       <w:r>
         <w:rPr>
           <w:b/>
@@ -10098,7 +9808,6 @@
         <w:lastRenderedPageBreak/>
         <w:t>CommentRepository</w:t>
       </w:r>
-      <w:proofErr w:type="spellEnd"/>
       <w:r>
         <w:t> — added 3 new queries: fetch all comments (including deleted), single entity count, and batch entity counts via JPQL</w:t>
       </w:r>
@@ -10115,7 +9824,6 @@
         </w:tabs>
         <w:ind w:left="851" w:hanging="284"/>
       </w:pPr>
-      <w:proofErr w:type="spellStart"/>
       <w:r>
         <w:rPr>
           <w:b/>
@@ -10123,65 +9831,28 @@
         </w:rPr>
         <w:t>CommentServiceImpl</w:t>
       </w:r>
-      <w:proofErr w:type="spellEnd"/>
       <w:r>
         <w:t> — rewrote </w:t>
       </w:r>
-      <w:proofErr w:type="spellStart"/>
-      <w:r>
-        <w:fldChar w:fldCharType="begin"/>
-      </w:r>
-      <w:r>
-        <w:instrText>HYPERLINK "vscode-file://vscode-app/d:/apps/Microsoft%20VS%20Code/07ff9d6178/resources/app/out/vs/code/electron-browser/workbench/workbench.html" \o ""</w:instrText>
-      </w:r>
-      <w:r>
-        <w:fldChar w:fldCharType="separate"/>
-      </w:r>
-      <w:r>
-        <w:rPr>
-          <w:rStyle w:val="Hyperlink"/>
-        </w:rPr>
-        <w:t>getThread</w:t>
-      </w:r>
-      <w:proofErr w:type="spellEnd"/>
-      <w:r>
-        <w:rPr>
-          <w:rStyle w:val="Hyperlink"/>
-        </w:rPr>
-        <w:t>()</w:t>
-      </w:r>
-      <w:r>
-        <w:fldChar w:fldCharType="end"/>
-      </w:r>
+      <w:hyperlink r:id="rId47" w:history="1">
+        <w:r>
+          <w:rPr>
+            <w:rStyle w:val="Hyperlink"/>
+          </w:rPr>
+          <w:t>getThread()</w:t>
+        </w:r>
+      </w:hyperlink>
       <w:r>
         <w:t> to include soft-deleted parents as placeholders when they have non-deleted descendants; added </w:t>
       </w:r>
-      <w:proofErr w:type="spellStart"/>
-      <w:r>
-        <w:fldChar w:fldCharType="begin"/>
-      </w:r>
-      <w:r>
-        <w:instrText>HYPERLINK "vscode-file://vscode-app/d:/apps/Microsoft%20VS%20Code/07ff9d6178/resources/app/out/vs/code/electron-browser/workbench/workbench.html" \o ""</w:instrText>
-      </w:r>
-      <w:r>
-        <w:fldChar w:fldCharType="separate"/>
-      </w:r>
-      <w:r>
-        <w:rPr>
-          <w:rStyle w:val="Hyperlink"/>
-        </w:rPr>
-        <w:t>getCounts</w:t>
-      </w:r>
-      <w:proofErr w:type="spellEnd"/>
-      <w:r>
-        <w:rPr>
-          <w:rStyle w:val="Hyperlink"/>
-        </w:rPr>
-        <w:t>()</w:t>
-      </w:r>
-      <w:r>
-        <w:fldChar w:fldCharType="end"/>
-      </w:r>
+      <w:hyperlink r:id="rId48" w:history="1">
+        <w:r>
+          <w:rPr>
+            <w:rStyle w:val="Hyperlink"/>
+          </w:rPr>
+          <w:t>getCounts()</w:t>
+        </w:r>
+      </w:hyperlink>
       <w:r>
         <w:t> for batch comment count retrieval</w:t>
       </w:r>
@@ -10198,7 +9869,6 @@
         </w:tabs>
         <w:ind w:left="851" w:hanging="284"/>
       </w:pPr>
-      <w:proofErr w:type="spellStart"/>
       <w:r>
         <w:rPr>
           <w:b/>
@@ -10206,58 +9876,15 @@
         </w:rPr>
         <w:t>CommentController</w:t>
       </w:r>
-      <w:proofErr w:type="spellEnd"/>
       <w:r>
         <w:t> — added </w:t>
       </w:r>
-      <w:hyperlink r:id="rId36" w:history="1">
+      <w:hyperlink r:id="rId49" w:history="1">
         <w:r>
           <w:rPr>
             <w:rStyle w:val="Hyperlink"/>
           </w:rPr>
-          <w:t>GET /</w:t>
-        </w:r>
-        <w:proofErr w:type="spellStart"/>
-        <w:r>
-          <w:rPr>
-            <w:rStyle w:val="Hyperlink"/>
-          </w:rPr>
-          <w:t>api</w:t>
-        </w:r>
-        <w:proofErr w:type="spellEnd"/>
-        <w:r>
-          <w:rPr>
-            <w:rStyle w:val="Hyperlink"/>
-          </w:rPr>
-          <w:t>/comments/</w:t>
-        </w:r>
-        <w:proofErr w:type="spellStart"/>
-        <w:r>
-          <w:rPr>
-            <w:rStyle w:val="Hyperlink"/>
-          </w:rPr>
-          <w:t>counts?entityType</w:t>
-        </w:r>
-        <w:proofErr w:type="spellEnd"/>
-        <w:r>
-          <w:rPr>
-            <w:rStyle w:val="Hyperlink"/>
-          </w:rPr>
-          <w:t>=&amp;</w:t>
-        </w:r>
-        <w:proofErr w:type="spellStart"/>
-        <w:r>
-          <w:rPr>
-            <w:rStyle w:val="Hyperlink"/>
-          </w:rPr>
-          <w:t>entityIds</w:t>
-        </w:r>
-        <w:proofErr w:type="spellEnd"/>
-        <w:r>
-          <w:rPr>
-            <w:rStyle w:val="Hyperlink"/>
-          </w:rPr>
-          <w:t>=</w:t>
+          <w:t>GET /api/comments/counts?entityType=&amp;entityIds=</w:t>
         </w:r>
       </w:hyperlink>
       <w:r>
@@ -10365,15 +9992,7 @@
         <w:t>6.6 Comment count badge</w:t>
       </w:r>
       <w:r>
-        <w:t xml:space="preserve">: Counts load on page </w:t>
-      </w:r>
-      <w:proofErr w:type="spellStart"/>
-      <w:r>
-        <w:t>init</w:t>
-      </w:r>
-      <w:proofErr w:type="spellEnd"/>
-      <w:r>
-        <w:t xml:space="preserve"> via batch endpoint (not just when panel opens)</w:t>
+        <w:t>: Counts load on page init via batch endpoint (not just when panel opens)</w:t>
       </w:r>
     </w:p>
     <w:p>
@@ -10419,29 +10038,18 @@
         <w:t>6.8 Accessibility</w:t>
       </w:r>
       <w:r>
-        <w:t>: ARIA roles/labels on panel, entries, buttons, icons; aria-live="polite" for dynamic content; Escape key closes panel; </w:t>
-      </w:r>
-      <w:proofErr w:type="spellStart"/>
-      <w:r>
-        <w:t>trackBy</w:t>
-      </w:r>
-      <w:proofErr w:type="spellEnd"/>
-      <w:r>
-        <w:t> on all *</w:t>
-      </w:r>
-      <w:proofErr w:type="spellStart"/>
-      <w:r>
-        <w:t>ngFor</w:t>
-      </w:r>
-      <w:proofErr w:type="spellEnd"/>
+        <w:t>: ARIA roles/labels on panel, entries, buttons, icons; aria-live="polite" for dynamic content; Escape key closes panel; trackBy on all *ngFor</w:t>
+      </w:r>
     </w:p>
     <w:p>
       <w:pPr>
         <w:pStyle w:val="Heading1"/>
       </w:pPr>
+      <w:bookmarkStart w:id="37" w:name="_Toc225694791"/>
       <w:r>
         <w:t>6. Authorization by Group</w:t>
       </w:r>
+      <w:bookmarkEnd w:id="37"/>
     </w:p>
     <w:p>
       <w:pPr>
@@ -10451,17 +10059,14 @@
           <w:bCs/>
         </w:rPr>
       </w:pPr>
-      <w:proofErr w:type="gramStart"/>
+      <w:bookmarkStart w:id="38" w:name="_Toc225694792"/>
       <w:r>
         <w:t xml:space="preserve">6.1  </w:t>
       </w:r>
       <w:r>
-        <w:t>Setting</w:t>
-      </w:r>
-      <w:proofErr w:type="gramEnd"/>
-      <w:r>
-        <w:t xml:space="preserve"> Up Groups in Microsoft Entra ID</w:t>
-      </w:r>
+        <w:t>Setting Up Groups in Microsoft Entra ID</w:t>
+      </w:r>
+      <w:bookmarkEnd w:id="38"/>
     </w:p>
     <w:p>
       <w:pPr>
@@ -10491,7 +10096,7 @@
       <w:r>
         <w:t xml:space="preserve"> </w:t>
       </w:r>
-      <w:hyperlink r:id="rId37" w:anchor="view/Microsoft_AAD_IAM/TenantOverview.ReactView" w:history="1">
+      <w:hyperlink r:id="rId50" w:anchor="view/Microsoft_AAD_IAM/TenantOverview.ReactView" w:history="1">
         <w:r>
           <w:rPr>
             <w:rStyle w:val="Hyperlink"/>
@@ -10500,10 +10105,7 @@
         </w:r>
       </w:hyperlink>
       <w:r>
-        <w:t xml:space="preserve"> </w:t>
-      </w:r>
-      <w:r>
-        <w:t>→ </w:t>
+        <w:t xml:space="preserve"> → </w:t>
       </w:r>
       <w:r>
         <w:rPr>
@@ -11355,7 +10957,6 @@
       <w:r>
         <w:t xml:space="preserve"> </w:t>
       </w:r>
-      <w:proofErr w:type="spellStart"/>
       <w:r>
         <w:rPr>
           <w:b/>
@@ -11363,7 +10964,6 @@
         </w:rPr>
         <w:t>poc-bff</w:t>
       </w:r>
-      <w:proofErr w:type="spellEnd"/>
     </w:p>
     <w:p>
       <w:pPr>
@@ -11536,7 +11136,6 @@
       <w:r>
         <w:t>You'll need these IDs in </w:t>
       </w:r>
-      <w:proofErr w:type="spellStart"/>
       <w:r>
         <w:rPr>
           <w:b/>
@@ -11544,7 +11143,6 @@
         </w:rPr>
         <w:t>application.yml</w:t>
       </w:r>
-      <w:proofErr w:type="spellEnd"/>
       <w:r>
         <w:t>:</w:t>
       </w:r>
@@ -11609,12 +11207,14 @@
       <w:pPr>
         <w:pStyle w:val="Heading2"/>
       </w:pPr>
+      <w:bookmarkStart w:id="39" w:name="_Toc225694793"/>
       <w:r>
         <w:t xml:space="preserve">6.2 </w:t>
       </w:r>
       <w:r>
         <w:t>Spring Boot Application Implementation</w:t>
       </w:r>
+      <w:bookmarkEnd w:id="39"/>
     </w:p>
     <w:p>
       <w:pPr>
@@ -11690,8 +11290,6 @@
       <w:r>
         <w:t>Added </w:t>
       </w:r>
-      <w:proofErr w:type="spellStart"/>
-      <w:proofErr w:type="gramStart"/>
       <w:r>
         <w:rPr>
           <w:b/>
@@ -11699,8 +11297,6 @@
         </w:rPr>
         <w:t>app.groups</w:t>
       </w:r>
-      <w:proofErr w:type="spellEnd"/>
-      <w:proofErr w:type="gramEnd"/>
       <w:r>
         <w:t> config mapping group Object IDs → friendly names</w:t>
       </w:r>
@@ -11710,6 +11306,9 @@
         <w:ind w:left="720"/>
       </w:pPr>
       <w:r>
+        <w:rPr>
+          <w:noProof/>
+        </w:rPr>
         <w:drawing>
           <wp:inline distT="0" distB="0" distL="0" distR="0" wp14:anchorId="3B99D702" wp14:editId="7075C6FA">
             <wp:extent cx="2557670" cy="1201047"/>
@@ -11726,7 +11325,7 @@
                     <pic:cNvPicPr/>
                   </pic:nvPicPr>
                   <pic:blipFill>
-                    <a:blip r:embed="rId38"/>
+                    <a:blip r:embed="rId51"/>
                     <a:stretch>
                       <a:fillRect/>
                     </a:stretch>
@@ -11808,7 +11407,7 @@
             <w:hideMark/>
           </w:tcPr>
           <w:p>
-            <w:hyperlink r:id="rId39" w:history="1">
+            <w:hyperlink r:id="rId52" w:history="1">
               <w:r>
                 <w:rPr>
                   <w:rStyle w:val="Hyperlink"/>
@@ -11863,7 +11462,7 @@
             <w:hideMark/>
           </w:tcPr>
           <w:p>
-            <w:hyperlink r:id="rId40" w:history="1">
+            <w:hyperlink r:id="rId53" w:history="1">
               <w:r>
                 <w:rPr>
                   <w:rStyle w:val="Hyperlink"/>
@@ -11918,7 +11517,7 @@
             <w:hideMark/>
           </w:tcPr>
           <w:p>
-            <w:hyperlink r:id="rId41" w:history="1">
+            <w:hyperlink r:id="rId54" w:history="1">
               <w:r>
                 <w:rPr>
                   <w:rStyle w:val="Hyperlink"/>
@@ -11973,7 +11572,7 @@
             <w:hideMark/>
           </w:tcPr>
           <w:p>
-            <w:hyperlink r:id="rId42" w:history="1">
+            <w:hyperlink r:id="rId55" w:history="1">
               <w:r>
                 <w:rPr>
                   <w:rStyle w:val="Hyperlink"/>
@@ -12002,15 +11601,7 @@
           </w:tcPr>
           <w:p>
             <w:r>
-              <w:t>Extracts GROUP_* authorities → returns groups list in /</w:t>
-            </w:r>
-            <w:proofErr w:type="spellStart"/>
-            <w:r>
-              <w:t>api</w:t>
-            </w:r>
-            <w:proofErr w:type="spellEnd"/>
-            <w:r>
-              <w:t>/me</w:t>
+              <w:t>Extracts GROUP_* authorities → returns groups list in /api/me</w:t>
             </w:r>
           </w:p>
         </w:tc>
@@ -12036,7 +11627,7 @@
             <w:hideMark/>
           </w:tcPr>
           <w:p>
-            <w:hyperlink r:id="rId43" w:history="1">
+            <w:hyperlink r:id="rId56" w:history="1">
               <w:r>
                 <w:rPr>
                   <w:rStyle w:val="Hyperlink"/>
@@ -12065,23 +11656,7 @@
           </w:tcPr>
           <w:p>
             <w:r>
-              <w:t>All @PreAuthorize now: </w:t>
-            </w:r>
-            <w:proofErr w:type="spellStart"/>
-            <w:r>
-              <w:t>hasRole</w:t>
-            </w:r>
-            <w:proofErr w:type="spellEnd"/>
-            <w:r>
-              <w:t xml:space="preserve">('APP_X') or </w:t>
-            </w:r>
-            <w:proofErr w:type="spellStart"/>
-            <w:r>
-              <w:t>hasAuthority</w:t>
-            </w:r>
-            <w:proofErr w:type="spellEnd"/>
-            <w:r>
-              <w:t>('GROUP_GRP_X')</w:t>
+              <w:t>All @PreAuthorize now: hasRole('APP_X') or hasAuthority('GROUP_GRP_X')</w:t>
             </w:r>
           </w:p>
         </w:tc>
@@ -12108,7 +11683,7 @@
             <w:hideMark/>
           </w:tcPr>
           <w:p>
-            <w:hyperlink r:id="rId44" w:history="1">
+            <w:hyperlink r:id="rId57" w:history="1">
               <w:r>
                 <w:rPr>
                   <w:rStyle w:val="Hyperlink"/>
@@ -12140,26 +11715,14 @@
             <w:r>
               <w:t>Same pattern; </w:t>
             </w:r>
-            <w:proofErr w:type="spellStart"/>
-            <w:r>
-              <w:fldChar w:fldCharType="begin"/>
-            </w:r>
-            <w:r>
-              <w:instrText>HYPERLINK "vscode-file://vscode-app/d:/apps/Microsoft%20VS%20Code/07ff9d6178/resources/app/out/vs/code/electron-browser/workbench/workbench.html" \o ""</w:instrText>
-            </w:r>
-            <w:r>
-              <w:fldChar w:fldCharType="separate"/>
-            </w:r>
-            <w:r>
-              <w:rPr>
-                <w:rStyle w:val="Hyperlink"/>
-              </w:rPr>
-              <w:t>isAdmin</w:t>
-            </w:r>
-            <w:proofErr w:type="spellEnd"/>
-            <w:r>
-              <w:fldChar w:fldCharType="end"/>
-            </w:r>
+            <w:hyperlink r:id="rId58" w:history="1">
+              <w:r>
+                <w:rPr>
+                  <w:rStyle w:val="Hyperlink"/>
+                </w:rPr>
+                <w:t>isAdmin</w:t>
+              </w:r>
+            </w:hyperlink>
             <w:r>
               <w:t> check also considers GROUP_GRP_ADMIN</w:t>
             </w:r>
@@ -12303,29 +11866,13 @@
             <w:hideMark/>
           </w:tcPr>
           <w:p>
-            <w:hyperlink r:id="rId45" w:history="1">
+            <w:hyperlink r:id="rId59" w:history="1">
               <w:r>
                 <w:rPr>
                   <w:rStyle w:val="Hyperlink"/>
                 </w:rPr>
-                <w:t>user-</w:t>
+                <w:t>user-info.model.ts</w:t>
               </w:r>
-              <w:proofErr w:type="spellStart"/>
-              <w:proofErr w:type="gramStart"/>
-              <w:r>
-                <w:rPr>
-                  <w:rStyle w:val="Hyperlink"/>
-                </w:rPr>
-                <w:t>info.model</w:t>
-              </w:r>
-              <w:proofErr w:type="gramEnd"/>
-              <w:r>
-                <w:rPr>
-                  <w:rStyle w:val="Hyperlink"/>
-                </w:rPr>
-                <w:t>.ts</w:t>
-              </w:r>
-              <w:proofErr w:type="spellEnd"/>
             </w:hyperlink>
           </w:p>
         </w:tc>
@@ -12348,15 +11895,7 @@
           </w:tcPr>
           <w:p>
             <w:r>
-              <w:t xml:space="preserve">Added groups: </w:t>
-            </w:r>
-            <w:proofErr w:type="gramStart"/>
-            <w:r>
-              <w:t>string[</w:t>
-            </w:r>
-            <w:proofErr w:type="gramEnd"/>
-            <w:r>
-              <w:t>]</w:t>
+              <w:t>Added groups: string[]</w:t>
             </w:r>
           </w:p>
         </w:tc>
@@ -12382,23 +11921,13 @@
             <w:hideMark/>
           </w:tcPr>
           <w:p>
-            <w:hyperlink r:id="rId46" w:history="1">
-              <w:proofErr w:type="spellStart"/>
-              <w:proofErr w:type="gramStart"/>
+            <w:hyperlink r:id="rId60" w:history="1">
               <w:r>
                 <w:rPr>
                   <w:rStyle w:val="Hyperlink"/>
                 </w:rPr>
-                <w:t>auth.service</w:t>
+                <w:t>auth.service.ts</w:t>
               </w:r>
-              <w:proofErr w:type="gramEnd"/>
-              <w:r>
-                <w:rPr>
-                  <w:rStyle w:val="Hyperlink"/>
-                </w:rPr>
-                <w:t>.ts</w:t>
-              </w:r>
-              <w:proofErr w:type="spellEnd"/>
             </w:hyperlink>
           </w:p>
         </w:tc>
@@ -12421,50 +11950,16 @@
           </w:tcPr>
           <w:p>
             <w:r>
-              <w:t>Added </w:t>
-            </w:r>
-            <w:proofErr w:type="spellStart"/>
-            <w:r>
-              <w:t>hasGroup</w:t>
-            </w:r>
-            <w:proofErr w:type="spellEnd"/>
-            <w:r>
-              <w:t>(), </w:t>
-            </w:r>
-            <w:proofErr w:type="spellStart"/>
-            <w:r>
-              <w:t>hasAnyGroup</w:t>
-            </w:r>
-            <w:proofErr w:type="spellEnd"/>
-            <w:r>
-              <w:t>(), </w:t>
-            </w:r>
-            <w:proofErr w:type="spellStart"/>
-            <w:r>
-              <w:fldChar w:fldCharType="begin"/>
-            </w:r>
-            <w:r>
-              <w:instrText>HYPERLINK "vscode-file://vscode-app/d:/apps/Microsoft%20VS%20Code/07ff9d6178/resources/app/out/vs/code/electron-browser/workbench/workbench.html" \o ""</w:instrText>
-            </w:r>
-            <w:r>
-              <w:fldChar w:fldCharType="separate"/>
-            </w:r>
-            <w:r>
-              <w:rPr>
-                <w:rStyle w:val="Hyperlink"/>
-              </w:rPr>
-              <w:t>hasAnyRoleOrGroup</w:t>
-            </w:r>
-            <w:proofErr w:type="spellEnd"/>
-            <w:r>
-              <w:rPr>
-                <w:rStyle w:val="Hyperlink"/>
-              </w:rPr>
-              <w:t>()</w:t>
-            </w:r>
-            <w:r>
-              <w:fldChar w:fldCharType="end"/>
-            </w:r>
+              <w:t>Added hasGroup(), hasAnyGroup(), </w:t>
+            </w:r>
+            <w:hyperlink r:id="rId61" w:history="1">
+              <w:r>
+                <w:rPr>
+                  <w:rStyle w:val="Hyperlink"/>
+                </w:rPr>
+                <w:t>hasAnyRoleOrGroup()</w:t>
+              </w:r>
+            </w:hyperlink>
             <w:r>
               <w:t> — maps APP_X ↔ GRP_X</w:t>
             </w:r>
@@ -12492,23 +11987,13 @@
             <w:hideMark/>
           </w:tcPr>
           <w:p>
-            <w:hyperlink r:id="rId47" w:history="1">
-              <w:proofErr w:type="spellStart"/>
-              <w:proofErr w:type="gramStart"/>
+            <w:hyperlink r:id="rId62" w:history="1">
               <w:r>
                 <w:rPr>
                   <w:rStyle w:val="Hyperlink"/>
                 </w:rPr>
-                <w:t>role.guard</w:t>
+                <w:t>role.guard.ts</w:t>
               </w:r>
-              <w:proofErr w:type="gramEnd"/>
-              <w:r>
-                <w:rPr>
-                  <w:rStyle w:val="Hyperlink"/>
-                </w:rPr>
-                <w:t>.ts</w:t>
-              </w:r>
-              <w:proofErr w:type="spellEnd"/>
             </w:hyperlink>
           </w:p>
         </w:tc>
@@ -12533,42 +12018,16 @@
             <w:r>
               <w:t>Now calls </w:t>
             </w:r>
-            <w:proofErr w:type="spellStart"/>
-            <w:r>
-              <w:fldChar w:fldCharType="begin"/>
-            </w:r>
-            <w:r>
-              <w:instrText>HYPERLINK "vscode-file://vscode-app/d:/apps/Microsoft%20VS%20Code/07ff9d6178/resources/app/out/vs/code/electron-browser/workbench/workbench.html" \o ""</w:instrText>
-            </w:r>
-            <w:r>
-              <w:fldChar w:fldCharType="separate"/>
-            </w:r>
-            <w:r>
-              <w:rPr>
-                <w:rStyle w:val="Hyperlink"/>
-              </w:rPr>
-              <w:t>hasAnyRoleOrGroup</w:t>
-            </w:r>
-            <w:proofErr w:type="spellEnd"/>
-            <w:r>
-              <w:rPr>
-                <w:rStyle w:val="Hyperlink"/>
-              </w:rPr>
-              <w:t>()</w:t>
-            </w:r>
-            <w:r>
-              <w:fldChar w:fldCharType="end"/>
-            </w:r>
-            <w:r>
-              <w:t> instead of </w:t>
-            </w:r>
-            <w:proofErr w:type="spellStart"/>
-            <w:r>
-              <w:t>hasAnyRole</w:t>
-            </w:r>
-            <w:proofErr w:type="spellEnd"/>
-            <w:r>
-              <w:t>()</w:t>
+            <w:hyperlink r:id="rId63" w:history="1">
+              <w:r>
+                <w:rPr>
+                  <w:rStyle w:val="Hyperlink"/>
+                </w:rPr>
+                <w:t>hasAnyRoleOrGroup()</w:t>
+              </w:r>
+            </w:hyperlink>
+            <w:r>
+              <w:t> instead of hasAnyRole()</w:t>
             </w:r>
           </w:p>
         </w:tc>
@@ -12594,7 +12053,7 @@
             <w:hideMark/>
           </w:tcPr>
           <w:p>
-            <w:hyperlink r:id="rId48" w:history="1">
+            <w:hyperlink r:id="rId64" w:history="1">
               <w:r>
                 <w:rPr>
                   <w:rStyle w:val="Hyperlink"/>
@@ -12625,32 +12084,14 @@
             <w:r>
               <w:t>Nav visibility uses </w:t>
             </w:r>
-            <w:proofErr w:type="spellStart"/>
-            <w:r>
-              <w:fldChar w:fldCharType="begin"/>
-            </w:r>
-            <w:r>
-              <w:instrText>HYPERLINK "vscode-file://vscode-app/d:/apps/Microsoft%20VS%20Code/07ff9d6178/resources/app/out/vs/code/electron-browser/workbench/workbench.html" \o ""</w:instrText>
-            </w:r>
-            <w:r>
-              <w:fldChar w:fldCharType="separate"/>
-            </w:r>
-            <w:r>
-              <w:rPr>
-                <w:rStyle w:val="Hyperlink"/>
-              </w:rPr>
-              <w:t>hasAnyRoleOrGroup</w:t>
-            </w:r>
-            <w:proofErr w:type="spellEnd"/>
-            <w:r>
-              <w:rPr>
-                <w:rStyle w:val="Hyperlink"/>
-              </w:rPr>
-              <w:t>()</w:t>
-            </w:r>
-            <w:r>
-              <w:fldChar w:fldCharType="end"/>
-            </w:r>
+            <w:hyperlink r:id="rId65" w:history="1">
+              <w:r>
+                <w:rPr>
+                  <w:rStyle w:val="Hyperlink"/>
+                </w:rPr>
+                <w:t>hasAnyRoleOrGroup()</w:t>
+              </w:r>
+            </w:hyperlink>
           </w:p>
         </w:tc>
       </w:tr>
@@ -12676,29 +12117,13 @@
             <w:hideMark/>
           </w:tcPr>
           <w:p>
-            <w:hyperlink r:id="rId49" w:history="1">
+            <w:hyperlink r:id="rId66" w:history="1">
               <w:r>
                 <w:rPr>
                   <w:rStyle w:val="Hyperlink"/>
                 </w:rPr>
-                <w:t>comment-thread-</w:t>
+                <w:t>comment-thread-panel.component.ts</w:t>
               </w:r>
-              <w:proofErr w:type="spellStart"/>
-              <w:proofErr w:type="gramStart"/>
-              <w:r>
-                <w:rPr>
-                  <w:rStyle w:val="Hyperlink"/>
-                </w:rPr>
-                <w:t>panel.component</w:t>
-              </w:r>
-              <w:proofErr w:type="gramEnd"/>
-              <w:r>
-                <w:rPr>
-                  <w:rStyle w:val="Hyperlink"/>
-                </w:rPr>
-                <w:t>.ts</w:t>
-              </w:r>
-              <w:proofErr w:type="spellEnd"/>
             </w:hyperlink>
           </w:p>
         </w:tc>
@@ -12721,68 +12146,36 @@
             <w:hideMark/>
           </w:tcPr>
           <w:p>
-            <w:hyperlink r:id="rId50" w:history="1">
-              <w:proofErr w:type="spellStart"/>
+            <w:hyperlink r:id="rId67" w:history="1">
               <w:r>
                 <w:rPr>
                   <w:rStyle w:val="Hyperlink"/>
                 </w:rPr>
                 <w:t>canWrite</w:t>
               </w:r>
-              <w:proofErr w:type="spellEnd"/>
             </w:hyperlink>
             <w:r>
               <w:t>/</w:t>
             </w:r>
-            <w:proofErr w:type="spellStart"/>
-            <w:r>
-              <w:fldChar w:fldCharType="begin"/>
-            </w:r>
-            <w:r>
-              <w:instrText>HYPERLINK "vscode-file://vscode-app/d:/apps/Microsoft%20VS%20Code/07ff9d6178/resources/app/out/vs/code/electron-browser/workbench/workbench.html" \o ""</w:instrText>
-            </w:r>
-            <w:r>
-              <w:fldChar w:fldCharType="separate"/>
-            </w:r>
-            <w:r>
-              <w:rPr>
-                <w:rStyle w:val="Hyperlink"/>
-              </w:rPr>
-              <w:t>isAdmin</w:t>
-            </w:r>
-            <w:proofErr w:type="spellEnd"/>
-            <w:r>
-              <w:fldChar w:fldCharType="end"/>
-            </w:r>
+            <w:hyperlink r:id="rId68" w:history="1">
+              <w:r>
+                <w:rPr>
+                  <w:rStyle w:val="Hyperlink"/>
+                </w:rPr>
+                <w:t>isAdmin</w:t>
+              </w:r>
+            </w:hyperlink>
             <w:r>
               <w:t> use </w:t>
             </w:r>
-            <w:proofErr w:type="spellStart"/>
-            <w:r>
-              <w:fldChar w:fldCharType="begin"/>
-            </w:r>
-            <w:r>
-              <w:instrText>HYPERLINK "vscode-file://vscode-app/d:/apps/Microsoft%20VS%20Code/07ff9d6178/resources/app/out/vs/code/electron-browser/workbench/workbench.html" \o ""</w:instrText>
-            </w:r>
-            <w:r>
-              <w:fldChar w:fldCharType="separate"/>
-            </w:r>
-            <w:r>
-              <w:rPr>
-                <w:rStyle w:val="Hyperlink"/>
-              </w:rPr>
-              <w:t>hasAnyRoleOrGroup</w:t>
-            </w:r>
-            <w:proofErr w:type="spellEnd"/>
-            <w:r>
-              <w:rPr>
-                <w:rStyle w:val="Hyperlink"/>
-              </w:rPr>
-              <w:t>()</w:t>
-            </w:r>
-            <w:r>
-              <w:fldChar w:fldCharType="end"/>
-            </w:r>
+            <w:hyperlink r:id="rId69" w:history="1">
+              <w:r>
+                <w:rPr>
+                  <w:rStyle w:val="Hyperlink"/>
+                </w:rPr>
+                <w:t>hasAnyRoleOrGroup()</w:t>
+              </w:r>
+            </w:hyperlink>
           </w:p>
         </w:tc>
       </w:tr>
@@ -12792,9 +12185,11 @@
       <w:pPr>
         <w:pStyle w:val="Heading1"/>
       </w:pPr>
+      <w:bookmarkStart w:id="40" w:name="_Toc225694794"/>
       <w:r>
         <w:t>7. Mock Authentication and Authorization</w:t>
       </w:r>
+      <w:bookmarkEnd w:id="40"/>
     </w:p>
     <w:p>
       <w:r>
@@ -18566,6 +17961,7 @@
   <w:style w:type="character" w:default="1" w:styleId="DefaultParagraphFont">
     <w:name w:val="Default Paragraph Font"/>
     <w:uiPriority w:val="1"/>
+    <w:semiHidden/>
     <w:unhideWhenUsed/>
   </w:style>
   <w:style w:type="table" w:default="1" w:styleId="TableNormal">

</xml_diff>

<commit_message>
E2e - Increase wait time (factor) for async calls
</commit_message>
<xml_diff>
--- a/docs/poc_notes.docx
+++ b/docs/poc_notes.docx
@@ -3571,8 +3571,13 @@
         </w:numPr>
       </w:pPr>
       <w:r>
-        <w:t>Name: poc-bff</w:t>
-      </w:r>
+        <w:t xml:space="preserve">Name: </w:t>
+      </w:r>
+      <w:proofErr w:type="spellStart"/>
+      <w:r>
+        <w:t>poc-bff</w:t>
+      </w:r>
+      <w:proofErr w:type="spellEnd"/>
     </w:p>
     <w:p>
       <w:pPr>
@@ -3696,7 +3701,15 @@
         </w:numPr>
       </w:pPr>
       <w:r>
-        <w:t>App registrations → poc-bff →</w:t>
+        <w:t xml:space="preserve">App registrations → </w:t>
+      </w:r>
+      <w:proofErr w:type="spellStart"/>
+      <w:r>
+        <w:t>poc-bff</w:t>
+      </w:r>
+      <w:proofErr w:type="spellEnd"/>
+      <w:r>
+        <w:t xml:space="preserve"> →</w:t>
       </w:r>
       <w:r>
         <w:t xml:space="preserve"> </w:t>
@@ -3808,7 +3821,15 @@
         </w:numPr>
       </w:pPr>
       <w:r>
-        <w:t xml:space="preserve">App registrations → poc-bff → </w:t>
+        <w:t xml:space="preserve">App registrations → </w:t>
+      </w:r>
+      <w:proofErr w:type="spellStart"/>
+      <w:r>
+        <w:t>poc-bff</w:t>
+      </w:r>
+      <w:proofErr w:type="spellEnd"/>
+      <w:r>
+        <w:t xml:space="preserve"> → </w:t>
       </w:r>
       <w:r>
         <w:rPr>
@@ -3887,7 +3908,15 @@
         </w:r>
       </w:hyperlink>
       <w:r>
-        <w:t xml:space="preserve">   ?? </w:t>
+        <w:t xml:space="preserve"> </w:t>
+      </w:r>
+      <w:proofErr w:type="gramStart"/>
+      <w:r>
+        <w:t xml:space="preserve">  ??</w:t>
+      </w:r>
+      <w:proofErr w:type="gramEnd"/>
+      <w:r>
+        <w:t xml:space="preserve"> </w:t>
       </w:r>
       <w:r>
         <w:t>The logout URL must start with "HTTPS"</w:t>
@@ -3983,7 +4012,15 @@
         </w:numPr>
       </w:pPr>
       <w:r>
-        <w:t xml:space="preserve">App registrations → poc-bff → </w:t>
+        <w:t xml:space="preserve">App registrations → </w:t>
+      </w:r>
+      <w:proofErr w:type="spellStart"/>
+      <w:r>
+        <w:t>poc-bff</w:t>
+      </w:r>
+      <w:proofErr w:type="spellEnd"/>
+      <w:r>
+        <w:t xml:space="preserve"> → </w:t>
       </w:r>
       <w:r>
         <w:rPr>
@@ -4162,6 +4199,7 @@
       <w:r>
         <w:t xml:space="preserve">Find </w:t>
       </w:r>
+      <w:proofErr w:type="spellStart"/>
       <w:r>
         <w:rPr>
           <w:b/>
@@ -4169,6 +4207,7 @@
         </w:rPr>
         <w:t>poc-bff</w:t>
       </w:r>
+      <w:proofErr w:type="spellEnd"/>
       <w:r>
         <w:t xml:space="preserve"> (this is the service principal created from your app registration)</w:t>
       </w:r>
@@ -4268,7 +4307,11 @@
         <w:t>✅</w:t>
       </w:r>
       <w:r>
-        <w:t xml:space="preserve"> Now Entra will include a </w:t>
+        <w:t xml:space="preserve"> Now Entra will include </w:t>
+      </w:r>
+      <w:proofErr w:type="gramStart"/>
+      <w:r>
+        <w:t xml:space="preserve">a </w:t>
       </w:r>
       <w:r>
         <w:rPr>
@@ -4277,6 +4320,7 @@
         </w:rPr>
         <w:t>roles</w:t>
       </w:r>
+      <w:proofErr w:type="gramEnd"/>
       <w:r>
         <w:t xml:space="preserve"> claim in tokens for these users.</w:t>
       </w:r>
@@ -4328,7 +4372,7 @@
           <v:shape id="_x0000_i1025" type="#_x0000_t75" style="width:75.65pt;height:49.55pt" o:ole="">
             <v:imagedata r:id="rId9" o:title=""/>
           </v:shape>
-          <o:OLEObject Type="Embed" ProgID="Package" ShapeID="_x0000_i1025" DrawAspect="Icon" ObjectID="_1836410110" r:id="rId10"/>
+          <o:OLEObject Type="Embed" ProgID="Package" ShapeID="_x0000_i1025" DrawAspect="Icon" ObjectID="_1836416154" r:id="rId10"/>
         </w:object>
       </w:r>
     </w:p>
@@ -4361,7 +4405,7 @@
           <v:shape id="_x0000_i1026" type="#_x0000_t75" style="width:75.65pt;height:49.55pt" o:ole="">
             <v:imagedata r:id="rId11" o:title=""/>
           </v:shape>
-          <o:OLEObject Type="Embed" ProgID="Package" ShapeID="_x0000_i1026" DrawAspect="Icon" ObjectID="_1836410111" r:id="rId12"/>
+          <o:OLEObject Type="Embed" ProgID="Package" ShapeID="_x0000_i1026" DrawAspect="Icon" ObjectID="_1836416155" r:id="rId12"/>
         </w:object>
       </w:r>
     </w:p>
@@ -4437,7 +4481,7 @@
           <v:shape id="_x0000_i1027" type="#_x0000_t75" style="width:75.65pt;height:49.55pt" o:ole="">
             <v:imagedata r:id="rId14" o:title=""/>
           </v:shape>
-          <o:OLEObject Type="Embed" ProgID="Package" ShapeID="_x0000_i1027" DrawAspect="Icon" ObjectID="_1836410112" r:id="rId15"/>
+          <o:OLEObject Type="Embed" ProgID="Package" ShapeID="_x0000_i1027" DrawAspect="Icon" ObjectID="_1836416156" r:id="rId15"/>
         </w:object>
       </w:r>
     </w:p>
@@ -4513,7 +4557,7 @@
           <v:shape id="_x0000_i1028" type="#_x0000_t75" style="width:75.65pt;height:49.55pt" o:ole="">
             <v:imagedata r:id="rId17" o:title=""/>
           </v:shape>
-          <o:OLEObject Type="Embed" ProgID="Package" ShapeID="_x0000_i1028" DrawAspect="Icon" ObjectID="_1836410113" r:id="rId18"/>
+          <o:OLEObject Type="Embed" ProgID="Package" ShapeID="_x0000_i1028" DrawAspect="Icon" ObjectID="_1836416157" r:id="rId18"/>
         </w:object>
       </w:r>
     </w:p>
@@ -4818,8 +4862,13 @@
           </w:tcPr>
           <w:p>
             <w:r>
-              <w:t>DTOs, RoleConstants</w:t>
-            </w:r>
+              <w:t xml:space="preserve">DTOs, </w:t>
+            </w:r>
+            <w:proofErr w:type="spellStart"/>
+            <w:r>
+              <w:t>RoleConstants</w:t>
+            </w:r>
+            <w:proofErr w:type="spellEnd"/>
           </w:p>
         </w:tc>
       </w:tr>
@@ -4879,9 +4928,19 @@
             <w:hideMark/>
           </w:tcPr>
           <w:p>
-            <w:r>
-              <w:t>SecurityConfig with oauth2Login, CSRF cookie, authority mapper, application.yml</w:t>
-            </w:r>
+            <w:proofErr w:type="spellStart"/>
+            <w:r>
+              <w:t>SecurityConfig</w:t>
+            </w:r>
+            <w:proofErr w:type="spellEnd"/>
+            <w:r>
+              <w:t> with oauth2Login, CSRF cookie, authority mapper, </w:t>
+            </w:r>
+            <w:proofErr w:type="spellStart"/>
+            <w:r>
+              <w:t>application.yml</w:t>
+            </w:r>
+            <w:proofErr w:type="spellEnd"/>
           </w:p>
         </w:tc>
       </w:tr>
@@ -4923,7 +4982,15 @@
           </w:tcPr>
           <w:p>
             <w:r>
-              <w:t>/api/me endpoint</w:t>
+              <w:t>/</w:t>
+            </w:r>
+            <w:proofErr w:type="spellStart"/>
+            <w:r>
+              <w:t>api</w:t>
+            </w:r>
+            <w:proofErr w:type="spellEnd"/>
+            <w:r>
+              <w:t>/me endpoint</w:t>
             </w:r>
           </w:p>
         </w:tc>
@@ -5004,7 +5071,20 @@
           </w:tcPr>
           <w:p>
             <w:r>
-              <w:t>ng new, proxy.conf.json → localhost:</w:t>
+              <w:t xml:space="preserve">ng new, </w:t>
+            </w:r>
+            <w:proofErr w:type="spellStart"/>
+            <w:r>
+              <w:t>proxy.</w:t>
+            </w:r>
+            <w:proofErr w:type="gramStart"/>
+            <w:r>
+              <w:t>conf.json</w:t>
+            </w:r>
+            <w:proofErr w:type="spellEnd"/>
+            <w:proofErr w:type="gramEnd"/>
+            <w:r>
+              <w:t xml:space="preserve"> → localhost:</w:t>
             </w:r>
             <w:r>
               <w:t>1</w:t>
@@ -5134,7 +5214,15 @@
           </w:tcPr>
           <w:p>
             <w:r>
-              <w:t>GET /api/me, cache result, route guards</w:t>
+              <w:t>GET /</w:t>
+            </w:r>
+            <w:proofErr w:type="spellStart"/>
+            <w:r>
+              <w:t>api</w:t>
+            </w:r>
+            <w:proofErr w:type="spellEnd"/>
+            <w:r>
+              <w:t>/me, cache result, route guards</w:t>
             </w:r>
           </w:p>
         </w:tc>
@@ -5554,7 +5642,15 @@
           </w:tcPr>
           <w:p>
             <w:r>
-              <w:t>Sees "User Mgmt"</w:t>
+              <w:t xml:space="preserve">Sees "User </w:t>
+            </w:r>
+            <w:proofErr w:type="spellStart"/>
+            <w:r>
+              <w:t>Mgmt</w:t>
+            </w:r>
+            <w:proofErr w:type="spellEnd"/>
+            <w:r>
+              <w:t>"</w:t>
             </w:r>
           </w:p>
         </w:tc>
@@ -5612,9 +5708,11 @@
             <w:hideMark/>
           </w:tcPr>
           <w:p>
+            <w:proofErr w:type="spellStart"/>
             <w:r>
               <w:t>admin@yourtenant</w:t>
             </w:r>
+            <w:proofErr w:type="spellEnd"/>
           </w:p>
         </w:tc>
         <w:tc>
@@ -5709,9 +5807,11 @@
             <w:hideMark/>
           </w:tcPr>
           <w:p>
+            <w:proofErr w:type="spellStart"/>
             <w:r>
               <w:t>admin-rw@yourtenant</w:t>
             </w:r>
+            <w:proofErr w:type="spellEnd"/>
           </w:p>
         </w:tc>
         <w:tc>
@@ -5806,9 +5906,11 @@
             <w:hideMark/>
           </w:tcPr>
           <w:p>
+            <w:proofErr w:type="spellStart"/>
             <w:r>
               <w:t>reader@yourtenant</w:t>
             </w:r>
+            <w:proofErr w:type="spellEnd"/>
           </w:p>
         </w:tc>
         <w:tc>
@@ -5903,10 +6005,12 @@
             <w:hideMark/>
           </w:tcPr>
           <w:p>
+            <w:proofErr w:type="spellStart"/>
             <w:r>
               <w:lastRenderedPageBreak/>
               <w:t>writer@yourtenant</w:t>
             </w:r>
+            <w:proofErr w:type="spellEnd"/>
           </w:p>
         </w:tc>
         <w:tc>
@@ -6001,9 +6105,11 @@
             <w:hideMark/>
           </w:tcPr>
           <w:p>
+            <w:proofErr w:type="spellStart"/>
             <w:r>
               <w:t>reader-writer@yourtenant</w:t>
             </w:r>
+            <w:proofErr w:type="spellEnd"/>
           </w:p>
         </w:tc>
         <w:tc>
@@ -6258,8 +6364,13 @@
         </w:numPr>
       </w:pPr>
       <w:r>
-        <w:t>leap-frontedn</w:t>
-      </w:r>
+        <w:t>leap-</w:t>
+      </w:r>
+      <w:proofErr w:type="spellStart"/>
+      <w:r>
+        <w:t>frontedn</w:t>
+      </w:r>
+      <w:proofErr w:type="spellEnd"/>
     </w:p>
     <w:p>
       <w:pPr>
@@ -6409,9 +6520,27 @@
             <w:hideMark/>
           </w:tcPr>
           <w:p>
-            <w:r>
-              <w:t>UserInfoDto, BudgetRowDto, RoleConstants</w:t>
-            </w:r>
+            <w:proofErr w:type="spellStart"/>
+            <w:r>
+              <w:t>UserInfoDto</w:t>
+            </w:r>
+            <w:proofErr w:type="spellEnd"/>
+            <w:r>
+              <w:t>, </w:t>
+            </w:r>
+            <w:proofErr w:type="spellStart"/>
+            <w:r>
+              <w:t>BudgetRowDto</w:t>
+            </w:r>
+            <w:proofErr w:type="spellEnd"/>
+            <w:r>
+              <w:t>, </w:t>
+            </w:r>
+            <w:proofErr w:type="spellStart"/>
+            <w:r>
+              <w:t>RoleConstants</w:t>
+            </w:r>
+            <w:proofErr w:type="spellEnd"/>
           </w:p>
         </w:tc>
       </w:tr>
@@ -6454,7 +6583,15 @@
           </w:tcPr>
           <w:p>
             <w:r>
-              <w:t>GET /api/me — returns user info + mapped roles (or anon)</w:t>
+              <w:t>GET /</w:t>
+            </w:r>
+            <w:proofErr w:type="spellStart"/>
+            <w:r>
+              <w:t>api</w:t>
+            </w:r>
+            <w:proofErr w:type="spellEnd"/>
+            <w:r>
+              <w:t>/me — returns user info + mapped roles (or anon)</w:t>
             </w:r>
           </w:p>
         </w:tc>
@@ -6499,7 +6636,23 @@
           </w:tcPr>
           <w:p>
             <w:r>
-              <w:t>GET /api/budget (APP_READ/WRITE), PUT /api/budget/{id} (APP_WRITE), in-memory repo with 6 seed rows</w:t>
+              <w:t>GET /</w:t>
+            </w:r>
+            <w:proofErr w:type="spellStart"/>
+            <w:r>
+              <w:t>api</w:t>
+            </w:r>
+            <w:proofErr w:type="spellEnd"/>
+            <w:r>
+              <w:t>/budget (APP_READ/WRITE), PUT /</w:t>
+            </w:r>
+            <w:proofErr w:type="spellStart"/>
+            <w:r>
+              <w:t>api</w:t>
+            </w:r>
+            <w:proofErr w:type="spellEnd"/>
+            <w:r>
+              <w:t>/budget/{id} (APP_WRITE), in-memory repo with 6 seed rows</w:t>
             </w:r>
           </w:p>
         </w:tc>
@@ -6542,8 +6695,29 @@
             <w:hideMark/>
           </w:tcPr>
           <w:p>
-            <w:r>
-              <w:t>SecurityConfig — oauth2Login, CSRF cookie, Entra roles→ROLE_APP_* mapper, session-based auth. application.yml reads ENTRA_* env vars</w:t>
+            <w:proofErr w:type="spellStart"/>
+            <w:r>
+              <w:t>SecurityConfig</w:t>
+            </w:r>
+            <w:proofErr w:type="spellEnd"/>
+            <w:r>
+              <w:t xml:space="preserve"> — oauth2Login, CSRF cookie, Entra </w:t>
+            </w:r>
+            <w:proofErr w:type="spellStart"/>
+            <w:r>
+              <w:t>roles→ROLE_APP</w:t>
+            </w:r>
+            <w:proofErr w:type="spellEnd"/>
+            <w:r>
+              <w:t>_* mapper, session-based auth. </w:t>
+            </w:r>
+            <w:proofErr w:type="spellStart"/>
+            <w:r>
+              <w:t>application.yml</w:t>
+            </w:r>
+            <w:proofErr w:type="spellEnd"/>
+            <w:r>
+              <w:t> reads ENTRA_* env vars</w:t>
             </w:r>
           </w:p>
         </w:tc>
@@ -6672,6 +6846,7 @@
             <w:hideMark/>
           </w:tcPr>
           <w:p>
+            <w:proofErr w:type="spellStart"/>
             <w:r>
               <w:rPr>
                 <w:b/>
@@ -6679,6 +6854,7 @@
               </w:rPr>
               <w:t>AuthService</w:t>
             </w:r>
+            <w:proofErr w:type="spellEnd"/>
           </w:p>
         </w:tc>
         <w:tc>
@@ -6696,7 +6872,52 @@
           </w:tcPr>
           <w:p>
             <w:r>
-              <w:t>Calls /api/me on init, caches user, exposes hasRole(), login(), logout()</w:t>
+              <w:t>Calls /</w:t>
+            </w:r>
+            <w:proofErr w:type="spellStart"/>
+            <w:r>
+              <w:t>api</w:t>
+            </w:r>
+            <w:proofErr w:type="spellEnd"/>
+            <w:r>
+              <w:t xml:space="preserve">/me on </w:t>
+            </w:r>
+            <w:proofErr w:type="spellStart"/>
+            <w:r>
+              <w:t>init</w:t>
+            </w:r>
+            <w:proofErr w:type="spellEnd"/>
+            <w:r>
+              <w:t>, caches user, exposes </w:t>
+            </w:r>
+            <w:proofErr w:type="spellStart"/>
+            <w:proofErr w:type="gramStart"/>
+            <w:r>
+              <w:t>hasRole</w:t>
+            </w:r>
+            <w:proofErr w:type="spellEnd"/>
+            <w:r>
+              <w:t>(</w:t>
+            </w:r>
+            <w:proofErr w:type="gramEnd"/>
+            <w:r>
+              <w:t>), </w:t>
+            </w:r>
+            <w:proofErr w:type="gramStart"/>
+            <w:r>
+              <w:t>login(</w:t>
+            </w:r>
+            <w:proofErr w:type="gramEnd"/>
+            <w:r>
+              <w:t>), </w:t>
+            </w:r>
+            <w:proofErr w:type="gramStart"/>
+            <w:r>
+              <w:t>logout(</w:t>
+            </w:r>
+            <w:proofErr w:type="gramEnd"/>
+            <w:r>
+              <w:t>)</w:t>
             </w:r>
           </w:p>
         </w:tc>
@@ -6716,6 +6937,7 @@
             <w:hideMark/>
           </w:tcPr>
           <w:p>
+            <w:proofErr w:type="spellStart"/>
             <w:r>
               <w:rPr>
                 <w:b/>
@@ -6723,6 +6945,7 @@
               </w:rPr>
               <w:t>csrfInterceptor</w:t>
             </w:r>
+            <w:proofErr w:type="spellEnd"/>
           </w:p>
         </w:tc>
         <w:tc>
@@ -6760,6 +6983,7 @@
             <w:hideMark/>
           </w:tcPr>
           <w:p>
+            <w:proofErr w:type="spellStart"/>
             <w:r>
               <w:rPr>
                 <w:b/>
@@ -6767,6 +6991,7 @@
               </w:rPr>
               <w:t>roleGuard</w:t>
             </w:r>
+            <w:proofErr w:type="spellEnd"/>
           </w:p>
         </w:tc>
         <w:tc>
@@ -6786,14 +7011,32 @@
             <w:r>
               <w:t>Route guard factory: </w:t>
             </w:r>
-            <w:hyperlink r:id="rId20" w:history="1">
-              <w:r>
-                <w:rPr>
-                  <w:rStyle w:val="Hyperlink"/>
-                </w:rPr>
-                <w:t>roleGuard('APP_READ', 'APP_WRITE')</w:t>
-              </w:r>
-            </w:hyperlink>
+            <w:proofErr w:type="spellStart"/>
+            <w:r>
+              <w:fldChar w:fldCharType="begin"/>
+            </w:r>
+            <w:r>
+              <w:instrText>HYPERLINK "vscode-file://vscode-app/d:/apps/Microsoft%20VS%20Code/072586267e/resources/app/out/vs/code/electron-browser/workbench/workbench.html" \o ""</w:instrText>
+            </w:r>
+            <w:r>
+              <w:fldChar w:fldCharType="separate"/>
+            </w:r>
+            <w:r>
+              <w:rPr>
+                <w:rStyle w:val="Hyperlink"/>
+              </w:rPr>
+              <w:t>roleGuard</w:t>
+            </w:r>
+            <w:proofErr w:type="spellEnd"/>
+            <w:r>
+              <w:rPr>
+                <w:rStyle w:val="Hyperlink"/>
+              </w:rPr>
+              <w:t>('APP_READ', 'APP_WRITE')</w:t>
+            </w:r>
+            <w:r>
+              <w:fldChar w:fldCharType="end"/>
+            </w:r>
           </w:p>
         </w:tc>
       </w:tr>
@@ -6812,6 +7055,7 @@
             <w:hideMark/>
           </w:tcPr>
           <w:p>
+            <w:proofErr w:type="spellStart"/>
             <w:r>
               <w:rPr>
                 <w:b/>
@@ -6819,6 +7063,7 @@
               </w:rPr>
               <w:t>HeaderComponent</w:t>
             </w:r>
+            <w:proofErr w:type="spellEnd"/>
           </w:p>
         </w:tc>
         <w:tc>
@@ -6856,6 +7101,7 @@
             <w:hideMark/>
           </w:tcPr>
           <w:p>
+            <w:proofErr w:type="spellStart"/>
             <w:r>
               <w:rPr>
                 <w:b/>
@@ -6863,6 +7109,7 @@
               </w:rPr>
               <w:t>WelcomeComponent</w:t>
             </w:r>
+            <w:proofErr w:type="spellEnd"/>
           </w:p>
         </w:tc>
         <w:tc>
@@ -6900,6 +7147,7 @@
             <w:hideMark/>
           </w:tcPr>
           <w:p>
+            <w:proofErr w:type="spellStart"/>
             <w:r>
               <w:rPr>
                 <w:b/>
@@ -6907,6 +7155,7 @@
               </w:rPr>
               <w:t>UserManagementComponent</w:t>
             </w:r>
+            <w:proofErr w:type="spellEnd"/>
           </w:p>
         </w:tc>
         <w:tc>
@@ -6944,6 +7193,7 @@
             <w:hideMark/>
           </w:tcPr>
           <w:p>
+            <w:proofErr w:type="spellStart"/>
             <w:r>
               <w:rPr>
                 <w:b/>
@@ -6951,6 +7201,7 @@
               </w:rPr>
               <w:t>BudgetReportComponent</w:t>
             </w:r>
+            <w:proofErr w:type="spellEnd"/>
           </w:p>
         </w:tc>
         <w:tc>
@@ -6988,13 +7239,24 @@
             <w:hideMark/>
           </w:tcPr>
           <w:p>
+            <w:proofErr w:type="spellStart"/>
             <w:r>
               <w:rPr>
                 <w:b/>
                 <w:bCs/>
               </w:rPr>
-              <w:t>proxy.conf.json</w:t>
-            </w:r>
+              <w:t>proxy.</w:t>
+            </w:r>
+            <w:proofErr w:type="gramStart"/>
+            <w:r>
+              <w:rPr>
+                <w:b/>
+                <w:bCs/>
+              </w:rPr>
+              <w:t>conf.json</w:t>
+            </w:r>
+            <w:proofErr w:type="spellEnd"/>
+            <w:proofErr w:type="gramEnd"/>
           </w:p>
         </w:tc>
         <w:tc>
@@ -7012,7 +7274,15 @@
           </w:tcPr>
           <w:p>
             <w:r>
-              <w:t xml:space="preserve">Proxies /api, /oauth2, /login, /logout → port </w:t>
+              <w:t>Proxies /</w:t>
+            </w:r>
+            <w:proofErr w:type="spellStart"/>
+            <w:r>
+              <w:t>api</w:t>
+            </w:r>
+            <w:proofErr w:type="spellEnd"/>
+            <w:r>
+              <w:t xml:space="preserve">, /oauth2, /login, /logout → port </w:t>
             </w:r>
             <w:r>
               <w:t>1</w:t>
@@ -7065,7 +7335,28 @@
         <w:t>Backend:</w:t>
       </w:r>
       <w:r>
-        <w:t xml:space="preserve"> mvn spring-boot:run -pl leap-app (port </w:t>
+        <w:t> </w:t>
+      </w:r>
+      <w:proofErr w:type="spellStart"/>
+      <w:r>
+        <w:t>mvn</w:t>
+      </w:r>
+      <w:proofErr w:type="spellEnd"/>
+      <w:r>
+        <w:t xml:space="preserve"> </w:t>
+      </w:r>
+      <w:proofErr w:type="spellStart"/>
+      <w:r>
+        <w:t>spring-</w:t>
+      </w:r>
+      <w:proofErr w:type="gramStart"/>
+      <w:r>
+        <w:t>boot:run</w:t>
+      </w:r>
+      <w:proofErr w:type="spellEnd"/>
+      <w:proofErr w:type="gramEnd"/>
+      <w:r>
+        <w:t xml:space="preserve"> -pl leap-app (port </w:t>
       </w:r>
       <w:r>
         <w:t>1</w:t>
@@ -7089,7 +7380,15 @@
         <w:t>Frontend:</w:t>
       </w:r>
       <w:r>
-        <w:t> cd leap-frontend &amp;&amp; npm start (port 4200)</w:t>
+        <w:t xml:space="preserve"> cd leap-frontend &amp;&amp; </w:t>
+      </w:r>
+      <w:proofErr w:type="spellStart"/>
+      <w:r>
+        <w:t>npm</w:t>
+      </w:r>
+      <w:proofErr w:type="spellEnd"/>
+      <w:r>
+        <w:t xml:space="preserve"> start (port 4200)</w:t>
       </w:r>
     </w:p>
     <w:p>
@@ -7214,6 +7513,7 @@
       <w:r>
         <w:t>se Spring Security's </w:t>
       </w:r>
+      <w:proofErr w:type="spellStart"/>
       <w:r>
         <w:rPr>
           <w:b/>
@@ -7221,6 +7521,7 @@
         </w:rPr>
         <w:t>OidcClientInitiatedLogoutSuccessHandler</w:t>
       </w:r>
+      <w:proofErr w:type="spellEnd"/>
       <w:r>
         <w:t> which</w:t>
       </w:r>
@@ -7261,7 +7562,21 @@
         <w:rPr>
           <w:bCs/>
         </w:rPr>
-        <w:t>Redirects the browser to Entra's end_session_endpoint (https://login.microsoftonline.com/{tenant}/oauth2/v2.0/logout)</w:t>
+        <w:t xml:space="preserve">Redirects the browser to Entra's </w:t>
+      </w:r>
+      <w:proofErr w:type="spellStart"/>
+      <w:r>
+        <w:rPr>
+          <w:bCs/>
+        </w:rPr>
+        <w:t>end_session_endpoint</w:t>
+      </w:r>
+      <w:proofErr w:type="spellEnd"/>
+      <w:r>
+        <w:rPr>
+          <w:bCs/>
+        </w:rPr>
+        <w:t xml:space="preserve"> (https://login.microsoftonline.com/{tenant}/oauth2/v2.0/logout)</w:t>
       </w:r>
     </w:p>
     <w:p>
@@ -7299,7 +7614,7 @@
         </w:rPr>
         <w:t xml:space="preserve">Entra redirects back to </w:t>
       </w:r>
-      <w:hyperlink r:id="rId21" w:history="1">
+      <w:hyperlink r:id="rId20" w:history="1">
         <w:r>
           <w:rPr>
             <w:rStyle w:val="Hyperlink"/>
@@ -7321,8 +7636,17 @@
           <w:b/>
           <w:bCs/>
         </w:rPr>
-        <w:t>(Below is already done at the beginning) :</w:t>
-      </w:r>
+        <w:t>(Below is already done at the beginning</w:t>
+      </w:r>
+      <w:proofErr w:type="gramStart"/>
+      <w:r>
+        <w:rPr>
+          <w:b/>
+          <w:bCs/>
+        </w:rPr>
+        <w:t>) :</w:t>
+      </w:r>
+      <w:proofErr w:type="gramEnd"/>
     </w:p>
     <w:p>
       <w:pPr>
@@ -7385,7 +7709,21 @@
           <w:bCs/>
         </w:rPr>
         <w:lastRenderedPageBreak/>
-        <w:t>Azure Portal → App Registrations → "poc-bff" → Authentication</w:t>
+        <w:t>Azure Portal → App Registrations → "</w:t>
+      </w:r>
+      <w:proofErr w:type="spellStart"/>
+      <w:r>
+        <w:rPr>
+          <w:bCs/>
+        </w:rPr>
+        <w:t>poc-bff</w:t>
+      </w:r>
+      <w:proofErr w:type="spellEnd"/>
+      <w:r>
+        <w:rPr>
+          <w:bCs/>
+        </w:rPr>
+        <w:t>" → Authentication</w:t>
       </w:r>
     </w:p>
     <w:p>
@@ -7456,7 +7794,41 @@
     </w:p>
     <w:p>
       <w:r>
-        <w:t>The principal.getAuthorities() only has OIDC_USER, SCOPE_email, SCOPE_openid, SCOPE_profile. No roles are being mapped.</w:t>
+        <w:t xml:space="preserve">The </w:t>
+      </w:r>
+      <w:proofErr w:type="spellStart"/>
+      <w:proofErr w:type="gramStart"/>
+      <w:r>
+        <w:t>principal.getAuthorities</w:t>
+      </w:r>
+      <w:proofErr w:type="spellEnd"/>
+      <w:proofErr w:type="gramEnd"/>
+      <w:r>
+        <w:t xml:space="preserve">() only has OIDC_USER, </w:t>
+      </w:r>
+      <w:proofErr w:type="spellStart"/>
+      <w:r>
+        <w:t>SCOPE_email</w:t>
+      </w:r>
+      <w:proofErr w:type="spellEnd"/>
+      <w:r>
+        <w:t xml:space="preserve">, </w:t>
+      </w:r>
+      <w:proofErr w:type="spellStart"/>
+      <w:r>
+        <w:t>SCOPE_openid</w:t>
+      </w:r>
+      <w:proofErr w:type="spellEnd"/>
+      <w:r>
+        <w:t xml:space="preserve">, </w:t>
+      </w:r>
+      <w:proofErr w:type="spellStart"/>
+      <w:r>
+        <w:t>SCOPE_profile</w:t>
+      </w:r>
+      <w:proofErr w:type="spellEnd"/>
+      <w:r>
+        <w:t>. No roles are being mapped.</w:t>
       </w:r>
     </w:p>
     <w:p>
@@ -7483,20 +7855,68 @@
     </w:p>
     <w:p>
       <w:r>
-        <w:t>The old GrantedAuthoritiesMapper read roles from </w:t>
-      </w:r>
-      <w:hyperlink r:id="rId22" w:history="1">
-        <w:r>
-          <w:rPr>
-            <w:rStyle w:val="Hyperlink"/>
-          </w:rPr>
-          <w:t>oidcUserAuthority.getIdToken().getClaims()</w:t>
-        </w:r>
-      </w:hyperlink>
-      <w:r>
-        <w:t>. But Spring Security's OidcIdToken doesn't always expose non-standard claims (like Entra's </w:t>
-      </w:r>
-      <w:hyperlink r:id="rId23" w:history="1">
+        <w:t>The old </w:t>
+      </w:r>
+      <w:proofErr w:type="spellStart"/>
+      <w:r>
+        <w:t>GrantedAuthoritiesMapper</w:t>
+      </w:r>
+      <w:proofErr w:type="spellEnd"/>
+      <w:r>
+        <w:t> read roles from </w:t>
+      </w:r>
+      <w:proofErr w:type="spellStart"/>
+      <w:r>
+        <w:fldChar w:fldCharType="begin"/>
+      </w:r>
+      <w:r>
+        <w:instrText>HYPERLINK "vscode-file://vscode-app/d:/apps/Microsoft%20VS%20Code/072586267e/resources/app/out/vs/code/electron-browser/workbench/workbench.html" \o ""</w:instrText>
+      </w:r>
+      <w:r>
+        <w:fldChar w:fldCharType="separate"/>
+      </w:r>
+      <w:r>
+        <w:rPr>
+          <w:rStyle w:val="Hyperlink"/>
+        </w:rPr>
+        <w:t>oidcUserAuthority.getIdToken</w:t>
+      </w:r>
+      <w:proofErr w:type="spellEnd"/>
+      <w:r>
+        <w:rPr>
+          <w:rStyle w:val="Hyperlink"/>
+        </w:rPr>
+        <w:t>().</w:t>
+      </w:r>
+      <w:proofErr w:type="spellStart"/>
+      <w:r>
+        <w:rPr>
+          <w:rStyle w:val="Hyperlink"/>
+        </w:rPr>
+        <w:t>getClaims</w:t>
+      </w:r>
+      <w:proofErr w:type="spellEnd"/>
+      <w:r>
+        <w:rPr>
+          <w:rStyle w:val="Hyperlink"/>
+        </w:rPr>
+        <w:t>()</w:t>
+      </w:r>
+      <w:r>
+        <w:fldChar w:fldCharType="end"/>
+      </w:r>
+      <w:r>
+        <w:t>. But Spring Security's </w:t>
+      </w:r>
+      <w:proofErr w:type="spellStart"/>
+      <w:r>
+        <w:t>OidcIdToken</w:t>
+      </w:r>
+      <w:proofErr w:type="spellEnd"/>
+      <w:r>
+        <w:t> doesn't always expose non-standard claims (like Entra's </w:t>
+      </w:r>
+      <w:hyperlink r:id="rId21" w:history="1">
         <w:r>
           <w:rPr>
             <w:rStyle w:val="Hyperlink"/>
@@ -7513,82 +7933,178 @@
       <w:r>
         <w:t xml:space="preserve"> confirmed </w:t>
       </w:r>
-      <w:hyperlink r:id="rId24" w:history="1">
+      <w:proofErr w:type="spellStart"/>
+      <w:r>
+        <w:fldChar w:fldCharType="begin"/>
+      </w:r>
+      <w:r>
+        <w:instrText>HYPERLINK "vscode-file://vscode-app/d:/apps/Microsoft%20VS%20Code/072586267e/resources/app/out/vs/code/electron-browser/workbench/workbench.html" \o ""</w:instrText>
+      </w:r>
+      <w:r>
+        <w:fldChar w:fldCharType="separate"/>
+      </w:r>
+      <w:r>
+        <w:rPr>
+          <w:rStyle w:val="Hyperlink"/>
+        </w:rPr>
+        <w:t>principal.getAttribute</w:t>
+      </w:r>
+      <w:proofErr w:type="spellEnd"/>
+      <w:r>
+        <w:rPr>
+          <w:rStyle w:val="Hyperlink"/>
+        </w:rPr>
+        <w:t>("roles")</w:t>
+      </w:r>
+      <w:r>
+        <w:fldChar w:fldCharType="end"/>
+      </w:r>
+      <w:r>
+        <w:t> works — that reads from </w:t>
+      </w:r>
+      <w:proofErr w:type="spellStart"/>
+      <w:r>
+        <w:fldChar w:fldCharType="begin"/>
+      </w:r>
+      <w:r>
+        <w:instrText>HYPERLINK "vscode-file://vscode-app/d:/apps/Microsoft%20VS%20Code/072586267e/resources/app/out/vs/code/electron-browser/workbench/workbench.html" \o ""</w:instrText>
+      </w:r>
+      <w:r>
+        <w:fldChar w:fldCharType="separate"/>
+      </w:r>
+      <w:r>
+        <w:rPr>
+          <w:rStyle w:val="Hyperlink"/>
+        </w:rPr>
+        <w:t>OidcUser.getAttributes</w:t>
+      </w:r>
+      <w:proofErr w:type="spellEnd"/>
+      <w:r>
+        <w:rPr>
+          <w:rStyle w:val="Hyperlink"/>
+        </w:rPr>
+        <w:t>()</w:t>
+      </w:r>
+      <w:r>
+        <w:fldChar w:fldCharType="end"/>
+      </w:r>
+      <w:r>
+        <w:t>, which is the merged attribute map.</w:t>
+      </w:r>
+    </w:p>
+    <w:p>
+      <w:pPr>
+        <w:rPr>
+          <w:b/>
+          <w:bCs/>
+        </w:rPr>
+      </w:pPr>
+      <w:r>
+        <w:rPr>
+          <w:b/>
+          <w:bCs/>
+        </w:rPr>
+        <w:t>Solution:</w:t>
+      </w:r>
+    </w:p>
+    <w:p>
+      <w:r>
+        <w:t>Replaced the </w:t>
+      </w:r>
+      <w:proofErr w:type="spellStart"/>
+      <w:r>
+        <w:rPr>
+          <w:b/>
+          <w:bCs/>
+        </w:rPr>
+        <w:t>GrantedAuthoritiesMapper</w:t>
+      </w:r>
+      <w:proofErr w:type="spellEnd"/>
+      <w:r>
+        <w:t> bean with a </w:t>
+      </w:r>
+      <w:r>
+        <w:rPr>
+          <w:b/>
+          <w:bCs/>
+        </w:rPr>
+        <w:t>custom </w:t>
+      </w:r>
+      <w:proofErr w:type="spellStart"/>
+      <w:r>
+        <w:rPr>
+          <w:b/>
+          <w:bCs/>
+        </w:rPr>
+        <w:fldChar w:fldCharType="begin"/>
+      </w:r>
+      <w:r>
+        <w:rPr>
+          <w:b/>
+          <w:bCs/>
+        </w:rPr>
+        <w:instrText>HYPERLINK "vscode-file://vscode-app/d:/apps/Microsoft%20VS%20Code/072586267e/resources/app/out/vs/code/electron-browser/workbench/workbench.html" \o ""</w:instrText>
+      </w:r>
+      <w:r>
+        <w:rPr>
+          <w:b/>
+          <w:bCs/>
+        </w:rPr>
+      </w:r>
+      <w:r>
+        <w:rPr>
+          <w:b/>
+          <w:bCs/>
+        </w:rPr>
+        <w:fldChar w:fldCharType="separate"/>
+      </w:r>
+      <w:r>
+        <w:rPr>
+          <w:rStyle w:val="Hyperlink"/>
+        </w:rPr>
+        <w:t>OidcUserService</w:t>
+      </w:r>
+      <w:proofErr w:type="spellEnd"/>
+      <w:r>
+        <w:fldChar w:fldCharType="end"/>
+      </w:r>
+      <w:r>
+        <w:t> wired into </w:t>
+      </w:r>
+      <w:hyperlink r:id="rId22" w:history="1">
         <w:r>
           <w:rPr>
             <w:rStyle w:val="Hyperlink"/>
           </w:rPr>
-          <w:t>principal.getAttribute("roles")</w:t>
+          <w:t>.oauth2Login().</w:t>
         </w:r>
-      </w:hyperlink>
-      <w:r>
-        <w:t> works — that reads from </w:t>
-      </w:r>
-      <w:hyperlink r:id="rId25" w:history="1">
+        <w:proofErr w:type="spellStart"/>
         <w:r>
           <w:rPr>
             <w:rStyle w:val="Hyperlink"/>
           </w:rPr>
-          <w:t>OidcUser.getAttributes()</w:t>
+          <w:t>userInfoEndpoint</w:t>
         </w:r>
-      </w:hyperlink>
-      <w:r>
-        <w:t>, which is the merged attribute map.</w:t>
-      </w:r>
-    </w:p>
-    <w:p>
-      <w:pPr>
-        <w:rPr>
-          <w:b/>
-          <w:bCs/>
-        </w:rPr>
-      </w:pPr>
-      <w:r>
-        <w:rPr>
-          <w:b/>
-          <w:bCs/>
-        </w:rPr>
-        <w:t>Solution:</w:t>
-      </w:r>
-    </w:p>
-    <w:p>
-      <w:r>
-        <w:t>Replaced the </w:t>
-      </w:r>
-      <w:r>
-        <w:rPr>
-          <w:b/>
-          <w:bCs/>
-        </w:rPr>
-        <w:t>GrantedAuthoritiesMapper</w:t>
-      </w:r>
-      <w:r>
-        <w:t> bean with a </w:t>
-      </w:r>
-      <w:r>
-        <w:rPr>
-          <w:b/>
-          <w:bCs/>
-        </w:rPr>
-        <w:t>custom </w:t>
-      </w:r>
-      <w:hyperlink r:id="rId26" w:history="1">
+        <w:proofErr w:type="spellEnd"/>
         <w:r>
           <w:rPr>
             <w:rStyle w:val="Hyperlink"/>
           </w:rPr>
-          <w:t>OidcUserService</w:t>
+          <w:t>().</w:t>
         </w:r>
-      </w:hyperlink>
-      <w:r>
-        <w:t> wired into </w:t>
-      </w:r>
-      <w:hyperlink r:id="rId27" w:history="1">
+        <w:proofErr w:type="spellStart"/>
         <w:r>
           <w:rPr>
             <w:rStyle w:val="Hyperlink"/>
           </w:rPr>
-          <w:t>.oauth2Login().userInfoEndpoint().oidcUserService(...)</w:t>
+          <w:t>oidcUserService</w:t>
+        </w:r>
+        <w:proofErr w:type="spellEnd"/>
+        <w:r>
+          <w:rPr>
+            <w:rStyle w:val="Hyperlink"/>
+          </w:rPr>
+          <w:t>(...)</w:t>
         </w:r>
       </w:hyperlink>
       <w:r>
@@ -7605,25 +8121,49 @@
       <w:r>
         <w:t>Delegates to the default </w:t>
       </w:r>
-      <w:hyperlink r:id="rId28" w:history="1">
-        <w:r>
-          <w:rPr>
-            <w:rStyle w:val="Hyperlink"/>
-          </w:rPr>
-          <w:t>OidcUserService</w:t>
-        </w:r>
-      </w:hyperlink>
+      <w:proofErr w:type="spellStart"/>
+      <w:r>
+        <w:fldChar w:fldCharType="begin"/>
+      </w:r>
+      <w:r>
+        <w:instrText>HYPERLINK "vscode-file://vscode-app/d:/apps/Microsoft%20VS%20Code/072586267e/resources/app/out/vs/code/electron-browser/workbench/workbench.html" \o ""</w:instrText>
+      </w:r>
+      <w:r>
+        <w:fldChar w:fldCharType="separate"/>
+      </w:r>
+      <w:r>
+        <w:rPr>
+          <w:rStyle w:val="Hyperlink"/>
+        </w:rPr>
+        <w:t>OidcUserService</w:t>
+      </w:r>
+      <w:proofErr w:type="spellEnd"/>
+      <w:r>
+        <w:fldChar w:fldCharType="end"/>
+      </w:r>
       <w:r>
         <w:t> to get the </w:t>
       </w:r>
-      <w:hyperlink r:id="rId29" w:history="1">
-        <w:r>
-          <w:rPr>
-            <w:rStyle w:val="Hyperlink"/>
-          </w:rPr>
-          <w:t>OidcUser</w:t>
-        </w:r>
-      </w:hyperlink>
+      <w:proofErr w:type="spellStart"/>
+      <w:r>
+        <w:fldChar w:fldCharType="begin"/>
+      </w:r>
+      <w:r>
+        <w:instrText>HYPERLINK "vscode-file://vscode-app/d:/apps/Microsoft%20VS%20Code/072586267e/resources/app/out/vs/code/electron-browser/workbench/workbench.html" \o ""</w:instrText>
+      </w:r>
+      <w:r>
+        <w:fldChar w:fldCharType="separate"/>
+      </w:r>
+      <w:r>
+        <w:rPr>
+          <w:rStyle w:val="Hyperlink"/>
+        </w:rPr>
+        <w:t>OidcUser</w:t>
+      </w:r>
+      <w:proofErr w:type="spellEnd"/>
+      <w:r>
+        <w:fldChar w:fldCharType="end"/>
+      </w:r>
     </w:p>
     <w:p>
       <w:pPr>
@@ -7635,14 +8175,32 @@
       <w:r>
         <w:t>Reads </w:t>
       </w:r>
-      <w:hyperlink r:id="rId30" w:history="1">
-        <w:r>
-          <w:rPr>
-            <w:rStyle w:val="Hyperlink"/>
-          </w:rPr>
-          <w:t>oidcUser.getAttribute("roles")</w:t>
-        </w:r>
-      </w:hyperlink>
+      <w:proofErr w:type="spellStart"/>
+      <w:r>
+        <w:fldChar w:fldCharType="begin"/>
+      </w:r>
+      <w:r>
+        <w:instrText>HYPERLINK "vscode-file://vscode-app/d:/apps/Microsoft%20VS%20Code/072586267e/resources/app/out/vs/code/electron-browser/workbench/workbench.html" \o ""</w:instrText>
+      </w:r>
+      <w:r>
+        <w:fldChar w:fldCharType="separate"/>
+      </w:r>
+      <w:r>
+        <w:rPr>
+          <w:rStyle w:val="Hyperlink"/>
+        </w:rPr>
+        <w:t>oidcUser.getAttribute</w:t>
+      </w:r>
+      <w:proofErr w:type="spellEnd"/>
+      <w:r>
+        <w:rPr>
+          <w:rStyle w:val="Hyperlink"/>
+        </w:rPr>
+        <w:t>("roles")</w:t>
+      </w:r>
+      <w:r>
+        <w:fldChar w:fldCharType="end"/>
+      </w:r>
       <w:r>
         <w:t> — exactly where you confirmed the roles exist</w:t>
       </w:r>
@@ -7668,14 +8226,26 @@
       <w:r>
         <w:t>Returns a new </w:t>
       </w:r>
-      <w:hyperlink r:id="rId31" w:history="1">
-        <w:r>
-          <w:rPr>
-            <w:rStyle w:val="Hyperlink"/>
-          </w:rPr>
-          <w:t>DefaultOidcUser</w:t>
-        </w:r>
-      </w:hyperlink>
+      <w:proofErr w:type="spellStart"/>
+      <w:r>
+        <w:fldChar w:fldCharType="begin"/>
+      </w:r>
+      <w:r>
+        <w:instrText>HYPERLINK "vscode-file://vscode-app/d:/apps/Microsoft%20VS%20Code/072586267e/resources/app/out/vs/code/electron-browser/workbench/workbench.html" \o ""</w:instrText>
+      </w:r>
+      <w:r>
+        <w:fldChar w:fldCharType="separate"/>
+      </w:r>
+      <w:r>
+        <w:rPr>
+          <w:rStyle w:val="Hyperlink"/>
+        </w:rPr>
+        <w:t>DefaultOidcUser</w:t>
+      </w:r>
+      <w:proofErr w:type="spellEnd"/>
+      <w:r>
+        <w:fldChar w:fldCharType="end"/>
+      </w:r>
       <w:r>
         <w:t> with the combined authorities</w:t>
       </w:r>
@@ -7715,7 +8285,7 @@
                     </pic:cNvPicPr>
                   </pic:nvPicPr>
                   <pic:blipFill>
-                    <a:blip r:embed="rId32">
+                    <a:blip r:embed="rId23">
                       <a:extLst>
                         <a:ext uri="{28A0092B-C50C-407E-A947-70E740481C1C}">
                           <a14:useLocalDpi xmlns:a14="http://schemas.microsoft.com/office/drawing/2010/main" val="0"/>
@@ -7775,7 +8345,7 @@
                     </pic:cNvPicPr>
                   </pic:nvPicPr>
                   <pic:blipFill>
-                    <a:blip r:embed="rId33">
+                    <a:blip r:embed="rId24">
                       <a:extLst>
                         <a:ext uri="{28A0092B-C50C-407E-A947-70E740481C1C}">
                           <a14:useLocalDpi xmlns:a14="http://schemas.microsoft.com/office/drawing/2010/main" val="0"/>
@@ -7831,7 +8401,7 @@
                     </pic:cNvPicPr>
                   </pic:nvPicPr>
                   <pic:blipFill>
-                    <a:blip r:embed="rId34">
+                    <a:blip r:embed="rId25">
                       <a:extLst>
                         <a:ext uri="{28A0092B-C50C-407E-A947-70E740481C1C}">
                           <a14:useLocalDpi xmlns:a14="http://schemas.microsoft.com/office/drawing/2010/main" val="0"/>
@@ -7955,7 +8525,7 @@
       <w:r>
         <w:t>Azure Portal always triggers MFA because it has built-in Microsoft first-party policies — your custom app doesn't inherit that behavior. Even </w:t>
       </w:r>
-      <w:hyperlink r:id="rId35" w:history="1">
+      <w:hyperlink r:id="rId26" w:history="1">
         <w:r>
           <w:rPr>
             <w:rStyle w:val="Hyperlink"/>
@@ -8044,16 +8614,36 @@
       <w:r>
         <w:t>This tells Entra: "The </w:t>
       </w:r>
-      <w:hyperlink r:id="rId36" w:history="1">
-        <w:r>
-          <w:rPr>
-            <w:rStyle w:val="Hyperlink"/>
-          </w:rPr>
-          <w:t>amr</w:t>
-        </w:r>
-      </w:hyperlink>
-      <w:r>
-        <w:t> (authentication method reference) claim with value mfa is </w:t>
+      <w:proofErr w:type="spellStart"/>
+      <w:r>
+        <w:fldChar w:fldCharType="begin"/>
+      </w:r>
+      <w:r>
+        <w:instrText>HYPERLINK "vscode-file://vscode-app/d:/apps/Microsoft%20VS%20Code/072586267e/resources/app/out/vs/code/electron-browser/workbench/workbench.html" \o ""</w:instrText>
+      </w:r>
+      <w:r>
+        <w:fldChar w:fldCharType="separate"/>
+      </w:r>
+      <w:r>
+        <w:rPr>
+          <w:rStyle w:val="Hyperlink"/>
+        </w:rPr>
+        <w:t>amr</w:t>
+      </w:r>
+      <w:proofErr w:type="spellEnd"/>
+      <w:r>
+        <w:fldChar w:fldCharType="end"/>
+      </w:r>
+      <w:r>
+        <w:t> (authentication method reference) claim with value </w:t>
+      </w:r>
+      <w:proofErr w:type="spellStart"/>
+      <w:r>
+        <w:t>mfa</w:t>
+      </w:r>
+      <w:proofErr w:type="spellEnd"/>
+      <w:r>
+        <w:t> is </w:t>
       </w:r>
       <w:r>
         <w:rPr>
@@ -8086,7 +8676,7 @@
         </w:tabs>
         <w:ind w:left="1276"/>
       </w:pPr>
-      <w:hyperlink r:id="rId37" w:history="1">
+      <w:hyperlink r:id="rId27" w:history="1">
         <w:r>
           <w:rPr>
             <w:rStyle w:val="Hyperlink"/>
@@ -8111,7 +8701,39 @@
         <w:ind w:left="1276"/>
       </w:pPr>
       <w:r>
-        <w:t>claims={"id_token":{"amr":{"essential":true,"values":["mfa"]}}} — demands MFA step-up</w:t>
+        <w:t>claims={"id_token</w:t>
+      </w:r>
+      <w:proofErr w:type="gramStart"/>
+      <w:r>
+        <w:t>":{</w:t>
+      </w:r>
+      <w:proofErr w:type="gramEnd"/>
+      <w:r>
+        <w:t>"amr</w:t>
+      </w:r>
+      <w:proofErr w:type="gramStart"/>
+      <w:r>
+        <w:t>":{</w:t>
+      </w:r>
+      <w:proofErr w:type="gramEnd"/>
+      <w:r>
+        <w:t>"essential</w:t>
+      </w:r>
+      <w:proofErr w:type="gramStart"/>
+      <w:r>
+        <w:t>":true</w:t>
+      </w:r>
+      <w:proofErr w:type="gramEnd"/>
+      <w:r>
+        <w:t>,"values</w:t>
+      </w:r>
+      <w:proofErr w:type="gramStart"/>
+      <w:r>
+        <w:t>":[</w:t>
+      </w:r>
+      <w:proofErr w:type="gramEnd"/>
+      <w:r>
+        <w:t>"mfa"]}}} — demands MFA step-up</w:t>
       </w:r>
     </w:p>
     <w:p>
@@ -8139,7 +8761,7 @@
                     <pic:cNvPicPr/>
                   </pic:nvPicPr>
                   <pic:blipFill>
-                    <a:blip r:embed="rId38"/>
+                    <a:blip r:embed="rId28"/>
                     <a:stretch>
                       <a:fillRect/>
                     </a:stretch>
@@ -8205,7 +8827,15 @@
     </w:p>
     <w:p>
       <w:r>
-        <w:t>Disable Security Defaults → create a Conditional Access policy targeting the poc-bff app that requires MFA on every sign-in. This is the production-grade solution.</w:t>
+        <w:t>Disable Security Defaults → create a Conditional Access policy targeting the </w:t>
+      </w:r>
+      <w:proofErr w:type="spellStart"/>
+      <w:r>
+        <w:t>poc-bff</w:t>
+      </w:r>
+      <w:proofErr w:type="spellEnd"/>
+      <w:r>
+        <w:t> app that requires MFA on every sign-in. This is the production-grade solution.</w:t>
       </w:r>
     </w:p>
     <w:p>
@@ -8247,7 +8877,7 @@
                     </pic:cNvPicPr>
                   </pic:nvPicPr>
                   <pic:blipFill>
-                    <a:blip r:embed="rId39">
+                    <a:blip r:embed="rId29">
                       <a:extLst>
                         <a:ext uri="{28A0092B-C50C-407E-A947-70E740481C1C}">
                           <a14:useLocalDpi xmlns:a14="http://schemas.microsoft.com/office/drawing/2010/main" val="0"/>
@@ -8299,7 +8929,15 @@
         <w:t xml:space="preserve">5.1 </w:t>
       </w:r>
       <w:r>
-        <w:t xml:space="preserve">Phase 0  - </w:t>
+        <w:t xml:space="preserve">Phase </w:t>
+      </w:r>
+      <w:proofErr w:type="gramStart"/>
+      <w:r>
+        <w:t>0  -</w:t>
+      </w:r>
+      <w:proofErr w:type="gramEnd"/>
+      <w:r>
+        <w:t xml:space="preserve"> </w:t>
       </w:r>
       <w:r>
         <w:t>Database Setup</w:t>
@@ -8506,6 +9144,7 @@
       <w:r>
         <w:t xml:space="preserve">Set strong password for </w:t>
       </w:r>
+      <w:proofErr w:type="spellStart"/>
       <w:r>
         <w:rPr>
           <w:b/>
@@ -8513,6 +9152,7 @@
         </w:rPr>
         <w:t>sa</w:t>
       </w:r>
+      <w:proofErr w:type="spellEnd"/>
     </w:p>
     <w:p>
       <w:pPr>
@@ -8526,9 +9166,14 @@
         <w:t>.1</w:t>
       </w:r>
       <w:r>
-        <w:t>.2 Connect from DBeaver</w:t>
+        <w:t xml:space="preserve">.2 Connect from </w:t>
+      </w:r>
+      <w:proofErr w:type="spellStart"/>
+      <w:r>
+        <w:t>DBeaver</w:t>
       </w:r>
       <w:bookmarkEnd w:id="28"/>
+      <w:proofErr w:type="spellEnd"/>
     </w:p>
     <w:p>
       <w:r>
@@ -8557,7 +9202,7 @@
                     <pic:cNvPicPr/>
                   </pic:nvPicPr>
                   <pic:blipFill>
-                    <a:blip r:embed="rId40"/>
+                    <a:blip r:embed="rId30"/>
                     <a:stretch>
                       <a:fillRect/>
                     </a:stretch>
@@ -8613,7 +9258,7 @@
                     <pic:cNvPicPr/>
                   </pic:nvPicPr>
                   <pic:blipFill>
-                    <a:blip r:embed="rId41"/>
+                    <a:blip r:embed="rId31"/>
                     <a:stretch>
                       <a:fillRect/>
                     </a:stretch>
@@ -8757,7 +9402,7 @@
                     </pic:cNvPicPr>
                   </pic:nvPicPr>
                   <pic:blipFill>
-                    <a:blip r:embed="rId42">
+                    <a:blip r:embed="rId32">
                       <a:extLst>
                         <a:ext uri="{28A0092B-C50C-407E-A947-70E740481C1C}">
                           <a14:useLocalDpi xmlns:a14="http://schemas.microsoft.com/office/drawing/2010/main" val="0"/>
@@ -8979,7 +9624,7 @@
                     </pic:cNvPicPr>
                   </pic:nvPicPr>
                   <pic:blipFill>
-                    <a:blip r:embed="rId43">
+                    <a:blip r:embed="rId33">
                       <a:extLst>
                         <a:ext uri="{28A0092B-C50C-407E-A947-70E740481C1C}">
                           <a14:useLocalDpi xmlns:a14="http://schemas.microsoft.com/office/drawing/2010/main" val="0"/>
@@ -9113,6 +9758,7 @@
       <w:r>
         <w:t xml:space="preserve">Scroll to </w:t>
       </w:r>
+      <w:proofErr w:type="spellStart"/>
       <w:r>
         <w:rPr>
           <w:b/>
@@ -9120,6 +9766,7 @@
         </w:rPr>
         <w:t>IPAll</w:t>
       </w:r>
+      <w:proofErr w:type="spellEnd"/>
     </w:p>
     <w:p>
       <w:pPr>
@@ -9246,7 +9893,7 @@
                     </pic:cNvPicPr>
                   </pic:nvPicPr>
                   <pic:blipFill>
-                    <a:blip r:embed="rId44">
+                    <a:blip r:embed="rId34">
                       <a:extLst>
                         <a:ext uri="{28A0092B-C50C-407E-A947-70E740481C1C}">
                           <a14:useLocalDpi xmlns:a14="http://schemas.microsoft.com/office/drawing/2010/main" val="0"/>
@@ -9306,6 +9953,7 @@
       <w:r>
         <w:t xml:space="preserve">CREATE DATABASE </w:t>
       </w:r>
+      <w:proofErr w:type="spellStart"/>
       <w:r>
         <w:rPr>
           <w:b/>
@@ -9313,6 +9961,7 @@
         </w:rPr>
         <w:t>LeapPoc</w:t>
       </w:r>
+      <w:proofErr w:type="spellEnd"/>
       <w:r>
         <w:t> on local MSSQL Developer Edition</w:t>
       </w:r>
@@ -9335,7 +9984,15 @@
     </w:p>
     <w:p>
       <w:r>
-        <w:t>See docs/sql/</w:t>
+        <w:t>See docs/</w:t>
+      </w:r>
+      <w:proofErr w:type="spellStart"/>
+      <w:r>
+        <w:t>sql</w:t>
+      </w:r>
+      <w:proofErr w:type="spellEnd"/>
+      <w:r>
+        <w:t>/</w:t>
       </w:r>
       <w:r>
         <w:rPr>
@@ -9363,7 +10020,15 @@
     </w:p>
     <w:p>
       <w:r>
-        <w:t>See docs/sql/</w:t>
+        <w:t>See docs/</w:t>
+      </w:r>
+      <w:proofErr w:type="spellStart"/>
+      <w:r>
+        <w:t>sql</w:t>
+      </w:r>
+      <w:proofErr w:type="spellEnd"/>
+      <w:r>
+        <w:t>/</w:t>
       </w:r>
       <w:r>
         <w:rPr>
@@ -9444,7 +10109,31 @@
         </w:numPr>
       </w:pPr>
       <w:r>
-        <w:t>Add EntityScan and EnableJpaRepositoryies in leap-app LeapPocApplication to scan JPA entities and repositories in other modules/packages</w:t>
+        <w:t xml:space="preserve">Add </w:t>
+      </w:r>
+      <w:proofErr w:type="spellStart"/>
+      <w:r>
+        <w:t>EntityScan</w:t>
+      </w:r>
+      <w:proofErr w:type="spellEnd"/>
+      <w:r>
+        <w:t xml:space="preserve"> and </w:t>
+      </w:r>
+      <w:proofErr w:type="spellStart"/>
+      <w:r>
+        <w:t>EnableJpaRepositoryies</w:t>
+      </w:r>
+      <w:proofErr w:type="spellEnd"/>
+      <w:r>
+        <w:t xml:space="preserve"> in leap-app </w:t>
+      </w:r>
+      <w:proofErr w:type="spellStart"/>
+      <w:r>
+        <w:t>LeapPocApplication</w:t>
+      </w:r>
+      <w:proofErr w:type="spellEnd"/>
+      <w:r>
+        <w:t xml:space="preserve"> to scan JPA entities and repositories in other modules/packages</w:t>
       </w:r>
     </w:p>
     <w:p>
@@ -9472,7 +10161,7 @@
                     <pic:cNvPicPr/>
                   </pic:nvPicPr>
                   <pic:blipFill>
-                    <a:blip r:embed="rId45"/>
+                    <a:blip r:embed="rId35"/>
                     <a:stretch>
                       <a:fillRect/>
                     </a:stretch>
@@ -9502,8 +10191,21 @@
         </w:numPr>
       </w:pPr>
       <w:r>
-        <w:t>Change Instant to LocalDateTime for datetime fields such as createdAt</w:t>
-      </w:r>
+        <w:t xml:space="preserve">Change Instant to </w:t>
+      </w:r>
+      <w:proofErr w:type="spellStart"/>
+      <w:r>
+        <w:t>LocalDateTime</w:t>
+      </w:r>
+      <w:proofErr w:type="spellEnd"/>
+      <w:r>
+        <w:t xml:space="preserve"> for datetime fields such as </w:t>
+      </w:r>
+      <w:proofErr w:type="spellStart"/>
+      <w:r>
+        <w:t>createdAt</w:t>
+      </w:r>
+      <w:proofErr w:type="spellEnd"/>
     </w:p>
     <w:p>
       <w:pPr>
@@ -9766,6 +10468,7 @@
         </w:tabs>
         <w:ind w:left="851" w:hanging="284"/>
       </w:pPr>
+      <w:proofErr w:type="spellStart"/>
       <w:r>
         <w:rPr>
           <w:b/>
@@ -9773,19 +10476,239 @@
         </w:rPr>
         <w:t>CommentThreadDto</w:t>
       </w:r>
+      <w:proofErr w:type="spellEnd"/>
       <w:r>
         <w:t> — added </w:t>
       </w:r>
-      <w:hyperlink r:id="rId46" w:history="1">
+      <w:proofErr w:type="spellStart"/>
+      <w:r>
+        <w:fldChar w:fldCharType="begin"/>
+      </w:r>
+      <w:r>
+        <w:instrText>HYPERLINK "vscode-file://vscode-app/d:/apps/Microsoft%20VS%20Code/07ff9d6178/resources/app/out/vs/code/electron-browser/workbench/workbench.html" \o ""</w:instrText>
+      </w:r>
+      <w:r>
+        <w:fldChar w:fldCharType="separate"/>
+      </w:r>
+      <w:r>
+        <w:rPr>
+          <w:rStyle w:val="Hyperlink"/>
+        </w:rPr>
+        <w:t>isDeleted</w:t>
+      </w:r>
+      <w:proofErr w:type="spellEnd"/>
+      <w:r>
+        <w:fldChar w:fldCharType="end"/>
+      </w:r>
+      <w:r>
+        <w:t> </w:t>
+      </w:r>
+      <w:proofErr w:type="spellStart"/>
+      <w:r>
+        <w:t>boolean</w:t>
+      </w:r>
+      <w:proofErr w:type="spellEnd"/>
+      <w:r>
+        <w:t xml:space="preserve"> field</w:t>
+      </w:r>
+    </w:p>
+    <w:p>
+      <w:pPr>
+        <w:numPr>
+          <w:ilvl w:val="0"/>
+          <w:numId w:val="31"/>
+        </w:numPr>
+        <w:tabs>
+          <w:tab w:val="clear" w:pos="720"/>
+          <w:tab w:val="num" w:pos="851"/>
+        </w:tabs>
+        <w:ind w:left="851" w:hanging="284"/>
+      </w:pPr>
+      <w:proofErr w:type="spellStart"/>
+      <w:r>
+        <w:rPr>
+          <w:b/>
+          <w:bCs/>
+        </w:rPr>
+        <w:lastRenderedPageBreak/>
+        <w:t>CommentRepository</w:t>
+      </w:r>
+      <w:proofErr w:type="spellEnd"/>
+      <w:r>
+        <w:t> — added 3 new queries: fetch all comments (including deleted), single entity count, and batch entity counts via JPQL</w:t>
+      </w:r>
+    </w:p>
+    <w:p>
+      <w:pPr>
+        <w:numPr>
+          <w:ilvl w:val="0"/>
+          <w:numId w:val="31"/>
+        </w:numPr>
+        <w:tabs>
+          <w:tab w:val="clear" w:pos="720"/>
+          <w:tab w:val="num" w:pos="851"/>
+        </w:tabs>
+        <w:ind w:left="851" w:hanging="284"/>
+      </w:pPr>
+      <w:proofErr w:type="spellStart"/>
+      <w:r>
+        <w:rPr>
+          <w:b/>
+          <w:bCs/>
+        </w:rPr>
+        <w:t>CommentServiceImpl</w:t>
+      </w:r>
+      <w:proofErr w:type="spellEnd"/>
+      <w:r>
+        <w:t> — rewrote </w:t>
+      </w:r>
+      <w:proofErr w:type="spellStart"/>
+      <w:r>
+        <w:fldChar w:fldCharType="begin"/>
+      </w:r>
+      <w:r>
+        <w:instrText>HYPERLINK "vscode-file://vscode-app/d:/apps/Microsoft%20VS%20Code/07ff9d6178/resources/app/out/vs/code/electron-browser/workbench/workbench.html" \o ""</w:instrText>
+      </w:r>
+      <w:r>
+        <w:fldChar w:fldCharType="separate"/>
+      </w:r>
+      <w:r>
+        <w:rPr>
+          <w:rStyle w:val="Hyperlink"/>
+        </w:rPr>
+        <w:t>getThread</w:t>
+      </w:r>
+      <w:proofErr w:type="spellEnd"/>
+      <w:r>
+        <w:rPr>
+          <w:rStyle w:val="Hyperlink"/>
+        </w:rPr>
+        <w:t>()</w:t>
+      </w:r>
+      <w:r>
+        <w:fldChar w:fldCharType="end"/>
+      </w:r>
+      <w:r>
+        <w:t> to include soft-deleted parents as placeholders when they have non-deleted descendants; added </w:t>
+      </w:r>
+      <w:proofErr w:type="spellStart"/>
+      <w:r>
+        <w:fldChar w:fldCharType="begin"/>
+      </w:r>
+      <w:r>
+        <w:instrText>HYPERLINK "vscode-file://vscode-app/d:/apps/Microsoft%20VS%20Code/07ff9d6178/resources/app/out/vs/code/electron-browser/workbench/workbench.html" \o ""</w:instrText>
+      </w:r>
+      <w:r>
+        <w:fldChar w:fldCharType="separate"/>
+      </w:r>
+      <w:r>
+        <w:rPr>
+          <w:rStyle w:val="Hyperlink"/>
+        </w:rPr>
+        <w:t>getCounts</w:t>
+      </w:r>
+      <w:proofErr w:type="spellEnd"/>
+      <w:r>
+        <w:rPr>
+          <w:rStyle w:val="Hyperlink"/>
+        </w:rPr>
+        <w:t>()</w:t>
+      </w:r>
+      <w:r>
+        <w:fldChar w:fldCharType="end"/>
+      </w:r>
+      <w:r>
+        <w:t> for batch comment count retrieval</w:t>
+      </w:r>
+    </w:p>
+    <w:p>
+      <w:pPr>
+        <w:numPr>
+          <w:ilvl w:val="0"/>
+          <w:numId w:val="31"/>
+        </w:numPr>
+        <w:tabs>
+          <w:tab w:val="clear" w:pos="720"/>
+          <w:tab w:val="num" w:pos="851"/>
+        </w:tabs>
+        <w:ind w:left="851" w:hanging="284"/>
+      </w:pPr>
+      <w:proofErr w:type="spellStart"/>
+      <w:r>
+        <w:rPr>
+          <w:b/>
+          <w:bCs/>
+        </w:rPr>
+        <w:t>CommentController</w:t>
+      </w:r>
+      <w:proofErr w:type="spellEnd"/>
+      <w:r>
+        <w:t> — added </w:t>
+      </w:r>
+      <w:hyperlink r:id="rId36" w:history="1">
         <w:r>
           <w:rPr>
             <w:rStyle w:val="Hyperlink"/>
           </w:rPr>
-          <w:t>isDeleted</w:t>
+          <w:t>GET /</w:t>
+        </w:r>
+        <w:proofErr w:type="spellStart"/>
+        <w:r>
+          <w:rPr>
+            <w:rStyle w:val="Hyperlink"/>
+          </w:rPr>
+          <w:t>api</w:t>
+        </w:r>
+        <w:proofErr w:type="spellEnd"/>
+        <w:r>
+          <w:rPr>
+            <w:rStyle w:val="Hyperlink"/>
+          </w:rPr>
+          <w:t>/comments/</w:t>
+        </w:r>
+        <w:proofErr w:type="spellStart"/>
+        <w:r>
+          <w:rPr>
+            <w:rStyle w:val="Hyperlink"/>
+          </w:rPr>
+          <w:t>counts?entityType</w:t>
+        </w:r>
+        <w:proofErr w:type="spellEnd"/>
+        <w:r>
+          <w:rPr>
+            <w:rStyle w:val="Hyperlink"/>
+          </w:rPr>
+          <w:t>=&amp;</w:t>
+        </w:r>
+        <w:proofErr w:type="spellStart"/>
+        <w:r>
+          <w:rPr>
+            <w:rStyle w:val="Hyperlink"/>
+          </w:rPr>
+          <w:t>entityIds</w:t>
+        </w:r>
+        <w:proofErr w:type="spellEnd"/>
+        <w:r>
+          <w:rPr>
+            <w:rStyle w:val="Hyperlink"/>
+          </w:rPr>
+          <w:t>=</w:t>
         </w:r>
       </w:hyperlink>
       <w:r>
-        <w:t> boolean field</w:t>
+        <w:t> endpoint</w:t>
+      </w:r>
+    </w:p>
+    <w:p>
+      <w:pPr>
+        <w:ind w:left="284"/>
+      </w:pPr>
+      <w:r>
+        <w:rPr>
+          <w:b/>
+          <w:bCs/>
+        </w:rPr>
+        <w:t>Frontend (Angular):</w:t>
       </w:r>
     </w:p>
     <w:p>
@@ -9805,11 +10728,10 @@
           <w:b/>
           <w:bCs/>
         </w:rPr>
-        <w:lastRenderedPageBreak/>
-        <w:t>CommentRepository</w:t>
-      </w:r>
-      <w:r>
-        <w:t> — added 3 new queries: fetch all comments (including deleted), single entity count, and batch entity counts via JPQL</w:t>
+        <w:t>6.1 Error handling</w:t>
+      </w:r>
+      <w:r>
+        <w:t>: Thread panel differentiates 401/403/404/500/network errors with specific messages; network/server errors show a Retry button</w:t>
       </w:r>
     </w:p>
     <w:p>
@@ -9829,32 +10751,10 @@
           <w:b/>
           <w:bCs/>
         </w:rPr>
-        <w:t>CommentServiceImpl</w:t>
-      </w:r>
-      <w:r>
-        <w:t> — rewrote </w:t>
-      </w:r>
-      <w:hyperlink r:id="rId47" w:history="1">
-        <w:r>
-          <w:rPr>
-            <w:rStyle w:val="Hyperlink"/>
-          </w:rPr>
-          <w:t>getThread()</w:t>
-        </w:r>
-      </w:hyperlink>
-      <w:r>
-        <w:t> to include soft-deleted parents as placeholders when they have non-deleted descendants; added </w:t>
-      </w:r>
-      <w:hyperlink r:id="rId48" w:history="1">
-        <w:r>
-          <w:rPr>
-            <w:rStyle w:val="Hyperlink"/>
-          </w:rPr>
-          <w:t>getCounts()</w:t>
-        </w:r>
-      </w:hyperlink>
-      <w:r>
-        <w:t> for batch comment count retrieval</w:t>
+        <w:t>6.4 Deleted display</w:t>
+      </w:r>
+      <w:r>
+        <w:t>: Deleted comments render as "[This comment has been removed]" with dashed border styling; their replies still show</w:t>
       </w:r>
     </w:p>
     <w:p>
@@ -9874,33 +10774,10 @@
           <w:b/>
           <w:bCs/>
         </w:rPr>
-        <w:t>CommentController</w:t>
-      </w:r>
-      <w:r>
-        <w:t> — added </w:t>
-      </w:r>
-      <w:hyperlink r:id="rId49" w:history="1">
-        <w:r>
-          <w:rPr>
-            <w:rStyle w:val="Hyperlink"/>
-          </w:rPr>
-          <w:t>GET /api/comments/counts?entityType=&amp;entityIds=</w:t>
-        </w:r>
-      </w:hyperlink>
-      <w:r>
-        <w:t> endpoint</w:t>
-      </w:r>
-    </w:p>
-    <w:p>
-      <w:pPr>
-        <w:ind w:left="284"/>
-      </w:pPr>
-      <w:r>
-        <w:rPr>
-          <w:b/>
-          <w:bCs/>
-        </w:rPr>
-        <w:t>Frontend (Angular):</w:t>
+        <w:t>6.5 Collapse deep threads</w:t>
+      </w:r>
+      <w:r>
+        <w:t>: Replies beyond depth 3 auto-collapse with "Show N more replies" expandable link</w:t>
       </w:r>
     </w:p>
     <w:p>
@@ -9920,10 +10797,18 @@
           <w:b/>
           <w:bCs/>
         </w:rPr>
-        <w:t>6.1 Error handling</w:t>
-      </w:r>
-      <w:r>
-        <w:t>: Thread panel differentiates 401/403/404/500/network errors with specific messages; network/server errors show a Retry button</w:t>
+        <w:t>6.6 Comment count badge</w:t>
+      </w:r>
+      <w:r>
+        <w:t xml:space="preserve">: Counts load on page </w:t>
+      </w:r>
+      <w:proofErr w:type="spellStart"/>
+      <w:r>
+        <w:t>init</w:t>
+      </w:r>
+      <w:proofErr w:type="spellEnd"/>
+      <w:r>
+        <w:t xml:space="preserve"> via batch endpoint (not just when panel opens)</w:t>
       </w:r>
     </w:p>
     <w:p>
@@ -9943,10 +10828,10 @@
           <w:b/>
           <w:bCs/>
         </w:rPr>
-        <w:t>6.4 Deleted display</w:t>
-      </w:r>
-      <w:r>
-        <w:t>: Deleted comments render as "[This comment has been removed]" with dashed border styling; their replies still show</w:t>
+        <w:t>6.7 Optimistic UI</w:t>
+      </w:r>
+      <w:r>
+        <w:t>: New top-level comments appear instantly; reverted on error</w:t>
       </w:r>
     </w:p>
     <w:p>
@@ -9966,80 +10851,24 @@
           <w:b/>
           <w:bCs/>
         </w:rPr>
-        <w:t>6.5 Collapse deep threads</w:t>
-      </w:r>
-      <w:r>
-        <w:t>: Replies beyond depth 3 auto-collapse with "Show N more replies" expandable link</w:t>
-      </w:r>
-    </w:p>
-    <w:p>
-      <w:pPr>
-        <w:numPr>
-          <w:ilvl w:val="0"/>
-          <w:numId w:val="31"/>
-        </w:numPr>
-        <w:tabs>
-          <w:tab w:val="clear" w:pos="720"/>
-          <w:tab w:val="num" w:pos="851"/>
-        </w:tabs>
-        <w:ind w:left="851" w:hanging="284"/>
-      </w:pPr>
-      <w:r>
-        <w:rPr>
-          <w:b/>
-          <w:bCs/>
-        </w:rPr>
-        <w:t>6.6 Comment count badge</w:t>
-      </w:r>
-      <w:r>
-        <w:t>: Counts load on page init via batch endpoint (not just when panel opens)</w:t>
-      </w:r>
-    </w:p>
-    <w:p>
-      <w:pPr>
-        <w:numPr>
-          <w:ilvl w:val="0"/>
-          <w:numId w:val="31"/>
-        </w:numPr>
-        <w:tabs>
-          <w:tab w:val="clear" w:pos="720"/>
-          <w:tab w:val="num" w:pos="851"/>
-        </w:tabs>
-        <w:ind w:left="851" w:hanging="284"/>
-      </w:pPr>
-      <w:r>
-        <w:rPr>
-          <w:b/>
-          <w:bCs/>
-        </w:rPr>
-        <w:t>6.7 Optimistic UI</w:t>
-      </w:r>
-      <w:r>
-        <w:t>: New top-level comments appear instantly; reverted on error</w:t>
-      </w:r>
-    </w:p>
-    <w:p>
-      <w:pPr>
-        <w:numPr>
-          <w:ilvl w:val="0"/>
-          <w:numId w:val="31"/>
-        </w:numPr>
-        <w:tabs>
-          <w:tab w:val="clear" w:pos="720"/>
-          <w:tab w:val="num" w:pos="851"/>
-        </w:tabs>
-        <w:ind w:left="851" w:hanging="284"/>
-      </w:pPr>
-      <w:r>
-        <w:rPr>
-          <w:b/>
-          <w:bCs/>
-        </w:rPr>
         <w:t>6.8 Accessibility</w:t>
       </w:r>
       <w:r>
-        <w:t>: ARIA roles/labels on panel, entries, buttons, icons; aria-live="polite" for dynamic content; Escape key closes panel; trackBy on all *ngFor</w:t>
-      </w:r>
+        <w:t>: ARIA roles/labels on panel, entries, buttons, icons; aria-live="polite" for dynamic content; Escape key closes panel; </w:t>
+      </w:r>
+      <w:proofErr w:type="spellStart"/>
+      <w:r>
+        <w:t>trackBy</w:t>
+      </w:r>
+      <w:proofErr w:type="spellEnd"/>
+      <w:r>
+        <w:t> on all *</w:t>
+      </w:r>
+      <w:proofErr w:type="spellStart"/>
+      <w:r>
+        <w:t>ngFor</w:t>
+      </w:r>
+      <w:proofErr w:type="spellEnd"/>
     </w:p>
     <w:p>
       <w:pPr>
@@ -10060,11 +10889,16 @@
         </w:rPr>
       </w:pPr>
       <w:bookmarkStart w:id="38" w:name="_Toc225694792"/>
+      <w:proofErr w:type="gramStart"/>
       <w:r>
         <w:t xml:space="preserve">6.1  </w:t>
       </w:r>
       <w:r>
-        <w:t>Setting Up Groups in Microsoft Entra ID</w:t>
+        <w:t>Setting</w:t>
+      </w:r>
+      <w:proofErr w:type="gramEnd"/>
+      <w:r>
+        <w:t xml:space="preserve"> Up Groups in Microsoft Entra ID</w:t>
       </w:r>
       <w:bookmarkEnd w:id="38"/>
     </w:p>
@@ -10096,7 +10930,7 @@
       <w:r>
         <w:t xml:space="preserve"> </w:t>
       </w:r>
-      <w:hyperlink r:id="rId50" w:anchor="view/Microsoft_AAD_IAM/TenantOverview.ReactView" w:history="1">
+      <w:hyperlink r:id="rId37" w:anchor="view/Microsoft_AAD_IAM/TenantOverview.ReactView" w:history="1">
         <w:r>
           <w:rPr>
             <w:rStyle w:val="Hyperlink"/>
@@ -10957,6 +11791,7 @@
       <w:r>
         <w:t xml:space="preserve"> </w:t>
       </w:r>
+      <w:proofErr w:type="spellStart"/>
       <w:r>
         <w:rPr>
           <w:b/>
@@ -10964,6 +11799,7 @@
         </w:rPr>
         <w:t>poc-bff</w:t>
       </w:r>
+      <w:proofErr w:type="spellEnd"/>
     </w:p>
     <w:p>
       <w:pPr>
@@ -11136,6 +11972,7 @@
       <w:r>
         <w:t>You'll need these IDs in </w:t>
       </w:r>
+      <w:proofErr w:type="spellStart"/>
       <w:r>
         <w:rPr>
           <w:b/>
@@ -11143,6 +11980,7 @@
         </w:rPr>
         <w:t>application.yml</w:t>
       </w:r>
+      <w:proofErr w:type="spellEnd"/>
       <w:r>
         <w:t>:</w:t>
       </w:r>
@@ -11290,6 +12128,8 @@
       <w:r>
         <w:t>Added </w:t>
       </w:r>
+      <w:proofErr w:type="spellStart"/>
+      <w:proofErr w:type="gramStart"/>
       <w:r>
         <w:rPr>
           <w:b/>
@@ -11297,6 +12137,8 @@
         </w:rPr>
         <w:t>app.groups</w:t>
       </w:r>
+      <w:proofErr w:type="spellEnd"/>
+      <w:proofErr w:type="gramEnd"/>
       <w:r>
         <w:t> config mapping group Object IDs → friendly names</w:t>
       </w:r>
@@ -11325,7 +12167,7 @@
                     <pic:cNvPicPr/>
                   </pic:nvPicPr>
                   <pic:blipFill>
-                    <a:blip r:embed="rId51"/>
+                    <a:blip r:embed="rId38"/>
                     <a:stretch>
                       <a:fillRect/>
                     </a:stretch>
@@ -11407,7 +12249,7 @@
             <w:hideMark/>
           </w:tcPr>
           <w:p>
-            <w:hyperlink r:id="rId52" w:history="1">
+            <w:hyperlink r:id="rId39" w:history="1">
               <w:r>
                 <w:rPr>
                   <w:rStyle w:val="Hyperlink"/>
@@ -11462,7 +12304,7 @@
             <w:hideMark/>
           </w:tcPr>
           <w:p>
-            <w:hyperlink r:id="rId53" w:history="1">
+            <w:hyperlink r:id="rId40" w:history="1">
               <w:r>
                 <w:rPr>
                   <w:rStyle w:val="Hyperlink"/>
@@ -11517,7 +12359,7 @@
             <w:hideMark/>
           </w:tcPr>
           <w:p>
-            <w:hyperlink r:id="rId54" w:history="1">
+            <w:hyperlink r:id="rId41" w:history="1">
               <w:r>
                 <w:rPr>
                   <w:rStyle w:val="Hyperlink"/>
@@ -11572,7 +12414,7 @@
             <w:hideMark/>
           </w:tcPr>
           <w:p>
-            <w:hyperlink r:id="rId55" w:history="1">
+            <w:hyperlink r:id="rId42" w:history="1">
               <w:r>
                 <w:rPr>
                   <w:rStyle w:val="Hyperlink"/>
@@ -11601,7 +12443,15 @@
           </w:tcPr>
           <w:p>
             <w:r>
-              <w:t>Extracts GROUP_* authorities → returns groups list in /api/me</w:t>
+              <w:t>Extracts GROUP_* authorities → returns groups list in /</w:t>
+            </w:r>
+            <w:proofErr w:type="spellStart"/>
+            <w:r>
+              <w:t>api</w:t>
+            </w:r>
+            <w:proofErr w:type="spellEnd"/>
+            <w:r>
+              <w:t>/me</w:t>
             </w:r>
           </w:p>
         </w:tc>
@@ -11627,7 +12477,7 @@
             <w:hideMark/>
           </w:tcPr>
           <w:p>
-            <w:hyperlink r:id="rId56" w:history="1">
+            <w:hyperlink r:id="rId43" w:history="1">
               <w:r>
                 <w:rPr>
                   <w:rStyle w:val="Hyperlink"/>
@@ -11656,7 +12506,23 @@
           </w:tcPr>
           <w:p>
             <w:r>
-              <w:t>All @PreAuthorize now: hasRole('APP_X') or hasAuthority('GROUP_GRP_X')</w:t>
+              <w:t>All @PreAuthorize now: </w:t>
+            </w:r>
+            <w:proofErr w:type="spellStart"/>
+            <w:r>
+              <w:t>hasRole</w:t>
+            </w:r>
+            <w:proofErr w:type="spellEnd"/>
+            <w:r>
+              <w:t xml:space="preserve">('APP_X') or </w:t>
+            </w:r>
+            <w:proofErr w:type="spellStart"/>
+            <w:r>
+              <w:t>hasAuthority</w:t>
+            </w:r>
+            <w:proofErr w:type="spellEnd"/>
+            <w:r>
+              <w:t>('GROUP_GRP_X')</w:t>
             </w:r>
           </w:p>
         </w:tc>
@@ -11683,7 +12549,7 @@
             <w:hideMark/>
           </w:tcPr>
           <w:p>
-            <w:hyperlink r:id="rId57" w:history="1">
+            <w:hyperlink r:id="rId44" w:history="1">
               <w:r>
                 <w:rPr>
                   <w:rStyle w:val="Hyperlink"/>
@@ -11715,14 +12581,26 @@
             <w:r>
               <w:t>Same pattern; </w:t>
             </w:r>
-            <w:hyperlink r:id="rId58" w:history="1">
-              <w:r>
-                <w:rPr>
-                  <w:rStyle w:val="Hyperlink"/>
-                </w:rPr>
-                <w:t>isAdmin</w:t>
-              </w:r>
-            </w:hyperlink>
+            <w:proofErr w:type="spellStart"/>
+            <w:r>
+              <w:fldChar w:fldCharType="begin"/>
+            </w:r>
+            <w:r>
+              <w:instrText>HYPERLINK "vscode-file://vscode-app/d:/apps/Microsoft%20VS%20Code/07ff9d6178/resources/app/out/vs/code/electron-browser/workbench/workbench.html" \o ""</w:instrText>
+            </w:r>
+            <w:r>
+              <w:fldChar w:fldCharType="separate"/>
+            </w:r>
+            <w:r>
+              <w:rPr>
+                <w:rStyle w:val="Hyperlink"/>
+              </w:rPr>
+              <w:t>isAdmin</w:t>
+            </w:r>
+            <w:proofErr w:type="spellEnd"/>
+            <w:r>
+              <w:fldChar w:fldCharType="end"/>
+            </w:r>
             <w:r>
               <w:t> check also considers GROUP_GRP_ADMIN</w:t>
             </w:r>
@@ -11866,13 +12744,29 @@
             <w:hideMark/>
           </w:tcPr>
           <w:p>
-            <w:hyperlink r:id="rId59" w:history="1">
+            <w:hyperlink r:id="rId45" w:history="1">
               <w:r>
                 <w:rPr>
                   <w:rStyle w:val="Hyperlink"/>
                 </w:rPr>
-                <w:t>user-info.model.ts</w:t>
+                <w:t>user-</w:t>
               </w:r>
+              <w:proofErr w:type="spellStart"/>
+              <w:proofErr w:type="gramStart"/>
+              <w:r>
+                <w:rPr>
+                  <w:rStyle w:val="Hyperlink"/>
+                </w:rPr>
+                <w:t>info.model</w:t>
+              </w:r>
+              <w:proofErr w:type="gramEnd"/>
+              <w:r>
+                <w:rPr>
+                  <w:rStyle w:val="Hyperlink"/>
+                </w:rPr>
+                <w:t>.ts</w:t>
+              </w:r>
+              <w:proofErr w:type="spellEnd"/>
             </w:hyperlink>
           </w:p>
         </w:tc>
@@ -11895,7 +12789,15 @@
           </w:tcPr>
           <w:p>
             <w:r>
-              <w:t>Added groups: string[]</w:t>
+              <w:t xml:space="preserve">Added groups: </w:t>
+            </w:r>
+            <w:proofErr w:type="gramStart"/>
+            <w:r>
+              <w:t>string[</w:t>
+            </w:r>
+            <w:proofErr w:type="gramEnd"/>
+            <w:r>
+              <w:t>]</w:t>
             </w:r>
           </w:p>
         </w:tc>
@@ -11921,13 +12823,23 @@
             <w:hideMark/>
           </w:tcPr>
           <w:p>
-            <w:hyperlink r:id="rId60" w:history="1">
+            <w:hyperlink r:id="rId46" w:history="1">
+              <w:proofErr w:type="spellStart"/>
+              <w:proofErr w:type="gramStart"/>
               <w:r>
                 <w:rPr>
                   <w:rStyle w:val="Hyperlink"/>
                 </w:rPr>
-                <w:t>auth.service.ts</w:t>
+                <w:t>auth.service</w:t>
               </w:r>
+              <w:proofErr w:type="gramEnd"/>
+              <w:r>
+                <w:rPr>
+                  <w:rStyle w:val="Hyperlink"/>
+                </w:rPr>
+                <w:t>.ts</w:t>
+              </w:r>
+              <w:proofErr w:type="spellEnd"/>
             </w:hyperlink>
           </w:p>
         </w:tc>
@@ -11950,16 +12862,50 @@
           </w:tcPr>
           <w:p>
             <w:r>
-              <w:t>Added hasGroup(), hasAnyGroup(), </w:t>
-            </w:r>
-            <w:hyperlink r:id="rId61" w:history="1">
-              <w:r>
-                <w:rPr>
-                  <w:rStyle w:val="Hyperlink"/>
-                </w:rPr>
-                <w:t>hasAnyRoleOrGroup()</w:t>
-              </w:r>
-            </w:hyperlink>
+              <w:t>Added </w:t>
+            </w:r>
+            <w:proofErr w:type="spellStart"/>
+            <w:r>
+              <w:t>hasGroup</w:t>
+            </w:r>
+            <w:proofErr w:type="spellEnd"/>
+            <w:r>
+              <w:t>(), </w:t>
+            </w:r>
+            <w:proofErr w:type="spellStart"/>
+            <w:r>
+              <w:t>hasAnyGroup</w:t>
+            </w:r>
+            <w:proofErr w:type="spellEnd"/>
+            <w:r>
+              <w:t>(), </w:t>
+            </w:r>
+            <w:proofErr w:type="spellStart"/>
+            <w:r>
+              <w:fldChar w:fldCharType="begin"/>
+            </w:r>
+            <w:r>
+              <w:instrText>HYPERLINK "vscode-file://vscode-app/d:/apps/Microsoft%20VS%20Code/07ff9d6178/resources/app/out/vs/code/electron-browser/workbench/workbench.html" \o ""</w:instrText>
+            </w:r>
+            <w:r>
+              <w:fldChar w:fldCharType="separate"/>
+            </w:r>
+            <w:r>
+              <w:rPr>
+                <w:rStyle w:val="Hyperlink"/>
+              </w:rPr>
+              <w:t>hasAnyRoleOrGroup</w:t>
+            </w:r>
+            <w:proofErr w:type="spellEnd"/>
+            <w:r>
+              <w:rPr>
+                <w:rStyle w:val="Hyperlink"/>
+              </w:rPr>
+              <w:t>()</w:t>
+            </w:r>
+            <w:r>
+              <w:fldChar w:fldCharType="end"/>
+            </w:r>
             <w:r>
               <w:t> — maps APP_X ↔ GRP_X</w:t>
             </w:r>
@@ -11987,13 +12933,23 @@
             <w:hideMark/>
           </w:tcPr>
           <w:p>
-            <w:hyperlink r:id="rId62" w:history="1">
+            <w:hyperlink r:id="rId47" w:history="1">
+              <w:proofErr w:type="spellStart"/>
+              <w:proofErr w:type="gramStart"/>
               <w:r>
                 <w:rPr>
                   <w:rStyle w:val="Hyperlink"/>
                 </w:rPr>
-                <w:t>role.guard.ts</w:t>
+                <w:t>role.guard</w:t>
               </w:r>
+              <w:proofErr w:type="gramEnd"/>
+              <w:r>
+                <w:rPr>
+                  <w:rStyle w:val="Hyperlink"/>
+                </w:rPr>
+                <w:t>.ts</w:t>
+              </w:r>
+              <w:proofErr w:type="spellEnd"/>
             </w:hyperlink>
           </w:p>
         </w:tc>
@@ -12018,16 +12974,42 @@
             <w:r>
               <w:t>Now calls </w:t>
             </w:r>
-            <w:hyperlink r:id="rId63" w:history="1">
-              <w:r>
-                <w:rPr>
-                  <w:rStyle w:val="Hyperlink"/>
-                </w:rPr>
-                <w:t>hasAnyRoleOrGroup()</w:t>
-              </w:r>
-            </w:hyperlink>
-            <w:r>
-              <w:t> instead of hasAnyRole()</w:t>
+            <w:proofErr w:type="spellStart"/>
+            <w:r>
+              <w:fldChar w:fldCharType="begin"/>
+            </w:r>
+            <w:r>
+              <w:instrText>HYPERLINK "vscode-file://vscode-app/d:/apps/Microsoft%20VS%20Code/07ff9d6178/resources/app/out/vs/code/electron-browser/workbench/workbench.html" \o ""</w:instrText>
+            </w:r>
+            <w:r>
+              <w:fldChar w:fldCharType="separate"/>
+            </w:r>
+            <w:r>
+              <w:rPr>
+                <w:rStyle w:val="Hyperlink"/>
+              </w:rPr>
+              <w:t>hasAnyRoleOrGroup</w:t>
+            </w:r>
+            <w:proofErr w:type="spellEnd"/>
+            <w:r>
+              <w:rPr>
+                <w:rStyle w:val="Hyperlink"/>
+              </w:rPr>
+              <w:t>()</w:t>
+            </w:r>
+            <w:r>
+              <w:fldChar w:fldCharType="end"/>
+            </w:r>
+            <w:r>
+              <w:t> instead of </w:t>
+            </w:r>
+            <w:proofErr w:type="spellStart"/>
+            <w:r>
+              <w:t>hasAnyRole</w:t>
+            </w:r>
+            <w:proofErr w:type="spellEnd"/>
+            <w:r>
+              <w:t>()</w:t>
             </w:r>
           </w:p>
         </w:tc>
@@ -12053,7 +13035,7 @@
             <w:hideMark/>
           </w:tcPr>
           <w:p>
-            <w:hyperlink r:id="rId64" w:history="1">
+            <w:hyperlink r:id="rId48" w:history="1">
               <w:r>
                 <w:rPr>
                   <w:rStyle w:val="Hyperlink"/>
@@ -12084,14 +13066,32 @@
             <w:r>
               <w:t>Nav visibility uses </w:t>
             </w:r>
-            <w:hyperlink r:id="rId65" w:history="1">
-              <w:r>
-                <w:rPr>
-                  <w:rStyle w:val="Hyperlink"/>
-                </w:rPr>
-                <w:t>hasAnyRoleOrGroup()</w:t>
-              </w:r>
-            </w:hyperlink>
+            <w:proofErr w:type="spellStart"/>
+            <w:r>
+              <w:fldChar w:fldCharType="begin"/>
+            </w:r>
+            <w:r>
+              <w:instrText>HYPERLINK "vscode-file://vscode-app/d:/apps/Microsoft%20VS%20Code/07ff9d6178/resources/app/out/vs/code/electron-browser/workbench/workbench.html" \o ""</w:instrText>
+            </w:r>
+            <w:r>
+              <w:fldChar w:fldCharType="separate"/>
+            </w:r>
+            <w:r>
+              <w:rPr>
+                <w:rStyle w:val="Hyperlink"/>
+              </w:rPr>
+              <w:t>hasAnyRoleOrGroup</w:t>
+            </w:r>
+            <w:proofErr w:type="spellEnd"/>
+            <w:r>
+              <w:rPr>
+                <w:rStyle w:val="Hyperlink"/>
+              </w:rPr>
+              <w:t>()</w:t>
+            </w:r>
+            <w:r>
+              <w:fldChar w:fldCharType="end"/>
+            </w:r>
           </w:p>
         </w:tc>
       </w:tr>
@@ -12117,13 +13117,29 @@
             <w:hideMark/>
           </w:tcPr>
           <w:p>
-            <w:hyperlink r:id="rId66" w:history="1">
+            <w:hyperlink r:id="rId49" w:history="1">
               <w:r>
                 <w:rPr>
                   <w:rStyle w:val="Hyperlink"/>
                 </w:rPr>
-                <w:t>comment-thread-panel.component.ts</w:t>
+                <w:t>comment-thread-</w:t>
               </w:r>
+              <w:proofErr w:type="spellStart"/>
+              <w:proofErr w:type="gramStart"/>
+              <w:r>
+                <w:rPr>
+                  <w:rStyle w:val="Hyperlink"/>
+                </w:rPr>
+                <w:t>panel.component</w:t>
+              </w:r>
+              <w:proofErr w:type="gramEnd"/>
+              <w:r>
+                <w:rPr>
+                  <w:rStyle w:val="Hyperlink"/>
+                </w:rPr>
+                <w:t>.ts</w:t>
+              </w:r>
+              <w:proofErr w:type="spellEnd"/>
             </w:hyperlink>
           </w:p>
         </w:tc>
@@ -12146,36 +13162,68 @@
             <w:hideMark/>
           </w:tcPr>
           <w:p>
-            <w:hyperlink r:id="rId67" w:history="1">
+            <w:hyperlink r:id="rId50" w:history="1">
+              <w:proofErr w:type="spellStart"/>
               <w:r>
                 <w:rPr>
                   <w:rStyle w:val="Hyperlink"/>
                 </w:rPr>
                 <w:t>canWrite</w:t>
               </w:r>
+              <w:proofErr w:type="spellEnd"/>
             </w:hyperlink>
             <w:r>
               <w:t>/</w:t>
             </w:r>
-            <w:hyperlink r:id="rId68" w:history="1">
-              <w:r>
-                <w:rPr>
-                  <w:rStyle w:val="Hyperlink"/>
-                </w:rPr>
-                <w:t>isAdmin</w:t>
-              </w:r>
-            </w:hyperlink>
+            <w:proofErr w:type="spellStart"/>
+            <w:r>
+              <w:fldChar w:fldCharType="begin"/>
+            </w:r>
+            <w:r>
+              <w:instrText>HYPERLINK "vscode-file://vscode-app/d:/apps/Microsoft%20VS%20Code/07ff9d6178/resources/app/out/vs/code/electron-browser/workbench/workbench.html" \o ""</w:instrText>
+            </w:r>
+            <w:r>
+              <w:fldChar w:fldCharType="separate"/>
+            </w:r>
+            <w:r>
+              <w:rPr>
+                <w:rStyle w:val="Hyperlink"/>
+              </w:rPr>
+              <w:t>isAdmin</w:t>
+            </w:r>
+            <w:proofErr w:type="spellEnd"/>
+            <w:r>
+              <w:fldChar w:fldCharType="end"/>
+            </w:r>
             <w:r>
               <w:t> use </w:t>
             </w:r>
-            <w:hyperlink r:id="rId69" w:history="1">
-              <w:r>
-                <w:rPr>
-                  <w:rStyle w:val="Hyperlink"/>
-                </w:rPr>
-                <w:t>hasAnyRoleOrGroup()</w:t>
-              </w:r>
-            </w:hyperlink>
+            <w:proofErr w:type="spellStart"/>
+            <w:r>
+              <w:fldChar w:fldCharType="begin"/>
+            </w:r>
+            <w:r>
+              <w:instrText>HYPERLINK "vscode-file://vscode-app/d:/apps/Microsoft%20VS%20Code/07ff9d6178/resources/app/out/vs/code/electron-browser/workbench/workbench.html" \o ""</w:instrText>
+            </w:r>
+            <w:r>
+              <w:fldChar w:fldCharType="separate"/>
+            </w:r>
+            <w:r>
+              <w:rPr>
+                <w:rStyle w:val="Hyperlink"/>
+              </w:rPr>
+              <w:t>hasAnyRoleOrGroup</w:t>
+            </w:r>
+            <w:proofErr w:type="spellEnd"/>
+            <w:r>
+              <w:rPr>
+                <w:rStyle w:val="Hyperlink"/>
+              </w:rPr>
+              <w:t>()</w:t>
+            </w:r>
+            <w:r>
+              <w:fldChar w:fldCharType="end"/>
+            </w:r>
           </w:p>
         </w:tc>
       </w:tr>
@@ -12192,6 +13240,12 @@
       <w:bookmarkEnd w:id="40"/>
     </w:p>
     <w:p>
+      <w:pPr>
+        <w:rPr>
+          <w:b/>
+          <w:bCs/>
+        </w:rPr>
+      </w:pPr>
       <w:r>
         <w:t xml:space="preserve">See </w:t>
       </w:r>
@@ -12204,7 +13258,28 @@
       </w:r>
     </w:p>
     <w:p>
-      <w:r>
+      <w:pPr>
+        <w:pStyle w:val="Heading1"/>
+      </w:pPr>
+      <w:r>
+        <w:t>8. E2E Test</w:t>
+      </w:r>
+    </w:p>
+    <w:p>
+      <w:r>
+        <w:t xml:space="preserve">See </w:t>
+      </w:r>
+      <w:r>
+        <w:rPr>
+          <w:b/>
+          <w:bCs/>
+        </w:rPr>
+        <w:t>docs/e2e-testing.md</w:t>
+      </w:r>
+    </w:p>
+    <w:p>
+      <w:r>
+        <w:lastRenderedPageBreak/>
         <w:t xml:space="preserve"> </w:t>
       </w:r>
     </w:p>

</xml_diff>

<commit_message>
poc - comment - Entra ID User Lookup
</commit_message>
<xml_diff>
--- a/docs/poc_notes.docx
+++ b/docs/poc_notes.docx
@@ -2612,21 +2612,7 @@
                 <w:rStyle w:val="Hyperlink"/>
                 <w:noProof/>
               </w:rPr>
-              <w:t>6. Authorization by G</w:t>
-            </w:r>
-            <w:r>
-              <w:rPr>
-                <w:rStyle w:val="Hyperlink"/>
-                <w:noProof/>
-              </w:rPr>
-              <w:t>r</w:t>
-            </w:r>
-            <w:r>
-              <w:rPr>
-                <w:rStyle w:val="Hyperlink"/>
-                <w:noProof/>
-              </w:rPr>
-              <w:t>oup</w:t>
+              <w:t>6. Authorization by Group</w:t>
             </w:r>
             <w:r>
               <w:rPr>
@@ -4369,10 +4355,10 @@
             <v:path o:extrusionok="f" gradientshapeok="t" o:connecttype="rect"/>
             <o:lock v:ext="edit" aspectratio="t"/>
           </v:shapetype>
-          <v:shape id="_x0000_i1025" type="#_x0000_t75" style="width:75.65pt;height:49.55pt" o:ole="">
+          <v:shape id="_x0000_i1025" type="#_x0000_t75" style="width:75.6pt;height:49.35pt" o:ole="">
             <v:imagedata r:id="rId9" o:title=""/>
           </v:shape>
-          <o:OLEObject Type="Embed" ProgID="Package" ShapeID="_x0000_i1025" DrawAspect="Icon" ObjectID="_1836416154" r:id="rId10"/>
+          <o:OLEObject Type="Embed" ProgID="Package" ShapeID="_x0000_i1025" DrawAspect="Icon" ObjectID="_1837196363" r:id="rId10"/>
         </w:object>
       </w:r>
     </w:p>
@@ -4402,10 +4388,10 @@
     <w:p>
       <w:r>
         <w:object w:dxaOrig="1514" w:dyaOrig="987" w14:anchorId="56E11D1A">
-          <v:shape id="_x0000_i1026" type="#_x0000_t75" style="width:75.65pt;height:49.55pt" o:ole="">
+          <v:shape id="_x0000_i1026" type="#_x0000_t75" style="width:75.6pt;height:49.35pt" o:ole="">
             <v:imagedata r:id="rId11" o:title=""/>
           </v:shape>
-          <o:OLEObject Type="Embed" ProgID="Package" ShapeID="_x0000_i1026" DrawAspect="Icon" ObjectID="_1836416155" r:id="rId12"/>
+          <o:OLEObject Type="Embed" ProgID="Package" ShapeID="_x0000_i1026" DrawAspect="Icon" ObjectID="_1837196364" r:id="rId12"/>
         </w:object>
       </w:r>
     </w:p>
@@ -4478,10 +4464,10 @@
     <w:p>
       <w:r>
         <w:object w:dxaOrig="1514" w:dyaOrig="987" w14:anchorId="0BC1555C">
-          <v:shape id="_x0000_i1027" type="#_x0000_t75" style="width:75.65pt;height:49.55pt" o:ole="">
+          <v:shape id="_x0000_i1027" type="#_x0000_t75" style="width:75.6pt;height:49.35pt" o:ole="">
             <v:imagedata r:id="rId14" o:title=""/>
           </v:shape>
-          <o:OLEObject Type="Embed" ProgID="Package" ShapeID="_x0000_i1027" DrawAspect="Icon" ObjectID="_1836416156" r:id="rId15"/>
+          <o:OLEObject Type="Embed" ProgID="Package" ShapeID="_x0000_i1027" DrawAspect="Icon" ObjectID="_1837196365" r:id="rId15"/>
         </w:object>
       </w:r>
     </w:p>
@@ -4554,10 +4540,10 @@
     <w:p>
       <w:r>
         <w:object w:dxaOrig="1514" w:dyaOrig="987" w14:anchorId="2F1BACAC">
-          <v:shape id="_x0000_i1028" type="#_x0000_t75" style="width:75.65pt;height:49.55pt" o:ole="">
+          <v:shape id="_x0000_i1028" type="#_x0000_t75" style="width:75.6pt;height:49.35pt" o:ole="">
             <v:imagedata r:id="rId17" o:title=""/>
           </v:shape>
-          <o:OLEObject Type="Embed" ProgID="Package" ShapeID="_x0000_i1028" DrawAspect="Icon" ObjectID="_1836416157" r:id="rId18"/>
+          <o:OLEObject Type="Embed" ProgID="Package" ShapeID="_x0000_i1028" DrawAspect="Icon" ObjectID="_1837196366" r:id="rId18"/>
         </w:object>
       </w:r>
     </w:p>
@@ -13260,9 +13246,20 @@
     <w:p>
       <w:pPr>
         <w:pStyle w:val="Heading1"/>
-      </w:pPr>
-      <w:r>
-        <w:t>8. E2E Test</w:t>
+        <w:rPr>
+          <w:b/>
+          <w:bCs/>
+        </w:rPr>
+      </w:pPr>
+      <w:r>
+        <w:t xml:space="preserve">8. </w:t>
+      </w:r>
+      <w:r>
+        <w:rPr>
+          <w:b/>
+          <w:bCs/>
+        </w:rPr>
+        <w:t>Entra ID User Lookup — Implementation Guide</w:t>
       </w:r>
     </w:p>
     <w:p>
@@ -13274,12 +13271,35 @@
           <w:b/>
           <w:bCs/>
         </w:rPr>
+        <w:t>docs/entra-user-lookup.md</w:t>
+      </w:r>
+    </w:p>
+    <w:p>
+      <w:pPr>
+        <w:pStyle w:val="Heading1"/>
+      </w:pPr>
+      <w:r>
+        <w:lastRenderedPageBreak/>
+        <w:t>9</w:t>
+      </w:r>
+      <w:r>
+        <w:t>. E2E Test</w:t>
+      </w:r>
+    </w:p>
+    <w:p>
+      <w:r>
+        <w:t xml:space="preserve">See </w:t>
+      </w:r>
+      <w:r>
+        <w:rPr>
+          <w:b/>
+          <w:bCs/>
+        </w:rPr>
         <w:t>docs/e2e-testing.md</w:t>
       </w:r>
     </w:p>
     <w:p>
       <w:r>
-        <w:lastRenderedPageBreak/>
         <w:t xml:space="preserve"> </w:t>
       </w:r>
     </w:p>
@@ -19036,7 +19056,6 @@
   <w:style w:type="character" w:default="1" w:styleId="DefaultParagraphFont">
     <w:name w:val="Default Paragraph Font"/>
     <w:uiPriority w:val="1"/>
-    <w:semiHidden/>
     <w:unhideWhenUsed/>
   </w:style>
   <w:style w:type="table" w:default="1" w:styleId="TableNormal">

</xml_diff>

<commit_message>
CR - Remove roles related. Keep group based authorization only
</commit_message>
<xml_diff>
--- a/docs/poc_notes.docx
+++ b/docs/poc_notes.docx
@@ -3415,10 +3415,85 @@
         <w:t>23</w:t>
       </w:r>
       <w:r>
+        <w:t>(</w:t>
+      </w:r>
+      <w:r>
+        <w:t>leap-poc-admin1@danielxtbsmgmail.onmicrosoft.com</w:t>
+      </w:r>
+      <w:r>
+        <w:t>)</w:t>
+      </w:r>
+    </w:p>
+    <w:p>
+      <w:pPr>
+        <w:ind w:left="720"/>
+      </w:pPr>
+      <w:r>
+        <w:t>leap-poc-admin2</w:t>
+      </w:r>
+      <w:r>
+        <w:t xml:space="preserve"> (Admin2 Leap)</w:t>
+      </w:r>
+    </w:p>
+    <w:p>
+      <w:pPr>
+        <w:ind w:left="720"/>
+      </w:pPr>
+      <w:r>
+        <w:t>leap-poc-wri</w:t>
+      </w:r>
+      <w:r>
+        <w:t>t</w:t>
+      </w:r>
+      <w:r>
+        <w:t>e1</w:t>
+      </w:r>
+      <w:r>
+        <w:t xml:space="preserve"> (Write1 Leap)</w:t>
+      </w:r>
+    </w:p>
+    <w:p>
+      <w:pPr>
+        <w:ind w:left="720"/>
+      </w:pPr>
+      <w:r>
+        <w:t>leap-poc-write2 (Write2 Leap)</w:t>
+      </w:r>
+    </w:p>
+    <w:p>
+      <w:pPr>
+        <w:ind w:left="720"/>
+      </w:pPr>
+      <w:r>
+        <w:t>leap-poc-read1</w:t>
+      </w:r>
+      <w:r>
+        <w:t xml:space="preserve"> (Admin1 Leap)</w:t>
+      </w:r>
+    </w:p>
+    <w:p>
+      <w:pPr>
+        <w:ind w:left="720"/>
+      </w:pPr>
+      <w:r>
+        <w:t>leap-poc-read2</w:t>
+      </w:r>
+      <w:r>
+        <w:t xml:space="preserve"> (Admin2 Leap)</w:t>
+      </w:r>
+    </w:p>
+    <w:p>
+      <w:pPr>
+        <w:ind w:left="720"/>
+      </w:pPr>
+      <w:r>
+        <w:t>approver1-reqularoty</w:t>
+      </w:r>
+      <w:r>
         <w:t xml:space="preserve"> (</w:t>
       </w:r>
       <w:r>
-        <w:t>leap-poc-admin1@danielxtbsmgmail.onmicrosoft.com</w:t>
+        <w:t>Approver1 Regulatory</w:t>
       </w:r>
       <w:r>
         <w:t>)</w:t>
@@ -3429,10 +3504,28 @@
         <w:ind w:left="720"/>
       </w:pPr>
       <w:r>
-        <w:t>leap-poc-admin2</w:t>
-      </w:r>
-      <w:r>
-        <w:t xml:space="preserve"> (Admin2 Leap)</w:t>
+        <w:t>approver</w:t>
+      </w:r>
+      <w:r>
+        <w:t>2</w:t>
+      </w:r>
+      <w:r>
+        <w:t>-reqularoty</w:t>
+      </w:r>
+      <w:r>
+        <w:t xml:space="preserve"> (</w:t>
+      </w:r>
+      <w:r>
+        <w:t>Approver</w:t>
+      </w:r>
+      <w:r>
+        <w:t>2</w:t>
+      </w:r>
+      <w:r>
+        <w:t xml:space="preserve"> Regulatory</w:t>
+      </w:r>
+      <w:r>
+        <w:t>)</w:t>
       </w:r>
     </w:p>
     <w:p>
@@ -3440,16 +3533,54 @@
         <w:ind w:left="720"/>
       </w:pPr>
       <w:r>
-        <w:t>leap-poc-wri</w:t>
+        <w:t>approver</w:t>
+      </w:r>
+      <w:r>
+        <w:t>3</w:t>
+      </w:r>
+      <w:r>
+        <w:t>-reqularoty</w:t>
+      </w:r>
+      <w:r>
+        <w:t xml:space="preserve"> (</w:t>
+      </w:r>
+      <w:r>
+        <w:t>Approver</w:t>
+      </w:r>
+      <w:r>
+        <w:t>3</w:t>
+      </w:r>
+      <w:r>
+        <w:t xml:space="preserve"> Regulatory</w:t>
+      </w:r>
+      <w:r>
+        <w:t>)</w:t>
+      </w:r>
+    </w:p>
+    <w:p>
+      <w:pPr>
+        <w:ind w:left="720"/>
+      </w:pPr>
+      <w:r>
+        <w:t>approver1-</w:t>
       </w:r>
       <w:r>
         <w:t>t</w:t>
       </w:r>
       <w:r>
-        <w:t>e1</w:t>
-      </w:r>
-      <w:r>
-        <w:t xml:space="preserve"> (Write1 Leap)</w:t>
+        <w:t>reasury</w:t>
+      </w:r>
+      <w:r>
+        <w:t xml:space="preserve"> </w:t>
+      </w:r>
+      <w:r>
+        <w:t>(</w:t>
+      </w:r>
+      <w:r>
+        <w:t>Approver1 Treasury</w:t>
+      </w:r>
+      <w:r>
+        <w:t>)</w:t>
       </w:r>
     </w:p>
     <w:p>
@@ -3457,7 +3588,34 @@
         <w:ind w:left="720"/>
       </w:pPr>
       <w:r>
-        <w:t>leap-poc-write2 (Write2 Leap)</w:t>
+        <w:t>approver</w:t>
+      </w:r>
+      <w:r>
+        <w:t>2</w:t>
+      </w:r>
+      <w:r>
+        <w:t>-</w:t>
+      </w:r>
+      <w:r>
+        <w:t>t</w:t>
+      </w:r>
+      <w:r>
+        <w:t>reasury</w:t>
+      </w:r>
+      <w:r>
+        <w:t xml:space="preserve"> (</w:t>
+      </w:r>
+      <w:r>
+        <w:t>Approver</w:t>
+      </w:r>
+      <w:r>
+        <w:t>2</w:t>
+      </w:r>
+      <w:r>
+        <w:t xml:space="preserve"> Treasury</w:t>
+      </w:r>
+      <w:r>
+        <w:t>)</w:t>
       </w:r>
     </w:p>
     <w:p>
@@ -3465,10 +3623,34 @@
         <w:ind w:left="720"/>
       </w:pPr>
       <w:r>
-        <w:t>leap-poc-read1</w:t>
-      </w:r>
-      <w:r>
-        <w:t xml:space="preserve"> (Admin1 Leap)</w:t>
+        <w:t>approver</w:t>
+      </w:r>
+      <w:r>
+        <w:t>3</w:t>
+      </w:r>
+      <w:r>
+        <w:t>-</w:t>
+      </w:r>
+      <w:r>
+        <w:t>t</w:t>
+      </w:r>
+      <w:r>
+        <w:t>reasury</w:t>
+      </w:r>
+      <w:r>
+        <w:t xml:space="preserve"> (</w:t>
+      </w:r>
+      <w:r>
+        <w:t>Approver</w:t>
+      </w:r>
+      <w:r>
+        <w:t>3</w:t>
+      </w:r>
+      <w:r>
+        <w:t xml:space="preserve"> Treasury</w:t>
+      </w:r>
+      <w:r>
+        <w:t>)</w:t>
       </w:r>
     </w:p>
     <w:p>
@@ -3476,11 +3658,396 @@
         <w:ind w:left="720"/>
       </w:pPr>
       <w:r>
-        <w:t>leap-poc-read2</w:t>
-      </w:r>
-      <w:r>
-        <w:t xml:space="preserve"> (Admin2 Leap)</w:t>
-      </w:r>
+        <w:t>approver1-</w:t>
+      </w:r>
+      <w:r>
+        <w:t>risk</w:t>
+      </w:r>
+      <w:r>
+        <w:t xml:space="preserve"> (</w:t>
+      </w:r>
+      <w:r>
+        <w:t>Approver1 Risk</w:t>
+      </w:r>
+      <w:r>
+        <w:t>)</w:t>
+      </w:r>
+    </w:p>
+    <w:p>
+      <w:pPr>
+        <w:ind w:left="720"/>
+      </w:pPr>
+      <w:r>
+        <w:t>approver</w:t>
+      </w:r>
+      <w:r>
+        <w:t>2</w:t>
+      </w:r>
+      <w:r>
+        <w:t>-</w:t>
+      </w:r>
+      <w:r>
+        <w:t>risk (</w:t>
+      </w:r>
+      <w:r>
+        <w:t>Approver</w:t>
+      </w:r>
+      <w:r>
+        <w:t>2</w:t>
+      </w:r>
+      <w:r>
+        <w:t xml:space="preserve"> Risk</w:t>
+      </w:r>
+      <w:r>
+        <w:t>)</w:t>
+      </w:r>
+    </w:p>
+    <w:p>
+      <w:pPr>
+        <w:ind w:left="720"/>
+      </w:pPr>
+      <w:r>
+        <w:t>approver</w:t>
+      </w:r>
+      <w:r>
+        <w:t>3</w:t>
+      </w:r>
+      <w:r>
+        <w:t>-</w:t>
+      </w:r>
+      <w:r>
+        <w:t>risk (</w:t>
+      </w:r>
+      <w:r>
+        <w:t>Approver</w:t>
+      </w:r>
+      <w:r>
+        <w:t>3</w:t>
+      </w:r>
+      <w:r>
+        <w:t xml:space="preserve"> Risk</w:t>
+      </w:r>
+      <w:r>
+        <w:t>)</w:t>
+      </w:r>
+    </w:p>
+    <w:p>
+      <w:pPr>
+        <w:ind w:left="720"/>
+      </w:pPr>
+      <w:r>
+        <w:t>approver1-</w:t>
+      </w:r>
+      <w:r>
+        <w:t>fin</w:t>
+      </w:r>
+      <w:r>
+        <w:t xml:space="preserve"> (</w:t>
+      </w:r>
+      <w:r>
+        <w:t>Approver1 Financial</w:t>
+      </w:r>
+      <w:r>
+        <w:t>)</w:t>
+      </w:r>
+    </w:p>
+    <w:p>
+      <w:pPr>
+        <w:ind w:left="720"/>
+      </w:pPr>
+      <w:r>
+        <w:t>approver</w:t>
+      </w:r>
+      <w:r>
+        <w:t>2</w:t>
+      </w:r>
+      <w:r>
+        <w:t>-</w:t>
+      </w:r>
+      <w:r>
+        <w:t>fin (</w:t>
+      </w:r>
+      <w:r>
+        <w:t>Approver</w:t>
+      </w:r>
+      <w:r>
+        <w:t>2</w:t>
+      </w:r>
+      <w:r>
+        <w:t xml:space="preserve"> Financial</w:t>
+      </w:r>
+      <w:r>
+        <w:t>)</w:t>
+      </w:r>
+    </w:p>
+    <w:p>
+      <w:pPr>
+        <w:ind w:left="720"/>
+      </w:pPr>
+      <w:r>
+        <w:t>approver</w:t>
+      </w:r>
+      <w:r>
+        <w:t>3</w:t>
+      </w:r>
+      <w:r>
+        <w:t>-</w:t>
+      </w:r>
+      <w:r>
+        <w:t>fin (</w:t>
+      </w:r>
+      <w:r>
+        <w:t>Approver</w:t>
+      </w:r>
+      <w:r>
+        <w:t>3</w:t>
+      </w:r>
+      <w:r>
+        <w:t xml:space="preserve"> Financial</w:t>
+      </w:r>
+      <w:r>
+        <w:t>)</w:t>
+      </w:r>
+    </w:p>
+    <w:p>
+      <w:pPr>
+        <w:ind w:left="720"/>
+      </w:pPr>
+      <w:r>
+        <w:lastRenderedPageBreak/>
+        <w:t>approver1-</w:t>
+      </w:r>
+      <w:r>
+        <w:t xml:space="preserve">audit </w:t>
+      </w:r>
+      <w:r>
+        <w:t>(</w:t>
+      </w:r>
+      <w:r>
+        <w:t>Approver1 Audit</w:t>
+      </w:r>
+      <w:r>
+        <w:t>)</w:t>
+      </w:r>
+    </w:p>
+    <w:p>
+      <w:pPr>
+        <w:ind w:left="720"/>
+      </w:pPr>
+      <w:r>
+        <w:t>approver</w:t>
+      </w:r>
+      <w:r>
+        <w:t>2</w:t>
+      </w:r>
+      <w:r>
+        <w:t>-</w:t>
+      </w:r>
+      <w:r>
+        <w:t>audit (</w:t>
+      </w:r>
+      <w:r>
+        <w:t>Approver</w:t>
+      </w:r>
+      <w:r>
+        <w:t>2</w:t>
+      </w:r>
+      <w:r>
+        <w:t xml:space="preserve"> Audit</w:t>
+      </w:r>
+      <w:r>
+        <w:t>)</w:t>
+      </w:r>
+    </w:p>
+    <w:p>
+      <w:pPr>
+        <w:ind w:left="720"/>
+      </w:pPr>
+      <w:r>
+        <w:t>approver</w:t>
+      </w:r>
+      <w:r>
+        <w:t>3</w:t>
+      </w:r>
+      <w:r>
+        <w:t>-</w:t>
+      </w:r>
+      <w:r>
+        <w:t>audit (</w:t>
+      </w:r>
+      <w:r>
+        <w:t>Approver</w:t>
+      </w:r>
+      <w:r>
+        <w:t>3</w:t>
+      </w:r>
+      <w:r>
+        <w:t xml:space="preserve"> Audit</w:t>
+      </w:r>
+      <w:r>
+        <w:t>)</w:t>
+      </w:r>
+    </w:p>
+    <w:p>
+      <w:pPr>
+        <w:ind w:left="720"/>
+      </w:pPr>
+      <w:r>
+        <w:t>maker</w:t>
+      </w:r>
+      <w:r>
+        <w:t>1-</w:t>
+      </w:r>
+      <w:r>
+        <w:t>reporting</w:t>
+      </w:r>
+      <w:r>
+        <w:t xml:space="preserve"> (</w:t>
+      </w:r>
+      <w:r>
+        <w:t>Maker</w:t>
+      </w:r>
+      <w:r>
+        <w:t xml:space="preserve">1 </w:t>
+      </w:r>
+      <w:r>
+        <w:t>Reporting</w:t>
+      </w:r>
+      <w:r>
+        <w:t>)</w:t>
+      </w:r>
+    </w:p>
+    <w:p>
+      <w:pPr>
+        <w:ind w:left="720"/>
+      </w:pPr>
+      <w:r>
+        <w:t>maker2</w:t>
+      </w:r>
+      <w:r>
+        <w:t>-</w:t>
+      </w:r>
+      <w:r>
+        <w:t>reporting (Maker</w:t>
+      </w:r>
+      <w:r>
+        <w:t>2</w:t>
+      </w:r>
+      <w:r>
+        <w:t xml:space="preserve"> </w:t>
+      </w:r>
+      <w:r>
+        <w:t>Reporting)</w:t>
+      </w:r>
+    </w:p>
+    <w:p>
+      <w:pPr>
+        <w:ind w:left="720"/>
+      </w:pPr>
+      <w:r>
+        <w:t>maker3</w:t>
+      </w:r>
+      <w:r>
+        <w:t>-</w:t>
+      </w:r>
+      <w:r>
+        <w:t>reporting (Maker</w:t>
+      </w:r>
+      <w:r>
+        <w:t>3</w:t>
+      </w:r>
+      <w:r>
+        <w:t xml:space="preserve"> </w:t>
+      </w:r>
+      <w:r>
+        <w:t>Reporting)</w:t>
+      </w:r>
+    </w:p>
+    <w:p>
+      <w:pPr>
+        <w:ind w:left="720"/>
+      </w:pPr>
+      <w:r>
+        <w:t>maker</w:t>
+      </w:r>
+      <w:r>
+        <w:t>1-</w:t>
+      </w:r>
+      <w:r>
+        <w:t>t</w:t>
+      </w:r>
+      <w:r>
+        <w:t>reasury</w:t>
+      </w:r>
+      <w:r>
+        <w:t xml:space="preserve"> </w:t>
+      </w:r>
+      <w:r>
+        <w:t>(Maker</w:t>
+      </w:r>
+      <w:r>
+        <w:t>1 Treasury</w:t>
+      </w:r>
+      <w:r>
+        <w:t>)</w:t>
+      </w:r>
+    </w:p>
+    <w:p>
+      <w:pPr>
+        <w:ind w:left="720"/>
+      </w:pPr>
+      <w:r>
+        <w:t>maker2</w:t>
+      </w:r>
+      <w:r>
+        <w:t>-</w:t>
+      </w:r>
+      <w:r>
+        <w:t>t</w:t>
+      </w:r>
+      <w:r>
+        <w:t xml:space="preserve">reasury </w:t>
+      </w:r>
+      <w:r>
+        <w:t>(Maker2</w:t>
+      </w:r>
+      <w:r>
+        <w:t xml:space="preserve"> Treasury</w:t>
+      </w:r>
+      <w:r>
+        <w:t>)</w:t>
+      </w:r>
+    </w:p>
+    <w:p>
+      <w:pPr>
+        <w:ind w:left="720"/>
+      </w:pPr>
+      <w:r>
+        <w:t>maker3</w:t>
+      </w:r>
+      <w:r>
+        <w:t>-</w:t>
+      </w:r>
+      <w:r>
+        <w:t>t</w:t>
+      </w:r>
+      <w:r>
+        <w:t xml:space="preserve">reasury </w:t>
+      </w:r>
+      <w:r>
+        <w:t>(Maker3</w:t>
+      </w:r>
+      <w:r>
+        <w:t xml:space="preserve"> Treasury</w:t>
+      </w:r>
+      <w:r>
+        <w:t>)</w:t>
+      </w:r>
+    </w:p>
+    <w:p>
+      <w:pPr>
+        <w:ind w:left="720"/>
+      </w:pPr>
     </w:p>
     <w:p>
       <w:pPr>
@@ -3557,13 +4124,8 @@
         </w:numPr>
       </w:pPr>
       <w:r>
-        <w:t xml:space="preserve">Name: </w:t>
-      </w:r>
-      <w:proofErr w:type="spellStart"/>
-      <w:r>
-        <w:t>poc-bff</w:t>
-      </w:r>
-      <w:proofErr w:type="spellEnd"/>
+        <w:t>Name: poc-bff</w:t>
+      </w:r>
     </w:p>
     <w:p>
       <w:pPr>
@@ -3671,6 +4233,7 @@
       </w:pPr>
       <w:bookmarkStart w:id="7" w:name="_Toc225694761"/>
       <w:r>
+        <w:lastRenderedPageBreak/>
         <w:t>2</w:t>
       </w:r>
       <w:r>
@@ -3687,15 +4250,7 @@
         </w:numPr>
       </w:pPr>
       <w:r>
-        <w:t xml:space="preserve">App registrations → </w:t>
-      </w:r>
-      <w:proofErr w:type="spellStart"/>
-      <w:r>
-        <w:t>poc-bff</w:t>
-      </w:r>
-      <w:proofErr w:type="spellEnd"/>
-      <w:r>
-        <w:t xml:space="preserve"> →</w:t>
+        <w:t>App registrations → poc-bff →</w:t>
       </w:r>
       <w:r>
         <w:t xml:space="preserve"> </w:t>
@@ -3737,7 +4292,6 @@
           <w:b/>
           <w:bCs/>
         </w:rPr>
-        <w:lastRenderedPageBreak/>
         <w:t>New client secret</w:t>
       </w:r>
     </w:p>
@@ -3807,15 +4361,7 @@
         </w:numPr>
       </w:pPr>
       <w:r>
-        <w:t xml:space="preserve">App registrations → </w:t>
-      </w:r>
-      <w:proofErr w:type="spellStart"/>
-      <w:r>
-        <w:t>poc-bff</w:t>
-      </w:r>
-      <w:proofErr w:type="spellEnd"/>
-      <w:r>
-        <w:t xml:space="preserve"> → </w:t>
+        <w:t xml:space="preserve">App registrations → poc-bff → </w:t>
       </w:r>
       <w:r>
         <w:rPr>
@@ -3894,15 +4440,7 @@
         </w:r>
       </w:hyperlink>
       <w:r>
-        <w:t xml:space="preserve"> </w:t>
-      </w:r>
-      <w:proofErr w:type="gramStart"/>
-      <w:r>
-        <w:t xml:space="preserve">  ??</w:t>
-      </w:r>
-      <w:proofErr w:type="gramEnd"/>
-      <w:r>
-        <w:t xml:space="preserve"> </w:t>
+        <w:t xml:space="preserve">   ?? </w:t>
       </w:r>
       <w:r>
         <w:t>The logout URL must start with "HTTPS"</w:t>
@@ -3998,15 +4536,7 @@
         </w:numPr>
       </w:pPr>
       <w:r>
-        <w:t xml:space="preserve">App registrations → </w:t>
-      </w:r>
-      <w:proofErr w:type="spellStart"/>
-      <w:r>
-        <w:t>poc-bff</w:t>
-      </w:r>
-      <w:proofErr w:type="spellEnd"/>
-      <w:r>
-        <w:t xml:space="preserve"> → </w:t>
+        <w:t xml:space="preserve">App registrations → poc-bff → </w:t>
       </w:r>
       <w:r>
         <w:rPr>
@@ -4060,6 +4590,7 @@
         </w:tabs>
       </w:pPr>
       <w:r>
+        <w:lastRenderedPageBreak/>
         <w:t xml:space="preserve">Allowed member types: </w:t>
       </w:r>
       <w:r>
@@ -4095,7 +4626,6 @@
         </w:tabs>
       </w:pPr>
       <w:r>
-        <w:lastRenderedPageBreak/>
         <w:t>Enabled: yes</w:t>
       </w:r>
     </w:p>
@@ -4185,7 +4715,6 @@
       <w:r>
         <w:t xml:space="preserve">Find </w:t>
       </w:r>
-      <w:proofErr w:type="spellStart"/>
       <w:r>
         <w:rPr>
           <w:b/>
@@ -4193,7 +4722,6 @@
         </w:rPr>
         <w:t>poc-bff</w:t>
       </w:r>
-      <w:proofErr w:type="spellEnd"/>
       <w:r>
         <w:t xml:space="preserve"> (this is the service principal created from your app registration)</w:t>
       </w:r>
@@ -4293,11 +4821,7 @@
         <w:t>✅</w:t>
       </w:r>
       <w:r>
-        <w:t xml:space="preserve"> Now Entra will include </w:t>
-      </w:r>
-      <w:proofErr w:type="gramStart"/>
-      <w:r>
-        <w:t xml:space="preserve">a </w:t>
+        <w:t xml:space="preserve"> Now Entra will include a </w:t>
       </w:r>
       <w:r>
         <w:rPr>
@@ -4306,7 +4830,6 @@
         </w:rPr>
         <w:t>roles</w:t>
       </w:r>
-      <w:proofErr w:type="gramEnd"/>
       <w:r>
         <w:t xml:space="preserve"> claim in tokens for these users.</w:t>
       </w:r>
@@ -4358,7 +4881,7 @@
           <v:shape id="_x0000_i1025" type="#_x0000_t75" style="width:75.6pt;height:49.35pt" o:ole="">
             <v:imagedata r:id="rId9" o:title=""/>
           </v:shape>
-          <o:OLEObject Type="Embed" ProgID="Package" ShapeID="_x0000_i1025" DrawAspect="Icon" ObjectID="_1837196363" r:id="rId10"/>
+          <o:OLEObject Type="Embed" ProgID="Package" ShapeID="_x0000_i1025" DrawAspect="Icon" ObjectID="_1838926936" r:id="rId10"/>
         </w:object>
       </w:r>
     </w:p>
@@ -4368,6 +4891,7 @@
       </w:pPr>
       <w:bookmarkStart w:id="12" w:name="_Toc225694766"/>
       <w:r>
+        <w:lastRenderedPageBreak/>
         <w:t>3.</w:t>
       </w:r>
       <w:r>
@@ -4391,7 +4915,7 @@
           <v:shape id="_x0000_i1026" type="#_x0000_t75" style="width:75.6pt;height:49.35pt" o:ole="">
             <v:imagedata r:id="rId11" o:title=""/>
           </v:shape>
-          <o:OLEObject Type="Embed" ProgID="Package" ShapeID="_x0000_i1026" DrawAspect="Icon" ObjectID="_1837196364" r:id="rId12"/>
+          <o:OLEObject Type="Embed" ProgID="Package" ShapeID="_x0000_i1026" DrawAspect="Icon" ObjectID="_1838926937" r:id="rId12"/>
         </w:object>
       </w:r>
     </w:p>
@@ -4400,7 +4924,6 @@
         <w:rPr>
           <w:noProof/>
         </w:rPr>
-        <w:lastRenderedPageBreak/>
         <w:drawing>
           <wp:inline distT="0" distB="0" distL="0" distR="0" wp14:anchorId="3B438693" wp14:editId="6133D155">
             <wp:extent cx="6564630" cy="5034915"/>
@@ -4457,6 +4980,7 @@
       </w:pPr>
       <w:bookmarkStart w:id="14" w:name="_Toc225694768"/>
       <w:r>
+        <w:lastRenderedPageBreak/>
         <w:t>3.1.2 Component Diagram</w:t>
       </w:r>
       <w:bookmarkEnd w:id="14"/>
@@ -4467,7 +4991,7 @@
           <v:shape id="_x0000_i1027" type="#_x0000_t75" style="width:75.6pt;height:49.35pt" o:ole="">
             <v:imagedata r:id="rId14" o:title=""/>
           </v:shape>
-          <o:OLEObject Type="Embed" ProgID="Package" ShapeID="_x0000_i1027" DrawAspect="Icon" ObjectID="_1837196365" r:id="rId15"/>
+          <o:OLEObject Type="Embed" ProgID="Package" ShapeID="_x0000_i1027" DrawAspect="Icon" ObjectID="_1838926938" r:id="rId15"/>
         </w:object>
       </w:r>
     </w:p>
@@ -4476,7 +5000,6 @@
         <w:rPr>
           <w:noProof/>
         </w:rPr>
-        <w:lastRenderedPageBreak/>
         <w:drawing>
           <wp:inline distT="0" distB="0" distL="0" distR="0" wp14:anchorId="717FDD54" wp14:editId="00F0091E">
             <wp:extent cx="6558280" cy="2159000"/>
@@ -4543,7 +5066,7 @@
           <v:shape id="_x0000_i1028" type="#_x0000_t75" style="width:75.6pt;height:49.35pt" o:ole="">
             <v:imagedata r:id="rId17" o:title=""/>
           </v:shape>
-          <o:OLEObject Type="Embed" ProgID="Package" ShapeID="_x0000_i1028" DrawAspect="Icon" ObjectID="_1837196366" r:id="rId18"/>
+          <o:OLEObject Type="Embed" ProgID="Package" ShapeID="_x0000_i1028" DrawAspect="Icon" ObjectID="_1838926939" r:id="rId18"/>
         </w:object>
       </w:r>
     </w:p>
@@ -4552,6 +5075,7 @@
         <w:rPr>
           <w:noProof/>
         </w:rPr>
+        <w:lastRenderedPageBreak/>
         <w:drawing>
           <wp:inline distT="0" distB="0" distL="0" distR="0" wp14:anchorId="6FF269C0" wp14:editId="338E9B7E">
             <wp:extent cx="6569075" cy="2414270"/>
@@ -4608,7 +5132,6 @@
       </w:pPr>
       <w:bookmarkStart w:id="16" w:name="_Toc225694770"/>
       <w:r>
-        <w:lastRenderedPageBreak/>
         <w:t>3.2 Implementation Plan (Phases Checklist)</w:t>
       </w:r>
       <w:bookmarkEnd w:id="16"/>
@@ -4848,13 +5371,8 @@
           </w:tcPr>
           <w:p>
             <w:r>
-              <w:t xml:space="preserve">DTOs, </w:t>
-            </w:r>
-            <w:proofErr w:type="spellStart"/>
-            <w:r>
-              <w:t>RoleConstants</w:t>
-            </w:r>
-            <w:proofErr w:type="spellEnd"/>
+              <w:t>DTOs, RoleConstants</w:t>
+            </w:r>
           </w:p>
         </w:tc>
       </w:tr>
@@ -4914,19 +5432,9 @@
             <w:hideMark/>
           </w:tcPr>
           <w:p>
-            <w:proofErr w:type="spellStart"/>
-            <w:r>
-              <w:t>SecurityConfig</w:t>
-            </w:r>
-            <w:proofErr w:type="spellEnd"/>
-            <w:r>
-              <w:t> with oauth2Login, CSRF cookie, authority mapper, </w:t>
-            </w:r>
-            <w:proofErr w:type="spellStart"/>
-            <w:r>
-              <w:t>application.yml</w:t>
-            </w:r>
-            <w:proofErr w:type="spellEnd"/>
+            <w:r>
+              <w:t>SecurityConfig with oauth2Login, CSRF cookie, authority mapper, application.yml</w:t>
+            </w:r>
           </w:p>
         </w:tc>
       </w:tr>
@@ -4968,15 +5476,7 @@
           </w:tcPr>
           <w:p>
             <w:r>
-              <w:t>/</w:t>
-            </w:r>
-            <w:proofErr w:type="spellStart"/>
-            <w:r>
-              <w:t>api</w:t>
-            </w:r>
-            <w:proofErr w:type="spellEnd"/>
-            <w:r>
-              <w:t>/me endpoint</w:t>
+              <w:t>/api/me endpoint</w:t>
             </w:r>
           </w:p>
         </w:tc>
@@ -5057,20 +5557,7 @@
           </w:tcPr>
           <w:p>
             <w:r>
-              <w:t xml:space="preserve">ng new, </w:t>
-            </w:r>
-            <w:proofErr w:type="spellStart"/>
-            <w:r>
-              <w:t>proxy.</w:t>
-            </w:r>
-            <w:proofErr w:type="gramStart"/>
-            <w:r>
-              <w:t>conf.json</w:t>
-            </w:r>
-            <w:proofErr w:type="spellEnd"/>
-            <w:proofErr w:type="gramEnd"/>
-            <w:r>
-              <w:t xml:space="preserve"> → localhost:</w:t>
+              <w:t>ng new, proxy.conf.json → localhost:</w:t>
             </w:r>
             <w:r>
               <w:t>1</w:t>
@@ -5200,15 +5687,7 @@
           </w:tcPr>
           <w:p>
             <w:r>
-              <w:t>GET /</w:t>
-            </w:r>
-            <w:proofErr w:type="spellStart"/>
-            <w:r>
-              <w:t>api</w:t>
-            </w:r>
-            <w:proofErr w:type="spellEnd"/>
-            <w:r>
-              <w:t>/me, cache result, route guards</w:t>
+              <w:t>GET /api/me, cache result, route guards</w:t>
             </w:r>
           </w:p>
         </w:tc>
@@ -5628,15 +6107,7 @@
           </w:tcPr>
           <w:p>
             <w:r>
-              <w:t xml:space="preserve">Sees "User </w:t>
-            </w:r>
-            <w:proofErr w:type="spellStart"/>
-            <w:r>
-              <w:t>Mgmt</w:t>
-            </w:r>
-            <w:proofErr w:type="spellEnd"/>
-            <w:r>
-              <w:t>"</w:t>
+              <w:t>Sees "User Mgmt"</w:t>
             </w:r>
           </w:p>
         </w:tc>
@@ -5694,11 +6165,9 @@
             <w:hideMark/>
           </w:tcPr>
           <w:p>
-            <w:proofErr w:type="spellStart"/>
             <w:r>
               <w:t>admin@yourtenant</w:t>
             </w:r>
-            <w:proofErr w:type="spellEnd"/>
           </w:p>
         </w:tc>
         <w:tc>
@@ -5793,11 +6262,9 @@
             <w:hideMark/>
           </w:tcPr>
           <w:p>
-            <w:proofErr w:type="spellStart"/>
             <w:r>
               <w:t>admin-rw@yourtenant</w:t>
             </w:r>
-            <w:proofErr w:type="spellEnd"/>
           </w:p>
         </w:tc>
         <w:tc>
@@ -5892,11 +6359,9 @@
             <w:hideMark/>
           </w:tcPr>
           <w:p>
-            <w:proofErr w:type="spellStart"/>
             <w:r>
               <w:t>reader@yourtenant</w:t>
             </w:r>
-            <w:proofErr w:type="spellEnd"/>
           </w:p>
         </w:tc>
         <w:tc>
@@ -5991,12 +6456,9 @@
             <w:hideMark/>
           </w:tcPr>
           <w:p>
-            <w:proofErr w:type="spellStart"/>
-            <w:r>
-              <w:lastRenderedPageBreak/>
+            <w:r>
               <w:t>writer@yourtenant</w:t>
             </w:r>
-            <w:proofErr w:type="spellEnd"/>
           </w:p>
         </w:tc>
         <w:tc>
@@ -6091,11 +6553,9 @@
             <w:hideMark/>
           </w:tcPr>
           <w:p>
-            <w:proofErr w:type="spellStart"/>
             <w:r>
               <w:t>reader-writer@yourtenant</w:t>
             </w:r>
-            <w:proofErr w:type="spellEnd"/>
           </w:p>
         </w:tc>
         <w:tc>
@@ -6350,13 +6810,8 @@
         </w:numPr>
       </w:pPr>
       <w:r>
-        <w:t>leap-</w:t>
-      </w:r>
-      <w:proofErr w:type="spellStart"/>
-      <w:r>
-        <w:t>frontedn</w:t>
-      </w:r>
-      <w:proofErr w:type="spellEnd"/>
+        <w:t>leap-frontedn</w:t>
+      </w:r>
     </w:p>
     <w:p>
       <w:pPr>
@@ -6364,6 +6819,7 @@
       </w:pPr>
       <w:bookmarkStart w:id="19" w:name="_Toc225694773"/>
       <w:r>
+        <w:lastRenderedPageBreak/>
         <w:t>3.4.1 What was built</w:t>
       </w:r>
       <w:bookmarkEnd w:id="19"/>
@@ -6506,27 +6962,9 @@
             <w:hideMark/>
           </w:tcPr>
           <w:p>
-            <w:proofErr w:type="spellStart"/>
-            <w:r>
-              <w:t>UserInfoDto</w:t>
-            </w:r>
-            <w:proofErr w:type="spellEnd"/>
-            <w:r>
-              <w:t>, </w:t>
-            </w:r>
-            <w:proofErr w:type="spellStart"/>
-            <w:r>
-              <w:t>BudgetRowDto</w:t>
-            </w:r>
-            <w:proofErr w:type="spellEnd"/>
-            <w:r>
-              <w:t>, </w:t>
-            </w:r>
-            <w:proofErr w:type="spellStart"/>
-            <w:r>
-              <w:t>RoleConstants</w:t>
-            </w:r>
-            <w:proofErr w:type="spellEnd"/>
+            <w:r>
+              <w:t>UserInfoDto, BudgetRowDto, RoleConstants</w:t>
+            </w:r>
           </w:p>
         </w:tc>
       </w:tr>
@@ -6569,15 +7007,7 @@
           </w:tcPr>
           <w:p>
             <w:r>
-              <w:t>GET /</w:t>
-            </w:r>
-            <w:proofErr w:type="spellStart"/>
-            <w:r>
-              <w:t>api</w:t>
-            </w:r>
-            <w:proofErr w:type="spellEnd"/>
-            <w:r>
-              <w:t>/me — returns user info + mapped roles (or anon)</w:t>
+              <w:t>GET /api/me — returns user info + mapped roles (or anon)</w:t>
             </w:r>
           </w:p>
         </w:tc>
@@ -6602,7 +7032,6 @@
                 <w:b/>
                 <w:bCs/>
               </w:rPr>
-              <w:lastRenderedPageBreak/>
               <w:t>leap-budget-report</w:t>
             </w:r>
           </w:p>
@@ -6622,23 +7051,7 @@
           </w:tcPr>
           <w:p>
             <w:r>
-              <w:t>GET /</w:t>
-            </w:r>
-            <w:proofErr w:type="spellStart"/>
-            <w:r>
-              <w:t>api</w:t>
-            </w:r>
-            <w:proofErr w:type="spellEnd"/>
-            <w:r>
-              <w:t>/budget (APP_READ/WRITE), PUT /</w:t>
-            </w:r>
-            <w:proofErr w:type="spellStart"/>
-            <w:r>
-              <w:t>api</w:t>
-            </w:r>
-            <w:proofErr w:type="spellEnd"/>
-            <w:r>
-              <w:t>/budget/{id} (APP_WRITE), in-memory repo with 6 seed rows</w:t>
+              <w:t>GET /api/budget (APP_READ/WRITE), PUT /api/budget/{id} (APP_WRITE), in-memory repo with 6 seed rows</w:t>
             </w:r>
           </w:p>
         </w:tc>
@@ -6681,29 +7094,8 @@
             <w:hideMark/>
           </w:tcPr>
           <w:p>
-            <w:proofErr w:type="spellStart"/>
-            <w:r>
-              <w:t>SecurityConfig</w:t>
-            </w:r>
-            <w:proofErr w:type="spellEnd"/>
-            <w:r>
-              <w:t xml:space="preserve"> — oauth2Login, CSRF cookie, Entra </w:t>
-            </w:r>
-            <w:proofErr w:type="spellStart"/>
-            <w:r>
-              <w:t>roles→ROLE_APP</w:t>
-            </w:r>
-            <w:proofErr w:type="spellEnd"/>
-            <w:r>
-              <w:t>_* mapper, session-based auth. </w:t>
-            </w:r>
-            <w:proofErr w:type="spellStart"/>
-            <w:r>
-              <w:t>application.yml</w:t>
-            </w:r>
-            <w:proofErr w:type="spellEnd"/>
-            <w:r>
-              <w:t> reads ENTRA_* env vars</w:t>
+            <w:r>
+              <w:t>SecurityConfig — oauth2Login, CSRF cookie, Entra roles→ROLE_APP_* mapper, session-based auth. application.yml reads ENTRA_* env vars</w:t>
             </w:r>
           </w:p>
         </w:tc>
@@ -6832,7 +7224,6 @@
             <w:hideMark/>
           </w:tcPr>
           <w:p>
-            <w:proofErr w:type="spellStart"/>
             <w:r>
               <w:rPr>
                 <w:b/>
@@ -6840,7 +7231,6 @@
               </w:rPr>
               <w:t>AuthService</w:t>
             </w:r>
-            <w:proofErr w:type="spellEnd"/>
           </w:p>
         </w:tc>
         <w:tc>
@@ -6858,52 +7248,7 @@
           </w:tcPr>
           <w:p>
             <w:r>
-              <w:t>Calls /</w:t>
-            </w:r>
-            <w:proofErr w:type="spellStart"/>
-            <w:r>
-              <w:t>api</w:t>
-            </w:r>
-            <w:proofErr w:type="spellEnd"/>
-            <w:r>
-              <w:t xml:space="preserve">/me on </w:t>
-            </w:r>
-            <w:proofErr w:type="spellStart"/>
-            <w:r>
-              <w:t>init</w:t>
-            </w:r>
-            <w:proofErr w:type="spellEnd"/>
-            <w:r>
-              <w:t>, caches user, exposes </w:t>
-            </w:r>
-            <w:proofErr w:type="spellStart"/>
-            <w:proofErr w:type="gramStart"/>
-            <w:r>
-              <w:t>hasRole</w:t>
-            </w:r>
-            <w:proofErr w:type="spellEnd"/>
-            <w:r>
-              <w:t>(</w:t>
-            </w:r>
-            <w:proofErr w:type="gramEnd"/>
-            <w:r>
-              <w:t>), </w:t>
-            </w:r>
-            <w:proofErr w:type="gramStart"/>
-            <w:r>
-              <w:t>login(</w:t>
-            </w:r>
-            <w:proofErr w:type="gramEnd"/>
-            <w:r>
-              <w:t>), </w:t>
-            </w:r>
-            <w:proofErr w:type="gramStart"/>
-            <w:r>
-              <w:t>logout(</w:t>
-            </w:r>
-            <w:proofErr w:type="gramEnd"/>
-            <w:r>
-              <w:t>)</w:t>
+              <w:t>Calls /api/me on init, caches user, exposes hasRole(), login(), logout()</w:t>
             </w:r>
           </w:p>
         </w:tc>
@@ -6923,7 +7268,6 @@
             <w:hideMark/>
           </w:tcPr>
           <w:p>
-            <w:proofErr w:type="spellStart"/>
             <w:r>
               <w:rPr>
                 <w:b/>
@@ -6931,7 +7275,6 @@
               </w:rPr>
               <w:t>csrfInterceptor</w:t>
             </w:r>
-            <w:proofErr w:type="spellEnd"/>
           </w:p>
         </w:tc>
         <w:tc>
@@ -6969,7 +7312,6 @@
             <w:hideMark/>
           </w:tcPr>
           <w:p>
-            <w:proofErr w:type="spellStart"/>
             <w:r>
               <w:rPr>
                 <w:b/>
@@ -6977,7 +7319,6 @@
               </w:rPr>
               <w:t>roleGuard</w:t>
             </w:r>
-            <w:proofErr w:type="spellEnd"/>
           </w:p>
         </w:tc>
         <w:tc>
@@ -6997,32 +7338,14 @@
             <w:r>
               <w:t>Route guard factory: </w:t>
             </w:r>
-            <w:proofErr w:type="spellStart"/>
-            <w:r>
-              <w:fldChar w:fldCharType="begin"/>
-            </w:r>
-            <w:r>
-              <w:instrText>HYPERLINK "vscode-file://vscode-app/d:/apps/Microsoft%20VS%20Code/072586267e/resources/app/out/vs/code/electron-browser/workbench/workbench.html" \o ""</w:instrText>
-            </w:r>
-            <w:r>
-              <w:fldChar w:fldCharType="separate"/>
-            </w:r>
-            <w:r>
-              <w:rPr>
-                <w:rStyle w:val="Hyperlink"/>
-              </w:rPr>
-              <w:t>roleGuard</w:t>
-            </w:r>
-            <w:proofErr w:type="spellEnd"/>
-            <w:r>
-              <w:rPr>
-                <w:rStyle w:val="Hyperlink"/>
-              </w:rPr>
-              <w:t>('APP_READ', 'APP_WRITE')</w:t>
-            </w:r>
-            <w:r>
-              <w:fldChar w:fldCharType="end"/>
-            </w:r>
+            <w:hyperlink r:id="rId20" w:history="1">
+              <w:r>
+                <w:rPr>
+                  <w:rStyle w:val="Hyperlink"/>
+                </w:rPr>
+                <w:t>roleGuard('APP_READ', 'APP_WRITE')</w:t>
+              </w:r>
+            </w:hyperlink>
           </w:p>
         </w:tc>
       </w:tr>
@@ -7041,7 +7364,6 @@
             <w:hideMark/>
           </w:tcPr>
           <w:p>
-            <w:proofErr w:type="spellStart"/>
             <w:r>
               <w:rPr>
                 <w:b/>
@@ -7049,7 +7371,6 @@
               </w:rPr>
               <w:t>HeaderComponent</w:t>
             </w:r>
-            <w:proofErr w:type="spellEnd"/>
           </w:p>
         </w:tc>
         <w:tc>
@@ -7087,7 +7408,6 @@
             <w:hideMark/>
           </w:tcPr>
           <w:p>
-            <w:proofErr w:type="spellStart"/>
             <w:r>
               <w:rPr>
                 <w:b/>
@@ -7095,7 +7415,6 @@
               </w:rPr>
               <w:t>WelcomeComponent</w:t>
             </w:r>
-            <w:proofErr w:type="spellEnd"/>
           </w:p>
         </w:tc>
         <w:tc>
@@ -7133,7 +7452,6 @@
             <w:hideMark/>
           </w:tcPr>
           <w:p>
-            <w:proofErr w:type="spellStart"/>
             <w:r>
               <w:rPr>
                 <w:b/>
@@ -7141,7 +7459,6 @@
               </w:rPr>
               <w:t>UserManagementComponent</w:t>
             </w:r>
-            <w:proofErr w:type="spellEnd"/>
           </w:p>
         </w:tc>
         <w:tc>
@@ -7179,15 +7496,14 @@
             <w:hideMark/>
           </w:tcPr>
           <w:p>
-            <w:proofErr w:type="spellStart"/>
             <w:r>
               <w:rPr>
                 <w:b/>
                 <w:bCs/>
               </w:rPr>
+              <w:lastRenderedPageBreak/>
               <w:t>BudgetReportComponent</w:t>
             </w:r>
-            <w:proofErr w:type="spellEnd"/>
           </w:p>
         </w:tc>
         <w:tc>
@@ -7225,24 +7541,13 @@
             <w:hideMark/>
           </w:tcPr>
           <w:p>
-            <w:proofErr w:type="spellStart"/>
             <w:r>
               <w:rPr>
                 <w:b/>
                 <w:bCs/>
               </w:rPr>
-              <w:t>proxy.</w:t>
-            </w:r>
-            <w:proofErr w:type="gramStart"/>
-            <w:r>
-              <w:rPr>
-                <w:b/>
-                <w:bCs/>
-              </w:rPr>
-              <w:t>conf.json</w:t>
-            </w:r>
-            <w:proofErr w:type="spellEnd"/>
-            <w:proofErr w:type="gramEnd"/>
+              <w:t>proxy.conf.json</w:t>
+            </w:r>
           </w:p>
         </w:tc>
         <w:tc>
@@ -7260,15 +7565,7 @@
           </w:tcPr>
           <w:p>
             <w:r>
-              <w:t>Proxies /</w:t>
-            </w:r>
-            <w:proofErr w:type="spellStart"/>
-            <w:r>
-              <w:t>api</w:t>
-            </w:r>
-            <w:proofErr w:type="spellEnd"/>
-            <w:r>
-              <w:t xml:space="preserve">, /oauth2, /login, /logout → port </w:t>
+              <w:t xml:space="preserve">Proxies /api, /oauth2, /login, /logout → port </w:t>
             </w:r>
             <w:r>
               <w:t>1</w:t>
@@ -7287,7 +7584,6 @@
       </w:pPr>
       <w:bookmarkStart w:id="20" w:name="_Toc225694774"/>
       <w:r>
-        <w:lastRenderedPageBreak/>
         <w:t xml:space="preserve">3.4.2 </w:t>
       </w:r>
       <w:r>
@@ -7321,28 +7617,7 @@
         <w:t>Backend:</w:t>
       </w:r>
       <w:r>
-        <w:t> </w:t>
-      </w:r>
-      <w:proofErr w:type="spellStart"/>
-      <w:r>
-        <w:t>mvn</w:t>
-      </w:r>
-      <w:proofErr w:type="spellEnd"/>
-      <w:r>
-        <w:t xml:space="preserve"> </w:t>
-      </w:r>
-      <w:proofErr w:type="spellStart"/>
-      <w:r>
-        <w:t>spring-</w:t>
-      </w:r>
-      <w:proofErr w:type="gramStart"/>
-      <w:r>
-        <w:t>boot:run</w:t>
-      </w:r>
-      <w:proofErr w:type="spellEnd"/>
-      <w:proofErr w:type="gramEnd"/>
-      <w:r>
-        <w:t xml:space="preserve"> -pl leap-app (port </w:t>
+        <w:t xml:space="preserve"> mvn spring-boot:run -pl leap-app (port </w:t>
       </w:r>
       <w:r>
         <w:t>1</w:t>
@@ -7366,15 +7641,7 @@
         <w:t>Frontend:</w:t>
       </w:r>
       <w:r>
-        <w:t xml:space="preserve"> cd leap-frontend &amp;&amp; </w:t>
-      </w:r>
-      <w:proofErr w:type="spellStart"/>
-      <w:r>
-        <w:t>npm</w:t>
-      </w:r>
-      <w:proofErr w:type="spellEnd"/>
-      <w:r>
-        <w:t xml:space="preserve"> start (port 4200)</w:t>
+        <w:t> cd leap-frontend &amp;&amp; npm start (port 4200)</w:t>
       </w:r>
     </w:p>
     <w:p>
@@ -7499,7 +7766,6 @@
       <w:r>
         <w:t>se Spring Security's </w:t>
       </w:r>
-      <w:proofErr w:type="spellStart"/>
       <w:r>
         <w:rPr>
           <w:b/>
@@ -7507,7 +7773,6 @@
         </w:rPr>
         <w:t>OidcClientInitiatedLogoutSuccessHandler</w:t>
       </w:r>
-      <w:proofErr w:type="spellEnd"/>
       <w:r>
         <w:t> which</w:t>
       </w:r>
@@ -7530,6 +7795,7 @@
         <w:rPr>
           <w:bCs/>
         </w:rPr>
+        <w:lastRenderedPageBreak/>
         <w:t>Destroys the local Spring session</w:t>
       </w:r>
     </w:p>
@@ -7548,21 +7814,7 @@
         <w:rPr>
           <w:bCs/>
         </w:rPr>
-        <w:t xml:space="preserve">Redirects the browser to Entra's </w:t>
-      </w:r>
-      <w:proofErr w:type="spellStart"/>
-      <w:r>
-        <w:rPr>
-          <w:bCs/>
-        </w:rPr>
-        <w:t>end_session_endpoint</w:t>
-      </w:r>
-      <w:proofErr w:type="spellEnd"/>
-      <w:r>
-        <w:rPr>
-          <w:bCs/>
-        </w:rPr>
-        <w:t xml:space="preserve"> (https://login.microsoftonline.com/{tenant}/oauth2/v2.0/logout)</w:t>
+        <w:t>Redirects the browser to Entra's end_session_endpoint (https://login.microsoftonline.com/{tenant}/oauth2/v2.0/logout)</w:t>
       </w:r>
     </w:p>
     <w:p>
@@ -7600,7 +7852,7 @@
         </w:rPr>
         <w:t xml:space="preserve">Entra redirects back to </w:t>
       </w:r>
-      <w:hyperlink r:id="rId20" w:history="1">
+      <w:hyperlink r:id="rId21" w:history="1">
         <w:r>
           <w:rPr>
             <w:rStyle w:val="Hyperlink"/>
@@ -7622,17 +7874,8 @@
           <w:b/>
           <w:bCs/>
         </w:rPr>
-        <w:t>(Below is already done at the beginning</w:t>
-      </w:r>
-      <w:proofErr w:type="gramStart"/>
-      <w:r>
-        <w:rPr>
-          <w:b/>
-          <w:bCs/>
-        </w:rPr>
-        <w:t>) :</w:t>
-      </w:r>
-      <w:proofErr w:type="gramEnd"/>
+        <w:t>(Below is already done at the beginning) :</w:t>
+      </w:r>
     </w:p>
     <w:p>
       <w:pPr>
@@ -7694,22 +7937,7 @@
         <w:rPr>
           <w:bCs/>
         </w:rPr>
-        <w:lastRenderedPageBreak/>
-        <w:t>Azure Portal → App Registrations → "</w:t>
-      </w:r>
-      <w:proofErr w:type="spellStart"/>
-      <w:r>
-        <w:rPr>
-          <w:bCs/>
-        </w:rPr>
-        <w:t>poc-bff</w:t>
-      </w:r>
-      <w:proofErr w:type="spellEnd"/>
-      <w:r>
-        <w:rPr>
-          <w:bCs/>
-        </w:rPr>
-        <w:t>" → Authentication</w:t>
+        <w:t>Azure Portal → App Registrations → "poc-bff" → Authentication</w:t>
       </w:r>
     </w:p>
     <w:p>
@@ -7780,41 +8008,7 @@
     </w:p>
     <w:p>
       <w:r>
-        <w:t xml:space="preserve">The </w:t>
-      </w:r>
-      <w:proofErr w:type="spellStart"/>
-      <w:proofErr w:type="gramStart"/>
-      <w:r>
-        <w:t>principal.getAuthorities</w:t>
-      </w:r>
-      <w:proofErr w:type="spellEnd"/>
-      <w:proofErr w:type="gramEnd"/>
-      <w:r>
-        <w:t xml:space="preserve">() only has OIDC_USER, </w:t>
-      </w:r>
-      <w:proofErr w:type="spellStart"/>
-      <w:r>
-        <w:t>SCOPE_email</w:t>
-      </w:r>
-      <w:proofErr w:type="spellEnd"/>
-      <w:r>
-        <w:t xml:space="preserve">, </w:t>
-      </w:r>
-      <w:proofErr w:type="spellStart"/>
-      <w:r>
-        <w:t>SCOPE_openid</w:t>
-      </w:r>
-      <w:proofErr w:type="spellEnd"/>
-      <w:r>
-        <w:t xml:space="preserve">, </w:t>
-      </w:r>
-      <w:proofErr w:type="spellStart"/>
-      <w:r>
-        <w:t>SCOPE_profile</w:t>
-      </w:r>
-      <w:proofErr w:type="spellEnd"/>
-      <w:r>
-        <w:t>. No roles are being mapped.</w:t>
+        <w:t>The principal.getAuthorities() only has OIDC_USER, SCOPE_email, SCOPE_openid, SCOPE_profile. No roles are being mapped.</w:t>
       </w:r>
     </w:p>
     <w:p>
@@ -7841,68 +8035,20 @@
     </w:p>
     <w:p>
       <w:r>
-        <w:t>The old </w:t>
-      </w:r>
-      <w:proofErr w:type="spellStart"/>
-      <w:r>
-        <w:t>GrantedAuthoritiesMapper</w:t>
-      </w:r>
-      <w:proofErr w:type="spellEnd"/>
-      <w:r>
-        <w:t> read roles from </w:t>
-      </w:r>
-      <w:proofErr w:type="spellStart"/>
-      <w:r>
-        <w:fldChar w:fldCharType="begin"/>
-      </w:r>
-      <w:r>
-        <w:instrText>HYPERLINK "vscode-file://vscode-app/d:/apps/Microsoft%20VS%20Code/072586267e/resources/app/out/vs/code/electron-browser/workbench/workbench.html" \o ""</w:instrText>
-      </w:r>
-      <w:r>
-        <w:fldChar w:fldCharType="separate"/>
-      </w:r>
-      <w:r>
-        <w:rPr>
-          <w:rStyle w:val="Hyperlink"/>
-        </w:rPr>
-        <w:t>oidcUserAuthority.getIdToken</w:t>
-      </w:r>
-      <w:proofErr w:type="spellEnd"/>
-      <w:r>
-        <w:rPr>
-          <w:rStyle w:val="Hyperlink"/>
-        </w:rPr>
-        <w:t>().</w:t>
-      </w:r>
-      <w:proofErr w:type="spellStart"/>
-      <w:r>
-        <w:rPr>
-          <w:rStyle w:val="Hyperlink"/>
-        </w:rPr>
-        <w:t>getClaims</w:t>
-      </w:r>
-      <w:proofErr w:type="spellEnd"/>
-      <w:r>
-        <w:rPr>
-          <w:rStyle w:val="Hyperlink"/>
-        </w:rPr>
-        <w:t>()</w:t>
-      </w:r>
-      <w:r>
-        <w:fldChar w:fldCharType="end"/>
-      </w:r>
-      <w:r>
-        <w:t>. But Spring Security's </w:t>
-      </w:r>
-      <w:proofErr w:type="spellStart"/>
-      <w:r>
-        <w:t>OidcIdToken</w:t>
-      </w:r>
-      <w:proofErr w:type="spellEnd"/>
-      <w:r>
-        <w:t> doesn't always expose non-standard claims (like Entra's </w:t>
-      </w:r>
-      <w:hyperlink r:id="rId21" w:history="1">
+        <w:t>The old GrantedAuthoritiesMapper read roles from </w:t>
+      </w:r>
+      <w:hyperlink r:id="rId22" w:history="1">
+        <w:r>
+          <w:rPr>
+            <w:rStyle w:val="Hyperlink"/>
+          </w:rPr>
+          <w:t>oidcUserAuthority.getIdToken().getClaims()</w:t>
+        </w:r>
+      </w:hyperlink>
+      <w:r>
+        <w:t>. But Spring Security's OidcIdToken doesn't always expose non-standard claims (like Entra's </w:t>
+      </w:r>
+      <w:hyperlink r:id="rId23" w:history="1">
         <w:r>
           <w:rPr>
             <w:rStyle w:val="Hyperlink"/>
@@ -7919,183 +8065,117 @@
       <w:r>
         <w:t xml:space="preserve"> confirmed </w:t>
       </w:r>
-      <w:proofErr w:type="spellStart"/>
-      <w:r>
-        <w:fldChar w:fldCharType="begin"/>
-      </w:r>
-      <w:r>
-        <w:instrText>HYPERLINK "vscode-file://vscode-app/d:/apps/Microsoft%20VS%20Code/072586267e/resources/app/out/vs/code/electron-browser/workbench/workbench.html" \o ""</w:instrText>
-      </w:r>
-      <w:r>
-        <w:fldChar w:fldCharType="separate"/>
-      </w:r>
-      <w:r>
-        <w:rPr>
-          <w:rStyle w:val="Hyperlink"/>
-        </w:rPr>
-        <w:t>principal.getAttribute</w:t>
-      </w:r>
-      <w:proofErr w:type="spellEnd"/>
-      <w:r>
-        <w:rPr>
-          <w:rStyle w:val="Hyperlink"/>
-        </w:rPr>
-        <w:t>("roles")</w:t>
-      </w:r>
-      <w:r>
-        <w:fldChar w:fldCharType="end"/>
-      </w:r>
-      <w:r>
-        <w:t> works — that reads from </w:t>
-      </w:r>
-      <w:proofErr w:type="spellStart"/>
-      <w:r>
-        <w:fldChar w:fldCharType="begin"/>
-      </w:r>
-      <w:r>
-        <w:instrText>HYPERLINK "vscode-file://vscode-app/d:/apps/Microsoft%20VS%20Code/072586267e/resources/app/out/vs/code/electron-browser/workbench/workbench.html" \o ""</w:instrText>
-      </w:r>
-      <w:r>
-        <w:fldChar w:fldCharType="separate"/>
-      </w:r>
-      <w:r>
-        <w:rPr>
-          <w:rStyle w:val="Hyperlink"/>
-        </w:rPr>
-        <w:t>OidcUser.getAttributes</w:t>
-      </w:r>
-      <w:proofErr w:type="spellEnd"/>
-      <w:r>
-        <w:rPr>
-          <w:rStyle w:val="Hyperlink"/>
-        </w:rPr>
-        <w:t>()</w:t>
-      </w:r>
-      <w:r>
-        <w:fldChar w:fldCharType="end"/>
-      </w:r>
-      <w:r>
-        <w:t>, which is the merged attribute map.</w:t>
-      </w:r>
-    </w:p>
-    <w:p>
-      <w:pPr>
-        <w:rPr>
-          <w:b/>
-          <w:bCs/>
-        </w:rPr>
-      </w:pPr>
-      <w:r>
-        <w:rPr>
-          <w:b/>
-          <w:bCs/>
-        </w:rPr>
-        <w:t>Solution:</w:t>
-      </w:r>
-    </w:p>
-    <w:p>
-      <w:r>
-        <w:t>Replaced the </w:t>
-      </w:r>
-      <w:proofErr w:type="spellStart"/>
-      <w:r>
-        <w:rPr>
-          <w:b/>
-          <w:bCs/>
-        </w:rPr>
-        <w:t>GrantedAuthoritiesMapper</w:t>
-      </w:r>
-      <w:proofErr w:type="spellEnd"/>
-      <w:r>
-        <w:t> bean with a </w:t>
-      </w:r>
-      <w:r>
-        <w:rPr>
-          <w:b/>
-          <w:bCs/>
-        </w:rPr>
-        <w:t>custom </w:t>
-      </w:r>
-      <w:proofErr w:type="spellStart"/>
-      <w:r>
-        <w:rPr>
-          <w:b/>
-          <w:bCs/>
-        </w:rPr>
-        <w:fldChar w:fldCharType="begin"/>
-      </w:r>
-      <w:r>
-        <w:rPr>
-          <w:b/>
-          <w:bCs/>
-        </w:rPr>
-        <w:instrText>HYPERLINK "vscode-file://vscode-app/d:/apps/Microsoft%20VS%20Code/072586267e/resources/app/out/vs/code/electron-browser/workbench/workbench.html" \o ""</w:instrText>
-      </w:r>
-      <w:r>
-        <w:rPr>
-          <w:b/>
-          <w:bCs/>
-        </w:rPr>
-      </w:r>
-      <w:r>
-        <w:rPr>
-          <w:b/>
-          <w:bCs/>
-        </w:rPr>
-        <w:fldChar w:fldCharType="separate"/>
-      </w:r>
-      <w:r>
-        <w:rPr>
-          <w:rStyle w:val="Hyperlink"/>
-        </w:rPr>
-        <w:t>OidcUserService</w:t>
-      </w:r>
-      <w:proofErr w:type="spellEnd"/>
-      <w:r>
-        <w:fldChar w:fldCharType="end"/>
-      </w:r>
-      <w:r>
-        <w:t> wired into </w:t>
-      </w:r>
-      <w:hyperlink r:id="rId22" w:history="1">
+      <w:hyperlink r:id="rId24" w:history="1">
         <w:r>
           <w:rPr>
             <w:rStyle w:val="Hyperlink"/>
           </w:rPr>
-          <w:t>.oauth2Login().</w:t>
+          <w:t>principal.getAttribute("roles")</w:t>
         </w:r>
-        <w:proofErr w:type="spellStart"/>
+      </w:hyperlink>
+      <w:r>
+        <w:t> works — that reads from </w:t>
+      </w:r>
+      <w:hyperlink r:id="rId25" w:history="1">
         <w:r>
           <w:rPr>
             <w:rStyle w:val="Hyperlink"/>
           </w:rPr>
-          <w:t>userInfoEndpoint</w:t>
+          <w:t>OidcUser.getAttributes()</w:t>
         </w:r>
-        <w:proofErr w:type="spellEnd"/>
+      </w:hyperlink>
+      <w:r>
+        <w:t>, which is the merged attribute map.</w:t>
+      </w:r>
+    </w:p>
+    <w:p>
+      <w:pPr>
+        <w:rPr>
+          <w:b/>
+          <w:bCs/>
+        </w:rPr>
+      </w:pPr>
+      <w:r>
+        <w:rPr>
+          <w:b/>
+          <w:bCs/>
+        </w:rPr>
+        <w:t>Solution:</w:t>
+      </w:r>
+    </w:p>
+    <w:p>
+      <w:r>
+        <w:t>Replaced the </w:t>
+      </w:r>
+      <w:r>
+        <w:rPr>
+          <w:b/>
+          <w:bCs/>
+        </w:rPr>
+        <w:t>GrantedAuthoritiesMapper</w:t>
+      </w:r>
+      <w:r>
+        <w:t> bean with a </w:t>
+      </w:r>
+      <w:r>
+        <w:rPr>
+          <w:b/>
+          <w:bCs/>
+        </w:rPr>
+        <w:t>custom </w:t>
+      </w:r>
+      <w:hyperlink r:id="rId26" w:history="1">
         <w:r>
           <w:rPr>
             <w:rStyle w:val="Hyperlink"/>
           </w:rPr>
-          <w:t>().</w:t>
+          <w:t>OidcUserService</w:t>
         </w:r>
-        <w:proofErr w:type="spellStart"/>
+      </w:hyperlink>
+      <w:r>
+        <w:t> wired into </w:t>
+      </w:r>
+      <w:hyperlink r:id="rId27" w:history="1">
         <w:r>
           <w:rPr>
             <w:rStyle w:val="Hyperlink"/>
           </w:rPr>
-          <w:t>oidcUserService</w:t>
+          <w:t>.oauth2Login().userInfoEndpoint().oidcUserService(...)</w:t>
         </w:r>
-        <w:proofErr w:type="spellEnd"/>
+      </w:hyperlink>
+      <w:r>
+        <w:t>. This:</w:t>
+      </w:r>
+    </w:p>
+    <w:p>
+      <w:pPr>
+        <w:numPr>
+          <w:ilvl w:val="0"/>
+          <w:numId w:val="20"/>
+        </w:numPr>
+      </w:pPr>
+      <w:r>
+        <w:t>Delegates to the default </w:t>
+      </w:r>
+      <w:hyperlink r:id="rId28" w:history="1">
         <w:r>
           <w:rPr>
             <w:rStyle w:val="Hyperlink"/>
           </w:rPr>
-          <w:t>(...)</w:t>
+          <w:t>OidcUserService</w:t>
         </w:r>
       </w:hyperlink>
       <w:r>
-        <w:t>. This:</w:t>
-      </w:r>
+        <w:t> to get the </w:t>
+      </w:r>
+      <w:hyperlink r:id="rId29" w:history="1">
+        <w:r>
+          <w:rPr>
+            <w:rStyle w:val="Hyperlink"/>
+          </w:rPr>
+          <w:t>OidcUser</w:t>
+        </w:r>
+      </w:hyperlink>
     </w:p>
     <w:p>
       <w:pPr>
@@ -8105,50 +8185,18 @@
         </w:numPr>
       </w:pPr>
       <w:r>
-        <w:t>Delegates to the default </w:t>
-      </w:r>
-      <w:proofErr w:type="spellStart"/>
-      <w:r>
-        <w:fldChar w:fldCharType="begin"/>
-      </w:r>
-      <w:r>
-        <w:instrText>HYPERLINK "vscode-file://vscode-app/d:/apps/Microsoft%20VS%20Code/072586267e/resources/app/out/vs/code/electron-browser/workbench/workbench.html" \o ""</w:instrText>
-      </w:r>
-      <w:r>
-        <w:fldChar w:fldCharType="separate"/>
-      </w:r>
-      <w:r>
-        <w:rPr>
-          <w:rStyle w:val="Hyperlink"/>
-        </w:rPr>
-        <w:t>OidcUserService</w:t>
-      </w:r>
-      <w:proofErr w:type="spellEnd"/>
-      <w:r>
-        <w:fldChar w:fldCharType="end"/>
-      </w:r>
-      <w:r>
-        <w:t> to get the </w:t>
-      </w:r>
-      <w:proofErr w:type="spellStart"/>
-      <w:r>
-        <w:fldChar w:fldCharType="begin"/>
-      </w:r>
-      <w:r>
-        <w:instrText>HYPERLINK "vscode-file://vscode-app/d:/apps/Microsoft%20VS%20Code/072586267e/resources/app/out/vs/code/electron-browser/workbench/workbench.html" \o ""</w:instrText>
-      </w:r>
-      <w:r>
-        <w:fldChar w:fldCharType="separate"/>
-      </w:r>
-      <w:r>
-        <w:rPr>
-          <w:rStyle w:val="Hyperlink"/>
-        </w:rPr>
-        <w:t>OidcUser</w:t>
-      </w:r>
-      <w:proofErr w:type="spellEnd"/>
-      <w:r>
-        <w:fldChar w:fldCharType="end"/>
+        <w:t>Reads </w:t>
+      </w:r>
+      <w:hyperlink r:id="rId30" w:history="1">
+        <w:r>
+          <w:rPr>
+            <w:rStyle w:val="Hyperlink"/>
+          </w:rPr>
+          <w:t>oidcUser.getAttribute("roles")</w:t>
+        </w:r>
+      </w:hyperlink>
+      <w:r>
+        <w:t> — exactly where you confirmed the roles exist</w:t>
       </w:r>
     </w:p>
     <w:p>
@@ -8159,36 +8207,7 @@
         </w:numPr>
       </w:pPr>
       <w:r>
-        <w:t>Reads </w:t>
-      </w:r>
-      <w:proofErr w:type="spellStart"/>
-      <w:r>
-        <w:fldChar w:fldCharType="begin"/>
-      </w:r>
-      <w:r>
-        <w:instrText>HYPERLINK "vscode-file://vscode-app/d:/apps/Microsoft%20VS%20Code/072586267e/resources/app/out/vs/code/electron-browser/workbench/workbench.html" \o ""</w:instrText>
-      </w:r>
-      <w:r>
-        <w:fldChar w:fldCharType="separate"/>
-      </w:r>
-      <w:r>
-        <w:rPr>
-          <w:rStyle w:val="Hyperlink"/>
-        </w:rPr>
-        <w:t>oidcUser.getAttribute</w:t>
-      </w:r>
-      <w:proofErr w:type="spellEnd"/>
-      <w:r>
-        <w:rPr>
-          <w:rStyle w:val="Hyperlink"/>
-        </w:rPr>
-        <w:t>("roles")</w:t>
-      </w:r>
-      <w:r>
-        <w:fldChar w:fldCharType="end"/>
-      </w:r>
-      <w:r>
-        <w:t> — exactly where you confirmed the roles exist</w:t>
+        <w:t>Maps each Entra role to ROLE_APP_ADMIN, ROLE_APP_READ, ROLE_APP_WRITE authorities</w:t>
       </w:r>
     </w:p>
     <w:p>
@@ -8199,39 +8218,16 @@
         </w:numPr>
       </w:pPr>
       <w:r>
-        <w:t>Maps each Entra role to ROLE_APP_ADMIN, ROLE_APP_READ, ROLE_APP_WRITE authorities</w:t>
-      </w:r>
-    </w:p>
-    <w:p>
-      <w:pPr>
-        <w:numPr>
-          <w:ilvl w:val="0"/>
-          <w:numId w:val="20"/>
-        </w:numPr>
-      </w:pPr>
-      <w:r>
         <w:t>Returns a new </w:t>
       </w:r>
-      <w:proofErr w:type="spellStart"/>
-      <w:r>
-        <w:fldChar w:fldCharType="begin"/>
-      </w:r>
-      <w:r>
-        <w:instrText>HYPERLINK "vscode-file://vscode-app/d:/apps/Microsoft%20VS%20Code/072586267e/resources/app/out/vs/code/electron-browser/workbench/workbench.html" \o ""</w:instrText>
-      </w:r>
-      <w:r>
-        <w:fldChar w:fldCharType="separate"/>
-      </w:r>
-      <w:r>
-        <w:rPr>
-          <w:rStyle w:val="Hyperlink"/>
-        </w:rPr>
-        <w:t>DefaultOidcUser</w:t>
-      </w:r>
-      <w:proofErr w:type="spellEnd"/>
-      <w:r>
-        <w:fldChar w:fldCharType="end"/>
-      </w:r>
+      <w:hyperlink r:id="rId31" w:history="1">
+        <w:r>
+          <w:rPr>
+            <w:rStyle w:val="Hyperlink"/>
+          </w:rPr>
+          <w:t>DefaultOidcUser</w:t>
+        </w:r>
+      </w:hyperlink>
       <w:r>
         <w:t> with the combined authorities</w:t>
       </w:r>
@@ -8241,6 +8237,7 @@
         <w:rPr>
           <w:color w:val="EE0000"/>
         </w:rPr>
+        <w:lastRenderedPageBreak/>
         <w:t>Old Code</w:t>
       </w:r>
       <w:r>
@@ -8252,7 +8249,6 @@
         <w:rPr>
           <w:noProof/>
         </w:rPr>
-        <w:lastRenderedPageBreak/>
         <w:drawing>
           <wp:inline distT="0" distB="0" distL="0" distR="0" wp14:anchorId="4EFAB97E" wp14:editId="4D2B625E">
             <wp:extent cx="4248150" cy="3373724"/>
@@ -8271,7 +8267,7 @@
                     </pic:cNvPicPr>
                   </pic:nvPicPr>
                   <pic:blipFill>
-                    <a:blip r:embed="rId23">
+                    <a:blip r:embed="rId32">
                       <a:extLst>
                         <a:ext uri="{28A0092B-C50C-407E-A947-70E740481C1C}">
                           <a14:useLocalDpi xmlns:a14="http://schemas.microsoft.com/office/drawing/2010/main" val="0"/>
@@ -8331,7 +8327,7 @@
                     </pic:cNvPicPr>
                   </pic:nvPicPr>
                   <pic:blipFill>
-                    <a:blip r:embed="rId24">
+                    <a:blip r:embed="rId33">
                       <a:extLst>
                         <a:ext uri="{28A0092B-C50C-407E-A947-70E740481C1C}">
                           <a14:useLocalDpi xmlns:a14="http://schemas.microsoft.com/office/drawing/2010/main" val="0"/>
@@ -8387,7 +8383,7 @@
                     </pic:cNvPicPr>
                   </pic:nvPicPr>
                   <pic:blipFill>
-                    <a:blip r:embed="rId25">
+                    <a:blip r:embed="rId34">
                       <a:extLst>
                         <a:ext uri="{28A0092B-C50C-407E-A947-70E740481C1C}">
                           <a14:useLocalDpi xmlns:a14="http://schemas.microsoft.com/office/drawing/2010/main" val="0"/>
@@ -8511,7 +8507,7 @@
       <w:r>
         <w:t>Azure Portal always triggers MFA because it has built-in Microsoft first-party policies — your custom app doesn't inherit that behavior. Even </w:t>
       </w:r>
-      <w:hyperlink r:id="rId26" w:history="1">
+      <w:hyperlink r:id="rId35" w:history="1">
         <w:r>
           <w:rPr>
             <w:rStyle w:val="Hyperlink"/>
@@ -8600,36 +8596,16 @@
       <w:r>
         <w:t>This tells Entra: "The </w:t>
       </w:r>
-      <w:proofErr w:type="spellStart"/>
-      <w:r>
-        <w:fldChar w:fldCharType="begin"/>
-      </w:r>
-      <w:r>
-        <w:instrText>HYPERLINK "vscode-file://vscode-app/d:/apps/Microsoft%20VS%20Code/072586267e/resources/app/out/vs/code/electron-browser/workbench/workbench.html" \o ""</w:instrText>
-      </w:r>
-      <w:r>
-        <w:fldChar w:fldCharType="separate"/>
-      </w:r>
-      <w:r>
-        <w:rPr>
-          <w:rStyle w:val="Hyperlink"/>
-        </w:rPr>
-        <w:t>amr</w:t>
-      </w:r>
-      <w:proofErr w:type="spellEnd"/>
-      <w:r>
-        <w:fldChar w:fldCharType="end"/>
-      </w:r>
-      <w:r>
-        <w:t> (authentication method reference) claim with value </w:t>
-      </w:r>
-      <w:proofErr w:type="spellStart"/>
-      <w:r>
-        <w:t>mfa</w:t>
-      </w:r>
-      <w:proofErr w:type="spellEnd"/>
-      <w:r>
-        <w:t> is </w:t>
+      <w:hyperlink r:id="rId36" w:history="1">
+        <w:r>
+          <w:rPr>
+            <w:rStyle w:val="Hyperlink"/>
+          </w:rPr>
+          <w:t>amr</w:t>
+        </w:r>
+      </w:hyperlink>
+      <w:r>
+        <w:t> (authentication method reference) claim with value mfa is </w:t>
       </w:r>
       <w:r>
         <w:rPr>
@@ -8662,7 +8638,7 @@
         </w:tabs>
         <w:ind w:left="1276"/>
       </w:pPr>
-      <w:hyperlink r:id="rId27" w:history="1">
+      <w:hyperlink r:id="rId37" w:history="1">
         <w:r>
           <w:rPr>
             <w:rStyle w:val="Hyperlink"/>
@@ -8687,39 +8663,7 @@
         <w:ind w:left="1276"/>
       </w:pPr>
       <w:r>
-        <w:t>claims={"id_token</w:t>
-      </w:r>
-      <w:proofErr w:type="gramStart"/>
-      <w:r>
-        <w:t>":{</w:t>
-      </w:r>
-      <w:proofErr w:type="gramEnd"/>
-      <w:r>
-        <w:t>"amr</w:t>
-      </w:r>
-      <w:proofErr w:type="gramStart"/>
-      <w:r>
-        <w:t>":{</w:t>
-      </w:r>
-      <w:proofErr w:type="gramEnd"/>
-      <w:r>
-        <w:t>"essential</w:t>
-      </w:r>
-      <w:proofErr w:type="gramStart"/>
-      <w:r>
-        <w:t>":true</w:t>
-      </w:r>
-      <w:proofErr w:type="gramEnd"/>
-      <w:r>
-        <w:t>,"values</w:t>
-      </w:r>
-      <w:proofErr w:type="gramStart"/>
-      <w:r>
-        <w:t>":[</w:t>
-      </w:r>
-      <w:proofErr w:type="gramEnd"/>
-      <w:r>
-        <w:t>"mfa"]}}} — demands MFA step-up</w:t>
+        <w:t>claims={"id_token":{"amr":{"essential":true,"values":["mfa"]}}} — demands MFA step-up</w:t>
       </w:r>
     </w:p>
     <w:p>
@@ -8747,7 +8691,7 @@
                     <pic:cNvPicPr/>
                   </pic:nvPicPr>
                   <pic:blipFill>
-                    <a:blip r:embed="rId28"/>
+                    <a:blip r:embed="rId38"/>
                     <a:stretch>
                       <a:fillRect/>
                     </a:stretch>
@@ -8813,15 +8757,7 @@
     </w:p>
     <w:p>
       <w:r>
-        <w:t>Disable Security Defaults → create a Conditional Access policy targeting the </w:t>
-      </w:r>
-      <w:proofErr w:type="spellStart"/>
-      <w:r>
-        <w:t>poc-bff</w:t>
-      </w:r>
-      <w:proofErr w:type="spellEnd"/>
-      <w:r>
-        <w:t> app that requires MFA on every sign-in. This is the production-grade solution.</w:t>
+        <w:t>Disable Security Defaults → create a Conditional Access policy targeting the poc-bff app that requires MFA on every sign-in. This is the production-grade solution.</w:t>
       </w:r>
     </w:p>
     <w:p>
@@ -8863,7 +8799,7 @@
                     </pic:cNvPicPr>
                   </pic:nvPicPr>
                   <pic:blipFill>
-                    <a:blip r:embed="rId29">
+                    <a:blip r:embed="rId39">
                       <a:extLst>
                         <a:ext uri="{28A0092B-C50C-407E-A947-70E740481C1C}">
                           <a14:useLocalDpi xmlns:a14="http://schemas.microsoft.com/office/drawing/2010/main" val="0"/>
@@ -8915,15 +8851,7 @@
         <w:t xml:space="preserve">5.1 </w:t>
       </w:r>
       <w:r>
-        <w:t xml:space="preserve">Phase </w:t>
-      </w:r>
-      <w:proofErr w:type="gramStart"/>
-      <w:r>
-        <w:t>0  -</w:t>
-      </w:r>
-      <w:proofErr w:type="gramEnd"/>
-      <w:r>
-        <w:t xml:space="preserve"> </w:t>
+        <w:t xml:space="preserve">Phase 0  - </w:t>
       </w:r>
       <w:r>
         <w:t>Database Setup</w:t>
@@ -9130,7 +9058,6 @@
       <w:r>
         <w:t xml:space="preserve">Set strong password for </w:t>
       </w:r>
-      <w:proofErr w:type="spellStart"/>
       <w:r>
         <w:rPr>
           <w:b/>
@@ -9138,7 +9065,6 @@
         </w:rPr>
         <w:t>sa</w:t>
       </w:r>
-      <w:proofErr w:type="spellEnd"/>
     </w:p>
     <w:p>
       <w:pPr>
@@ -9152,14 +9078,9 @@
         <w:t>.1</w:t>
       </w:r>
       <w:r>
-        <w:t xml:space="preserve">.2 Connect from </w:t>
-      </w:r>
-      <w:proofErr w:type="spellStart"/>
-      <w:r>
-        <w:t>DBeaver</w:t>
+        <w:t>.2 Connect from DBeaver</w:t>
       </w:r>
       <w:bookmarkEnd w:id="28"/>
-      <w:proofErr w:type="spellEnd"/>
     </w:p>
     <w:p>
       <w:r>
@@ -9188,7 +9109,7 @@
                     <pic:cNvPicPr/>
                   </pic:nvPicPr>
                   <pic:blipFill>
-                    <a:blip r:embed="rId30"/>
+                    <a:blip r:embed="rId40"/>
                     <a:stretch>
                       <a:fillRect/>
                     </a:stretch>
@@ -9244,7 +9165,7 @@
                     <pic:cNvPicPr/>
                   </pic:nvPicPr>
                   <pic:blipFill>
-                    <a:blip r:embed="rId31"/>
+                    <a:blip r:embed="rId41"/>
                     <a:stretch>
                       <a:fillRect/>
                     </a:stretch>
@@ -9388,7 +9309,7 @@
                     </pic:cNvPicPr>
                   </pic:nvPicPr>
                   <pic:blipFill>
-                    <a:blip r:embed="rId32">
+                    <a:blip r:embed="rId42">
                       <a:extLst>
                         <a:ext uri="{28A0092B-C50C-407E-A947-70E740481C1C}">
                           <a14:useLocalDpi xmlns:a14="http://schemas.microsoft.com/office/drawing/2010/main" val="0"/>
@@ -9610,7 +9531,7 @@
                     </pic:cNvPicPr>
                   </pic:nvPicPr>
                   <pic:blipFill>
-                    <a:blip r:embed="rId33">
+                    <a:blip r:embed="rId43">
                       <a:extLst>
                         <a:ext uri="{28A0092B-C50C-407E-A947-70E740481C1C}">
                           <a14:useLocalDpi xmlns:a14="http://schemas.microsoft.com/office/drawing/2010/main" val="0"/>
@@ -9744,7 +9665,6 @@
       <w:r>
         <w:t xml:space="preserve">Scroll to </w:t>
       </w:r>
-      <w:proofErr w:type="spellStart"/>
       <w:r>
         <w:rPr>
           <w:b/>
@@ -9752,7 +9672,6 @@
         </w:rPr>
         <w:t>IPAll</w:t>
       </w:r>
-      <w:proofErr w:type="spellEnd"/>
     </w:p>
     <w:p>
       <w:pPr>
@@ -9879,7 +9798,7 @@
                     </pic:cNvPicPr>
                   </pic:nvPicPr>
                   <pic:blipFill>
-                    <a:blip r:embed="rId34">
+                    <a:blip r:embed="rId44">
                       <a:extLst>
                         <a:ext uri="{28A0092B-C50C-407E-A947-70E740481C1C}">
                           <a14:useLocalDpi xmlns:a14="http://schemas.microsoft.com/office/drawing/2010/main" val="0"/>
@@ -9939,7 +9858,6 @@
       <w:r>
         <w:t xml:space="preserve">CREATE DATABASE </w:t>
       </w:r>
-      <w:proofErr w:type="spellStart"/>
       <w:r>
         <w:rPr>
           <w:b/>
@@ -9947,7 +9865,6 @@
         </w:rPr>
         <w:t>LeapPoc</w:t>
       </w:r>
-      <w:proofErr w:type="spellEnd"/>
       <w:r>
         <w:t> on local MSSQL Developer Edition</w:t>
       </w:r>
@@ -9970,15 +9887,7 @@
     </w:p>
     <w:p>
       <w:r>
-        <w:t>See docs/</w:t>
-      </w:r>
-      <w:proofErr w:type="spellStart"/>
-      <w:r>
-        <w:t>sql</w:t>
-      </w:r>
-      <w:proofErr w:type="spellEnd"/>
-      <w:r>
-        <w:t>/</w:t>
+        <w:t>See docs/sql/</w:t>
       </w:r>
       <w:r>
         <w:rPr>
@@ -10006,15 +9915,7 @@
     </w:p>
     <w:p>
       <w:r>
-        <w:t>See docs/</w:t>
-      </w:r>
-      <w:proofErr w:type="spellStart"/>
-      <w:r>
-        <w:t>sql</w:t>
-      </w:r>
-      <w:proofErr w:type="spellEnd"/>
-      <w:r>
-        <w:t>/</w:t>
+        <w:t>See docs/sql/</w:t>
       </w:r>
       <w:r>
         <w:rPr>
@@ -10095,31 +9996,7 @@
         </w:numPr>
       </w:pPr>
       <w:r>
-        <w:t xml:space="preserve">Add </w:t>
-      </w:r>
-      <w:proofErr w:type="spellStart"/>
-      <w:r>
-        <w:t>EntityScan</w:t>
-      </w:r>
-      <w:proofErr w:type="spellEnd"/>
-      <w:r>
-        <w:t xml:space="preserve"> and </w:t>
-      </w:r>
-      <w:proofErr w:type="spellStart"/>
-      <w:r>
-        <w:t>EnableJpaRepositoryies</w:t>
-      </w:r>
-      <w:proofErr w:type="spellEnd"/>
-      <w:r>
-        <w:t xml:space="preserve"> in leap-app </w:t>
-      </w:r>
-      <w:proofErr w:type="spellStart"/>
-      <w:r>
-        <w:t>LeapPocApplication</w:t>
-      </w:r>
-      <w:proofErr w:type="spellEnd"/>
-      <w:r>
-        <w:t xml:space="preserve"> to scan JPA entities and repositories in other modules/packages</w:t>
+        <w:t>Add EntityScan and EnableJpaRepositoryies in leap-app LeapPocApplication to scan JPA entities and repositories in other modules/packages</w:t>
       </w:r>
     </w:p>
     <w:p>
@@ -10147,7 +10024,7 @@
                     <pic:cNvPicPr/>
                   </pic:nvPicPr>
                   <pic:blipFill>
-                    <a:blip r:embed="rId35"/>
+                    <a:blip r:embed="rId45"/>
                     <a:stretch>
                       <a:fillRect/>
                     </a:stretch>
@@ -10177,21 +10054,8 @@
         </w:numPr>
       </w:pPr>
       <w:r>
-        <w:t xml:space="preserve">Change Instant to </w:t>
-      </w:r>
-      <w:proofErr w:type="spellStart"/>
-      <w:r>
-        <w:t>LocalDateTime</w:t>
-      </w:r>
-      <w:proofErr w:type="spellEnd"/>
-      <w:r>
-        <w:t xml:space="preserve"> for datetime fields such as </w:t>
-      </w:r>
-      <w:proofErr w:type="spellStart"/>
-      <w:r>
-        <w:t>createdAt</w:t>
-      </w:r>
-      <w:proofErr w:type="spellEnd"/>
+        <w:t>Change Instant to LocalDateTime for datetime fields such as createdAt</w:t>
+      </w:r>
     </w:p>
     <w:p>
       <w:pPr>
@@ -10454,7 +10318,6 @@
         </w:tabs>
         <w:ind w:left="851" w:hanging="284"/>
       </w:pPr>
-      <w:proofErr w:type="spellStart"/>
       <w:r>
         <w:rPr>
           <w:b/>
@@ -10462,40 +10325,19 @@
         </w:rPr>
         <w:t>CommentThreadDto</w:t>
       </w:r>
-      <w:proofErr w:type="spellEnd"/>
       <w:r>
         <w:t> — added </w:t>
       </w:r>
-      <w:proofErr w:type="spellStart"/>
-      <w:r>
-        <w:fldChar w:fldCharType="begin"/>
-      </w:r>
-      <w:r>
-        <w:instrText>HYPERLINK "vscode-file://vscode-app/d:/apps/Microsoft%20VS%20Code/07ff9d6178/resources/app/out/vs/code/electron-browser/workbench/workbench.html" \o ""</w:instrText>
-      </w:r>
-      <w:r>
-        <w:fldChar w:fldCharType="separate"/>
-      </w:r>
-      <w:r>
-        <w:rPr>
-          <w:rStyle w:val="Hyperlink"/>
-        </w:rPr>
-        <w:t>isDeleted</w:t>
-      </w:r>
-      <w:proofErr w:type="spellEnd"/>
-      <w:r>
-        <w:fldChar w:fldCharType="end"/>
-      </w:r>
-      <w:r>
-        <w:t> </w:t>
-      </w:r>
-      <w:proofErr w:type="spellStart"/>
-      <w:r>
-        <w:t>boolean</w:t>
-      </w:r>
-      <w:proofErr w:type="spellEnd"/>
-      <w:r>
-        <w:t xml:space="preserve"> field</w:t>
+      <w:hyperlink r:id="rId46" w:history="1">
+        <w:r>
+          <w:rPr>
+            <w:rStyle w:val="Hyperlink"/>
+          </w:rPr>
+          <w:t>isDeleted</w:t>
+        </w:r>
+      </w:hyperlink>
+      <w:r>
+        <w:t> boolean field</w:t>
       </w:r>
     </w:p>
     <w:p>
@@ -10510,7 +10352,6 @@
         </w:tabs>
         <w:ind w:left="851" w:hanging="284"/>
       </w:pPr>
-      <w:proofErr w:type="spellStart"/>
       <w:r>
         <w:rPr>
           <w:b/>
@@ -10519,7 +10360,6 @@
         <w:lastRenderedPageBreak/>
         <w:t>CommentRepository</w:t>
       </w:r>
-      <w:proofErr w:type="spellEnd"/>
       <w:r>
         <w:t> — added 3 new queries: fetch all comments (including deleted), single entity count, and batch entity counts via JPQL</w:t>
       </w:r>
@@ -10536,7 +10376,6 @@
         </w:tabs>
         <w:ind w:left="851" w:hanging="284"/>
       </w:pPr>
-      <w:proofErr w:type="spellStart"/>
       <w:r>
         <w:rPr>
           <w:b/>
@@ -10544,65 +10383,28 @@
         </w:rPr>
         <w:t>CommentServiceImpl</w:t>
       </w:r>
-      <w:proofErr w:type="spellEnd"/>
       <w:r>
         <w:t> — rewrote </w:t>
       </w:r>
-      <w:proofErr w:type="spellStart"/>
-      <w:r>
-        <w:fldChar w:fldCharType="begin"/>
-      </w:r>
-      <w:r>
-        <w:instrText>HYPERLINK "vscode-file://vscode-app/d:/apps/Microsoft%20VS%20Code/07ff9d6178/resources/app/out/vs/code/electron-browser/workbench/workbench.html" \o ""</w:instrText>
-      </w:r>
-      <w:r>
-        <w:fldChar w:fldCharType="separate"/>
-      </w:r>
-      <w:r>
-        <w:rPr>
-          <w:rStyle w:val="Hyperlink"/>
-        </w:rPr>
-        <w:t>getThread</w:t>
-      </w:r>
-      <w:proofErr w:type="spellEnd"/>
-      <w:r>
-        <w:rPr>
-          <w:rStyle w:val="Hyperlink"/>
-        </w:rPr>
-        <w:t>()</w:t>
-      </w:r>
-      <w:r>
-        <w:fldChar w:fldCharType="end"/>
-      </w:r>
+      <w:hyperlink r:id="rId47" w:history="1">
+        <w:r>
+          <w:rPr>
+            <w:rStyle w:val="Hyperlink"/>
+          </w:rPr>
+          <w:t>getThread()</w:t>
+        </w:r>
+      </w:hyperlink>
       <w:r>
         <w:t> to include soft-deleted parents as placeholders when they have non-deleted descendants; added </w:t>
       </w:r>
-      <w:proofErr w:type="spellStart"/>
-      <w:r>
-        <w:fldChar w:fldCharType="begin"/>
-      </w:r>
-      <w:r>
-        <w:instrText>HYPERLINK "vscode-file://vscode-app/d:/apps/Microsoft%20VS%20Code/07ff9d6178/resources/app/out/vs/code/electron-browser/workbench/workbench.html" \o ""</w:instrText>
-      </w:r>
-      <w:r>
-        <w:fldChar w:fldCharType="separate"/>
-      </w:r>
-      <w:r>
-        <w:rPr>
-          <w:rStyle w:val="Hyperlink"/>
-        </w:rPr>
-        <w:t>getCounts</w:t>
-      </w:r>
-      <w:proofErr w:type="spellEnd"/>
-      <w:r>
-        <w:rPr>
-          <w:rStyle w:val="Hyperlink"/>
-        </w:rPr>
-        <w:t>()</w:t>
-      </w:r>
-      <w:r>
-        <w:fldChar w:fldCharType="end"/>
-      </w:r>
+      <w:hyperlink r:id="rId48" w:history="1">
+        <w:r>
+          <w:rPr>
+            <w:rStyle w:val="Hyperlink"/>
+          </w:rPr>
+          <w:t>getCounts()</w:t>
+        </w:r>
+      </w:hyperlink>
       <w:r>
         <w:t> for batch comment count retrieval</w:t>
       </w:r>
@@ -10619,7 +10421,6 @@
         </w:tabs>
         <w:ind w:left="851" w:hanging="284"/>
       </w:pPr>
-      <w:proofErr w:type="spellStart"/>
       <w:r>
         <w:rPr>
           <w:b/>
@@ -10627,58 +10428,15 @@
         </w:rPr>
         <w:t>CommentController</w:t>
       </w:r>
-      <w:proofErr w:type="spellEnd"/>
       <w:r>
         <w:t> — added </w:t>
       </w:r>
-      <w:hyperlink r:id="rId36" w:history="1">
+      <w:hyperlink r:id="rId49" w:history="1">
         <w:r>
           <w:rPr>
             <w:rStyle w:val="Hyperlink"/>
           </w:rPr>
-          <w:t>GET /</w:t>
-        </w:r>
-        <w:proofErr w:type="spellStart"/>
-        <w:r>
-          <w:rPr>
-            <w:rStyle w:val="Hyperlink"/>
-          </w:rPr>
-          <w:t>api</w:t>
-        </w:r>
-        <w:proofErr w:type="spellEnd"/>
-        <w:r>
-          <w:rPr>
-            <w:rStyle w:val="Hyperlink"/>
-          </w:rPr>
-          <w:t>/comments/</w:t>
-        </w:r>
-        <w:proofErr w:type="spellStart"/>
-        <w:r>
-          <w:rPr>
-            <w:rStyle w:val="Hyperlink"/>
-          </w:rPr>
-          <w:t>counts?entityType</w:t>
-        </w:r>
-        <w:proofErr w:type="spellEnd"/>
-        <w:r>
-          <w:rPr>
-            <w:rStyle w:val="Hyperlink"/>
-          </w:rPr>
-          <w:t>=&amp;</w:t>
-        </w:r>
-        <w:proofErr w:type="spellStart"/>
-        <w:r>
-          <w:rPr>
-            <w:rStyle w:val="Hyperlink"/>
-          </w:rPr>
-          <w:t>entityIds</w:t>
-        </w:r>
-        <w:proofErr w:type="spellEnd"/>
-        <w:r>
-          <w:rPr>
-            <w:rStyle w:val="Hyperlink"/>
-          </w:rPr>
-          <w:t>=</w:t>
+          <w:t>GET /api/comments/counts?entityType=&amp;entityIds=</w:t>
         </w:r>
       </w:hyperlink>
       <w:r>
@@ -10786,15 +10544,7 @@
         <w:t>6.6 Comment count badge</w:t>
       </w:r>
       <w:r>
-        <w:t xml:space="preserve">: Counts load on page </w:t>
-      </w:r>
-      <w:proofErr w:type="spellStart"/>
-      <w:r>
-        <w:t>init</w:t>
-      </w:r>
-      <w:proofErr w:type="spellEnd"/>
-      <w:r>
-        <w:t xml:space="preserve"> via batch endpoint (not just when panel opens)</w:t>
+        <w:t>: Counts load on page init via batch endpoint (not just when panel opens)</w:t>
       </w:r>
     </w:p>
     <w:p>
@@ -10840,21 +10590,8 @@
         <w:t>6.8 Accessibility</w:t>
       </w:r>
       <w:r>
-        <w:t>: ARIA roles/labels on panel, entries, buttons, icons; aria-live="polite" for dynamic content; Escape key closes panel; </w:t>
-      </w:r>
-      <w:proofErr w:type="spellStart"/>
-      <w:r>
-        <w:t>trackBy</w:t>
-      </w:r>
-      <w:proofErr w:type="spellEnd"/>
-      <w:r>
-        <w:t> on all *</w:t>
-      </w:r>
-      <w:proofErr w:type="spellStart"/>
-      <w:r>
-        <w:t>ngFor</w:t>
-      </w:r>
-      <w:proofErr w:type="spellEnd"/>
+        <w:t>: ARIA roles/labels on panel, entries, buttons, icons; aria-live="polite" for dynamic content; Escape key closes panel; trackBy on all *ngFor</w:t>
+      </w:r>
     </w:p>
     <w:p>
       <w:pPr>
@@ -10875,16 +10612,11 @@
         </w:rPr>
       </w:pPr>
       <w:bookmarkStart w:id="38" w:name="_Toc225694792"/>
-      <w:proofErr w:type="gramStart"/>
       <w:r>
         <w:t xml:space="preserve">6.1  </w:t>
       </w:r>
       <w:r>
-        <w:t>Setting</w:t>
-      </w:r>
-      <w:proofErr w:type="gramEnd"/>
-      <w:r>
-        <w:t xml:space="preserve"> Up Groups in Microsoft Entra ID</w:t>
+        <w:t>Setting Up Groups in Microsoft Entra ID</w:t>
       </w:r>
       <w:bookmarkEnd w:id="38"/>
     </w:p>
@@ -10916,7 +10648,7 @@
       <w:r>
         <w:t xml:space="preserve"> </w:t>
       </w:r>
-      <w:hyperlink r:id="rId37" w:anchor="view/Microsoft_AAD_IAM/TenantOverview.ReactView" w:history="1">
+      <w:hyperlink r:id="rId50" w:anchor="view/Microsoft_AAD_IAM/TenantOverview.ReactView" w:history="1">
         <w:r>
           <w:rPr>
             <w:rStyle w:val="Hyperlink"/>
@@ -11777,7 +11509,6 @@
       <w:r>
         <w:t xml:space="preserve"> </w:t>
       </w:r>
-      <w:proofErr w:type="spellStart"/>
       <w:r>
         <w:rPr>
           <w:b/>
@@ -11785,7 +11516,6 @@
         </w:rPr>
         <w:t>poc-bff</w:t>
       </w:r>
-      <w:proofErr w:type="spellEnd"/>
     </w:p>
     <w:p>
       <w:pPr>
@@ -11958,7 +11688,6 @@
       <w:r>
         <w:t>You'll need these IDs in </w:t>
       </w:r>
-      <w:proofErr w:type="spellStart"/>
       <w:r>
         <w:rPr>
           <w:b/>
@@ -11966,7 +11695,6 @@
         </w:rPr>
         <w:t>application.yml</w:t>
       </w:r>
-      <w:proofErr w:type="spellEnd"/>
       <w:r>
         <w:t>:</w:t>
       </w:r>
@@ -12114,8 +11842,6 @@
       <w:r>
         <w:t>Added </w:t>
       </w:r>
-      <w:proofErr w:type="spellStart"/>
-      <w:proofErr w:type="gramStart"/>
       <w:r>
         <w:rPr>
           <w:b/>
@@ -12123,8 +11849,6 @@
         </w:rPr>
         <w:t>app.groups</w:t>
       </w:r>
-      <w:proofErr w:type="spellEnd"/>
-      <w:proofErr w:type="gramEnd"/>
       <w:r>
         <w:t> config mapping group Object IDs → friendly names</w:t>
       </w:r>
@@ -12153,7 +11877,7 @@
                     <pic:cNvPicPr/>
                   </pic:nvPicPr>
                   <pic:blipFill>
-                    <a:blip r:embed="rId38"/>
+                    <a:blip r:embed="rId51"/>
                     <a:stretch>
                       <a:fillRect/>
                     </a:stretch>
@@ -12235,7 +11959,7 @@
             <w:hideMark/>
           </w:tcPr>
           <w:p>
-            <w:hyperlink r:id="rId39" w:history="1">
+            <w:hyperlink r:id="rId52" w:history="1">
               <w:r>
                 <w:rPr>
                   <w:rStyle w:val="Hyperlink"/>
@@ -12290,7 +12014,7 @@
             <w:hideMark/>
           </w:tcPr>
           <w:p>
-            <w:hyperlink r:id="rId40" w:history="1">
+            <w:hyperlink r:id="rId53" w:history="1">
               <w:r>
                 <w:rPr>
                   <w:rStyle w:val="Hyperlink"/>
@@ -12345,7 +12069,7 @@
             <w:hideMark/>
           </w:tcPr>
           <w:p>
-            <w:hyperlink r:id="rId41" w:history="1">
+            <w:hyperlink r:id="rId54" w:history="1">
               <w:r>
                 <w:rPr>
                   <w:rStyle w:val="Hyperlink"/>
@@ -12400,7 +12124,7 @@
             <w:hideMark/>
           </w:tcPr>
           <w:p>
-            <w:hyperlink r:id="rId42" w:history="1">
+            <w:hyperlink r:id="rId55" w:history="1">
               <w:r>
                 <w:rPr>
                   <w:rStyle w:val="Hyperlink"/>
@@ -12429,15 +12153,7 @@
           </w:tcPr>
           <w:p>
             <w:r>
-              <w:t>Extracts GROUP_* authorities → returns groups list in /</w:t>
-            </w:r>
-            <w:proofErr w:type="spellStart"/>
-            <w:r>
-              <w:t>api</w:t>
-            </w:r>
-            <w:proofErr w:type="spellEnd"/>
-            <w:r>
-              <w:t>/me</w:t>
+              <w:t>Extracts GROUP_* authorities → returns groups list in /api/me</w:t>
             </w:r>
           </w:p>
         </w:tc>
@@ -12463,7 +12179,7 @@
             <w:hideMark/>
           </w:tcPr>
           <w:p>
-            <w:hyperlink r:id="rId43" w:history="1">
+            <w:hyperlink r:id="rId56" w:history="1">
               <w:r>
                 <w:rPr>
                   <w:rStyle w:val="Hyperlink"/>
@@ -12492,23 +12208,7 @@
           </w:tcPr>
           <w:p>
             <w:r>
-              <w:t>All @PreAuthorize now: </w:t>
-            </w:r>
-            <w:proofErr w:type="spellStart"/>
-            <w:r>
-              <w:t>hasRole</w:t>
-            </w:r>
-            <w:proofErr w:type="spellEnd"/>
-            <w:r>
-              <w:t xml:space="preserve">('APP_X') or </w:t>
-            </w:r>
-            <w:proofErr w:type="spellStart"/>
-            <w:r>
-              <w:t>hasAuthority</w:t>
-            </w:r>
-            <w:proofErr w:type="spellEnd"/>
-            <w:r>
-              <w:t>('GROUP_GRP_X')</w:t>
+              <w:t>All @PreAuthorize now: hasRole('APP_X') or hasAuthority('GROUP_GRP_X')</w:t>
             </w:r>
           </w:p>
         </w:tc>
@@ -12535,7 +12235,7 @@
             <w:hideMark/>
           </w:tcPr>
           <w:p>
-            <w:hyperlink r:id="rId44" w:history="1">
+            <w:hyperlink r:id="rId57" w:history="1">
               <w:r>
                 <w:rPr>
                   <w:rStyle w:val="Hyperlink"/>
@@ -12567,26 +12267,14 @@
             <w:r>
               <w:t>Same pattern; </w:t>
             </w:r>
-            <w:proofErr w:type="spellStart"/>
-            <w:r>
-              <w:fldChar w:fldCharType="begin"/>
-            </w:r>
-            <w:r>
-              <w:instrText>HYPERLINK "vscode-file://vscode-app/d:/apps/Microsoft%20VS%20Code/07ff9d6178/resources/app/out/vs/code/electron-browser/workbench/workbench.html" \o ""</w:instrText>
-            </w:r>
-            <w:r>
-              <w:fldChar w:fldCharType="separate"/>
-            </w:r>
-            <w:r>
-              <w:rPr>
-                <w:rStyle w:val="Hyperlink"/>
-              </w:rPr>
-              <w:t>isAdmin</w:t>
-            </w:r>
-            <w:proofErr w:type="spellEnd"/>
-            <w:r>
-              <w:fldChar w:fldCharType="end"/>
-            </w:r>
+            <w:hyperlink r:id="rId58" w:history="1">
+              <w:r>
+                <w:rPr>
+                  <w:rStyle w:val="Hyperlink"/>
+                </w:rPr>
+                <w:t>isAdmin</w:t>
+              </w:r>
+            </w:hyperlink>
             <w:r>
               <w:t> check also considers GROUP_GRP_ADMIN</w:t>
             </w:r>
@@ -12730,29 +12418,13 @@
             <w:hideMark/>
           </w:tcPr>
           <w:p>
-            <w:hyperlink r:id="rId45" w:history="1">
+            <w:hyperlink r:id="rId59" w:history="1">
               <w:r>
                 <w:rPr>
                   <w:rStyle w:val="Hyperlink"/>
                 </w:rPr>
-                <w:t>user-</w:t>
+                <w:t>user-info.model.ts</w:t>
               </w:r>
-              <w:proofErr w:type="spellStart"/>
-              <w:proofErr w:type="gramStart"/>
-              <w:r>
-                <w:rPr>
-                  <w:rStyle w:val="Hyperlink"/>
-                </w:rPr>
-                <w:t>info.model</w:t>
-              </w:r>
-              <w:proofErr w:type="gramEnd"/>
-              <w:r>
-                <w:rPr>
-                  <w:rStyle w:val="Hyperlink"/>
-                </w:rPr>
-                <w:t>.ts</w:t>
-              </w:r>
-              <w:proofErr w:type="spellEnd"/>
             </w:hyperlink>
           </w:p>
         </w:tc>
@@ -12775,15 +12447,7 @@
           </w:tcPr>
           <w:p>
             <w:r>
-              <w:t xml:space="preserve">Added groups: </w:t>
-            </w:r>
-            <w:proofErr w:type="gramStart"/>
-            <w:r>
-              <w:t>string[</w:t>
-            </w:r>
-            <w:proofErr w:type="gramEnd"/>
-            <w:r>
-              <w:t>]</w:t>
+              <w:t>Added groups: string[]</w:t>
             </w:r>
           </w:p>
         </w:tc>
@@ -12809,23 +12473,13 @@
             <w:hideMark/>
           </w:tcPr>
           <w:p>
-            <w:hyperlink r:id="rId46" w:history="1">
-              <w:proofErr w:type="spellStart"/>
-              <w:proofErr w:type="gramStart"/>
+            <w:hyperlink r:id="rId60" w:history="1">
               <w:r>
                 <w:rPr>
                   <w:rStyle w:val="Hyperlink"/>
                 </w:rPr>
-                <w:t>auth.service</w:t>
+                <w:t>auth.service.ts</w:t>
               </w:r>
-              <w:proofErr w:type="gramEnd"/>
-              <w:r>
-                <w:rPr>
-                  <w:rStyle w:val="Hyperlink"/>
-                </w:rPr>
-                <w:t>.ts</w:t>
-              </w:r>
-              <w:proofErr w:type="spellEnd"/>
             </w:hyperlink>
           </w:p>
         </w:tc>
@@ -12848,50 +12502,16 @@
           </w:tcPr>
           <w:p>
             <w:r>
-              <w:t>Added </w:t>
-            </w:r>
-            <w:proofErr w:type="spellStart"/>
-            <w:r>
-              <w:t>hasGroup</w:t>
-            </w:r>
-            <w:proofErr w:type="spellEnd"/>
-            <w:r>
-              <w:t>(), </w:t>
-            </w:r>
-            <w:proofErr w:type="spellStart"/>
-            <w:r>
-              <w:t>hasAnyGroup</w:t>
-            </w:r>
-            <w:proofErr w:type="spellEnd"/>
-            <w:r>
-              <w:t>(), </w:t>
-            </w:r>
-            <w:proofErr w:type="spellStart"/>
-            <w:r>
-              <w:fldChar w:fldCharType="begin"/>
-            </w:r>
-            <w:r>
-              <w:instrText>HYPERLINK "vscode-file://vscode-app/d:/apps/Microsoft%20VS%20Code/07ff9d6178/resources/app/out/vs/code/electron-browser/workbench/workbench.html" \o ""</w:instrText>
-            </w:r>
-            <w:r>
-              <w:fldChar w:fldCharType="separate"/>
-            </w:r>
-            <w:r>
-              <w:rPr>
-                <w:rStyle w:val="Hyperlink"/>
-              </w:rPr>
-              <w:t>hasAnyRoleOrGroup</w:t>
-            </w:r>
-            <w:proofErr w:type="spellEnd"/>
-            <w:r>
-              <w:rPr>
-                <w:rStyle w:val="Hyperlink"/>
-              </w:rPr>
-              <w:t>()</w:t>
-            </w:r>
-            <w:r>
-              <w:fldChar w:fldCharType="end"/>
-            </w:r>
+              <w:t>Added hasGroup(), hasAnyGroup(), </w:t>
+            </w:r>
+            <w:hyperlink r:id="rId61" w:history="1">
+              <w:r>
+                <w:rPr>
+                  <w:rStyle w:val="Hyperlink"/>
+                </w:rPr>
+                <w:t>hasAnyRoleOrGroup()</w:t>
+              </w:r>
+            </w:hyperlink>
             <w:r>
               <w:t> — maps APP_X ↔ GRP_X</w:t>
             </w:r>
@@ -12919,23 +12539,13 @@
             <w:hideMark/>
           </w:tcPr>
           <w:p>
-            <w:hyperlink r:id="rId47" w:history="1">
-              <w:proofErr w:type="spellStart"/>
-              <w:proofErr w:type="gramStart"/>
+            <w:hyperlink r:id="rId62" w:history="1">
               <w:r>
                 <w:rPr>
                   <w:rStyle w:val="Hyperlink"/>
                 </w:rPr>
-                <w:t>role.guard</w:t>
+                <w:t>role.guard.ts</w:t>
               </w:r>
-              <w:proofErr w:type="gramEnd"/>
-              <w:r>
-                <w:rPr>
-                  <w:rStyle w:val="Hyperlink"/>
-                </w:rPr>
-                <w:t>.ts</w:t>
-              </w:r>
-              <w:proofErr w:type="spellEnd"/>
             </w:hyperlink>
           </w:p>
         </w:tc>
@@ -12960,42 +12570,16 @@
             <w:r>
               <w:t>Now calls </w:t>
             </w:r>
-            <w:proofErr w:type="spellStart"/>
-            <w:r>
-              <w:fldChar w:fldCharType="begin"/>
-            </w:r>
-            <w:r>
-              <w:instrText>HYPERLINK "vscode-file://vscode-app/d:/apps/Microsoft%20VS%20Code/07ff9d6178/resources/app/out/vs/code/electron-browser/workbench/workbench.html" \o ""</w:instrText>
-            </w:r>
-            <w:r>
-              <w:fldChar w:fldCharType="separate"/>
-            </w:r>
-            <w:r>
-              <w:rPr>
-                <w:rStyle w:val="Hyperlink"/>
-              </w:rPr>
-              <w:t>hasAnyRoleOrGroup</w:t>
-            </w:r>
-            <w:proofErr w:type="spellEnd"/>
-            <w:r>
-              <w:rPr>
-                <w:rStyle w:val="Hyperlink"/>
-              </w:rPr>
-              <w:t>()</w:t>
-            </w:r>
-            <w:r>
-              <w:fldChar w:fldCharType="end"/>
-            </w:r>
-            <w:r>
-              <w:t> instead of </w:t>
-            </w:r>
-            <w:proofErr w:type="spellStart"/>
-            <w:r>
-              <w:t>hasAnyRole</w:t>
-            </w:r>
-            <w:proofErr w:type="spellEnd"/>
-            <w:r>
-              <w:t>()</w:t>
+            <w:hyperlink r:id="rId63" w:history="1">
+              <w:r>
+                <w:rPr>
+                  <w:rStyle w:val="Hyperlink"/>
+                </w:rPr>
+                <w:t>hasAnyRoleOrGroup()</w:t>
+              </w:r>
+            </w:hyperlink>
+            <w:r>
+              <w:t> instead of hasAnyRole()</w:t>
             </w:r>
           </w:p>
         </w:tc>
@@ -13021,7 +12605,7 @@
             <w:hideMark/>
           </w:tcPr>
           <w:p>
-            <w:hyperlink r:id="rId48" w:history="1">
+            <w:hyperlink r:id="rId64" w:history="1">
               <w:r>
                 <w:rPr>
                   <w:rStyle w:val="Hyperlink"/>
@@ -13052,32 +12636,14 @@
             <w:r>
               <w:t>Nav visibility uses </w:t>
             </w:r>
-            <w:proofErr w:type="spellStart"/>
-            <w:r>
-              <w:fldChar w:fldCharType="begin"/>
-            </w:r>
-            <w:r>
-              <w:instrText>HYPERLINK "vscode-file://vscode-app/d:/apps/Microsoft%20VS%20Code/07ff9d6178/resources/app/out/vs/code/electron-browser/workbench/workbench.html" \o ""</w:instrText>
-            </w:r>
-            <w:r>
-              <w:fldChar w:fldCharType="separate"/>
-            </w:r>
-            <w:r>
-              <w:rPr>
-                <w:rStyle w:val="Hyperlink"/>
-              </w:rPr>
-              <w:t>hasAnyRoleOrGroup</w:t>
-            </w:r>
-            <w:proofErr w:type="spellEnd"/>
-            <w:r>
-              <w:rPr>
-                <w:rStyle w:val="Hyperlink"/>
-              </w:rPr>
-              <w:t>()</w:t>
-            </w:r>
-            <w:r>
-              <w:fldChar w:fldCharType="end"/>
-            </w:r>
+            <w:hyperlink r:id="rId65" w:history="1">
+              <w:r>
+                <w:rPr>
+                  <w:rStyle w:val="Hyperlink"/>
+                </w:rPr>
+                <w:t>hasAnyRoleOrGroup()</w:t>
+              </w:r>
+            </w:hyperlink>
           </w:p>
         </w:tc>
       </w:tr>
@@ -13103,29 +12669,13 @@
             <w:hideMark/>
           </w:tcPr>
           <w:p>
-            <w:hyperlink r:id="rId49" w:history="1">
+            <w:hyperlink r:id="rId66" w:history="1">
               <w:r>
                 <w:rPr>
                   <w:rStyle w:val="Hyperlink"/>
                 </w:rPr>
-                <w:t>comment-thread-</w:t>
+                <w:t>comment-thread-panel.component.ts</w:t>
               </w:r>
-              <w:proofErr w:type="spellStart"/>
-              <w:proofErr w:type="gramStart"/>
-              <w:r>
-                <w:rPr>
-                  <w:rStyle w:val="Hyperlink"/>
-                </w:rPr>
-                <w:t>panel.component</w:t>
-              </w:r>
-              <w:proofErr w:type="gramEnd"/>
-              <w:r>
-                <w:rPr>
-                  <w:rStyle w:val="Hyperlink"/>
-                </w:rPr>
-                <w:t>.ts</w:t>
-              </w:r>
-              <w:proofErr w:type="spellEnd"/>
             </w:hyperlink>
           </w:p>
         </w:tc>
@@ -13148,68 +12698,36 @@
             <w:hideMark/>
           </w:tcPr>
           <w:p>
-            <w:hyperlink r:id="rId50" w:history="1">
-              <w:proofErr w:type="spellStart"/>
+            <w:hyperlink r:id="rId67" w:history="1">
               <w:r>
                 <w:rPr>
                   <w:rStyle w:val="Hyperlink"/>
                 </w:rPr>
                 <w:t>canWrite</w:t>
               </w:r>
-              <w:proofErr w:type="spellEnd"/>
             </w:hyperlink>
             <w:r>
               <w:t>/</w:t>
             </w:r>
-            <w:proofErr w:type="spellStart"/>
-            <w:r>
-              <w:fldChar w:fldCharType="begin"/>
-            </w:r>
-            <w:r>
-              <w:instrText>HYPERLINK "vscode-file://vscode-app/d:/apps/Microsoft%20VS%20Code/07ff9d6178/resources/app/out/vs/code/electron-browser/workbench/workbench.html" \o ""</w:instrText>
-            </w:r>
-            <w:r>
-              <w:fldChar w:fldCharType="separate"/>
-            </w:r>
-            <w:r>
-              <w:rPr>
-                <w:rStyle w:val="Hyperlink"/>
-              </w:rPr>
-              <w:t>isAdmin</w:t>
-            </w:r>
-            <w:proofErr w:type="spellEnd"/>
-            <w:r>
-              <w:fldChar w:fldCharType="end"/>
-            </w:r>
+            <w:hyperlink r:id="rId68" w:history="1">
+              <w:r>
+                <w:rPr>
+                  <w:rStyle w:val="Hyperlink"/>
+                </w:rPr>
+                <w:t>isAdmin</w:t>
+              </w:r>
+            </w:hyperlink>
             <w:r>
               <w:t> use </w:t>
             </w:r>
-            <w:proofErr w:type="spellStart"/>
-            <w:r>
-              <w:fldChar w:fldCharType="begin"/>
-            </w:r>
-            <w:r>
-              <w:instrText>HYPERLINK "vscode-file://vscode-app/d:/apps/Microsoft%20VS%20Code/07ff9d6178/resources/app/out/vs/code/electron-browser/workbench/workbench.html" \o ""</w:instrText>
-            </w:r>
-            <w:r>
-              <w:fldChar w:fldCharType="separate"/>
-            </w:r>
-            <w:r>
-              <w:rPr>
-                <w:rStyle w:val="Hyperlink"/>
-              </w:rPr>
-              <w:t>hasAnyRoleOrGroup</w:t>
-            </w:r>
-            <w:proofErr w:type="spellEnd"/>
-            <w:r>
-              <w:rPr>
-                <w:rStyle w:val="Hyperlink"/>
-              </w:rPr>
-              <w:t>()</w:t>
-            </w:r>
-            <w:r>
-              <w:fldChar w:fldCharType="end"/>
-            </w:r>
+            <w:hyperlink r:id="rId69" w:history="1">
+              <w:r>
+                <w:rPr>
+                  <w:rStyle w:val="Hyperlink"/>
+                </w:rPr>
+                <w:t>hasAnyRoleOrGroup()</w:t>
+              </w:r>
+            </w:hyperlink>
           </w:p>
         </w:tc>
       </w:tr>
@@ -18855,6 +18373,7 @@
   <w:style w:type="paragraph" w:default="1" w:styleId="Normal">
     <w:name w:val="Normal"/>
     <w:qFormat/>
+    <w:rsid w:val="00AF7D7B"/>
   </w:style>
   <w:style w:type="paragraph" w:styleId="Heading1">
     <w:name w:val="heading 1"/>
@@ -19056,6 +18575,7 @@
   <w:style w:type="character" w:default="1" w:styleId="DefaultParagraphFont">
     <w:name w:val="Default Paragraph Font"/>
     <w:uiPriority w:val="1"/>
+    <w:semiHidden/>
     <w:unhideWhenUsed/>
   </w:style>
   <w:style w:type="table" w:default="1" w:styleId="TableNormal">

</xml_diff>